<commit_message>
abis nyicil penggabungan dataset. next cicil pemilihan kolom dll
</commit_message>
<xml_diff>
--- a/non-website/Laporan Akhir KP/2203040182 - Dhika Ramadhan Saputra - Laporan KP.docx
+++ b/non-website/Laporan Akhir KP/2203040182 - Dhika Ramadhan Saputra - Laporan KP.docx
@@ -61,7 +61,7 @@
                     <pic:cNvPicPr/>
                   </pic:nvPicPr>
                   <pic:blipFill>
-                    <a:blip r:embed="rId5" cstate="print">
+                    <a:blip r:embed="rId6" cstate="print">
                       <a:extLst>
                         <a:ext uri="{28A0092B-C50C-407E-A947-70E740481C1C}">
                           <a14:useLocalDpi xmlns:a14="http://schemas.microsoft.com/office/drawing/2010/main" val="0"/>
@@ -1195,8 +1195,16 @@
       <w:r>
         <w:rPr>
           <w:rFonts w:ascii="Times New Roman" w:hAnsi="Times New Roman" w:cs="Times New Roman"/>
-        </w:rPr>
-        <w:t>Pre-processing data</w:t>
+          <w:i/>
+          <w:iCs/>
+        </w:rPr>
+        <w:t>Pre-processing</w:t>
+      </w:r>
+      <w:r>
+        <w:rPr>
+          <w:rFonts w:ascii="Times New Roman" w:hAnsi="Times New Roman" w:cs="Times New Roman"/>
+        </w:rPr>
+        <w:t xml:space="preserve"> data</w:t>
       </w:r>
     </w:p>
     <w:p>
@@ -1527,9 +1535,9 @@
           <w:noProof/>
         </w:rPr>
         <w:drawing>
-          <wp:inline distT="0" distB="0" distL="0" distR="0" wp14:anchorId="091CD487" wp14:editId="7B27F6F2">
-            <wp:extent cx="2683589" cy="6876000"/>
-            <wp:effectExtent l="0" t="0" r="2540" b="1270"/>
+          <wp:inline distT="0" distB="0" distL="0" distR="0" wp14:anchorId="091CD487" wp14:editId="1AF43376">
+            <wp:extent cx="2683498" cy="6876000"/>
+            <wp:effectExtent l="0" t="0" r="3175" b="1270"/>
             <wp:docPr id="426171956" name="Picture 1"/>
             <wp:cNvGraphicFramePr>
               <a:graphicFrameLocks xmlns:a="http://schemas.openxmlformats.org/drawingml/2006/main" noChangeAspect="1"/>
@@ -1538,11 +1546,11 @@
               <a:graphicData uri="http://schemas.openxmlformats.org/drawingml/2006/picture">
                 <pic:pic xmlns:pic="http://schemas.openxmlformats.org/drawingml/2006/picture">
                   <pic:nvPicPr>
-                    <pic:cNvPr id="426171956" name="Picture 426171956"/>
+                    <pic:cNvPr id="426171956" name="Picture 1"/>
                     <pic:cNvPicPr/>
                   </pic:nvPicPr>
                   <pic:blipFill>
-                    <a:blip r:embed="rId6">
+                    <a:blip r:embed="rId7">
                       <a:extLst>
                         <a:ext uri="{28A0092B-C50C-407E-A947-70E740481C1C}">
                           <a14:useLocalDpi xmlns:a14="http://schemas.microsoft.com/office/drawing/2010/main" val="0"/>
@@ -1556,7 +1564,7 @@
                   <pic:spPr>
                     <a:xfrm>
                       <a:off x="0" y="0"/>
-                      <a:ext cx="2683589" cy="6876000"/>
+                      <a:ext cx="2683498" cy="6876000"/>
                     </a:xfrm>
                     <a:prstGeom prst="rect">
                       <a:avLst/>
@@ -1572,6 +1580,7 @@
     <w:p>
       <w:pPr>
         <w:pStyle w:val="Caption"/>
+        <w:spacing w:line="480" w:lineRule="auto"/>
         <w:jc w:val="center"/>
         <w:rPr>
           <w:rFonts w:ascii="Times New Roman" w:hAnsi="Times New Roman" w:cs="Times New Roman"/>
@@ -1580,14 +1589,27 @@
       <w:r>
         <w:t xml:space="preserve">gambar </w:t>
       </w:r>
-      <w:fldSimple w:instr=" SEQ gambar \* ARABIC ">
-        <w:r>
-          <w:rPr>
-            <w:noProof/>
-          </w:rPr>
-          <w:t>1</w:t>
-        </w:r>
-      </w:fldSimple>
+      <w:r>
+        <w:fldChar w:fldCharType="begin"/>
+      </w:r>
+      <w:r>
+        <w:instrText xml:space="preserve"> SEQ gambar \* ARABIC </w:instrText>
+      </w:r>
+      <w:r>
+        <w:fldChar w:fldCharType="separate"/>
+      </w:r>
+      <w:r>
+        <w:rPr>
+          <w:noProof/>
+        </w:rPr>
+        <w:t>1</w:t>
+      </w:r>
+      <w:r>
+        <w:rPr>
+          <w:noProof/>
+        </w:rPr>
+        <w:fldChar w:fldCharType="end"/>
+      </w:r>
       <w:r>
         <w:t xml:space="preserve"> Tahapan Pelaksanaan</w:t>
       </w:r>
@@ -2442,11 +2464,15 @@
               <w:spacing w:line="276" w:lineRule="auto"/>
               <w:rPr>
                 <w:rFonts w:ascii="Times New Roman" w:hAnsi="Times New Roman" w:cs="Times New Roman"/>
+                <w:i/>
+                <w:iCs/>
               </w:rPr>
             </w:pPr>
             <w:r>
               <w:rPr>
                 <w:rFonts w:ascii="Times New Roman" w:hAnsi="Times New Roman" w:cs="Times New Roman"/>
+                <w:i/>
+                <w:iCs/>
               </w:rPr>
               <w:t>Pre-processing</w:t>
             </w:r>
@@ -3277,12 +3303,43 @@
     </w:tbl>
     <w:p>
       <w:pPr>
+        <w:pStyle w:val="Caption"/>
+        <w:jc w:val="center"/>
+      </w:pPr>
+    </w:p>
+    <w:p>
+      <w:pPr>
+        <w:pStyle w:val="Caption"/>
         <w:spacing w:line="480" w:lineRule="auto"/>
-        <w:jc w:val="both"/>
-        <w:rPr>
-          <w:rFonts w:ascii="Times New Roman" w:hAnsi="Times New Roman" w:cs="Times New Roman"/>
-        </w:rPr>
-      </w:pPr>
+        <w:jc w:val="center"/>
+        <w:rPr>
+          <w:rFonts w:ascii="Times New Roman" w:hAnsi="Times New Roman" w:cs="Times New Roman"/>
+        </w:rPr>
+      </w:pPr>
+      <w:r>
+        <w:t xml:space="preserve">Tabel </w:t>
+      </w:r>
+      <w:r>
+        <w:fldChar w:fldCharType="begin"/>
+      </w:r>
+      <w:r>
+        <w:instrText xml:space="preserve"> SEQ Tabel \* ARABIC </w:instrText>
+      </w:r>
+      <w:r>
+        <w:fldChar w:fldCharType="separate"/>
+      </w:r>
+      <w:r>
+        <w:rPr>
+          <w:noProof/>
+        </w:rPr>
+        <w:t>1</w:t>
+      </w:r>
+      <w:r>
+        <w:fldChar w:fldCharType="end"/>
+      </w:r>
+      <w:r>
+        <w:t xml:space="preserve"> Jadwal pelaksanaan</w:t>
+      </w:r>
     </w:p>
     <w:p>
       <w:pPr>
@@ -3438,7 +3495,7 @@
                     <pic:cNvPicPr/>
                   </pic:nvPicPr>
                   <pic:blipFill>
-                    <a:blip r:embed="rId7">
+                    <a:blip r:embed="rId8">
                       <a:extLst>
                         <a:ext uri="{28A0092B-C50C-407E-A947-70E740481C1C}">
                           <a14:useLocalDpi xmlns:a14="http://schemas.microsoft.com/office/drawing/2010/main" val="0"/>
@@ -3468,6 +3525,7 @@
     <w:p>
       <w:pPr>
         <w:pStyle w:val="Caption"/>
+        <w:spacing w:line="480" w:lineRule="auto"/>
         <w:jc w:val="center"/>
         <w:rPr>
           <w:rFonts w:ascii="Times New Roman" w:hAnsi="Times New Roman" w:cs="Times New Roman"/>
@@ -3476,14 +3534,27 @@
       <w:r>
         <w:t xml:space="preserve">gambar </w:t>
       </w:r>
-      <w:fldSimple w:instr=" SEQ gambar \* ARABIC ">
-        <w:r>
-          <w:rPr>
-            <w:noProof/>
-          </w:rPr>
-          <w:t>2</w:t>
-        </w:r>
-      </w:fldSimple>
+      <w:r>
+        <w:fldChar w:fldCharType="begin"/>
+      </w:r>
+      <w:r>
+        <w:instrText xml:space="preserve"> SEQ gambar \* ARABIC </w:instrText>
+      </w:r>
+      <w:r>
+        <w:fldChar w:fldCharType="separate"/>
+      </w:r>
+      <w:r>
+        <w:rPr>
+          <w:noProof/>
+        </w:rPr>
+        <w:t>2</w:t>
+      </w:r>
+      <w:r>
+        <w:rPr>
+          <w:noProof/>
+        </w:rPr>
+        <w:fldChar w:fldCharType="end"/>
+      </w:r>
       <w:r>
         <w:t xml:space="preserve"> Struktur Umum Organisasi Mitra</w:t>
       </w:r>
@@ -3651,27 +3722,13 @@
         </w:rPr>
         <w:t xml:space="preserve">Website: </w:t>
       </w:r>
-      <w:hyperlink r:id="rId8" w:history="1">
+      <w:hyperlink r:id="rId9" w:history="1">
         <w:r>
           <w:rPr>
             <w:rStyle w:val="Hyperlink"/>
             <w:rFonts w:ascii="Times New Roman" w:hAnsi="Times New Roman" w:cs="Times New Roman"/>
           </w:rPr>
-          <w:t>https://um</w:t>
-        </w:r>
-        <w:r>
-          <w:rPr>
-            <w:rStyle w:val="Hyperlink"/>
-            <w:rFonts w:ascii="Times New Roman" w:hAnsi="Times New Roman" w:cs="Times New Roman"/>
-          </w:rPr>
-          <w:t>p</w:t>
-        </w:r>
-        <w:r>
-          <w:rPr>
-            <w:rStyle w:val="Hyperlink"/>
-            <w:rFonts w:ascii="Times New Roman" w:hAnsi="Times New Roman" w:cs="Times New Roman"/>
-          </w:rPr>
-          <w:t>.ac.id/</w:t>
+          <w:t>https://ump.ac.id/</w:t>
         </w:r>
       </w:hyperlink>
     </w:p>
@@ -3695,6 +3752,7 @@
         <w:rPr>
           <w:rFonts w:ascii="Times New Roman" w:hAnsi="Times New Roman" w:cs="Times New Roman"/>
         </w:rPr>
+        <w:lastRenderedPageBreak/>
         <w:br w:type="page"/>
       </w:r>
     </w:p>
@@ -3730,7 +3788,739 @@
         <w:rPr>
           <w:rFonts w:ascii="Times New Roman" w:hAnsi="Times New Roman" w:cs="Times New Roman"/>
         </w:rPr>
-        <w:t>ssss</w:t>
+        <w:t>Berikut ini adalah hasil dari setiap tahapan pelaksanaan pada proyek ini:</w:t>
+      </w:r>
+    </w:p>
+    <w:p>
+      <w:pPr>
+        <w:pStyle w:val="Heading4"/>
+      </w:pPr>
+      <w:r>
+        <w:t>Pengumpulan Data</w:t>
+      </w:r>
+    </w:p>
+    <w:p>
+      <w:pPr>
+        <w:pStyle w:val="ListParagraph"/>
+        <w:spacing w:line="480" w:lineRule="auto"/>
+        <w:ind w:firstLine="720"/>
+        <w:jc w:val="both"/>
+        <w:rPr>
+          <w:rFonts w:ascii="Times New Roman" w:hAnsi="Times New Roman" w:cs="Times New Roman"/>
+        </w:rPr>
+      </w:pPr>
+      <w:r>
+        <w:rPr>
+          <w:rFonts w:ascii="Times New Roman" w:hAnsi="Times New Roman" w:cs="Times New Roman"/>
+        </w:rPr>
+        <w:t>Proses pengumpulan data di database UMP tidak dilakukan langsung oleh penulis, melainkan oleh mitra proyek (BPA UMP)</w:t>
+      </w:r>
+      <w:r>
+        <w:rPr>
+          <w:rFonts w:ascii="Times New Roman" w:hAnsi="Times New Roman" w:cs="Times New Roman"/>
+        </w:rPr>
+        <w:t>. Data yang dikumpulkan meliputi data mahasiswa yang berstatus mahasiswa baru dalam kurun tahun 2014-2024</w:t>
+      </w:r>
+      <w:r>
+        <w:rPr>
+          <w:rFonts w:ascii="Times New Roman" w:hAnsi="Times New Roman" w:cs="Times New Roman"/>
+        </w:rPr>
+        <w:t>.</w:t>
+      </w:r>
+      <w:r>
+        <w:rPr>
+          <w:rFonts w:ascii="Times New Roman" w:hAnsi="Times New Roman" w:cs="Times New Roman"/>
+        </w:rPr>
+        <w:t xml:space="preserve"> Pada data mentah, terdapat </w:t>
+      </w:r>
+      <w:r>
+        <w:rPr>
+          <w:rFonts w:ascii="Times New Roman" w:hAnsi="Times New Roman" w:cs="Times New Roman"/>
+        </w:rPr>
+        <w:t xml:space="preserve">74 kolom informasi yang nantinya akan dipilih pada </w:t>
+      </w:r>
+      <w:r>
+        <w:rPr>
+          <w:rFonts w:ascii="Times New Roman" w:hAnsi="Times New Roman" w:cs="Times New Roman"/>
+        </w:rPr>
+        <w:t xml:space="preserve">tahap </w:t>
+      </w:r>
+      <w:r>
+        <w:rPr>
+          <w:rFonts w:ascii="Times New Roman" w:hAnsi="Times New Roman" w:cs="Times New Roman"/>
+          <w:i/>
+          <w:iCs/>
+        </w:rPr>
+        <w:t>p</w:t>
+      </w:r>
+      <w:r>
+        <w:rPr>
+          <w:rFonts w:ascii="Times New Roman" w:hAnsi="Times New Roman" w:cs="Times New Roman"/>
+          <w:i/>
+          <w:iCs/>
+        </w:rPr>
+        <w:t>re-processing</w:t>
+      </w:r>
+      <w:r>
+        <w:rPr>
+          <w:rFonts w:ascii="Times New Roman" w:hAnsi="Times New Roman" w:cs="Times New Roman"/>
+        </w:rPr>
+        <w:t>.</w:t>
+      </w:r>
+      <w:r>
+        <w:rPr>
+          <w:rFonts w:ascii="Times New Roman" w:hAnsi="Times New Roman" w:cs="Times New Roman"/>
+        </w:rPr>
+        <w:t xml:space="preserve"> Berikut ini </w:t>
+      </w:r>
+      <w:r>
+        <w:rPr>
+          <w:rFonts w:ascii="Times New Roman" w:hAnsi="Times New Roman" w:cs="Times New Roman"/>
+        </w:rPr>
+        <w:t>adalah dokumentasi dari proses pengumpulan data</w:t>
+      </w:r>
+      <w:r>
+        <w:rPr>
+          <w:rFonts w:ascii="Times New Roman" w:hAnsi="Times New Roman" w:cs="Times New Roman"/>
+        </w:rPr>
+        <w:t>:</w:t>
+      </w:r>
+    </w:p>
+    <w:p>
+      <w:pPr>
+        <w:pStyle w:val="ListParagraph"/>
+        <w:keepNext/>
+        <w:spacing w:line="480" w:lineRule="auto"/>
+        <w:jc w:val="center"/>
+      </w:pPr>
+      <w:r>
+        <w:rPr>
+          <w:rFonts w:ascii="Times New Roman" w:hAnsi="Times New Roman" w:cs="Times New Roman"/>
+          <w:noProof/>
+        </w:rPr>
+        <w:drawing>
+          <wp:inline distT="0" distB="0" distL="0" distR="0" wp14:anchorId="4B3B3EE4" wp14:editId="2AB122FF">
+            <wp:extent cx="2802353" cy="3240000"/>
+            <wp:effectExtent l="19050" t="19050" r="17145" b="17780"/>
+            <wp:docPr id="623233293" name="Picture 2"/>
+            <wp:cNvGraphicFramePr>
+              <a:graphicFrameLocks xmlns:a="http://schemas.openxmlformats.org/drawingml/2006/main" noChangeAspect="1"/>
+            </wp:cNvGraphicFramePr>
+            <a:graphic xmlns:a="http://schemas.openxmlformats.org/drawingml/2006/main">
+              <a:graphicData uri="http://schemas.openxmlformats.org/drawingml/2006/picture">
+                <pic:pic xmlns:pic="http://schemas.openxmlformats.org/drawingml/2006/picture">
+                  <pic:nvPicPr>
+                    <pic:cNvPr id="0" name="Picture 2"/>
+                    <pic:cNvPicPr>
+                      <a:picLocks noChangeAspect="1" noChangeArrowheads="1"/>
+                    </pic:cNvPicPr>
+                  </pic:nvPicPr>
+                  <pic:blipFill>
+                    <a:blip r:embed="rId10" cstate="print">
+                      <a:extLst>
+                        <a:ext uri="{28A0092B-C50C-407E-A947-70E740481C1C}">
+                          <a14:useLocalDpi xmlns:a14="http://schemas.microsoft.com/office/drawing/2010/main" val="0"/>
+                        </a:ext>
+                      </a:extLst>
+                    </a:blip>
+                    <a:srcRect/>
+                    <a:stretch>
+                      <a:fillRect/>
+                    </a:stretch>
+                  </pic:blipFill>
+                  <pic:spPr bwMode="auto">
+                    <a:xfrm>
+                      <a:off x="0" y="0"/>
+                      <a:ext cx="2802353" cy="3240000"/>
+                    </a:xfrm>
+                    <a:prstGeom prst="rect">
+                      <a:avLst/>
+                    </a:prstGeom>
+                    <a:noFill/>
+                    <a:ln w="12700">
+                      <a:solidFill>
+                        <a:schemeClr val="tx1"/>
+                      </a:solidFill>
+                    </a:ln>
+                  </pic:spPr>
+                </pic:pic>
+              </a:graphicData>
+            </a:graphic>
+          </wp:inline>
+        </w:drawing>
+      </w:r>
+    </w:p>
+    <w:p>
+      <w:pPr>
+        <w:pStyle w:val="Caption"/>
+        <w:spacing w:line="480" w:lineRule="auto"/>
+        <w:jc w:val="center"/>
+      </w:pPr>
+      <w:r>
+        <w:t xml:space="preserve">gambar </w:t>
+      </w:r>
+      <w:r>
+        <w:fldChar w:fldCharType="begin"/>
+      </w:r>
+      <w:r>
+        <w:instrText xml:space="preserve"> SEQ gambar \* ARABIC </w:instrText>
+      </w:r>
+      <w:r>
+        <w:fldChar w:fldCharType="separate"/>
+      </w:r>
+      <w:r>
+        <w:rPr>
+          <w:noProof/>
+        </w:rPr>
+        <w:t>3</w:t>
+      </w:r>
+      <w:r>
+        <w:fldChar w:fldCharType="end"/>
+      </w:r>
+      <w:r>
+        <w:t xml:space="preserve"> Dokumentasi proses penerimaan data</w:t>
+      </w:r>
+    </w:p>
+    <w:p/>
+    <w:p>
+      <w:pPr>
+        <w:pStyle w:val="ListParagraph"/>
+        <w:keepNext/>
+        <w:spacing w:line="480" w:lineRule="auto"/>
+        <w:jc w:val="center"/>
+      </w:pPr>
+      <w:r>
+        <w:rPr>
+          <w:rFonts w:ascii="Times New Roman" w:hAnsi="Times New Roman" w:cs="Times New Roman"/>
+          <w:noProof/>
+        </w:rPr>
+        <w:drawing>
+          <wp:inline distT="0" distB="0" distL="0" distR="0" wp14:anchorId="75188C27" wp14:editId="20959BB2">
+            <wp:extent cx="4608000" cy="1698906"/>
+            <wp:effectExtent l="19050" t="19050" r="21590" b="15875"/>
+            <wp:docPr id="783286403" name="Picture 4"/>
+            <wp:cNvGraphicFramePr>
+              <a:graphicFrameLocks xmlns:a="http://schemas.openxmlformats.org/drawingml/2006/main" noChangeAspect="1"/>
+            </wp:cNvGraphicFramePr>
+            <a:graphic xmlns:a="http://schemas.openxmlformats.org/drawingml/2006/main">
+              <a:graphicData uri="http://schemas.openxmlformats.org/drawingml/2006/picture">
+                <pic:pic xmlns:pic="http://schemas.openxmlformats.org/drawingml/2006/picture">
+                  <pic:nvPicPr>
+                    <pic:cNvPr id="0" name="Picture 4"/>
+                    <pic:cNvPicPr>
+                      <a:picLocks noChangeAspect="1" noChangeArrowheads="1"/>
+                    </pic:cNvPicPr>
+                  </pic:nvPicPr>
+                  <pic:blipFill>
+                    <a:blip r:embed="rId11" cstate="print">
+                      <a:extLst>
+                        <a:ext uri="{28A0092B-C50C-407E-A947-70E740481C1C}">
+                          <a14:useLocalDpi xmlns:a14="http://schemas.microsoft.com/office/drawing/2010/main" val="0"/>
+                        </a:ext>
+                      </a:extLst>
+                    </a:blip>
+                    <a:srcRect/>
+                    <a:stretch>
+                      <a:fillRect/>
+                    </a:stretch>
+                  </pic:blipFill>
+                  <pic:spPr bwMode="auto">
+                    <a:xfrm>
+                      <a:off x="0" y="0"/>
+                      <a:ext cx="4608000" cy="1698906"/>
+                    </a:xfrm>
+                    <a:prstGeom prst="rect">
+                      <a:avLst/>
+                    </a:prstGeom>
+                    <a:noFill/>
+                    <a:ln w="12700">
+                      <a:solidFill>
+                        <a:schemeClr val="tx1"/>
+                      </a:solidFill>
+                    </a:ln>
+                  </pic:spPr>
+                </pic:pic>
+              </a:graphicData>
+            </a:graphic>
+          </wp:inline>
+        </w:drawing>
+      </w:r>
+    </w:p>
+    <w:p>
+      <w:pPr>
+        <w:pStyle w:val="Caption"/>
+        <w:spacing w:line="480" w:lineRule="auto"/>
+        <w:jc w:val="center"/>
+        <w:rPr>
+          <w:rFonts w:ascii="Times New Roman" w:hAnsi="Times New Roman" w:cs="Times New Roman"/>
+        </w:rPr>
+      </w:pPr>
+      <w:r>
+        <w:t xml:space="preserve">gambar </w:t>
+      </w:r>
+      <w:r>
+        <w:fldChar w:fldCharType="begin"/>
+      </w:r>
+      <w:r>
+        <w:instrText xml:space="preserve"> SEQ gambar \* ARABIC </w:instrText>
+      </w:r>
+      <w:r>
+        <w:fldChar w:fldCharType="separate"/>
+      </w:r>
+      <w:r>
+        <w:rPr>
+          <w:noProof/>
+        </w:rPr>
+        <w:t>4</w:t>
+      </w:r>
+      <w:r>
+        <w:fldChar w:fldCharType="end"/>
+      </w:r>
+      <w:r>
+        <w:t xml:space="preserve"> Sampel data mentah</w:t>
+      </w:r>
+      <w:r>
+        <w:t xml:space="preserve"> 2024</w:t>
+      </w:r>
+      <w:r>
+        <w:t xml:space="preserve"> (dengan sensor)</w:t>
+      </w:r>
+    </w:p>
+    <w:p>
+      <w:pPr>
+        <w:pStyle w:val="Heading4"/>
+        <w:rPr>
+          <w:i/>
+          <w:iCs w:val="0"/>
+        </w:rPr>
+      </w:pPr>
+      <w:r>
+        <w:rPr>
+          <w:i/>
+          <w:iCs w:val="0"/>
+        </w:rPr>
+        <w:t>Pre-processing</w:t>
+      </w:r>
+    </w:p>
+    <w:p>
+      <w:pPr>
+        <w:pStyle w:val="ListParagraph"/>
+        <w:spacing w:line="480" w:lineRule="auto"/>
+        <w:ind w:firstLine="720"/>
+        <w:jc w:val="both"/>
+        <w:rPr>
+          <w:rFonts w:ascii="Times New Roman" w:hAnsi="Times New Roman" w:cs="Times New Roman"/>
+        </w:rPr>
+      </w:pPr>
+      <w:r>
+        <w:rPr>
+          <w:rFonts w:ascii="Times New Roman" w:hAnsi="Times New Roman" w:cs="Times New Roman"/>
+        </w:rPr>
+        <w:t xml:space="preserve">Sesuai dengan gambaran umum proyek, tahap </w:t>
+      </w:r>
+      <w:r>
+        <w:rPr>
+          <w:rFonts w:ascii="Times New Roman" w:hAnsi="Times New Roman" w:cs="Times New Roman"/>
+          <w:i/>
+          <w:iCs/>
+        </w:rPr>
+        <w:t>Pre-processing</w:t>
+      </w:r>
+      <w:r>
+        <w:rPr>
+          <w:rFonts w:ascii="Times New Roman" w:hAnsi="Times New Roman" w:cs="Times New Roman"/>
+        </w:rPr>
+        <w:t xml:space="preserve"> memiliki 4 tahap, dengan detail dan hasil sebagai berikut: </w:t>
+      </w:r>
+    </w:p>
+    <w:p>
+      <w:pPr>
+        <w:pStyle w:val="Heading5"/>
+      </w:pPr>
+      <w:r>
+        <w:t xml:space="preserve">Penggabungan </w:t>
+      </w:r>
+      <w:r>
+        <w:rPr>
+          <w:i/>
+          <w:iCs/>
+        </w:rPr>
+        <w:t>dataset</w:t>
+      </w:r>
+    </w:p>
+    <w:p>
+      <w:pPr>
+        <w:pStyle w:val="ListParagraph"/>
+        <w:spacing w:line="480" w:lineRule="auto"/>
+        <w:rPr>
+          <w:rFonts w:ascii="Times New Roman" w:hAnsi="Times New Roman" w:cs="Times New Roman"/>
+        </w:rPr>
+      </w:pPr>
+      <w:r>
+        <w:rPr>
+          <w:rFonts w:ascii="Times New Roman" w:hAnsi="Times New Roman" w:cs="Times New Roman"/>
+        </w:rPr>
+        <w:t>Data mentah yang diterima dari mitra proyek (BPA UMP)</w:t>
+      </w:r>
+      <w:r>
+        <w:rPr>
+          <w:rFonts w:ascii="Times New Roman" w:hAnsi="Times New Roman" w:cs="Times New Roman"/>
+        </w:rPr>
+        <w:t xml:space="preserve"> merupakan </w:t>
+      </w:r>
+      <w:r>
+        <w:rPr>
+          <w:rFonts w:ascii="Times New Roman" w:hAnsi="Times New Roman" w:cs="Times New Roman"/>
+        </w:rPr>
+        <w:t>10 berkas Microsoft Excell</w:t>
+      </w:r>
+      <w:r>
+        <w:rPr>
+          <w:rFonts w:ascii="Times New Roman" w:hAnsi="Times New Roman" w:cs="Times New Roman"/>
+        </w:rPr>
+        <w:t xml:space="preserve">. Untuk alasan efisiensi pada tahap </w:t>
+      </w:r>
+      <w:r>
+        <w:rPr>
+          <w:rFonts w:ascii="Times New Roman" w:hAnsi="Times New Roman" w:cs="Times New Roman"/>
+          <w:i/>
+          <w:iCs/>
+        </w:rPr>
+        <w:t>p</w:t>
+      </w:r>
+      <w:r>
+        <w:rPr>
+          <w:rFonts w:ascii="Times New Roman" w:hAnsi="Times New Roman" w:cs="Times New Roman"/>
+          <w:i/>
+          <w:iCs/>
+        </w:rPr>
+        <w:t>re-processing</w:t>
+      </w:r>
+      <w:r>
+        <w:rPr>
+          <w:rFonts w:ascii="Times New Roman" w:hAnsi="Times New Roman" w:cs="Times New Roman"/>
+        </w:rPr>
+        <w:t>, penggabungan dataset ini diperlukan. Berikut ini dokumentasinya:</w:t>
+      </w:r>
+    </w:p>
+    <w:p>
+      <w:pPr>
+        <w:pStyle w:val="ListParagraph"/>
+        <w:keepNext/>
+        <w:spacing w:line="480" w:lineRule="auto"/>
+        <w:jc w:val="center"/>
+      </w:pPr>
+      <w:r>
+        <w:rPr>
+          <w:rFonts w:ascii="Times New Roman" w:hAnsi="Times New Roman" w:cs="Times New Roman"/>
+          <w:noProof/>
+        </w:rPr>
+        <w:drawing>
+          <wp:inline distT="0" distB="0" distL="0" distR="0" wp14:anchorId="02EBA956" wp14:editId="113B55F5">
+            <wp:extent cx="3888000" cy="2160000"/>
+            <wp:effectExtent l="19050" t="19050" r="17780" b="12065"/>
+            <wp:docPr id="102117401" name="Picture 5"/>
+            <wp:cNvGraphicFramePr>
+              <a:graphicFrameLocks xmlns:a="http://schemas.openxmlformats.org/drawingml/2006/main" noChangeAspect="1"/>
+            </wp:cNvGraphicFramePr>
+            <a:graphic xmlns:a="http://schemas.openxmlformats.org/drawingml/2006/main">
+              <a:graphicData uri="http://schemas.openxmlformats.org/drawingml/2006/picture">
+                <pic:pic xmlns:pic="http://schemas.openxmlformats.org/drawingml/2006/picture">
+                  <pic:nvPicPr>
+                    <pic:cNvPr id="0" name="Picture 5"/>
+                    <pic:cNvPicPr>
+                      <a:picLocks noChangeAspect="1" noChangeArrowheads="1"/>
+                    </pic:cNvPicPr>
+                  </pic:nvPicPr>
+                  <pic:blipFill>
+                    <a:blip r:embed="rId12" cstate="print">
+                      <a:extLst>
+                        <a:ext uri="{28A0092B-C50C-407E-A947-70E740481C1C}">
+                          <a14:useLocalDpi xmlns:a14="http://schemas.microsoft.com/office/drawing/2010/main" val="0"/>
+                        </a:ext>
+                      </a:extLst>
+                    </a:blip>
+                    <a:srcRect/>
+                    <a:stretch>
+                      <a:fillRect/>
+                    </a:stretch>
+                  </pic:blipFill>
+                  <pic:spPr bwMode="auto">
+                    <a:xfrm>
+                      <a:off x="0" y="0"/>
+                      <a:ext cx="3888000" cy="2160000"/>
+                    </a:xfrm>
+                    <a:prstGeom prst="rect">
+                      <a:avLst/>
+                    </a:prstGeom>
+                    <a:noFill/>
+                    <a:ln w="12700">
+                      <a:solidFill>
+                        <a:schemeClr val="tx1"/>
+                      </a:solidFill>
+                    </a:ln>
+                  </pic:spPr>
+                </pic:pic>
+              </a:graphicData>
+            </a:graphic>
+          </wp:inline>
+        </w:drawing>
+      </w:r>
+    </w:p>
+    <w:p>
+      <w:pPr>
+        <w:pStyle w:val="Caption"/>
+        <w:spacing w:line="480" w:lineRule="auto"/>
+        <w:jc w:val="center"/>
+        <w:rPr>
+          <w:rFonts w:ascii="Times New Roman" w:hAnsi="Times New Roman" w:cs="Times New Roman"/>
+        </w:rPr>
+      </w:pPr>
+      <w:r>
+        <w:t xml:space="preserve">Gambar </w:t>
+      </w:r>
+      <w:r>
+        <w:fldChar w:fldCharType="begin"/>
+      </w:r>
+      <w:r>
+        <w:instrText xml:space="preserve"> SEQ Gambar \* ARABIC </w:instrText>
+      </w:r>
+      <w:r>
+        <w:fldChar w:fldCharType="separate"/>
+      </w:r>
+      <w:r>
+        <w:rPr>
+          <w:noProof/>
+        </w:rPr>
+        <w:t>5</w:t>
+      </w:r>
+      <w:r>
+        <w:fldChar w:fldCharType="end"/>
+      </w:r>
+      <w:r>
+        <w:t xml:space="preserve"> Cuplikan querry penggabungan dataset</w:t>
+      </w:r>
+    </w:p>
+    <w:p>
+      <w:pPr>
+        <w:pStyle w:val="ListParagraph"/>
+        <w:keepNext/>
+        <w:spacing w:line="480" w:lineRule="auto"/>
+        <w:jc w:val="center"/>
+      </w:pPr>
+      <w:r>
+        <w:rPr>
+          <w:rFonts w:ascii="Times New Roman" w:hAnsi="Times New Roman" w:cs="Times New Roman"/>
+          <w:noProof/>
+        </w:rPr>
+        <w:lastRenderedPageBreak/>
+        <w:drawing>
+          <wp:inline distT="0" distB="0" distL="0" distR="0" wp14:anchorId="2A1F1CBC" wp14:editId="11C399CC">
+            <wp:extent cx="2520000" cy="2411027"/>
+            <wp:effectExtent l="19050" t="19050" r="13970" b="27940"/>
+            <wp:docPr id="990638686" name="Picture 6"/>
+            <wp:cNvGraphicFramePr>
+              <a:graphicFrameLocks xmlns:a="http://schemas.openxmlformats.org/drawingml/2006/main" noChangeAspect="1"/>
+            </wp:cNvGraphicFramePr>
+            <a:graphic xmlns:a="http://schemas.openxmlformats.org/drawingml/2006/main">
+              <a:graphicData uri="http://schemas.openxmlformats.org/drawingml/2006/picture">
+                <pic:pic xmlns:pic="http://schemas.openxmlformats.org/drawingml/2006/picture">
+                  <pic:nvPicPr>
+                    <pic:cNvPr id="0" name="Picture 6"/>
+                    <pic:cNvPicPr>
+                      <a:picLocks noChangeAspect="1" noChangeArrowheads="1"/>
+                    </pic:cNvPicPr>
+                  </pic:nvPicPr>
+                  <pic:blipFill>
+                    <a:blip r:embed="rId13">
+                      <a:extLst>
+                        <a:ext uri="{28A0092B-C50C-407E-A947-70E740481C1C}">
+                          <a14:useLocalDpi xmlns:a14="http://schemas.microsoft.com/office/drawing/2010/main" val="0"/>
+                        </a:ext>
+                      </a:extLst>
+                    </a:blip>
+                    <a:srcRect/>
+                    <a:stretch>
+                      <a:fillRect/>
+                    </a:stretch>
+                  </pic:blipFill>
+                  <pic:spPr bwMode="auto">
+                    <a:xfrm>
+                      <a:off x="0" y="0"/>
+                      <a:ext cx="2520000" cy="2411027"/>
+                    </a:xfrm>
+                    <a:prstGeom prst="rect">
+                      <a:avLst/>
+                    </a:prstGeom>
+                    <a:noFill/>
+                    <a:ln w="12700">
+                      <a:solidFill>
+                        <a:schemeClr val="tx1"/>
+                      </a:solidFill>
+                    </a:ln>
+                  </pic:spPr>
+                </pic:pic>
+              </a:graphicData>
+            </a:graphic>
+          </wp:inline>
+        </w:drawing>
+      </w:r>
+    </w:p>
+    <w:p>
+      <w:pPr>
+        <w:pStyle w:val="Caption"/>
+        <w:spacing w:line="480" w:lineRule="auto"/>
+        <w:jc w:val="center"/>
+        <w:rPr>
+          <w:rFonts w:ascii="Times New Roman" w:hAnsi="Times New Roman" w:cs="Times New Roman"/>
+        </w:rPr>
+      </w:pPr>
+      <w:r>
+        <w:t xml:space="preserve">Gambar </w:t>
+      </w:r>
+      <w:r>
+        <w:fldChar w:fldCharType="begin"/>
+      </w:r>
+      <w:r>
+        <w:instrText xml:space="preserve"> SEQ Gambar \* ARABIC </w:instrText>
+      </w:r>
+      <w:r>
+        <w:fldChar w:fldCharType="separate"/>
+      </w:r>
+      <w:r>
+        <w:rPr>
+          <w:noProof/>
+        </w:rPr>
+        <w:t>6</w:t>
+      </w:r>
+      <w:r>
+        <w:fldChar w:fldCharType="end"/>
+      </w:r>
+      <w:r>
+        <w:t xml:space="preserve"> Berkas sebelum &amp; sesudah penggabungan</w:t>
+      </w:r>
+    </w:p>
+    <w:p>
+      <w:pPr>
+        <w:pStyle w:val="Heading5"/>
+      </w:pPr>
+      <w:r>
+        <w:t>Pemilihan Kolom</w:t>
+      </w:r>
+    </w:p>
+    <w:p>
+      <w:pPr>
+        <w:pStyle w:val="ListParagraph"/>
+        <w:spacing w:line="480" w:lineRule="auto"/>
+        <w:rPr>
+          <w:rFonts w:ascii="Times New Roman" w:hAnsi="Times New Roman" w:cs="Times New Roman"/>
+        </w:rPr>
+      </w:pPr>
+      <w:r>
+        <w:rPr>
+          <w:rFonts w:ascii="Times New Roman" w:hAnsi="Times New Roman" w:cs="Times New Roman"/>
+        </w:rPr>
+        <w:t>ss</w:t>
+      </w:r>
+    </w:p>
+    <w:p>
+      <w:pPr>
+        <w:pStyle w:val="Heading5"/>
+      </w:pPr>
+      <w:r>
+        <w:t>Validasi Data</w:t>
+      </w:r>
+    </w:p>
+    <w:p>
+      <w:pPr>
+        <w:pStyle w:val="ListParagraph"/>
+        <w:spacing w:line="480" w:lineRule="auto"/>
+        <w:rPr>
+          <w:rFonts w:ascii="Times New Roman" w:hAnsi="Times New Roman" w:cs="Times New Roman"/>
+        </w:rPr>
+      </w:pPr>
+      <w:r>
+        <w:rPr>
+          <w:rFonts w:ascii="Times New Roman" w:hAnsi="Times New Roman" w:cs="Times New Roman"/>
+        </w:rPr>
+        <w:t>ss</w:t>
+      </w:r>
+    </w:p>
+    <w:p>
+      <w:pPr>
+        <w:pStyle w:val="Heading5"/>
+        <w:rPr>
+          <w:i/>
+          <w:iCs/>
+        </w:rPr>
+      </w:pPr>
+      <w:r>
+        <w:rPr>
+          <w:i/>
+          <w:iCs/>
+        </w:rPr>
+        <w:t>Problem Solving</w:t>
+      </w:r>
+    </w:p>
+    <w:p>
+      <w:pPr>
+        <w:pStyle w:val="ListParagraph"/>
+        <w:spacing w:line="480" w:lineRule="auto"/>
+        <w:rPr>
+          <w:rFonts w:ascii="Times New Roman" w:hAnsi="Times New Roman" w:cs="Times New Roman"/>
+        </w:rPr>
+      </w:pPr>
+      <w:r>
+        <w:rPr>
+          <w:rFonts w:ascii="Times New Roman" w:hAnsi="Times New Roman" w:cs="Times New Roman"/>
+        </w:rPr>
+        <w:t>sss</w:t>
+      </w:r>
+    </w:p>
+    <w:p>
+      <w:pPr>
+        <w:pStyle w:val="Heading4"/>
+      </w:pPr>
+      <w:r>
+        <w:t>Representasi</w:t>
+      </w:r>
+    </w:p>
+    <w:p>
+      <w:pPr>
+        <w:pStyle w:val="ListParagraph"/>
+        <w:spacing w:line="480" w:lineRule="auto"/>
+        <w:rPr>
+          <w:rFonts w:ascii="Times New Roman" w:hAnsi="Times New Roman" w:cs="Times New Roman"/>
+        </w:rPr>
+      </w:pPr>
+      <w:r>
+        <w:rPr>
+          <w:rFonts w:ascii="Times New Roman" w:hAnsi="Times New Roman" w:cs="Times New Roman"/>
+        </w:rPr>
+        <w:t>sss</w:t>
+      </w:r>
+    </w:p>
+    <w:p>
+      <w:pPr>
+        <w:pStyle w:val="Heading4"/>
+      </w:pPr>
+      <w:r>
+        <w:t>Pembuatan Landing Page</w:t>
+      </w:r>
+    </w:p>
+    <w:p>
+      <w:pPr>
+        <w:pStyle w:val="ListParagraph"/>
+        <w:spacing w:line="480" w:lineRule="auto"/>
+        <w:rPr>
+          <w:rFonts w:ascii="Times New Roman" w:hAnsi="Times New Roman" w:cs="Times New Roman"/>
+        </w:rPr>
+      </w:pPr>
+      <w:r>
+        <w:rPr>
+          <w:rFonts w:ascii="Times New Roman" w:hAnsi="Times New Roman" w:cs="Times New Roman"/>
+        </w:rPr>
+        <w:t>sss</w:t>
       </w:r>
     </w:p>
     <w:p>
@@ -3771,10 +4561,10 @@
 <file path=word/numbering.xml><?xml version="1.0" encoding="utf-8"?>
 <w:numbering xmlns:wpc="http://schemas.microsoft.com/office/word/2010/wordprocessingCanvas" xmlns:cx="http://schemas.microsoft.com/office/drawing/2014/chartex" xmlns:cx1="http://schemas.microsoft.com/office/drawing/2015/9/8/chartex" xmlns:cx2="http://schemas.microsoft.com/office/drawing/2015/10/21/chartex" xmlns:cx3="http://schemas.microsoft.com/office/drawing/2016/5/9/chartex" xmlns:cx4="http://schemas.microsoft.com/office/drawing/2016/5/10/chartex" xmlns:cx5="http://schemas.microsoft.com/office/drawing/2016/5/11/chartex" xmlns:cx6="http://schemas.microsoft.com/office/drawing/2016/5/12/chartex" xmlns:cx7="http://schemas.microsoft.com/office/drawing/2016/5/13/chartex" xmlns:cx8="http://schemas.microsoft.com/office/drawing/2016/5/14/chartex" xmlns:mc="http://schemas.openxmlformats.org/markup-compatibility/2006" xmlns:aink="http://schemas.microsoft.com/office/drawing/2016/ink" xmlns:am3d="http://schemas.microsoft.com/office/drawing/2017/model3d" xmlns:o="urn:schemas-microsoft-com:office:office" xmlns:oel="http://schemas.microsoft.com/office/2019/extlst" xmlns:r="http://schemas.openxmlformats.org/officeDocument/2006/relationships" xmlns:m="http://schemas.openxmlformats.org/officeDocument/2006/math" xmlns:v="urn:schemas-microsoft-com:vml" xmlns:wp14="http://schemas.microsoft.com/office/word/2010/wordprocessingDrawing" xmlns:wp="http://schemas.openxmlformats.org/drawingml/2006/wordprocessingDrawing" xmlns:w10="urn:schemas-microsoft-com:office:word" xmlns:w="http://schemas.openxmlformats.org/wordprocessingml/2006/main" xmlns:w14="http://schemas.microsoft.com/office/word/2010/wordml" xmlns:w15="http://schemas.microsoft.com/office/word/2012/wordml" xmlns:w16cex="http://schemas.microsoft.com/office/word/2018/wordml/cex" xmlns:w16cid="http://schemas.microsoft.com/office/word/2016/wordml/cid" xmlns:w16="http://schemas.microsoft.com/office/word/2018/wordml" xmlns:w16du="http://schemas.microsoft.com/office/word/2023/wordml/word16du" xmlns:w16sdtdh="http://schemas.microsoft.com/office/word/2020/wordml/sdtdatahash" xmlns:w16sdtfl="http://schemas.microsoft.com/office/word/2024/wordml/sdtformatlock" xmlns:w16se="http://schemas.microsoft.com/office/word/2015/wordml/symex" xmlns:wpg="http://schemas.microsoft.com/office/word/2010/wordprocessingGroup" xmlns:wpi="http://schemas.microsoft.com/office/word/2010/wordprocessingInk" xmlns:wne="http://schemas.microsoft.com/office/word/2006/wordml" xmlns:wps="http://schemas.microsoft.com/office/word/2010/wordprocessingShape" mc:Ignorable="w14 w15 w16se w16cid w16 w16cex w16sdtdh w16sdtfl w16du wp14">
   <w:abstractNum w:abstractNumId="0" w15:restartNumberingAfterBreak="0">
-    <w:nsid w:val="2B7B57CD"/>
+    <w:nsid w:val="1B792F65"/>
     <w:multiLevelType w:val="hybridMultilevel"/>
-    <w:tmpl w:val="0A640A02"/>
-    <w:lvl w:ilvl="0" w:tplc="0409000F">
+    <w:tmpl w:val="5082DAE2"/>
+    <w:lvl w:ilvl="0" w:tplc="FFFFFFFF">
       <w:start w:val="1"/>
       <w:numFmt w:val="decimal"/>
       <w:lvlText w:val="%1."/>
@@ -3786,7 +4576,7 @@
         <w:rFonts w:hint="default"/>
       </w:rPr>
     </w:lvl>
-    <w:lvl w:ilvl="1" w:tplc="04090003" w:tentative="1">
+    <w:lvl w:ilvl="1" w:tplc="FFFFFFFF" w:tentative="1">
       <w:start w:val="1"/>
       <w:numFmt w:val="bullet"/>
       <w:lvlText w:val="o"/>
@@ -3798,7 +4588,7 @@
         <w:rFonts w:ascii="Courier New" w:hAnsi="Courier New" w:cs="Courier New" w:hint="default"/>
       </w:rPr>
     </w:lvl>
-    <w:lvl w:ilvl="2" w:tplc="04090005" w:tentative="1">
+    <w:lvl w:ilvl="2" w:tplc="FFFFFFFF" w:tentative="1">
       <w:start w:val="1"/>
       <w:numFmt w:val="bullet"/>
       <w:lvlText w:val=""/>
@@ -3810,7 +4600,7 @@
         <w:rFonts w:ascii="Wingdings" w:hAnsi="Wingdings" w:hint="default"/>
       </w:rPr>
     </w:lvl>
-    <w:lvl w:ilvl="3" w:tplc="04090001" w:tentative="1">
+    <w:lvl w:ilvl="3" w:tplc="FFFFFFFF" w:tentative="1">
       <w:start w:val="1"/>
       <w:numFmt w:val="bullet"/>
       <w:lvlText w:val=""/>
@@ -3822,7 +4612,7 @@
         <w:rFonts w:ascii="Symbol" w:hAnsi="Symbol" w:hint="default"/>
       </w:rPr>
     </w:lvl>
-    <w:lvl w:ilvl="4" w:tplc="04090003" w:tentative="1">
+    <w:lvl w:ilvl="4" w:tplc="FFFFFFFF" w:tentative="1">
       <w:start w:val="1"/>
       <w:numFmt w:val="bullet"/>
       <w:lvlText w:val="o"/>
@@ -3834,7 +4624,7 @@
         <w:rFonts w:ascii="Courier New" w:hAnsi="Courier New" w:cs="Courier New" w:hint="default"/>
       </w:rPr>
     </w:lvl>
-    <w:lvl w:ilvl="5" w:tplc="04090005" w:tentative="1">
+    <w:lvl w:ilvl="5" w:tplc="FFFFFFFF" w:tentative="1">
       <w:start w:val="1"/>
       <w:numFmt w:val="bullet"/>
       <w:lvlText w:val=""/>
@@ -3846,7 +4636,7 @@
         <w:rFonts w:ascii="Wingdings" w:hAnsi="Wingdings" w:hint="default"/>
       </w:rPr>
     </w:lvl>
-    <w:lvl w:ilvl="6" w:tplc="04090001" w:tentative="1">
+    <w:lvl w:ilvl="6" w:tplc="FFFFFFFF" w:tentative="1">
       <w:start w:val="1"/>
       <w:numFmt w:val="bullet"/>
       <w:lvlText w:val=""/>
@@ -3858,7 +4648,7 @@
         <w:rFonts w:ascii="Symbol" w:hAnsi="Symbol" w:hint="default"/>
       </w:rPr>
     </w:lvl>
-    <w:lvl w:ilvl="7" w:tplc="04090003" w:tentative="1">
+    <w:lvl w:ilvl="7" w:tplc="FFFFFFFF" w:tentative="1">
       <w:start w:val="1"/>
       <w:numFmt w:val="bullet"/>
       <w:lvlText w:val="o"/>
@@ -3870,7 +4660,7 @@
         <w:rFonts w:ascii="Courier New" w:hAnsi="Courier New" w:cs="Courier New" w:hint="default"/>
       </w:rPr>
     </w:lvl>
-    <w:lvl w:ilvl="8" w:tplc="04090005" w:tentative="1">
+    <w:lvl w:ilvl="8" w:tplc="FFFFFFFF" w:tentative="1">
       <w:start w:val="1"/>
       <w:numFmt w:val="bullet"/>
       <w:lvlText w:val=""/>
@@ -3884,6 +4674,293 @@
     </w:lvl>
   </w:abstractNum>
   <w:abstractNum w:abstractNumId="1" w15:restartNumberingAfterBreak="0">
+    <w:nsid w:val="1B8B5DC0"/>
+    <w:multiLevelType w:val="hybridMultilevel"/>
+    <w:tmpl w:val="94307F80"/>
+    <w:lvl w:ilvl="0" w:tplc="176AA08A">
+      <w:start w:val="1"/>
+      <w:numFmt w:val="upperLetter"/>
+      <w:pStyle w:val="Heading5"/>
+      <w:lvlText w:val="%1."/>
+      <w:lvlJc w:val="left"/>
+      <w:pPr>
+        <w:ind w:left="6480" w:hanging="360"/>
+      </w:pPr>
+    </w:lvl>
+    <w:lvl w:ilvl="1" w:tplc="04090019" w:tentative="1">
+      <w:start w:val="1"/>
+      <w:numFmt w:val="lowerLetter"/>
+      <w:lvlText w:val="%2."/>
+      <w:lvlJc w:val="left"/>
+      <w:pPr>
+        <w:ind w:left="7200" w:hanging="360"/>
+      </w:pPr>
+    </w:lvl>
+    <w:lvl w:ilvl="2" w:tplc="0409001B" w:tentative="1">
+      <w:start w:val="1"/>
+      <w:numFmt w:val="lowerRoman"/>
+      <w:lvlText w:val="%3."/>
+      <w:lvlJc w:val="right"/>
+      <w:pPr>
+        <w:ind w:left="7920" w:hanging="180"/>
+      </w:pPr>
+    </w:lvl>
+    <w:lvl w:ilvl="3" w:tplc="0409000F" w:tentative="1">
+      <w:start w:val="1"/>
+      <w:numFmt w:val="decimal"/>
+      <w:lvlText w:val="%4."/>
+      <w:lvlJc w:val="left"/>
+      <w:pPr>
+        <w:ind w:left="8640" w:hanging="360"/>
+      </w:pPr>
+    </w:lvl>
+    <w:lvl w:ilvl="4" w:tplc="04090019" w:tentative="1">
+      <w:start w:val="1"/>
+      <w:numFmt w:val="lowerLetter"/>
+      <w:lvlText w:val="%5."/>
+      <w:lvlJc w:val="left"/>
+      <w:pPr>
+        <w:ind w:left="9360" w:hanging="360"/>
+      </w:pPr>
+    </w:lvl>
+    <w:lvl w:ilvl="5" w:tplc="0409001B" w:tentative="1">
+      <w:start w:val="1"/>
+      <w:numFmt w:val="lowerRoman"/>
+      <w:lvlText w:val="%6."/>
+      <w:lvlJc w:val="right"/>
+      <w:pPr>
+        <w:ind w:left="10080" w:hanging="180"/>
+      </w:pPr>
+    </w:lvl>
+    <w:lvl w:ilvl="6" w:tplc="0409000F" w:tentative="1">
+      <w:start w:val="1"/>
+      <w:numFmt w:val="decimal"/>
+      <w:lvlText w:val="%7."/>
+      <w:lvlJc w:val="left"/>
+      <w:pPr>
+        <w:ind w:left="10800" w:hanging="360"/>
+      </w:pPr>
+    </w:lvl>
+    <w:lvl w:ilvl="7" w:tplc="04090019" w:tentative="1">
+      <w:start w:val="1"/>
+      <w:numFmt w:val="lowerLetter"/>
+      <w:lvlText w:val="%8."/>
+      <w:lvlJc w:val="left"/>
+      <w:pPr>
+        <w:ind w:left="11520" w:hanging="360"/>
+      </w:pPr>
+    </w:lvl>
+    <w:lvl w:ilvl="8" w:tplc="0409001B" w:tentative="1">
+      <w:start w:val="1"/>
+      <w:numFmt w:val="lowerRoman"/>
+      <w:lvlText w:val="%9."/>
+      <w:lvlJc w:val="right"/>
+      <w:pPr>
+        <w:ind w:left="12240" w:hanging="180"/>
+      </w:pPr>
+    </w:lvl>
+  </w:abstractNum>
+  <w:abstractNum w:abstractNumId="2" w15:restartNumberingAfterBreak="0">
+    <w:nsid w:val="1FE53CE5"/>
+    <w:multiLevelType w:val="hybridMultilevel"/>
+    <w:tmpl w:val="D2EAEADC"/>
+    <w:lvl w:ilvl="0" w:tplc="8FD8E216">
+      <w:start w:val="1"/>
+      <w:numFmt w:val="decimal"/>
+      <w:pStyle w:val="Heading4"/>
+      <w:lvlText w:val="%1."/>
+      <w:lvlJc w:val="left"/>
+      <w:pPr>
+        <w:ind w:left="720" w:hanging="360"/>
+      </w:pPr>
+    </w:lvl>
+    <w:lvl w:ilvl="1" w:tplc="04090019" w:tentative="1">
+      <w:start w:val="1"/>
+      <w:numFmt w:val="lowerLetter"/>
+      <w:lvlText w:val="%2."/>
+      <w:lvlJc w:val="left"/>
+      <w:pPr>
+        <w:ind w:left="1440" w:hanging="360"/>
+      </w:pPr>
+    </w:lvl>
+    <w:lvl w:ilvl="2" w:tplc="0409001B" w:tentative="1">
+      <w:start w:val="1"/>
+      <w:numFmt w:val="lowerRoman"/>
+      <w:lvlText w:val="%3."/>
+      <w:lvlJc w:val="right"/>
+      <w:pPr>
+        <w:ind w:left="2160" w:hanging="180"/>
+      </w:pPr>
+    </w:lvl>
+    <w:lvl w:ilvl="3" w:tplc="0409000F" w:tentative="1">
+      <w:start w:val="1"/>
+      <w:numFmt w:val="decimal"/>
+      <w:lvlText w:val="%4."/>
+      <w:lvlJc w:val="left"/>
+      <w:pPr>
+        <w:ind w:left="2880" w:hanging="360"/>
+      </w:pPr>
+    </w:lvl>
+    <w:lvl w:ilvl="4" w:tplc="04090019" w:tentative="1">
+      <w:start w:val="1"/>
+      <w:numFmt w:val="lowerLetter"/>
+      <w:lvlText w:val="%5."/>
+      <w:lvlJc w:val="left"/>
+      <w:pPr>
+        <w:ind w:left="3600" w:hanging="360"/>
+      </w:pPr>
+    </w:lvl>
+    <w:lvl w:ilvl="5" w:tplc="0409001B" w:tentative="1">
+      <w:start w:val="1"/>
+      <w:numFmt w:val="lowerRoman"/>
+      <w:lvlText w:val="%6."/>
+      <w:lvlJc w:val="right"/>
+      <w:pPr>
+        <w:ind w:left="4320" w:hanging="180"/>
+      </w:pPr>
+    </w:lvl>
+    <w:lvl w:ilvl="6" w:tplc="0409000F" w:tentative="1">
+      <w:start w:val="1"/>
+      <w:numFmt w:val="decimal"/>
+      <w:lvlText w:val="%7."/>
+      <w:lvlJc w:val="left"/>
+      <w:pPr>
+        <w:ind w:left="5040" w:hanging="360"/>
+      </w:pPr>
+    </w:lvl>
+    <w:lvl w:ilvl="7" w:tplc="04090019" w:tentative="1">
+      <w:start w:val="1"/>
+      <w:numFmt w:val="lowerLetter"/>
+      <w:lvlText w:val="%8."/>
+      <w:lvlJc w:val="left"/>
+      <w:pPr>
+        <w:ind w:left="5760" w:hanging="360"/>
+      </w:pPr>
+    </w:lvl>
+    <w:lvl w:ilvl="8" w:tplc="0409001B" w:tentative="1">
+      <w:start w:val="1"/>
+      <w:numFmt w:val="lowerRoman"/>
+      <w:lvlText w:val="%9."/>
+      <w:lvlJc w:val="right"/>
+      <w:pPr>
+        <w:ind w:left="6480" w:hanging="180"/>
+      </w:pPr>
+    </w:lvl>
+  </w:abstractNum>
+  <w:abstractNum w:abstractNumId="3" w15:restartNumberingAfterBreak="0">
+    <w:nsid w:val="2B7B57CD"/>
+    <w:multiLevelType w:val="hybridMultilevel"/>
+    <w:tmpl w:val="5082DAE2"/>
+    <w:lvl w:ilvl="0" w:tplc="0409000F">
+      <w:start w:val="1"/>
+      <w:numFmt w:val="decimal"/>
+      <w:lvlText w:val="%1."/>
+      <w:lvlJc w:val="left"/>
+      <w:pPr>
+        <w:ind w:left="720" w:hanging="360"/>
+      </w:pPr>
+      <w:rPr>
+        <w:rFonts w:hint="default"/>
+      </w:rPr>
+    </w:lvl>
+    <w:lvl w:ilvl="1" w:tplc="04090003" w:tentative="1">
+      <w:start w:val="1"/>
+      <w:numFmt w:val="bullet"/>
+      <w:lvlText w:val="o"/>
+      <w:lvlJc w:val="left"/>
+      <w:pPr>
+        <w:ind w:left="1440" w:hanging="360"/>
+      </w:pPr>
+      <w:rPr>
+        <w:rFonts w:ascii="Courier New" w:hAnsi="Courier New" w:cs="Courier New" w:hint="default"/>
+      </w:rPr>
+    </w:lvl>
+    <w:lvl w:ilvl="2" w:tplc="04090005" w:tentative="1">
+      <w:start w:val="1"/>
+      <w:numFmt w:val="bullet"/>
+      <w:lvlText w:val=""/>
+      <w:lvlJc w:val="left"/>
+      <w:pPr>
+        <w:ind w:left="2160" w:hanging="360"/>
+      </w:pPr>
+      <w:rPr>
+        <w:rFonts w:ascii="Wingdings" w:hAnsi="Wingdings" w:hint="default"/>
+      </w:rPr>
+    </w:lvl>
+    <w:lvl w:ilvl="3" w:tplc="04090001" w:tentative="1">
+      <w:start w:val="1"/>
+      <w:numFmt w:val="bullet"/>
+      <w:lvlText w:val=""/>
+      <w:lvlJc w:val="left"/>
+      <w:pPr>
+        <w:ind w:left="2880" w:hanging="360"/>
+      </w:pPr>
+      <w:rPr>
+        <w:rFonts w:ascii="Symbol" w:hAnsi="Symbol" w:hint="default"/>
+      </w:rPr>
+    </w:lvl>
+    <w:lvl w:ilvl="4" w:tplc="04090003" w:tentative="1">
+      <w:start w:val="1"/>
+      <w:numFmt w:val="bullet"/>
+      <w:lvlText w:val="o"/>
+      <w:lvlJc w:val="left"/>
+      <w:pPr>
+        <w:ind w:left="3600" w:hanging="360"/>
+      </w:pPr>
+      <w:rPr>
+        <w:rFonts w:ascii="Courier New" w:hAnsi="Courier New" w:cs="Courier New" w:hint="default"/>
+      </w:rPr>
+    </w:lvl>
+    <w:lvl w:ilvl="5" w:tplc="04090005" w:tentative="1">
+      <w:start w:val="1"/>
+      <w:numFmt w:val="bullet"/>
+      <w:lvlText w:val=""/>
+      <w:lvlJc w:val="left"/>
+      <w:pPr>
+        <w:ind w:left="4320" w:hanging="360"/>
+      </w:pPr>
+      <w:rPr>
+        <w:rFonts w:ascii="Wingdings" w:hAnsi="Wingdings" w:hint="default"/>
+      </w:rPr>
+    </w:lvl>
+    <w:lvl w:ilvl="6" w:tplc="04090001" w:tentative="1">
+      <w:start w:val="1"/>
+      <w:numFmt w:val="bullet"/>
+      <w:lvlText w:val=""/>
+      <w:lvlJc w:val="left"/>
+      <w:pPr>
+        <w:ind w:left="5040" w:hanging="360"/>
+      </w:pPr>
+      <w:rPr>
+        <w:rFonts w:ascii="Symbol" w:hAnsi="Symbol" w:hint="default"/>
+      </w:rPr>
+    </w:lvl>
+    <w:lvl w:ilvl="7" w:tplc="04090003" w:tentative="1">
+      <w:start w:val="1"/>
+      <w:numFmt w:val="bullet"/>
+      <w:lvlText w:val="o"/>
+      <w:lvlJc w:val="left"/>
+      <w:pPr>
+        <w:ind w:left="5760" w:hanging="360"/>
+      </w:pPr>
+      <w:rPr>
+        <w:rFonts w:ascii="Courier New" w:hAnsi="Courier New" w:cs="Courier New" w:hint="default"/>
+      </w:rPr>
+    </w:lvl>
+    <w:lvl w:ilvl="8" w:tplc="04090005" w:tentative="1">
+      <w:start w:val="1"/>
+      <w:numFmt w:val="bullet"/>
+      <w:lvlText w:val=""/>
+      <w:lvlJc w:val="left"/>
+      <w:pPr>
+        <w:ind w:left="6480" w:hanging="360"/>
+      </w:pPr>
+      <w:rPr>
+        <w:rFonts w:ascii="Wingdings" w:hAnsi="Wingdings" w:hint="default"/>
+      </w:rPr>
+    </w:lvl>
+  </w:abstractNum>
+  <w:abstractNum w:abstractNumId="4" w15:restartNumberingAfterBreak="0">
     <w:nsid w:val="2EE4123E"/>
     <w:multiLevelType w:val="hybridMultilevel"/>
     <w:tmpl w:val="259C1778"/>
@@ -3996,7 +5073,120 @@
       </w:rPr>
     </w:lvl>
   </w:abstractNum>
-  <w:abstractNum w:abstractNumId="2" w15:restartNumberingAfterBreak="0">
+  <w:abstractNum w:abstractNumId="5" w15:restartNumberingAfterBreak="0">
+    <w:nsid w:val="4F7E66BA"/>
+    <w:multiLevelType w:val="hybridMultilevel"/>
+    <w:tmpl w:val="79F2C6B8"/>
+    <w:lvl w:ilvl="0" w:tplc="04090001">
+      <w:start w:val="1"/>
+      <w:numFmt w:val="bullet"/>
+      <w:lvlText w:val=""/>
+      <w:lvlJc w:val="left"/>
+      <w:pPr>
+        <w:ind w:left="1440" w:hanging="360"/>
+      </w:pPr>
+      <w:rPr>
+        <w:rFonts w:ascii="Symbol" w:hAnsi="Symbol" w:hint="default"/>
+      </w:rPr>
+    </w:lvl>
+    <w:lvl w:ilvl="1" w:tplc="04090003" w:tentative="1">
+      <w:start w:val="1"/>
+      <w:numFmt w:val="bullet"/>
+      <w:lvlText w:val="o"/>
+      <w:lvlJc w:val="left"/>
+      <w:pPr>
+        <w:ind w:left="2160" w:hanging="360"/>
+      </w:pPr>
+      <w:rPr>
+        <w:rFonts w:ascii="Courier New" w:hAnsi="Courier New" w:cs="Courier New" w:hint="default"/>
+      </w:rPr>
+    </w:lvl>
+    <w:lvl w:ilvl="2" w:tplc="04090005" w:tentative="1">
+      <w:start w:val="1"/>
+      <w:numFmt w:val="bullet"/>
+      <w:lvlText w:val=""/>
+      <w:lvlJc w:val="left"/>
+      <w:pPr>
+        <w:ind w:left="2880" w:hanging="360"/>
+      </w:pPr>
+      <w:rPr>
+        <w:rFonts w:ascii="Wingdings" w:hAnsi="Wingdings" w:hint="default"/>
+      </w:rPr>
+    </w:lvl>
+    <w:lvl w:ilvl="3" w:tplc="04090001" w:tentative="1">
+      <w:start w:val="1"/>
+      <w:numFmt w:val="bullet"/>
+      <w:lvlText w:val=""/>
+      <w:lvlJc w:val="left"/>
+      <w:pPr>
+        <w:ind w:left="3600" w:hanging="360"/>
+      </w:pPr>
+      <w:rPr>
+        <w:rFonts w:ascii="Symbol" w:hAnsi="Symbol" w:hint="default"/>
+      </w:rPr>
+    </w:lvl>
+    <w:lvl w:ilvl="4" w:tplc="04090003" w:tentative="1">
+      <w:start w:val="1"/>
+      <w:numFmt w:val="bullet"/>
+      <w:lvlText w:val="o"/>
+      <w:lvlJc w:val="left"/>
+      <w:pPr>
+        <w:ind w:left="4320" w:hanging="360"/>
+      </w:pPr>
+      <w:rPr>
+        <w:rFonts w:ascii="Courier New" w:hAnsi="Courier New" w:cs="Courier New" w:hint="default"/>
+      </w:rPr>
+    </w:lvl>
+    <w:lvl w:ilvl="5" w:tplc="04090005" w:tentative="1">
+      <w:start w:val="1"/>
+      <w:numFmt w:val="bullet"/>
+      <w:lvlText w:val=""/>
+      <w:lvlJc w:val="left"/>
+      <w:pPr>
+        <w:ind w:left="5040" w:hanging="360"/>
+      </w:pPr>
+      <w:rPr>
+        <w:rFonts w:ascii="Wingdings" w:hAnsi="Wingdings" w:hint="default"/>
+      </w:rPr>
+    </w:lvl>
+    <w:lvl w:ilvl="6" w:tplc="04090001" w:tentative="1">
+      <w:start w:val="1"/>
+      <w:numFmt w:val="bullet"/>
+      <w:lvlText w:val=""/>
+      <w:lvlJc w:val="left"/>
+      <w:pPr>
+        <w:ind w:left="5760" w:hanging="360"/>
+      </w:pPr>
+      <w:rPr>
+        <w:rFonts w:ascii="Symbol" w:hAnsi="Symbol" w:hint="default"/>
+      </w:rPr>
+    </w:lvl>
+    <w:lvl w:ilvl="7" w:tplc="04090003" w:tentative="1">
+      <w:start w:val="1"/>
+      <w:numFmt w:val="bullet"/>
+      <w:lvlText w:val="o"/>
+      <w:lvlJc w:val="left"/>
+      <w:pPr>
+        <w:ind w:left="6480" w:hanging="360"/>
+      </w:pPr>
+      <w:rPr>
+        <w:rFonts w:ascii="Courier New" w:hAnsi="Courier New" w:cs="Courier New" w:hint="default"/>
+      </w:rPr>
+    </w:lvl>
+    <w:lvl w:ilvl="8" w:tplc="04090005" w:tentative="1">
+      <w:start w:val="1"/>
+      <w:numFmt w:val="bullet"/>
+      <w:lvlText w:val=""/>
+      <w:lvlJc w:val="left"/>
+      <w:pPr>
+        <w:ind w:left="7200" w:hanging="360"/>
+      </w:pPr>
+      <w:rPr>
+        <w:rFonts w:ascii="Wingdings" w:hAnsi="Wingdings" w:hint="default"/>
+      </w:rPr>
+    </w:lvl>
+  </w:abstractNum>
+  <w:abstractNum w:abstractNumId="6" w15:restartNumberingAfterBreak="0">
     <w:nsid w:val="63917590"/>
     <w:multiLevelType w:val="hybridMultilevel"/>
     <w:tmpl w:val="D714BB68"/>
@@ -4109,7 +5299,7 @@
       </w:rPr>
     </w:lvl>
   </w:abstractNum>
-  <w:abstractNum w:abstractNumId="3" w15:restartNumberingAfterBreak="0">
+  <w:abstractNum w:abstractNumId="7" w15:restartNumberingAfterBreak="0">
     <w:nsid w:val="75AD4CC8"/>
     <w:multiLevelType w:val="hybridMultilevel"/>
     <w:tmpl w:val="CB147842"/>
@@ -4223,16 +5413,28 @@
     </w:lvl>
   </w:abstractNum>
   <w:num w:numId="1" w16cid:durableId="1173185611">
+    <w:abstractNumId w:val="6"/>
+  </w:num>
+  <w:num w:numId="2" w16cid:durableId="2008241989">
+    <w:abstractNumId w:val="3"/>
+  </w:num>
+  <w:num w:numId="3" w16cid:durableId="1280189446">
+    <w:abstractNumId w:val="4"/>
+  </w:num>
+  <w:num w:numId="4" w16cid:durableId="126434000">
+    <w:abstractNumId w:val="7"/>
+  </w:num>
+  <w:num w:numId="5" w16cid:durableId="88235218">
+    <w:abstractNumId w:val="0"/>
+  </w:num>
+  <w:num w:numId="6" w16cid:durableId="2075662437">
     <w:abstractNumId w:val="2"/>
   </w:num>
-  <w:num w:numId="2" w16cid:durableId="2008241989">
-    <w:abstractNumId w:val="0"/>
-  </w:num>
-  <w:num w:numId="3" w16cid:durableId="1280189446">
+  <w:num w:numId="7" w16cid:durableId="100228626">
     <w:abstractNumId w:val="1"/>
   </w:num>
-  <w:num w:numId="4" w16cid:durableId="126434000">
-    <w:abstractNumId w:val="3"/>
+  <w:num w:numId="8" w16cid:durableId="1520004101">
+    <w:abstractNumId w:val="5"/>
   </w:num>
 </w:numbering>
 </file>
@@ -4257,7 +5459,7 @@
     </w:pPrDefault>
   </w:docDefaults>
   <w:latentStyles w:defLockedState="0" w:defUIPriority="99" w:defSemiHidden="0" w:defUnhideWhenUsed="0" w:defQFormat="0" w:count="376">
-    <w:lsdException w:name="Normal" w:uiPriority="0" w:qFormat="1"/>
+    <w:lsdException w:name="Normal" w:uiPriority="0"/>
     <w:lsdException w:name="heading 1" w:uiPriority="9" w:qFormat="1"/>
     <w:lsdException w:name="heading 2" w:semiHidden="1" w:uiPriority="9" w:unhideWhenUsed="1" w:qFormat="1"/>
     <w:lsdException w:name="heading 3" w:semiHidden="1" w:uiPriority="9" w:unhideWhenUsed="1" w:qFormat="1"/>
@@ -4414,7 +5616,7 @@
     <w:lsdException w:name="Table Grid" w:uiPriority="39"/>
     <w:lsdException w:name="Table Theme" w:semiHidden="1" w:unhideWhenUsed="1"/>
     <w:lsdException w:name="Placeholder Text" w:semiHidden="1"/>
-    <w:lsdException w:name="No Spacing" w:uiPriority="1" w:qFormat="1"/>
+    <w:lsdException w:name="No Spacing" w:uiPriority="1"/>
     <w:lsdException w:name="Light Shading" w:uiPriority="60"/>
     <w:lsdException w:name="Light List" w:uiPriority="61"/>
     <w:lsdException w:name="Light Grid" w:uiPriority="62"/>
@@ -4636,7 +5838,6 @@
   </w:latentStyles>
   <w:style w:type="paragraph" w:default="1" w:styleId="Normal">
     <w:name w:val="Normal"/>
-    <w:qFormat/>
   </w:style>
   <w:style w:type="paragraph" w:styleId="Heading1">
     <w:name w:val="heading 1"/>
@@ -4708,46 +5909,50 @@
   </w:style>
   <w:style w:type="paragraph" w:styleId="Heading4">
     <w:name w:val="heading 4"/>
+    <w:aliases w:val="Heading 4 (sub abc)"/>
     <w:basedOn w:val="Normal"/>
     <w:next w:val="Normal"/>
     <w:link w:val="Heading4Char"/>
     <w:uiPriority w:val="9"/>
-    <w:semiHidden/>
     <w:unhideWhenUsed/>
     <w:qFormat/>
-    <w:rsid w:val="00023480"/>
+    <w:rsid w:val="00126550"/>
     <w:pPr>
       <w:keepNext/>
       <w:keepLines/>
-      <w:spacing w:before="80" w:after="40"/>
+      <w:numPr>
+        <w:numId w:val="6"/>
+      </w:numPr>
+      <w:spacing w:before="80" w:after="40" w:line="480" w:lineRule="auto"/>
       <w:outlineLvl w:val="3"/>
     </w:pPr>
     <w:rPr>
-      <w:rFonts w:eastAsiaTheme="majorEastAsia" w:cstheme="majorBidi"/>
-      <w:i/>
+      <w:rFonts w:ascii="Times New Roman" w:eastAsiaTheme="majorEastAsia" w:hAnsi="Times New Roman" w:cstheme="majorBidi"/>
       <w:iCs/>
-      <w:color w:val="2F5496" w:themeColor="accent1" w:themeShade="BF"/>
     </w:rPr>
   </w:style>
   <w:style w:type="paragraph" w:styleId="Heading5">
     <w:name w:val="heading 5"/>
+    <w:aliases w:val="Heading 5 (point sub bab abc)"/>
     <w:basedOn w:val="Normal"/>
     <w:next w:val="Normal"/>
     <w:link w:val="Heading5Char"/>
     <w:uiPriority w:val="9"/>
-    <w:semiHidden/>
     <w:unhideWhenUsed/>
     <w:qFormat/>
-    <w:rsid w:val="00023480"/>
+    <w:rsid w:val="00692767"/>
     <w:pPr>
       <w:keepNext/>
       <w:keepLines/>
-      <w:spacing w:before="80" w:after="40"/>
+      <w:numPr>
+        <w:numId w:val="7"/>
+      </w:numPr>
+      <w:spacing w:before="80" w:after="40" w:line="480" w:lineRule="auto"/>
+      <w:ind w:left="1080"/>
       <w:outlineLvl w:val="4"/>
     </w:pPr>
     <w:rPr>
-      <w:rFonts w:eastAsiaTheme="majorEastAsia" w:cstheme="majorBidi"/>
-      <w:color w:val="2F5496" w:themeColor="accent1" w:themeShade="BF"/>
+      <w:rFonts w:ascii="Times New Roman" w:eastAsiaTheme="majorEastAsia" w:hAnsi="Times New Roman" w:cstheme="majorBidi"/>
     </w:rPr>
   </w:style>
   <w:style w:type="paragraph" w:styleId="Heading6">
@@ -4841,6 +6046,7 @@
   <w:style w:type="character" w:default="1" w:styleId="DefaultParagraphFont">
     <w:name w:val="Default Paragraph Font"/>
     <w:uiPriority w:val="1"/>
+    <w:semiHidden/>
     <w:unhideWhenUsed/>
   </w:style>
   <w:style w:type="table" w:default="1" w:styleId="TableNormal">
@@ -4906,28 +6112,25 @@
   </w:style>
   <w:style w:type="character" w:customStyle="1" w:styleId="Heading4Char">
     <w:name w:val="Heading 4 Char"/>
+    <w:aliases w:val="Heading 4 (sub abc) Char"/>
     <w:basedOn w:val="DefaultParagraphFont"/>
     <w:link w:val="Heading4"/>
     <w:uiPriority w:val="9"/>
-    <w:semiHidden/>
-    <w:rsid w:val="00023480"/>
+    <w:rsid w:val="00126550"/>
     <w:rPr>
-      <w:rFonts w:eastAsiaTheme="majorEastAsia" w:cstheme="majorBidi"/>
-      <w:i/>
+      <w:rFonts w:ascii="Times New Roman" w:eastAsiaTheme="majorEastAsia" w:hAnsi="Times New Roman" w:cstheme="majorBidi"/>
       <w:iCs/>
-      <w:color w:val="2F5496" w:themeColor="accent1" w:themeShade="BF"/>
     </w:rPr>
   </w:style>
   <w:style w:type="character" w:customStyle="1" w:styleId="Heading5Char">
     <w:name w:val="Heading 5 Char"/>
+    <w:aliases w:val="Heading 5 (point sub bab abc) Char"/>
     <w:basedOn w:val="DefaultParagraphFont"/>
     <w:link w:val="Heading5"/>
     <w:uiPriority w:val="9"/>
-    <w:semiHidden/>
-    <w:rsid w:val="00023480"/>
+    <w:rsid w:val="00692767"/>
     <w:rPr>
-      <w:rFonts w:eastAsiaTheme="majorEastAsia" w:cstheme="majorBidi"/>
-      <w:color w:val="2F5496" w:themeColor="accent1" w:themeShade="BF"/>
+      <w:rFonts w:ascii="Times New Roman" w:eastAsiaTheme="majorEastAsia" w:hAnsi="Times New Roman" w:cstheme="majorBidi"/>
     </w:rPr>
   </w:style>
   <w:style w:type="character" w:customStyle="1" w:styleId="Heading6Char">
@@ -5548,4 +6751,16 @@
     </a:ext>
   </a:extLst>
 </a:theme>
+</file>
+
+<file path=customXml/item1.xml><?xml version="1.0" encoding="utf-8"?>
+<b:Sources xmlns:b="http://schemas.openxmlformats.org/officeDocument/2006/bibliography" xmlns="http://schemas.openxmlformats.org/officeDocument/2006/bibliography" SelectedStyle="\APASixthEditionOfficeOnline.xsl" StyleName="APA" Version="6"/>
+</file>
+
+<file path=customXml/itemProps1.xml><?xml version="1.0" encoding="utf-8"?>
+<ds:datastoreItem xmlns:ds="http://schemas.openxmlformats.org/officeDocument/2006/customXml" ds:itemID="{723964AA-99C4-4129-8BC5-AF18D3DD99AB}">
+  <ds:schemaRefs>
+    <ds:schemaRef ds:uri="http://schemas.openxmlformats.org/officeDocument/2006/bibliography"/>
+  </ds:schemaRefs>
+</ds:datastoreItem>
 </file>
</xml_diff>

<commit_message>
abis nyicil validasi data. next selesaikan validasi
</commit_message>
<xml_diff>
--- a/non-website/Laporan Akhir KP/2203040182 - Dhika Ramadhan Saputra - Laporan KP.docx
+++ b/non-website/Laporan Akhir KP/2203040182 - Dhika Ramadhan Saputra - Laporan KP.docx
@@ -177,7 +177,6 @@
           <w:szCs w:val="22"/>
         </w:rPr>
       </w:pPr>
-      <w:proofErr w:type="gramStart"/>
       <w:r>
         <w:rPr>
           <w:rFonts w:ascii="Times New Roman" w:hAnsi="Times New Roman" w:cs="Times New Roman"/>
@@ -200,16 +199,15 @@
           <w:sz w:val="22"/>
           <w:szCs w:val="22"/>
         </w:rPr>
-        <w:t>:</w:t>
-      </w:r>
-      <w:proofErr w:type="gramEnd"/>
+        <w:t>: Dhika Ramadhan Saputra</w:t>
+      </w:r>
       <w:r>
         <w:rPr>
           <w:rFonts w:ascii="Times New Roman" w:hAnsi="Times New Roman" w:cs="Times New Roman"/>
           <w:sz w:val="22"/>
           <w:szCs w:val="22"/>
         </w:rPr>
-        <w:t xml:space="preserve"> Dhika Ramadhan Saputra</w:t>
+        <w:br/>
       </w:r>
       <w:r>
         <w:rPr>
@@ -217,16 +215,15 @@
           <w:sz w:val="22"/>
           <w:szCs w:val="22"/>
         </w:rPr>
-        <w:br/>
-      </w:r>
-      <w:proofErr w:type="gramStart"/>
+        <w:t>NIM.</w:t>
+      </w:r>
       <w:r>
         <w:rPr>
           <w:rFonts w:ascii="Times New Roman" w:hAnsi="Times New Roman" w:cs="Times New Roman"/>
           <w:sz w:val="22"/>
           <w:szCs w:val="22"/>
         </w:rPr>
-        <w:t>NIM.</w:t>
+        <w:t xml:space="preserve">  </w:t>
       </w:r>
       <w:r>
         <w:rPr>
@@ -234,24 +231,7 @@
           <w:sz w:val="22"/>
           <w:szCs w:val="22"/>
         </w:rPr>
-        <w:t xml:space="preserve">  </w:t>
-      </w:r>
-      <w:r>
-        <w:rPr>
-          <w:rFonts w:ascii="Times New Roman" w:hAnsi="Times New Roman" w:cs="Times New Roman"/>
-          <w:sz w:val="22"/>
-          <w:szCs w:val="22"/>
-        </w:rPr>
-        <w:t>:</w:t>
-      </w:r>
-      <w:proofErr w:type="gramEnd"/>
-      <w:r>
-        <w:rPr>
-          <w:rFonts w:ascii="Times New Roman" w:hAnsi="Times New Roman" w:cs="Times New Roman"/>
-          <w:sz w:val="22"/>
-          <w:szCs w:val="22"/>
-        </w:rPr>
-        <w:t xml:space="preserve"> 2203040182</w:t>
+        <w:t>: 2203040182</w:t>
       </w:r>
     </w:p>
     <w:p>
@@ -688,21 +668,7 @@
         <w:rPr>
           <w:rFonts w:ascii="Times New Roman" w:hAnsi="Times New Roman" w:cs="Times New Roman"/>
         </w:rPr>
-        <w:t xml:space="preserve">Nomor pendaftaran, jalur masuk, tahun masuk, prodi pilihan 1, prodi pilihan 2, fakultas pilihan 1, fakultas pilihan 2, prodi diterima, fakultas prodi diterima, usia, asal SLTA, jurusan SLTA, alamat asal, alamat domisili, pendidikan ayah, pendidikan ibu, pekerjaan ibu, alamat orang </w:t>
-      </w:r>
-      <w:proofErr w:type="gramStart"/>
-      <w:r>
-        <w:rPr>
-          <w:rFonts w:ascii="Times New Roman" w:hAnsi="Times New Roman" w:cs="Times New Roman"/>
-        </w:rPr>
-        <w:t>tua,  dan</w:t>
-      </w:r>
-      <w:proofErr w:type="gramEnd"/>
-      <w:r>
-        <w:rPr>
-          <w:rFonts w:ascii="Times New Roman" w:hAnsi="Times New Roman" w:cs="Times New Roman"/>
-        </w:rPr>
-        <w:t xml:space="preserve"> Provinsi asal domisili</w:t>
+        <w:t>Nomor pendaftaran, jalur masuk, tahun masuk, prodi pilihan 1, prodi pilihan 2, fakultas pilihan 1, fakultas pilihan 2, prodi diterima, fakultas prodi diterima, usia, asal SLTA, jurusan SLTA, alamat asal, alamat domisili, pendidikan ayah, pendidikan ibu, pekerjaan ibu, alamat orang tua,  dan Provinsi asal domisili</w:t>
       </w:r>
       <w:r>
         <w:rPr>
@@ -1587,7 +1553,10 @@
         </w:rPr>
       </w:pPr>
       <w:r>
-        <w:t xml:space="preserve">gambar </w:t>
+        <w:t>G</w:t>
+      </w:r>
+      <w:r>
+        <w:t xml:space="preserve">ambar </w:t>
       </w:r>
       <w:r>
         <w:fldChar w:fldCharType="begin"/>
@@ -3532,7 +3501,10 @@
         </w:rPr>
       </w:pPr>
       <w:r>
-        <w:t xml:space="preserve">gambar </w:t>
+        <w:t>G</w:t>
+      </w:r>
+      <w:r>
+        <w:t xml:space="preserve">ambar </w:t>
       </w:r>
       <w:r>
         <w:fldChar w:fldCharType="begin"/>
@@ -3837,7 +3809,19 @@
         <w:rPr>
           <w:rFonts w:ascii="Times New Roman" w:hAnsi="Times New Roman" w:cs="Times New Roman"/>
         </w:rPr>
-        <w:t xml:space="preserve">74 kolom informasi yang nantinya akan dipilih pada </w:t>
+        <w:t>74 kolom informasi yang nantinya akan di</w:t>
+      </w:r>
+      <w:r>
+        <w:rPr>
+          <w:rFonts w:ascii="Times New Roman" w:hAnsi="Times New Roman" w:cs="Times New Roman"/>
+        </w:rPr>
+        <w:t>seleksi</w:t>
+      </w:r>
+      <w:r>
+        <w:rPr>
+          <w:rFonts w:ascii="Times New Roman" w:hAnsi="Times New Roman" w:cs="Times New Roman"/>
+        </w:rPr>
+        <w:t xml:space="preserve"> pada </w:t>
       </w:r>
       <w:r>
         <w:rPr>
@@ -3957,7 +3941,10 @@
         <w:jc w:val="center"/>
       </w:pPr>
       <w:r>
-        <w:t xml:space="preserve">gambar </w:t>
+        <w:t>G</w:t>
+      </w:r>
+      <w:r>
+        <w:t xml:space="preserve">ambar </w:t>
       </w:r>
       <w:r>
         <w:fldChar w:fldCharType="begin"/>
@@ -3995,7 +3982,7 @@
           <w:noProof/>
         </w:rPr>
         <w:drawing>
-          <wp:inline distT="0" distB="0" distL="0" distR="0" wp14:anchorId="75188C27" wp14:editId="20959BB2">
+          <wp:inline distT="0" distB="0" distL="0" distR="0" wp14:anchorId="75188C27" wp14:editId="331419FB">
             <wp:extent cx="4608000" cy="1698906"/>
             <wp:effectExtent l="19050" t="19050" r="21590" b="15875"/>
             <wp:docPr id="783286403" name="Picture 4"/>
@@ -4056,7 +4043,10 @@
         </w:rPr>
       </w:pPr>
       <w:r>
-        <w:t xml:space="preserve">gambar </w:t>
+        <w:t>G</w:t>
+      </w:r>
+      <w:r>
+        <w:t xml:space="preserve">ambar </w:t>
       </w:r>
       <w:r>
         <w:fldChar w:fldCharType="begin"/>
@@ -4077,10 +4067,22 @@
         <w:fldChar w:fldCharType="end"/>
       </w:r>
       <w:r>
-        <w:t xml:space="preserve"> Sampel data mentah</w:t>
-      </w:r>
-      <w:r>
-        <w:t xml:space="preserve"> 2024</w:t>
+        <w:t xml:space="preserve"> Sampel</w:t>
+      </w:r>
+      <w:r>
+        <w:t xml:space="preserve"> kolom dan data </w:t>
+      </w:r>
+      <w:r>
+        <w:t>mentah</w:t>
+      </w:r>
+      <w:r>
+        <w:t xml:space="preserve"> </w:t>
+      </w:r>
+      <w:r>
+        <w:t xml:space="preserve">tahun </w:t>
+      </w:r>
+      <w:r>
+        <w:t>2024</w:t>
       </w:r>
       <w:r>
         <w:t xml:space="preserve"> (dengan sensor)</w:t>
@@ -4152,6 +4154,7 @@
       <w:pPr>
         <w:pStyle w:val="ListParagraph"/>
         <w:spacing w:line="480" w:lineRule="auto"/>
+        <w:ind w:firstLine="720"/>
         <w:rPr>
           <w:rFonts w:ascii="Times New Roman" w:hAnsi="Times New Roman" w:cs="Times New Roman"/>
         </w:rPr>
@@ -4215,8 +4218,9 @@
           <w:rFonts w:ascii="Times New Roman" w:hAnsi="Times New Roman" w:cs="Times New Roman"/>
           <w:noProof/>
         </w:rPr>
+        <w:lastRenderedPageBreak/>
         <w:drawing>
-          <wp:inline distT="0" distB="0" distL="0" distR="0" wp14:anchorId="02EBA956" wp14:editId="113B55F5">
+          <wp:inline distT="0" distB="0" distL="0" distR="0" wp14:anchorId="02EBA956" wp14:editId="6D961E44">
             <wp:extent cx="3888000" cy="2160000"/>
             <wp:effectExtent l="19050" t="19050" r="17780" b="12065"/>
             <wp:docPr id="102117401" name="Picture 5"/>
@@ -4277,7 +4281,10 @@
         </w:rPr>
       </w:pPr>
       <w:r>
-        <w:t xml:space="preserve">Gambar </w:t>
+        <w:t>G</w:t>
+      </w:r>
+      <w:r>
+        <w:t xml:space="preserve">ambar </w:t>
       </w:r>
       <w:r>
         <w:fldChar w:fldCharType="begin"/>
@@ -4313,7 +4320,6 @@
           <w:rFonts w:ascii="Times New Roman" w:hAnsi="Times New Roman" w:cs="Times New Roman"/>
           <w:noProof/>
         </w:rPr>
-        <w:lastRenderedPageBreak/>
         <w:drawing>
           <wp:inline distT="0" distB="0" distL="0" distR="0" wp14:anchorId="2A1F1CBC" wp14:editId="11C399CC">
             <wp:extent cx="2520000" cy="2411027"/>
@@ -4412,15 +4418,392 @@
       <w:pPr>
         <w:pStyle w:val="ListParagraph"/>
         <w:spacing w:line="480" w:lineRule="auto"/>
-        <w:rPr>
-          <w:rFonts w:ascii="Times New Roman" w:hAnsi="Times New Roman" w:cs="Times New Roman"/>
-        </w:rPr>
-      </w:pPr>
-      <w:r>
-        <w:rPr>
-          <w:rFonts w:ascii="Times New Roman" w:hAnsi="Times New Roman" w:cs="Times New Roman"/>
-        </w:rPr>
-        <w:t>ss</w:t>
+        <w:ind w:firstLine="720"/>
+        <w:jc w:val="both"/>
+        <w:rPr>
+          <w:rFonts w:ascii="Times New Roman" w:hAnsi="Times New Roman" w:cs="Times New Roman"/>
+        </w:rPr>
+      </w:pPr>
+      <w:r>
+        <w:rPr>
+          <w:rFonts w:ascii="Times New Roman" w:hAnsi="Times New Roman" w:cs="Times New Roman"/>
+        </w:rPr>
+        <w:t xml:space="preserve">Pemilihan </w:t>
+      </w:r>
+      <w:r>
+        <w:rPr>
+          <w:rFonts w:ascii="Times New Roman" w:hAnsi="Times New Roman" w:cs="Times New Roman"/>
+        </w:rPr>
+        <w:t>k</w:t>
+      </w:r>
+      <w:r>
+        <w:rPr>
+          <w:rFonts w:ascii="Times New Roman" w:hAnsi="Times New Roman" w:cs="Times New Roman"/>
+        </w:rPr>
+        <w:t>olom berfungsi untuk mengurangi jumlah kolom informasi dari dataset mentah</w:t>
+      </w:r>
+      <w:r>
+        <w:rPr>
+          <w:rFonts w:ascii="Times New Roman" w:hAnsi="Times New Roman" w:cs="Times New Roman"/>
+        </w:rPr>
+        <w:t xml:space="preserve"> dan menyisakan kolom informasi yang berguna pada tahap visualisasi</w:t>
+      </w:r>
+      <w:r>
+        <w:rPr>
+          <w:rFonts w:ascii="Times New Roman" w:hAnsi="Times New Roman" w:cs="Times New Roman"/>
+        </w:rPr>
+        <w:t xml:space="preserve">, </w:t>
+      </w:r>
+      <w:r>
+        <w:rPr>
+          <w:rFonts w:ascii="Times New Roman" w:hAnsi="Times New Roman" w:cs="Times New Roman"/>
+        </w:rPr>
+        <w:t>proses</w:t>
+      </w:r>
+      <w:r>
+        <w:rPr>
+          <w:rFonts w:ascii="Times New Roman" w:hAnsi="Times New Roman" w:cs="Times New Roman"/>
+        </w:rPr>
+        <w:t xml:space="preserve"> ini sangat bermanfaat untuk efisiensi pada saat validasi data dan </w:t>
+      </w:r>
+      <w:r>
+        <w:rPr>
+          <w:rFonts w:ascii="Times New Roman" w:hAnsi="Times New Roman" w:cs="Times New Roman"/>
+          <w:i/>
+          <w:iCs/>
+        </w:rPr>
+        <w:t>problem solving</w:t>
+      </w:r>
+      <w:r>
+        <w:rPr>
+          <w:rFonts w:ascii="Times New Roman" w:hAnsi="Times New Roman" w:cs="Times New Roman"/>
+        </w:rPr>
+        <w:t>.</w:t>
+      </w:r>
+      <w:r>
+        <w:rPr>
+          <w:rFonts w:ascii="Times New Roman" w:hAnsi="Times New Roman" w:cs="Times New Roman"/>
+        </w:rPr>
+        <w:t xml:space="preserve"> </w:t>
+      </w:r>
+      <w:r>
+        <w:rPr>
+          <w:rFonts w:ascii="Times New Roman" w:hAnsi="Times New Roman" w:cs="Times New Roman"/>
+        </w:rPr>
+        <w:t xml:space="preserve">Berikut ini adalah </w:t>
+      </w:r>
+      <w:r>
+        <w:rPr>
+          <w:rFonts w:ascii="Times New Roman" w:hAnsi="Times New Roman" w:cs="Times New Roman"/>
+        </w:rPr>
+        <w:t>18 dari 74 kolom pilihan</w:t>
+      </w:r>
+      <w:r>
+        <w:rPr>
+          <w:rFonts w:ascii="Times New Roman" w:hAnsi="Times New Roman" w:cs="Times New Roman"/>
+        </w:rPr>
+        <w:t xml:space="preserve"> serta dokumentasi </w:t>
+      </w:r>
+      <w:r>
+        <w:rPr>
+          <w:rFonts w:ascii="Times New Roman" w:hAnsi="Times New Roman" w:cs="Times New Roman"/>
+        </w:rPr>
+        <w:t>dari tahap ini:</w:t>
+      </w:r>
+    </w:p>
+    <w:p>
+      <w:pPr>
+        <w:pStyle w:val="ListParagraph"/>
+        <w:keepNext/>
+        <w:spacing w:line="480" w:lineRule="auto"/>
+        <w:jc w:val="center"/>
+      </w:pPr>
+      <w:r>
+        <w:rPr>
+          <w:rFonts w:ascii="Times New Roman" w:hAnsi="Times New Roman" w:cs="Times New Roman"/>
+          <w:noProof/>
+        </w:rPr>
+        <w:lastRenderedPageBreak/>
+        <w:drawing>
+          <wp:inline distT="0" distB="0" distL="0" distR="0" wp14:anchorId="7A542151" wp14:editId="524F1531">
+            <wp:extent cx="3418966" cy="1800000"/>
+            <wp:effectExtent l="19050" t="19050" r="10160" b="10160"/>
+            <wp:docPr id="1182821816" name="Picture 3"/>
+            <wp:cNvGraphicFramePr>
+              <a:graphicFrameLocks xmlns:a="http://schemas.openxmlformats.org/drawingml/2006/main" noChangeAspect="1"/>
+            </wp:cNvGraphicFramePr>
+            <a:graphic xmlns:a="http://schemas.openxmlformats.org/drawingml/2006/main">
+              <a:graphicData uri="http://schemas.openxmlformats.org/drawingml/2006/picture">
+                <pic:pic xmlns:pic="http://schemas.openxmlformats.org/drawingml/2006/picture">
+                  <pic:nvPicPr>
+                    <pic:cNvPr id="0" name="Picture 3"/>
+                    <pic:cNvPicPr>
+                      <a:picLocks noChangeAspect="1" noChangeArrowheads="1"/>
+                    </pic:cNvPicPr>
+                  </pic:nvPicPr>
+                  <pic:blipFill>
+                    <a:blip r:embed="rId14" cstate="print">
+                      <a:extLst>
+                        <a:ext uri="{28A0092B-C50C-407E-A947-70E740481C1C}">
+                          <a14:useLocalDpi xmlns:a14="http://schemas.microsoft.com/office/drawing/2010/main" val="0"/>
+                        </a:ext>
+                      </a:extLst>
+                    </a:blip>
+                    <a:srcRect/>
+                    <a:stretch>
+                      <a:fillRect/>
+                    </a:stretch>
+                  </pic:blipFill>
+                  <pic:spPr bwMode="auto">
+                    <a:xfrm>
+                      <a:off x="0" y="0"/>
+                      <a:ext cx="3418966" cy="1800000"/>
+                    </a:xfrm>
+                    <a:prstGeom prst="rect">
+                      <a:avLst/>
+                    </a:prstGeom>
+                    <a:noFill/>
+                    <a:ln w="12700">
+                      <a:solidFill>
+                        <a:schemeClr val="tx1"/>
+                      </a:solidFill>
+                    </a:ln>
+                  </pic:spPr>
+                </pic:pic>
+              </a:graphicData>
+            </a:graphic>
+          </wp:inline>
+        </w:drawing>
+      </w:r>
+    </w:p>
+    <w:p>
+      <w:pPr>
+        <w:pStyle w:val="Caption"/>
+        <w:spacing w:line="480" w:lineRule="auto"/>
+        <w:jc w:val="center"/>
+        <w:rPr>
+          <w:rFonts w:ascii="Times New Roman" w:hAnsi="Times New Roman" w:cs="Times New Roman"/>
+        </w:rPr>
+      </w:pPr>
+      <w:r>
+        <w:t xml:space="preserve">Gambar </w:t>
+      </w:r>
+      <w:r>
+        <w:fldChar w:fldCharType="begin"/>
+      </w:r>
+      <w:r>
+        <w:instrText xml:space="preserve"> SEQ Gambar \* ARABIC </w:instrText>
+      </w:r>
+      <w:r>
+        <w:fldChar w:fldCharType="separate"/>
+      </w:r>
+      <w:r>
+        <w:rPr>
+          <w:noProof/>
+        </w:rPr>
+        <w:t>7</w:t>
+      </w:r>
+      <w:r>
+        <w:fldChar w:fldCharType="end"/>
+      </w:r>
+      <w:r>
+        <w:t xml:space="preserve"> Brainstorming pemilihan kolom menggunakan Notepad</w:t>
+      </w:r>
+    </w:p>
+    <w:p>
+      <w:pPr>
+        <w:pStyle w:val="ListParagraph"/>
+        <w:keepNext/>
+        <w:spacing w:line="480" w:lineRule="auto"/>
+        <w:jc w:val="center"/>
+      </w:pPr>
+      <w:r>
+        <w:rPr>
+          <w:rFonts w:ascii="Times New Roman" w:hAnsi="Times New Roman" w:cs="Times New Roman"/>
+          <w:noProof/>
+        </w:rPr>
+        <w:drawing>
+          <wp:inline distT="0" distB="0" distL="0" distR="0" wp14:anchorId="3D1861C2" wp14:editId="5292518B">
+            <wp:extent cx="2176464" cy="2160000"/>
+            <wp:effectExtent l="19050" t="19050" r="14605" b="12065"/>
+            <wp:docPr id="471594841" name="Picture 1"/>
+            <wp:cNvGraphicFramePr>
+              <a:graphicFrameLocks xmlns:a="http://schemas.openxmlformats.org/drawingml/2006/main" noChangeAspect="1"/>
+            </wp:cNvGraphicFramePr>
+            <a:graphic xmlns:a="http://schemas.openxmlformats.org/drawingml/2006/main">
+              <a:graphicData uri="http://schemas.openxmlformats.org/drawingml/2006/picture">
+                <pic:pic xmlns:pic="http://schemas.openxmlformats.org/drawingml/2006/picture">
+                  <pic:nvPicPr>
+                    <pic:cNvPr id="0" name="Picture 1"/>
+                    <pic:cNvPicPr>
+                      <a:picLocks noChangeAspect="1" noChangeArrowheads="1"/>
+                    </pic:cNvPicPr>
+                  </pic:nvPicPr>
+                  <pic:blipFill>
+                    <a:blip r:embed="rId15" cstate="print">
+                      <a:extLst>
+                        <a:ext uri="{28A0092B-C50C-407E-A947-70E740481C1C}">
+                          <a14:useLocalDpi xmlns:a14="http://schemas.microsoft.com/office/drawing/2010/main" val="0"/>
+                        </a:ext>
+                      </a:extLst>
+                    </a:blip>
+                    <a:srcRect/>
+                    <a:stretch>
+                      <a:fillRect/>
+                    </a:stretch>
+                  </pic:blipFill>
+                  <pic:spPr bwMode="auto">
+                    <a:xfrm>
+                      <a:off x="0" y="0"/>
+                      <a:ext cx="2176464" cy="2160000"/>
+                    </a:xfrm>
+                    <a:prstGeom prst="rect">
+                      <a:avLst/>
+                    </a:prstGeom>
+                    <a:noFill/>
+                    <a:ln w="12700">
+                      <a:solidFill>
+                        <a:schemeClr val="tx1"/>
+                      </a:solidFill>
+                    </a:ln>
+                  </pic:spPr>
+                </pic:pic>
+              </a:graphicData>
+            </a:graphic>
+          </wp:inline>
+        </w:drawing>
+      </w:r>
+    </w:p>
+    <w:p>
+      <w:pPr>
+        <w:pStyle w:val="Caption"/>
+        <w:spacing w:line="480" w:lineRule="auto"/>
+        <w:jc w:val="center"/>
+        <w:rPr>
+          <w:rFonts w:ascii="Times New Roman" w:hAnsi="Times New Roman" w:cs="Times New Roman"/>
+        </w:rPr>
+      </w:pPr>
+      <w:r>
+        <w:t xml:space="preserve">Gambar </w:t>
+      </w:r>
+      <w:r>
+        <w:fldChar w:fldCharType="begin"/>
+      </w:r>
+      <w:r>
+        <w:instrText xml:space="preserve"> SEQ Gambar \* ARABIC </w:instrText>
+      </w:r>
+      <w:r>
+        <w:fldChar w:fldCharType="separate"/>
+      </w:r>
+      <w:r>
+        <w:rPr>
+          <w:noProof/>
+        </w:rPr>
+        <w:t>8</w:t>
+      </w:r>
+      <w:r>
+        <w:fldChar w:fldCharType="end"/>
+      </w:r>
+      <w:r>
+        <w:t xml:space="preserve"> Querry realisasi brainstorming</w:t>
+      </w:r>
+    </w:p>
+    <w:p>
+      <w:pPr>
+        <w:pStyle w:val="ListParagraph"/>
+        <w:keepNext/>
+        <w:spacing w:line="480" w:lineRule="auto"/>
+        <w:jc w:val="center"/>
+      </w:pPr>
+      <w:r>
+        <w:rPr>
+          <w:rFonts w:ascii="Times New Roman" w:hAnsi="Times New Roman" w:cs="Times New Roman"/>
+          <w:noProof/>
+        </w:rPr>
+        <w:drawing>
+          <wp:inline distT="0" distB="0" distL="0" distR="0" wp14:anchorId="0A53EE62" wp14:editId="76666DE1">
+            <wp:extent cx="2223826" cy="2160000"/>
+            <wp:effectExtent l="19050" t="19050" r="24130" b="12065"/>
+            <wp:docPr id="1541638088" name="Picture 2"/>
+            <wp:cNvGraphicFramePr>
+              <a:graphicFrameLocks xmlns:a="http://schemas.openxmlformats.org/drawingml/2006/main" noChangeAspect="1"/>
+            </wp:cNvGraphicFramePr>
+            <a:graphic xmlns:a="http://schemas.openxmlformats.org/drawingml/2006/main">
+              <a:graphicData uri="http://schemas.openxmlformats.org/drawingml/2006/picture">
+                <pic:pic xmlns:pic="http://schemas.openxmlformats.org/drawingml/2006/picture">
+                  <pic:nvPicPr>
+                    <pic:cNvPr id="0" name="Picture 2"/>
+                    <pic:cNvPicPr>
+                      <a:picLocks noChangeAspect="1" noChangeArrowheads="1"/>
+                    </pic:cNvPicPr>
+                  </pic:nvPicPr>
+                  <pic:blipFill>
+                    <a:blip r:embed="rId16" cstate="print">
+                      <a:extLst>
+                        <a:ext uri="{28A0092B-C50C-407E-A947-70E740481C1C}">
+                          <a14:useLocalDpi xmlns:a14="http://schemas.microsoft.com/office/drawing/2010/main" val="0"/>
+                        </a:ext>
+                      </a:extLst>
+                    </a:blip>
+                    <a:srcRect/>
+                    <a:stretch>
+                      <a:fillRect/>
+                    </a:stretch>
+                  </pic:blipFill>
+                  <pic:spPr bwMode="auto">
+                    <a:xfrm>
+                      <a:off x="0" y="0"/>
+                      <a:ext cx="2223826" cy="2160000"/>
+                    </a:xfrm>
+                    <a:prstGeom prst="rect">
+                      <a:avLst/>
+                    </a:prstGeom>
+                    <a:noFill/>
+                    <a:ln w="12700">
+                      <a:solidFill>
+                        <a:schemeClr val="tx1"/>
+                      </a:solidFill>
+                    </a:ln>
+                  </pic:spPr>
+                </pic:pic>
+              </a:graphicData>
+            </a:graphic>
+          </wp:inline>
+        </w:drawing>
+      </w:r>
+    </w:p>
+    <w:p>
+      <w:pPr>
+        <w:pStyle w:val="Caption"/>
+        <w:spacing w:line="480" w:lineRule="auto"/>
+        <w:jc w:val="center"/>
+        <w:rPr>
+          <w:rFonts w:ascii="Times New Roman" w:hAnsi="Times New Roman" w:cs="Times New Roman"/>
+        </w:rPr>
+      </w:pPr>
+      <w:r>
+        <w:t xml:space="preserve">Gambar </w:t>
+      </w:r>
+      <w:r>
+        <w:fldChar w:fldCharType="begin"/>
+      </w:r>
+      <w:r>
+        <w:instrText xml:space="preserve"> SEQ Gambar \* ARABIC </w:instrText>
+      </w:r>
+      <w:r>
+        <w:fldChar w:fldCharType="separate"/>
+      </w:r>
+      <w:r>
+        <w:rPr>
+          <w:noProof/>
+        </w:rPr>
+        <w:t>9</w:t>
+      </w:r>
+      <w:r>
+        <w:fldChar w:fldCharType="end"/>
+      </w:r>
+      <w:r>
+        <w:t xml:space="preserve"> Hasil realisasi brainstorming pemilihan kolom</w:t>
       </w:r>
     </w:p>
     <w:p>
@@ -4428,6 +4811,7 @@
         <w:pStyle w:val="Heading5"/>
       </w:pPr>
       <w:r>
+        <w:lastRenderedPageBreak/>
         <w:t>Validasi Data</w:t>
       </w:r>
     </w:p>
@@ -4435,15 +4819,211 @@
       <w:pPr>
         <w:pStyle w:val="ListParagraph"/>
         <w:spacing w:line="480" w:lineRule="auto"/>
-        <w:rPr>
-          <w:rFonts w:ascii="Times New Roman" w:hAnsi="Times New Roman" w:cs="Times New Roman"/>
-        </w:rPr>
-      </w:pPr>
-      <w:r>
-        <w:rPr>
-          <w:rFonts w:ascii="Times New Roman" w:hAnsi="Times New Roman" w:cs="Times New Roman"/>
-        </w:rPr>
-        <w:t>ss</w:t>
+        <w:ind w:firstLine="720"/>
+        <w:jc w:val="both"/>
+        <w:rPr>
+          <w:rFonts w:ascii="Times New Roman" w:hAnsi="Times New Roman" w:cs="Times New Roman"/>
+        </w:rPr>
+      </w:pPr>
+      <w:r>
+        <w:rPr>
+          <w:rFonts w:ascii="Times New Roman" w:hAnsi="Times New Roman" w:cs="Times New Roman"/>
+        </w:rPr>
+        <w:t xml:space="preserve">Pada tahap ini, terdapat 4 aspek utama yang akan divalidasi: Struktur data, duplikasi data, </w:t>
+      </w:r>
+      <w:r>
+        <w:rPr>
+          <w:rFonts w:ascii="Times New Roman" w:hAnsi="Times New Roman" w:cs="Times New Roman"/>
+          <w:i/>
+          <w:iCs/>
+        </w:rPr>
+        <w:t>missing</w:t>
+      </w:r>
+      <w:r>
+        <w:rPr>
+          <w:rFonts w:ascii="Times New Roman" w:hAnsi="Times New Roman" w:cs="Times New Roman"/>
+          <w:i/>
+          <w:iCs/>
+        </w:rPr>
+        <w:t>/null</w:t>
+      </w:r>
+      <w:r>
+        <w:rPr>
+          <w:rFonts w:ascii="Times New Roman" w:hAnsi="Times New Roman" w:cs="Times New Roman"/>
+          <w:i/>
+          <w:iCs/>
+        </w:rPr>
+        <w:t xml:space="preserve"> values</w:t>
+      </w:r>
+      <w:r>
+        <w:rPr>
+          <w:rFonts w:ascii="Times New Roman" w:hAnsi="Times New Roman" w:cs="Times New Roman"/>
+        </w:rPr>
+        <w:t xml:space="preserve">, dan distribusi data. </w:t>
+      </w:r>
+      <w:r>
+        <w:rPr>
+          <w:rFonts w:ascii="Times New Roman" w:hAnsi="Times New Roman" w:cs="Times New Roman"/>
+        </w:rPr>
+        <w:t xml:space="preserve">Tujuan dari tahap ini adalah untuk menemukan bagian mana dari dataset ini yang harus melalui proses </w:t>
+      </w:r>
+      <w:r>
+        <w:rPr>
+          <w:rFonts w:ascii="Times New Roman" w:hAnsi="Times New Roman" w:cs="Times New Roman"/>
+          <w:i/>
+          <w:iCs/>
+        </w:rPr>
+        <w:t>problem solving</w:t>
+      </w:r>
+      <w:r>
+        <w:rPr>
+          <w:rFonts w:ascii="Times New Roman" w:hAnsi="Times New Roman" w:cs="Times New Roman"/>
+        </w:rPr>
+        <w:t>. Validasi data s</w:t>
+      </w:r>
+      <w:r>
+        <w:rPr>
+          <w:rFonts w:ascii="Times New Roman" w:hAnsi="Times New Roman" w:cs="Times New Roman"/>
+        </w:rPr>
+        <w:t>a</w:t>
+      </w:r>
+      <w:r>
+        <w:rPr>
+          <w:rFonts w:ascii="Times New Roman" w:hAnsi="Times New Roman" w:cs="Times New Roman"/>
+        </w:rPr>
+        <w:t xml:space="preserve">ngat bermanfaat </w:t>
+      </w:r>
+      <w:r>
+        <w:rPr>
+          <w:rFonts w:ascii="Times New Roman" w:hAnsi="Times New Roman" w:cs="Times New Roman"/>
+        </w:rPr>
+        <w:t xml:space="preserve">untuk menjaga penulis tidak buta arah </w:t>
+      </w:r>
+      <w:r>
+        <w:rPr>
+          <w:rFonts w:ascii="Times New Roman" w:hAnsi="Times New Roman" w:cs="Times New Roman"/>
+        </w:rPr>
+        <w:t>pada</w:t>
+      </w:r>
+      <w:r>
+        <w:rPr>
+          <w:rFonts w:ascii="Times New Roman" w:hAnsi="Times New Roman" w:cs="Times New Roman"/>
+        </w:rPr>
+        <w:t xml:space="preserve"> proses selanjutnya</w:t>
+      </w:r>
+      <w:r>
+        <w:rPr>
+          <w:rFonts w:ascii="Times New Roman" w:hAnsi="Times New Roman" w:cs="Times New Roman"/>
+        </w:rPr>
+        <w:t xml:space="preserve">. </w:t>
+      </w:r>
+      <w:r>
+        <w:rPr>
+          <w:rFonts w:ascii="Times New Roman" w:hAnsi="Times New Roman" w:cs="Times New Roman"/>
+        </w:rPr>
+        <w:t>Berikut ini adalah dokumentasi dan hasil proses ini</w:t>
+      </w:r>
+      <w:r>
+        <w:rPr>
+          <w:rFonts w:ascii="Times New Roman" w:hAnsi="Times New Roman" w:cs="Times New Roman"/>
+        </w:rPr>
+        <w:t>:</w:t>
+      </w:r>
+    </w:p>
+    <w:p>
+      <w:pPr>
+        <w:pStyle w:val="ListParagraph"/>
+        <w:numPr>
+          <w:ilvl w:val="0"/>
+          <w:numId w:val="10"/>
+        </w:numPr>
+        <w:spacing w:line="480" w:lineRule="auto"/>
+        <w:rPr>
+          <w:rFonts w:ascii="Times New Roman" w:hAnsi="Times New Roman" w:cs="Times New Roman"/>
+        </w:rPr>
+      </w:pPr>
+      <w:r>
+        <w:rPr>
+          <w:rFonts w:ascii="Times New Roman" w:hAnsi="Times New Roman" w:cs="Times New Roman"/>
+        </w:rPr>
+        <w:t>Struktur data</w:t>
+      </w:r>
+    </w:p>
+    <w:p>
+      <w:pPr>
+        <w:pStyle w:val="ListParagraph"/>
+        <w:numPr>
+          <w:ilvl w:val="0"/>
+          <w:numId w:val="10"/>
+        </w:numPr>
+        <w:spacing w:line="480" w:lineRule="auto"/>
+        <w:rPr>
+          <w:rFonts w:ascii="Times New Roman" w:hAnsi="Times New Roman" w:cs="Times New Roman"/>
+        </w:rPr>
+      </w:pPr>
+      <w:r>
+        <w:rPr>
+          <w:rFonts w:ascii="Times New Roman" w:hAnsi="Times New Roman" w:cs="Times New Roman"/>
+        </w:rPr>
+        <w:t>Duplikasi data</w:t>
+      </w:r>
+    </w:p>
+    <w:p>
+      <w:pPr>
+        <w:pStyle w:val="ListParagraph"/>
+        <w:numPr>
+          <w:ilvl w:val="0"/>
+          <w:numId w:val="10"/>
+        </w:numPr>
+        <w:spacing w:line="480" w:lineRule="auto"/>
+        <w:rPr>
+          <w:rFonts w:ascii="Times New Roman" w:hAnsi="Times New Roman" w:cs="Times New Roman"/>
+          <w:i/>
+          <w:iCs/>
+        </w:rPr>
+      </w:pPr>
+      <w:r>
+        <w:rPr>
+          <w:rFonts w:ascii="Times New Roman" w:hAnsi="Times New Roman" w:cs="Times New Roman"/>
+          <w:i/>
+          <w:iCs/>
+        </w:rPr>
+        <w:t>Missing</w:t>
+      </w:r>
+      <w:r>
+        <w:rPr>
+          <w:rFonts w:ascii="Times New Roman" w:hAnsi="Times New Roman" w:cs="Times New Roman"/>
+          <w:i/>
+          <w:iCs/>
+        </w:rPr>
+        <w:t>/null</w:t>
+      </w:r>
+      <w:r>
+        <w:rPr>
+          <w:rFonts w:ascii="Times New Roman" w:hAnsi="Times New Roman" w:cs="Times New Roman"/>
+          <w:i/>
+          <w:iCs/>
+        </w:rPr>
+        <w:t xml:space="preserve"> values</w:t>
+      </w:r>
+    </w:p>
+    <w:p>
+      <w:pPr>
+        <w:pStyle w:val="ListParagraph"/>
+        <w:numPr>
+          <w:ilvl w:val="0"/>
+          <w:numId w:val="10"/>
+        </w:numPr>
+        <w:spacing w:line="480" w:lineRule="auto"/>
+        <w:rPr>
+          <w:rFonts w:ascii="Times New Roman" w:hAnsi="Times New Roman" w:cs="Times New Roman"/>
+        </w:rPr>
+      </w:pPr>
+      <w:r>
+        <w:rPr>
+          <w:rFonts w:ascii="Times New Roman" w:hAnsi="Times New Roman" w:cs="Times New Roman"/>
+        </w:rPr>
+        <w:t>Distribusi data</w:t>
       </w:r>
     </w:p>
     <w:p>
@@ -4561,6 +5141,119 @@
 <file path=word/numbering.xml><?xml version="1.0" encoding="utf-8"?>
 <w:numbering xmlns:wpc="http://schemas.microsoft.com/office/word/2010/wordprocessingCanvas" xmlns:cx="http://schemas.microsoft.com/office/drawing/2014/chartex" xmlns:cx1="http://schemas.microsoft.com/office/drawing/2015/9/8/chartex" xmlns:cx2="http://schemas.microsoft.com/office/drawing/2015/10/21/chartex" xmlns:cx3="http://schemas.microsoft.com/office/drawing/2016/5/9/chartex" xmlns:cx4="http://schemas.microsoft.com/office/drawing/2016/5/10/chartex" xmlns:cx5="http://schemas.microsoft.com/office/drawing/2016/5/11/chartex" xmlns:cx6="http://schemas.microsoft.com/office/drawing/2016/5/12/chartex" xmlns:cx7="http://schemas.microsoft.com/office/drawing/2016/5/13/chartex" xmlns:cx8="http://schemas.microsoft.com/office/drawing/2016/5/14/chartex" xmlns:mc="http://schemas.openxmlformats.org/markup-compatibility/2006" xmlns:aink="http://schemas.microsoft.com/office/drawing/2016/ink" xmlns:am3d="http://schemas.microsoft.com/office/drawing/2017/model3d" xmlns:o="urn:schemas-microsoft-com:office:office" xmlns:oel="http://schemas.microsoft.com/office/2019/extlst" xmlns:r="http://schemas.openxmlformats.org/officeDocument/2006/relationships" xmlns:m="http://schemas.openxmlformats.org/officeDocument/2006/math" xmlns:v="urn:schemas-microsoft-com:vml" xmlns:wp14="http://schemas.microsoft.com/office/word/2010/wordprocessingDrawing" xmlns:wp="http://schemas.openxmlformats.org/drawingml/2006/wordprocessingDrawing" xmlns:w10="urn:schemas-microsoft-com:office:word" xmlns:w="http://schemas.openxmlformats.org/wordprocessingml/2006/main" xmlns:w14="http://schemas.microsoft.com/office/word/2010/wordml" xmlns:w15="http://schemas.microsoft.com/office/word/2012/wordml" xmlns:w16cex="http://schemas.microsoft.com/office/word/2018/wordml/cex" xmlns:w16cid="http://schemas.microsoft.com/office/word/2016/wordml/cid" xmlns:w16="http://schemas.microsoft.com/office/word/2018/wordml" xmlns:w16du="http://schemas.microsoft.com/office/word/2023/wordml/word16du" xmlns:w16sdtdh="http://schemas.microsoft.com/office/word/2020/wordml/sdtdatahash" xmlns:w16sdtfl="http://schemas.microsoft.com/office/word/2024/wordml/sdtformatlock" xmlns:w16se="http://schemas.microsoft.com/office/word/2015/wordml/symex" xmlns:wpg="http://schemas.microsoft.com/office/word/2010/wordprocessingGroup" xmlns:wpi="http://schemas.microsoft.com/office/word/2010/wordprocessingInk" xmlns:wne="http://schemas.microsoft.com/office/word/2006/wordml" xmlns:wps="http://schemas.microsoft.com/office/word/2010/wordprocessingShape" mc:Ignorable="w14 w15 w16se w16cid w16 w16cex w16sdtdh w16sdtfl w16du wp14">
   <w:abstractNum w:abstractNumId="0" w15:restartNumberingAfterBreak="0">
+    <w:nsid w:val="055F3A42"/>
+    <w:multiLevelType w:val="hybridMultilevel"/>
+    <w:tmpl w:val="4DAACF10"/>
+    <w:lvl w:ilvl="0" w:tplc="04090001">
+      <w:start w:val="1"/>
+      <w:numFmt w:val="bullet"/>
+      <w:lvlText w:val=""/>
+      <w:lvlJc w:val="left"/>
+      <w:pPr>
+        <w:ind w:left="1440" w:hanging="360"/>
+      </w:pPr>
+      <w:rPr>
+        <w:rFonts w:ascii="Symbol" w:hAnsi="Symbol" w:hint="default"/>
+      </w:rPr>
+    </w:lvl>
+    <w:lvl w:ilvl="1" w:tplc="04090003" w:tentative="1">
+      <w:start w:val="1"/>
+      <w:numFmt w:val="bullet"/>
+      <w:lvlText w:val="o"/>
+      <w:lvlJc w:val="left"/>
+      <w:pPr>
+        <w:ind w:left="2160" w:hanging="360"/>
+      </w:pPr>
+      <w:rPr>
+        <w:rFonts w:ascii="Courier New" w:hAnsi="Courier New" w:cs="Courier New" w:hint="default"/>
+      </w:rPr>
+    </w:lvl>
+    <w:lvl w:ilvl="2" w:tplc="04090005" w:tentative="1">
+      <w:start w:val="1"/>
+      <w:numFmt w:val="bullet"/>
+      <w:lvlText w:val=""/>
+      <w:lvlJc w:val="left"/>
+      <w:pPr>
+        <w:ind w:left="2880" w:hanging="360"/>
+      </w:pPr>
+      <w:rPr>
+        <w:rFonts w:ascii="Wingdings" w:hAnsi="Wingdings" w:hint="default"/>
+      </w:rPr>
+    </w:lvl>
+    <w:lvl w:ilvl="3" w:tplc="04090001" w:tentative="1">
+      <w:start w:val="1"/>
+      <w:numFmt w:val="bullet"/>
+      <w:lvlText w:val=""/>
+      <w:lvlJc w:val="left"/>
+      <w:pPr>
+        <w:ind w:left="3600" w:hanging="360"/>
+      </w:pPr>
+      <w:rPr>
+        <w:rFonts w:ascii="Symbol" w:hAnsi="Symbol" w:hint="default"/>
+      </w:rPr>
+    </w:lvl>
+    <w:lvl w:ilvl="4" w:tplc="04090003" w:tentative="1">
+      <w:start w:val="1"/>
+      <w:numFmt w:val="bullet"/>
+      <w:lvlText w:val="o"/>
+      <w:lvlJc w:val="left"/>
+      <w:pPr>
+        <w:ind w:left="4320" w:hanging="360"/>
+      </w:pPr>
+      <w:rPr>
+        <w:rFonts w:ascii="Courier New" w:hAnsi="Courier New" w:cs="Courier New" w:hint="default"/>
+      </w:rPr>
+    </w:lvl>
+    <w:lvl w:ilvl="5" w:tplc="04090005" w:tentative="1">
+      <w:start w:val="1"/>
+      <w:numFmt w:val="bullet"/>
+      <w:lvlText w:val=""/>
+      <w:lvlJc w:val="left"/>
+      <w:pPr>
+        <w:ind w:left="5040" w:hanging="360"/>
+      </w:pPr>
+      <w:rPr>
+        <w:rFonts w:ascii="Wingdings" w:hAnsi="Wingdings" w:hint="default"/>
+      </w:rPr>
+    </w:lvl>
+    <w:lvl w:ilvl="6" w:tplc="04090001" w:tentative="1">
+      <w:start w:val="1"/>
+      <w:numFmt w:val="bullet"/>
+      <w:lvlText w:val=""/>
+      <w:lvlJc w:val="left"/>
+      <w:pPr>
+        <w:ind w:left="5760" w:hanging="360"/>
+      </w:pPr>
+      <w:rPr>
+        <w:rFonts w:ascii="Symbol" w:hAnsi="Symbol" w:hint="default"/>
+      </w:rPr>
+    </w:lvl>
+    <w:lvl w:ilvl="7" w:tplc="04090003" w:tentative="1">
+      <w:start w:val="1"/>
+      <w:numFmt w:val="bullet"/>
+      <w:lvlText w:val="o"/>
+      <w:lvlJc w:val="left"/>
+      <w:pPr>
+        <w:ind w:left="6480" w:hanging="360"/>
+      </w:pPr>
+      <w:rPr>
+        <w:rFonts w:ascii="Courier New" w:hAnsi="Courier New" w:cs="Courier New" w:hint="default"/>
+      </w:rPr>
+    </w:lvl>
+    <w:lvl w:ilvl="8" w:tplc="04090005" w:tentative="1">
+      <w:start w:val="1"/>
+      <w:numFmt w:val="bullet"/>
+      <w:lvlText w:val=""/>
+      <w:lvlJc w:val="left"/>
+      <w:pPr>
+        <w:ind w:left="7200" w:hanging="360"/>
+      </w:pPr>
+      <w:rPr>
+        <w:rFonts w:ascii="Wingdings" w:hAnsi="Wingdings" w:hint="default"/>
+      </w:rPr>
+    </w:lvl>
+  </w:abstractNum>
+  <w:abstractNum w:abstractNumId="1" w15:restartNumberingAfterBreak="0">
     <w:nsid w:val="1B792F65"/>
     <w:multiLevelType w:val="hybridMultilevel"/>
     <w:tmpl w:val="5082DAE2"/>
@@ -4673,7 +5366,7 @@
       </w:rPr>
     </w:lvl>
   </w:abstractNum>
-  <w:abstractNum w:abstractNumId="1" w15:restartNumberingAfterBreak="0">
+  <w:abstractNum w:abstractNumId="2" w15:restartNumberingAfterBreak="0">
     <w:nsid w:val="1B8B5DC0"/>
     <w:multiLevelType w:val="hybridMultilevel"/>
     <w:tmpl w:val="94307F80"/>
@@ -4760,7 +5453,7 @@
       </w:pPr>
     </w:lvl>
   </w:abstractNum>
-  <w:abstractNum w:abstractNumId="2" w15:restartNumberingAfterBreak="0">
+  <w:abstractNum w:abstractNumId="3" w15:restartNumberingAfterBreak="0">
     <w:nsid w:val="1FE53CE5"/>
     <w:multiLevelType w:val="hybridMultilevel"/>
     <w:tmpl w:val="D2EAEADC"/>
@@ -4847,7 +5540,7 @@
       </w:pPr>
     </w:lvl>
   </w:abstractNum>
-  <w:abstractNum w:abstractNumId="3" w15:restartNumberingAfterBreak="0">
+  <w:abstractNum w:abstractNumId="4" w15:restartNumberingAfterBreak="0">
     <w:nsid w:val="2B7B57CD"/>
     <w:multiLevelType w:val="hybridMultilevel"/>
     <w:tmpl w:val="5082DAE2"/>
@@ -4960,7 +5653,7 @@
       </w:rPr>
     </w:lvl>
   </w:abstractNum>
-  <w:abstractNum w:abstractNumId="4" w15:restartNumberingAfterBreak="0">
+  <w:abstractNum w:abstractNumId="5" w15:restartNumberingAfterBreak="0">
     <w:nsid w:val="2EE4123E"/>
     <w:multiLevelType w:val="hybridMultilevel"/>
     <w:tmpl w:val="259C1778"/>
@@ -5073,7 +5766,93 @@
       </w:rPr>
     </w:lvl>
   </w:abstractNum>
-  <w:abstractNum w:abstractNumId="5" w15:restartNumberingAfterBreak="0">
+  <w:abstractNum w:abstractNumId="6" w15:restartNumberingAfterBreak="0">
+    <w:nsid w:val="4167498C"/>
+    <w:multiLevelType w:val="hybridMultilevel"/>
+    <w:tmpl w:val="89B2EC42"/>
+    <w:lvl w:ilvl="0" w:tplc="04090011">
+      <w:start w:val="1"/>
+      <w:numFmt w:val="decimal"/>
+      <w:lvlText w:val="%1)"/>
+      <w:lvlJc w:val="left"/>
+      <w:pPr>
+        <w:ind w:left="1440" w:hanging="360"/>
+      </w:pPr>
+    </w:lvl>
+    <w:lvl w:ilvl="1" w:tplc="04090019" w:tentative="1">
+      <w:start w:val="1"/>
+      <w:numFmt w:val="lowerLetter"/>
+      <w:lvlText w:val="%2."/>
+      <w:lvlJc w:val="left"/>
+      <w:pPr>
+        <w:ind w:left="2160" w:hanging="360"/>
+      </w:pPr>
+    </w:lvl>
+    <w:lvl w:ilvl="2" w:tplc="0409001B" w:tentative="1">
+      <w:start w:val="1"/>
+      <w:numFmt w:val="lowerRoman"/>
+      <w:lvlText w:val="%3."/>
+      <w:lvlJc w:val="right"/>
+      <w:pPr>
+        <w:ind w:left="2880" w:hanging="180"/>
+      </w:pPr>
+    </w:lvl>
+    <w:lvl w:ilvl="3" w:tplc="0409000F" w:tentative="1">
+      <w:start w:val="1"/>
+      <w:numFmt w:val="decimal"/>
+      <w:lvlText w:val="%4."/>
+      <w:lvlJc w:val="left"/>
+      <w:pPr>
+        <w:ind w:left="3600" w:hanging="360"/>
+      </w:pPr>
+    </w:lvl>
+    <w:lvl w:ilvl="4" w:tplc="04090019" w:tentative="1">
+      <w:start w:val="1"/>
+      <w:numFmt w:val="lowerLetter"/>
+      <w:lvlText w:val="%5."/>
+      <w:lvlJc w:val="left"/>
+      <w:pPr>
+        <w:ind w:left="4320" w:hanging="360"/>
+      </w:pPr>
+    </w:lvl>
+    <w:lvl w:ilvl="5" w:tplc="0409001B" w:tentative="1">
+      <w:start w:val="1"/>
+      <w:numFmt w:val="lowerRoman"/>
+      <w:lvlText w:val="%6."/>
+      <w:lvlJc w:val="right"/>
+      <w:pPr>
+        <w:ind w:left="5040" w:hanging="180"/>
+      </w:pPr>
+    </w:lvl>
+    <w:lvl w:ilvl="6" w:tplc="0409000F" w:tentative="1">
+      <w:start w:val="1"/>
+      <w:numFmt w:val="decimal"/>
+      <w:lvlText w:val="%7."/>
+      <w:lvlJc w:val="left"/>
+      <w:pPr>
+        <w:ind w:left="5760" w:hanging="360"/>
+      </w:pPr>
+    </w:lvl>
+    <w:lvl w:ilvl="7" w:tplc="04090019" w:tentative="1">
+      <w:start w:val="1"/>
+      <w:numFmt w:val="lowerLetter"/>
+      <w:lvlText w:val="%8."/>
+      <w:lvlJc w:val="left"/>
+      <w:pPr>
+        <w:ind w:left="6480" w:hanging="360"/>
+      </w:pPr>
+    </w:lvl>
+    <w:lvl w:ilvl="8" w:tplc="0409001B" w:tentative="1">
+      <w:start w:val="1"/>
+      <w:numFmt w:val="lowerRoman"/>
+      <w:lvlText w:val="%9."/>
+      <w:lvlJc w:val="right"/>
+      <w:pPr>
+        <w:ind w:left="7200" w:hanging="180"/>
+      </w:pPr>
+    </w:lvl>
+  </w:abstractNum>
+  <w:abstractNum w:abstractNumId="7" w15:restartNumberingAfterBreak="0">
     <w:nsid w:val="4F7E66BA"/>
     <w:multiLevelType w:val="hybridMultilevel"/>
     <w:tmpl w:val="79F2C6B8"/>
@@ -5186,7 +5965,7 @@
       </w:rPr>
     </w:lvl>
   </w:abstractNum>
-  <w:abstractNum w:abstractNumId="6" w15:restartNumberingAfterBreak="0">
+  <w:abstractNum w:abstractNumId="8" w15:restartNumberingAfterBreak="0">
     <w:nsid w:val="63917590"/>
     <w:multiLevelType w:val="hybridMultilevel"/>
     <w:tmpl w:val="D714BB68"/>
@@ -5299,7 +6078,7 @@
       </w:rPr>
     </w:lvl>
   </w:abstractNum>
-  <w:abstractNum w:abstractNumId="7" w15:restartNumberingAfterBreak="0">
+  <w:abstractNum w:abstractNumId="9" w15:restartNumberingAfterBreak="0">
     <w:nsid w:val="75AD4CC8"/>
     <w:multiLevelType w:val="hybridMultilevel"/>
     <w:tmpl w:val="CB147842"/>
@@ -5413,28 +6192,34 @@
     </w:lvl>
   </w:abstractNum>
   <w:num w:numId="1" w16cid:durableId="1173185611">
-    <w:abstractNumId w:val="6"/>
+    <w:abstractNumId w:val="8"/>
   </w:num>
   <w:num w:numId="2" w16cid:durableId="2008241989">
+    <w:abstractNumId w:val="4"/>
+  </w:num>
+  <w:num w:numId="3" w16cid:durableId="1280189446">
+    <w:abstractNumId w:val="5"/>
+  </w:num>
+  <w:num w:numId="4" w16cid:durableId="126434000">
+    <w:abstractNumId w:val="9"/>
+  </w:num>
+  <w:num w:numId="5" w16cid:durableId="88235218">
+    <w:abstractNumId w:val="1"/>
+  </w:num>
+  <w:num w:numId="6" w16cid:durableId="2075662437">
     <w:abstractNumId w:val="3"/>
   </w:num>
-  <w:num w:numId="3" w16cid:durableId="1280189446">
-    <w:abstractNumId w:val="4"/>
+  <w:num w:numId="7" w16cid:durableId="100228626">
+    <w:abstractNumId w:val="2"/>
   </w:num>
-  <w:num w:numId="4" w16cid:durableId="126434000">
+  <w:num w:numId="8" w16cid:durableId="1520004101">
     <w:abstractNumId w:val="7"/>
   </w:num>
-  <w:num w:numId="5" w16cid:durableId="88235218">
+  <w:num w:numId="9" w16cid:durableId="2040203771">
     <w:abstractNumId w:val="0"/>
   </w:num>
-  <w:num w:numId="6" w16cid:durableId="2075662437">
-    <w:abstractNumId w:val="2"/>
-  </w:num>
-  <w:num w:numId="7" w16cid:durableId="100228626">
-    <w:abstractNumId w:val="1"/>
-  </w:num>
-  <w:num w:numId="8" w16cid:durableId="1520004101">
-    <w:abstractNumId w:val="5"/>
+  <w:num w:numId="10" w16cid:durableId="315181602">
+    <w:abstractNumId w:val="6"/>
   </w:num>
 </w:numbering>
 </file>

</xml_diff>

<commit_message>
probelm solving done. next cicil representasi
</commit_message>
<xml_diff>
--- a/non-website/Laporan Akhir KP/2203040182 - Dhika Ramadhan Saputra - Laporan KP.docx
+++ b/non-website/Laporan Akhir KP/2203040182 - Dhika Ramadhan Saputra - Laporan KP.docx
@@ -177,7 +177,6 @@
           <w:szCs w:val="22"/>
         </w:rPr>
       </w:pPr>
-      <w:proofErr w:type="gramStart"/>
       <w:r>
         <w:rPr>
           <w:rFonts w:ascii="Times New Roman" w:hAnsi="Times New Roman" w:cs="Times New Roman"/>
@@ -200,16 +199,15 @@
           <w:sz w:val="22"/>
           <w:szCs w:val="22"/>
         </w:rPr>
-        <w:t>:</w:t>
-      </w:r>
-      <w:proofErr w:type="gramEnd"/>
+        <w:t>: Dhika Ramadhan Saputra</w:t>
+      </w:r>
       <w:r>
         <w:rPr>
           <w:rFonts w:ascii="Times New Roman" w:hAnsi="Times New Roman" w:cs="Times New Roman"/>
           <w:sz w:val="22"/>
           <w:szCs w:val="22"/>
         </w:rPr>
-        <w:t xml:space="preserve"> Dhika Ramadhan Saputra</w:t>
+        <w:br/>
       </w:r>
       <w:r>
         <w:rPr>
@@ -217,16 +215,15 @@
           <w:sz w:val="22"/>
           <w:szCs w:val="22"/>
         </w:rPr>
-        <w:br/>
-      </w:r>
-      <w:proofErr w:type="gramStart"/>
+        <w:t>NIM.</w:t>
+      </w:r>
       <w:r>
         <w:rPr>
           <w:rFonts w:ascii="Times New Roman" w:hAnsi="Times New Roman" w:cs="Times New Roman"/>
           <w:sz w:val="22"/>
           <w:szCs w:val="22"/>
         </w:rPr>
-        <w:t>NIM.</w:t>
+        <w:t xml:space="preserve">  </w:t>
       </w:r>
       <w:r>
         <w:rPr>
@@ -234,35 +231,18 @@
           <w:sz w:val="22"/>
           <w:szCs w:val="22"/>
         </w:rPr>
-        <w:t xml:space="preserve">  </w:t>
-      </w:r>
-      <w:r>
+        <w:t>: 2203040182</w:t>
+      </w:r>
+    </w:p>
+    <w:p>
+      <w:pPr>
+        <w:spacing w:line="360" w:lineRule="auto"/>
+        <w:ind w:left="2552"/>
         <w:rPr>
           <w:rFonts w:ascii="Times New Roman" w:hAnsi="Times New Roman" w:cs="Times New Roman"/>
           <w:sz w:val="22"/>
           <w:szCs w:val="22"/>
         </w:rPr>
-        <w:t>:</w:t>
-      </w:r>
-      <w:proofErr w:type="gramEnd"/>
-      <w:r>
-        <w:rPr>
-          <w:rFonts w:ascii="Times New Roman" w:hAnsi="Times New Roman" w:cs="Times New Roman"/>
-          <w:sz w:val="22"/>
-          <w:szCs w:val="22"/>
-        </w:rPr>
-        <w:t xml:space="preserve"> 2203040182</w:t>
-      </w:r>
-    </w:p>
-    <w:p>
-      <w:pPr>
-        <w:spacing w:line="360" w:lineRule="auto"/>
-        <w:ind w:left="2552"/>
-        <w:rPr>
-          <w:rFonts w:ascii="Times New Roman" w:hAnsi="Times New Roman" w:cs="Times New Roman"/>
-          <w:sz w:val="22"/>
-          <w:szCs w:val="22"/>
-        </w:rPr>
       </w:pPr>
     </w:p>
     <w:p>
@@ -694,21 +674,7 @@
         <w:rPr>
           <w:rFonts w:ascii="Times New Roman" w:hAnsi="Times New Roman" w:cs="Times New Roman"/>
         </w:rPr>
-        <w:t xml:space="preserve">Nomor pendaftaran, jalur masuk, tahun masuk, prodi pilihan 1, prodi pilihan 2, fakultas pilihan 1, fakultas pilihan 2, prodi diterima, fakultas prodi diterima, usia, asal SLTA, jurusan SLTA, alamat asal, alamat domisili, pendidikan ayah, pendidikan ibu, pekerjaan ibu, alamat orang </w:t>
-      </w:r>
-      <w:proofErr w:type="gramStart"/>
-      <w:r>
-        <w:rPr>
-          <w:rFonts w:ascii="Times New Roman" w:hAnsi="Times New Roman" w:cs="Times New Roman"/>
-        </w:rPr>
-        <w:t>tua,  dan</w:t>
-      </w:r>
-      <w:proofErr w:type="gramEnd"/>
-      <w:r>
-        <w:rPr>
-          <w:rFonts w:ascii="Times New Roman" w:hAnsi="Times New Roman" w:cs="Times New Roman"/>
-        </w:rPr>
-        <w:t xml:space="preserve"> Provinsi asal domisili</w:t>
+        <w:t>Nomor pendaftaran, jalur masuk, tahun masuk, prodi pilihan 1, prodi pilihan 2, fakultas pilihan 1, fakultas pilihan 2, prodi diterima, fakultas prodi diterima, usia, asal SLTA, jurusan SLTA, alamat asal, alamat domisili, pendidikan ayah, pendidikan ibu, pekerjaan ibu, alamat orang tua,  dan Provinsi asal domisili</w:t>
       </w:r>
       <w:r>
         <w:rPr>
@@ -1598,14 +1564,27 @@
       <w:r>
         <w:t xml:space="preserve">ambar </w:t>
       </w:r>
-      <w:fldSimple w:instr=" SEQ gambar \* ARABIC ">
-        <w:r>
-          <w:rPr>
-            <w:noProof/>
-          </w:rPr>
-          <w:t>1</w:t>
-        </w:r>
-      </w:fldSimple>
+      <w:r>
+        <w:fldChar w:fldCharType="begin"/>
+      </w:r>
+      <w:r>
+        <w:instrText xml:space="preserve"> SEQ gambar \* ARABIC </w:instrText>
+      </w:r>
+      <w:r>
+        <w:fldChar w:fldCharType="separate"/>
+      </w:r>
+      <w:r>
+        <w:rPr>
+          <w:noProof/>
+        </w:rPr>
+        <w:t>1</w:t>
+      </w:r>
+      <w:r>
+        <w:rPr>
+          <w:noProof/>
+        </w:rPr>
+        <w:fldChar w:fldCharType="end"/>
+      </w:r>
       <w:r>
         <w:t xml:space="preserve"> Tahapan Pelaksanaan</w:t>
       </w:r>
@@ -3551,14 +3530,27 @@
       <w:r>
         <w:t xml:space="preserve">Tabel </w:t>
       </w:r>
-      <w:fldSimple w:instr=" SEQ Tabel \* ARABIC ">
-        <w:r>
-          <w:rPr>
-            <w:noProof/>
-          </w:rPr>
-          <w:t>1</w:t>
-        </w:r>
-      </w:fldSimple>
+      <w:r>
+        <w:fldChar w:fldCharType="begin"/>
+      </w:r>
+      <w:r>
+        <w:instrText xml:space="preserve"> SEQ Tabel \* ARABIC </w:instrText>
+      </w:r>
+      <w:r>
+        <w:fldChar w:fldCharType="separate"/>
+      </w:r>
+      <w:r>
+        <w:rPr>
+          <w:noProof/>
+        </w:rPr>
+        <w:t>1</w:t>
+      </w:r>
+      <w:r>
+        <w:rPr>
+          <w:noProof/>
+        </w:rPr>
+        <w:fldChar w:fldCharType="end"/>
+      </w:r>
       <w:r>
         <w:t xml:space="preserve"> Jadwal pelaksanaan</w:t>
       </w:r>
@@ -3759,14 +3751,27 @@
       <w:r>
         <w:t xml:space="preserve">ambar </w:t>
       </w:r>
-      <w:fldSimple w:instr=" SEQ gambar \* ARABIC ">
-        <w:r>
-          <w:rPr>
-            <w:noProof/>
-          </w:rPr>
-          <w:t>2</w:t>
-        </w:r>
-      </w:fldSimple>
+      <w:r>
+        <w:fldChar w:fldCharType="begin"/>
+      </w:r>
+      <w:r>
+        <w:instrText xml:space="preserve"> SEQ gambar \* ARABIC </w:instrText>
+      </w:r>
+      <w:r>
+        <w:fldChar w:fldCharType="separate"/>
+      </w:r>
+      <w:r>
+        <w:rPr>
+          <w:noProof/>
+        </w:rPr>
+        <w:t>2</w:t>
+      </w:r>
+      <w:r>
+        <w:rPr>
+          <w:noProof/>
+        </w:rPr>
+        <w:fldChar w:fldCharType="end"/>
+      </w:r>
       <w:r>
         <w:t xml:space="preserve"> Struktur Umum Organisasi Mitra</w:t>
       </w:r>
@@ -4010,15 +4015,7 @@
           <w:rFonts w:ascii="Times New Roman" w:hAnsi="Times New Roman" w:cs="Times New Roman"/>
           <w:color w:val="FF0000"/>
         </w:rPr>
-        <w:t xml:space="preserve">Pengumpulan data adalah </w:t>
-      </w:r>
-      <w:proofErr w:type="gramStart"/>
-      <w:r>
-        <w:rPr>
-          <w:rFonts w:ascii="Times New Roman" w:hAnsi="Times New Roman" w:cs="Times New Roman"/>
-          <w:color w:val="FF0000"/>
-        </w:rPr>
-        <w:t xml:space="preserve">… </w:t>
+        <w:t xml:space="preserve">Pengumpulan data adalah … </w:t>
       </w:r>
       <w:r>
         <w:rPr>
@@ -4036,14 +4033,7 @@
         <w:rPr>
           <w:rFonts w:ascii="Times New Roman" w:hAnsi="Times New Roman" w:cs="Times New Roman"/>
         </w:rPr>
-        <w:t>ada</w:t>
-      </w:r>
-      <w:proofErr w:type="gramEnd"/>
-      <w:r>
-        <w:rPr>
-          <w:rFonts w:ascii="Times New Roman" w:hAnsi="Times New Roman" w:cs="Times New Roman"/>
-        </w:rPr>
-        <w:t xml:space="preserve"> proyek ini, p</w:t>
+        <w:t>ada proyek ini, p</w:t>
       </w:r>
       <w:r>
         <w:rPr>
@@ -4211,14 +4201,27 @@
       <w:r>
         <w:t xml:space="preserve">ambar </w:t>
       </w:r>
-      <w:fldSimple w:instr=" SEQ gambar \* ARABIC ">
-        <w:r>
-          <w:rPr>
-            <w:noProof/>
-          </w:rPr>
-          <w:t>3</w:t>
-        </w:r>
-      </w:fldSimple>
+      <w:r>
+        <w:fldChar w:fldCharType="begin"/>
+      </w:r>
+      <w:r>
+        <w:instrText xml:space="preserve"> SEQ gambar \* ARABIC </w:instrText>
+      </w:r>
+      <w:r>
+        <w:fldChar w:fldCharType="separate"/>
+      </w:r>
+      <w:r>
+        <w:rPr>
+          <w:noProof/>
+        </w:rPr>
+        <w:t>3</w:t>
+      </w:r>
+      <w:r>
+        <w:rPr>
+          <w:noProof/>
+        </w:rPr>
+        <w:fldChar w:fldCharType="end"/>
+      </w:r>
       <w:r>
         <w:t xml:space="preserve"> Dokumentasi proses penerimaan data</w:t>
       </w:r>
@@ -4237,7 +4240,7 @@
           <w:noProof/>
         </w:rPr>
         <w:drawing>
-          <wp:inline distT="0" distB="0" distL="0" distR="0" wp14:anchorId="75188C27" wp14:editId="02DE1B10">
+          <wp:inline distT="0" distB="0" distL="0" distR="0" wp14:anchorId="75188C27" wp14:editId="530E8B53">
             <wp:extent cx="4608000" cy="1698906"/>
             <wp:effectExtent l="19050" t="19050" r="21590" b="15875"/>
             <wp:docPr id="783286403" name="Picture 4"/>
@@ -4303,14 +4306,27 @@
       <w:r>
         <w:t xml:space="preserve">ambar </w:t>
       </w:r>
-      <w:fldSimple w:instr=" SEQ gambar \* ARABIC ">
-        <w:r>
-          <w:rPr>
-            <w:noProof/>
-          </w:rPr>
-          <w:t>4</w:t>
-        </w:r>
-      </w:fldSimple>
+      <w:r>
+        <w:fldChar w:fldCharType="begin"/>
+      </w:r>
+      <w:r>
+        <w:instrText xml:space="preserve"> SEQ gambar \* ARABIC </w:instrText>
+      </w:r>
+      <w:r>
+        <w:fldChar w:fldCharType="separate"/>
+      </w:r>
+      <w:r>
+        <w:rPr>
+          <w:noProof/>
+        </w:rPr>
+        <w:t>4</w:t>
+      </w:r>
+      <w:r>
+        <w:rPr>
+          <w:noProof/>
+        </w:rPr>
+        <w:fldChar w:fldCharType="end"/>
+      </w:r>
       <w:r>
         <w:t xml:space="preserve"> Sampel</w:t>
       </w:r>
@@ -4364,15 +4380,7 @@
           <w:rFonts w:ascii="Times New Roman" w:hAnsi="Times New Roman" w:cs="Times New Roman"/>
           <w:color w:val="FF0000"/>
         </w:rPr>
-        <w:t xml:space="preserve">Pre-processing adalah </w:t>
-      </w:r>
-      <w:proofErr w:type="gramStart"/>
-      <w:r>
-        <w:rPr>
-          <w:rFonts w:ascii="Times New Roman" w:hAnsi="Times New Roman" w:cs="Times New Roman"/>
-          <w:color w:val="FF0000"/>
-        </w:rPr>
-        <w:t xml:space="preserve">… </w:t>
+        <w:t xml:space="preserve">Pre-processing adalah … </w:t>
       </w:r>
       <w:r>
         <w:rPr>
@@ -4384,14 +4392,7 @@
         <w:rPr>
           <w:rFonts w:ascii="Times New Roman" w:hAnsi="Times New Roman" w:cs="Times New Roman"/>
         </w:rPr>
-        <w:t>Sesuai</w:t>
-      </w:r>
-      <w:proofErr w:type="gramEnd"/>
-      <w:r>
-        <w:rPr>
-          <w:rFonts w:ascii="Times New Roman" w:hAnsi="Times New Roman" w:cs="Times New Roman"/>
-        </w:rPr>
-        <w:t xml:space="preserve"> dengan gambaran umum proyek, tahap </w:t>
+        <w:t xml:space="preserve">Sesuai dengan gambaran umum proyek, tahap </w:t>
       </w:r>
       <w:r>
         <w:rPr>
@@ -4439,15 +4440,7 @@
           <w:rFonts w:ascii="Times New Roman" w:hAnsi="Times New Roman" w:cs="Times New Roman"/>
           <w:color w:val="FF0000"/>
         </w:rPr>
-        <w:t xml:space="preserve">Dataset adalah </w:t>
-      </w:r>
-      <w:proofErr w:type="gramStart"/>
-      <w:r>
-        <w:rPr>
-          <w:rFonts w:ascii="Times New Roman" w:hAnsi="Times New Roman" w:cs="Times New Roman"/>
-          <w:color w:val="FF0000"/>
-        </w:rPr>
-        <w:t xml:space="preserve">… </w:t>
+        <w:t xml:space="preserve">Dataset adalah … </w:t>
       </w:r>
       <w:r>
         <w:rPr>
@@ -4471,7 +4464,6 @@
         </w:rPr>
         <w:t>set</w:t>
       </w:r>
-      <w:proofErr w:type="gramEnd"/>
       <w:r>
         <w:rPr>
           <w:rFonts w:ascii="Times New Roman" w:hAnsi="Times New Roman" w:cs="Times New Roman"/>
@@ -4532,7 +4524,7 @@
           <w:noProof/>
         </w:rPr>
         <w:drawing>
-          <wp:inline distT="0" distB="0" distL="0" distR="0" wp14:anchorId="02EBA956" wp14:editId="5BDE8696">
+          <wp:inline distT="0" distB="0" distL="0" distR="0" wp14:anchorId="02EBA956" wp14:editId="22B9F591">
             <wp:extent cx="3888000" cy="2160000"/>
             <wp:effectExtent l="19050" t="19050" r="17780" b="12065"/>
             <wp:docPr id="102117401" name="Picture 5"/>
@@ -4598,16 +4590,35 @@
       <w:r>
         <w:t xml:space="preserve">ambar </w:t>
       </w:r>
-      <w:fldSimple w:instr=" SEQ Gambar \* ARABIC ">
-        <w:r>
-          <w:rPr>
-            <w:noProof/>
-          </w:rPr>
-          <w:t>5</w:t>
-        </w:r>
-      </w:fldSimple>
-      <w:r>
-        <w:t xml:space="preserve"> Cuplikan querry penggabungan dataset</w:t>
+      <w:r>
+        <w:fldChar w:fldCharType="begin"/>
+      </w:r>
+      <w:r>
+        <w:instrText xml:space="preserve"> SEQ Gambar \* ARABIC </w:instrText>
+      </w:r>
+      <w:r>
+        <w:fldChar w:fldCharType="separate"/>
+      </w:r>
+      <w:r>
+        <w:rPr>
+          <w:noProof/>
+        </w:rPr>
+        <w:t>5</w:t>
+      </w:r>
+      <w:r>
+        <w:rPr>
+          <w:noProof/>
+        </w:rPr>
+        <w:fldChar w:fldCharType="end"/>
+      </w:r>
+      <w:r>
+        <w:t xml:space="preserve"> Cuplikan </w:t>
+      </w:r>
+      <w:r>
+        <w:t>sintaks</w:t>
+      </w:r>
+      <w:r>
+        <w:t xml:space="preserve"> penggabungan dataset</w:t>
       </w:r>
     </w:p>
     <w:p>
@@ -4686,14 +4697,27 @@
       <w:r>
         <w:t xml:space="preserve">Gambar </w:t>
       </w:r>
-      <w:fldSimple w:instr=" SEQ Gambar \* ARABIC ">
-        <w:r>
-          <w:rPr>
-            <w:noProof/>
-          </w:rPr>
-          <w:t>6</w:t>
-        </w:r>
-      </w:fldSimple>
+      <w:r>
+        <w:fldChar w:fldCharType="begin"/>
+      </w:r>
+      <w:r>
+        <w:instrText xml:space="preserve"> SEQ Gambar \* ARABIC </w:instrText>
+      </w:r>
+      <w:r>
+        <w:fldChar w:fldCharType="separate"/>
+      </w:r>
+      <w:r>
+        <w:rPr>
+          <w:noProof/>
+        </w:rPr>
+        <w:t>6</w:t>
+      </w:r>
+      <w:r>
+        <w:rPr>
+          <w:noProof/>
+        </w:rPr>
+        <w:fldChar w:fldCharType="end"/>
+      </w:r>
       <w:r>
         <w:t xml:space="preserve"> Berkas sebelum &amp; sesudah penggabungan</w:t>
       </w:r>
@@ -4817,7 +4841,7 @@
           <w:noProof/>
         </w:rPr>
         <w:drawing>
-          <wp:inline distT="0" distB="0" distL="0" distR="0" wp14:anchorId="7A542151" wp14:editId="18965F9B">
+          <wp:inline distT="0" distB="0" distL="0" distR="0" wp14:anchorId="7A542151" wp14:editId="40A8B1CE">
             <wp:extent cx="3418966" cy="1800000"/>
             <wp:effectExtent l="19050" t="19050" r="10160" b="10160"/>
             <wp:docPr id="1182821816" name="Picture 3"/>
@@ -4880,14 +4904,27 @@
       <w:r>
         <w:t xml:space="preserve">Gambar </w:t>
       </w:r>
-      <w:fldSimple w:instr=" SEQ Gambar \* ARABIC ">
-        <w:r>
-          <w:rPr>
-            <w:noProof/>
-          </w:rPr>
-          <w:t>7</w:t>
-        </w:r>
-      </w:fldSimple>
+      <w:r>
+        <w:fldChar w:fldCharType="begin"/>
+      </w:r>
+      <w:r>
+        <w:instrText xml:space="preserve"> SEQ Gambar \* ARABIC </w:instrText>
+      </w:r>
+      <w:r>
+        <w:fldChar w:fldCharType="separate"/>
+      </w:r>
+      <w:r>
+        <w:rPr>
+          <w:noProof/>
+        </w:rPr>
+        <w:t>7</w:t>
+      </w:r>
+      <w:r>
+        <w:rPr>
+          <w:noProof/>
+        </w:rPr>
+        <w:fldChar w:fldCharType="end"/>
+      </w:r>
       <w:r>
         <w:t xml:space="preserve"> Brainstorming pemilihan kolom menggunakan Notepad</w:t>
       </w:r>
@@ -4905,7 +4942,7 @@
           <w:noProof/>
         </w:rPr>
         <w:drawing>
-          <wp:inline distT="0" distB="0" distL="0" distR="0" wp14:anchorId="3D1861C2" wp14:editId="1801D007">
+          <wp:inline distT="0" distB="0" distL="0" distR="0" wp14:anchorId="3D1861C2" wp14:editId="5D4F276F">
             <wp:extent cx="2176464" cy="2160000"/>
             <wp:effectExtent l="19050" t="19050" r="14605" b="12065"/>
             <wp:docPr id="471594841" name="Picture 1"/>
@@ -4968,16 +5005,35 @@
       <w:r>
         <w:t xml:space="preserve">Gambar </w:t>
       </w:r>
-      <w:fldSimple w:instr=" SEQ Gambar \* ARABIC ">
-        <w:r>
-          <w:rPr>
-            <w:noProof/>
-          </w:rPr>
-          <w:t>8</w:t>
-        </w:r>
-      </w:fldSimple>
-      <w:r>
-        <w:t xml:space="preserve"> Querry realisasi brainstorming</w:t>
+      <w:r>
+        <w:fldChar w:fldCharType="begin"/>
+      </w:r>
+      <w:r>
+        <w:instrText xml:space="preserve"> SEQ Gambar \* ARABIC </w:instrText>
+      </w:r>
+      <w:r>
+        <w:fldChar w:fldCharType="separate"/>
+      </w:r>
+      <w:r>
+        <w:rPr>
+          <w:noProof/>
+        </w:rPr>
+        <w:t>8</w:t>
+      </w:r>
+      <w:r>
+        <w:rPr>
+          <w:noProof/>
+        </w:rPr>
+        <w:fldChar w:fldCharType="end"/>
+      </w:r>
+      <w:r>
+        <w:t xml:space="preserve"> </w:t>
+      </w:r>
+      <w:r>
+        <w:t>Sintaks</w:t>
+      </w:r>
+      <w:r>
+        <w:t xml:space="preserve"> realisasi brainstorming</w:t>
       </w:r>
     </w:p>
     <w:p>
@@ -5057,14 +5113,27 @@
       <w:r>
         <w:t xml:space="preserve">Gambar </w:t>
       </w:r>
-      <w:fldSimple w:instr=" SEQ Gambar \* ARABIC ">
-        <w:r>
-          <w:rPr>
-            <w:noProof/>
-          </w:rPr>
-          <w:t>9</w:t>
-        </w:r>
-      </w:fldSimple>
+      <w:r>
+        <w:fldChar w:fldCharType="begin"/>
+      </w:r>
+      <w:r>
+        <w:instrText xml:space="preserve"> SEQ Gambar \* ARABIC </w:instrText>
+      </w:r>
+      <w:r>
+        <w:fldChar w:fldCharType="separate"/>
+      </w:r>
+      <w:r>
+        <w:rPr>
+          <w:noProof/>
+        </w:rPr>
+        <w:t>9</w:t>
+      </w:r>
+      <w:r>
+        <w:rPr>
+          <w:noProof/>
+        </w:rPr>
+        <w:fldChar w:fldCharType="end"/>
+      </w:r>
       <w:r>
         <w:t xml:space="preserve"> Hasil realisasi brainstorming pemilihan kolom</w:t>
       </w:r>
@@ -5194,26 +5263,15 @@
     </w:p>
     <w:p>
       <w:pPr>
+        <w:pStyle w:val="Heading6"/>
+      </w:pPr>
+      <w:r>
+        <w:t>Struktur data</w:t>
+      </w:r>
+    </w:p>
+    <w:p>
+      <w:pPr>
         <w:pStyle w:val="ListParagraph"/>
-        <w:numPr>
-          <w:ilvl w:val="0"/>
-          <w:numId w:val="10"/>
-        </w:numPr>
-        <w:spacing w:line="480" w:lineRule="auto"/>
-        <w:rPr>
-          <w:rFonts w:ascii="Times New Roman" w:hAnsi="Times New Roman" w:cs="Times New Roman"/>
-        </w:rPr>
-      </w:pPr>
-      <w:r>
-        <w:rPr>
-          <w:rFonts w:ascii="Times New Roman" w:hAnsi="Times New Roman" w:cs="Times New Roman"/>
-        </w:rPr>
-        <w:t>Struktur data</w:t>
-      </w:r>
-    </w:p>
-    <w:p>
-      <w:pPr>
-        <w:pStyle w:val="ListParagraph"/>
         <w:spacing w:line="480" w:lineRule="auto"/>
         <w:ind w:left="1440" w:firstLine="720"/>
         <w:rPr>
@@ -5225,23 +5283,7 @@
           <w:rFonts w:ascii="Times New Roman" w:hAnsi="Times New Roman" w:cs="Times New Roman"/>
           <w:color w:val="FF0000"/>
         </w:rPr>
-        <w:t xml:space="preserve">Struktur data pada dataset adalah </w:t>
-      </w:r>
-      <w:proofErr w:type="gramStart"/>
-      <w:r>
-        <w:rPr>
-          <w:rFonts w:ascii="Times New Roman" w:hAnsi="Times New Roman" w:cs="Times New Roman"/>
-          <w:color w:val="FF0000"/>
-        </w:rPr>
-        <w:t>…..</w:t>
-      </w:r>
-      <w:proofErr w:type="gramEnd"/>
-      <w:r>
-        <w:rPr>
-          <w:rFonts w:ascii="Times New Roman" w:hAnsi="Times New Roman" w:cs="Times New Roman"/>
-          <w:color w:val="FF0000"/>
-        </w:rPr>
-        <w:t xml:space="preserve"> </w:t>
+        <w:t xml:space="preserve">Struktur data pada dataset adalah ….. </w:t>
       </w:r>
       <w:r>
         <w:rPr>
@@ -5347,14 +5389,27 @@
       <w:r>
         <w:t xml:space="preserve">Gambar </w:t>
       </w:r>
-      <w:fldSimple w:instr=" SEQ Gambar \* ARABIC ">
-        <w:r>
-          <w:rPr>
-            <w:noProof/>
-          </w:rPr>
-          <w:t>10</w:t>
-        </w:r>
-      </w:fldSimple>
+      <w:r>
+        <w:fldChar w:fldCharType="begin"/>
+      </w:r>
+      <w:r>
+        <w:instrText xml:space="preserve"> SEQ Gambar \* ARABIC </w:instrText>
+      </w:r>
+      <w:r>
+        <w:fldChar w:fldCharType="separate"/>
+      </w:r>
+      <w:r>
+        <w:rPr>
+          <w:noProof/>
+        </w:rPr>
+        <w:t>10</w:t>
+      </w:r>
+      <w:r>
+        <w:rPr>
+          <w:noProof/>
+        </w:rPr>
+        <w:fldChar w:fldCharType="end"/>
+      </w:r>
       <w:r>
         <w:t xml:space="preserve"> Struktrur dataset (data mentah)</w:t>
       </w:r>
@@ -5414,20 +5469,9 @@
     </w:p>
     <w:p>
       <w:pPr>
-        <w:pStyle w:val="ListParagraph"/>
-        <w:numPr>
-          <w:ilvl w:val="0"/>
-          <w:numId w:val="10"/>
-        </w:numPr>
-        <w:spacing w:line="480" w:lineRule="auto"/>
-        <w:rPr>
-          <w:rFonts w:ascii="Times New Roman" w:hAnsi="Times New Roman" w:cs="Times New Roman"/>
-        </w:rPr>
-      </w:pPr>
-      <w:r>
-        <w:rPr>
-          <w:rFonts w:ascii="Times New Roman" w:hAnsi="Times New Roman" w:cs="Times New Roman"/>
-        </w:rPr>
+        <w:pStyle w:val="Heading6"/>
+      </w:pPr>
+      <w:r>
         <w:t>Duplikasi data</w:t>
       </w:r>
     </w:p>
@@ -5449,28 +5493,13 @@
           <w:rFonts w:ascii="Times New Roman" w:hAnsi="Times New Roman" w:cs="Times New Roman"/>
           <w:color w:val="FF0000"/>
         </w:rPr>
-        <w:t>Duplikasi data adalah …</w:t>
-      </w:r>
-      <w:proofErr w:type="gramStart"/>
-      <w:r>
-        <w:rPr>
-          <w:rFonts w:ascii="Times New Roman" w:hAnsi="Times New Roman" w:cs="Times New Roman"/>
-          <w:color w:val="FF0000"/>
+        <w:t xml:space="preserve">Duplikasi data adalah …. </w:t>
+      </w:r>
+      <w:r>
+        <w:rPr>
+          <w:rFonts w:ascii="Times New Roman" w:hAnsi="Times New Roman" w:cs="Times New Roman"/>
         </w:rPr>
         <w:t xml:space="preserve">. </w:t>
-      </w:r>
-      <w:r>
-        <w:rPr>
-          <w:rFonts w:ascii="Times New Roman" w:hAnsi="Times New Roman" w:cs="Times New Roman"/>
-        </w:rPr>
-        <w:t>.</w:t>
-      </w:r>
-      <w:proofErr w:type="gramEnd"/>
-      <w:r>
-        <w:rPr>
-          <w:rFonts w:ascii="Times New Roman" w:hAnsi="Times New Roman" w:cs="Times New Roman"/>
-        </w:rPr>
-        <w:t xml:space="preserve"> </w:t>
       </w:r>
       <w:r>
         <w:rPr>
@@ -5568,14 +5597,27 @@
       <w:r>
         <w:t xml:space="preserve">Gambar </w:t>
       </w:r>
-      <w:fldSimple w:instr=" SEQ Gambar \* ARABIC ">
-        <w:r>
-          <w:rPr>
-            <w:noProof/>
-          </w:rPr>
-          <w:t>11</w:t>
-        </w:r>
-      </w:fldSimple>
+      <w:r>
+        <w:fldChar w:fldCharType="begin"/>
+      </w:r>
+      <w:r>
+        <w:instrText xml:space="preserve"> SEQ Gambar \* ARABIC </w:instrText>
+      </w:r>
+      <w:r>
+        <w:fldChar w:fldCharType="separate"/>
+      </w:r>
+      <w:r>
+        <w:rPr>
+          <w:noProof/>
+        </w:rPr>
+        <w:t>11</w:t>
+      </w:r>
+      <w:r>
+        <w:rPr>
+          <w:noProof/>
+        </w:rPr>
+        <w:fldChar w:fldCharType="end"/>
+      </w:r>
       <w:r>
         <w:t xml:space="preserve"> Menghitung jumlah data duplikat</w:t>
       </w:r>
@@ -5658,14 +5700,27 @@
       <w:r>
         <w:t xml:space="preserve">Gambar </w:t>
       </w:r>
-      <w:fldSimple w:instr=" SEQ Gambar \* ARABIC ">
-        <w:r>
-          <w:rPr>
-            <w:noProof/>
-          </w:rPr>
-          <w:t>12</w:t>
-        </w:r>
-      </w:fldSimple>
+      <w:r>
+        <w:fldChar w:fldCharType="begin"/>
+      </w:r>
+      <w:r>
+        <w:instrText xml:space="preserve"> SEQ Gambar \* ARABIC </w:instrText>
+      </w:r>
+      <w:r>
+        <w:fldChar w:fldCharType="separate"/>
+      </w:r>
+      <w:r>
+        <w:rPr>
+          <w:noProof/>
+        </w:rPr>
+        <w:t>12</w:t>
+      </w:r>
+      <w:r>
+        <w:rPr>
+          <w:noProof/>
+        </w:rPr>
+        <w:fldChar w:fldCharType="end"/>
+      </w:r>
       <w:r>
         <w:t xml:space="preserve"> Sampel data duplikat</w:t>
       </w:r>
@@ -5707,40 +5762,15 @@
     </w:p>
     <w:p>
       <w:pPr>
-        <w:pStyle w:val="ListParagraph"/>
-        <w:numPr>
-          <w:ilvl w:val="0"/>
-          <w:numId w:val="10"/>
-        </w:numPr>
-        <w:spacing w:line="480" w:lineRule="auto"/>
-        <w:rPr>
-          <w:rFonts w:ascii="Times New Roman" w:hAnsi="Times New Roman" w:cs="Times New Roman"/>
-          <w:i/>
-          <w:iCs/>
-        </w:rPr>
-      </w:pPr>
-      <w:r>
-        <w:rPr>
-          <w:rFonts w:ascii="Times New Roman" w:hAnsi="Times New Roman" w:cs="Times New Roman"/>
-          <w:i/>
-          <w:iCs/>
-        </w:rPr>
+        <w:pStyle w:val="Heading6"/>
+      </w:pPr>
+      <w:r>
         <w:t>Missing</w:t>
       </w:r>
       <w:r>
-        <w:rPr>
-          <w:rFonts w:ascii="Times New Roman" w:hAnsi="Times New Roman" w:cs="Times New Roman"/>
-          <w:i/>
-          <w:iCs/>
-        </w:rPr>
         <w:t>/null</w:t>
       </w:r>
       <w:r>
-        <w:rPr>
-          <w:rFonts w:ascii="Times New Roman" w:hAnsi="Times New Roman" w:cs="Times New Roman"/>
-          <w:i/>
-          <w:iCs/>
-        </w:rPr>
         <w:t xml:space="preserve"> values</w:t>
       </w:r>
     </w:p>
@@ -5768,28 +5798,13 @@
           <w:rFonts w:ascii="Times New Roman" w:hAnsi="Times New Roman" w:cs="Times New Roman"/>
           <w:color w:val="FF0000"/>
         </w:rPr>
-        <w:t>adalah …</w:t>
-      </w:r>
-      <w:proofErr w:type="gramStart"/>
-      <w:r>
-        <w:rPr>
-          <w:rFonts w:ascii="Times New Roman" w:hAnsi="Times New Roman" w:cs="Times New Roman"/>
-          <w:color w:val="FF0000"/>
-        </w:rPr>
-        <w:t xml:space="preserve">. </w:t>
-      </w:r>
-      <w:r>
-        <w:rPr>
-          <w:rFonts w:ascii="Times New Roman" w:hAnsi="Times New Roman" w:cs="Times New Roman"/>
-        </w:rPr>
-        <w:t>.</w:t>
-      </w:r>
-      <w:proofErr w:type="gramEnd"/>
-      <w:r>
-        <w:rPr>
-          <w:rFonts w:ascii="Times New Roman" w:hAnsi="Times New Roman" w:cs="Times New Roman"/>
-        </w:rPr>
-        <w:t xml:space="preserve"> Tujuan dari proses ini adalah untuk mengetahui bagian mana saja yang terdapat </w:t>
+        <w:t xml:space="preserve">adalah …. </w:t>
+      </w:r>
+      <w:r>
+        <w:rPr>
+          <w:rFonts w:ascii="Times New Roman" w:hAnsi="Times New Roman" w:cs="Times New Roman"/>
+        </w:rPr>
+        <w:t xml:space="preserve">. Tujuan dari proses ini adalah untuk mengetahui bagian mana saja yang terdapat </w:t>
       </w:r>
       <w:r>
         <w:rPr>
@@ -5890,16 +5905,35 @@
       <w:r>
         <w:t xml:space="preserve">Gambar </w:t>
       </w:r>
-      <w:fldSimple w:instr=" SEQ Gambar \* ARABIC ">
-        <w:r>
-          <w:rPr>
-            <w:noProof/>
-          </w:rPr>
-          <w:t>13</w:t>
-        </w:r>
-      </w:fldSimple>
-      <w:r>
-        <w:t xml:space="preserve"> Querry dan hasil pengecekan missing/null values</w:t>
+      <w:r>
+        <w:fldChar w:fldCharType="begin"/>
+      </w:r>
+      <w:r>
+        <w:instrText xml:space="preserve"> SEQ Gambar \* ARABIC </w:instrText>
+      </w:r>
+      <w:r>
+        <w:fldChar w:fldCharType="separate"/>
+      </w:r>
+      <w:r>
+        <w:rPr>
+          <w:noProof/>
+        </w:rPr>
+        <w:t>13</w:t>
+      </w:r>
+      <w:r>
+        <w:rPr>
+          <w:noProof/>
+        </w:rPr>
+        <w:fldChar w:fldCharType="end"/>
+      </w:r>
+      <w:r>
+        <w:t xml:space="preserve"> </w:t>
+      </w:r>
+      <w:r>
+        <w:t>Sintaks</w:t>
+      </w:r>
+      <w:r>
+        <w:t xml:space="preserve"> dan hasil pengecekan missing/null values</w:t>
       </w:r>
     </w:p>
     <w:p>
@@ -6407,26 +6441,15 @@
     </w:p>
     <w:p>
       <w:pPr>
+        <w:pStyle w:val="Heading6"/>
+      </w:pPr>
+      <w:r>
+        <w:t>Distribusi data</w:t>
+      </w:r>
+    </w:p>
+    <w:p>
+      <w:pPr>
         <w:pStyle w:val="ListParagraph"/>
-        <w:numPr>
-          <w:ilvl w:val="0"/>
-          <w:numId w:val="10"/>
-        </w:numPr>
-        <w:spacing w:line="480" w:lineRule="auto"/>
-        <w:rPr>
-          <w:rFonts w:ascii="Times New Roman" w:hAnsi="Times New Roman" w:cs="Times New Roman"/>
-        </w:rPr>
-      </w:pPr>
-      <w:r>
-        <w:rPr>
-          <w:rFonts w:ascii="Times New Roman" w:hAnsi="Times New Roman" w:cs="Times New Roman"/>
-        </w:rPr>
-        <w:t>Distribusi data</w:t>
-      </w:r>
-    </w:p>
-    <w:p>
-      <w:pPr>
-        <w:pStyle w:val="ListParagraph"/>
         <w:spacing w:line="480" w:lineRule="auto"/>
         <w:ind w:left="1440"/>
         <w:rPr>
@@ -6439,19 +6462,11 @@
         </w:rPr>
         <w:t>Distribusi data pada konteks bussines intelegence adalah …</w:t>
       </w:r>
-      <w:proofErr w:type="gramStart"/>
-      <w:r>
-        <w:rPr>
-          <w:rFonts w:ascii="Times New Roman" w:hAnsi="Times New Roman" w:cs="Times New Roman"/>
-        </w:rPr>
-        <w:t>. .</w:t>
-      </w:r>
-      <w:proofErr w:type="gramEnd"/>
-      <w:r>
-        <w:rPr>
-          <w:rFonts w:ascii="Times New Roman" w:hAnsi="Times New Roman" w:cs="Times New Roman"/>
-        </w:rPr>
-        <w:t xml:space="preserve"> Tujuan proses ini adalah untuk melihat ada tidaknya d</w:t>
+      <w:r>
+        <w:rPr>
+          <w:rFonts w:ascii="Times New Roman" w:hAnsi="Times New Roman" w:cs="Times New Roman"/>
+        </w:rPr>
+        <w:t>. . Tujuan proses ini adalah untuk melihat ada tidaknya d</w:t>
       </w:r>
       <w:r>
         <w:rPr>
@@ -6565,14 +6580,27 @@
       <w:r>
         <w:t xml:space="preserve">Gambar </w:t>
       </w:r>
-      <w:fldSimple w:instr=" SEQ Gambar \* ARABIC ">
-        <w:r>
-          <w:rPr>
-            <w:noProof/>
-          </w:rPr>
-          <w:t>14</w:t>
-        </w:r>
-      </w:fldSimple>
+      <w:r>
+        <w:fldChar w:fldCharType="begin"/>
+      </w:r>
+      <w:r>
+        <w:instrText xml:space="preserve"> SEQ Gambar \* ARABIC </w:instrText>
+      </w:r>
+      <w:r>
+        <w:fldChar w:fldCharType="separate"/>
+      </w:r>
+      <w:r>
+        <w:rPr>
+          <w:noProof/>
+        </w:rPr>
+        <w:t>14</w:t>
+      </w:r>
+      <w:r>
+        <w:rPr>
+          <w:noProof/>
+        </w:rPr>
+        <w:fldChar w:fldCharType="end"/>
+      </w:r>
       <w:r>
         <w:t xml:space="preserve"> Distribusi jalur pendaftaran</w:t>
       </w:r>
@@ -6653,14 +6681,27 @@
       <w:r>
         <w:t xml:space="preserve">Gambar </w:t>
       </w:r>
-      <w:fldSimple w:instr=" SEQ Gambar \* ARABIC ">
-        <w:r>
-          <w:rPr>
-            <w:noProof/>
-          </w:rPr>
-          <w:t>15</w:t>
-        </w:r>
-      </w:fldSimple>
+      <w:r>
+        <w:fldChar w:fldCharType="begin"/>
+      </w:r>
+      <w:r>
+        <w:instrText xml:space="preserve"> SEQ Gambar \* ARABIC </w:instrText>
+      </w:r>
+      <w:r>
+        <w:fldChar w:fldCharType="separate"/>
+      </w:r>
+      <w:r>
+        <w:rPr>
+          <w:noProof/>
+        </w:rPr>
+        <w:t>15</w:t>
+      </w:r>
+      <w:r>
+        <w:rPr>
+          <w:noProof/>
+        </w:rPr>
+        <w:fldChar w:fldCharType="end"/>
+      </w:r>
       <w:r>
         <w:t xml:space="preserve"> </w:t>
       </w:r>
@@ -6753,14 +6794,27 @@
       <w:r>
         <w:t xml:space="preserve">Gambar </w:t>
       </w:r>
-      <w:fldSimple w:instr=" SEQ Gambar \* ARABIC ">
-        <w:r>
-          <w:rPr>
-            <w:noProof/>
-          </w:rPr>
-          <w:t>16</w:t>
-        </w:r>
-      </w:fldSimple>
+      <w:r>
+        <w:fldChar w:fldCharType="begin"/>
+      </w:r>
+      <w:r>
+        <w:instrText xml:space="preserve"> SEQ Gambar \* ARABIC </w:instrText>
+      </w:r>
+      <w:r>
+        <w:fldChar w:fldCharType="separate"/>
+      </w:r>
+      <w:r>
+        <w:rPr>
+          <w:noProof/>
+        </w:rPr>
+        <w:t>16</w:t>
+      </w:r>
+      <w:r>
+        <w:rPr>
+          <w:noProof/>
+        </w:rPr>
+        <w:fldChar w:fldCharType="end"/>
+      </w:r>
       <w:r>
         <w:t xml:space="preserve"> Distribusi </w:t>
       </w:r>
@@ -6843,14 +6897,27 @@
       <w:r>
         <w:t xml:space="preserve">Gambar </w:t>
       </w:r>
-      <w:fldSimple w:instr=" SEQ Gambar \* ARABIC ">
-        <w:r>
-          <w:rPr>
-            <w:noProof/>
-          </w:rPr>
-          <w:t>17</w:t>
-        </w:r>
-      </w:fldSimple>
+      <w:r>
+        <w:fldChar w:fldCharType="begin"/>
+      </w:r>
+      <w:r>
+        <w:instrText xml:space="preserve"> SEQ Gambar \* ARABIC </w:instrText>
+      </w:r>
+      <w:r>
+        <w:fldChar w:fldCharType="separate"/>
+      </w:r>
+      <w:r>
+        <w:rPr>
+          <w:noProof/>
+        </w:rPr>
+        <w:t>17</w:t>
+      </w:r>
+      <w:r>
+        <w:rPr>
+          <w:noProof/>
+        </w:rPr>
+        <w:fldChar w:fldCharType="end"/>
+      </w:r>
       <w:r>
         <w:t xml:space="preserve"> Distribusi </w:t>
       </w:r>
@@ -6873,7 +6940,7 @@
         </w:rPr>
         <w:lastRenderedPageBreak/>
         <w:drawing>
-          <wp:inline distT="0" distB="0" distL="0" distR="0" wp14:anchorId="5EBC01C6" wp14:editId="3C7B68ED">
+          <wp:inline distT="0" distB="0" distL="0" distR="0" wp14:anchorId="5EBC01C6" wp14:editId="1B27B4C8">
             <wp:extent cx="4320000" cy="4658802"/>
             <wp:effectExtent l="0" t="0" r="4445" b="8890"/>
             <wp:docPr id="1878337612" name="Picture 9"/>
@@ -6934,14 +7001,27 @@
       <w:r>
         <w:t xml:space="preserve">Gambar </w:t>
       </w:r>
-      <w:fldSimple w:instr=" SEQ Gambar \* ARABIC ">
-        <w:r>
-          <w:rPr>
-            <w:noProof/>
-          </w:rPr>
-          <w:t>18</w:t>
-        </w:r>
-      </w:fldSimple>
+      <w:r>
+        <w:fldChar w:fldCharType="begin"/>
+      </w:r>
+      <w:r>
+        <w:instrText xml:space="preserve"> SEQ Gambar \* ARABIC </w:instrText>
+      </w:r>
+      <w:r>
+        <w:fldChar w:fldCharType="separate"/>
+      </w:r>
+      <w:r>
+        <w:rPr>
+          <w:noProof/>
+        </w:rPr>
+        <w:t>18</w:t>
+      </w:r>
+      <w:r>
+        <w:rPr>
+          <w:noProof/>
+        </w:rPr>
+        <w:fldChar w:fldCharType="end"/>
+      </w:r>
       <w:r>
         <w:t xml:space="preserve"> Distribusi </w:t>
       </w:r>
@@ -6963,7 +7043,7 @@
           <w:noProof/>
         </w:rPr>
         <w:drawing>
-          <wp:inline distT="0" distB="0" distL="0" distR="0" wp14:anchorId="733B8FED" wp14:editId="62F3C28C">
+          <wp:inline distT="0" distB="0" distL="0" distR="0" wp14:anchorId="733B8FED" wp14:editId="3673FFC3">
             <wp:extent cx="4320000" cy="2058826"/>
             <wp:effectExtent l="0" t="0" r="4445" b="0"/>
             <wp:docPr id="55094509" name="Picture 10"/>
@@ -7024,14 +7104,27 @@
       <w:r>
         <w:t xml:space="preserve">Gambar </w:t>
       </w:r>
-      <w:fldSimple w:instr=" SEQ Gambar \* ARABIC ">
-        <w:r>
-          <w:rPr>
-            <w:noProof/>
-          </w:rPr>
-          <w:t>19</w:t>
-        </w:r>
-      </w:fldSimple>
+      <w:r>
+        <w:fldChar w:fldCharType="begin"/>
+      </w:r>
+      <w:r>
+        <w:instrText xml:space="preserve"> SEQ Gambar \* ARABIC </w:instrText>
+      </w:r>
+      <w:r>
+        <w:fldChar w:fldCharType="separate"/>
+      </w:r>
+      <w:r>
+        <w:rPr>
+          <w:noProof/>
+        </w:rPr>
+        <w:t>19</w:t>
+      </w:r>
+      <w:r>
+        <w:rPr>
+          <w:noProof/>
+        </w:rPr>
+        <w:fldChar w:fldCharType="end"/>
+      </w:r>
       <w:r>
         <w:t xml:space="preserve"> Distribusi </w:t>
       </w:r>
@@ -7115,14 +7208,27 @@
       <w:r>
         <w:t xml:space="preserve">Gambar </w:t>
       </w:r>
-      <w:fldSimple w:instr=" SEQ Gambar \* ARABIC ">
-        <w:r>
-          <w:rPr>
-            <w:noProof/>
-          </w:rPr>
-          <w:t>20</w:t>
-        </w:r>
-      </w:fldSimple>
+      <w:r>
+        <w:fldChar w:fldCharType="begin"/>
+      </w:r>
+      <w:r>
+        <w:instrText xml:space="preserve"> SEQ Gambar \* ARABIC </w:instrText>
+      </w:r>
+      <w:r>
+        <w:fldChar w:fldCharType="separate"/>
+      </w:r>
+      <w:r>
+        <w:rPr>
+          <w:noProof/>
+        </w:rPr>
+        <w:t>20</w:t>
+      </w:r>
+      <w:r>
+        <w:rPr>
+          <w:noProof/>
+        </w:rPr>
+        <w:fldChar w:fldCharType="end"/>
+      </w:r>
       <w:r>
         <w:t xml:space="preserve"> Distribusi </w:t>
       </w:r>
@@ -7144,7 +7250,7 @@
           <w:noProof/>
         </w:rPr>
         <w:drawing>
-          <wp:inline distT="0" distB="0" distL="0" distR="0" wp14:anchorId="314D0ACC" wp14:editId="3D14FC89">
+          <wp:inline distT="0" distB="0" distL="0" distR="0" wp14:anchorId="314D0ACC" wp14:editId="70C45168">
             <wp:extent cx="4320000" cy="2070296"/>
             <wp:effectExtent l="0" t="0" r="4445" b="6350"/>
             <wp:docPr id="1341359440" name="Picture 12"/>
@@ -7205,14 +7311,27 @@
       <w:r>
         <w:t xml:space="preserve">Gambar </w:t>
       </w:r>
-      <w:fldSimple w:instr=" SEQ Gambar \* ARABIC ">
-        <w:r>
-          <w:rPr>
-            <w:noProof/>
-          </w:rPr>
-          <w:t>21</w:t>
-        </w:r>
-      </w:fldSimple>
+      <w:r>
+        <w:fldChar w:fldCharType="begin"/>
+      </w:r>
+      <w:r>
+        <w:instrText xml:space="preserve"> SEQ Gambar \* ARABIC </w:instrText>
+      </w:r>
+      <w:r>
+        <w:fldChar w:fldCharType="separate"/>
+      </w:r>
+      <w:r>
+        <w:rPr>
+          <w:noProof/>
+        </w:rPr>
+        <w:t>21</w:t>
+      </w:r>
+      <w:r>
+        <w:rPr>
+          <w:noProof/>
+        </w:rPr>
+        <w:fldChar w:fldCharType="end"/>
+      </w:r>
       <w:r>
         <w:t xml:space="preserve"> Distribusi </w:t>
       </w:r>
@@ -7296,14 +7415,27 @@
       <w:r>
         <w:t xml:space="preserve">Gambar </w:t>
       </w:r>
-      <w:fldSimple w:instr=" SEQ Gambar \* ARABIC ">
-        <w:r>
-          <w:rPr>
-            <w:noProof/>
-          </w:rPr>
-          <w:t>22</w:t>
-        </w:r>
-      </w:fldSimple>
+      <w:r>
+        <w:fldChar w:fldCharType="begin"/>
+      </w:r>
+      <w:r>
+        <w:instrText xml:space="preserve"> SEQ Gambar \* ARABIC </w:instrText>
+      </w:r>
+      <w:r>
+        <w:fldChar w:fldCharType="separate"/>
+      </w:r>
+      <w:r>
+        <w:rPr>
+          <w:noProof/>
+        </w:rPr>
+        <w:t>22</w:t>
+      </w:r>
+      <w:r>
+        <w:rPr>
+          <w:noProof/>
+        </w:rPr>
+        <w:fldChar w:fldCharType="end"/>
+      </w:r>
       <w:r>
         <w:t xml:space="preserve"> Distribusi </w:t>
       </w:r>
@@ -7386,14 +7518,27 @@
       <w:r>
         <w:t xml:space="preserve">Gambar </w:t>
       </w:r>
-      <w:fldSimple w:instr=" SEQ Gambar \* ARABIC ">
-        <w:r>
-          <w:rPr>
-            <w:noProof/>
-          </w:rPr>
-          <w:t>23</w:t>
-        </w:r>
-      </w:fldSimple>
+      <w:r>
+        <w:fldChar w:fldCharType="begin"/>
+      </w:r>
+      <w:r>
+        <w:instrText xml:space="preserve"> SEQ Gambar \* ARABIC </w:instrText>
+      </w:r>
+      <w:r>
+        <w:fldChar w:fldCharType="separate"/>
+      </w:r>
+      <w:r>
+        <w:rPr>
+          <w:noProof/>
+        </w:rPr>
+        <w:t>23</w:t>
+      </w:r>
+      <w:r>
+        <w:rPr>
+          <w:noProof/>
+        </w:rPr>
+        <w:fldChar w:fldCharType="end"/>
+      </w:r>
       <w:r>
         <w:t xml:space="preserve"> Distribusi </w:t>
       </w:r>
@@ -7477,14 +7622,27 @@
       <w:r>
         <w:t xml:space="preserve">Gambar </w:t>
       </w:r>
-      <w:fldSimple w:instr=" SEQ Gambar \* ARABIC ">
-        <w:r>
-          <w:rPr>
-            <w:noProof/>
-          </w:rPr>
-          <w:t>24</w:t>
-        </w:r>
-      </w:fldSimple>
+      <w:r>
+        <w:fldChar w:fldCharType="begin"/>
+      </w:r>
+      <w:r>
+        <w:instrText xml:space="preserve"> SEQ Gambar \* ARABIC </w:instrText>
+      </w:r>
+      <w:r>
+        <w:fldChar w:fldCharType="separate"/>
+      </w:r>
+      <w:r>
+        <w:rPr>
+          <w:noProof/>
+        </w:rPr>
+        <w:t>24</w:t>
+      </w:r>
+      <w:r>
+        <w:rPr>
+          <w:noProof/>
+        </w:rPr>
+        <w:fldChar w:fldCharType="end"/>
+      </w:r>
       <w:r>
         <w:t xml:space="preserve"> Distribusi </w:t>
       </w:r>
@@ -7567,14 +7725,27 @@
       <w:r>
         <w:t xml:space="preserve">Gambar </w:t>
       </w:r>
-      <w:fldSimple w:instr=" SEQ Gambar \* ARABIC ">
-        <w:r>
-          <w:rPr>
-            <w:noProof/>
-          </w:rPr>
-          <w:t>25</w:t>
-        </w:r>
-      </w:fldSimple>
+      <w:r>
+        <w:fldChar w:fldCharType="begin"/>
+      </w:r>
+      <w:r>
+        <w:instrText xml:space="preserve"> SEQ Gambar \* ARABIC </w:instrText>
+      </w:r>
+      <w:r>
+        <w:fldChar w:fldCharType="separate"/>
+      </w:r>
+      <w:r>
+        <w:rPr>
+          <w:noProof/>
+        </w:rPr>
+        <w:t>25</w:t>
+      </w:r>
+      <w:r>
+        <w:rPr>
+          <w:noProof/>
+        </w:rPr>
+        <w:fldChar w:fldCharType="end"/>
+      </w:r>
       <w:r>
         <w:t xml:space="preserve"> Distribusi </w:t>
       </w:r>
@@ -7658,14 +7829,27 @@
       <w:r>
         <w:t xml:space="preserve">Gambar </w:t>
       </w:r>
-      <w:fldSimple w:instr=" SEQ Gambar \* ARABIC ">
-        <w:r>
-          <w:rPr>
-            <w:noProof/>
-          </w:rPr>
-          <w:t>26</w:t>
-        </w:r>
-      </w:fldSimple>
+      <w:r>
+        <w:fldChar w:fldCharType="begin"/>
+      </w:r>
+      <w:r>
+        <w:instrText xml:space="preserve"> SEQ Gambar \* ARABIC </w:instrText>
+      </w:r>
+      <w:r>
+        <w:fldChar w:fldCharType="separate"/>
+      </w:r>
+      <w:r>
+        <w:rPr>
+          <w:noProof/>
+        </w:rPr>
+        <w:t>26</w:t>
+      </w:r>
+      <w:r>
+        <w:rPr>
+          <w:noProof/>
+        </w:rPr>
+        <w:fldChar w:fldCharType="end"/>
+      </w:r>
       <w:r>
         <w:t xml:space="preserve"> Distribusi </w:t>
       </w:r>
@@ -7889,13 +8073,7 @@
         <w:rPr>
           <w:rFonts w:ascii="Times New Roman" w:hAnsi="Times New Roman" w:cs="Times New Roman"/>
         </w:rPr>
-        <w:t>Terdapat</w:t>
-      </w:r>
-      <w:r>
-        <w:rPr>
-          <w:rFonts w:ascii="Times New Roman" w:hAnsi="Times New Roman" w:cs="Times New Roman"/>
-        </w:rPr>
-        <w:t xml:space="preserve"> </w:t>
+        <w:t xml:space="preserve">Terdapat </w:t>
       </w:r>
       <w:r>
         <w:rPr>
@@ -8004,6 +8182,1986 @@
       <w:pPr>
         <w:pStyle w:val="ListParagraph"/>
         <w:spacing w:line="480" w:lineRule="auto"/>
+        <w:ind w:firstLine="720"/>
+        <w:jc w:val="both"/>
+        <w:rPr>
+          <w:rFonts w:ascii="Times New Roman" w:hAnsi="Times New Roman" w:cs="Times New Roman"/>
+        </w:rPr>
+      </w:pPr>
+      <w:r>
+        <w:rPr>
+          <w:rFonts w:ascii="Times New Roman" w:hAnsi="Times New Roman" w:cs="Times New Roman"/>
+          <w:i/>
+          <w:iCs/>
+          <w:color w:val="FF0000"/>
+        </w:rPr>
+        <w:t>Problem solving</w:t>
+      </w:r>
+      <w:r>
+        <w:rPr>
+          <w:rFonts w:ascii="Times New Roman" w:hAnsi="Times New Roman" w:cs="Times New Roman"/>
+          <w:color w:val="FF0000"/>
+        </w:rPr>
+        <w:t xml:space="preserve"> secara umum adalah … </w:t>
+      </w:r>
+      <w:r>
+        <w:rPr>
+          <w:rFonts w:ascii="Times New Roman" w:hAnsi="Times New Roman" w:cs="Times New Roman"/>
+        </w:rPr>
+        <w:t>.</w:t>
+      </w:r>
+      <w:r>
+        <w:rPr>
+          <w:rFonts w:ascii="Times New Roman" w:hAnsi="Times New Roman" w:cs="Times New Roman"/>
+        </w:rPr>
+        <w:t xml:space="preserve"> Untuk proyek ini, problem solving bertujuan untuk mengatasi daftar masalah yang ditemukan pada proses validasi data.</w:t>
+      </w:r>
+      <w:r>
+        <w:rPr>
+          <w:rFonts w:ascii="Times New Roman" w:hAnsi="Times New Roman" w:cs="Times New Roman"/>
+        </w:rPr>
+        <w:t xml:space="preserve"> Setelah dilakukan problem solving, tahap validasi dilakukan lagi untuk memastikan </w:t>
+      </w:r>
+      <w:r>
+        <w:rPr>
+          <w:rFonts w:ascii="Times New Roman" w:hAnsi="Times New Roman" w:cs="Times New Roman"/>
+        </w:rPr>
+        <w:t>kesiapan</w:t>
+      </w:r>
+      <w:r>
+        <w:rPr>
+          <w:rFonts w:ascii="Times New Roman" w:hAnsi="Times New Roman" w:cs="Times New Roman"/>
+        </w:rPr>
+        <w:t xml:space="preserve"> data.</w:t>
+      </w:r>
+      <w:r>
+        <w:rPr>
+          <w:rFonts w:ascii="Times New Roman" w:hAnsi="Times New Roman" w:cs="Times New Roman"/>
+        </w:rPr>
+        <w:t xml:space="preserve"> Berikut ini adalah hasil dari tahap</w:t>
+      </w:r>
+      <w:r>
+        <w:rPr>
+          <w:rFonts w:ascii="Times New Roman" w:hAnsi="Times New Roman" w:cs="Times New Roman"/>
+        </w:rPr>
+        <w:t xml:space="preserve"> validasi ulang</w:t>
+      </w:r>
+      <w:r>
+        <w:rPr>
+          <w:rFonts w:ascii="Times New Roman" w:hAnsi="Times New Roman" w:cs="Times New Roman"/>
+        </w:rPr>
+        <w:t>:</w:t>
+      </w:r>
+    </w:p>
+    <w:p>
+      <w:pPr>
+        <w:pStyle w:val="Heading6"/>
+        <w:numPr>
+          <w:ilvl w:val="0"/>
+          <w:numId w:val="13"/>
+        </w:numPr>
+      </w:pPr>
+      <w:r>
+        <w:lastRenderedPageBreak/>
+        <w:t>Struktur data</w:t>
+      </w:r>
+    </w:p>
+    <w:p>
+      <w:pPr>
+        <w:pStyle w:val="ListParagraph"/>
+        <w:spacing w:line="480" w:lineRule="auto"/>
+        <w:ind w:left="1440" w:firstLine="720"/>
+        <w:jc w:val="both"/>
+        <w:rPr>
+          <w:rFonts w:ascii="Times New Roman" w:hAnsi="Times New Roman" w:cs="Times New Roman"/>
+        </w:rPr>
+      </w:pPr>
+      <w:r>
+        <w:rPr>
+          <w:rFonts w:ascii="Times New Roman" w:hAnsi="Times New Roman" w:cs="Times New Roman"/>
+        </w:rPr>
+        <w:t>Pada bagian struktur data, masalah yang diatasi adalah pada kolom</w:t>
+      </w:r>
+      <w:r>
+        <w:rPr>
+          <w:rFonts w:ascii="Times New Roman" w:hAnsi="Times New Roman" w:cs="Times New Roman"/>
+        </w:rPr>
+        <w:t xml:space="preserve"> ‘USIA’ yang bertipe data Float pada data mentah</w:t>
+      </w:r>
+      <w:r>
+        <w:rPr>
+          <w:rFonts w:ascii="Times New Roman" w:hAnsi="Times New Roman" w:cs="Times New Roman"/>
+        </w:rPr>
+        <w:t>. Tipe data ini diubah menjadi Integer</w:t>
+      </w:r>
+      <w:r>
+        <w:rPr>
+          <w:rFonts w:ascii="Times New Roman" w:hAnsi="Times New Roman" w:cs="Times New Roman"/>
+        </w:rPr>
+        <w:t>.</w:t>
+      </w:r>
+    </w:p>
+    <w:p>
+      <w:pPr>
+        <w:pStyle w:val="ListParagraph"/>
+        <w:keepNext/>
+        <w:spacing w:line="480" w:lineRule="auto"/>
+        <w:ind w:left="1440"/>
+        <w:jc w:val="center"/>
+      </w:pPr>
+      <w:r>
+        <w:rPr>
+          <w:rFonts w:ascii="Times New Roman" w:hAnsi="Times New Roman" w:cs="Times New Roman"/>
+          <w:noProof/>
+        </w:rPr>
+        <w:drawing>
+          <wp:inline distT="0" distB="0" distL="0" distR="0" wp14:anchorId="243B031C" wp14:editId="3D36B037">
+            <wp:extent cx="2880000" cy="3272133"/>
+            <wp:effectExtent l="19050" t="19050" r="15875" b="24130"/>
+            <wp:docPr id="1492789560" name="Picture 1"/>
+            <wp:cNvGraphicFramePr>
+              <a:graphicFrameLocks xmlns:a="http://schemas.openxmlformats.org/drawingml/2006/main" noChangeAspect="1"/>
+            </wp:cNvGraphicFramePr>
+            <a:graphic xmlns:a="http://schemas.openxmlformats.org/drawingml/2006/main">
+              <a:graphicData uri="http://schemas.openxmlformats.org/drawingml/2006/picture">
+                <pic:pic xmlns:pic="http://schemas.openxmlformats.org/drawingml/2006/picture">
+                  <pic:nvPicPr>
+                    <pic:cNvPr id="0" name="Picture 1"/>
+                    <pic:cNvPicPr>
+                      <a:picLocks noChangeAspect="1" noChangeArrowheads="1"/>
+                    </pic:cNvPicPr>
+                  </pic:nvPicPr>
+                  <pic:blipFill>
+                    <a:blip r:embed="rId34">
+                      <a:extLst>
+                        <a:ext uri="{28A0092B-C50C-407E-A947-70E740481C1C}">
+                          <a14:useLocalDpi xmlns:a14="http://schemas.microsoft.com/office/drawing/2010/main" val="0"/>
+                        </a:ext>
+                      </a:extLst>
+                    </a:blip>
+                    <a:srcRect/>
+                    <a:stretch>
+                      <a:fillRect/>
+                    </a:stretch>
+                  </pic:blipFill>
+                  <pic:spPr bwMode="auto">
+                    <a:xfrm>
+                      <a:off x="0" y="0"/>
+                      <a:ext cx="2880000" cy="3272133"/>
+                    </a:xfrm>
+                    <a:prstGeom prst="rect">
+                      <a:avLst/>
+                    </a:prstGeom>
+                    <a:noFill/>
+                    <a:ln w="12700">
+                      <a:solidFill>
+                        <a:schemeClr val="tx1"/>
+                      </a:solidFill>
+                    </a:ln>
+                  </pic:spPr>
+                </pic:pic>
+              </a:graphicData>
+            </a:graphic>
+          </wp:inline>
+        </w:drawing>
+      </w:r>
+    </w:p>
+    <w:p>
+      <w:pPr>
+        <w:pStyle w:val="Caption"/>
+        <w:spacing w:line="480" w:lineRule="auto"/>
+        <w:jc w:val="center"/>
+        <w:rPr>
+          <w:rFonts w:ascii="Times New Roman" w:hAnsi="Times New Roman" w:cs="Times New Roman"/>
+        </w:rPr>
+      </w:pPr>
+      <w:r>
+        <w:t xml:space="preserve">Gambar </w:t>
+      </w:r>
+      <w:r>
+        <w:fldChar w:fldCharType="begin"/>
+      </w:r>
+      <w:r>
+        <w:instrText xml:space="preserve"> SEQ Gambar \* ARABIC </w:instrText>
+      </w:r>
+      <w:r>
+        <w:fldChar w:fldCharType="separate"/>
+      </w:r>
+      <w:r>
+        <w:rPr>
+          <w:noProof/>
+        </w:rPr>
+        <w:t>27</w:t>
+      </w:r>
+      <w:r>
+        <w:fldChar w:fldCharType="end"/>
+      </w:r>
+      <w:r>
+        <w:t xml:space="preserve"> Validasi ulang struktur data</w:t>
+      </w:r>
+      <w:r>
+        <w:t xml:space="preserve"> </w:t>
+      </w:r>
+    </w:p>
+    <w:p>
+      <w:pPr>
+        <w:pStyle w:val="Heading6"/>
+      </w:pPr>
+      <w:r>
+        <w:t>Duplikasi data</w:t>
+      </w:r>
+    </w:p>
+    <w:p>
+      <w:pPr>
+        <w:pStyle w:val="ListParagraph"/>
+        <w:spacing w:line="480" w:lineRule="auto"/>
+        <w:ind w:left="1440" w:firstLine="720"/>
+        <w:jc w:val="both"/>
+        <w:rPr>
+          <w:rFonts w:ascii="Times New Roman" w:hAnsi="Times New Roman" w:cs="Times New Roman"/>
+        </w:rPr>
+      </w:pPr>
+      <w:r>
+        <w:rPr>
+          <w:rFonts w:ascii="Times New Roman" w:hAnsi="Times New Roman" w:cs="Times New Roman"/>
+        </w:rPr>
+        <w:t>Pada proses validasi data, ditemukan 54 data duplikat yang hanya akan menyebabkan ketidakaslian data pada tahap visualisasi nantinya</w:t>
+      </w:r>
+      <w:r>
+        <w:rPr>
+          <w:rFonts w:ascii="Times New Roman" w:hAnsi="Times New Roman" w:cs="Times New Roman"/>
+        </w:rPr>
+        <w:t>. Maka dari itu, 54 data duplikat dihapus pada tahap problem solving</w:t>
+      </w:r>
+      <w:r>
+        <w:rPr>
+          <w:rFonts w:ascii="Times New Roman" w:hAnsi="Times New Roman" w:cs="Times New Roman"/>
+        </w:rPr>
+        <w:t>.</w:t>
+      </w:r>
+      <w:r>
+        <w:rPr>
+          <w:rFonts w:ascii="Times New Roman" w:hAnsi="Times New Roman" w:cs="Times New Roman"/>
+        </w:rPr>
+        <w:t xml:space="preserve"> </w:t>
+      </w:r>
+      <w:r>
+        <w:rPr>
+          <w:rFonts w:ascii="Times New Roman" w:hAnsi="Times New Roman" w:cs="Times New Roman"/>
+        </w:rPr>
+        <w:t>Berikut</w:t>
+      </w:r>
+      <w:r>
+        <w:rPr>
+          <w:rFonts w:ascii="Times New Roman" w:hAnsi="Times New Roman" w:cs="Times New Roman"/>
+        </w:rPr>
+        <w:t xml:space="preserve"> ini adalah hasil duplikasi data setelah divalidasi ulang</w:t>
+      </w:r>
+      <w:r>
+        <w:rPr>
+          <w:rFonts w:ascii="Times New Roman" w:hAnsi="Times New Roman" w:cs="Times New Roman"/>
+        </w:rPr>
+        <w:t>:</w:t>
+      </w:r>
+    </w:p>
+    <w:p>
+      <w:pPr>
+        <w:pStyle w:val="ListParagraph"/>
+        <w:keepNext/>
+        <w:spacing w:line="480" w:lineRule="auto"/>
+        <w:ind w:left="1440"/>
+        <w:jc w:val="center"/>
+      </w:pPr>
+      <w:r>
+        <w:rPr>
+          <w:rFonts w:ascii="Times New Roman" w:hAnsi="Times New Roman" w:cs="Times New Roman"/>
+          <w:noProof/>
+        </w:rPr>
+        <w:lastRenderedPageBreak/>
+        <w:drawing>
+          <wp:inline distT="0" distB="0" distL="0" distR="0" wp14:anchorId="244B21FA" wp14:editId="64149F72">
+            <wp:extent cx="3600000" cy="2276551"/>
+            <wp:effectExtent l="19050" t="19050" r="19685" b="9525"/>
+            <wp:docPr id="1518039382" name="Picture 2"/>
+            <wp:cNvGraphicFramePr>
+              <a:graphicFrameLocks xmlns:a="http://schemas.openxmlformats.org/drawingml/2006/main" noChangeAspect="1"/>
+            </wp:cNvGraphicFramePr>
+            <a:graphic xmlns:a="http://schemas.openxmlformats.org/drawingml/2006/main">
+              <a:graphicData uri="http://schemas.openxmlformats.org/drawingml/2006/picture">
+                <pic:pic xmlns:pic="http://schemas.openxmlformats.org/drawingml/2006/picture">
+                  <pic:nvPicPr>
+                    <pic:cNvPr id="0" name="Picture 2"/>
+                    <pic:cNvPicPr>
+                      <a:picLocks noChangeAspect="1" noChangeArrowheads="1"/>
+                    </pic:cNvPicPr>
+                  </pic:nvPicPr>
+                  <pic:blipFill>
+                    <a:blip r:embed="rId35">
+                      <a:extLst>
+                        <a:ext uri="{28A0092B-C50C-407E-A947-70E740481C1C}">
+                          <a14:useLocalDpi xmlns:a14="http://schemas.microsoft.com/office/drawing/2010/main" val="0"/>
+                        </a:ext>
+                      </a:extLst>
+                    </a:blip>
+                    <a:srcRect/>
+                    <a:stretch>
+                      <a:fillRect/>
+                    </a:stretch>
+                  </pic:blipFill>
+                  <pic:spPr bwMode="auto">
+                    <a:xfrm>
+                      <a:off x="0" y="0"/>
+                      <a:ext cx="3600000" cy="2276551"/>
+                    </a:xfrm>
+                    <a:prstGeom prst="rect">
+                      <a:avLst/>
+                    </a:prstGeom>
+                    <a:noFill/>
+                    <a:ln w="12700">
+                      <a:solidFill>
+                        <a:schemeClr val="tx1"/>
+                      </a:solidFill>
+                    </a:ln>
+                  </pic:spPr>
+                </pic:pic>
+              </a:graphicData>
+            </a:graphic>
+          </wp:inline>
+        </w:drawing>
+      </w:r>
+    </w:p>
+    <w:p>
+      <w:pPr>
+        <w:pStyle w:val="Caption"/>
+        <w:spacing w:line="480" w:lineRule="auto"/>
+        <w:jc w:val="center"/>
+        <w:rPr>
+          <w:rFonts w:ascii="Times New Roman" w:hAnsi="Times New Roman" w:cs="Times New Roman"/>
+        </w:rPr>
+      </w:pPr>
+      <w:r>
+        <w:t xml:space="preserve">Gambar </w:t>
+      </w:r>
+      <w:r>
+        <w:fldChar w:fldCharType="begin"/>
+      </w:r>
+      <w:r>
+        <w:instrText xml:space="preserve"> SEQ Gambar \* ARABIC </w:instrText>
+      </w:r>
+      <w:r>
+        <w:fldChar w:fldCharType="separate"/>
+      </w:r>
+      <w:r>
+        <w:rPr>
+          <w:noProof/>
+        </w:rPr>
+        <w:t>28</w:t>
+      </w:r>
+      <w:r>
+        <w:fldChar w:fldCharType="end"/>
+      </w:r>
+      <w:r>
+        <w:t xml:space="preserve"> Validasi ulang duplikasi data</w:t>
+      </w:r>
+    </w:p>
+    <w:p>
+      <w:pPr>
+        <w:pStyle w:val="Heading6"/>
+      </w:pPr>
+      <w:r>
+        <w:t>Missing/null values</w:t>
+      </w:r>
+    </w:p>
+    <w:p>
+      <w:pPr>
+        <w:pStyle w:val="ListParagraph"/>
+        <w:spacing w:line="480" w:lineRule="auto"/>
+        <w:ind w:left="1440" w:firstLine="720"/>
+        <w:jc w:val="both"/>
+        <w:rPr>
+          <w:rFonts w:ascii="Times New Roman" w:hAnsi="Times New Roman" w:cs="Times New Roman"/>
+        </w:rPr>
+      </w:pPr>
+      <w:r>
+        <w:rPr>
+          <w:rFonts w:ascii="Times New Roman" w:hAnsi="Times New Roman" w:cs="Times New Roman"/>
+          <w:i/>
+          <w:iCs/>
+          <w:color w:val="FF0000"/>
+        </w:rPr>
+        <w:t>Missing/null values</w:t>
+      </w:r>
+      <w:r>
+        <w:rPr>
+          <w:rFonts w:ascii="Times New Roman" w:hAnsi="Times New Roman" w:cs="Times New Roman"/>
+          <w:color w:val="FF0000"/>
+        </w:rPr>
+        <w:t xml:space="preserve"> menyebabkan …. </w:t>
+      </w:r>
+      <w:r>
+        <w:rPr>
+          <w:rFonts w:ascii="Times New Roman" w:hAnsi="Times New Roman" w:cs="Times New Roman"/>
+        </w:rPr>
+        <w:t>.</w:t>
+      </w:r>
+      <w:r>
+        <w:rPr>
+          <w:rFonts w:ascii="Times New Roman" w:hAnsi="Times New Roman" w:cs="Times New Roman"/>
+        </w:rPr>
+        <w:t xml:space="preserve"> Maka dari itu, pada tahap </w:t>
+      </w:r>
+      <w:r>
+        <w:rPr>
+          <w:rFonts w:ascii="Times New Roman" w:hAnsi="Times New Roman" w:cs="Times New Roman"/>
+          <w:i/>
+          <w:iCs/>
+        </w:rPr>
+        <w:t>problem solving</w:t>
+      </w:r>
+      <w:r>
+        <w:rPr>
+          <w:rFonts w:ascii="Times New Roman" w:hAnsi="Times New Roman" w:cs="Times New Roman"/>
+        </w:rPr>
+        <w:t xml:space="preserve"> semua </w:t>
+      </w:r>
+      <w:r>
+        <w:rPr>
+          <w:rFonts w:ascii="Times New Roman" w:hAnsi="Times New Roman" w:cs="Times New Roman"/>
+          <w:i/>
+          <w:iCs/>
+        </w:rPr>
+        <w:t>missing/null values</w:t>
+      </w:r>
+      <w:r>
+        <w:rPr>
+          <w:rFonts w:ascii="Times New Roman" w:hAnsi="Times New Roman" w:cs="Times New Roman"/>
+        </w:rPr>
+        <w:t xml:space="preserve"> pada tiap kolom harus diatasi</w:t>
+      </w:r>
+      <w:r>
+        <w:rPr>
+          <w:rFonts w:ascii="Times New Roman" w:hAnsi="Times New Roman" w:cs="Times New Roman"/>
+        </w:rPr>
+        <w:t>.</w:t>
+      </w:r>
+      <w:r>
+        <w:rPr>
+          <w:rFonts w:ascii="Times New Roman" w:hAnsi="Times New Roman" w:cs="Times New Roman"/>
+        </w:rPr>
+        <w:t xml:space="preserve"> Penanganan </w:t>
+      </w:r>
+      <w:r>
+        <w:rPr>
+          <w:rFonts w:ascii="Times New Roman" w:hAnsi="Times New Roman" w:cs="Times New Roman"/>
+          <w:i/>
+          <w:iCs/>
+        </w:rPr>
+        <w:t>missing/null values</w:t>
+      </w:r>
+      <w:r>
+        <w:rPr>
+          <w:rFonts w:ascii="Times New Roman" w:hAnsi="Times New Roman" w:cs="Times New Roman"/>
+        </w:rPr>
+        <w:t xml:space="preserve"> pada proyek ini menggunakan 2 cara, yaitu: </w:t>
+      </w:r>
+      <w:r>
+        <w:rPr>
+          <w:rFonts w:ascii="Times New Roman" w:hAnsi="Times New Roman" w:cs="Times New Roman"/>
+          <w:i/>
+          <w:iCs/>
+        </w:rPr>
+        <w:t>Statistical imputation</w:t>
+      </w:r>
+      <w:r>
+        <w:rPr>
+          <w:rFonts w:ascii="Times New Roman" w:hAnsi="Times New Roman" w:cs="Times New Roman"/>
+        </w:rPr>
+        <w:t xml:space="preserve"> dan </w:t>
+      </w:r>
+      <w:r>
+        <w:rPr>
+          <w:rFonts w:ascii="Times New Roman" w:hAnsi="Times New Roman" w:cs="Times New Roman"/>
+          <w:i/>
+          <w:iCs/>
+        </w:rPr>
+        <w:t>label imputation</w:t>
+      </w:r>
+      <w:r>
+        <w:rPr>
+          <w:rFonts w:ascii="Times New Roman" w:hAnsi="Times New Roman" w:cs="Times New Roman"/>
+        </w:rPr>
+        <w:t xml:space="preserve">. Berikut ini adalah hasil dari </w:t>
+      </w:r>
+      <w:r>
+        <w:rPr>
+          <w:rFonts w:ascii="Times New Roman" w:hAnsi="Times New Roman" w:cs="Times New Roman"/>
+          <w:i/>
+          <w:iCs/>
+        </w:rPr>
+        <w:t>missing/null values</w:t>
+      </w:r>
+      <w:r>
+        <w:rPr>
+          <w:rFonts w:ascii="Times New Roman" w:hAnsi="Times New Roman" w:cs="Times New Roman"/>
+        </w:rPr>
+        <w:t xml:space="preserve"> </w:t>
+      </w:r>
+      <w:r>
+        <w:rPr>
+          <w:rFonts w:ascii="Times New Roman" w:hAnsi="Times New Roman" w:cs="Times New Roman"/>
+        </w:rPr>
+        <w:t>setelah divalidasi ulang</w:t>
+      </w:r>
+      <w:r>
+        <w:rPr>
+          <w:rFonts w:ascii="Times New Roman" w:hAnsi="Times New Roman" w:cs="Times New Roman"/>
+        </w:rPr>
+        <w:t>:</w:t>
+      </w:r>
+    </w:p>
+    <w:p>
+      <w:pPr>
+        <w:pStyle w:val="ListParagraph"/>
+        <w:keepNext/>
+        <w:spacing w:line="480" w:lineRule="auto"/>
+        <w:ind w:left="1440"/>
+        <w:jc w:val="center"/>
+      </w:pPr>
+      <w:r>
+        <w:rPr>
+          <w:rFonts w:ascii="Times New Roman" w:hAnsi="Times New Roman" w:cs="Times New Roman"/>
+          <w:noProof/>
+        </w:rPr>
+        <w:lastRenderedPageBreak/>
+        <w:drawing>
+          <wp:inline distT="0" distB="0" distL="0" distR="0" wp14:anchorId="1330E9ED" wp14:editId="5419A932">
+            <wp:extent cx="2015327" cy="2520000"/>
+            <wp:effectExtent l="19050" t="19050" r="23495" b="13970"/>
+            <wp:docPr id="70786930" name="Picture 3"/>
+            <wp:cNvGraphicFramePr>
+              <a:graphicFrameLocks xmlns:a="http://schemas.openxmlformats.org/drawingml/2006/main" noChangeAspect="1"/>
+            </wp:cNvGraphicFramePr>
+            <a:graphic xmlns:a="http://schemas.openxmlformats.org/drawingml/2006/main">
+              <a:graphicData uri="http://schemas.openxmlformats.org/drawingml/2006/picture">
+                <pic:pic xmlns:pic="http://schemas.openxmlformats.org/drawingml/2006/picture">
+                  <pic:nvPicPr>
+                    <pic:cNvPr id="0" name="Picture 3"/>
+                    <pic:cNvPicPr>
+                      <a:picLocks noChangeAspect="1" noChangeArrowheads="1"/>
+                    </pic:cNvPicPr>
+                  </pic:nvPicPr>
+                  <pic:blipFill>
+                    <a:blip r:embed="rId36">
+                      <a:extLst>
+                        <a:ext uri="{28A0092B-C50C-407E-A947-70E740481C1C}">
+                          <a14:useLocalDpi xmlns:a14="http://schemas.microsoft.com/office/drawing/2010/main" val="0"/>
+                        </a:ext>
+                      </a:extLst>
+                    </a:blip>
+                    <a:srcRect/>
+                    <a:stretch>
+                      <a:fillRect/>
+                    </a:stretch>
+                  </pic:blipFill>
+                  <pic:spPr bwMode="auto">
+                    <a:xfrm>
+                      <a:off x="0" y="0"/>
+                      <a:ext cx="2015327" cy="2520000"/>
+                    </a:xfrm>
+                    <a:prstGeom prst="rect">
+                      <a:avLst/>
+                    </a:prstGeom>
+                    <a:noFill/>
+                    <a:ln w="12700">
+                      <a:solidFill>
+                        <a:schemeClr val="tx1"/>
+                      </a:solidFill>
+                    </a:ln>
+                  </pic:spPr>
+                </pic:pic>
+              </a:graphicData>
+            </a:graphic>
+          </wp:inline>
+        </w:drawing>
+      </w:r>
+    </w:p>
+    <w:p>
+      <w:pPr>
+        <w:pStyle w:val="Caption"/>
+        <w:spacing w:line="480" w:lineRule="auto"/>
+        <w:jc w:val="center"/>
+        <w:rPr>
+          <w:rFonts w:ascii="Times New Roman" w:hAnsi="Times New Roman" w:cs="Times New Roman"/>
+        </w:rPr>
+      </w:pPr>
+      <w:r>
+        <w:t xml:space="preserve">Gambar </w:t>
+      </w:r>
+      <w:r>
+        <w:fldChar w:fldCharType="begin"/>
+      </w:r>
+      <w:r>
+        <w:instrText xml:space="preserve"> SEQ Gambar \* ARABIC </w:instrText>
+      </w:r>
+      <w:r>
+        <w:fldChar w:fldCharType="separate"/>
+      </w:r>
+      <w:r>
+        <w:rPr>
+          <w:noProof/>
+        </w:rPr>
+        <w:t>29</w:t>
+      </w:r>
+      <w:r>
+        <w:fldChar w:fldCharType="end"/>
+      </w:r>
+      <w:r>
+        <w:t xml:space="preserve"> </w:t>
+      </w:r>
+      <w:r>
+        <w:t>v</w:t>
+      </w:r>
+      <w:r>
+        <w:t>alidasi ulang missing/null values</w:t>
+      </w:r>
+    </w:p>
+    <w:p>
+      <w:pPr>
+        <w:pStyle w:val="ListParagraph"/>
+        <w:keepNext/>
+        <w:spacing w:line="480" w:lineRule="auto"/>
+        <w:ind w:left="1440"/>
+        <w:jc w:val="center"/>
+      </w:pPr>
+      <w:r>
+        <w:rPr>
+          <w:rFonts w:ascii="Times New Roman" w:hAnsi="Times New Roman" w:cs="Times New Roman"/>
+          <w:noProof/>
+        </w:rPr>
+        <w:drawing>
+          <wp:inline distT="0" distB="0" distL="0" distR="0" wp14:anchorId="2E96E5F1" wp14:editId="4FC6C335">
+            <wp:extent cx="3960000" cy="1258094"/>
+            <wp:effectExtent l="19050" t="19050" r="21590" b="18415"/>
+            <wp:docPr id="1700537861" name="Picture 4"/>
+            <wp:cNvGraphicFramePr>
+              <a:graphicFrameLocks xmlns:a="http://schemas.openxmlformats.org/drawingml/2006/main" noChangeAspect="1"/>
+            </wp:cNvGraphicFramePr>
+            <a:graphic xmlns:a="http://schemas.openxmlformats.org/drawingml/2006/main">
+              <a:graphicData uri="http://schemas.openxmlformats.org/drawingml/2006/picture">
+                <pic:pic xmlns:pic="http://schemas.openxmlformats.org/drawingml/2006/picture">
+                  <pic:nvPicPr>
+                    <pic:cNvPr id="0" name="Picture 4"/>
+                    <pic:cNvPicPr>
+                      <a:picLocks noChangeAspect="1" noChangeArrowheads="1"/>
+                    </pic:cNvPicPr>
+                  </pic:nvPicPr>
+                  <pic:blipFill>
+                    <a:blip r:embed="rId37" cstate="print">
+                      <a:extLst>
+                        <a:ext uri="{28A0092B-C50C-407E-A947-70E740481C1C}">
+                          <a14:useLocalDpi xmlns:a14="http://schemas.microsoft.com/office/drawing/2010/main" val="0"/>
+                        </a:ext>
+                      </a:extLst>
+                    </a:blip>
+                    <a:srcRect/>
+                    <a:stretch>
+                      <a:fillRect/>
+                    </a:stretch>
+                  </pic:blipFill>
+                  <pic:spPr bwMode="auto">
+                    <a:xfrm>
+                      <a:off x="0" y="0"/>
+                      <a:ext cx="3960000" cy="1258094"/>
+                    </a:xfrm>
+                    <a:prstGeom prst="rect">
+                      <a:avLst/>
+                    </a:prstGeom>
+                    <a:noFill/>
+                    <a:ln w="12700">
+                      <a:solidFill>
+                        <a:schemeClr val="tx1"/>
+                      </a:solidFill>
+                    </a:ln>
+                  </pic:spPr>
+                </pic:pic>
+              </a:graphicData>
+            </a:graphic>
+          </wp:inline>
+        </w:drawing>
+      </w:r>
+    </w:p>
+    <w:p>
+      <w:pPr>
+        <w:pStyle w:val="Caption"/>
+        <w:spacing w:line="480" w:lineRule="auto"/>
+        <w:jc w:val="center"/>
+        <w:rPr>
+          <w:rFonts w:ascii="Times New Roman" w:hAnsi="Times New Roman" w:cs="Times New Roman"/>
+          <w:color w:val="auto"/>
+        </w:rPr>
+      </w:pPr>
+      <w:r>
+        <w:t xml:space="preserve">Gambar </w:t>
+      </w:r>
+      <w:r>
+        <w:fldChar w:fldCharType="begin"/>
+      </w:r>
+      <w:r>
+        <w:instrText xml:space="preserve"> SEQ Gambar \* ARABIC </w:instrText>
+      </w:r>
+      <w:r>
+        <w:fldChar w:fldCharType="separate"/>
+      </w:r>
+      <w:r>
+        <w:rPr>
+          <w:noProof/>
+        </w:rPr>
+        <w:t>30</w:t>
+      </w:r>
+      <w:r>
+        <w:fldChar w:fldCharType="end"/>
+      </w:r>
+      <w:r>
+        <w:t xml:space="preserve"> contoh data</w:t>
+      </w:r>
+      <w:r>
+        <w:t xml:space="preserve"> missing yang di isi</w:t>
+      </w:r>
+      <w:r>
+        <w:t xml:space="preserve"> dengan teknik imputation</w:t>
+      </w:r>
+    </w:p>
+    <w:p>
+      <w:pPr>
+        <w:pStyle w:val="Heading6"/>
+      </w:pPr>
+      <w:r>
+        <w:t>Distribusi data</w:t>
+      </w:r>
+    </w:p>
+    <w:p>
+      <w:pPr>
+        <w:pStyle w:val="ListParagraph"/>
+        <w:spacing w:line="480" w:lineRule="auto"/>
+        <w:ind w:left="1440" w:firstLine="720"/>
+        <w:jc w:val="both"/>
+        <w:rPr>
+          <w:rFonts w:ascii="Times New Roman" w:hAnsi="Times New Roman" w:cs="Times New Roman"/>
+        </w:rPr>
+      </w:pPr>
+      <w:r>
+        <w:rPr>
+          <w:rFonts w:ascii="Times New Roman" w:hAnsi="Times New Roman" w:cs="Times New Roman"/>
+        </w:rPr>
+        <w:t xml:space="preserve">Penanganan masalah pada distribusi data juga menggunakan teknik yang sama dengan penanganan pada </w:t>
+      </w:r>
+      <w:r>
+        <w:rPr>
+          <w:rFonts w:ascii="Times New Roman" w:hAnsi="Times New Roman" w:cs="Times New Roman"/>
+          <w:i/>
+          <w:iCs/>
+        </w:rPr>
+        <w:t>missing/nul values</w:t>
+      </w:r>
+      <w:r>
+        <w:rPr>
+          <w:rFonts w:ascii="Times New Roman" w:hAnsi="Times New Roman" w:cs="Times New Roman"/>
+        </w:rPr>
+        <w:t xml:space="preserve">, yaitu dengan teknik </w:t>
+      </w:r>
+      <w:r>
+        <w:rPr>
+          <w:rFonts w:ascii="Times New Roman" w:hAnsi="Times New Roman" w:cs="Times New Roman"/>
+          <w:i/>
+          <w:iCs/>
+        </w:rPr>
+        <w:t>statistical imputation</w:t>
+      </w:r>
+      <w:r>
+        <w:rPr>
+          <w:rFonts w:ascii="Times New Roman" w:hAnsi="Times New Roman" w:cs="Times New Roman"/>
+        </w:rPr>
+        <w:t xml:space="preserve"> dan </w:t>
+      </w:r>
+      <w:r>
+        <w:rPr>
+          <w:rFonts w:ascii="Times New Roman" w:hAnsi="Times New Roman" w:cs="Times New Roman"/>
+          <w:i/>
+          <w:iCs/>
+        </w:rPr>
+        <w:t>label imputation</w:t>
+      </w:r>
+      <w:r>
+        <w:rPr>
+          <w:rFonts w:ascii="Times New Roman" w:hAnsi="Times New Roman" w:cs="Times New Roman"/>
+        </w:rPr>
+        <w:t>.</w:t>
+      </w:r>
+      <w:r>
+        <w:rPr>
+          <w:rFonts w:ascii="Times New Roman" w:hAnsi="Times New Roman" w:cs="Times New Roman"/>
+        </w:rPr>
+        <w:t xml:space="preserve"> Berikut ini adalah hasil dari distribusi data</w:t>
+      </w:r>
+      <w:r>
+        <w:rPr>
+          <w:rFonts w:ascii="Times New Roman" w:hAnsi="Times New Roman" w:cs="Times New Roman"/>
+        </w:rPr>
+        <w:t xml:space="preserve"> yang melalui tahap </w:t>
+      </w:r>
+      <w:r>
+        <w:rPr>
+          <w:rFonts w:ascii="Times New Roman" w:hAnsi="Times New Roman" w:cs="Times New Roman"/>
+          <w:i/>
+          <w:iCs/>
+        </w:rPr>
+        <w:t>problem solving</w:t>
+      </w:r>
+      <w:r>
+        <w:rPr>
+          <w:rFonts w:ascii="Times New Roman" w:hAnsi="Times New Roman" w:cs="Times New Roman"/>
+        </w:rPr>
+        <w:t xml:space="preserve"> setelah divalidasi ulang</w:t>
+      </w:r>
+      <w:r>
+        <w:rPr>
+          <w:rFonts w:ascii="Times New Roman" w:hAnsi="Times New Roman" w:cs="Times New Roman"/>
+        </w:rPr>
+        <w:t>:</w:t>
+      </w:r>
+    </w:p>
+    <w:p>
+      <w:pPr>
+        <w:pStyle w:val="ListParagraph"/>
+        <w:keepNext/>
+        <w:spacing w:line="480" w:lineRule="auto"/>
+        <w:ind w:left="1440"/>
+        <w:jc w:val="center"/>
+      </w:pPr>
+      <w:r>
+        <w:rPr>
+          <w:rFonts w:ascii="Times New Roman" w:hAnsi="Times New Roman" w:cs="Times New Roman"/>
+          <w:noProof/>
+        </w:rPr>
+        <w:lastRenderedPageBreak/>
+        <w:drawing>
+          <wp:inline distT="0" distB="0" distL="0" distR="0" wp14:anchorId="13C331C0" wp14:editId="75F463AD">
+            <wp:extent cx="3600000" cy="2685268"/>
+            <wp:effectExtent l="0" t="0" r="635" b="1270"/>
+            <wp:docPr id="1953399178" name="Picture 5"/>
+            <wp:cNvGraphicFramePr>
+              <a:graphicFrameLocks xmlns:a="http://schemas.openxmlformats.org/drawingml/2006/main" noChangeAspect="1"/>
+            </wp:cNvGraphicFramePr>
+            <a:graphic xmlns:a="http://schemas.openxmlformats.org/drawingml/2006/main">
+              <a:graphicData uri="http://schemas.openxmlformats.org/drawingml/2006/picture">
+                <pic:pic xmlns:pic="http://schemas.openxmlformats.org/drawingml/2006/picture">
+                  <pic:nvPicPr>
+                    <pic:cNvPr id="0" name="Picture 5"/>
+                    <pic:cNvPicPr>
+                      <a:picLocks noChangeAspect="1" noChangeArrowheads="1"/>
+                    </pic:cNvPicPr>
+                  </pic:nvPicPr>
+                  <pic:blipFill>
+                    <a:blip r:embed="rId38">
+                      <a:extLst>
+                        <a:ext uri="{28A0092B-C50C-407E-A947-70E740481C1C}">
+                          <a14:useLocalDpi xmlns:a14="http://schemas.microsoft.com/office/drawing/2010/main" val="0"/>
+                        </a:ext>
+                      </a:extLst>
+                    </a:blip>
+                    <a:srcRect/>
+                    <a:stretch>
+                      <a:fillRect/>
+                    </a:stretch>
+                  </pic:blipFill>
+                  <pic:spPr bwMode="auto">
+                    <a:xfrm>
+                      <a:off x="0" y="0"/>
+                      <a:ext cx="3600000" cy="2685268"/>
+                    </a:xfrm>
+                    <a:prstGeom prst="rect">
+                      <a:avLst/>
+                    </a:prstGeom>
+                    <a:noFill/>
+                    <a:ln>
+                      <a:noFill/>
+                    </a:ln>
+                  </pic:spPr>
+                </pic:pic>
+              </a:graphicData>
+            </a:graphic>
+          </wp:inline>
+        </w:drawing>
+      </w:r>
+    </w:p>
+    <w:p>
+      <w:pPr>
+        <w:pStyle w:val="Caption"/>
+        <w:spacing w:line="480" w:lineRule="auto"/>
+        <w:jc w:val="center"/>
+      </w:pPr>
+      <w:r>
+        <w:t xml:space="preserve">Gambar </w:t>
+      </w:r>
+      <w:r>
+        <w:fldChar w:fldCharType="begin"/>
+      </w:r>
+      <w:r>
+        <w:instrText xml:space="preserve"> SEQ Gambar \* ARABIC </w:instrText>
+      </w:r>
+      <w:r>
+        <w:fldChar w:fldCharType="separate"/>
+      </w:r>
+      <w:r>
+        <w:rPr>
+          <w:noProof/>
+        </w:rPr>
+        <w:t>31</w:t>
+      </w:r>
+      <w:r>
+        <w:fldChar w:fldCharType="end"/>
+      </w:r>
+      <w:r>
+        <w:t xml:space="preserve"> validasi ulang distribusi usia</w:t>
+      </w:r>
+    </w:p>
+    <w:p>
+      <w:pPr>
+        <w:pStyle w:val="ListParagraph"/>
+        <w:keepNext/>
+        <w:spacing w:line="480" w:lineRule="auto"/>
+        <w:ind w:left="1440"/>
+        <w:jc w:val="center"/>
+      </w:pPr>
+      <w:r>
+        <w:rPr>
+          <w:rFonts w:ascii="Times New Roman" w:hAnsi="Times New Roman" w:cs="Times New Roman"/>
+          <w:noProof/>
+        </w:rPr>
+        <w:drawing>
+          <wp:inline distT="0" distB="0" distL="0" distR="0" wp14:anchorId="79EADAB9" wp14:editId="4D3A95D7">
+            <wp:extent cx="3600000" cy="1725247"/>
+            <wp:effectExtent l="0" t="0" r="635" b="8890"/>
+            <wp:docPr id="294467288" name="Picture 6"/>
+            <wp:cNvGraphicFramePr>
+              <a:graphicFrameLocks xmlns:a="http://schemas.openxmlformats.org/drawingml/2006/main" noChangeAspect="1"/>
+            </wp:cNvGraphicFramePr>
+            <a:graphic xmlns:a="http://schemas.openxmlformats.org/drawingml/2006/main">
+              <a:graphicData uri="http://schemas.openxmlformats.org/drawingml/2006/picture">
+                <pic:pic xmlns:pic="http://schemas.openxmlformats.org/drawingml/2006/picture">
+                  <pic:nvPicPr>
+                    <pic:cNvPr id="0" name="Picture 6"/>
+                    <pic:cNvPicPr>
+                      <a:picLocks noChangeAspect="1" noChangeArrowheads="1"/>
+                    </pic:cNvPicPr>
+                  </pic:nvPicPr>
+                  <pic:blipFill>
+                    <a:blip r:embed="rId39" cstate="print">
+                      <a:extLst>
+                        <a:ext uri="{28A0092B-C50C-407E-A947-70E740481C1C}">
+                          <a14:useLocalDpi xmlns:a14="http://schemas.microsoft.com/office/drawing/2010/main" val="0"/>
+                        </a:ext>
+                      </a:extLst>
+                    </a:blip>
+                    <a:srcRect/>
+                    <a:stretch>
+                      <a:fillRect/>
+                    </a:stretch>
+                  </pic:blipFill>
+                  <pic:spPr bwMode="auto">
+                    <a:xfrm>
+                      <a:off x="0" y="0"/>
+                      <a:ext cx="3600000" cy="1725247"/>
+                    </a:xfrm>
+                    <a:prstGeom prst="rect">
+                      <a:avLst/>
+                    </a:prstGeom>
+                    <a:noFill/>
+                    <a:ln>
+                      <a:noFill/>
+                    </a:ln>
+                  </pic:spPr>
+                </pic:pic>
+              </a:graphicData>
+            </a:graphic>
+          </wp:inline>
+        </w:drawing>
+      </w:r>
+    </w:p>
+    <w:p>
+      <w:pPr>
+        <w:pStyle w:val="Caption"/>
+        <w:spacing w:line="480" w:lineRule="auto"/>
+        <w:jc w:val="center"/>
+      </w:pPr>
+      <w:r>
+        <w:t xml:space="preserve">Gambar </w:t>
+      </w:r>
+      <w:r>
+        <w:fldChar w:fldCharType="begin"/>
+      </w:r>
+      <w:r>
+        <w:instrText xml:space="preserve"> SEQ Gambar \* ARABIC </w:instrText>
+      </w:r>
+      <w:r>
+        <w:fldChar w:fldCharType="separate"/>
+      </w:r>
+      <w:r>
+        <w:rPr>
+          <w:noProof/>
+        </w:rPr>
+        <w:t>32</w:t>
+      </w:r>
+      <w:r>
+        <w:fldChar w:fldCharType="end"/>
+      </w:r>
+      <w:r>
+        <w:t xml:space="preserve"> validasi ulang fakultas prodi diterima</w:t>
+      </w:r>
+    </w:p>
+    <w:p>
+      <w:pPr>
+        <w:pStyle w:val="ListParagraph"/>
+        <w:keepNext/>
+        <w:spacing w:line="480" w:lineRule="auto"/>
+        <w:ind w:left="1440"/>
+        <w:jc w:val="center"/>
+      </w:pPr>
+      <w:r>
+        <w:rPr>
+          <w:rFonts w:ascii="Times New Roman" w:hAnsi="Times New Roman" w:cs="Times New Roman"/>
+          <w:noProof/>
+        </w:rPr>
+        <w:drawing>
+          <wp:inline distT="0" distB="0" distL="0" distR="0" wp14:anchorId="663BC19F" wp14:editId="400CFC5F">
+            <wp:extent cx="3600000" cy="1271015"/>
+            <wp:effectExtent l="0" t="0" r="635" b="5715"/>
+            <wp:docPr id="304927025" name="Picture 7"/>
+            <wp:cNvGraphicFramePr>
+              <a:graphicFrameLocks xmlns:a="http://schemas.openxmlformats.org/drawingml/2006/main" noChangeAspect="1"/>
+            </wp:cNvGraphicFramePr>
+            <a:graphic xmlns:a="http://schemas.openxmlformats.org/drawingml/2006/main">
+              <a:graphicData uri="http://schemas.openxmlformats.org/drawingml/2006/picture">
+                <pic:pic xmlns:pic="http://schemas.openxmlformats.org/drawingml/2006/picture">
+                  <pic:nvPicPr>
+                    <pic:cNvPr id="0" name="Picture 7"/>
+                    <pic:cNvPicPr>
+                      <a:picLocks noChangeAspect="1" noChangeArrowheads="1"/>
+                    </pic:cNvPicPr>
+                  </pic:nvPicPr>
+                  <pic:blipFill>
+                    <a:blip r:embed="rId40" cstate="print">
+                      <a:extLst>
+                        <a:ext uri="{28A0092B-C50C-407E-A947-70E740481C1C}">
+                          <a14:useLocalDpi xmlns:a14="http://schemas.microsoft.com/office/drawing/2010/main" val="0"/>
+                        </a:ext>
+                      </a:extLst>
+                    </a:blip>
+                    <a:srcRect/>
+                    <a:stretch>
+                      <a:fillRect/>
+                    </a:stretch>
+                  </pic:blipFill>
+                  <pic:spPr bwMode="auto">
+                    <a:xfrm>
+                      <a:off x="0" y="0"/>
+                      <a:ext cx="3600000" cy="1271015"/>
+                    </a:xfrm>
+                    <a:prstGeom prst="rect">
+                      <a:avLst/>
+                    </a:prstGeom>
+                    <a:noFill/>
+                    <a:ln>
+                      <a:noFill/>
+                    </a:ln>
+                  </pic:spPr>
+                </pic:pic>
+              </a:graphicData>
+            </a:graphic>
+          </wp:inline>
+        </w:drawing>
+      </w:r>
+    </w:p>
+    <w:p>
+      <w:pPr>
+        <w:pStyle w:val="Caption"/>
+        <w:spacing w:line="480" w:lineRule="auto"/>
+        <w:jc w:val="center"/>
+      </w:pPr>
+      <w:r>
+        <w:t xml:space="preserve">Gambar </w:t>
+      </w:r>
+      <w:r>
+        <w:fldChar w:fldCharType="begin"/>
+      </w:r>
+      <w:r>
+        <w:instrText xml:space="preserve"> SEQ Gambar \* ARABIC </w:instrText>
+      </w:r>
+      <w:r>
+        <w:fldChar w:fldCharType="separate"/>
+      </w:r>
+      <w:r>
+        <w:rPr>
+          <w:noProof/>
+        </w:rPr>
+        <w:t>33</w:t>
+      </w:r>
+      <w:r>
+        <w:fldChar w:fldCharType="end"/>
+      </w:r>
+      <w:r>
+        <w:t xml:space="preserve"> validasi ulang distribusi fakultas prodi 1</w:t>
+      </w:r>
+    </w:p>
+    <w:p>
+      <w:pPr>
+        <w:pStyle w:val="ListParagraph"/>
+        <w:keepNext/>
+        <w:spacing w:line="480" w:lineRule="auto"/>
+        <w:ind w:left="1440"/>
+        <w:jc w:val="center"/>
+      </w:pPr>
+      <w:r>
+        <w:rPr>
+          <w:rFonts w:ascii="Times New Roman" w:hAnsi="Times New Roman" w:cs="Times New Roman"/>
+          <w:noProof/>
+        </w:rPr>
+        <w:lastRenderedPageBreak/>
+        <w:drawing>
+          <wp:inline distT="0" distB="0" distL="0" distR="0" wp14:anchorId="5AE0D623" wp14:editId="00F7DE04">
+            <wp:extent cx="3600000" cy="1725247"/>
+            <wp:effectExtent l="0" t="0" r="635" b="8890"/>
+            <wp:docPr id="840825659" name="Picture 8"/>
+            <wp:cNvGraphicFramePr>
+              <a:graphicFrameLocks xmlns:a="http://schemas.openxmlformats.org/drawingml/2006/main" noChangeAspect="1"/>
+            </wp:cNvGraphicFramePr>
+            <a:graphic xmlns:a="http://schemas.openxmlformats.org/drawingml/2006/main">
+              <a:graphicData uri="http://schemas.openxmlformats.org/drawingml/2006/picture">
+                <pic:pic xmlns:pic="http://schemas.openxmlformats.org/drawingml/2006/picture">
+                  <pic:nvPicPr>
+                    <pic:cNvPr id="0" name="Picture 8"/>
+                    <pic:cNvPicPr>
+                      <a:picLocks noChangeAspect="1" noChangeArrowheads="1"/>
+                    </pic:cNvPicPr>
+                  </pic:nvPicPr>
+                  <pic:blipFill>
+                    <a:blip r:embed="rId41" cstate="print">
+                      <a:extLst>
+                        <a:ext uri="{28A0092B-C50C-407E-A947-70E740481C1C}">
+                          <a14:useLocalDpi xmlns:a14="http://schemas.microsoft.com/office/drawing/2010/main" val="0"/>
+                        </a:ext>
+                      </a:extLst>
+                    </a:blip>
+                    <a:srcRect/>
+                    <a:stretch>
+                      <a:fillRect/>
+                    </a:stretch>
+                  </pic:blipFill>
+                  <pic:spPr bwMode="auto">
+                    <a:xfrm>
+                      <a:off x="0" y="0"/>
+                      <a:ext cx="3600000" cy="1725247"/>
+                    </a:xfrm>
+                    <a:prstGeom prst="rect">
+                      <a:avLst/>
+                    </a:prstGeom>
+                    <a:noFill/>
+                    <a:ln>
+                      <a:noFill/>
+                    </a:ln>
+                  </pic:spPr>
+                </pic:pic>
+              </a:graphicData>
+            </a:graphic>
+          </wp:inline>
+        </w:drawing>
+      </w:r>
+    </w:p>
+    <w:p>
+      <w:pPr>
+        <w:pStyle w:val="Caption"/>
+        <w:spacing w:line="480" w:lineRule="auto"/>
+        <w:jc w:val="center"/>
+      </w:pPr>
+      <w:r>
+        <w:t xml:space="preserve">Gambar </w:t>
+      </w:r>
+      <w:r>
+        <w:fldChar w:fldCharType="begin"/>
+      </w:r>
+      <w:r>
+        <w:instrText xml:space="preserve"> SEQ Gambar \* ARABIC </w:instrText>
+      </w:r>
+      <w:r>
+        <w:fldChar w:fldCharType="separate"/>
+      </w:r>
+      <w:r>
+        <w:rPr>
+          <w:noProof/>
+        </w:rPr>
+        <w:t>34</w:t>
+      </w:r>
+      <w:r>
+        <w:fldChar w:fldCharType="end"/>
+      </w:r>
+      <w:r>
+        <w:t xml:space="preserve"> validasi ulang distribusi fakultas prodi 2</w:t>
+      </w:r>
+    </w:p>
+    <w:p>
+      <w:pPr>
+        <w:pStyle w:val="ListParagraph"/>
+        <w:keepNext/>
+        <w:spacing w:line="480" w:lineRule="auto"/>
+        <w:ind w:left="1440"/>
+        <w:jc w:val="center"/>
+      </w:pPr>
+      <w:r>
+        <w:rPr>
+          <w:rFonts w:ascii="Times New Roman" w:hAnsi="Times New Roman" w:cs="Times New Roman"/>
+          <w:noProof/>
+        </w:rPr>
+        <w:drawing>
+          <wp:inline distT="0" distB="0" distL="0" distR="0" wp14:anchorId="30AD1E72" wp14:editId="7F87348C">
+            <wp:extent cx="3600000" cy="3748636"/>
+            <wp:effectExtent l="0" t="0" r="635" b="4445"/>
+            <wp:docPr id="615914710" name="Picture 9"/>
+            <wp:cNvGraphicFramePr>
+              <a:graphicFrameLocks xmlns:a="http://schemas.openxmlformats.org/drawingml/2006/main" noChangeAspect="1"/>
+            </wp:cNvGraphicFramePr>
+            <a:graphic xmlns:a="http://schemas.openxmlformats.org/drawingml/2006/main">
+              <a:graphicData uri="http://schemas.openxmlformats.org/drawingml/2006/picture">
+                <pic:pic xmlns:pic="http://schemas.openxmlformats.org/drawingml/2006/picture">
+                  <pic:nvPicPr>
+                    <pic:cNvPr id="0" name="Picture 9"/>
+                    <pic:cNvPicPr>
+                      <a:picLocks noChangeAspect="1" noChangeArrowheads="1"/>
+                    </pic:cNvPicPr>
+                  </pic:nvPicPr>
+                  <pic:blipFill>
+                    <a:blip r:embed="rId42" cstate="print">
+                      <a:extLst>
+                        <a:ext uri="{28A0092B-C50C-407E-A947-70E740481C1C}">
+                          <a14:useLocalDpi xmlns:a14="http://schemas.microsoft.com/office/drawing/2010/main" val="0"/>
+                        </a:ext>
+                      </a:extLst>
+                    </a:blip>
+                    <a:srcRect/>
+                    <a:stretch>
+                      <a:fillRect/>
+                    </a:stretch>
+                  </pic:blipFill>
+                  <pic:spPr bwMode="auto">
+                    <a:xfrm>
+                      <a:off x="0" y="0"/>
+                      <a:ext cx="3600000" cy="3748636"/>
+                    </a:xfrm>
+                    <a:prstGeom prst="rect">
+                      <a:avLst/>
+                    </a:prstGeom>
+                    <a:noFill/>
+                    <a:ln>
+                      <a:noFill/>
+                    </a:ln>
+                  </pic:spPr>
+                </pic:pic>
+              </a:graphicData>
+            </a:graphic>
+          </wp:inline>
+        </w:drawing>
+      </w:r>
+    </w:p>
+    <w:p>
+      <w:pPr>
+        <w:pStyle w:val="Caption"/>
+        <w:spacing w:line="480" w:lineRule="auto"/>
+        <w:jc w:val="center"/>
+      </w:pPr>
+      <w:r>
+        <w:t xml:space="preserve">Gambar </w:t>
+      </w:r>
+      <w:r>
+        <w:fldChar w:fldCharType="begin"/>
+      </w:r>
+      <w:r>
+        <w:instrText xml:space="preserve"> SEQ Gambar \* ARABIC </w:instrText>
+      </w:r>
+      <w:r>
+        <w:fldChar w:fldCharType="separate"/>
+      </w:r>
+      <w:r>
+        <w:rPr>
+          <w:noProof/>
+        </w:rPr>
+        <w:t>35</w:t>
+      </w:r>
+      <w:r>
+        <w:fldChar w:fldCharType="end"/>
+      </w:r>
+      <w:r>
+        <w:t xml:space="preserve"> validasi ulang distribusi prodi diterima</w:t>
+      </w:r>
+    </w:p>
+    <w:p>
+      <w:pPr>
+        <w:pStyle w:val="ListParagraph"/>
+        <w:keepNext/>
+        <w:spacing w:line="480" w:lineRule="auto"/>
+        <w:ind w:left="1440"/>
+        <w:jc w:val="center"/>
+      </w:pPr>
+      <w:r>
+        <w:rPr>
+          <w:rFonts w:ascii="Times New Roman" w:hAnsi="Times New Roman" w:cs="Times New Roman"/>
+          <w:noProof/>
+        </w:rPr>
+        <w:lastRenderedPageBreak/>
+        <w:drawing>
+          <wp:inline distT="0" distB="0" distL="0" distR="0" wp14:anchorId="7A2B8C94" wp14:editId="11EE56DE">
+            <wp:extent cx="3600000" cy="3748636"/>
+            <wp:effectExtent l="0" t="0" r="635" b="4445"/>
+            <wp:docPr id="851375306" name="Picture 10"/>
+            <wp:cNvGraphicFramePr>
+              <a:graphicFrameLocks xmlns:a="http://schemas.openxmlformats.org/drawingml/2006/main" noChangeAspect="1"/>
+            </wp:cNvGraphicFramePr>
+            <a:graphic xmlns:a="http://schemas.openxmlformats.org/drawingml/2006/main">
+              <a:graphicData uri="http://schemas.openxmlformats.org/drawingml/2006/picture">
+                <pic:pic xmlns:pic="http://schemas.openxmlformats.org/drawingml/2006/picture">
+                  <pic:nvPicPr>
+                    <pic:cNvPr id="0" name="Picture 10"/>
+                    <pic:cNvPicPr>
+                      <a:picLocks noChangeAspect="1" noChangeArrowheads="1"/>
+                    </pic:cNvPicPr>
+                  </pic:nvPicPr>
+                  <pic:blipFill>
+                    <a:blip r:embed="rId43" cstate="print">
+                      <a:extLst>
+                        <a:ext uri="{28A0092B-C50C-407E-A947-70E740481C1C}">
+                          <a14:useLocalDpi xmlns:a14="http://schemas.microsoft.com/office/drawing/2010/main" val="0"/>
+                        </a:ext>
+                      </a:extLst>
+                    </a:blip>
+                    <a:srcRect/>
+                    <a:stretch>
+                      <a:fillRect/>
+                    </a:stretch>
+                  </pic:blipFill>
+                  <pic:spPr bwMode="auto">
+                    <a:xfrm>
+                      <a:off x="0" y="0"/>
+                      <a:ext cx="3600000" cy="3748636"/>
+                    </a:xfrm>
+                    <a:prstGeom prst="rect">
+                      <a:avLst/>
+                    </a:prstGeom>
+                    <a:noFill/>
+                    <a:ln>
+                      <a:noFill/>
+                    </a:ln>
+                  </pic:spPr>
+                </pic:pic>
+              </a:graphicData>
+            </a:graphic>
+          </wp:inline>
+        </w:drawing>
+      </w:r>
+    </w:p>
+    <w:p>
+      <w:pPr>
+        <w:pStyle w:val="Caption"/>
+        <w:spacing w:line="480" w:lineRule="auto"/>
+        <w:jc w:val="center"/>
+      </w:pPr>
+      <w:r>
+        <w:t xml:space="preserve">Gambar </w:t>
+      </w:r>
+      <w:r>
+        <w:fldChar w:fldCharType="begin"/>
+      </w:r>
+      <w:r>
+        <w:instrText xml:space="preserve"> SEQ Gambar \* ARABIC </w:instrText>
+      </w:r>
+      <w:r>
+        <w:fldChar w:fldCharType="separate"/>
+      </w:r>
+      <w:r>
+        <w:rPr>
+          <w:noProof/>
+        </w:rPr>
+        <w:t>36</w:t>
+      </w:r>
+      <w:r>
+        <w:fldChar w:fldCharType="end"/>
+      </w:r>
+      <w:r>
+        <w:t xml:space="preserve"> validasi ulang distribusi prodi pilihan 1</w:t>
+      </w:r>
+    </w:p>
+    <w:p>
+      <w:pPr>
+        <w:pStyle w:val="ListParagraph"/>
+        <w:keepNext/>
+        <w:spacing w:line="480" w:lineRule="auto"/>
+        <w:ind w:left="1440"/>
+        <w:jc w:val="center"/>
+      </w:pPr>
+      <w:r>
+        <w:rPr>
+          <w:rFonts w:ascii="Times New Roman" w:hAnsi="Times New Roman" w:cs="Times New Roman"/>
+          <w:noProof/>
+        </w:rPr>
+        <w:lastRenderedPageBreak/>
+        <w:drawing>
+          <wp:inline distT="0" distB="0" distL="0" distR="0" wp14:anchorId="792ECB98" wp14:editId="596BA6E4">
+            <wp:extent cx="3600000" cy="3882335"/>
+            <wp:effectExtent l="0" t="0" r="635" b="4445"/>
+            <wp:docPr id="1236457430" name="Picture 11"/>
+            <wp:cNvGraphicFramePr>
+              <a:graphicFrameLocks xmlns:a="http://schemas.openxmlformats.org/drawingml/2006/main" noChangeAspect="1"/>
+            </wp:cNvGraphicFramePr>
+            <a:graphic xmlns:a="http://schemas.openxmlformats.org/drawingml/2006/main">
+              <a:graphicData uri="http://schemas.openxmlformats.org/drawingml/2006/picture">
+                <pic:pic xmlns:pic="http://schemas.openxmlformats.org/drawingml/2006/picture">
+                  <pic:nvPicPr>
+                    <pic:cNvPr id="0" name="Picture 11"/>
+                    <pic:cNvPicPr>
+                      <a:picLocks noChangeAspect="1" noChangeArrowheads="1"/>
+                    </pic:cNvPicPr>
+                  </pic:nvPicPr>
+                  <pic:blipFill>
+                    <a:blip r:embed="rId44" cstate="print">
+                      <a:extLst>
+                        <a:ext uri="{28A0092B-C50C-407E-A947-70E740481C1C}">
+                          <a14:useLocalDpi xmlns:a14="http://schemas.microsoft.com/office/drawing/2010/main" val="0"/>
+                        </a:ext>
+                      </a:extLst>
+                    </a:blip>
+                    <a:srcRect/>
+                    <a:stretch>
+                      <a:fillRect/>
+                    </a:stretch>
+                  </pic:blipFill>
+                  <pic:spPr bwMode="auto">
+                    <a:xfrm>
+                      <a:off x="0" y="0"/>
+                      <a:ext cx="3600000" cy="3882335"/>
+                    </a:xfrm>
+                    <a:prstGeom prst="rect">
+                      <a:avLst/>
+                    </a:prstGeom>
+                    <a:noFill/>
+                    <a:ln>
+                      <a:noFill/>
+                    </a:ln>
+                  </pic:spPr>
+                </pic:pic>
+              </a:graphicData>
+            </a:graphic>
+          </wp:inline>
+        </w:drawing>
+      </w:r>
+    </w:p>
+    <w:p>
+      <w:pPr>
+        <w:pStyle w:val="Caption"/>
+        <w:spacing w:line="480" w:lineRule="auto"/>
+        <w:jc w:val="center"/>
+        <w:rPr>
+          <w:rFonts w:ascii="Times New Roman" w:hAnsi="Times New Roman" w:cs="Times New Roman"/>
+        </w:rPr>
+      </w:pPr>
+      <w:r>
+        <w:t xml:space="preserve">Gambar </w:t>
+      </w:r>
+      <w:r>
+        <w:fldChar w:fldCharType="begin"/>
+      </w:r>
+      <w:r>
+        <w:instrText xml:space="preserve"> SEQ Gambar \* ARABIC </w:instrText>
+      </w:r>
+      <w:r>
+        <w:fldChar w:fldCharType="separate"/>
+      </w:r>
+      <w:r>
+        <w:rPr>
+          <w:noProof/>
+        </w:rPr>
+        <w:t>37</w:t>
+      </w:r>
+      <w:r>
+        <w:fldChar w:fldCharType="end"/>
+      </w:r>
+      <w:r>
+        <w:t xml:space="preserve"> validasi ulang prodi pilihan 2</w:t>
+      </w:r>
+    </w:p>
+    <w:p>
+      <w:pPr>
+        <w:pStyle w:val="Heading6"/>
+      </w:pPr>
+      <w:r>
+        <w:t xml:space="preserve">Penambahan </w:t>
+      </w:r>
+      <w:r>
+        <w:t>kolom baru</w:t>
+      </w:r>
+    </w:p>
+    <w:p>
+      <w:pPr>
+        <w:pStyle w:val="ListParagraph"/>
+        <w:spacing w:line="480" w:lineRule="auto"/>
+        <w:ind w:left="1440" w:firstLine="720"/>
+        <w:jc w:val="both"/>
+        <w:rPr>
+          <w:rFonts w:ascii="Times New Roman" w:hAnsi="Times New Roman" w:cs="Times New Roman"/>
+        </w:rPr>
+      </w:pPr>
+      <w:r>
+        <w:rPr>
+          <w:rFonts w:ascii="Times New Roman" w:hAnsi="Times New Roman" w:cs="Times New Roman"/>
+        </w:rPr>
+        <w:t xml:space="preserve">Setelah melakukan </w:t>
+      </w:r>
+      <w:r>
+        <w:rPr>
+          <w:rFonts w:ascii="Times New Roman" w:hAnsi="Times New Roman" w:cs="Times New Roman"/>
+          <w:i/>
+          <w:iCs/>
+        </w:rPr>
+        <w:t>problem solving</w:t>
+      </w:r>
+      <w:r>
+        <w:rPr>
+          <w:rFonts w:ascii="Times New Roman" w:hAnsi="Times New Roman" w:cs="Times New Roman"/>
+        </w:rPr>
+        <w:t xml:space="preserve"> dan validasi ulang, penulis </w:t>
+      </w:r>
+      <w:r>
+        <w:rPr>
+          <w:rFonts w:ascii="Times New Roman" w:hAnsi="Times New Roman" w:cs="Times New Roman"/>
+        </w:rPr>
+        <w:t xml:space="preserve">memutuskan untuk membuat </w:t>
+      </w:r>
+      <w:r>
+        <w:rPr>
+          <w:rFonts w:ascii="Times New Roman" w:hAnsi="Times New Roman" w:cs="Times New Roman"/>
+        </w:rPr>
+        <w:t>kolom baru</w:t>
+      </w:r>
+      <w:r>
+        <w:rPr>
+          <w:rFonts w:ascii="Times New Roman" w:hAnsi="Times New Roman" w:cs="Times New Roman"/>
+        </w:rPr>
+        <w:t xml:space="preserve">. Kolom baru </w:t>
+      </w:r>
+      <w:r>
+        <w:rPr>
+          <w:rFonts w:ascii="Times New Roman" w:hAnsi="Times New Roman" w:cs="Times New Roman"/>
+        </w:rPr>
+        <w:t xml:space="preserve">ini bernama </w:t>
+      </w:r>
+      <w:r>
+        <w:rPr>
+          <w:rFonts w:ascii="Times New Roman" w:hAnsi="Times New Roman" w:cs="Times New Roman"/>
+        </w:rPr>
+        <w:t>‘Kabupaten/Kota’ dan</w:t>
+      </w:r>
+      <w:r>
+        <w:rPr>
+          <w:rFonts w:ascii="Times New Roman" w:hAnsi="Times New Roman" w:cs="Times New Roman"/>
+        </w:rPr>
+        <w:t xml:space="preserve"> </w:t>
+      </w:r>
+      <w:r>
+        <w:rPr>
+          <w:rFonts w:ascii="Times New Roman" w:hAnsi="Times New Roman" w:cs="Times New Roman"/>
+        </w:rPr>
+        <w:t>‘Provinsi’</w:t>
+      </w:r>
+      <w:r>
+        <w:rPr>
+          <w:rFonts w:ascii="Times New Roman" w:hAnsi="Times New Roman" w:cs="Times New Roman"/>
+        </w:rPr>
+        <w:t xml:space="preserve"> yang nantinya </w:t>
+      </w:r>
+      <w:r>
+        <w:rPr>
+          <w:rFonts w:ascii="Times New Roman" w:hAnsi="Times New Roman" w:cs="Times New Roman"/>
+        </w:rPr>
+        <w:t>berpotensi</w:t>
+      </w:r>
+      <w:r>
+        <w:rPr>
+          <w:rFonts w:ascii="Times New Roman" w:hAnsi="Times New Roman" w:cs="Times New Roman"/>
+        </w:rPr>
+        <w:t xml:space="preserve"> digunakan untuk keperluan </w:t>
+      </w:r>
+      <w:r>
+        <w:rPr>
+          <w:rFonts w:ascii="Times New Roman" w:hAnsi="Times New Roman" w:cs="Times New Roman"/>
+        </w:rPr>
+        <w:t>tipe data lokasi</w:t>
+      </w:r>
+      <w:r>
+        <w:rPr>
+          <w:rFonts w:ascii="Times New Roman" w:hAnsi="Times New Roman" w:cs="Times New Roman"/>
+        </w:rPr>
+        <w:t xml:space="preserve"> pada saat visualisasi</w:t>
+      </w:r>
+      <w:r>
+        <w:rPr>
+          <w:rFonts w:ascii="Times New Roman" w:hAnsi="Times New Roman" w:cs="Times New Roman"/>
+        </w:rPr>
+        <w:t xml:space="preserve">. </w:t>
+      </w:r>
+      <w:r>
+        <w:rPr>
+          <w:rFonts w:ascii="Times New Roman" w:hAnsi="Times New Roman" w:cs="Times New Roman"/>
+        </w:rPr>
+        <w:t>Data pada kolom ini adalah hasil ekstraksi kolom ‘ALAMAT DOMISILI</w:t>
+      </w:r>
+      <w:r>
+        <w:rPr>
+          <w:rFonts w:ascii="Times New Roman" w:hAnsi="Times New Roman" w:cs="Times New Roman"/>
+        </w:rPr>
+        <w:t>’</w:t>
+      </w:r>
+      <w:r>
+        <w:rPr>
+          <w:rFonts w:ascii="Times New Roman" w:hAnsi="Times New Roman" w:cs="Times New Roman"/>
+        </w:rPr>
+        <w:t>. Berikut ini adalah dokumentasinya</w:t>
+      </w:r>
+      <w:r>
+        <w:rPr>
+          <w:rFonts w:ascii="Times New Roman" w:hAnsi="Times New Roman" w:cs="Times New Roman"/>
+        </w:rPr>
+        <w:t>:</w:t>
+      </w:r>
+    </w:p>
+    <w:p>
+      <w:pPr>
+        <w:pStyle w:val="ListParagraph"/>
+        <w:keepNext/>
+        <w:spacing w:line="480" w:lineRule="auto"/>
+        <w:ind w:left="1440"/>
+        <w:jc w:val="center"/>
+      </w:pPr>
+      <w:r>
+        <w:rPr>
+          <w:rFonts w:ascii="Times New Roman" w:hAnsi="Times New Roman" w:cs="Times New Roman"/>
+          <w:noProof/>
+        </w:rPr>
+        <w:lastRenderedPageBreak/>
+        <w:drawing>
+          <wp:inline distT="0" distB="0" distL="0" distR="0" wp14:anchorId="1F39DEAA" wp14:editId="6FAB1188">
+            <wp:extent cx="3600000" cy="1778898"/>
+            <wp:effectExtent l="19050" t="19050" r="19685" b="12065"/>
+            <wp:docPr id="1471415995" name="Picture 13"/>
+            <wp:cNvGraphicFramePr>
+              <a:graphicFrameLocks xmlns:a="http://schemas.openxmlformats.org/drawingml/2006/main" noChangeAspect="1"/>
+            </wp:cNvGraphicFramePr>
+            <a:graphic xmlns:a="http://schemas.openxmlformats.org/drawingml/2006/main">
+              <a:graphicData uri="http://schemas.openxmlformats.org/drawingml/2006/picture">
+                <pic:pic xmlns:pic="http://schemas.openxmlformats.org/drawingml/2006/picture">
+                  <pic:nvPicPr>
+                    <pic:cNvPr id="0" name="Picture 13"/>
+                    <pic:cNvPicPr>
+                      <a:picLocks noChangeAspect="1" noChangeArrowheads="1"/>
+                    </pic:cNvPicPr>
+                  </pic:nvPicPr>
+                  <pic:blipFill>
+                    <a:blip r:embed="rId45">
+                      <a:extLst>
+                        <a:ext uri="{28A0092B-C50C-407E-A947-70E740481C1C}">
+                          <a14:useLocalDpi xmlns:a14="http://schemas.microsoft.com/office/drawing/2010/main" val="0"/>
+                        </a:ext>
+                      </a:extLst>
+                    </a:blip>
+                    <a:srcRect/>
+                    <a:stretch>
+                      <a:fillRect/>
+                    </a:stretch>
+                  </pic:blipFill>
+                  <pic:spPr bwMode="auto">
+                    <a:xfrm>
+                      <a:off x="0" y="0"/>
+                      <a:ext cx="3600000" cy="1778898"/>
+                    </a:xfrm>
+                    <a:prstGeom prst="rect">
+                      <a:avLst/>
+                    </a:prstGeom>
+                    <a:noFill/>
+                    <a:ln w="12700">
+                      <a:solidFill>
+                        <a:schemeClr val="tx1"/>
+                      </a:solidFill>
+                    </a:ln>
+                  </pic:spPr>
+                </pic:pic>
+              </a:graphicData>
+            </a:graphic>
+          </wp:inline>
+        </w:drawing>
+      </w:r>
+    </w:p>
+    <w:p>
+      <w:pPr>
+        <w:pStyle w:val="Caption"/>
+        <w:spacing w:line="480" w:lineRule="auto"/>
+        <w:jc w:val="center"/>
+        <w:rPr>
+          <w:rFonts w:ascii="Times New Roman" w:hAnsi="Times New Roman" w:cs="Times New Roman"/>
+        </w:rPr>
+      </w:pPr>
+      <w:r>
+        <w:t xml:space="preserve">Gambar </w:t>
+      </w:r>
+      <w:r>
+        <w:fldChar w:fldCharType="begin"/>
+      </w:r>
+      <w:r>
+        <w:instrText xml:space="preserve"> SEQ Gambar \* ARABIC </w:instrText>
+      </w:r>
+      <w:r>
+        <w:fldChar w:fldCharType="separate"/>
+      </w:r>
+      <w:r>
+        <w:rPr>
+          <w:noProof/>
+        </w:rPr>
+        <w:t>38</w:t>
+      </w:r>
+      <w:r>
+        <w:fldChar w:fldCharType="end"/>
+      </w:r>
+      <w:r>
+        <w:t xml:space="preserve"> </w:t>
+      </w:r>
+      <w:r>
+        <w:t>sintaks</w:t>
+      </w:r>
+      <w:r>
+        <w:t xml:space="preserve"> pembuatan kolom Kabupaten/Kota</w:t>
+      </w:r>
+    </w:p>
+    <w:p>
+      <w:pPr>
+        <w:pStyle w:val="ListParagraph"/>
+        <w:keepNext/>
+        <w:spacing w:line="480" w:lineRule="auto"/>
+        <w:ind w:left="1440"/>
+        <w:jc w:val="center"/>
+      </w:pPr>
+      <w:r>
+        <w:rPr>
+          <w:rFonts w:ascii="Times New Roman" w:hAnsi="Times New Roman" w:cs="Times New Roman"/>
+          <w:noProof/>
+        </w:rPr>
+        <w:drawing>
+          <wp:inline distT="0" distB="0" distL="0" distR="0" wp14:anchorId="69934982" wp14:editId="37CCF397">
+            <wp:extent cx="3600000" cy="1639581"/>
+            <wp:effectExtent l="19050" t="19050" r="19685" b="17780"/>
+            <wp:docPr id="1079505026" name="Picture 14"/>
+            <wp:cNvGraphicFramePr>
+              <a:graphicFrameLocks xmlns:a="http://schemas.openxmlformats.org/drawingml/2006/main" noChangeAspect="1"/>
+            </wp:cNvGraphicFramePr>
+            <a:graphic xmlns:a="http://schemas.openxmlformats.org/drawingml/2006/main">
+              <a:graphicData uri="http://schemas.openxmlformats.org/drawingml/2006/picture">
+                <pic:pic xmlns:pic="http://schemas.openxmlformats.org/drawingml/2006/picture">
+                  <pic:nvPicPr>
+                    <pic:cNvPr id="0" name="Picture 14"/>
+                    <pic:cNvPicPr>
+                      <a:picLocks noChangeAspect="1" noChangeArrowheads="1"/>
+                    </pic:cNvPicPr>
+                  </pic:nvPicPr>
+                  <pic:blipFill>
+                    <a:blip r:embed="rId46">
+                      <a:extLst>
+                        <a:ext uri="{28A0092B-C50C-407E-A947-70E740481C1C}">
+                          <a14:useLocalDpi xmlns:a14="http://schemas.microsoft.com/office/drawing/2010/main" val="0"/>
+                        </a:ext>
+                      </a:extLst>
+                    </a:blip>
+                    <a:srcRect/>
+                    <a:stretch>
+                      <a:fillRect/>
+                    </a:stretch>
+                  </pic:blipFill>
+                  <pic:spPr bwMode="auto">
+                    <a:xfrm>
+                      <a:off x="0" y="0"/>
+                      <a:ext cx="3600000" cy="1639581"/>
+                    </a:xfrm>
+                    <a:prstGeom prst="rect">
+                      <a:avLst/>
+                    </a:prstGeom>
+                    <a:noFill/>
+                    <a:ln w="12700">
+                      <a:solidFill>
+                        <a:schemeClr val="tx1"/>
+                      </a:solidFill>
+                    </a:ln>
+                  </pic:spPr>
+                </pic:pic>
+              </a:graphicData>
+            </a:graphic>
+          </wp:inline>
+        </w:drawing>
+      </w:r>
+    </w:p>
+    <w:p>
+      <w:pPr>
+        <w:pStyle w:val="Caption"/>
+        <w:spacing w:line="480" w:lineRule="auto"/>
+        <w:jc w:val="center"/>
+        <w:rPr>
+          <w:rFonts w:ascii="Times New Roman" w:hAnsi="Times New Roman" w:cs="Times New Roman"/>
+        </w:rPr>
+      </w:pPr>
+      <w:r>
+        <w:t xml:space="preserve">Gambar </w:t>
+      </w:r>
+      <w:r>
+        <w:fldChar w:fldCharType="begin"/>
+      </w:r>
+      <w:r>
+        <w:instrText xml:space="preserve"> SEQ Gambar \* ARABIC </w:instrText>
+      </w:r>
+      <w:r>
+        <w:fldChar w:fldCharType="separate"/>
+      </w:r>
+      <w:r>
+        <w:rPr>
+          <w:noProof/>
+        </w:rPr>
+        <w:t>39</w:t>
+      </w:r>
+      <w:r>
+        <w:fldChar w:fldCharType="end"/>
+      </w:r>
+      <w:r>
+        <w:t xml:space="preserve"> sintaks pembuatan kolom Provinsi</w:t>
+      </w:r>
+    </w:p>
+    <w:p>
+      <w:pPr>
+        <w:pStyle w:val="ListParagraph"/>
+        <w:keepNext/>
+        <w:spacing w:line="480" w:lineRule="auto"/>
+        <w:ind w:left="1440"/>
+        <w:jc w:val="center"/>
+      </w:pPr>
+      <w:r>
+        <w:rPr>
+          <w:rFonts w:ascii="Times New Roman" w:hAnsi="Times New Roman" w:cs="Times New Roman"/>
+          <w:noProof/>
+        </w:rPr>
+        <w:drawing>
+          <wp:inline distT="0" distB="0" distL="0" distR="0" wp14:anchorId="42F23791" wp14:editId="055AE681">
+            <wp:extent cx="3472668" cy="2710551"/>
+            <wp:effectExtent l="19050" t="19050" r="13970" b="13970"/>
+            <wp:docPr id="401638566" name="Picture 15"/>
+            <wp:cNvGraphicFramePr>
+              <a:graphicFrameLocks xmlns:a="http://schemas.openxmlformats.org/drawingml/2006/main" noChangeAspect="1"/>
+            </wp:cNvGraphicFramePr>
+            <a:graphic xmlns:a="http://schemas.openxmlformats.org/drawingml/2006/main">
+              <a:graphicData uri="http://schemas.openxmlformats.org/drawingml/2006/picture">
+                <pic:pic xmlns:pic="http://schemas.openxmlformats.org/drawingml/2006/picture">
+                  <pic:nvPicPr>
+                    <pic:cNvPr id="401638566" name="Picture 15"/>
+                    <pic:cNvPicPr>
+                      <a:picLocks noChangeAspect="1" noChangeArrowheads="1"/>
+                    </pic:cNvPicPr>
+                  </pic:nvPicPr>
+                  <pic:blipFill>
+                    <a:blip r:embed="rId47" cstate="print">
+                      <a:extLst>
+                        <a:ext uri="{28A0092B-C50C-407E-A947-70E740481C1C}">
+                          <a14:useLocalDpi xmlns:a14="http://schemas.microsoft.com/office/drawing/2010/main" val="0"/>
+                        </a:ext>
+                      </a:extLst>
+                    </a:blip>
+                    <a:stretch>
+                      <a:fillRect/>
+                    </a:stretch>
+                  </pic:blipFill>
+                  <pic:spPr bwMode="auto">
+                    <a:xfrm>
+                      <a:off x="0" y="0"/>
+                      <a:ext cx="3472668" cy="2710551"/>
+                    </a:xfrm>
+                    <a:prstGeom prst="rect">
+                      <a:avLst/>
+                    </a:prstGeom>
+                    <a:noFill/>
+                    <a:ln w="12700">
+                      <a:solidFill>
+                        <a:schemeClr val="tx1"/>
+                      </a:solidFill>
+                    </a:ln>
+                  </pic:spPr>
+                </pic:pic>
+              </a:graphicData>
+            </a:graphic>
+          </wp:inline>
+        </w:drawing>
+      </w:r>
+    </w:p>
+    <w:p>
+      <w:pPr>
+        <w:pStyle w:val="Caption"/>
+        <w:spacing w:line="480" w:lineRule="auto"/>
+        <w:jc w:val="center"/>
+        <w:rPr>
+          <w:rFonts w:ascii="Times New Roman" w:hAnsi="Times New Roman" w:cs="Times New Roman"/>
+          <w:color w:val="auto"/>
+        </w:rPr>
+      </w:pPr>
+      <w:r>
+        <w:t xml:space="preserve">Gambar </w:t>
+      </w:r>
+      <w:r>
+        <w:fldChar w:fldCharType="begin"/>
+      </w:r>
+      <w:r>
+        <w:instrText xml:space="preserve"> SEQ Gambar \* ARABIC </w:instrText>
+      </w:r>
+      <w:r>
+        <w:fldChar w:fldCharType="separate"/>
+      </w:r>
+      <w:r>
+        <w:rPr>
+          <w:noProof/>
+        </w:rPr>
+        <w:t>40</w:t>
+      </w:r>
+      <w:r>
+        <w:fldChar w:fldCharType="end"/>
+      </w:r>
+      <w:r>
+        <w:t xml:space="preserve"> </w:t>
+      </w:r>
+      <w:r>
+        <w:t xml:space="preserve">contoh </w:t>
+      </w:r>
+      <w:r>
+        <w:t>hasil pembuatan kolom baru</w:t>
+      </w:r>
+    </w:p>
+    <w:p>
+      <w:pPr>
+        <w:pStyle w:val="Heading4"/>
+      </w:pPr>
+      <w:r>
+        <w:lastRenderedPageBreak/>
+        <w:t>Representasi</w:t>
+      </w:r>
+    </w:p>
+    <w:p>
+      <w:pPr>
+        <w:pStyle w:val="ListParagraph"/>
+        <w:spacing w:line="480" w:lineRule="auto"/>
         <w:rPr>
           <w:rFonts w:ascii="Times New Roman" w:hAnsi="Times New Roman" w:cs="Times New Roman"/>
         </w:rPr>
@@ -8020,30 +10178,6 @@
         <w:pStyle w:val="Heading4"/>
       </w:pPr>
       <w:r>
-        <w:t>Representasi</w:t>
-      </w:r>
-    </w:p>
-    <w:p>
-      <w:pPr>
-        <w:pStyle w:val="ListParagraph"/>
-        <w:spacing w:line="480" w:lineRule="auto"/>
-        <w:rPr>
-          <w:rFonts w:ascii="Times New Roman" w:hAnsi="Times New Roman" w:cs="Times New Roman"/>
-        </w:rPr>
-      </w:pPr>
-      <w:r>
-        <w:rPr>
-          <w:rFonts w:ascii="Times New Roman" w:hAnsi="Times New Roman" w:cs="Times New Roman"/>
-        </w:rPr>
-        <w:t>sss</w:t>
-      </w:r>
-    </w:p>
-    <w:p>
-      <w:pPr>
-        <w:pStyle w:val="Heading4"/>
-      </w:pPr>
-      <w:r>
-        <w:lastRenderedPageBreak/>
         <w:t>Pembuatan Landing Page</w:t>
       </w:r>
     </w:p>
@@ -8502,11 +10636,11 @@
   <w:abstractNum w:abstractNumId="4" w15:restartNumberingAfterBreak="0">
     <w:nsid w:val="2B7B57CD"/>
     <w:multiLevelType w:val="hybridMultilevel"/>
-    <w:tmpl w:val="5082DAE2"/>
-    <w:lvl w:ilvl="0" w:tplc="0409000F">
+    <w:tmpl w:val="3A02C9E4"/>
+    <w:lvl w:ilvl="0" w:tplc="04090011">
       <w:start w:val="1"/>
       <w:numFmt w:val="decimal"/>
-      <w:lvlText w:val="%1."/>
+      <w:lvlText w:val="%1)"/>
       <w:lvlJc w:val="left"/>
       <w:pPr>
         <w:ind w:left="720" w:hanging="360"/>
@@ -8515,16 +10649,17 @@
         <w:rFonts w:hint="default"/>
       </w:rPr>
     </w:lvl>
-    <w:lvl w:ilvl="1" w:tplc="04090003" w:tentative="1">
+    <w:lvl w:ilvl="1" w:tplc="A2F6460C">
       <w:start w:val="1"/>
-      <w:numFmt w:val="bullet"/>
-      <w:lvlText w:val="o"/>
+      <w:numFmt w:val="decimal"/>
+      <w:pStyle w:val="Heading7"/>
+      <w:lvlText w:val="%2)"/>
       <w:lvlJc w:val="left"/>
       <w:pPr>
         <w:ind w:left="1440" w:hanging="360"/>
       </w:pPr>
       <w:rPr>
-        <w:rFonts w:ascii="Courier New" w:hAnsi="Courier New" w:cs="Courier New" w:hint="default"/>
+        <w:rFonts w:hint="default"/>
       </w:rPr>
     </w:lvl>
     <w:lvl w:ilvl="2" w:tplc="04090005" w:tentative="1">
@@ -8841,15 +10976,19 @@
   <w:abstractNum w:abstractNumId="7" w15:restartNumberingAfterBreak="0">
     <w:nsid w:val="4167498C"/>
     <w:multiLevelType w:val="hybridMultilevel"/>
-    <w:tmpl w:val="89B2EC42"/>
-    <w:lvl w:ilvl="0" w:tplc="04090011">
+    <w:tmpl w:val="64DCE37C"/>
+    <w:lvl w:ilvl="0" w:tplc="164E053A">
       <w:start w:val="1"/>
       <w:numFmt w:val="decimal"/>
+      <w:pStyle w:val="Heading6"/>
       <w:lvlText w:val="%1)"/>
       <w:lvlJc w:val="left"/>
       <w:pPr>
         <w:ind w:left="1440" w:hanging="360"/>
       </w:pPr>
+      <w:rPr>
+        <w:rFonts w:hint="default"/>
+      </w:rPr>
     </w:lvl>
     <w:lvl w:ilvl="1" w:tplc="04090019" w:tentative="1">
       <w:start w:val="1"/>
@@ -9412,6 +11551,12 @@
   <w:num w:numId="12" w16cid:durableId="644774398">
     <w:abstractNumId w:val="9"/>
   </w:num>
+  <w:num w:numId="13" w16cid:durableId="1220090486">
+    <w:abstractNumId w:val="7"/>
+    <w:lvlOverride w:ilvl="0">
+      <w:startOverride w:val="1"/>
+    </w:lvlOverride>
+  </w:num>
 </w:numbering>
 </file>
 
@@ -9442,7 +11587,7 @@
     <w:lsdException w:name="heading 4" w:semiHidden="1" w:uiPriority="9" w:unhideWhenUsed="1" w:qFormat="1"/>
     <w:lsdException w:name="heading 5" w:semiHidden="1" w:uiPriority="9" w:unhideWhenUsed="1" w:qFormat="1"/>
     <w:lsdException w:name="heading 6" w:semiHidden="1" w:uiPriority="9" w:unhideWhenUsed="1" w:qFormat="1"/>
-    <w:lsdException w:name="heading 7" w:semiHidden="1" w:uiPriority="9" w:unhideWhenUsed="1" w:qFormat="1"/>
+    <w:lsdException w:name="heading 7" w:semiHidden="1" w:uiPriority="9" w:unhideWhenUsed="1"/>
     <w:lsdException w:name="heading 8" w:semiHidden="1" w:uiPriority="9" w:unhideWhenUsed="1" w:qFormat="1"/>
     <w:lsdException w:name="heading 9" w:semiHidden="1" w:uiPriority="9" w:unhideWhenUsed="1" w:qFormat="1"/>
     <w:lsdException w:name="index 1" w:semiHidden="1" w:unhideWhenUsed="1"/>
@@ -9933,46 +12078,44 @@
   </w:style>
   <w:style w:type="paragraph" w:styleId="Heading6">
     <w:name w:val="heading 6"/>
-    <w:basedOn w:val="Normal"/>
+    <w:aliases w:val="Heading 6 (Validasi sub)"/>
+    <w:basedOn w:val="ListParagraph"/>
     <w:next w:val="Normal"/>
     <w:link w:val="Heading6Char"/>
     <w:uiPriority w:val="9"/>
-    <w:semiHidden/>
     <w:unhideWhenUsed/>
     <w:qFormat/>
-    <w:rsid w:val="00023480"/>
+    <w:rsid w:val="004E3B8E"/>
     <w:pPr>
-      <w:keepNext/>
-      <w:keepLines/>
-      <w:spacing w:before="40" w:after="0"/>
+      <w:numPr>
+        <w:numId w:val="10"/>
+      </w:numPr>
+      <w:spacing w:line="480" w:lineRule="auto"/>
       <w:outlineLvl w:val="5"/>
     </w:pPr>
     <w:rPr>
-      <w:rFonts w:eastAsiaTheme="majorEastAsia" w:cstheme="majorBidi"/>
-      <w:i/>
-      <w:iCs/>
-      <w:color w:val="595959" w:themeColor="text1" w:themeTint="A6"/>
+      <w:rFonts w:ascii="Times New Roman" w:hAnsi="Times New Roman" w:cs="Times New Roman"/>
     </w:rPr>
   </w:style>
   <w:style w:type="paragraph" w:styleId="Heading7">
     <w:name w:val="heading 7"/>
-    <w:basedOn w:val="Normal"/>
+    <w:aliases w:val="Heading 7 (problem solving sub)"/>
+    <w:basedOn w:val="ListParagraph"/>
     <w:next w:val="Normal"/>
     <w:link w:val="Heading7Char"/>
     <w:uiPriority w:val="9"/>
-    <w:semiHidden/>
     <w:unhideWhenUsed/>
-    <w:qFormat/>
-    <w:rsid w:val="00023480"/>
+    <w:rsid w:val="000C586E"/>
     <w:pPr>
-      <w:keepNext/>
-      <w:keepLines/>
-      <w:spacing w:before="40" w:after="0"/>
+      <w:numPr>
+        <w:ilvl w:val="1"/>
+        <w:numId w:val="2"/>
+      </w:numPr>
+      <w:spacing w:line="480" w:lineRule="auto"/>
       <w:outlineLvl w:val="6"/>
     </w:pPr>
     <w:rPr>
-      <w:rFonts w:eastAsiaTheme="majorEastAsia" w:cstheme="majorBidi"/>
-      <w:color w:val="595959" w:themeColor="text1" w:themeTint="A6"/>
+      <w:rFonts w:ascii="Times New Roman" w:hAnsi="Times New Roman" w:cs="Times New Roman"/>
     </w:rPr>
   </w:style>
   <w:style w:type="paragraph" w:styleId="Heading8">
@@ -10111,28 +12254,24 @@
   </w:style>
   <w:style w:type="character" w:customStyle="1" w:styleId="Heading6Char">
     <w:name w:val="Heading 6 Char"/>
+    <w:aliases w:val="Heading 6 (Validasi sub) Char"/>
     <w:basedOn w:val="DefaultParagraphFont"/>
     <w:link w:val="Heading6"/>
     <w:uiPriority w:val="9"/>
-    <w:semiHidden/>
-    <w:rsid w:val="00023480"/>
+    <w:rsid w:val="004E3B8E"/>
     <w:rPr>
-      <w:rFonts w:eastAsiaTheme="majorEastAsia" w:cstheme="majorBidi"/>
-      <w:i/>
-      <w:iCs/>
-      <w:color w:val="595959" w:themeColor="text1" w:themeTint="A6"/>
+      <w:rFonts w:ascii="Times New Roman" w:hAnsi="Times New Roman" w:cs="Times New Roman"/>
     </w:rPr>
   </w:style>
   <w:style w:type="character" w:customStyle="1" w:styleId="Heading7Char">
     <w:name w:val="Heading 7 Char"/>
+    <w:aliases w:val="Heading 7 (problem solving sub) Char"/>
     <w:basedOn w:val="DefaultParagraphFont"/>
     <w:link w:val="Heading7"/>
     <w:uiPriority w:val="9"/>
-    <w:semiHidden/>
-    <w:rsid w:val="00023480"/>
+    <w:rsid w:val="000C586E"/>
     <w:rPr>
-      <w:rFonts w:eastAsiaTheme="majorEastAsia" w:cstheme="majorBidi"/>
-      <w:color w:val="595959" w:themeColor="text1" w:themeTint="A6"/>
+      <w:rFonts w:ascii="Times New Roman" w:hAnsi="Times New Roman" w:cs="Times New Roman"/>
     </w:rPr>
   </w:style>
   <w:style w:type="character" w:customStyle="1" w:styleId="Heading8Char">

</xml_diff>

<commit_message>
abis nyicil bagian brainstorming visualisasi, nexxt selesaikan visualisasi
</commit_message>
<xml_diff>
--- a/non-website/Laporan Akhir KP/2203040182 - Dhika Ramadhan Saputra - Laporan KP.docx
+++ b/non-website/Laporan Akhir KP/2203040182 - Dhika Ramadhan Saputra - Laporan KP.docx
@@ -177,6 +177,7 @@
           <w:szCs w:val="22"/>
         </w:rPr>
       </w:pPr>
+      <w:proofErr w:type="gramStart"/>
       <w:r>
         <w:rPr>
           <w:rFonts w:ascii="Times New Roman" w:hAnsi="Times New Roman" w:cs="Times New Roman"/>
@@ -199,15 +200,16 @@
           <w:sz w:val="22"/>
           <w:szCs w:val="22"/>
         </w:rPr>
-        <w:t>: Dhika Ramadhan Saputra</w:t>
-      </w:r>
+        <w:t>:</w:t>
+      </w:r>
+      <w:proofErr w:type="gramEnd"/>
       <w:r>
         <w:rPr>
           <w:rFonts w:ascii="Times New Roman" w:hAnsi="Times New Roman" w:cs="Times New Roman"/>
           <w:sz w:val="22"/>
           <w:szCs w:val="22"/>
         </w:rPr>
-        <w:br/>
+        <w:t xml:space="preserve"> Dhika Ramadhan Saputra</w:t>
       </w:r>
       <w:r>
         <w:rPr>
@@ -215,15 +217,16 @@
           <w:sz w:val="22"/>
           <w:szCs w:val="22"/>
         </w:rPr>
-        <w:t>NIM.</w:t>
-      </w:r>
+        <w:br/>
+      </w:r>
+      <w:proofErr w:type="gramStart"/>
       <w:r>
         <w:rPr>
           <w:rFonts w:ascii="Times New Roman" w:hAnsi="Times New Roman" w:cs="Times New Roman"/>
           <w:sz w:val="22"/>
           <w:szCs w:val="22"/>
         </w:rPr>
-        <w:t xml:space="preserve">  </w:t>
+        <w:t>NIM.</w:t>
       </w:r>
       <w:r>
         <w:rPr>
@@ -231,7 +234,24 @@
           <w:sz w:val="22"/>
           <w:szCs w:val="22"/>
         </w:rPr>
-        <w:t>: 2203040182</w:t>
+        <w:t xml:space="preserve">  </w:t>
+      </w:r>
+      <w:r>
+        <w:rPr>
+          <w:rFonts w:ascii="Times New Roman" w:hAnsi="Times New Roman" w:cs="Times New Roman"/>
+          <w:sz w:val="22"/>
+          <w:szCs w:val="22"/>
+        </w:rPr>
+        <w:t>:</w:t>
+      </w:r>
+      <w:proofErr w:type="gramEnd"/>
+      <w:r>
+        <w:rPr>
+          <w:rFonts w:ascii="Times New Roman" w:hAnsi="Times New Roman" w:cs="Times New Roman"/>
+          <w:sz w:val="22"/>
+          <w:szCs w:val="22"/>
+        </w:rPr>
+        <w:t xml:space="preserve"> 2203040182</w:t>
       </w:r>
     </w:p>
     <w:p>
@@ -674,7 +694,21 @@
         <w:rPr>
           <w:rFonts w:ascii="Times New Roman" w:hAnsi="Times New Roman" w:cs="Times New Roman"/>
         </w:rPr>
-        <w:t>Nomor pendaftaran, jalur masuk, tahun masuk, prodi pilihan 1, prodi pilihan 2, fakultas pilihan 1, fakultas pilihan 2, prodi diterima, fakultas prodi diterima, usia, asal SLTA, jurusan SLTA, alamat asal, alamat domisili, pendidikan ayah, pendidikan ibu, pekerjaan ibu, alamat orang tua,  dan Provinsi asal domisili</w:t>
+        <w:t xml:space="preserve">Nomor pendaftaran, jalur masuk, tahun masuk, prodi pilihan 1, prodi pilihan 2, fakultas pilihan 1, fakultas pilihan 2, prodi diterima, fakultas prodi diterima, usia, asal SLTA, jurusan SLTA, alamat asal, alamat domisili, pendidikan ayah, pendidikan ibu, pekerjaan ibu, alamat orang </w:t>
+      </w:r>
+      <w:proofErr w:type="gramStart"/>
+      <w:r>
+        <w:rPr>
+          <w:rFonts w:ascii="Times New Roman" w:hAnsi="Times New Roman" w:cs="Times New Roman"/>
+        </w:rPr>
+        <w:t>tua,  dan</w:t>
+      </w:r>
+      <w:proofErr w:type="gramEnd"/>
+      <w:r>
+        <w:rPr>
+          <w:rFonts w:ascii="Times New Roman" w:hAnsi="Times New Roman" w:cs="Times New Roman"/>
+        </w:rPr>
+        <w:t xml:space="preserve"> Provinsi asal domisili</w:t>
       </w:r>
       <w:r>
         <w:rPr>
@@ -4015,7 +4049,15 @@
           <w:rFonts w:ascii="Times New Roman" w:hAnsi="Times New Roman" w:cs="Times New Roman"/>
           <w:color w:val="FF0000"/>
         </w:rPr>
-        <w:t xml:space="preserve">Pengumpulan data adalah … </w:t>
+        <w:t xml:space="preserve">Pengumpulan data adalah </w:t>
+      </w:r>
+      <w:proofErr w:type="gramStart"/>
+      <w:r>
+        <w:rPr>
+          <w:rFonts w:ascii="Times New Roman" w:hAnsi="Times New Roman" w:cs="Times New Roman"/>
+          <w:color w:val="FF0000"/>
+        </w:rPr>
+        <w:t xml:space="preserve">… </w:t>
       </w:r>
       <w:r>
         <w:rPr>
@@ -4033,7 +4075,14 @@
         <w:rPr>
           <w:rFonts w:ascii="Times New Roman" w:hAnsi="Times New Roman" w:cs="Times New Roman"/>
         </w:rPr>
-        <w:t>ada proyek ini, p</w:t>
+        <w:t>ada</w:t>
+      </w:r>
+      <w:proofErr w:type="gramEnd"/>
+      <w:r>
+        <w:rPr>
+          <w:rFonts w:ascii="Times New Roman" w:hAnsi="Times New Roman" w:cs="Times New Roman"/>
+        </w:rPr>
+        <w:t xml:space="preserve"> proyek ini, p</w:t>
       </w:r>
       <w:r>
         <w:rPr>
@@ -4240,7 +4289,7 @@
           <w:noProof/>
         </w:rPr>
         <w:drawing>
-          <wp:inline distT="0" distB="0" distL="0" distR="0" wp14:anchorId="75188C27" wp14:editId="530E8B53">
+          <wp:inline distT="0" distB="0" distL="0" distR="0" wp14:anchorId="75188C27" wp14:editId="1A5517E6">
             <wp:extent cx="4608000" cy="1698906"/>
             <wp:effectExtent l="19050" t="19050" r="21590" b="15875"/>
             <wp:docPr id="783286403" name="Picture 4"/>
@@ -4380,7 +4429,15 @@
           <w:rFonts w:ascii="Times New Roman" w:hAnsi="Times New Roman" w:cs="Times New Roman"/>
           <w:color w:val="FF0000"/>
         </w:rPr>
-        <w:t xml:space="preserve">Pre-processing adalah … </w:t>
+        <w:t xml:space="preserve">Pre-processing adalah </w:t>
+      </w:r>
+      <w:proofErr w:type="gramStart"/>
+      <w:r>
+        <w:rPr>
+          <w:rFonts w:ascii="Times New Roman" w:hAnsi="Times New Roman" w:cs="Times New Roman"/>
+          <w:color w:val="FF0000"/>
+        </w:rPr>
+        <w:t xml:space="preserve">… </w:t>
       </w:r>
       <w:r>
         <w:rPr>
@@ -4392,7 +4449,14 @@
         <w:rPr>
           <w:rFonts w:ascii="Times New Roman" w:hAnsi="Times New Roman" w:cs="Times New Roman"/>
         </w:rPr>
-        <w:t xml:space="preserve">Sesuai dengan gambaran umum proyek, tahap </w:t>
+        <w:t>Sesuai</w:t>
+      </w:r>
+      <w:proofErr w:type="gramEnd"/>
+      <w:r>
+        <w:rPr>
+          <w:rFonts w:ascii="Times New Roman" w:hAnsi="Times New Roman" w:cs="Times New Roman"/>
+        </w:rPr>
+        <w:t xml:space="preserve"> dengan gambaran umum proyek, tahap </w:t>
       </w:r>
       <w:r>
         <w:rPr>
@@ -4440,7 +4504,15 @@
           <w:rFonts w:ascii="Times New Roman" w:hAnsi="Times New Roman" w:cs="Times New Roman"/>
           <w:color w:val="FF0000"/>
         </w:rPr>
-        <w:t xml:space="preserve">Dataset adalah … </w:t>
+        <w:t xml:space="preserve">Dataset adalah </w:t>
+      </w:r>
+      <w:proofErr w:type="gramStart"/>
+      <w:r>
+        <w:rPr>
+          <w:rFonts w:ascii="Times New Roman" w:hAnsi="Times New Roman" w:cs="Times New Roman"/>
+          <w:color w:val="FF0000"/>
+        </w:rPr>
+        <w:t xml:space="preserve">… </w:t>
       </w:r>
       <w:r>
         <w:rPr>
@@ -4464,6 +4536,7 @@
         </w:rPr>
         <w:t>set</w:t>
       </w:r>
+      <w:proofErr w:type="gramEnd"/>
       <w:r>
         <w:rPr>
           <w:rFonts w:ascii="Times New Roman" w:hAnsi="Times New Roman" w:cs="Times New Roman"/>
@@ -4524,7 +4597,7 @@
           <w:noProof/>
         </w:rPr>
         <w:drawing>
-          <wp:inline distT="0" distB="0" distL="0" distR="0" wp14:anchorId="02EBA956" wp14:editId="22B9F591">
+          <wp:inline distT="0" distB="0" distL="0" distR="0" wp14:anchorId="02EBA956" wp14:editId="64B8A314">
             <wp:extent cx="3888000" cy="2160000"/>
             <wp:effectExtent l="19050" t="19050" r="17780" b="12065"/>
             <wp:docPr id="102117401" name="Picture 5"/>
@@ -4841,7 +4914,7 @@
           <w:noProof/>
         </w:rPr>
         <w:drawing>
-          <wp:inline distT="0" distB="0" distL="0" distR="0" wp14:anchorId="7A542151" wp14:editId="40A8B1CE">
+          <wp:inline distT="0" distB="0" distL="0" distR="0" wp14:anchorId="7A542151" wp14:editId="35A3B738">
             <wp:extent cx="3418966" cy="1800000"/>
             <wp:effectExtent l="19050" t="19050" r="10160" b="10160"/>
             <wp:docPr id="1182821816" name="Picture 3"/>
@@ -4942,7 +5015,7 @@
           <w:noProof/>
         </w:rPr>
         <w:drawing>
-          <wp:inline distT="0" distB="0" distL="0" distR="0" wp14:anchorId="3D1861C2" wp14:editId="5D4F276F">
+          <wp:inline distT="0" distB="0" distL="0" distR="0" wp14:anchorId="3D1861C2" wp14:editId="28468D33">
             <wp:extent cx="2176464" cy="2160000"/>
             <wp:effectExtent l="19050" t="19050" r="14605" b="12065"/>
             <wp:docPr id="471594841" name="Picture 1"/>
@@ -5283,7 +5356,23 @@
           <w:rFonts w:ascii="Times New Roman" w:hAnsi="Times New Roman" w:cs="Times New Roman"/>
           <w:color w:val="FF0000"/>
         </w:rPr>
-        <w:t xml:space="preserve">Struktur data pada dataset adalah ….. </w:t>
+        <w:t xml:space="preserve">Struktur data pada dataset adalah </w:t>
+      </w:r>
+      <w:proofErr w:type="gramStart"/>
+      <w:r>
+        <w:rPr>
+          <w:rFonts w:ascii="Times New Roman" w:hAnsi="Times New Roman" w:cs="Times New Roman"/>
+          <w:color w:val="FF0000"/>
+        </w:rPr>
+        <w:t>…..</w:t>
+      </w:r>
+      <w:proofErr w:type="gramEnd"/>
+      <w:r>
+        <w:rPr>
+          <w:rFonts w:ascii="Times New Roman" w:hAnsi="Times New Roman" w:cs="Times New Roman"/>
+          <w:color w:val="FF0000"/>
+        </w:rPr>
+        <w:t xml:space="preserve"> </w:t>
       </w:r>
       <w:r>
         <w:rPr>
@@ -5493,13 +5582,28 @@
           <w:rFonts w:ascii="Times New Roman" w:hAnsi="Times New Roman" w:cs="Times New Roman"/>
           <w:color w:val="FF0000"/>
         </w:rPr>
-        <w:t xml:space="preserve">Duplikasi data adalah …. </w:t>
-      </w:r>
-      <w:r>
-        <w:rPr>
-          <w:rFonts w:ascii="Times New Roman" w:hAnsi="Times New Roman" w:cs="Times New Roman"/>
+        <w:t>Duplikasi data adalah …</w:t>
+      </w:r>
+      <w:proofErr w:type="gramStart"/>
+      <w:r>
+        <w:rPr>
+          <w:rFonts w:ascii="Times New Roman" w:hAnsi="Times New Roman" w:cs="Times New Roman"/>
+          <w:color w:val="FF0000"/>
         </w:rPr>
         <w:t xml:space="preserve">. </w:t>
+      </w:r>
+      <w:r>
+        <w:rPr>
+          <w:rFonts w:ascii="Times New Roman" w:hAnsi="Times New Roman" w:cs="Times New Roman"/>
+        </w:rPr>
+        <w:t>.</w:t>
+      </w:r>
+      <w:proofErr w:type="gramEnd"/>
+      <w:r>
+        <w:rPr>
+          <w:rFonts w:ascii="Times New Roman" w:hAnsi="Times New Roman" w:cs="Times New Roman"/>
+        </w:rPr>
+        <w:t xml:space="preserve"> </w:t>
       </w:r>
       <w:r>
         <w:rPr>
@@ -5798,13 +5902,28 @@
           <w:rFonts w:ascii="Times New Roman" w:hAnsi="Times New Roman" w:cs="Times New Roman"/>
           <w:color w:val="FF0000"/>
         </w:rPr>
-        <w:t xml:space="preserve">adalah …. </w:t>
-      </w:r>
-      <w:r>
-        <w:rPr>
-          <w:rFonts w:ascii="Times New Roman" w:hAnsi="Times New Roman" w:cs="Times New Roman"/>
-        </w:rPr>
-        <w:t xml:space="preserve">. Tujuan dari proses ini adalah untuk mengetahui bagian mana saja yang terdapat </w:t>
+        <w:t>adalah …</w:t>
+      </w:r>
+      <w:proofErr w:type="gramStart"/>
+      <w:r>
+        <w:rPr>
+          <w:rFonts w:ascii="Times New Roman" w:hAnsi="Times New Roman" w:cs="Times New Roman"/>
+          <w:color w:val="FF0000"/>
+        </w:rPr>
+        <w:t xml:space="preserve">. </w:t>
+      </w:r>
+      <w:r>
+        <w:rPr>
+          <w:rFonts w:ascii="Times New Roman" w:hAnsi="Times New Roman" w:cs="Times New Roman"/>
+        </w:rPr>
+        <w:t>.</w:t>
+      </w:r>
+      <w:proofErr w:type="gramEnd"/>
+      <w:r>
+        <w:rPr>
+          <w:rFonts w:ascii="Times New Roman" w:hAnsi="Times New Roman" w:cs="Times New Roman"/>
+        </w:rPr>
+        <w:t xml:space="preserve"> Tujuan dari proses ini adalah untuk mengetahui bagian mana saja yang terdapat </w:t>
       </w:r>
       <w:r>
         <w:rPr>
@@ -6462,11 +6581,19 @@
         </w:rPr>
         <w:t>Distribusi data pada konteks bussines intelegence adalah …</w:t>
       </w:r>
-      <w:r>
-        <w:rPr>
-          <w:rFonts w:ascii="Times New Roman" w:hAnsi="Times New Roman" w:cs="Times New Roman"/>
-        </w:rPr>
-        <w:t>. . Tujuan proses ini adalah untuk melihat ada tidaknya d</w:t>
+      <w:proofErr w:type="gramStart"/>
+      <w:r>
+        <w:rPr>
+          <w:rFonts w:ascii="Times New Roman" w:hAnsi="Times New Roman" w:cs="Times New Roman"/>
+        </w:rPr>
+        <w:t>. .</w:t>
+      </w:r>
+      <w:proofErr w:type="gramEnd"/>
+      <w:r>
+        <w:rPr>
+          <w:rFonts w:ascii="Times New Roman" w:hAnsi="Times New Roman" w:cs="Times New Roman"/>
+        </w:rPr>
+        <w:t xml:space="preserve"> Tujuan proses ini adalah untuk melihat ada tidaknya d</w:t>
       </w:r>
       <w:r>
         <w:rPr>
@@ -6940,7 +7067,7 @@
         </w:rPr>
         <w:lastRenderedPageBreak/>
         <w:drawing>
-          <wp:inline distT="0" distB="0" distL="0" distR="0" wp14:anchorId="5EBC01C6" wp14:editId="1B27B4C8">
+          <wp:inline distT="0" distB="0" distL="0" distR="0" wp14:anchorId="5EBC01C6" wp14:editId="7F48D5FF">
             <wp:extent cx="4320000" cy="4658802"/>
             <wp:effectExtent l="0" t="0" r="4445" b="8890"/>
             <wp:docPr id="1878337612" name="Picture 9"/>
@@ -7043,7 +7170,7 @@
           <w:noProof/>
         </w:rPr>
         <w:drawing>
-          <wp:inline distT="0" distB="0" distL="0" distR="0" wp14:anchorId="733B8FED" wp14:editId="3673FFC3">
+          <wp:inline distT="0" distB="0" distL="0" distR="0" wp14:anchorId="733B8FED" wp14:editId="758EB87F">
             <wp:extent cx="4320000" cy="2058826"/>
             <wp:effectExtent l="0" t="0" r="4445" b="0"/>
             <wp:docPr id="55094509" name="Picture 10"/>
@@ -7250,7 +7377,7 @@
           <w:noProof/>
         </w:rPr>
         <w:drawing>
-          <wp:inline distT="0" distB="0" distL="0" distR="0" wp14:anchorId="314D0ACC" wp14:editId="70C45168">
+          <wp:inline distT="0" distB="0" distL="0" distR="0" wp14:anchorId="314D0ACC" wp14:editId="3D4AB1AB">
             <wp:extent cx="4320000" cy="2070296"/>
             <wp:effectExtent l="0" t="0" r="4445" b="6350"/>
             <wp:docPr id="1341359440" name="Picture 12"/>
@@ -8202,7 +8329,15 @@
           <w:rFonts w:ascii="Times New Roman" w:hAnsi="Times New Roman" w:cs="Times New Roman"/>
           <w:color w:val="FF0000"/>
         </w:rPr>
-        <w:t xml:space="preserve"> secara umum adalah … </w:t>
+        <w:t xml:space="preserve"> secara umum adalah </w:t>
+      </w:r>
+      <w:proofErr w:type="gramStart"/>
+      <w:r>
+        <w:rPr>
+          <w:rFonts w:ascii="Times New Roman" w:hAnsi="Times New Roman" w:cs="Times New Roman"/>
+          <w:color w:val="FF0000"/>
+        </w:rPr>
+        <w:t xml:space="preserve">… </w:t>
       </w:r>
       <w:r>
         <w:rPr>
@@ -8210,6 +8345,7 @@
         </w:rPr>
         <w:t>.</w:t>
       </w:r>
+      <w:proofErr w:type="gramEnd"/>
       <w:r>
         <w:rPr>
           <w:rFonts w:ascii="Times New Roman" w:hAnsi="Times New Roman" w:cs="Times New Roman"/>
@@ -8596,7 +8732,15 @@
           <w:rFonts w:ascii="Times New Roman" w:hAnsi="Times New Roman" w:cs="Times New Roman"/>
           <w:color w:val="FF0000"/>
         </w:rPr>
-        <w:t xml:space="preserve"> menyebabkan …. </w:t>
+        <w:t xml:space="preserve"> menyebabkan …</w:t>
+      </w:r>
+      <w:proofErr w:type="gramStart"/>
+      <w:r>
+        <w:rPr>
+          <w:rFonts w:ascii="Times New Roman" w:hAnsi="Times New Roman" w:cs="Times New Roman"/>
+          <w:color w:val="FF0000"/>
+        </w:rPr>
+        <w:t xml:space="preserve">. </w:t>
       </w:r>
       <w:r>
         <w:rPr>
@@ -8604,6 +8748,7 @@
         </w:rPr>
         <w:t>.</w:t>
       </w:r>
+      <w:proofErr w:type="gramEnd"/>
       <w:r>
         <w:rPr>
           <w:rFonts w:ascii="Times New Roman" w:hAnsi="Times New Roman" w:cs="Times New Roman"/>
@@ -10162,15 +10307,795 @@
       <w:pPr>
         <w:pStyle w:val="ListParagraph"/>
         <w:spacing w:line="480" w:lineRule="auto"/>
-        <w:rPr>
-          <w:rFonts w:ascii="Times New Roman" w:hAnsi="Times New Roman" w:cs="Times New Roman"/>
-        </w:rPr>
-      </w:pPr>
-      <w:r>
-        <w:rPr>
-          <w:rFonts w:ascii="Times New Roman" w:hAnsi="Times New Roman" w:cs="Times New Roman"/>
-        </w:rPr>
-        <w:t>sss</w:t>
+        <w:ind w:firstLine="720"/>
+        <w:jc w:val="both"/>
+        <w:rPr>
+          <w:rFonts w:ascii="Times New Roman" w:hAnsi="Times New Roman" w:cs="Times New Roman"/>
+        </w:rPr>
+      </w:pPr>
+      <w:r>
+        <w:rPr>
+          <w:rFonts w:ascii="Times New Roman" w:hAnsi="Times New Roman" w:cs="Times New Roman"/>
+          <w:color w:val="FF0000"/>
+        </w:rPr>
+        <w:t xml:space="preserve">Representasi adalah </w:t>
+      </w:r>
+      <w:proofErr w:type="gramStart"/>
+      <w:r>
+        <w:rPr>
+          <w:rFonts w:ascii="Times New Roman" w:hAnsi="Times New Roman" w:cs="Times New Roman"/>
+          <w:color w:val="FF0000"/>
+        </w:rPr>
+        <w:t xml:space="preserve">… </w:t>
+      </w:r>
+      <w:r>
+        <w:rPr>
+          <w:rFonts w:ascii="Times New Roman" w:hAnsi="Times New Roman" w:cs="Times New Roman"/>
+        </w:rPr>
+        <w:t>.</w:t>
+      </w:r>
+      <w:proofErr w:type="gramEnd"/>
+      <w:r>
+        <w:rPr>
+          <w:rFonts w:ascii="Times New Roman" w:hAnsi="Times New Roman" w:cs="Times New Roman"/>
+        </w:rPr>
+        <w:t xml:space="preserve"> Pada proyek ini, representasi dilakukan secara visual guna memudahkan pemangku kepentingan dalam memahami tren penerimaan mahasiswa baru</w:t>
+      </w:r>
+      <w:r>
+        <w:rPr>
+          <w:rFonts w:ascii="Times New Roman" w:hAnsi="Times New Roman" w:cs="Times New Roman"/>
+        </w:rPr>
+        <w:t xml:space="preserve">. Proses representasi memiliki 2 tahap, yaitu: </w:t>
+      </w:r>
+      <w:r>
+        <w:rPr>
+          <w:rFonts w:ascii="Times New Roman" w:hAnsi="Times New Roman" w:cs="Times New Roman"/>
+          <w:i/>
+          <w:iCs/>
+        </w:rPr>
+        <w:t xml:space="preserve">Brainstorming </w:t>
+      </w:r>
+      <w:r>
+        <w:rPr>
+          <w:rFonts w:ascii="Times New Roman" w:hAnsi="Times New Roman" w:cs="Times New Roman"/>
+        </w:rPr>
+        <w:t>dan realisasi. Berikut ini adalah detailnya</w:t>
+      </w:r>
+      <w:r>
+        <w:rPr>
+          <w:rFonts w:ascii="Times New Roman" w:hAnsi="Times New Roman" w:cs="Times New Roman"/>
+        </w:rPr>
+        <w:t>:</w:t>
+      </w:r>
+    </w:p>
+    <w:p>
+      <w:pPr>
+        <w:pStyle w:val="Heading5"/>
+        <w:numPr>
+          <w:ilvl w:val="0"/>
+          <w:numId w:val="19"/>
+        </w:numPr>
+      </w:pPr>
+      <w:r>
+        <w:t>Brainstorming</w:t>
+      </w:r>
+    </w:p>
+    <w:p>
+      <w:pPr>
+        <w:pStyle w:val="ListParagraph"/>
+        <w:spacing w:line="480" w:lineRule="auto"/>
+        <w:ind w:firstLine="720"/>
+        <w:jc w:val="both"/>
+        <w:rPr>
+          <w:rFonts w:ascii="Times New Roman" w:hAnsi="Times New Roman" w:cs="Times New Roman"/>
+        </w:rPr>
+      </w:pPr>
+      <w:r>
+        <w:rPr>
+          <w:rFonts w:ascii="Times New Roman" w:hAnsi="Times New Roman" w:cs="Times New Roman"/>
+          <w:i/>
+          <w:iCs/>
+          <w:color w:val="FF0000"/>
+        </w:rPr>
+        <w:t>Brainstorming</w:t>
+      </w:r>
+      <w:r>
+        <w:rPr>
+          <w:rFonts w:ascii="Times New Roman" w:hAnsi="Times New Roman" w:cs="Times New Roman"/>
+          <w:color w:val="FF0000"/>
+        </w:rPr>
+        <w:t xml:space="preserve"> adalah </w:t>
+      </w:r>
+      <w:proofErr w:type="gramStart"/>
+      <w:r>
+        <w:rPr>
+          <w:rFonts w:ascii="Times New Roman" w:hAnsi="Times New Roman" w:cs="Times New Roman"/>
+          <w:color w:val="FF0000"/>
+        </w:rPr>
+        <w:t xml:space="preserve">… </w:t>
+      </w:r>
+      <w:r>
+        <w:rPr>
+          <w:rFonts w:ascii="Times New Roman" w:hAnsi="Times New Roman" w:cs="Times New Roman"/>
+        </w:rPr>
+        <w:t>.</w:t>
+      </w:r>
+      <w:proofErr w:type="gramEnd"/>
+      <w:r>
+        <w:rPr>
+          <w:rFonts w:ascii="Times New Roman" w:hAnsi="Times New Roman" w:cs="Times New Roman"/>
+        </w:rPr>
+        <w:t xml:space="preserve"> Pada tahap ini, brainstorming sangat berguna untuk realisasi visualisasi yang lebih terstruktur</w:t>
+      </w:r>
+      <w:r>
+        <w:rPr>
+          <w:rFonts w:ascii="Times New Roman" w:hAnsi="Times New Roman" w:cs="Times New Roman"/>
+        </w:rPr>
+        <w:t xml:space="preserve">. Berikut ini adalah detail </w:t>
+      </w:r>
+      <w:r>
+        <w:rPr>
+          <w:rFonts w:ascii="Times New Roman" w:hAnsi="Times New Roman" w:cs="Times New Roman"/>
+        </w:rPr>
+        <w:t>hasil brainstorming:</w:t>
+      </w:r>
+    </w:p>
+    <w:p>
+      <w:pPr>
+        <w:pStyle w:val="Heading6"/>
+        <w:numPr>
+          <w:ilvl w:val="0"/>
+          <w:numId w:val="20"/>
+        </w:numPr>
+      </w:pPr>
+      <w:r>
+        <w:t>Dashboard</w:t>
+      </w:r>
+      <w:r>
+        <w:t xml:space="preserve"> Overview</w:t>
+      </w:r>
+    </w:p>
+    <w:p>
+      <w:pPr>
+        <w:pStyle w:val="ListParagraph"/>
+        <w:spacing w:line="480" w:lineRule="auto"/>
+        <w:ind w:left="1440" w:firstLine="720"/>
+        <w:jc w:val="both"/>
+        <w:rPr>
+          <w:rFonts w:ascii="Times New Roman" w:hAnsi="Times New Roman" w:cs="Times New Roman"/>
+        </w:rPr>
+      </w:pPr>
+      <w:r>
+        <w:rPr>
+          <w:rFonts w:ascii="Times New Roman" w:hAnsi="Times New Roman" w:cs="Times New Roman"/>
+          <w:i/>
+          <w:iCs/>
+        </w:rPr>
+        <w:t>Dashboard</w:t>
+      </w:r>
+      <w:r>
+        <w:rPr>
+          <w:rFonts w:ascii="Times New Roman" w:hAnsi="Times New Roman" w:cs="Times New Roman"/>
+        </w:rPr>
+        <w:t xml:space="preserve"> ini dirancang untuk memudahkan pemangku</w:t>
+      </w:r>
+      <w:r>
+        <w:rPr>
+          <w:rFonts w:ascii="Times New Roman" w:hAnsi="Times New Roman" w:cs="Times New Roman"/>
+        </w:rPr>
+        <w:t xml:space="preserve"> </w:t>
+      </w:r>
+      <w:r>
+        <w:rPr>
+          <w:rFonts w:ascii="Times New Roman" w:hAnsi="Times New Roman" w:cs="Times New Roman"/>
+        </w:rPr>
+        <w:t xml:space="preserve">kepentingan dalam memahami tren penerimaan mahasiswa baru secara </w:t>
+      </w:r>
+      <w:r>
+        <w:rPr>
+          <w:rFonts w:ascii="Times New Roman" w:hAnsi="Times New Roman" w:cs="Times New Roman"/>
+          <w:i/>
+          <w:iCs/>
+        </w:rPr>
+        <w:t>overall</w:t>
+      </w:r>
+      <w:r>
+        <w:rPr>
+          <w:rFonts w:ascii="Times New Roman" w:hAnsi="Times New Roman" w:cs="Times New Roman"/>
+        </w:rPr>
+        <w:t>.</w:t>
+      </w:r>
+    </w:p>
+    <w:p>
+      <w:pPr>
+        <w:pStyle w:val="ListParagraph"/>
+        <w:numPr>
+          <w:ilvl w:val="0"/>
+          <w:numId w:val="15"/>
+        </w:numPr>
+        <w:spacing w:line="480" w:lineRule="auto"/>
+        <w:jc w:val="both"/>
+        <w:rPr>
+          <w:rFonts w:ascii="Times New Roman" w:hAnsi="Times New Roman" w:cs="Times New Roman"/>
+        </w:rPr>
+      </w:pPr>
+      <w:r>
+        <w:rPr>
+          <w:rFonts w:ascii="Times New Roman" w:hAnsi="Times New Roman" w:cs="Times New Roman"/>
+          <w:i/>
+          <w:iCs/>
+        </w:rPr>
+        <w:t>KPIs</w:t>
+      </w:r>
+      <w:r>
+        <w:rPr>
+          <w:rFonts w:ascii="Times New Roman" w:hAnsi="Times New Roman" w:cs="Times New Roman"/>
+        </w:rPr>
+        <w:t>: Total mahasiswa, total jalur masuk, persebaran jenis asal SLTA.</w:t>
+      </w:r>
+    </w:p>
+    <w:p>
+      <w:pPr>
+        <w:pStyle w:val="ListParagraph"/>
+        <w:numPr>
+          <w:ilvl w:val="0"/>
+          <w:numId w:val="15"/>
+        </w:numPr>
+        <w:spacing w:line="480" w:lineRule="auto"/>
+        <w:jc w:val="both"/>
+        <w:rPr>
+          <w:rFonts w:ascii="Times New Roman" w:hAnsi="Times New Roman" w:cs="Times New Roman"/>
+        </w:rPr>
+      </w:pPr>
+      <w:r>
+        <w:rPr>
+          <w:rFonts w:ascii="Times New Roman" w:hAnsi="Times New Roman" w:cs="Times New Roman"/>
+        </w:rPr>
+        <w:t>Bagaimana grafik jumlah mahasiswa baru dalam 10 tahun terakhir?</w:t>
+      </w:r>
+    </w:p>
+    <w:p>
+      <w:pPr>
+        <w:pStyle w:val="ListParagraph"/>
+        <w:numPr>
+          <w:ilvl w:val="0"/>
+          <w:numId w:val="15"/>
+        </w:numPr>
+        <w:spacing w:line="480" w:lineRule="auto"/>
+        <w:jc w:val="both"/>
+        <w:rPr>
+          <w:rFonts w:ascii="Times New Roman" w:hAnsi="Times New Roman" w:cs="Times New Roman"/>
+        </w:rPr>
+      </w:pPr>
+      <w:r>
+        <w:rPr>
+          <w:rFonts w:ascii="Times New Roman" w:hAnsi="Times New Roman" w:cs="Times New Roman"/>
+        </w:rPr>
+        <w:t>Jalur apa yang digunakan para mahasiswa tersebut?</w:t>
+      </w:r>
+    </w:p>
+    <w:p>
+      <w:pPr>
+        <w:pStyle w:val="ListParagraph"/>
+        <w:numPr>
+          <w:ilvl w:val="0"/>
+          <w:numId w:val="15"/>
+        </w:numPr>
+        <w:spacing w:line="480" w:lineRule="auto"/>
+        <w:jc w:val="both"/>
+        <w:rPr>
+          <w:rFonts w:ascii="Times New Roman" w:hAnsi="Times New Roman" w:cs="Times New Roman"/>
+        </w:rPr>
+      </w:pPr>
+      <w:r>
+        <w:rPr>
+          <w:rFonts w:ascii="Times New Roman" w:hAnsi="Times New Roman" w:cs="Times New Roman"/>
+        </w:rPr>
+        <w:t>Bagaimana jumlah distribusi mahasiswa baru per-fakultas?</w:t>
+      </w:r>
+    </w:p>
+    <w:p>
+      <w:pPr>
+        <w:pStyle w:val="ListParagraph"/>
+        <w:numPr>
+          <w:ilvl w:val="0"/>
+          <w:numId w:val="15"/>
+        </w:numPr>
+        <w:spacing w:line="480" w:lineRule="auto"/>
+        <w:jc w:val="both"/>
+        <w:rPr>
+          <w:rFonts w:ascii="Times New Roman" w:hAnsi="Times New Roman" w:cs="Times New Roman"/>
+        </w:rPr>
+      </w:pPr>
+      <w:r>
+        <w:rPr>
+          <w:rFonts w:ascii="Times New Roman" w:hAnsi="Times New Roman" w:cs="Times New Roman"/>
+        </w:rPr>
+        <w:t>Program studi apa yang paling diminati mahasiswa baru?</w:t>
+      </w:r>
+    </w:p>
+    <w:p>
+      <w:pPr>
+        <w:pStyle w:val="Heading6"/>
+      </w:pPr>
+      <w:r>
+        <w:rPr>
+          <w:i/>
+          <w:iCs/>
+        </w:rPr>
+        <w:t>Dahboard</w:t>
+      </w:r>
+      <w:r>
+        <w:t xml:space="preserve"> Demografi</w:t>
+      </w:r>
+    </w:p>
+    <w:p>
+      <w:pPr>
+        <w:pStyle w:val="ListParagraph"/>
+        <w:spacing w:line="480" w:lineRule="auto"/>
+        <w:ind w:left="1440" w:firstLine="720"/>
+        <w:jc w:val="both"/>
+        <w:rPr>
+          <w:rFonts w:ascii="Times New Roman" w:hAnsi="Times New Roman" w:cs="Times New Roman"/>
+        </w:rPr>
+      </w:pPr>
+      <w:r>
+        <w:rPr>
+          <w:rFonts w:ascii="Times New Roman" w:hAnsi="Times New Roman" w:cs="Times New Roman"/>
+          <w:i/>
+          <w:iCs/>
+        </w:rPr>
+        <w:lastRenderedPageBreak/>
+        <w:t>Dashboard</w:t>
+      </w:r>
+      <w:r>
+        <w:rPr>
+          <w:rFonts w:ascii="Times New Roman" w:hAnsi="Times New Roman" w:cs="Times New Roman"/>
+        </w:rPr>
+        <w:t xml:space="preserve"> lebih ini ditekankan untuk bisa melihat pola demografi mahasiswa baru, terutama distribusi asal daerah.</w:t>
+      </w:r>
+    </w:p>
+    <w:p>
+      <w:pPr>
+        <w:pStyle w:val="ListParagraph"/>
+        <w:numPr>
+          <w:ilvl w:val="0"/>
+          <w:numId w:val="16"/>
+        </w:numPr>
+        <w:spacing w:line="480" w:lineRule="auto"/>
+        <w:jc w:val="both"/>
+        <w:rPr>
+          <w:rFonts w:ascii="Times New Roman" w:hAnsi="Times New Roman" w:cs="Times New Roman"/>
+        </w:rPr>
+      </w:pPr>
+      <w:r>
+        <w:rPr>
+          <w:rFonts w:ascii="Times New Roman" w:hAnsi="Times New Roman" w:cs="Times New Roman"/>
+          <w:i/>
+          <w:iCs/>
+        </w:rPr>
+        <w:t>KPIs</w:t>
+      </w:r>
+      <w:r>
+        <w:rPr>
+          <w:rFonts w:ascii="Times New Roman" w:hAnsi="Times New Roman" w:cs="Times New Roman"/>
+        </w:rPr>
+        <w:t>: Umur rata-rata, jumlah pekerjaan orang tua, jumlah SLTA</w:t>
+      </w:r>
+    </w:p>
+    <w:p>
+      <w:pPr>
+        <w:pStyle w:val="ListParagraph"/>
+        <w:numPr>
+          <w:ilvl w:val="0"/>
+          <w:numId w:val="16"/>
+        </w:numPr>
+        <w:spacing w:line="480" w:lineRule="auto"/>
+        <w:jc w:val="both"/>
+        <w:rPr>
+          <w:rFonts w:ascii="Times New Roman" w:hAnsi="Times New Roman" w:cs="Times New Roman"/>
+        </w:rPr>
+      </w:pPr>
+      <w:r>
+        <w:rPr>
+          <w:rFonts w:ascii="Times New Roman" w:hAnsi="Times New Roman" w:cs="Times New Roman"/>
+        </w:rPr>
+        <w:t>Daerah mana saja yang menyumbang mahasiswa paling banyak?</w:t>
+      </w:r>
+    </w:p>
+    <w:p>
+      <w:pPr>
+        <w:pStyle w:val="ListParagraph"/>
+        <w:numPr>
+          <w:ilvl w:val="0"/>
+          <w:numId w:val="16"/>
+        </w:numPr>
+        <w:spacing w:line="480" w:lineRule="auto"/>
+        <w:jc w:val="both"/>
+        <w:rPr>
+          <w:rFonts w:ascii="Times New Roman" w:hAnsi="Times New Roman" w:cs="Times New Roman"/>
+        </w:rPr>
+      </w:pPr>
+      <w:r>
+        <w:rPr>
+          <w:rFonts w:ascii="Times New Roman" w:hAnsi="Times New Roman" w:cs="Times New Roman"/>
+        </w:rPr>
+        <w:t>Apa saja pekerjaan orang tua para mahasiswa baru?</w:t>
+      </w:r>
+    </w:p>
+    <w:p>
+      <w:pPr>
+        <w:pStyle w:val="ListParagraph"/>
+        <w:numPr>
+          <w:ilvl w:val="0"/>
+          <w:numId w:val="16"/>
+        </w:numPr>
+        <w:spacing w:line="480" w:lineRule="auto"/>
+        <w:jc w:val="both"/>
+        <w:rPr>
+          <w:rFonts w:ascii="Times New Roman" w:hAnsi="Times New Roman" w:cs="Times New Roman"/>
+        </w:rPr>
+      </w:pPr>
+      <w:r>
+        <w:rPr>
+          <w:rFonts w:ascii="Times New Roman" w:hAnsi="Times New Roman" w:cs="Times New Roman"/>
+        </w:rPr>
+        <w:t>Bagaimana distribusi pendidikan terakhir orang tua mahasiswa baru?</w:t>
+      </w:r>
+    </w:p>
+    <w:p>
+      <w:pPr>
+        <w:pStyle w:val="ListParagraph"/>
+        <w:numPr>
+          <w:ilvl w:val="0"/>
+          <w:numId w:val="16"/>
+        </w:numPr>
+        <w:spacing w:line="480" w:lineRule="auto"/>
+        <w:jc w:val="both"/>
+        <w:rPr>
+          <w:rFonts w:ascii="Times New Roman" w:hAnsi="Times New Roman" w:cs="Times New Roman"/>
+        </w:rPr>
+      </w:pPr>
+      <w:r>
+        <w:rPr>
+          <w:rFonts w:ascii="Times New Roman" w:hAnsi="Times New Roman" w:cs="Times New Roman"/>
+        </w:rPr>
+        <w:t>SLTA mana saja yang menjadi top 10 penyumbang mahasiswa baru?</w:t>
+      </w:r>
+    </w:p>
+    <w:p>
+      <w:pPr>
+        <w:pStyle w:val="Heading5"/>
+      </w:pPr>
+      <w:r>
+        <w:t>Visualisasi</w:t>
+      </w:r>
+    </w:p>
+    <w:p>
+      <w:pPr>
+        <w:pStyle w:val="ListParagraph"/>
+        <w:spacing w:line="480" w:lineRule="auto"/>
+        <w:ind w:firstLine="720"/>
+        <w:jc w:val="both"/>
+        <w:rPr>
+          <w:rFonts w:ascii="Times New Roman" w:hAnsi="Times New Roman" w:cs="Times New Roman"/>
+        </w:rPr>
+      </w:pPr>
+      <w:r>
+        <w:rPr>
+          <w:rFonts w:ascii="Times New Roman" w:hAnsi="Times New Roman" w:cs="Times New Roman"/>
+          <w:color w:val="FF0000"/>
+        </w:rPr>
+        <w:t>Visualisasi</w:t>
+      </w:r>
+      <w:r>
+        <w:rPr>
+          <w:rFonts w:ascii="Times New Roman" w:hAnsi="Times New Roman" w:cs="Times New Roman"/>
+          <w:color w:val="FF0000"/>
+        </w:rPr>
+        <w:t xml:space="preserve"> adalah </w:t>
+      </w:r>
+      <w:proofErr w:type="gramStart"/>
+      <w:r>
+        <w:rPr>
+          <w:rFonts w:ascii="Times New Roman" w:hAnsi="Times New Roman" w:cs="Times New Roman"/>
+          <w:color w:val="FF0000"/>
+        </w:rPr>
+        <w:t xml:space="preserve">… </w:t>
+      </w:r>
+      <w:r>
+        <w:rPr>
+          <w:rFonts w:ascii="Times New Roman" w:hAnsi="Times New Roman" w:cs="Times New Roman"/>
+        </w:rPr>
+        <w:t>.</w:t>
+      </w:r>
+      <w:proofErr w:type="gramEnd"/>
+      <w:r>
+        <w:rPr>
+          <w:rFonts w:ascii="Times New Roman" w:hAnsi="Times New Roman" w:cs="Times New Roman"/>
+        </w:rPr>
+        <w:t xml:space="preserve"> Proses visualisasi pada proyek ini dilakukan dengan </w:t>
+      </w:r>
+      <w:r>
+        <w:rPr>
+          <w:rFonts w:ascii="Times New Roman" w:hAnsi="Times New Roman" w:cs="Times New Roman"/>
+          <w:i/>
+          <w:iCs/>
+        </w:rPr>
+        <w:t>software business intel</w:t>
+      </w:r>
+      <w:r>
+        <w:rPr>
+          <w:rFonts w:ascii="Times New Roman" w:hAnsi="Times New Roman" w:cs="Times New Roman"/>
+          <w:i/>
+          <w:iCs/>
+        </w:rPr>
+        <w:t>l</w:t>
+      </w:r>
+      <w:r>
+        <w:rPr>
+          <w:rFonts w:ascii="Times New Roman" w:hAnsi="Times New Roman" w:cs="Times New Roman"/>
+          <w:i/>
+          <w:iCs/>
+        </w:rPr>
+        <w:t>i</w:t>
+      </w:r>
+      <w:r>
+        <w:rPr>
+          <w:rFonts w:ascii="Times New Roman" w:hAnsi="Times New Roman" w:cs="Times New Roman"/>
+          <w:i/>
+          <w:iCs/>
+        </w:rPr>
+        <w:t>gence</w:t>
+      </w:r>
+      <w:r>
+        <w:rPr>
+          <w:rFonts w:ascii="Times New Roman" w:hAnsi="Times New Roman" w:cs="Times New Roman"/>
+        </w:rPr>
+        <w:t xml:space="preserve"> Tableau Public</w:t>
+      </w:r>
+      <w:r>
+        <w:rPr>
+          <w:rFonts w:ascii="Times New Roman" w:hAnsi="Times New Roman" w:cs="Times New Roman"/>
+        </w:rPr>
+        <w:t>.</w:t>
+      </w:r>
+      <w:r>
+        <w:rPr>
+          <w:rFonts w:ascii="Times New Roman" w:hAnsi="Times New Roman" w:cs="Times New Roman"/>
+        </w:rPr>
+        <w:t xml:space="preserve"> Proses pembuatan visualisasi sepenuhnya berdasar pada hasil tahap brainstorming</w:t>
+      </w:r>
+      <w:r>
+        <w:rPr>
+          <w:rFonts w:ascii="Times New Roman" w:hAnsi="Times New Roman" w:cs="Times New Roman"/>
+        </w:rPr>
+        <w:t>. Berikut ini adalah hasil dari tahap ini</w:t>
+      </w:r>
+      <w:r>
+        <w:rPr>
+          <w:rFonts w:ascii="Times New Roman" w:hAnsi="Times New Roman" w:cs="Times New Roman"/>
+        </w:rPr>
+        <w:t>:</w:t>
+      </w:r>
+    </w:p>
+    <w:p>
+      <w:pPr>
+        <w:pStyle w:val="Heading6"/>
+        <w:numPr>
+          <w:ilvl w:val="0"/>
+          <w:numId w:val="24"/>
+        </w:numPr>
+      </w:pPr>
+      <w:r>
+        <w:t>Dashboard Overview</w:t>
+      </w:r>
+    </w:p>
+    <w:p>
+      <w:pPr>
+        <w:pStyle w:val="ListParagraph"/>
+        <w:keepNext/>
+        <w:spacing w:line="480" w:lineRule="auto"/>
+        <w:ind w:left="1440"/>
+        <w:jc w:val="center"/>
+      </w:pPr>
+      <w:r>
+        <w:rPr>
+          <w:rFonts w:ascii="Times New Roman" w:hAnsi="Times New Roman" w:cs="Times New Roman"/>
+          <w:noProof/>
+        </w:rPr>
+        <w:lastRenderedPageBreak/>
+        <w:drawing>
+          <wp:inline distT="0" distB="0" distL="0" distR="0" wp14:anchorId="0500A38A" wp14:editId="423E443D">
+            <wp:extent cx="3960000" cy="2260000"/>
+            <wp:effectExtent l="19050" t="19050" r="21590" b="26035"/>
+            <wp:docPr id="1816641514" name="Picture 1"/>
+            <wp:cNvGraphicFramePr>
+              <a:graphicFrameLocks xmlns:a="http://schemas.openxmlformats.org/drawingml/2006/main" noChangeAspect="1"/>
+            </wp:cNvGraphicFramePr>
+            <a:graphic xmlns:a="http://schemas.openxmlformats.org/drawingml/2006/main">
+              <a:graphicData uri="http://schemas.openxmlformats.org/drawingml/2006/picture">
+                <pic:pic xmlns:pic="http://schemas.openxmlformats.org/drawingml/2006/picture">
+                  <pic:nvPicPr>
+                    <pic:cNvPr id="0" name="Picture 1"/>
+                    <pic:cNvPicPr>
+                      <a:picLocks noChangeAspect="1" noChangeArrowheads="1"/>
+                    </pic:cNvPicPr>
+                  </pic:nvPicPr>
+                  <pic:blipFill>
+                    <a:blip r:embed="rId48" cstate="print">
+                      <a:extLst>
+                        <a:ext uri="{28A0092B-C50C-407E-A947-70E740481C1C}">
+                          <a14:useLocalDpi xmlns:a14="http://schemas.microsoft.com/office/drawing/2010/main" val="0"/>
+                        </a:ext>
+                      </a:extLst>
+                    </a:blip>
+                    <a:srcRect/>
+                    <a:stretch>
+                      <a:fillRect/>
+                    </a:stretch>
+                  </pic:blipFill>
+                  <pic:spPr bwMode="auto">
+                    <a:xfrm>
+                      <a:off x="0" y="0"/>
+                      <a:ext cx="3960000" cy="2260000"/>
+                    </a:xfrm>
+                    <a:prstGeom prst="rect">
+                      <a:avLst/>
+                    </a:prstGeom>
+                    <a:noFill/>
+                    <a:ln w="12700">
+                      <a:solidFill>
+                        <a:schemeClr val="tx1"/>
+                      </a:solidFill>
+                    </a:ln>
+                  </pic:spPr>
+                </pic:pic>
+              </a:graphicData>
+            </a:graphic>
+          </wp:inline>
+        </w:drawing>
+      </w:r>
+    </w:p>
+    <w:p>
+      <w:pPr>
+        <w:pStyle w:val="Caption"/>
+        <w:spacing w:line="480" w:lineRule="auto"/>
+        <w:jc w:val="center"/>
+        <w:rPr>
+          <w:rFonts w:ascii="Times New Roman" w:hAnsi="Times New Roman" w:cs="Times New Roman"/>
+        </w:rPr>
+      </w:pPr>
+      <w:r>
+        <w:t xml:space="preserve">Gambar </w:t>
+      </w:r>
+      <w:r>
+        <w:fldChar w:fldCharType="begin"/>
+      </w:r>
+      <w:r>
+        <w:instrText xml:space="preserve"> SEQ Gambar \* ARABIC </w:instrText>
+      </w:r>
+      <w:r>
+        <w:fldChar w:fldCharType="separate"/>
+      </w:r>
+      <w:r>
+        <w:rPr>
+          <w:noProof/>
+        </w:rPr>
+        <w:t>41</w:t>
+      </w:r>
+      <w:r>
+        <w:fldChar w:fldCharType="end"/>
+      </w:r>
+      <w:r>
+        <w:t xml:space="preserve"> dashboard overview</w:t>
+      </w:r>
+    </w:p>
+    <w:p>
+      <w:pPr>
+        <w:pStyle w:val="Heading6"/>
+      </w:pPr>
+      <w:r>
+        <w:t>Dashboard demografi</w:t>
+      </w:r>
+    </w:p>
+    <w:p>
+      <w:pPr>
+        <w:pStyle w:val="ListParagraph"/>
+        <w:keepNext/>
+        <w:spacing w:line="480" w:lineRule="auto"/>
+        <w:ind w:left="1440"/>
+        <w:jc w:val="center"/>
+      </w:pPr>
+      <w:r>
+        <w:rPr>
+          <w:rFonts w:ascii="Times New Roman" w:hAnsi="Times New Roman" w:cs="Times New Roman"/>
+          <w:noProof/>
+        </w:rPr>
+        <w:drawing>
+          <wp:inline distT="0" distB="0" distL="0" distR="0" wp14:anchorId="7D6A7027" wp14:editId="785E4ABF">
+            <wp:extent cx="3960000" cy="2262000"/>
+            <wp:effectExtent l="19050" t="19050" r="21590" b="24130"/>
+            <wp:docPr id="314435876" name="Picture 2"/>
+            <wp:cNvGraphicFramePr>
+              <a:graphicFrameLocks xmlns:a="http://schemas.openxmlformats.org/drawingml/2006/main" noChangeAspect="1"/>
+            </wp:cNvGraphicFramePr>
+            <a:graphic xmlns:a="http://schemas.openxmlformats.org/drawingml/2006/main">
+              <a:graphicData uri="http://schemas.openxmlformats.org/drawingml/2006/picture">
+                <pic:pic xmlns:pic="http://schemas.openxmlformats.org/drawingml/2006/picture">
+                  <pic:nvPicPr>
+                    <pic:cNvPr id="0" name="Picture 2"/>
+                    <pic:cNvPicPr>
+                      <a:picLocks noChangeAspect="1" noChangeArrowheads="1"/>
+                    </pic:cNvPicPr>
+                  </pic:nvPicPr>
+                  <pic:blipFill>
+                    <a:blip r:embed="rId49" cstate="print">
+                      <a:extLst>
+                        <a:ext uri="{28A0092B-C50C-407E-A947-70E740481C1C}">
+                          <a14:useLocalDpi xmlns:a14="http://schemas.microsoft.com/office/drawing/2010/main" val="0"/>
+                        </a:ext>
+                      </a:extLst>
+                    </a:blip>
+                    <a:srcRect/>
+                    <a:stretch>
+                      <a:fillRect/>
+                    </a:stretch>
+                  </pic:blipFill>
+                  <pic:spPr bwMode="auto">
+                    <a:xfrm>
+                      <a:off x="0" y="0"/>
+                      <a:ext cx="3960000" cy="2262000"/>
+                    </a:xfrm>
+                    <a:prstGeom prst="rect">
+                      <a:avLst/>
+                    </a:prstGeom>
+                    <a:noFill/>
+                    <a:ln w="12700">
+                      <a:solidFill>
+                        <a:schemeClr val="tx1"/>
+                      </a:solidFill>
+                    </a:ln>
+                  </pic:spPr>
+                </pic:pic>
+              </a:graphicData>
+            </a:graphic>
+          </wp:inline>
+        </w:drawing>
+      </w:r>
+    </w:p>
+    <w:p>
+      <w:pPr>
+        <w:pStyle w:val="Caption"/>
+        <w:spacing w:line="480" w:lineRule="auto"/>
+        <w:jc w:val="center"/>
+        <w:rPr>
+          <w:rFonts w:ascii="Times New Roman" w:hAnsi="Times New Roman" w:cs="Times New Roman"/>
+        </w:rPr>
+      </w:pPr>
+      <w:r>
+        <w:t xml:space="preserve">Gambar </w:t>
+      </w:r>
+      <w:r>
+        <w:fldChar w:fldCharType="begin"/>
+      </w:r>
+      <w:r>
+        <w:instrText xml:space="preserve"> SEQ Gambar \* ARABIC </w:instrText>
+      </w:r>
+      <w:r>
+        <w:fldChar w:fldCharType="separate"/>
+      </w:r>
+      <w:r>
+        <w:rPr>
+          <w:noProof/>
+        </w:rPr>
+        <w:t>42</w:t>
+      </w:r>
+      <w:r>
+        <w:fldChar w:fldCharType="end"/>
+      </w:r>
+      <w:r>
+        <w:t xml:space="preserve"> dashboard demografi</w:t>
       </w:r>
     </w:p>
     <w:p>
@@ -10179,6 +11104,420 @@
       </w:pPr>
       <w:r>
         <w:t>Pembuatan Landing Page</w:t>
+      </w:r>
+    </w:p>
+    <w:p>
+      <w:pPr>
+        <w:pStyle w:val="ListParagraph"/>
+        <w:spacing w:line="480" w:lineRule="auto"/>
+        <w:rPr>
+          <w:rFonts w:ascii="Times New Roman" w:hAnsi="Times New Roman" w:cs="Times New Roman"/>
+        </w:rPr>
+      </w:pPr>
+      <w:r>
+        <w:rPr>
+          <w:rFonts w:ascii="Times New Roman" w:hAnsi="Times New Roman" w:cs="Times New Roman"/>
+        </w:rPr>
+        <w:t>Landing page adalah …</w:t>
+      </w:r>
+      <w:proofErr w:type="gramStart"/>
+      <w:r>
+        <w:rPr>
+          <w:rFonts w:ascii="Times New Roman" w:hAnsi="Times New Roman" w:cs="Times New Roman"/>
+        </w:rPr>
+        <w:t>. .</w:t>
+      </w:r>
+      <w:proofErr w:type="gramEnd"/>
+      <w:r>
+        <w:rPr>
+          <w:rFonts w:ascii="Times New Roman" w:hAnsi="Times New Roman" w:cs="Times New Roman"/>
+        </w:rPr>
+        <w:t xml:space="preserve"> Selain untuk menampung URL menuju dashboard, landing page</w:t>
+      </w:r>
+      <w:r>
+        <w:rPr>
+          <w:rFonts w:ascii="Times New Roman" w:hAnsi="Times New Roman" w:cs="Times New Roman"/>
+        </w:rPr>
+        <w:t xml:space="preserve"> pada proyek</w:t>
+      </w:r>
+      <w:r>
+        <w:rPr>
+          <w:rFonts w:ascii="Times New Roman" w:hAnsi="Times New Roman" w:cs="Times New Roman"/>
+        </w:rPr>
+        <w:t xml:space="preserve"> ini </w:t>
+      </w:r>
+      <w:r>
+        <w:rPr>
+          <w:rFonts w:ascii="Times New Roman" w:hAnsi="Times New Roman" w:cs="Times New Roman"/>
+        </w:rPr>
+        <w:t xml:space="preserve">juga </w:t>
+      </w:r>
+      <w:r>
+        <w:rPr>
+          <w:rFonts w:ascii="Times New Roman" w:hAnsi="Times New Roman" w:cs="Times New Roman"/>
+        </w:rPr>
+        <w:t xml:space="preserve">berfungsi </w:t>
+      </w:r>
+      <w:r>
+        <w:rPr>
+          <w:rFonts w:ascii="Times New Roman" w:hAnsi="Times New Roman" w:cs="Times New Roman"/>
+        </w:rPr>
+        <w:t xml:space="preserve">sebagai halaman penampung </w:t>
+      </w:r>
+      <w:r>
+        <w:rPr>
+          <w:rFonts w:ascii="Times New Roman" w:hAnsi="Times New Roman" w:cs="Times New Roman"/>
+        </w:rPr>
+        <w:t>panduan</w:t>
+      </w:r>
+      <w:r>
+        <w:rPr>
+          <w:rFonts w:ascii="Times New Roman" w:hAnsi="Times New Roman" w:cs="Times New Roman"/>
+        </w:rPr>
+        <w:t xml:space="preserve"> cara membaca dashboard</w:t>
+      </w:r>
+      <w:r>
+        <w:rPr>
+          <w:rFonts w:ascii="Times New Roman" w:hAnsi="Times New Roman" w:cs="Times New Roman"/>
+        </w:rPr>
+        <w:t>.</w:t>
+      </w:r>
+    </w:p>
+    <w:p>
+      <w:pPr>
+        <w:pStyle w:val="Heading5"/>
+        <w:numPr>
+          <w:ilvl w:val="0"/>
+          <w:numId w:val="25"/>
+        </w:numPr>
+      </w:pPr>
+      <w:r>
+        <w:lastRenderedPageBreak/>
+        <w:t>Brainstorming</w:t>
+      </w:r>
+    </w:p>
+    <w:p>
+      <w:pPr>
+        <w:pStyle w:val="ListParagraph"/>
+        <w:spacing w:line="480" w:lineRule="auto"/>
+        <w:rPr>
+          <w:rFonts w:ascii="Times New Roman" w:hAnsi="Times New Roman" w:cs="Times New Roman"/>
+        </w:rPr>
+      </w:pPr>
+      <w:r>
+        <w:rPr>
+          <w:rFonts w:ascii="Times New Roman" w:hAnsi="Times New Roman" w:cs="Times New Roman"/>
+        </w:rPr>
+        <w:t>Berikut ini adalah brainstorming untuk landing page pada proyek ini:</w:t>
+      </w:r>
+    </w:p>
+    <w:p>
+      <w:pPr>
+        <w:pStyle w:val="ListParagraph"/>
+        <w:numPr>
+          <w:ilvl w:val="0"/>
+          <w:numId w:val="27"/>
+        </w:numPr>
+        <w:spacing w:line="480" w:lineRule="auto"/>
+        <w:rPr>
+          <w:rFonts w:ascii="Times New Roman" w:hAnsi="Times New Roman" w:cs="Times New Roman"/>
+        </w:rPr>
+      </w:pPr>
+      <w:r>
+        <w:rPr>
+          <w:rFonts w:ascii="Times New Roman" w:hAnsi="Times New Roman" w:cs="Times New Roman"/>
+        </w:rPr>
+        <w:t>Halaman Utama</w:t>
+      </w:r>
+    </w:p>
+    <w:p>
+      <w:pPr>
+        <w:pStyle w:val="ListParagraph"/>
+        <w:numPr>
+          <w:ilvl w:val="1"/>
+          <w:numId w:val="27"/>
+        </w:numPr>
+        <w:spacing w:line="480" w:lineRule="auto"/>
+        <w:rPr>
+          <w:rFonts w:ascii="Times New Roman" w:hAnsi="Times New Roman" w:cs="Times New Roman"/>
+        </w:rPr>
+      </w:pPr>
+      <w:r>
+        <w:rPr>
+          <w:rFonts w:ascii="Times New Roman" w:hAnsi="Times New Roman" w:cs="Times New Roman"/>
+        </w:rPr>
+        <w:t>Bar n</w:t>
+      </w:r>
+      <w:r>
+        <w:rPr>
+          <w:rFonts w:ascii="Times New Roman" w:hAnsi="Times New Roman" w:cs="Times New Roman"/>
+        </w:rPr>
+        <w:t>avigasi</w:t>
+      </w:r>
+    </w:p>
+    <w:p>
+      <w:pPr>
+        <w:pStyle w:val="ListParagraph"/>
+        <w:numPr>
+          <w:ilvl w:val="1"/>
+          <w:numId w:val="27"/>
+        </w:numPr>
+        <w:spacing w:line="480" w:lineRule="auto"/>
+        <w:rPr>
+          <w:rFonts w:ascii="Times New Roman" w:hAnsi="Times New Roman" w:cs="Times New Roman"/>
+        </w:rPr>
+      </w:pPr>
+      <w:r>
+        <w:rPr>
+          <w:rFonts w:ascii="Times New Roman" w:hAnsi="Times New Roman" w:cs="Times New Roman"/>
+        </w:rPr>
+        <w:t>Judul proyek</w:t>
+      </w:r>
+    </w:p>
+    <w:p>
+      <w:pPr>
+        <w:pStyle w:val="ListParagraph"/>
+        <w:numPr>
+          <w:ilvl w:val="1"/>
+          <w:numId w:val="27"/>
+        </w:numPr>
+        <w:spacing w:line="480" w:lineRule="auto"/>
+        <w:rPr>
+          <w:rFonts w:ascii="Times New Roman" w:hAnsi="Times New Roman" w:cs="Times New Roman"/>
+        </w:rPr>
+      </w:pPr>
+      <w:r>
+        <w:rPr>
+          <w:rFonts w:ascii="Times New Roman" w:hAnsi="Times New Roman" w:cs="Times New Roman"/>
+        </w:rPr>
+        <w:t>Permasalahan, tujuan, dan manfaat</w:t>
+      </w:r>
+    </w:p>
+    <w:p>
+      <w:pPr>
+        <w:pStyle w:val="ListParagraph"/>
+        <w:numPr>
+          <w:ilvl w:val="1"/>
+          <w:numId w:val="27"/>
+        </w:numPr>
+        <w:spacing w:line="480" w:lineRule="auto"/>
+        <w:rPr>
+          <w:rFonts w:ascii="Times New Roman" w:hAnsi="Times New Roman" w:cs="Times New Roman"/>
+        </w:rPr>
+      </w:pPr>
+      <w:r>
+        <w:rPr>
+          <w:rFonts w:ascii="Times New Roman" w:hAnsi="Times New Roman" w:cs="Times New Roman"/>
+          <w:i/>
+          <w:iCs/>
+        </w:rPr>
+        <w:t>Data pipeline</w:t>
+      </w:r>
+      <w:r>
+        <w:rPr>
+          <w:rFonts w:ascii="Times New Roman" w:hAnsi="Times New Roman" w:cs="Times New Roman"/>
+        </w:rPr>
+        <w:t xml:space="preserve"> utama</w:t>
+      </w:r>
+    </w:p>
+    <w:p>
+      <w:pPr>
+        <w:pStyle w:val="ListParagraph"/>
+        <w:numPr>
+          <w:ilvl w:val="1"/>
+          <w:numId w:val="27"/>
+        </w:numPr>
+        <w:spacing w:line="480" w:lineRule="auto"/>
+        <w:rPr>
+          <w:rFonts w:ascii="Times New Roman" w:hAnsi="Times New Roman" w:cs="Times New Roman"/>
+        </w:rPr>
+      </w:pPr>
+      <w:r>
+        <w:rPr>
+          <w:rFonts w:ascii="Times New Roman" w:hAnsi="Times New Roman" w:cs="Times New Roman"/>
+          <w:i/>
+          <w:iCs/>
+        </w:rPr>
+        <w:t>Funfact</w:t>
+      </w:r>
+      <w:r>
+        <w:rPr>
+          <w:rFonts w:ascii="Times New Roman" w:hAnsi="Times New Roman" w:cs="Times New Roman"/>
+        </w:rPr>
+        <w:t xml:space="preserve"> dalam </w:t>
+      </w:r>
+      <w:r>
+        <w:rPr>
+          <w:rFonts w:ascii="Times New Roman" w:hAnsi="Times New Roman" w:cs="Times New Roman"/>
+          <w:i/>
+          <w:iCs/>
+        </w:rPr>
+        <w:t>dataset</w:t>
+      </w:r>
+    </w:p>
+    <w:p>
+      <w:pPr>
+        <w:pStyle w:val="ListParagraph"/>
+        <w:numPr>
+          <w:ilvl w:val="1"/>
+          <w:numId w:val="27"/>
+        </w:numPr>
+        <w:spacing w:line="480" w:lineRule="auto"/>
+        <w:rPr>
+          <w:rFonts w:ascii="Times New Roman" w:hAnsi="Times New Roman" w:cs="Times New Roman"/>
+        </w:rPr>
+      </w:pPr>
+      <w:r>
+        <w:rPr>
+          <w:rFonts w:ascii="Times New Roman" w:hAnsi="Times New Roman" w:cs="Times New Roman"/>
+          <w:i/>
+          <w:iCs/>
+        </w:rPr>
+        <w:t>Brainstorming dashboard</w:t>
+      </w:r>
+      <w:r>
+        <w:rPr>
+          <w:rFonts w:ascii="Times New Roman" w:hAnsi="Times New Roman" w:cs="Times New Roman"/>
+        </w:rPr>
+        <w:t xml:space="preserve"> visualisasi</w:t>
+      </w:r>
+    </w:p>
+    <w:p>
+      <w:pPr>
+        <w:pStyle w:val="ListParagraph"/>
+        <w:numPr>
+          <w:ilvl w:val="1"/>
+          <w:numId w:val="27"/>
+        </w:numPr>
+        <w:spacing w:line="480" w:lineRule="auto"/>
+        <w:rPr>
+          <w:rFonts w:ascii="Times New Roman" w:hAnsi="Times New Roman" w:cs="Times New Roman"/>
+        </w:rPr>
+      </w:pPr>
+      <w:r>
+        <w:rPr>
+          <w:rFonts w:ascii="Times New Roman" w:hAnsi="Times New Roman" w:cs="Times New Roman"/>
+        </w:rPr>
+        <w:t>Ucapan terimakasih</w:t>
+      </w:r>
+    </w:p>
+    <w:p>
+      <w:pPr>
+        <w:pStyle w:val="ListParagraph"/>
+        <w:numPr>
+          <w:ilvl w:val="1"/>
+          <w:numId w:val="27"/>
+        </w:numPr>
+        <w:spacing w:line="480" w:lineRule="auto"/>
+        <w:rPr>
+          <w:rFonts w:ascii="Times New Roman" w:hAnsi="Times New Roman" w:cs="Times New Roman"/>
+        </w:rPr>
+      </w:pPr>
+      <w:r>
+        <w:rPr>
+          <w:rFonts w:ascii="Times New Roman" w:hAnsi="Times New Roman" w:cs="Times New Roman"/>
+          <w:i/>
+          <w:iCs/>
+        </w:rPr>
+        <w:t>Watermark</w:t>
+      </w:r>
+      <w:r>
+        <w:rPr>
+          <w:rFonts w:ascii="Times New Roman" w:hAnsi="Times New Roman" w:cs="Times New Roman"/>
+        </w:rPr>
+        <w:t xml:space="preserve"> penulis</w:t>
+      </w:r>
+    </w:p>
+    <w:p>
+      <w:pPr>
+        <w:pStyle w:val="ListParagraph"/>
+        <w:numPr>
+          <w:ilvl w:val="0"/>
+          <w:numId w:val="27"/>
+        </w:numPr>
+        <w:spacing w:line="480" w:lineRule="auto"/>
+        <w:rPr>
+          <w:rFonts w:ascii="Times New Roman" w:hAnsi="Times New Roman" w:cs="Times New Roman"/>
+        </w:rPr>
+      </w:pPr>
+      <w:r>
+        <w:rPr>
+          <w:rFonts w:ascii="Times New Roman" w:hAnsi="Times New Roman" w:cs="Times New Roman"/>
+        </w:rPr>
+        <w:t>Halaman ‘Cara Membaca Dashboard’</w:t>
+      </w:r>
+    </w:p>
+    <w:p>
+      <w:pPr>
+        <w:pStyle w:val="ListParagraph"/>
+        <w:numPr>
+          <w:ilvl w:val="1"/>
+          <w:numId w:val="27"/>
+        </w:numPr>
+        <w:spacing w:line="480" w:lineRule="auto"/>
+        <w:rPr>
+          <w:rFonts w:ascii="Times New Roman" w:hAnsi="Times New Roman" w:cs="Times New Roman"/>
+        </w:rPr>
+      </w:pPr>
+      <w:r>
+        <w:rPr>
+          <w:rFonts w:ascii="Times New Roman" w:hAnsi="Times New Roman" w:cs="Times New Roman"/>
+        </w:rPr>
+        <w:t>Bar navigasi</w:t>
+      </w:r>
+    </w:p>
+    <w:p>
+      <w:pPr>
+        <w:pStyle w:val="ListParagraph"/>
+        <w:numPr>
+          <w:ilvl w:val="1"/>
+          <w:numId w:val="27"/>
+        </w:numPr>
+        <w:spacing w:line="480" w:lineRule="auto"/>
+        <w:rPr>
+          <w:rFonts w:ascii="Times New Roman" w:hAnsi="Times New Roman" w:cs="Times New Roman"/>
+        </w:rPr>
+      </w:pPr>
+      <w:r>
+        <w:rPr>
+          <w:rFonts w:ascii="Times New Roman" w:hAnsi="Times New Roman" w:cs="Times New Roman"/>
+        </w:rPr>
+        <w:t>Cara membaca</w:t>
+      </w:r>
+    </w:p>
+    <w:p>
+      <w:pPr>
+        <w:pStyle w:val="ListParagraph"/>
+        <w:numPr>
+          <w:ilvl w:val="1"/>
+          <w:numId w:val="27"/>
+        </w:numPr>
+        <w:spacing w:line="480" w:lineRule="auto"/>
+        <w:rPr>
+          <w:rFonts w:ascii="Times New Roman" w:hAnsi="Times New Roman" w:cs="Times New Roman"/>
+        </w:rPr>
+      </w:pPr>
+      <w:r>
+        <w:rPr>
+          <w:rFonts w:ascii="Times New Roman" w:hAnsi="Times New Roman" w:cs="Times New Roman"/>
+          <w:i/>
+          <w:iCs/>
+        </w:rPr>
+        <w:t>Matermark</w:t>
+      </w:r>
+      <w:r>
+        <w:rPr>
+          <w:rFonts w:ascii="Times New Roman" w:hAnsi="Times New Roman" w:cs="Times New Roman"/>
+        </w:rPr>
+        <w:t xml:space="preserve"> penulis</w:t>
+      </w:r>
+    </w:p>
+    <w:p>
+      <w:pPr>
+        <w:pStyle w:val="Heading5"/>
+      </w:pPr>
+      <w:r>
+        <w:t>Realisasi</w:t>
       </w:r>
     </w:p>
     <w:p>
@@ -10347,6 +11686,119 @@
     </w:lvl>
   </w:abstractNum>
   <w:abstractNum w:abstractNumId="1" w15:restartNumberingAfterBreak="0">
+    <w:nsid w:val="18BD3AFC"/>
+    <w:multiLevelType w:val="hybridMultilevel"/>
+    <w:tmpl w:val="41E44DE0"/>
+    <w:lvl w:ilvl="0" w:tplc="04090001">
+      <w:start w:val="1"/>
+      <w:numFmt w:val="bullet"/>
+      <w:lvlText w:val=""/>
+      <w:lvlJc w:val="left"/>
+      <w:pPr>
+        <w:ind w:left="1440" w:hanging="360"/>
+      </w:pPr>
+      <w:rPr>
+        <w:rFonts w:ascii="Symbol" w:hAnsi="Symbol" w:hint="default"/>
+      </w:rPr>
+    </w:lvl>
+    <w:lvl w:ilvl="1" w:tplc="04090003" w:tentative="1">
+      <w:start w:val="1"/>
+      <w:numFmt w:val="bullet"/>
+      <w:lvlText w:val="o"/>
+      <w:lvlJc w:val="left"/>
+      <w:pPr>
+        <w:ind w:left="2160" w:hanging="360"/>
+      </w:pPr>
+      <w:rPr>
+        <w:rFonts w:ascii="Courier New" w:hAnsi="Courier New" w:cs="Courier New" w:hint="default"/>
+      </w:rPr>
+    </w:lvl>
+    <w:lvl w:ilvl="2" w:tplc="04090005" w:tentative="1">
+      <w:start w:val="1"/>
+      <w:numFmt w:val="bullet"/>
+      <w:lvlText w:val=""/>
+      <w:lvlJc w:val="left"/>
+      <w:pPr>
+        <w:ind w:left="2880" w:hanging="360"/>
+      </w:pPr>
+      <w:rPr>
+        <w:rFonts w:ascii="Wingdings" w:hAnsi="Wingdings" w:hint="default"/>
+      </w:rPr>
+    </w:lvl>
+    <w:lvl w:ilvl="3" w:tplc="04090001" w:tentative="1">
+      <w:start w:val="1"/>
+      <w:numFmt w:val="bullet"/>
+      <w:lvlText w:val=""/>
+      <w:lvlJc w:val="left"/>
+      <w:pPr>
+        <w:ind w:left="3600" w:hanging="360"/>
+      </w:pPr>
+      <w:rPr>
+        <w:rFonts w:ascii="Symbol" w:hAnsi="Symbol" w:hint="default"/>
+      </w:rPr>
+    </w:lvl>
+    <w:lvl w:ilvl="4" w:tplc="04090003" w:tentative="1">
+      <w:start w:val="1"/>
+      <w:numFmt w:val="bullet"/>
+      <w:lvlText w:val="o"/>
+      <w:lvlJc w:val="left"/>
+      <w:pPr>
+        <w:ind w:left="4320" w:hanging="360"/>
+      </w:pPr>
+      <w:rPr>
+        <w:rFonts w:ascii="Courier New" w:hAnsi="Courier New" w:cs="Courier New" w:hint="default"/>
+      </w:rPr>
+    </w:lvl>
+    <w:lvl w:ilvl="5" w:tplc="04090005" w:tentative="1">
+      <w:start w:val="1"/>
+      <w:numFmt w:val="bullet"/>
+      <w:lvlText w:val=""/>
+      <w:lvlJc w:val="left"/>
+      <w:pPr>
+        <w:ind w:left="5040" w:hanging="360"/>
+      </w:pPr>
+      <w:rPr>
+        <w:rFonts w:ascii="Wingdings" w:hAnsi="Wingdings" w:hint="default"/>
+      </w:rPr>
+    </w:lvl>
+    <w:lvl w:ilvl="6" w:tplc="04090001" w:tentative="1">
+      <w:start w:val="1"/>
+      <w:numFmt w:val="bullet"/>
+      <w:lvlText w:val=""/>
+      <w:lvlJc w:val="left"/>
+      <w:pPr>
+        <w:ind w:left="5760" w:hanging="360"/>
+      </w:pPr>
+      <w:rPr>
+        <w:rFonts w:ascii="Symbol" w:hAnsi="Symbol" w:hint="default"/>
+      </w:rPr>
+    </w:lvl>
+    <w:lvl w:ilvl="7" w:tplc="04090003" w:tentative="1">
+      <w:start w:val="1"/>
+      <w:numFmt w:val="bullet"/>
+      <w:lvlText w:val="o"/>
+      <w:lvlJc w:val="left"/>
+      <w:pPr>
+        <w:ind w:left="6480" w:hanging="360"/>
+      </w:pPr>
+      <w:rPr>
+        <w:rFonts w:ascii="Courier New" w:hAnsi="Courier New" w:cs="Courier New" w:hint="default"/>
+      </w:rPr>
+    </w:lvl>
+    <w:lvl w:ilvl="8" w:tplc="04090005" w:tentative="1">
+      <w:start w:val="1"/>
+      <w:numFmt w:val="bullet"/>
+      <w:lvlText w:val=""/>
+      <w:lvlJc w:val="left"/>
+      <w:pPr>
+        <w:ind w:left="7200" w:hanging="360"/>
+      </w:pPr>
+      <w:rPr>
+        <w:rFonts w:ascii="Wingdings" w:hAnsi="Wingdings" w:hint="default"/>
+      </w:rPr>
+    </w:lvl>
+  </w:abstractNum>
+  <w:abstractNum w:abstractNumId="2" w15:restartNumberingAfterBreak="0">
     <w:nsid w:val="1B792F65"/>
     <w:multiLevelType w:val="hybridMultilevel"/>
     <w:tmpl w:val="5082DAE2"/>
@@ -10459,19 +11911,23 @@
       </w:rPr>
     </w:lvl>
   </w:abstractNum>
-  <w:abstractNum w:abstractNumId="2" w15:restartNumberingAfterBreak="0">
+  <w:abstractNum w:abstractNumId="3" w15:restartNumberingAfterBreak="0">
     <w:nsid w:val="1B8B5DC0"/>
     <w:multiLevelType w:val="hybridMultilevel"/>
-    <w:tmpl w:val="94307F80"/>
-    <w:lvl w:ilvl="0" w:tplc="176AA08A">
+    <w:tmpl w:val="D7CE983E"/>
+    <w:lvl w:ilvl="0" w:tplc="CD2EE75C">
       <w:start w:val="1"/>
       <w:numFmt w:val="upperLetter"/>
       <w:pStyle w:val="Heading5"/>
+      <w:suff w:val="space"/>
       <w:lvlText w:val="%1."/>
       <w:lvlJc w:val="left"/>
       <w:pPr>
-        <w:ind w:left="6480" w:hanging="360"/>
-      </w:pPr>
+        <w:ind w:left="0" w:firstLine="720"/>
+      </w:pPr>
+      <w:rPr>
+        <w:rFonts w:hint="default"/>
+      </w:rPr>
     </w:lvl>
     <w:lvl w:ilvl="1" w:tplc="04090019" w:tentative="1">
       <w:start w:val="1"/>
@@ -10546,7 +12002,7 @@
       </w:pPr>
     </w:lvl>
   </w:abstractNum>
-  <w:abstractNum w:abstractNumId="3" w15:restartNumberingAfterBreak="0">
+  <w:abstractNum w:abstractNumId="4" w15:restartNumberingAfterBreak="0">
     <w:nsid w:val="1FE53CE5"/>
     <w:multiLevelType w:val="hybridMultilevel"/>
     <w:tmpl w:val="D2EAEADC"/>
@@ -10633,7 +12089,7 @@
       </w:pPr>
     </w:lvl>
   </w:abstractNum>
-  <w:abstractNum w:abstractNumId="4" w15:restartNumberingAfterBreak="0">
+  <w:abstractNum w:abstractNumId="5" w15:restartNumberingAfterBreak="0">
     <w:nsid w:val="2B7B57CD"/>
     <w:multiLevelType w:val="hybridMultilevel"/>
     <w:tmpl w:val="3A02C9E4"/>
@@ -10747,7 +12203,7 @@
       </w:rPr>
     </w:lvl>
   </w:abstractNum>
-  <w:abstractNum w:abstractNumId="5" w15:restartNumberingAfterBreak="0">
+  <w:abstractNum w:abstractNumId="6" w15:restartNumberingAfterBreak="0">
     <w:nsid w:val="2EE4123E"/>
     <w:multiLevelType w:val="hybridMultilevel"/>
     <w:tmpl w:val="259C1778"/>
@@ -10860,7 +12316,7 @@
       </w:rPr>
     </w:lvl>
   </w:abstractNum>
-  <w:abstractNum w:abstractNumId="6" w15:restartNumberingAfterBreak="0">
+  <w:abstractNum w:abstractNumId="7" w15:restartNumberingAfterBreak="0">
     <w:nsid w:val="35715EFD"/>
     <w:multiLevelType w:val="hybridMultilevel"/>
     <w:tmpl w:val="DD664F90"/>
@@ -10973,10 +12429,10 @@
       </w:rPr>
     </w:lvl>
   </w:abstractNum>
-  <w:abstractNum w:abstractNumId="7" w15:restartNumberingAfterBreak="0">
+  <w:abstractNum w:abstractNumId="8" w15:restartNumberingAfterBreak="0">
     <w:nsid w:val="4167498C"/>
     <w:multiLevelType w:val="hybridMultilevel"/>
-    <w:tmpl w:val="64DCE37C"/>
+    <w:tmpl w:val="AC70AFAC"/>
     <w:lvl w:ilvl="0" w:tplc="164E053A">
       <w:start w:val="1"/>
       <w:numFmt w:val="decimal"/>
@@ -11063,7 +12519,7 @@
       </w:pPr>
     </w:lvl>
   </w:abstractNum>
-  <w:abstractNum w:abstractNumId="8" w15:restartNumberingAfterBreak="0">
+  <w:abstractNum w:abstractNumId="9" w15:restartNumberingAfterBreak="0">
     <w:nsid w:val="4F7E66BA"/>
     <w:multiLevelType w:val="hybridMultilevel"/>
     <w:tmpl w:val="79F2C6B8"/>
@@ -11176,7 +12632,7 @@
       </w:rPr>
     </w:lvl>
   </w:abstractNum>
-  <w:abstractNum w:abstractNumId="9" w15:restartNumberingAfterBreak="0">
+  <w:abstractNum w:abstractNumId="10" w15:restartNumberingAfterBreak="0">
     <w:nsid w:val="51F91447"/>
     <w:multiLevelType w:val="hybridMultilevel"/>
     <w:tmpl w:val="37762FA8"/>
@@ -11289,7 +12745,209 @@
       </w:rPr>
     </w:lvl>
   </w:abstractNum>
-  <w:abstractNum w:abstractNumId="10" w15:restartNumberingAfterBreak="0">
+  <w:abstractNum w:abstractNumId="11" w15:restartNumberingAfterBreak="0">
+    <w:nsid w:val="5D8A4FCC"/>
+    <w:multiLevelType w:val="hybridMultilevel"/>
+    <w:tmpl w:val="21287962"/>
+    <w:lvl w:ilvl="0" w:tplc="04090001">
+      <w:start w:val="1"/>
+      <w:numFmt w:val="bullet"/>
+      <w:lvlText w:val=""/>
+      <w:lvlJc w:val="left"/>
+      <w:pPr>
+        <w:ind w:left="2160" w:hanging="360"/>
+      </w:pPr>
+      <w:rPr>
+        <w:rFonts w:ascii="Symbol" w:hAnsi="Symbol" w:hint="default"/>
+      </w:rPr>
+    </w:lvl>
+    <w:lvl w:ilvl="1" w:tplc="04090003" w:tentative="1">
+      <w:start w:val="1"/>
+      <w:numFmt w:val="bullet"/>
+      <w:lvlText w:val="o"/>
+      <w:lvlJc w:val="left"/>
+      <w:pPr>
+        <w:ind w:left="2880" w:hanging="360"/>
+      </w:pPr>
+      <w:rPr>
+        <w:rFonts w:ascii="Courier New" w:hAnsi="Courier New" w:cs="Courier New" w:hint="default"/>
+      </w:rPr>
+    </w:lvl>
+    <w:lvl w:ilvl="2" w:tplc="04090005" w:tentative="1">
+      <w:start w:val="1"/>
+      <w:numFmt w:val="bullet"/>
+      <w:lvlText w:val=""/>
+      <w:lvlJc w:val="left"/>
+      <w:pPr>
+        <w:ind w:left="3600" w:hanging="360"/>
+      </w:pPr>
+      <w:rPr>
+        <w:rFonts w:ascii="Wingdings" w:hAnsi="Wingdings" w:hint="default"/>
+      </w:rPr>
+    </w:lvl>
+    <w:lvl w:ilvl="3" w:tplc="04090001" w:tentative="1">
+      <w:start w:val="1"/>
+      <w:numFmt w:val="bullet"/>
+      <w:lvlText w:val=""/>
+      <w:lvlJc w:val="left"/>
+      <w:pPr>
+        <w:ind w:left="4320" w:hanging="360"/>
+      </w:pPr>
+      <w:rPr>
+        <w:rFonts w:ascii="Symbol" w:hAnsi="Symbol" w:hint="default"/>
+      </w:rPr>
+    </w:lvl>
+    <w:lvl w:ilvl="4" w:tplc="04090003" w:tentative="1">
+      <w:start w:val="1"/>
+      <w:numFmt w:val="bullet"/>
+      <w:lvlText w:val="o"/>
+      <w:lvlJc w:val="left"/>
+      <w:pPr>
+        <w:ind w:left="5040" w:hanging="360"/>
+      </w:pPr>
+      <w:rPr>
+        <w:rFonts w:ascii="Courier New" w:hAnsi="Courier New" w:cs="Courier New" w:hint="default"/>
+      </w:rPr>
+    </w:lvl>
+    <w:lvl w:ilvl="5" w:tplc="04090005" w:tentative="1">
+      <w:start w:val="1"/>
+      <w:numFmt w:val="bullet"/>
+      <w:lvlText w:val=""/>
+      <w:lvlJc w:val="left"/>
+      <w:pPr>
+        <w:ind w:left="5760" w:hanging="360"/>
+      </w:pPr>
+      <w:rPr>
+        <w:rFonts w:ascii="Wingdings" w:hAnsi="Wingdings" w:hint="default"/>
+      </w:rPr>
+    </w:lvl>
+    <w:lvl w:ilvl="6" w:tplc="04090001" w:tentative="1">
+      <w:start w:val="1"/>
+      <w:numFmt w:val="bullet"/>
+      <w:lvlText w:val=""/>
+      <w:lvlJc w:val="left"/>
+      <w:pPr>
+        <w:ind w:left="6480" w:hanging="360"/>
+      </w:pPr>
+      <w:rPr>
+        <w:rFonts w:ascii="Symbol" w:hAnsi="Symbol" w:hint="default"/>
+      </w:rPr>
+    </w:lvl>
+    <w:lvl w:ilvl="7" w:tplc="04090003" w:tentative="1">
+      <w:start w:val="1"/>
+      <w:numFmt w:val="bullet"/>
+      <w:lvlText w:val="o"/>
+      <w:lvlJc w:val="left"/>
+      <w:pPr>
+        <w:ind w:left="7200" w:hanging="360"/>
+      </w:pPr>
+      <w:rPr>
+        <w:rFonts w:ascii="Courier New" w:hAnsi="Courier New" w:cs="Courier New" w:hint="default"/>
+      </w:rPr>
+    </w:lvl>
+    <w:lvl w:ilvl="8" w:tplc="04090005" w:tentative="1">
+      <w:start w:val="1"/>
+      <w:numFmt w:val="bullet"/>
+      <w:lvlText w:val=""/>
+      <w:lvlJc w:val="left"/>
+      <w:pPr>
+        <w:ind w:left="7920" w:hanging="360"/>
+      </w:pPr>
+      <w:rPr>
+        <w:rFonts w:ascii="Wingdings" w:hAnsi="Wingdings" w:hint="default"/>
+      </w:rPr>
+    </w:lvl>
+  </w:abstractNum>
+  <w:abstractNum w:abstractNumId="12" w15:restartNumberingAfterBreak="0">
+    <w:nsid w:val="5F115D9E"/>
+    <w:multiLevelType w:val="hybridMultilevel"/>
+    <w:tmpl w:val="AE40592A"/>
+    <w:lvl w:ilvl="0" w:tplc="0409000F">
+      <w:start w:val="1"/>
+      <w:numFmt w:val="decimal"/>
+      <w:lvlText w:val="%1."/>
+      <w:lvlJc w:val="left"/>
+      <w:pPr>
+        <w:ind w:left="1440" w:hanging="360"/>
+      </w:pPr>
+    </w:lvl>
+    <w:lvl w:ilvl="1" w:tplc="04090001">
+      <w:start w:val="1"/>
+      <w:numFmt w:val="bullet"/>
+      <w:lvlText w:val=""/>
+      <w:lvlJc w:val="left"/>
+      <w:pPr>
+        <w:ind w:left="2160" w:hanging="360"/>
+      </w:pPr>
+      <w:rPr>
+        <w:rFonts w:ascii="Symbol" w:hAnsi="Symbol" w:hint="default"/>
+      </w:rPr>
+    </w:lvl>
+    <w:lvl w:ilvl="2" w:tplc="0409001B" w:tentative="1">
+      <w:start w:val="1"/>
+      <w:numFmt w:val="lowerRoman"/>
+      <w:lvlText w:val="%3."/>
+      <w:lvlJc w:val="right"/>
+      <w:pPr>
+        <w:ind w:left="2880" w:hanging="180"/>
+      </w:pPr>
+    </w:lvl>
+    <w:lvl w:ilvl="3" w:tplc="0409000F" w:tentative="1">
+      <w:start w:val="1"/>
+      <w:numFmt w:val="decimal"/>
+      <w:lvlText w:val="%4."/>
+      <w:lvlJc w:val="left"/>
+      <w:pPr>
+        <w:ind w:left="3600" w:hanging="360"/>
+      </w:pPr>
+    </w:lvl>
+    <w:lvl w:ilvl="4" w:tplc="04090019" w:tentative="1">
+      <w:start w:val="1"/>
+      <w:numFmt w:val="lowerLetter"/>
+      <w:lvlText w:val="%5."/>
+      <w:lvlJc w:val="left"/>
+      <w:pPr>
+        <w:ind w:left="4320" w:hanging="360"/>
+      </w:pPr>
+    </w:lvl>
+    <w:lvl w:ilvl="5" w:tplc="0409001B" w:tentative="1">
+      <w:start w:val="1"/>
+      <w:numFmt w:val="lowerRoman"/>
+      <w:lvlText w:val="%6."/>
+      <w:lvlJc w:val="right"/>
+      <w:pPr>
+        <w:ind w:left="5040" w:hanging="180"/>
+      </w:pPr>
+    </w:lvl>
+    <w:lvl w:ilvl="6" w:tplc="0409000F" w:tentative="1">
+      <w:start w:val="1"/>
+      <w:numFmt w:val="decimal"/>
+      <w:lvlText w:val="%7."/>
+      <w:lvlJc w:val="left"/>
+      <w:pPr>
+        <w:ind w:left="5760" w:hanging="360"/>
+      </w:pPr>
+    </w:lvl>
+    <w:lvl w:ilvl="7" w:tplc="04090019" w:tentative="1">
+      <w:start w:val="1"/>
+      <w:numFmt w:val="lowerLetter"/>
+      <w:lvlText w:val="%8."/>
+      <w:lvlJc w:val="left"/>
+      <w:pPr>
+        <w:ind w:left="6480" w:hanging="360"/>
+      </w:pPr>
+    </w:lvl>
+    <w:lvl w:ilvl="8" w:tplc="0409001B" w:tentative="1">
+      <w:start w:val="1"/>
+      <w:numFmt w:val="lowerRoman"/>
+      <w:lvlText w:val="%9."/>
+      <w:lvlJc w:val="right"/>
+      <w:pPr>
+        <w:ind w:left="7200" w:hanging="180"/>
+      </w:pPr>
+    </w:lvl>
+  </w:abstractNum>
+  <w:abstractNum w:abstractNumId="13" w15:restartNumberingAfterBreak="0">
     <w:nsid w:val="63917590"/>
     <w:multiLevelType w:val="hybridMultilevel"/>
     <w:tmpl w:val="D714BB68"/>
@@ -11402,7 +13060,206 @@
       </w:rPr>
     </w:lvl>
   </w:abstractNum>
-  <w:abstractNum w:abstractNumId="11" w15:restartNumberingAfterBreak="0">
+  <w:abstractNum w:abstractNumId="14" w15:restartNumberingAfterBreak="0">
+    <w:nsid w:val="6E3F320D"/>
+    <w:multiLevelType w:val="hybridMultilevel"/>
+    <w:tmpl w:val="C68A37A4"/>
+    <w:lvl w:ilvl="0" w:tplc="04090001">
+      <w:start w:val="1"/>
+      <w:numFmt w:val="bullet"/>
+      <w:lvlText w:val=""/>
+      <w:lvlJc w:val="left"/>
+      <w:pPr>
+        <w:ind w:left="1440" w:hanging="360"/>
+      </w:pPr>
+      <w:rPr>
+        <w:rFonts w:ascii="Symbol" w:hAnsi="Symbol" w:hint="default"/>
+      </w:rPr>
+    </w:lvl>
+    <w:lvl w:ilvl="1" w:tplc="04090003" w:tentative="1">
+      <w:start w:val="1"/>
+      <w:numFmt w:val="bullet"/>
+      <w:lvlText w:val="o"/>
+      <w:lvlJc w:val="left"/>
+      <w:pPr>
+        <w:ind w:left="2160" w:hanging="360"/>
+      </w:pPr>
+      <w:rPr>
+        <w:rFonts w:ascii="Courier New" w:hAnsi="Courier New" w:cs="Courier New" w:hint="default"/>
+      </w:rPr>
+    </w:lvl>
+    <w:lvl w:ilvl="2" w:tplc="04090005" w:tentative="1">
+      <w:start w:val="1"/>
+      <w:numFmt w:val="bullet"/>
+      <w:lvlText w:val=""/>
+      <w:lvlJc w:val="left"/>
+      <w:pPr>
+        <w:ind w:left="2880" w:hanging="360"/>
+      </w:pPr>
+      <w:rPr>
+        <w:rFonts w:ascii="Wingdings" w:hAnsi="Wingdings" w:hint="default"/>
+      </w:rPr>
+    </w:lvl>
+    <w:lvl w:ilvl="3" w:tplc="04090001" w:tentative="1">
+      <w:start w:val="1"/>
+      <w:numFmt w:val="bullet"/>
+      <w:lvlText w:val=""/>
+      <w:lvlJc w:val="left"/>
+      <w:pPr>
+        <w:ind w:left="3600" w:hanging="360"/>
+      </w:pPr>
+      <w:rPr>
+        <w:rFonts w:ascii="Symbol" w:hAnsi="Symbol" w:hint="default"/>
+      </w:rPr>
+    </w:lvl>
+    <w:lvl w:ilvl="4" w:tplc="04090003" w:tentative="1">
+      <w:start w:val="1"/>
+      <w:numFmt w:val="bullet"/>
+      <w:lvlText w:val="o"/>
+      <w:lvlJc w:val="left"/>
+      <w:pPr>
+        <w:ind w:left="4320" w:hanging="360"/>
+      </w:pPr>
+      <w:rPr>
+        <w:rFonts w:ascii="Courier New" w:hAnsi="Courier New" w:cs="Courier New" w:hint="default"/>
+      </w:rPr>
+    </w:lvl>
+    <w:lvl w:ilvl="5" w:tplc="04090005" w:tentative="1">
+      <w:start w:val="1"/>
+      <w:numFmt w:val="bullet"/>
+      <w:lvlText w:val=""/>
+      <w:lvlJc w:val="left"/>
+      <w:pPr>
+        <w:ind w:left="5040" w:hanging="360"/>
+      </w:pPr>
+      <w:rPr>
+        <w:rFonts w:ascii="Wingdings" w:hAnsi="Wingdings" w:hint="default"/>
+      </w:rPr>
+    </w:lvl>
+    <w:lvl w:ilvl="6" w:tplc="04090001" w:tentative="1">
+      <w:start w:val="1"/>
+      <w:numFmt w:val="bullet"/>
+      <w:lvlText w:val=""/>
+      <w:lvlJc w:val="left"/>
+      <w:pPr>
+        <w:ind w:left="5760" w:hanging="360"/>
+      </w:pPr>
+      <w:rPr>
+        <w:rFonts w:ascii="Symbol" w:hAnsi="Symbol" w:hint="default"/>
+      </w:rPr>
+    </w:lvl>
+    <w:lvl w:ilvl="7" w:tplc="04090003" w:tentative="1">
+      <w:start w:val="1"/>
+      <w:numFmt w:val="bullet"/>
+      <w:lvlText w:val="o"/>
+      <w:lvlJc w:val="left"/>
+      <w:pPr>
+        <w:ind w:left="6480" w:hanging="360"/>
+      </w:pPr>
+      <w:rPr>
+        <w:rFonts w:ascii="Courier New" w:hAnsi="Courier New" w:cs="Courier New" w:hint="default"/>
+      </w:rPr>
+    </w:lvl>
+    <w:lvl w:ilvl="8" w:tplc="04090005" w:tentative="1">
+      <w:start w:val="1"/>
+      <w:numFmt w:val="bullet"/>
+      <w:lvlText w:val=""/>
+      <w:lvlJc w:val="left"/>
+      <w:pPr>
+        <w:ind w:left="7200" w:hanging="360"/>
+      </w:pPr>
+      <w:rPr>
+        <w:rFonts w:ascii="Wingdings" w:hAnsi="Wingdings" w:hint="default"/>
+      </w:rPr>
+    </w:lvl>
+  </w:abstractNum>
+  <w:abstractNum w:abstractNumId="15" w15:restartNumberingAfterBreak="0">
+    <w:nsid w:val="6F821489"/>
+    <w:multiLevelType w:val="hybridMultilevel"/>
+    <w:tmpl w:val="0746499E"/>
+    <w:lvl w:ilvl="0" w:tplc="0409000F">
+      <w:start w:val="1"/>
+      <w:numFmt w:val="decimal"/>
+      <w:lvlText w:val="%1."/>
+      <w:lvlJc w:val="left"/>
+      <w:pPr>
+        <w:ind w:left="1440" w:hanging="360"/>
+      </w:pPr>
+    </w:lvl>
+    <w:lvl w:ilvl="1" w:tplc="04090019" w:tentative="1">
+      <w:start w:val="1"/>
+      <w:numFmt w:val="lowerLetter"/>
+      <w:lvlText w:val="%2."/>
+      <w:lvlJc w:val="left"/>
+      <w:pPr>
+        <w:ind w:left="2160" w:hanging="360"/>
+      </w:pPr>
+    </w:lvl>
+    <w:lvl w:ilvl="2" w:tplc="0409001B" w:tentative="1">
+      <w:start w:val="1"/>
+      <w:numFmt w:val="lowerRoman"/>
+      <w:lvlText w:val="%3."/>
+      <w:lvlJc w:val="right"/>
+      <w:pPr>
+        <w:ind w:left="2880" w:hanging="180"/>
+      </w:pPr>
+    </w:lvl>
+    <w:lvl w:ilvl="3" w:tplc="0409000F" w:tentative="1">
+      <w:start w:val="1"/>
+      <w:numFmt w:val="decimal"/>
+      <w:lvlText w:val="%4."/>
+      <w:lvlJc w:val="left"/>
+      <w:pPr>
+        <w:ind w:left="3600" w:hanging="360"/>
+      </w:pPr>
+    </w:lvl>
+    <w:lvl w:ilvl="4" w:tplc="04090019" w:tentative="1">
+      <w:start w:val="1"/>
+      <w:numFmt w:val="lowerLetter"/>
+      <w:lvlText w:val="%5."/>
+      <w:lvlJc w:val="left"/>
+      <w:pPr>
+        <w:ind w:left="4320" w:hanging="360"/>
+      </w:pPr>
+    </w:lvl>
+    <w:lvl w:ilvl="5" w:tplc="0409001B" w:tentative="1">
+      <w:start w:val="1"/>
+      <w:numFmt w:val="lowerRoman"/>
+      <w:lvlText w:val="%6."/>
+      <w:lvlJc w:val="right"/>
+      <w:pPr>
+        <w:ind w:left="5040" w:hanging="180"/>
+      </w:pPr>
+    </w:lvl>
+    <w:lvl w:ilvl="6" w:tplc="0409000F" w:tentative="1">
+      <w:start w:val="1"/>
+      <w:numFmt w:val="decimal"/>
+      <w:lvlText w:val="%7."/>
+      <w:lvlJc w:val="left"/>
+      <w:pPr>
+        <w:ind w:left="5760" w:hanging="360"/>
+      </w:pPr>
+    </w:lvl>
+    <w:lvl w:ilvl="7" w:tplc="04090019" w:tentative="1">
+      <w:start w:val="1"/>
+      <w:numFmt w:val="lowerLetter"/>
+      <w:lvlText w:val="%8."/>
+      <w:lvlJc w:val="left"/>
+      <w:pPr>
+        <w:ind w:left="6480" w:hanging="360"/>
+      </w:pPr>
+    </w:lvl>
+    <w:lvl w:ilvl="8" w:tplc="0409001B" w:tentative="1">
+      <w:start w:val="1"/>
+      <w:numFmt w:val="lowerRoman"/>
+      <w:lvlText w:val="%9."/>
+      <w:lvlJc w:val="right"/>
+      <w:pPr>
+        <w:ind w:left="7200" w:hanging="180"/>
+      </w:pPr>
+    </w:lvl>
+  </w:abstractNum>
+  <w:abstractNum w:abstractNumId="16" w15:restartNumberingAfterBreak="0">
     <w:nsid w:val="75AD4CC8"/>
     <w:multiLevelType w:val="hybridMultilevel"/>
     <w:tmpl w:val="CB147842"/>
@@ -11515,47 +13372,226 @@
       </w:rPr>
     </w:lvl>
   </w:abstractNum>
+  <w:abstractNum w:abstractNumId="17" w15:restartNumberingAfterBreak="0">
+    <w:nsid w:val="7998064F"/>
+    <w:multiLevelType w:val="hybridMultilevel"/>
+    <w:tmpl w:val="6D7EEBCC"/>
+    <w:lvl w:ilvl="0" w:tplc="04090001">
+      <w:start w:val="1"/>
+      <w:numFmt w:val="bullet"/>
+      <w:lvlText w:val=""/>
+      <w:lvlJc w:val="left"/>
+      <w:pPr>
+        <w:ind w:left="2160" w:hanging="360"/>
+      </w:pPr>
+      <w:rPr>
+        <w:rFonts w:ascii="Symbol" w:hAnsi="Symbol" w:hint="default"/>
+      </w:rPr>
+    </w:lvl>
+    <w:lvl w:ilvl="1" w:tplc="04090003" w:tentative="1">
+      <w:start w:val="1"/>
+      <w:numFmt w:val="bullet"/>
+      <w:lvlText w:val="o"/>
+      <w:lvlJc w:val="left"/>
+      <w:pPr>
+        <w:ind w:left="2880" w:hanging="360"/>
+      </w:pPr>
+      <w:rPr>
+        <w:rFonts w:ascii="Courier New" w:hAnsi="Courier New" w:cs="Courier New" w:hint="default"/>
+      </w:rPr>
+    </w:lvl>
+    <w:lvl w:ilvl="2" w:tplc="04090005" w:tentative="1">
+      <w:start w:val="1"/>
+      <w:numFmt w:val="bullet"/>
+      <w:lvlText w:val=""/>
+      <w:lvlJc w:val="left"/>
+      <w:pPr>
+        <w:ind w:left="3600" w:hanging="360"/>
+      </w:pPr>
+      <w:rPr>
+        <w:rFonts w:ascii="Wingdings" w:hAnsi="Wingdings" w:hint="default"/>
+      </w:rPr>
+    </w:lvl>
+    <w:lvl w:ilvl="3" w:tplc="04090001" w:tentative="1">
+      <w:start w:val="1"/>
+      <w:numFmt w:val="bullet"/>
+      <w:lvlText w:val=""/>
+      <w:lvlJc w:val="left"/>
+      <w:pPr>
+        <w:ind w:left="4320" w:hanging="360"/>
+      </w:pPr>
+      <w:rPr>
+        <w:rFonts w:ascii="Symbol" w:hAnsi="Symbol" w:hint="default"/>
+      </w:rPr>
+    </w:lvl>
+    <w:lvl w:ilvl="4" w:tplc="04090003" w:tentative="1">
+      <w:start w:val="1"/>
+      <w:numFmt w:val="bullet"/>
+      <w:lvlText w:val="o"/>
+      <w:lvlJc w:val="left"/>
+      <w:pPr>
+        <w:ind w:left="5040" w:hanging="360"/>
+      </w:pPr>
+      <w:rPr>
+        <w:rFonts w:ascii="Courier New" w:hAnsi="Courier New" w:cs="Courier New" w:hint="default"/>
+      </w:rPr>
+    </w:lvl>
+    <w:lvl w:ilvl="5" w:tplc="04090005" w:tentative="1">
+      <w:start w:val="1"/>
+      <w:numFmt w:val="bullet"/>
+      <w:lvlText w:val=""/>
+      <w:lvlJc w:val="left"/>
+      <w:pPr>
+        <w:ind w:left="5760" w:hanging="360"/>
+      </w:pPr>
+      <w:rPr>
+        <w:rFonts w:ascii="Wingdings" w:hAnsi="Wingdings" w:hint="default"/>
+      </w:rPr>
+    </w:lvl>
+    <w:lvl w:ilvl="6" w:tplc="04090001" w:tentative="1">
+      <w:start w:val="1"/>
+      <w:numFmt w:val="bullet"/>
+      <w:lvlText w:val=""/>
+      <w:lvlJc w:val="left"/>
+      <w:pPr>
+        <w:ind w:left="6480" w:hanging="360"/>
+      </w:pPr>
+      <w:rPr>
+        <w:rFonts w:ascii="Symbol" w:hAnsi="Symbol" w:hint="default"/>
+      </w:rPr>
+    </w:lvl>
+    <w:lvl w:ilvl="7" w:tplc="04090003" w:tentative="1">
+      <w:start w:val="1"/>
+      <w:numFmt w:val="bullet"/>
+      <w:lvlText w:val="o"/>
+      <w:lvlJc w:val="left"/>
+      <w:pPr>
+        <w:ind w:left="7200" w:hanging="360"/>
+      </w:pPr>
+      <w:rPr>
+        <w:rFonts w:ascii="Courier New" w:hAnsi="Courier New" w:cs="Courier New" w:hint="default"/>
+      </w:rPr>
+    </w:lvl>
+    <w:lvl w:ilvl="8" w:tplc="04090005" w:tentative="1">
+      <w:start w:val="1"/>
+      <w:numFmt w:val="bullet"/>
+      <w:lvlText w:val=""/>
+      <w:lvlJc w:val="left"/>
+      <w:pPr>
+        <w:ind w:left="7920" w:hanging="360"/>
+      </w:pPr>
+      <w:rPr>
+        <w:rFonts w:ascii="Wingdings" w:hAnsi="Wingdings" w:hint="default"/>
+      </w:rPr>
+    </w:lvl>
+  </w:abstractNum>
   <w:num w:numId="1" w16cid:durableId="1173185611">
-    <w:abstractNumId w:val="10"/>
+    <w:abstractNumId w:val="13"/>
   </w:num>
   <w:num w:numId="2" w16cid:durableId="2008241989">
+    <w:abstractNumId w:val="5"/>
+  </w:num>
+  <w:num w:numId="3" w16cid:durableId="1280189446">
+    <w:abstractNumId w:val="6"/>
+  </w:num>
+  <w:num w:numId="4" w16cid:durableId="126434000">
+    <w:abstractNumId w:val="16"/>
+  </w:num>
+  <w:num w:numId="5" w16cid:durableId="88235218">
+    <w:abstractNumId w:val="2"/>
+  </w:num>
+  <w:num w:numId="6" w16cid:durableId="2075662437">
     <w:abstractNumId w:val="4"/>
   </w:num>
-  <w:num w:numId="3" w16cid:durableId="1280189446">
-    <w:abstractNumId w:val="5"/>
-  </w:num>
-  <w:num w:numId="4" w16cid:durableId="126434000">
-    <w:abstractNumId w:val="11"/>
-  </w:num>
-  <w:num w:numId="5" w16cid:durableId="88235218">
-    <w:abstractNumId w:val="1"/>
-  </w:num>
-  <w:num w:numId="6" w16cid:durableId="2075662437">
+  <w:num w:numId="7" w16cid:durableId="100228626">
     <w:abstractNumId w:val="3"/>
   </w:num>
-  <w:num w:numId="7" w16cid:durableId="100228626">
-    <w:abstractNumId w:val="2"/>
-  </w:num>
   <w:num w:numId="8" w16cid:durableId="1520004101">
-    <w:abstractNumId w:val="8"/>
+    <w:abstractNumId w:val="9"/>
   </w:num>
   <w:num w:numId="9" w16cid:durableId="2040203771">
     <w:abstractNumId w:val="0"/>
   </w:num>
   <w:num w:numId="10" w16cid:durableId="315181602">
+    <w:abstractNumId w:val="8"/>
+  </w:num>
+  <w:num w:numId="11" w16cid:durableId="6830234">
     <w:abstractNumId w:val="7"/>
   </w:num>
-  <w:num w:numId="11" w16cid:durableId="6830234">
-    <w:abstractNumId w:val="6"/>
-  </w:num>
   <w:num w:numId="12" w16cid:durableId="644774398">
-    <w:abstractNumId w:val="9"/>
+    <w:abstractNumId w:val="10"/>
   </w:num>
   <w:num w:numId="13" w16cid:durableId="1220090486">
-    <w:abstractNumId w:val="7"/>
+    <w:abstractNumId w:val="8"/>
     <w:lvlOverride w:ilvl="0">
       <w:startOverride w:val="1"/>
     </w:lvlOverride>
+  </w:num>
+  <w:num w:numId="14" w16cid:durableId="653677883">
+    <w:abstractNumId w:val="15"/>
+  </w:num>
+  <w:num w:numId="15" w16cid:durableId="1593008556">
+    <w:abstractNumId w:val="11"/>
+  </w:num>
+  <w:num w:numId="16" w16cid:durableId="1969361129">
+    <w:abstractNumId w:val="17"/>
+  </w:num>
+  <w:num w:numId="17" w16cid:durableId="287854270">
+    <w:abstractNumId w:val="3"/>
+    <w:lvlOverride w:ilvl="0">
+      <w:startOverride w:val="1"/>
+    </w:lvlOverride>
+  </w:num>
+  <w:num w:numId="18" w16cid:durableId="1455246916">
+    <w:abstractNumId w:val="3"/>
+    <w:lvlOverride w:ilvl="0">
+      <w:startOverride w:val="1"/>
+    </w:lvlOverride>
+  </w:num>
+  <w:num w:numId="19" w16cid:durableId="1837114645">
+    <w:abstractNumId w:val="3"/>
+    <w:lvlOverride w:ilvl="0">
+      <w:startOverride w:val="1"/>
+    </w:lvlOverride>
+  </w:num>
+  <w:num w:numId="20" w16cid:durableId="382221458">
+    <w:abstractNumId w:val="8"/>
+    <w:lvlOverride w:ilvl="0">
+      <w:startOverride w:val="1"/>
+    </w:lvlOverride>
+  </w:num>
+  <w:num w:numId="21" w16cid:durableId="1655790808">
+    <w:abstractNumId w:val="8"/>
+    <w:lvlOverride w:ilvl="0">
+      <w:startOverride w:val="1"/>
+    </w:lvlOverride>
+  </w:num>
+  <w:num w:numId="22" w16cid:durableId="234171700">
+    <w:abstractNumId w:val="8"/>
+    <w:lvlOverride w:ilvl="0">
+      <w:startOverride w:val="1"/>
+    </w:lvlOverride>
+  </w:num>
+  <w:num w:numId="23" w16cid:durableId="1009982909">
+    <w:abstractNumId w:val="1"/>
+  </w:num>
+  <w:num w:numId="24" w16cid:durableId="1560550362">
+    <w:abstractNumId w:val="8"/>
+    <w:lvlOverride w:ilvl="0">
+      <w:startOverride w:val="1"/>
+    </w:lvlOverride>
+  </w:num>
+  <w:num w:numId="25" w16cid:durableId="813061479">
+    <w:abstractNumId w:val="3"/>
+    <w:lvlOverride w:ilvl="0">
+      <w:startOverride w:val="1"/>
+    </w:lvlOverride>
+  </w:num>
+  <w:num w:numId="26" w16cid:durableId="1077551942">
+    <w:abstractNumId w:val="14"/>
+  </w:num>
+  <w:num w:numId="27" w16cid:durableId="840898556">
+    <w:abstractNumId w:val="12"/>
   </w:num>
 </w:numbering>
 </file>
@@ -12061,7 +14097,7 @@
     <w:uiPriority w:val="9"/>
     <w:unhideWhenUsed/>
     <w:qFormat/>
-    <w:rsid w:val="00692767"/>
+    <w:rsid w:val="005C32EB"/>
     <w:pPr>
       <w:keepNext/>
       <w:keepLines/>
@@ -12069,7 +14105,6 @@
         <w:numId w:val="7"/>
       </w:numPr>
       <w:spacing w:before="80" w:after="40" w:line="480" w:lineRule="auto"/>
-      <w:ind w:left="1080"/>
       <w:outlineLvl w:val="4"/>
     </w:pPr>
     <w:rPr>
@@ -12165,7 +14200,6 @@
   <w:style w:type="character" w:default="1" w:styleId="DefaultParagraphFont">
     <w:name w:val="Default Paragraph Font"/>
     <w:uiPriority w:val="1"/>
-    <w:semiHidden/>
     <w:unhideWhenUsed/>
   </w:style>
   <w:style w:type="table" w:default="1" w:styleId="TableNormal">
@@ -12247,7 +14281,7 @@
     <w:basedOn w:val="DefaultParagraphFont"/>
     <w:link w:val="Heading5"/>
     <w:uiPriority w:val="9"/>
-    <w:rsid w:val="00692767"/>
+    <w:rsid w:val="005C32EB"/>
     <w:rPr>
       <w:rFonts w:ascii="Times New Roman" w:eastAsiaTheme="majorEastAsia" w:hAnsi="Times New Roman" w:cstheme="majorBidi"/>
     </w:rPr>

</xml_diff>

<commit_message>
hasil tahapan pelaksanaan done, next cicil kendala tiap tahapan
</commit_message>
<xml_diff>
--- a/non-website/Laporan Akhir KP/2203040182 - Dhika Ramadhan Saputra - Laporan KP.docx
+++ b/non-website/Laporan Akhir KP/2203040182 - Dhika Ramadhan Saputra - Laporan KP.docx
@@ -1598,27 +1598,14 @@
       <w:r>
         <w:t xml:space="preserve">ambar </w:t>
       </w:r>
-      <w:r>
-        <w:fldChar w:fldCharType="begin"/>
-      </w:r>
-      <w:r>
-        <w:instrText xml:space="preserve"> SEQ gambar \* ARABIC </w:instrText>
-      </w:r>
-      <w:r>
-        <w:fldChar w:fldCharType="separate"/>
-      </w:r>
-      <w:r>
-        <w:rPr>
-          <w:noProof/>
-        </w:rPr>
-        <w:t>1</w:t>
-      </w:r>
-      <w:r>
-        <w:rPr>
-          <w:noProof/>
-        </w:rPr>
-        <w:fldChar w:fldCharType="end"/>
-      </w:r>
+      <w:fldSimple w:instr=" SEQ gambar \* ARABIC ">
+        <w:r>
+          <w:rPr>
+            <w:noProof/>
+          </w:rPr>
+          <w:t>1</w:t>
+        </w:r>
+      </w:fldSimple>
       <w:r>
         <w:t xml:space="preserve"> Tahapan Pelaksanaan</w:t>
       </w:r>
@@ -3564,27 +3551,14 @@
       <w:r>
         <w:t xml:space="preserve">Tabel </w:t>
       </w:r>
-      <w:r>
-        <w:fldChar w:fldCharType="begin"/>
-      </w:r>
-      <w:r>
-        <w:instrText xml:space="preserve"> SEQ Tabel \* ARABIC </w:instrText>
-      </w:r>
-      <w:r>
-        <w:fldChar w:fldCharType="separate"/>
-      </w:r>
-      <w:r>
-        <w:rPr>
-          <w:noProof/>
-        </w:rPr>
-        <w:t>1</w:t>
-      </w:r>
-      <w:r>
-        <w:rPr>
-          <w:noProof/>
-        </w:rPr>
-        <w:fldChar w:fldCharType="end"/>
-      </w:r>
+      <w:fldSimple w:instr=" SEQ Tabel \* ARABIC ">
+        <w:r>
+          <w:rPr>
+            <w:noProof/>
+          </w:rPr>
+          <w:t>1</w:t>
+        </w:r>
+      </w:fldSimple>
       <w:r>
         <w:t xml:space="preserve"> Jadwal pelaksanaan</w:t>
       </w:r>
@@ -3785,27 +3759,14 @@
       <w:r>
         <w:t xml:space="preserve">ambar </w:t>
       </w:r>
-      <w:r>
-        <w:fldChar w:fldCharType="begin"/>
-      </w:r>
-      <w:r>
-        <w:instrText xml:space="preserve"> SEQ gambar \* ARABIC </w:instrText>
-      </w:r>
-      <w:r>
-        <w:fldChar w:fldCharType="separate"/>
-      </w:r>
-      <w:r>
-        <w:rPr>
-          <w:noProof/>
-        </w:rPr>
-        <w:t>2</w:t>
-      </w:r>
-      <w:r>
-        <w:rPr>
-          <w:noProof/>
-        </w:rPr>
-        <w:fldChar w:fldCharType="end"/>
-      </w:r>
+      <w:fldSimple w:instr=" SEQ gambar \* ARABIC ">
+        <w:r>
+          <w:rPr>
+            <w:noProof/>
+          </w:rPr>
+          <w:t>2</w:t>
+        </w:r>
+      </w:fldSimple>
       <w:r>
         <w:t xml:space="preserve"> Struktur Umum Organisasi Mitra</w:t>
       </w:r>
@@ -4250,27 +4211,14 @@
       <w:r>
         <w:t xml:space="preserve">ambar </w:t>
       </w:r>
-      <w:r>
-        <w:fldChar w:fldCharType="begin"/>
-      </w:r>
-      <w:r>
-        <w:instrText xml:space="preserve"> SEQ gambar \* ARABIC </w:instrText>
-      </w:r>
-      <w:r>
-        <w:fldChar w:fldCharType="separate"/>
-      </w:r>
-      <w:r>
-        <w:rPr>
-          <w:noProof/>
-        </w:rPr>
-        <w:t>3</w:t>
-      </w:r>
-      <w:r>
-        <w:rPr>
-          <w:noProof/>
-        </w:rPr>
-        <w:fldChar w:fldCharType="end"/>
-      </w:r>
+      <w:fldSimple w:instr=" SEQ gambar \* ARABIC ">
+        <w:r>
+          <w:rPr>
+            <w:noProof/>
+          </w:rPr>
+          <w:t>3</w:t>
+        </w:r>
+      </w:fldSimple>
       <w:r>
         <w:t xml:space="preserve"> Dokumentasi proses penerimaan data</w:t>
       </w:r>
@@ -4289,7 +4237,7 @@
           <w:noProof/>
         </w:rPr>
         <w:drawing>
-          <wp:inline distT="0" distB="0" distL="0" distR="0" wp14:anchorId="75188C27" wp14:editId="1A5517E6">
+          <wp:inline distT="0" distB="0" distL="0" distR="0" wp14:anchorId="75188C27" wp14:editId="49A75DFD">
             <wp:extent cx="4608000" cy="1698906"/>
             <wp:effectExtent l="19050" t="19050" r="21590" b="15875"/>
             <wp:docPr id="783286403" name="Picture 4"/>
@@ -4355,27 +4303,14 @@
       <w:r>
         <w:t xml:space="preserve">ambar </w:t>
       </w:r>
-      <w:r>
-        <w:fldChar w:fldCharType="begin"/>
-      </w:r>
-      <w:r>
-        <w:instrText xml:space="preserve"> SEQ gambar \* ARABIC </w:instrText>
-      </w:r>
-      <w:r>
-        <w:fldChar w:fldCharType="separate"/>
-      </w:r>
-      <w:r>
-        <w:rPr>
-          <w:noProof/>
-        </w:rPr>
-        <w:t>4</w:t>
-      </w:r>
-      <w:r>
-        <w:rPr>
-          <w:noProof/>
-        </w:rPr>
-        <w:fldChar w:fldCharType="end"/>
-      </w:r>
+      <w:fldSimple w:instr=" SEQ gambar \* ARABIC ">
+        <w:r>
+          <w:rPr>
+            <w:noProof/>
+          </w:rPr>
+          <w:t>4</w:t>
+        </w:r>
+      </w:fldSimple>
       <w:r>
         <w:t xml:space="preserve"> Sampel</w:t>
       </w:r>
@@ -4597,7 +4532,7 @@
           <w:noProof/>
         </w:rPr>
         <w:drawing>
-          <wp:inline distT="0" distB="0" distL="0" distR="0" wp14:anchorId="02EBA956" wp14:editId="64B8A314">
+          <wp:inline distT="0" distB="0" distL="0" distR="0" wp14:anchorId="02EBA956" wp14:editId="40EC7092">
             <wp:extent cx="3888000" cy="2160000"/>
             <wp:effectExtent l="19050" t="19050" r="17780" b="12065"/>
             <wp:docPr id="102117401" name="Picture 5"/>
@@ -4663,27 +4598,14 @@
       <w:r>
         <w:t xml:space="preserve">ambar </w:t>
       </w:r>
-      <w:r>
-        <w:fldChar w:fldCharType="begin"/>
-      </w:r>
-      <w:r>
-        <w:instrText xml:space="preserve"> SEQ Gambar \* ARABIC </w:instrText>
-      </w:r>
-      <w:r>
-        <w:fldChar w:fldCharType="separate"/>
-      </w:r>
-      <w:r>
-        <w:rPr>
-          <w:noProof/>
-        </w:rPr>
-        <w:t>5</w:t>
-      </w:r>
-      <w:r>
-        <w:rPr>
-          <w:noProof/>
-        </w:rPr>
-        <w:fldChar w:fldCharType="end"/>
-      </w:r>
+      <w:fldSimple w:instr=" SEQ Gambar \* ARABIC ">
+        <w:r>
+          <w:rPr>
+            <w:noProof/>
+          </w:rPr>
+          <w:t>5</w:t>
+        </w:r>
+      </w:fldSimple>
       <w:r>
         <w:t xml:space="preserve"> Cuplikan </w:t>
       </w:r>
@@ -4770,27 +4692,14 @@
       <w:r>
         <w:t xml:space="preserve">Gambar </w:t>
       </w:r>
-      <w:r>
-        <w:fldChar w:fldCharType="begin"/>
-      </w:r>
-      <w:r>
-        <w:instrText xml:space="preserve"> SEQ Gambar \* ARABIC </w:instrText>
-      </w:r>
-      <w:r>
-        <w:fldChar w:fldCharType="separate"/>
-      </w:r>
-      <w:r>
-        <w:rPr>
-          <w:noProof/>
-        </w:rPr>
-        <w:t>6</w:t>
-      </w:r>
-      <w:r>
-        <w:rPr>
-          <w:noProof/>
-        </w:rPr>
-        <w:fldChar w:fldCharType="end"/>
-      </w:r>
+      <w:fldSimple w:instr=" SEQ Gambar \* ARABIC ">
+        <w:r>
+          <w:rPr>
+            <w:noProof/>
+          </w:rPr>
+          <w:t>6</w:t>
+        </w:r>
+      </w:fldSimple>
       <w:r>
         <w:t xml:space="preserve"> Berkas sebelum &amp; sesudah penggabungan</w:t>
       </w:r>
@@ -4914,7 +4823,7 @@
           <w:noProof/>
         </w:rPr>
         <w:drawing>
-          <wp:inline distT="0" distB="0" distL="0" distR="0" wp14:anchorId="7A542151" wp14:editId="35A3B738">
+          <wp:inline distT="0" distB="0" distL="0" distR="0" wp14:anchorId="7A542151" wp14:editId="71CF8349">
             <wp:extent cx="3418966" cy="1800000"/>
             <wp:effectExtent l="19050" t="19050" r="10160" b="10160"/>
             <wp:docPr id="1182821816" name="Picture 3"/>
@@ -4977,27 +4886,14 @@
       <w:r>
         <w:t xml:space="preserve">Gambar </w:t>
       </w:r>
-      <w:r>
-        <w:fldChar w:fldCharType="begin"/>
-      </w:r>
-      <w:r>
-        <w:instrText xml:space="preserve"> SEQ Gambar \* ARABIC </w:instrText>
-      </w:r>
-      <w:r>
-        <w:fldChar w:fldCharType="separate"/>
-      </w:r>
-      <w:r>
-        <w:rPr>
-          <w:noProof/>
-        </w:rPr>
-        <w:t>7</w:t>
-      </w:r>
-      <w:r>
-        <w:rPr>
-          <w:noProof/>
-        </w:rPr>
-        <w:fldChar w:fldCharType="end"/>
-      </w:r>
+      <w:fldSimple w:instr=" SEQ Gambar \* ARABIC ">
+        <w:r>
+          <w:rPr>
+            <w:noProof/>
+          </w:rPr>
+          <w:t>7</w:t>
+        </w:r>
+      </w:fldSimple>
       <w:r>
         <w:t xml:space="preserve"> Brainstorming pemilihan kolom menggunakan Notepad</w:t>
       </w:r>
@@ -5015,7 +4911,7 @@
           <w:noProof/>
         </w:rPr>
         <w:drawing>
-          <wp:inline distT="0" distB="0" distL="0" distR="0" wp14:anchorId="3D1861C2" wp14:editId="28468D33">
+          <wp:inline distT="0" distB="0" distL="0" distR="0" wp14:anchorId="3D1861C2" wp14:editId="52E3375B">
             <wp:extent cx="2176464" cy="2160000"/>
             <wp:effectExtent l="19050" t="19050" r="14605" b="12065"/>
             <wp:docPr id="471594841" name="Picture 1"/>
@@ -5078,27 +4974,14 @@
       <w:r>
         <w:t xml:space="preserve">Gambar </w:t>
       </w:r>
-      <w:r>
-        <w:fldChar w:fldCharType="begin"/>
-      </w:r>
-      <w:r>
-        <w:instrText xml:space="preserve"> SEQ Gambar \* ARABIC </w:instrText>
-      </w:r>
-      <w:r>
-        <w:fldChar w:fldCharType="separate"/>
-      </w:r>
-      <w:r>
-        <w:rPr>
-          <w:noProof/>
-        </w:rPr>
-        <w:t>8</w:t>
-      </w:r>
-      <w:r>
-        <w:rPr>
-          <w:noProof/>
-        </w:rPr>
-        <w:fldChar w:fldCharType="end"/>
-      </w:r>
+      <w:fldSimple w:instr=" SEQ Gambar \* ARABIC ">
+        <w:r>
+          <w:rPr>
+            <w:noProof/>
+          </w:rPr>
+          <w:t>8</w:t>
+        </w:r>
+      </w:fldSimple>
       <w:r>
         <w:t xml:space="preserve"> </w:t>
       </w:r>
@@ -5186,27 +5069,14 @@
       <w:r>
         <w:t xml:space="preserve">Gambar </w:t>
       </w:r>
-      <w:r>
-        <w:fldChar w:fldCharType="begin"/>
-      </w:r>
-      <w:r>
-        <w:instrText xml:space="preserve"> SEQ Gambar \* ARABIC </w:instrText>
-      </w:r>
-      <w:r>
-        <w:fldChar w:fldCharType="separate"/>
-      </w:r>
-      <w:r>
-        <w:rPr>
-          <w:noProof/>
-        </w:rPr>
-        <w:t>9</w:t>
-      </w:r>
-      <w:r>
-        <w:rPr>
-          <w:noProof/>
-        </w:rPr>
-        <w:fldChar w:fldCharType="end"/>
-      </w:r>
+      <w:fldSimple w:instr=" SEQ Gambar \* ARABIC ">
+        <w:r>
+          <w:rPr>
+            <w:noProof/>
+          </w:rPr>
+          <w:t>9</w:t>
+        </w:r>
+      </w:fldSimple>
       <w:r>
         <w:t xml:space="preserve"> Hasil realisasi brainstorming pemilihan kolom</w:t>
       </w:r>
@@ -5478,27 +5348,14 @@
       <w:r>
         <w:t xml:space="preserve">Gambar </w:t>
       </w:r>
-      <w:r>
-        <w:fldChar w:fldCharType="begin"/>
-      </w:r>
-      <w:r>
-        <w:instrText xml:space="preserve"> SEQ Gambar \* ARABIC </w:instrText>
-      </w:r>
-      <w:r>
-        <w:fldChar w:fldCharType="separate"/>
-      </w:r>
-      <w:r>
-        <w:rPr>
-          <w:noProof/>
-        </w:rPr>
-        <w:t>10</w:t>
-      </w:r>
-      <w:r>
-        <w:rPr>
-          <w:noProof/>
-        </w:rPr>
-        <w:fldChar w:fldCharType="end"/>
-      </w:r>
+      <w:fldSimple w:instr=" SEQ Gambar \* ARABIC ">
+        <w:r>
+          <w:rPr>
+            <w:noProof/>
+          </w:rPr>
+          <w:t>10</w:t>
+        </w:r>
+      </w:fldSimple>
       <w:r>
         <w:t xml:space="preserve"> Struktrur dataset (data mentah)</w:t>
       </w:r>
@@ -5701,27 +5558,14 @@
       <w:r>
         <w:t xml:space="preserve">Gambar </w:t>
       </w:r>
-      <w:r>
-        <w:fldChar w:fldCharType="begin"/>
-      </w:r>
-      <w:r>
-        <w:instrText xml:space="preserve"> SEQ Gambar \* ARABIC </w:instrText>
-      </w:r>
-      <w:r>
-        <w:fldChar w:fldCharType="separate"/>
-      </w:r>
-      <w:r>
-        <w:rPr>
-          <w:noProof/>
-        </w:rPr>
-        <w:t>11</w:t>
-      </w:r>
-      <w:r>
-        <w:rPr>
-          <w:noProof/>
-        </w:rPr>
-        <w:fldChar w:fldCharType="end"/>
-      </w:r>
+      <w:fldSimple w:instr=" SEQ Gambar \* ARABIC ">
+        <w:r>
+          <w:rPr>
+            <w:noProof/>
+          </w:rPr>
+          <w:t>11</w:t>
+        </w:r>
+      </w:fldSimple>
       <w:r>
         <w:t xml:space="preserve"> Menghitung jumlah data duplikat</w:t>
       </w:r>
@@ -5804,27 +5648,14 @@
       <w:r>
         <w:t xml:space="preserve">Gambar </w:t>
       </w:r>
-      <w:r>
-        <w:fldChar w:fldCharType="begin"/>
-      </w:r>
-      <w:r>
-        <w:instrText xml:space="preserve"> SEQ Gambar \* ARABIC </w:instrText>
-      </w:r>
-      <w:r>
-        <w:fldChar w:fldCharType="separate"/>
-      </w:r>
-      <w:r>
-        <w:rPr>
-          <w:noProof/>
-        </w:rPr>
-        <w:t>12</w:t>
-      </w:r>
-      <w:r>
-        <w:rPr>
-          <w:noProof/>
-        </w:rPr>
-        <w:fldChar w:fldCharType="end"/>
-      </w:r>
+      <w:fldSimple w:instr=" SEQ Gambar \* ARABIC ">
+        <w:r>
+          <w:rPr>
+            <w:noProof/>
+          </w:rPr>
+          <w:t>12</w:t>
+        </w:r>
+      </w:fldSimple>
       <w:r>
         <w:t xml:space="preserve"> Sampel data duplikat</w:t>
       </w:r>
@@ -6024,27 +5855,14 @@
       <w:r>
         <w:t xml:space="preserve">Gambar </w:t>
       </w:r>
-      <w:r>
-        <w:fldChar w:fldCharType="begin"/>
-      </w:r>
-      <w:r>
-        <w:instrText xml:space="preserve"> SEQ Gambar \* ARABIC </w:instrText>
-      </w:r>
-      <w:r>
-        <w:fldChar w:fldCharType="separate"/>
-      </w:r>
-      <w:r>
-        <w:rPr>
-          <w:noProof/>
-        </w:rPr>
-        <w:t>13</w:t>
-      </w:r>
-      <w:r>
-        <w:rPr>
-          <w:noProof/>
-        </w:rPr>
-        <w:fldChar w:fldCharType="end"/>
-      </w:r>
+      <w:fldSimple w:instr=" SEQ Gambar \* ARABIC ">
+        <w:r>
+          <w:rPr>
+            <w:noProof/>
+          </w:rPr>
+          <w:t>13</w:t>
+        </w:r>
+      </w:fldSimple>
       <w:r>
         <w:t xml:space="preserve"> </w:t>
       </w:r>
@@ -6707,27 +6525,14 @@
       <w:r>
         <w:t xml:space="preserve">Gambar </w:t>
       </w:r>
-      <w:r>
-        <w:fldChar w:fldCharType="begin"/>
-      </w:r>
-      <w:r>
-        <w:instrText xml:space="preserve"> SEQ Gambar \* ARABIC </w:instrText>
-      </w:r>
-      <w:r>
-        <w:fldChar w:fldCharType="separate"/>
-      </w:r>
-      <w:r>
-        <w:rPr>
-          <w:noProof/>
-        </w:rPr>
-        <w:t>14</w:t>
-      </w:r>
-      <w:r>
-        <w:rPr>
-          <w:noProof/>
-        </w:rPr>
-        <w:fldChar w:fldCharType="end"/>
-      </w:r>
+      <w:fldSimple w:instr=" SEQ Gambar \* ARABIC ">
+        <w:r>
+          <w:rPr>
+            <w:noProof/>
+          </w:rPr>
+          <w:t>14</w:t>
+        </w:r>
+      </w:fldSimple>
       <w:r>
         <w:t xml:space="preserve"> Distribusi jalur pendaftaran</w:t>
       </w:r>
@@ -6808,27 +6613,14 @@
       <w:r>
         <w:t xml:space="preserve">Gambar </w:t>
       </w:r>
-      <w:r>
-        <w:fldChar w:fldCharType="begin"/>
-      </w:r>
-      <w:r>
-        <w:instrText xml:space="preserve"> SEQ Gambar \* ARABIC </w:instrText>
-      </w:r>
-      <w:r>
-        <w:fldChar w:fldCharType="separate"/>
-      </w:r>
-      <w:r>
-        <w:rPr>
-          <w:noProof/>
-        </w:rPr>
-        <w:t>15</w:t>
-      </w:r>
-      <w:r>
-        <w:rPr>
-          <w:noProof/>
-        </w:rPr>
-        <w:fldChar w:fldCharType="end"/>
-      </w:r>
+      <w:fldSimple w:instr=" SEQ Gambar \* ARABIC ">
+        <w:r>
+          <w:rPr>
+            <w:noProof/>
+          </w:rPr>
+          <w:t>15</w:t>
+        </w:r>
+      </w:fldSimple>
       <w:r>
         <w:t xml:space="preserve"> </w:t>
       </w:r>
@@ -6921,27 +6713,14 @@
       <w:r>
         <w:t xml:space="preserve">Gambar </w:t>
       </w:r>
-      <w:r>
-        <w:fldChar w:fldCharType="begin"/>
-      </w:r>
-      <w:r>
-        <w:instrText xml:space="preserve"> SEQ Gambar \* ARABIC </w:instrText>
-      </w:r>
-      <w:r>
-        <w:fldChar w:fldCharType="separate"/>
-      </w:r>
-      <w:r>
-        <w:rPr>
-          <w:noProof/>
-        </w:rPr>
-        <w:t>16</w:t>
-      </w:r>
-      <w:r>
-        <w:rPr>
-          <w:noProof/>
-        </w:rPr>
-        <w:fldChar w:fldCharType="end"/>
-      </w:r>
+      <w:fldSimple w:instr=" SEQ Gambar \* ARABIC ">
+        <w:r>
+          <w:rPr>
+            <w:noProof/>
+          </w:rPr>
+          <w:t>16</w:t>
+        </w:r>
+      </w:fldSimple>
       <w:r>
         <w:t xml:space="preserve"> Distribusi </w:t>
       </w:r>
@@ -7024,27 +6803,14 @@
       <w:r>
         <w:t xml:space="preserve">Gambar </w:t>
       </w:r>
-      <w:r>
-        <w:fldChar w:fldCharType="begin"/>
-      </w:r>
-      <w:r>
-        <w:instrText xml:space="preserve"> SEQ Gambar \* ARABIC </w:instrText>
-      </w:r>
-      <w:r>
-        <w:fldChar w:fldCharType="separate"/>
-      </w:r>
-      <w:r>
-        <w:rPr>
-          <w:noProof/>
-        </w:rPr>
-        <w:t>17</w:t>
-      </w:r>
-      <w:r>
-        <w:rPr>
-          <w:noProof/>
-        </w:rPr>
-        <w:fldChar w:fldCharType="end"/>
-      </w:r>
+      <w:fldSimple w:instr=" SEQ Gambar \* ARABIC ">
+        <w:r>
+          <w:rPr>
+            <w:noProof/>
+          </w:rPr>
+          <w:t>17</w:t>
+        </w:r>
+      </w:fldSimple>
       <w:r>
         <w:t xml:space="preserve"> Distribusi </w:t>
       </w:r>
@@ -7067,7 +6833,7 @@
         </w:rPr>
         <w:lastRenderedPageBreak/>
         <w:drawing>
-          <wp:inline distT="0" distB="0" distL="0" distR="0" wp14:anchorId="5EBC01C6" wp14:editId="7F48D5FF">
+          <wp:inline distT="0" distB="0" distL="0" distR="0" wp14:anchorId="5EBC01C6" wp14:editId="55A916F9">
             <wp:extent cx="4320000" cy="4658802"/>
             <wp:effectExtent l="0" t="0" r="4445" b="8890"/>
             <wp:docPr id="1878337612" name="Picture 9"/>
@@ -7128,27 +6894,14 @@
       <w:r>
         <w:t xml:space="preserve">Gambar </w:t>
       </w:r>
-      <w:r>
-        <w:fldChar w:fldCharType="begin"/>
-      </w:r>
-      <w:r>
-        <w:instrText xml:space="preserve"> SEQ Gambar \* ARABIC </w:instrText>
-      </w:r>
-      <w:r>
-        <w:fldChar w:fldCharType="separate"/>
-      </w:r>
-      <w:r>
-        <w:rPr>
-          <w:noProof/>
-        </w:rPr>
-        <w:t>18</w:t>
-      </w:r>
-      <w:r>
-        <w:rPr>
-          <w:noProof/>
-        </w:rPr>
-        <w:fldChar w:fldCharType="end"/>
-      </w:r>
+      <w:fldSimple w:instr=" SEQ Gambar \* ARABIC ">
+        <w:r>
+          <w:rPr>
+            <w:noProof/>
+          </w:rPr>
+          <w:t>18</w:t>
+        </w:r>
+      </w:fldSimple>
       <w:r>
         <w:t xml:space="preserve"> Distribusi </w:t>
       </w:r>
@@ -7170,7 +6923,7 @@
           <w:noProof/>
         </w:rPr>
         <w:drawing>
-          <wp:inline distT="0" distB="0" distL="0" distR="0" wp14:anchorId="733B8FED" wp14:editId="758EB87F">
+          <wp:inline distT="0" distB="0" distL="0" distR="0" wp14:anchorId="733B8FED" wp14:editId="4DF89CED">
             <wp:extent cx="4320000" cy="2058826"/>
             <wp:effectExtent l="0" t="0" r="4445" b="0"/>
             <wp:docPr id="55094509" name="Picture 10"/>
@@ -7231,27 +6984,14 @@
       <w:r>
         <w:t xml:space="preserve">Gambar </w:t>
       </w:r>
-      <w:r>
-        <w:fldChar w:fldCharType="begin"/>
-      </w:r>
-      <w:r>
-        <w:instrText xml:space="preserve"> SEQ Gambar \* ARABIC </w:instrText>
-      </w:r>
-      <w:r>
-        <w:fldChar w:fldCharType="separate"/>
-      </w:r>
-      <w:r>
-        <w:rPr>
-          <w:noProof/>
-        </w:rPr>
-        <w:t>19</w:t>
-      </w:r>
-      <w:r>
-        <w:rPr>
-          <w:noProof/>
-        </w:rPr>
-        <w:fldChar w:fldCharType="end"/>
-      </w:r>
+      <w:fldSimple w:instr=" SEQ Gambar \* ARABIC ">
+        <w:r>
+          <w:rPr>
+            <w:noProof/>
+          </w:rPr>
+          <w:t>19</w:t>
+        </w:r>
+      </w:fldSimple>
       <w:r>
         <w:t xml:space="preserve"> Distribusi </w:t>
       </w:r>
@@ -7335,27 +7075,14 @@
       <w:r>
         <w:t xml:space="preserve">Gambar </w:t>
       </w:r>
-      <w:r>
-        <w:fldChar w:fldCharType="begin"/>
-      </w:r>
-      <w:r>
-        <w:instrText xml:space="preserve"> SEQ Gambar \* ARABIC </w:instrText>
-      </w:r>
-      <w:r>
-        <w:fldChar w:fldCharType="separate"/>
-      </w:r>
-      <w:r>
-        <w:rPr>
-          <w:noProof/>
-        </w:rPr>
-        <w:t>20</w:t>
-      </w:r>
-      <w:r>
-        <w:rPr>
-          <w:noProof/>
-        </w:rPr>
-        <w:fldChar w:fldCharType="end"/>
-      </w:r>
+      <w:fldSimple w:instr=" SEQ Gambar \* ARABIC ">
+        <w:r>
+          <w:rPr>
+            <w:noProof/>
+          </w:rPr>
+          <w:t>20</w:t>
+        </w:r>
+      </w:fldSimple>
       <w:r>
         <w:t xml:space="preserve"> Distribusi </w:t>
       </w:r>
@@ -7377,7 +7104,7 @@
           <w:noProof/>
         </w:rPr>
         <w:drawing>
-          <wp:inline distT="0" distB="0" distL="0" distR="0" wp14:anchorId="314D0ACC" wp14:editId="3D4AB1AB">
+          <wp:inline distT="0" distB="0" distL="0" distR="0" wp14:anchorId="314D0ACC" wp14:editId="3ABF0A3D">
             <wp:extent cx="4320000" cy="2070296"/>
             <wp:effectExtent l="0" t="0" r="4445" b="6350"/>
             <wp:docPr id="1341359440" name="Picture 12"/>
@@ -7438,27 +7165,14 @@
       <w:r>
         <w:t xml:space="preserve">Gambar </w:t>
       </w:r>
-      <w:r>
-        <w:fldChar w:fldCharType="begin"/>
-      </w:r>
-      <w:r>
-        <w:instrText xml:space="preserve"> SEQ Gambar \* ARABIC </w:instrText>
-      </w:r>
-      <w:r>
-        <w:fldChar w:fldCharType="separate"/>
-      </w:r>
-      <w:r>
-        <w:rPr>
-          <w:noProof/>
-        </w:rPr>
-        <w:t>21</w:t>
-      </w:r>
-      <w:r>
-        <w:rPr>
-          <w:noProof/>
-        </w:rPr>
-        <w:fldChar w:fldCharType="end"/>
-      </w:r>
+      <w:fldSimple w:instr=" SEQ Gambar \* ARABIC ">
+        <w:r>
+          <w:rPr>
+            <w:noProof/>
+          </w:rPr>
+          <w:t>21</w:t>
+        </w:r>
+      </w:fldSimple>
       <w:r>
         <w:t xml:space="preserve"> Distribusi </w:t>
       </w:r>
@@ -7542,27 +7256,14 @@
       <w:r>
         <w:t xml:space="preserve">Gambar </w:t>
       </w:r>
-      <w:r>
-        <w:fldChar w:fldCharType="begin"/>
-      </w:r>
-      <w:r>
-        <w:instrText xml:space="preserve"> SEQ Gambar \* ARABIC </w:instrText>
-      </w:r>
-      <w:r>
-        <w:fldChar w:fldCharType="separate"/>
-      </w:r>
-      <w:r>
-        <w:rPr>
-          <w:noProof/>
-        </w:rPr>
-        <w:t>22</w:t>
-      </w:r>
-      <w:r>
-        <w:rPr>
-          <w:noProof/>
-        </w:rPr>
-        <w:fldChar w:fldCharType="end"/>
-      </w:r>
+      <w:fldSimple w:instr=" SEQ Gambar \* ARABIC ">
+        <w:r>
+          <w:rPr>
+            <w:noProof/>
+          </w:rPr>
+          <w:t>22</w:t>
+        </w:r>
+      </w:fldSimple>
       <w:r>
         <w:t xml:space="preserve"> Distribusi </w:t>
       </w:r>
@@ -7645,27 +7346,14 @@
       <w:r>
         <w:t xml:space="preserve">Gambar </w:t>
       </w:r>
-      <w:r>
-        <w:fldChar w:fldCharType="begin"/>
-      </w:r>
-      <w:r>
-        <w:instrText xml:space="preserve"> SEQ Gambar \* ARABIC </w:instrText>
-      </w:r>
-      <w:r>
-        <w:fldChar w:fldCharType="separate"/>
-      </w:r>
-      <w:r>
-        <w:rPr>
-          <w:noProof/>
-        </w:rPr>
-        <w:t>23</w:t>
-      </w:r>
-      <w:r>
-        <w:rPr>
-          <w:noProof/>
-        </w:rPr>
-        <w:fldChar w:fldCharType="end"/>
-      </w:r>
+      <w:fldSimple w:instr=" SEQ Gambar \* ARABIC ">
+        <w:r>
+          <w:rPr>
+            <w:noProof/>
+          </w:rPr>
+          <w:t>23</w:t>
+        </w:r>
+      </w:fldSimple>
       <w:r>
         <w:t xml:space="preserve"> Distribusi </w:t>
       </w:r>
@@ -7749,27 +7437,14 @@
       <w:r>
         <w:t xml:space="preserve">Gambar </w:t>
       </w:r>
-      <w:r>
-        <w:fldChar w:fldCharType="begin"/>
-      </w:r>
-      <w:r>
-        <w:instrText xml:space="preserve"> SEQ Gambar \* ARABIC </w:instrText>
-      </w:r>
-      <w:r>
-        <w:fldChar w:fldCharType="separate"/>
-      </w:r>
-      <w:r>
-        <w:rPr>
-          <w:noProof/>
-        </w:rPr>
-        <w:t>24</w:t>
-      </w:r>
-      <w:r>
-        <w:rPr>
-          <w:noProof/>
-        </w:rPr>
-        <w:fldChar w:fldCharType="end"/>
-      </w:r>
+      <w:fldSimple w:instr=" SEQ Gambar \* ARABIC ">
+        <w:r>
+          <w:rPr>
+            <w:noProof/>
+          </w:rPr>
+          <w:t>24</w:t>
+        </w:r>
+      </w:fldSimple>
       <w:r>
         <w:t xml:space="preserve"> Distribusi </w:t>
       </w:r>
@@ -7852,27 +7527,14 @@
       <w:r>
         <w:t xml:space="preserve">Gambar </w:t>
       </w:r>
-      <w:r>
-        <w:fldChar w:fldCharType="begin"/>
-      </w:r>
-      <w:r>
-        <w:instrText xml:space="preserve"> SEQ Gambar \* ARABIC </w:instrText>
-      </w:r>
-      <w:r>
-        <w:fldChar w:fldCharType="separate"/>
-      </w:r>
-      <w:r>
-        <w:rPr>
-          <w:noProof/>
-        </w:rPr>
-        <w:t>25</w:t>
-      </w:r>
-      <w:r>
-        <w:rPr>
-          <w:noProof/>
-        </w:rPr>
-        <w:fldChar w:fldCharType="end"/>
-      </w:r>
+      <w:fldSimple w:instr=" SEQ Gambar \* ARABIC ">
+        <w:r>
+          <w:rPr>
+            <w:noProof/>
+          </w:rPr>
+          <w:t>25</w:t>
+        </w:r>
+      </w:fldSimple>
       <w:r>
         <w:t xml:space="preserve"> Distribusi </w:t>
       </w:r>
@@ -7956,27 +7618,14 @@
       <w:r>
         <w:t xml:space="preserve">Gambar </w:t>
       </w:r>
-      <w:r>
-        <w:fldChar w:fldCharType="begin"/>
-      </w:r>
-      <w:r>
-        <w:instrText xml:space="preserve"> SEQ Gambar \* ARABIC </w:instrText>
-      </w:r>
-      <w:r>
-        <w:fldChar w:fldCharType="separate"/>
-      </w:r>
-      <w:r>
-        <w:rPr>
-          <w:noProof/>
-        </w:rPr>
-        <w:t>26</w:t>
-      </w:r>
-      <w:r>
-        <w:rPr>
-          <w:noProof/>
-        </w:rPr>
-        <w:fldChar w:fldCharType="end"/>
-      </w:r>
+      <w:fldSimple w:instr=" SEQ Gambar \* ARABIC ">
+        <w:r>
+          <w:rPr>
+            <w:noProof/>
+          </w:rPr>
+          <w:t>26</w:t>
+        </w:r>
+      </w:fldSimple>
       <w:r>
         <w:t xml:space="preserve"> Distribusi </w:t>
       </w:r>
@@ -8514,24 +8163,14 @@
       <w:r>
         <w:t xml:space="preserve">Gambar </w:t>
       </w:r>
-      <w:r>
-        <w:fldChar w:fldCharType="begin"/>
-      </w:r>
-      <w:r>
-        <w:instrText xml:space="preserve"> SEQ Gambar \* ARABIC </w:instrText>
-      </w:r>
-      <w:r>
-        <w:fldChar w:fldCharType="separate"/>
-      </w:r>
-      <w:r>
-        <w:rPr>
-          <w:noProof/>
-        </w:rPr>
-        <w:t>27</w:t>
-      </w:r>
-      <w:r>
-        <w:fldChar w:fldCharType="end"/>
-      </w:r>
+      <w:fldSimple w:instr=" SEQ Gambar \* ARABIC ">
+        <w:r>
+          <w:rPr>
+            <w:noProof/>
+          </w:rPr>
+          <w:t>27</w:t>
+        </w:r>
+      </w:fldSimple>
       <w:r>
         <w:t xml:space="preserve"> Validasi ulang struktur data</w:t>
       </w:r>
@@ -8678,24 +8317,14 @@
       <w:r>
         <w:t xml:space="preserve">Gambar </w:t>
       </w:r>
-      <w:r>
-        <w:fldChar w:fldCharType="begin"/>
-      </w:r>
-      <w:r>
-        <w:instrText xml:space="preserve"> SEQ Gambar \* ARABIC </w:instrText>
-      </w:r>
-      <w:r>
-        <w:fldChar w:fldCharType="separate"/>
-      </w:r>
-      <w:r>
-        <w:rPr>
-          <w:noProof/>
-        </w:rPr>
-        <w:t>28</w:t>
-      </w:r>
-      <w:r>
-        <w:fldChar w:fldCharType="end"/>
-      </w:r>
+      <w:fldSimple w:instr=" SEQ Gambar \* ARABIC ">
+        <w:r>
+          <w:rPr>
+            <w:noProof/>
+          </w:rPr>
+          <w:t>28</w:t>
+        </w:r>
+      </w:fldSimple>
       <w:r>
         <w:t xml:space="preserve"> Validasi ulang duplikasi data</w:t>
       </w:r>
@@ -8942,24 +8571,14 @@
       <w:r>
         <w:t xml:space="preserve">Gambar </w:t>
       </w:r>
-      <w:r>
-        <w:fldChar w:fldCharType="begin"/>
-      </w:r>
-      <w:r>
-        <w:instrText xml:space="preserve"> SEQ Gambar \* ARABIC </w:instrText>
-      </w:r>
-      <w:r>
-        <w:fldChar w:fldCharType="separate"/>
-      </w:r>
-      <w:r>
-        <w:rPr>
-          <w:noProof/>
-        </w:rPr>
-        <w:t>29</w:t>
-      </w:r>
-      <w:r>
-        <w:fldChar w:fldCharType="end"/>
-      </w:r>
+      <w:fldSimple w:instr=" SEQ Gambar \* ARABIC ">
+        <w:r>
+          <w:rPr>
+            <w:noProof/>
+          </w:rPr>
+          <w:t>29</w:t>
+        </w:r>
+      </w:fldSimple>
       <w:r>
         <w:t xml:space="preserve"> </w:t>
       </w:r>
@@ -9048,24 +8667,14 @@
       <w:r>
         <w:t xml:space="preserve">Gambar </w:t>
       </w:r>
-      <w:r>
-        <w:fldChar w:fldCharType="begin"/>
-      </w:r>
-      <w:r>
-        <w:instrText xml:space="preserve"> SEQ Gambar \* ARABIC </w:instrText>
-      </w:r>
-      <w:r>
-        <w:fldChar w:fldCharType="separate"/>
-      </w:r>
-      <w:r>
-        <w:rPr>
-          <w:noProof/>
-        </w:rPr>
-        <w:t>30</w:t>
-      </w:r>
-      <w:r>
-        <w:fldChar w:fldCharType="end"/>
-      </w:r>
+      <w:fldSimple w:instr=" SEQ Gambar \* ARABIC ">
+        <w:r>
+          <w:rPr>
+            <w:noProof/>
+          </w:rPr>
+          <w:t>30</w:t>
+        </w:r>
+      </w:fldSimple>
       <w:r>
         <w:t xml:space="preserve"> contoh data</w:t>
       </w:r>
@@ -9248,24 +8857,14 @@
       <w:r>
         <w:t xml:space="preserve">Gambar </w:t>
       </w:r>
-      <w:r>
-        <w:fldChar w:fldCharType="begin"/>
-      </w:r>
-      <w:r>
-        <w:instrText xml:space="preserve"> SEQ Gambar \* ARABIC </w:instrText>
-      </w:r>
-      <w:r>
-        <w:fldChar w:fldCharType="separate"/>
-      </w:r>
-      <w:r>
-        <w:rPr>
-          <w:noProof/>
-        </w:rPr>
-        <w:t>31</w:t>
-      </w:r>
-      <w:r>
-        <w:fldChar w:fldCharType="end"/>
-      </w:r>
+      <w:fldSimple w:instr=" SEQ Gambar \* ARABIC ">
+        <w:r>
+          <w:rPr>
+            <w:noProof/>
+          </w:rPr>
+          <w:t>31</w:t>
+        </w:r>
+      </w:fldSimple>
       <w:r>
         <w:t xml:space="preserve"> validasi ulang distribusi usia</w:t>
       </w:r>
@@ -9342,24 +8941,14 @@
       <w:r>
         <w:t xml:space="preserve">Gambar </w:t>
       </w:r>
-      <w:r>
-        <w:fldChar w:fldCharType="begin"/>
-      </w:r>
-      <w:r>
-        <w:instrText xml:space="preserve"> SEQ Gambar \* ARABIC </w:instrText>
-      </w:r>
-      <w:r>
-        <w:fldChar w:fldCharType="separate"/>
-      </w:r>
-      <w:r>
-        <w:rPr>
-          <w:noProof/>
-        </w:rPr>
-        <w:t>32</w:t>
-      </w:r>
-      <w:r>
-        <w:fldChar w:fldCharType="end"/>
-      </w:r>
+      <w:fldSimple w:instr=" SEQ Gambar \* ARABIC ">
+        <w:r>
+          <w:rPr>
+            <w:noProof/>
+          </w:rPr>
+          <w:t>32</w:t>
+        </w:r>
+      </w:fldSimple>
       <w:r>
         <w:t xml:space="preserve"> validasi ulang fakultas prodi diterima</w:t>
       </w:r>
@@ -9436,24 +9025,14 @@
       <w:r>
         <w:t xml:space="preserve">Gambar </w:t>
       </w:r>
-      <w:r>
-        <w:fldChar w:fldCharType="begin"/>
-      </w:r>
-      <w:r>
-        <w:instrText xml:space="preserve"> SEQ Gambar \* ARABIC </w:instrText>
-      </w:r>
-      <w:r>
-        <w:fldChar w:fldCharType="separate"/>
-      </w:r>
-      <w:r>
-        <w:rPr>
-          <w:noProof/>
-        </w:rPr>
-        <w:t>33</w:t>
-      </w:r>
-      <w:r>
-        <w:fldChar w:fldCharType="end"/>
-      </w:r>
+      <w:fldSimple w:instr=" SEQ Gambar \* ARABIC ">
+        <w:r>
+          <w:rPr>
+            <w:noProof/>
+          </w:rPr>
+          <w:t>33</w:t>
+        </w:r>
+      </w:fldSimple>
       <w:r>
         <w:t xml:space="preserve"> validasi ulang distribusi fakultas prodi 1</w:t>
       </w:r>
@@ -9531,24 +9110,14 @@
       <w:r>
         <w:t xml:space="preserve">Gambar </w:t>
       </w:r>
-      <w:r>
-        <w:fldChar w:fldCharType="begin"/>
-      </w:r>
-      <w:r>
-        <w:instrText xml:space="preserve"> SEQ Gambar \* ARABIC </w:instrText>
-      </w:r>
-      <w:r>
-        <w:fldChar w:fldCharType="separate"/>
-      </w:r>
-      <w:r>
-        <w:rPr>
-          <w:noProof/>
-        </w:rPr>
-        <w:t>34</w:t>
-      </w:r>
-      <w:r>
-        <w:fldChar w:fldCharType="end"/>
-      </w:r>
+      <w:fldSimple w:instr=" SEQ Gambar \* ARABIC ">
+        <w:r>
+          <w:rPr>
+            <w:noProof/>
+          </w:rPr>
+          <w:t>34</w:t>
+        </w:r>
+      </w:fldSimple>
       <w:r>
         <w:t xml:space="preserve"> validasi ulang distribusi fakultas prodi 2</w:t>
       </w:r>
@@ -9625,24 +9194,14 @@
       <w:r>
         <w:t xml:space="preserve">Gambar </w:t>
       </w:r>
-      <w:r>
-        <w:fldChar w:fldCharType="begin"/>
-      </w:r>
-      <w:r>
-        <w:instrText xml:space="preserve"> SEQ Gambar \* ARABIC </w:instrText>
-      </w:r>
-      <w:r>
-        <w:fldChar w:fldCharType="separate"/>
-      </w:r>
-      <w:r>
-        <w:rPr>
-          <w:noProof/>
-        </w:rPr>
-        <w:t>35</w:t>
-      </w:r>
-      <w:r>
-        <w:fldChar w:fldCharType="end"/>
-      </w:r>
+      <w:fldSimple w:instr=" SEQ Gambar \* ARABIC ">
+        <w:r>
+          <w:rPr>
+            <w:noProof/>
+          </w:rPr>
+          <w:t>35</w:t>
+        </w:r>
+      </w:fldSimple>
       <w:r>
         <w:t xml:space="preserve"> validasi ulang distribusi prodi diterima</w:t>
       </w:r>
@@ -9720,24 +9279,14 @@
       <w:r>
         <w:t xml:space="preserve">Gambar </w:t>
       </w:r>
-      <w:r>
-        <w:fldChar w:fldCharType="begin"/>
-      </w:r>
-      <w:r>
-        <w:instrText xml:space="preserve"> SEQ Gambar \* ARABIC </w:instrText>
-      </w:r>
-      <w:r>
-        <w:fldChar w:fldCharType="separate"/>
-      </w:r>
-      <w:r>
-        <w:rPr>
-          <w:noProof/>
-        </w:rPr>
-        <w:t>36</w:t>
-      </w:r>
-      <w:r>
-        <w:fldChar w:fldCharType="end"/>
-      </w:r>
+      <w:fldSimple w:instr=" SEQ Gambar \* ARABIC ">
+        <w:r>
+          <w:rPr>
+            <w:noProof/>
+          </w:rPr>
+          <w:t>36</w:t>
+        </w:r>
+      </w:fldSimple>
       <w:r>
         <w:t xml:space="preserve"> validasi ulang distribusi prodi pilihan 1</w:t>
       </w:r>
@@ -9818,24 +9367,14 @@
       <w:r>
         <w:t xml:space="preserve">Gambar </w:t>
       </w:r>
-      <w:r>
-        <w:fldChar w:fldCharType="begin"/>
-      </w:r>
-      <w:r>
-        <w:instrText xml:space="preserve"> SEQ Gambar \* ARABIC </w:instrText>
-      </w:r>
-      <w:r>
-        <w:fldChar w:fldCharType="separate"/>
-      </w:r>
-      <w:r>
-        <w:rPr>
-          <w:noProof/>
-        </w:rPr>
-        <w:t>37</w:t>
-      </w:r>
-      <w:r>
-        <w:fldChar w:fldCharType="end"/>
-      </w:r>
+      <w:fldSimple w:instr=" SEQ Gambar \* ARABIC ">
+        <w:r>
+          <w:rPr>
+            <w:noProof/>
+          </w:rPr>
+          <w:t>37</w:t>
+        </w:r>
+      </w:fldSimple>
       <w:r>
         <w:t xml:space="preserve"> validasi ulang prodi pilihan 2</w:t>
       </w:r>
@@ -10062,24 +9601,14 @@
       <w:r>
         <w:t xml:space="preserve">Gambar </w:t>
       </w:r>
-      <w:r>
-        <w:fldChar w:fldCharType="begin"/>
-      </w:r>
-      <w:r>
-        <w:instrText xml:space="preserve"> SEQ Gambar \* ARABIC </w:instrText>
-      </w:r>
-      <w:r>
-        <w:fldChar w:fldCharType="separate"/>
-      </w:r>
-      <w:r>
-        <w:rPr>
-          <w:noProof/>
-        </w:rPr>
-        <w:t>38</w:t>
-      </w:r>
-      <w:r>
-        <w:fldChar w:fldCharType="end"/>
-      </w:r>
+      <w:fldSimple w:instr=" SEQ Gambar \* ARABIC ">
+        <w:r>
+          <w:rPr>
+            <w:noProof/>
+          </w:rPr>
+          <w:t>38</w:t>
+        </w:r>
+      </w:fldSimple>
       <w:r>
         <w:t xml:space="preserve"> </w:t>
       </w:r>
@@ -10167,24 +9696,14 @@
       <w:r>
         <w:t xml:space="preserve">Gambar </w:t>
       </w:r>
-      <w:r>
-        <w:fldChar w:fldCharType="begin"/>
-      </w:r>
-      <w:r>
-        <w:instrText xml:space="preserve"> SEQ Gambar \* ARABIC </w:instrText>
-      </w:r>
-      <w:r>
-        <w:fldChar w:fldCharType="separate"/>
-      </w:r>
-      <w:r>
-        <w:rPr>
-          <w:noProof/>
-        </w:rPr>
-        <w:t>39</w:t>
-      </w:r>
-      <w:r>
-        <w:fldChar w:fldCharType="end"/>
-      </w:r>
+      <w:fldSimple w:instr=" SEQ Gambar \* ARABIC ">
+        <w:r>
+          <w:rPr>
+            <w:noProof/>
+          </w:rPr>
+          <w:t>39</w:t>
+        </w:r>
+      </w:fldSimple>
       <w:r>
         <w:t xml:space="preserve"> sintaks pembuatan kolom Provinsi</w:t>
       </w:r>
@@ -10266,24 +9785,14 @@
       <w:r>
         <w:t xml:space="preserve">Gambar </w:t>
       </w:r>
-      <w:r>
-        <w:fldChar w:fldCharType="begin"/>
-      </w:r>
-      <w:r>
-        <w:instrText xml:space="preserve"> SEQ Gambar \* ARABIC </w:instrText>
-      </w:r>
-      <w:r>
-        <w:fldChar w:fldCharType="separate"/>
-      </w:r>
-      <w:r>
-        <w:rPr>
-          <w:noProof/>
-        </w:rPr>
-        <w:t>40</w:t>
-      </w:r>
-      <w:r>
-        <w:fldChar w:fldCharType="end"/>
-      </w:r>
+      <w:fldSimple w:instr=" SEQ Gambar \* ARABIC ">
+        <w:r>
+          <w:rPr>
+            <w:noProof/>
+          </w:rPr>
+          <w:t>40</w:t>
+        </w:r>
+      </w:fldSimple>
       <w:r>
         <w:t xml:space="preserve"> </w:t>
       </w:r>
@@ -10864,7 +10373,15 @@
         <w:rPr>
           <w:rFonts w:ascii="Times New Roman" w:hAnsi="Times New Roman" w:cs="Times New Roman"/>
         </w:rPr>
-        <w:t xml:space="preserve"> Proses pembuatan visualisasi sepenuhnya berdasar pada hasil tahap brainstorming</w:t>
+        <w:t xml:space="preserve"> Proses pembuatan visualisasi sepenuhnya berdasar pada hasil tahap </w:t>
+      </w:r>
+      <w:r>
+        <w:rPr>
+          <w:rFonts w:ascii="Times New Roman" w:hAnsi="Times New Roman" w:cs="Times New Roman"/>
+          <w:i/>
+          <w:iCs/>
+        </w:rPr>
+        <w:t>brainstorming</w:t>
       </w:r>
       <w:r>
         <w:rPr>
@@ -10888,7 +10405,14 @@
         </w:numPr>
       </w:pPr>
       <w:r>
-        <w:t>Dashboard Overview</w:t>
+        <w:rPr>
+          <w:i/>
+          <w:iCs/>
+        </w:rPr>
+        <w:t>Dashboard</w:t>
+      </w:r>
+      <w:r>
+        <w:t xml:space="preserve"> Overview</w:t>
       </w:r>
     </w:p>
     <w:p>
@@ -10969,24 +10493,14 @@
       <w:r>
         <w:t xml:space="preserve">Gambar </w:t>
       </w:r>
-      <w:r>
-        <w:fldChar w:fldCharType="begin"/>
-      </w:r>
-      <w:r>
-        <w:instrText xml:space="preserve"> SEQ Gambar \* ARABIC </w:instrText>
-      </w:r>
-      <w:r>
-        <w:fldChar w:fldCharType="separate"/>
-      </w:r>
-      <w:r>
-        <w:rPr>
-          <w:noProof/>
-        </w:rPr>
-        <w:t>41</w:t>
-      </w:r>
-      <w:r>
-        <w:fldChar w:fldCharType="end"/>
-      </w:r>
+      <w:fldSimple w:instr=" SEQ Gambar \* ARABIC ">
+        <w:r>
+          <w:rPr>
+            <w:noProof/>
+          </w:rPr>
+          <w:t>41</w:t>
+        </w:r>
+      </w:fldSimple>
       <w:r>
         <w:t xml:space="preserve"> dashboard overview</w:t>
       </w:r>
@@ -10996,7 +10510,14 @@
         <w:pStyle w:val="Heading6"/>
       </w:pPr>
       <w:r>
-        <w:t>Dashboard demografi</w:t>
+        <w:rPr>
+          <w:i/>
+          <w:iCs/>
+        </w:rPr>
+        <w:t>Dashboard</w:t>
+      </w:r>
+      <w:r>
+        <w:t xml:space="preserve"> demografi</w:t>
       </w:r>
     </w:p>
     <w:p>
@@ -11076,24 +10597,14 @@
       <w:r>
         <w:t xml:space="preserve">Gambar </w:t>
       </w:r>
-      <w:r>
-        <w:fldChar w:fldCharType="begin"/>
-      </w:r>
-      <w:r>
-        <w:instrText xml:space="preserve"> SEQ Gambar \* ARABIC </w:instrText>
-      </w:r>
-      <w:r>
-        <w:fldChar w:fldCharType="separate"/>
-      </w:r>
-      <w:r>
-        <w:rPr>
-          <w:noProof/>
-        </w:rPr>
-        <w:t>42</w:t>
-      </w:r>
-      <w:r>
-        <w:fldChar w:fldCharType="end"/>
-      </w:r>
+      <w:fldSimple w:instr=" SEQ Gambar \* ARABIC ">
+        <w:r>
+          <w:rPr>
+            <w:noProof/>
+          </w:rPr>
+          <w:t>42</w:t>
+        </w:r>
+      </w:fldSimple>
       <w:r>
         <w:t xml:space="preserve"> dashboard demografi</w:t>
       </w:r>
@@ -11103,7 +10614,14 @@
         <w:pStyle w:val="Heading4"/>
       </w:pPr>
       <w:r>
-        <w:t>Pembuatan Landing Page</w:t>
+        <w:t xml:space="preserve">Pembuatan </w:t>
+      </w:r>
+      <w:r>
+        <w:rPr>
+          <w:i/>
+          <w:iCs w:val="0"/>
+        </w:rPr>
+        <w:t>Landing Page</w:t>
       </w:r>
     </w:p>
     <w:p>
@@ -11117,8 +10635,16 @@
       <w:r>
         <w:rPr>
           <w:rFonts w:ascii="Times New Roman" w:hAnsi="Times New Roman" w:cs="Times New Roman"/>
-        </w:rPr>
-        <w:t>Landing page adalah …</w:t>
+          <w:i/>
+          <w:iCs/>
+        </w:rPr>
+        <w:t>Landing page</w:t>
+      </w:r>
+      <w:r>
+        <w:rPr>
+          <w:rFonts w:ascii="Times New Roman" w:hAnsi="Times New Roman" w:cs="Times New Roman"/>
+        </w:rPr>
+        <w:t xml:space="preserve"> adalah …</w:t>
       </w:r>
       <w:proofErr w:type="gramStart"/>
       <w:r>
@@ -11132,13 +10658,51 @@
         <w:rPr>
           <w:rFonts w:ascii="Times New Roman" w:hAnsi="Times New Roman" w:cs="Times New Roman"/>
         </w:rPr>
-        <w:t xml:space="preserve"> Selain untuk menampung URL menuju dashboard, landing page</w:t>
-      </w:r>
-      <w:r>
-        <w:rPr>
-          <w:rFonts w:ascii="Times New Roman" w:hAnsi="Times New Roman" w:cs="Times New Roman"/>
-        </w:rPr>
-        <w:t xml:space="preserve"> pada proyek</w:t>
+        <w:t xml:space="preserve"> Selain untuk menampung </w:t>
+      </w:r>
+      <w:r>
+        <w:rPr>
+          <w:rFonts w:ascii="Times New Roman" w:hAnsi="Times New Roman" w:cs="Times New Roman"/>
+          <w:i/>
+          <w:iCs/>
+        </w:rPr>
+        <w:t>URL</w:t>
+      </w:r>
+      <w:r>
+        <w:rPr>
+          <w:rFonts w:ascii="Times New Roman" w:hAnsi="Times New Roman" w:cs="Times New Roman"/>
+        </w:rPr>
+        <w:t xml:space="preserve"> menuju </w:t>
+      </w:r>
+      <w:r>
+        <w:rPr>
+          <w:rFonts w:ascii="Times New Roman" w:hAnsi="Times New Roman" w:cs="Times New Roman"/>
+          <w:i/>
+          <w:iCs/>
+        </w:rPr>
+        <w:t>dashboard</w:t>
+      </w:r>
+      <w:r>
+        <w:rPr>
+          <w:rFonts w:ascii="Times New Roman" w:hAnsi="Times New Roman" w:cs="Times New Roman"/>
+          <w:i/>
+          <w:iCs/>
+        </w:rPr>
+        <w:t>, landing page</w:t>
+      </w:r>
+      <w:r>
+        <w:rPr>
+          <w:rFonts w:ascii="Times New Roman" w:hAnsi="Times New Roman" w:cs="Times New Roman"/>
+          <w:i/>
+          <w:iCs/>
+        </w:rPr>
+        <w:t xml:space="preserve"> </w:t>
+      </w:r>
+      <w:r>
+        <w:rPr>
+          <w:rFonts w:ascii="Times New Roman" w:hAnsi="Times New Roman" w:cs="Times New Roman"/>
+        </w:rPr>
+        <w:t>pada proyek</w:t>
       </w:r>
       <w:r>
         <w:rPr>
@@ -11174,7 +10738,15 @@
         <w:rPr>
           <w:rFonts w:ascii="Times New Roman" w:hAnsi="Times New Roman" w:cs="Times New Roman"/>
         </w:rPr>
-        <w:t xml:space="preserve"> cara membaca dashboard</w:t>
+        <w:t xml:space="preserve"> cara membaca </w:t>
+      </w:r>
+      <w:r>
+        <w:rPr>
+          <w:rFonts w:ascii="Times New Roman" w:hAnsi="Times New Roman" w:cs="Times New Roman"/>
+          <w:i/>
+          <w:iCs/>
+        </w:rPr>
+        <w:t>dashboard</w:t>
       </w:r>
       <w:r>
         <w:rPr>
@@ -11190,8 +10762,16 @@
           <w:ilvl w:val="0"/>
           <w:numId w:val="25"/>
         </w:numPr>
-      </w:pPr>
-      <w:r>
+        <w:rPr>
+          <w:i/>
+          <w:iCs/>
+        </w:rPr>
+      </w:pPr>
+      <w:r>
+        <w:rPr>
+          <w:i/>
+          <w:iCs/>
+        </w:rPr>
         <w:lastRenderedPageBreak/>
         <w:t>Brainstorming</w:t>
       </w:r>
@@ -11208,25 +10788,32 @@
         <w:rPr>
           <w:rFonts w:ascii="Times New Roman" w:hAnsi="Times New Roman" w:cs="Times New Roman"/>
         </w:rPr>
-        <w:t>Berikut ini adalah brainstorming untuk landing page pada proyek ini:</w:t>
-      </w:r>
-    </w:p>
-    <w:p>
-      <w:pPr>
-        <w:pStyle w:val="ListParagraph"/>
+        <w:t xml:space="preserve">Berikut ini adalah </w:t>
+      </w:r>
+      <w:r>
+        <w:rPr>
+          <w:rFonts w:ascii="Times New Roman" w:hAnsi="Times New Roman" w:cs="Times New Roman"/>
+          <w:i/>
+          <w:iCs/>
+        </w:rPr>
+        <w:t>brainstorming</w:t>
+      </w:r>
+      <w:r>
+        <w:rPr>
+          <w:rFonts w:ascii="Times New Roman" w:hAnsi="Times New Roman" w:cs="Times New Roman"/>
+        </w:rPr>
+        <w:t xml:space="preserve"> untuk landing page pada proyek ini:</w:t>
+      </w:r>
+    </w:p>
+    <w:p>
+      <w:pPr>
+        <w:pStyle w:val="Heading6"/>
         <w:numPr>
           <w:ilvl w:val="0"/>
-          <w:numId w:val="27"/>
+          <w:numId w:val="29"/>
         </w:numPr>
-        <w:spacing w:line="480" w:lineRule="auto"/>
-        <w:rPr>
-          <w:rFonts w:ascii="Times New Roman" w:hAnsi="Times New Roman" w:cs="Times New Roman"/>
-        </w:rPr>
-      </w:pPr>
-      <w:r>
-        <w:rPr>
-          <w:rFonts w:ascii="Times New Roman" w:hAnsi="Times New Roman" w:cs="Times New Roman"/>
-        </w:rPr>
+      </w:pPr>
+      <w:r>
         <w:t>Halaman Utama</w:t>
       </w:r>
     </w:p>
@@ -11430,20 +11017,9 @@
     </w:p>
     <w:p>
       <w:pPr>
-        <w:pStyle w:val="ListParagraph"/>
-        <w:numPr>
-          <w:ilvl w:val="0"/>
-          <w:numId w:val="27"/>
-        </w:numPr>
-        <w:spacing w:line="480" w:lineRule="auto"/>
-        <w:rPr>
-          <w:rFonts w:ascii="Times New Roman" w:hAnsi="Times New Roman" w:cs="Times New Roman"/>
-        </w:rPr>
-      </w:pPr>
-      <w:r>
-        <w:rPr>
-          <w:rFonts w:ascii="Times New Roman" w:hAnsi="Times New Roman" w:cs="Times New Roman"/>
-        </w:rPr>
+        <w:pStyle w:val="Heading6"/>
+      </w:pPr>
+      <w:r>
         <w:t>Halaman ‘Cara Membaca Dashboard’</w:t>
       </w:r>
     </w:p>
@@ -11532,7 +11108,1649 @@
         <w:rPr>
           <w:rFonts w:ascii="Times New Roman" w:hAnsi="Times New Roman" w:cs="Times New Roman"/>
         </w:rPr>
-        <w:t>sss</w:t>
+        <w:t xml:space="preserve">Berikut ini adalah realisasi dari setiap </w:t>
+      </w:r>
+      <w:r>
+        <w:rPr>
+          <w:rFonts w:ascii="Times New Roman" w:hAnsi="Times New Roman" w:cs="Times New Roman"/>
+          <w:i/>
+          <w:iCs/>
+        </w:rPr>
+        <w:t>brainstorming</w:t>
+      </w:r>
+      <w:r>
+        <w:rPr>
+          <w:rFonts w:ascii="Times New Roman" w:hAnsi="Times New Roman" w:cs="Times New Roman"/>
+        </w:rPr>
+        <w:t xml:space="preserve"> yang telah dibuat:</w:t>
+      </w:r>
+    </w:p>
+    <w:p>
+      <w:pPr>
+        <w:pStyle w:val="Heading6"/>
+        <w:numPr>
+          <w:ilvl w:val="0"/>
+          <w:numId w:val="30"/>
+        </w:numPr>
+      </w:pPr>
+      <w:r>
+        <w:t xml:space="preserve">Halaman </w:t>
+      </w:r>
+      <w:r>
+        <w:t>utama</w:t>
+      </w:r>
+    </w:p>
+    <w:p>
+      <w:pPr>
+        <w:pStyle w:val="ListParagraph"/>
+        <w:numPr>
+          <w:ilvl w:val="1"/>
+          <w:numId w:val="28"/>
+        </w:numPr>
+        <w:spacing w:line="480" w:lineRule="auto"/>
+        <w:rPr>
+          <w:rFonts w:ascii="Times New Roman" w:hAnsi="Times New Roman" w:cs="Times New Roman"/>
+        </w:rPr>
+      </w:pPr>
+      <w:r>
+        <w:rPr>
+          <w:rFonts w:ascii="Times New Roman" w:hAnsi="Times New Roman" w:cs="Times New Roman"/>
+        </w:rPr>
+        <w:t>Bar navigasi</w:t>
+      </w:r>
+    </w:p>
+    <w:p>
+      <w:pPr>
+        <w:pStyle w:val="ListParagraph"/>
+        <w:spacing w:line="480" w:lineRule="auto"/>
+        <w:ind w:left="2160" w:firstLine="720"/>
+        <w:jc w:val="both"/>
+        <w:rPr>
+          <w:rFonts w:ascii="Times New Roman" w:hAnsi="Times New Roman" w:cs="Times New Roman"/>
+        </w:rPr>
+      </w:pPr>
+      <w:r>
+        <w:rPr>
+          <w:rFonts w:ascii="Times New Roman" w:hAnsi="Times New Roman" w:cs="Times New Roman"/>
+        </w:rPr>
+        <w:t>Bar navigasi adalah tempat dimana tombol untuk berpindah halaman berada</w:t>
+      </w:r>
+      <w:r>
+        <w:rPr>
+          <w:rFonts w:ascii="Times New Roman" w:hAnsi="Times New Roman" w:cs="Times New Roman"/>
+        </w:rPr>
+        <w:t xml:space="preserve">. Bar navigasi terdiri dari 3 </w:t>
+      </w:r>
+      <w:r>
+        <w:rPr>
+          <w:rFonts w:ascii="Times New Roman" w:hAnsi="Times New Roman" w:cs="Times New Roman"/>
+        </w:rPr>
+        <w:lastRenderedPageBreak/>
+        <w:t xml:space="preserve">tombol: </w:t>
+      </w:r>
+      <w:r>
+        <w:rPr>
+          <w:rFonts w:ascii="Times New Roman" w:hAnsi="Times New Roman" w:cs="Times New Roman"/>
+        </w:rPr>
+        <w:t xml:space="preserve">tombol menuju halaman utama, </w:t>
+      </w:r>
+      <w:r>
+        <w:rPr>
+          <w:rFonts w:ascii="Times New Roman" w:hAnsi="Times New Roman" w:cs="Times New Roman"/>
+        </w:rPr>
+        <w:t>C</w:t>
+      </w:r>
+      <w:r>
+        <w:rPr>
+          <w:rFonts w:ascii="Times New Roman" w:hAnsi="Times New Roman" w:cs="Times New Roman"/>
+        </w:rPr>
+        <w:t xml:space="preserve">ara </w:t>
+      </w:r>
+      <w:r>
+        <w:rPr>
+          <w:rFonts w:ascii="Times New Roman" w:hAnsi="Times New Roman" w:cs="Times New Roman"/>
+        </w:rPr>
+        <w:t>M</w:t>
+      </w:r>
+      <w:r>
+        <w:rPr>
+          <w:rFonts w:ascii="Times New Roman" w:hAnsi="Times New Roman" w:cs="Times New Roman"/>
+        </w:rPr>
+        <w:t xml:space="preserve">embaca </w:t>
+      </w:r>
+      <w:r>
+        <w:rPr>
+          <w:rFonts w:ascii="Times New Roman" w:hAnsi="Times New Roman" w:cs="Times New Roman"/>
+        </w:rPr>
+        <w:t>D</w:t>
+      </w:r>
+      <w:r>
+        <w:rPr>
+          <w:rFonts w:ascii="Times New Roman" w:hAnsi="Times New Roman" w:cs="Times New Roman"/>
+        </w:rPr>
+        <w:t xml:space="preserve">ashboard, dan </w:t>
+      </w:r>
+      <w:r>
+        <w:rPr>
+          <w:rFonts w:ascii="Times New Roman" w:hAnsi="Times New Roman" w:cs="Times New Roman"/>
+        </w:rPr>
+        <w:t>D</w:t>
+      </w:r>
+      <w:r>
+        <w:rPr>
+          <w:rFonts w:ascii="Times New Roman" w:hAnsi="Times New Roman" w:cs="Times New Roman"/>
+        </w:rPr>
+        <w:t xml:space="preserve">ashboard </w:t>
+      </w:r>
+      <w:r>
+        <w:rPr>
+          <w:rFonts w:ascii="Times New Roman" w:hAnsi="Times New Roman" w:cs="Times New Roman"/>
+        </w:rPr>
+        <w:t>V</w:t>
+      </w:r>
+      <w:r>
+        <w:rPr>
+          <w:rFonts w:ascii="Times New Roman" w:hAnsi="Times New Roman" w:cs="Times New Roman"/>
+        </w:rPr>
+        <w:t>isualisasi</w:t>
+      </w:r>
+      <w:r>
+        <w:rPr>
+          <w:rFonts w:ascii="Times New Roman" w:hAnsi="Times New Roman" w:cs="Times New Roman"/>
+        </w:rPr>
+        <w:t>.</w:t>
+      </w:r>
+    </w:p>
+    <w:p>
+      <w:pPr>
+        <w:pStyle w:val="ListParagraph"/>
+        <w:keepNext/>
+        <w:spacing w:line="480" w:lineRule="auto"/>
+        <w:ind w:left="2160"/>
+        <w:jc w:val="center"/>
+      </w:pPr>
+      <w:r>
+        <w:rPr>
+          <w:rFonts w:ascii="Times New Roman" w:hAnsi="Times New Roman" w:cs="Times New Roman"/>
+          <w:noProof/>
+        </w:rPr>
+        <w:drawing>
+          <wp:inline distT="0" distB="0" distL="0" distR="0" wp14:anchorId="44B3BE65" wp14:editId="3F9396ED">
+            <wp:extent cx="3960000" cy="2106500"/>
+            <wp:effectExtent l="19050" t="19050" r="21590" b="27305"/>
+            <wp:docPr id="379771780" name="Picture 1"/>
+            <wp:cNvGraphicFramePr>
+              <a:graphicFrameLocks xmlns:a="http://schemas.openxmlformats.org/drawingml/2006/main" noChangeAspect="1"/>
+            </wp:cNvGraphicFramePr>
+            <a:graphic xmlns:a="http://schemas.openxmlformats.org/drawingml/2006/main">
+              <a:graphicData uri="http://schemas.openxmlformats.org/drawingml/2006/picture">
+                <pic:pic xmlns:pic="http://schemas.openxmlformats.org/drawingml/2006/picture">
+                  <pic:nvPicPr>
+                    <pic:cNvPr id="0" name="Picture 1"/>
+                    <pic:cNvPicPr>
+                      <a:picLocks noChangeAspect="1" noChangeArrowheads="1"/>
+                    </pic:cNvPicPr>
+                  </pic:nvPicPr>
+                  <pic:blipFill>
+                    <a:blip r:embed="rId50" cstate="print">
+                      <a:extLst>
+                        <a:ext uri="{28A0092B-C50C-407E-A947-70E740481C1C}">
+                          <a14:useLocalDpi xmlns:a14="http://schemas.microsoft.com/office/drawing/2010/main" val="0"/>
+                        </a:ext>
+                      </a:extLst>
+                    </a:blip>
+                    <a:srcRect/>
+                    <a:stretch>
+                      <a:fillRect/>
+                    </a:stretch>
+                  </pic:blipFill>
+                  <pic:spPr bwMode="auto">
+                    <a:xfrm>
+                      <a:off x="0" y="0"/>
+                      <a:ext cx="3960000" cy="2106500"/>
+                    </a:xfrm>
+                    <a:prstGeom prst="rect">
+                      <a:avLst/>
+                    </a:prstGeom>
+                    <a:noFill/>
+                    <a:ln w="12700">
+                      <a:solidFill>
+                        <a:schemeClr val="accent1"/>
+                      </a:solidFill>
+                    </a:ln>
+                  </pic:spPr>
+                </pic:pic>
+              </a:graphicData>
+            </a:graphic>
+          </wp:inline>
+        </w:drawing>
+      </w:r>
+    </w:p>
+    <w:p>
+      <w:pPr>
+        <w:pStyle w:val="Caption"/>
+        <w:spacing w:line="480" w:lineRule="auto"/>
+        <w:jc w:val="center"/>
+        <w:rPr>
+          <w:rFonts w:ascii="Times New Roman" w:hAnsi="Times New Roman" w:cs="Times New Roman"/>
+        </w:rPr>
+      </w:pPr>
+      <w:r>
+        <w:t xml:space="preserve">Gambar </w:t>
+      </w:r>
+      <w:fldSimple w:instr=" SEQ Gambar \* ARABIC ">
+        <w:r>
+          <w:rPr>
+            <w:noProof/>
+          </w:rPr>
+          <w:t>43</w:t>
+        </w:r>
+      </w:fldSimple>
+      <w:r>
+        <w:t xml:space="preserve"> bar navigasi halaman utama</w:t>
+      </w:r>
+    </w:p>
+    <w:p>
+      <w:pPr>
+        <w:pStyle w:val="ListParagraph"/>
+        <w:numPr>
+          <w:ilvl w:val="1"/>
+          <w:numId w:val="28"/>
+        </w:numPr>
+        <w:spacing w:line="480" w:lineRule="auto"/>
+        <w:rPr>
+          <w:rFonts w:ascii="Times New Roman" w:hAnsi="Times New Roman" w:cs="Times New Roman"/>
+        </w:rPr>
+      </w:pPr>
+      <w:r>
+        <w:rPr>
+          <w:rFonts w:ascii="Times New Roman" w:hAnsi="Times New Roman" w:cs="Times New Roman"/>
+        </w:rPr>
+        <w:t>Judul proyek</w:t>
+      </w:r>
+    </w:p>
+    <w:p>
+      <w:pPr>
+        <w:pStyle w:val="ListParagraph"/>
+        <w:spacing w:line="480" w:lineRule="auto"/>
+        <w:ind w:left="2160" w:firstLine="720"/>
+        <w:jc w:val="both"/>
+        <w:rPr>
+          <w:rFonts w:ascii="Times New Roman" w:hAnsi="Times New Roman" w:cs="Times New Roman"/>
+        </w:rPr>
+      </w:pPr>
+      <w:r>
+        <w:rPr>
+          <w:rFonts w:ascii="Times New Roman" w:hAnsi="Times New Roman" w:cs="Times New Roman"/>
+        </w:rPr>
+        <w:t>Bagian ini dirancang sebagai tempat penampungan judul proyek</w:t>
+      </w:r>
+      <w:r>
+        <w:rPr>
+          <w:rFonts w:ascii="Times New Roman" w:hAnsi="Times New Roman" w:cs="Times New Roman"/>
+        </w:rPr>
+        <w:t>.</w:t>
+      </w:r>
+    </w:p>
+    <w:p>
+      <w:pPr>
+        <w:pStyle w:val="ListParagraph"/>
+        <w:keepNext/>
+        <w:spacing w:line="480" w:lineRule="auto"/>
+        <w:ind w:left="2160"/>
+        <w:jc w:val="center"/>
+      </w:pPr>
+      <w:r>
+        <w:rPr>
+          <w:rFonts w:ascii="Times New Roman" w:hAnsi="Times New Roman" w:cs="Times New Roman"/>
+          <w:noProof/>
+        </w:rPr>
+        <w:drawing>
+          <wp:inline distT="0" distB="0" distL="0" distR="0" wp14:anchorId="36A105A2" wp14:editId="23421EE3">
+            <wp:extent cx="3960000" cy="2106500"/>
+            <wp:effectExtent l="19050" t="19050" r="21590" b="27305"/>
+            <wp:docPr id="1628000398" name="Picture 2"/>
+            <wp:cNvGraphicFramePr>
+              <a:graphicFrameLocks xmlns:a="http://schemas.openxmlformats.org/drawingml/2006/main" noChangeAspect="1"/>
+            </wp:cNvGraphicFramePr>
+            <a:graphic xmlns:a="http://schemas.openxmlformats.org/drawingml/2006/main">
+              <a:graphicData uri="http://schemas.openxmlformats.org/drawingml/2006/picture">
+                <pic:pic xmlns:pic="http://schemas.openxmlformats.org/drawingml/2006/picture">
+                  <pic:nvPicPr>
+                    <pic:cNvPr id="0" name="Picture 2"/>
+                    <pic:cNvPicPr>
+                      <a:picLocks noChangeAspect="1" noChangeArrowheads="1"/>
+                    </pic:cNvPicPr>
+                  </pic:nvPicPr>
+                  <pic:blipFill>
+                    <a:blip r:embed="rId51" cstate="print">
+                      <a:extLst>
+                        <a:ext uri="{28A0092B-C50C-407E-A947-70E740481C1C}">
+                          <a14:useLocalDpi xmlns:a14="http://schemas.microsoft.com/office/drawing/2010/main" val="0"/>
+                        </a:ext>
+                      </a:extLst>
+                    </a:blip>
+                    <a:srcRect/>
+                    <a:stretch>
+                      <a:fillRect/>
+                    </a:stretch>
+                  </pic:blipFill>
+                  <pic:spPr bwMode="auto">
+                    <a:xfrm>
+                      <a:off x="0" y="0"/>
+                      <a:ext cx="3960000" cy="2106500"/>
+                    </a:xfrm>
+                    <a:prstGeom prst="rect">
+                      <a:avLst/>
+                    </a:prstGeom>
+                    <a:noFill/>
+                    <a:ln w="12700">
+                      <a:solidFill>
+                        <a:schemeClr val="tx1"/>
+                      </a:solidFill>
+                    </a:ln>
+                  </pic:spPr>
+                </pic:pic>
+              </a:graphicData>
+            </a:graphic>
+          </wp:inline>
+        </w:drawing>
+      </w:r>
+    </w:p>
+    <w:p>
+      <w:pPr>
+        <w:pStyle w:val="Caption"/>
+        <w:spacing w:line="480" w:lineRule="auto"/>
+        <w:jc w:val="center"/>
+        <w:rPr>
+          <w:rFonts w:ascii="Times New Roman" w:hAnsi="Times New Roman" w:cs="Times New Roman"/>
+        </w:rPr>
+      </w:pPr>
+      <w:r>
+        <w:t xml:space="preserve">Gambar </w:t>
+      </w:r>
+      <w:fldSimple w:instr=" SEQ Gambar \* ARABIC ">
+        <w:r>
+          <w:rPr>
+            <w:noProof/>
+          </w:rPr>
+          <w:t>44</w:t>
+        </w:r>
+      </w:fldSimple>
+      <w:r>
+        <w:t xml:space="preserve"> judul proyek</w:t>
+      </w:r>
+      <w:r>
+        <w:rPr>
+          <w:noProof/>
+        </w:rPr>
+        <w:t xml:space="preserve"> pada halaman utama</w:t>
+      </w:r>
+    </w:p>
+    <w:p>
+      <w:pPr>
+        <w:pStyle w:val="ListParagraph"/>
+        <w:numPr>
+          <w:ilvl w:val="1"/>
+          <w:numId w:val="28"/>
+        </w:numPr>
+        <w:spacing w:line="480" w:lineRule="auto"/>
+        <w:rPr>
+          <w:rFonts w:ascii="Times New Roman" w:hAnsi="Times New Roman" w:cs="Times New Roman"/>
+        </w:rPr>
+      </w:pPr>
+      <w:r>
+        <w:rPr>
+          <w:rFonts w:ascii="Times New Roman" w:hAnsi="Times New Roman" w:cs="Times New Roman"/>
+        </w:rPr>
+        <w:t>Permasalahan, tujuan, dan manfaat</w:t>
+      </w:r>
+    </w:p>
+    <w:p>
+      <w:pPr>
+        <w:pStyle w:val="ListParagraph"/>
+        <w:spacing w:line="480" w:lineRule="auto"/>
+        <w:ind w:left="2160" w:firstLine="720"/>
+        <w:jc w:val="both"/>
+        <w:rPr>
+          <w:rFonts w:ascii="Times New Roman" w:hAnsi="Times New Roman" w:cs="Times New Roman"/>
+        </w:rPr>
+      </w:pPr>
+      <w:r>
+        <w:rPr>
+          <w:rFonts w:ascii="Times New Roman" w:hAnsi="Times New Roman" w:cs="Times New Roman"/>
+        </w:rPr>
+        <w:lastRenderedPageBreak/>
+        <w:t>Bagian ini dirancang untuk menampung permasalahan, tujuan, dan manfaat proyek ini secara singkat</w:t>
+      </w:r>
+      <w:r>
+        <w:rPr>
+          <w:rFonts w:ascii="Times New Roman" w:hAnsi="Times New Roman" w:cs="Times New Roman"/>
+        </w:rPr>
+        <w:t>.</w:t>
+      </w:r>
+    </w:p>
+    <w:p>
+      <w:pPr>
+        <w:pStyle w:val="ListParagraph"/>
+        <w:keepNext/>
+        <w:spacing w:line="480" w:lineRule="auto"/>
+        <w:ind w:left="2160"/>
+        <w:jc w:val="center"/>
+      </w:pPr>
+      <w:r>
+        <w:rPr>
+          <w:rFonts w:ascii="Times New Roman" w:hAnsi="Times New Roman" w:cs="Times New Roman"/>
+          <w:noProof/>
+        </w:rPr>
+        <w:drawing>
+          <wp:inline distT="0" distB="0" distL="0" distR="0" wp14:anchorId="15C1CDAC" wp14:editId="090FA1E7">
+            <wp:extent cx="3960000" cy="2106500"/>
+            <wp:effectExtent l="19050" t="19050" r="21590" b="27305"/>
+            <wp:docPr id="129654097" name="Picture 3"/>
+            <wp:cNvGraphicFramePr>
+              <a:graphicFrameLocks xmlns:a="http://schemas.openxmlformats.org/drawingml/2006/main" noChangeAspect="1"/>
+            </wp:cNvGraphicFramePr>
+            <a:graphic xmlns:a="http://schemas.openxmlformats.org/drawingml/2006/main">
+              <a:graphicData uri="http://schemas.openxmlformats.org/drawingml/2006/picture">
+                <pic:pic xmlns:pic="http://schemas.openxmlformats.org/drawingml/2006/picture">
+                  <pic:nvPicPr>
+                    <pic:cNvPr id="0" name="Picture 3"/>
+                    <pic:cNvPicPr>
+                      <a:picLocks noChangeAspect="1" noChangeArrowheads="1"/>
+                    </pic:cNvPicPr>
+                  </pic:nvPicPr>
+                  <pic:blipFill>
+                    <a:blip r:embed="rId52" cstate="print">
+                      <a:extLst>
+                        <a:ext uri="{28A0092B-C50C-407E-A947-70E740481C1C}">
+                          <a14:useLocalDpi xmlns:a14="http://schemas.microsoft.com/office/drawing/2010/main" val="0"/>
+                        </a:ext>
+                      </a:extLst>
+                    </a:blip>
+                    <a:srcRect/>
+                    <a:stretch>
+                      <a:fillRect/>
+                    </a:stretch>
+                  </pic:blipFill>
+                  <pic:spPr bwMode="auto">
+                    <a:xfrm>
+                      <a:off x="0" y="0"/>
+                      <a:ext cx="3960000" cy="2106500"/>
+                    </a:xfrm>
+                    <a:prstGeom prst="rect">
+                      <a:avLst/>
+                    </a:prstGeom>
+                    <a:noFill/>
+                    <a:ln w="12700">
+                      <a:solidFill>
+                        <a:schemeClr val="tx1"/>
+                      </a:solidFill>
+                    </a:ln>
+                  </pic:spPr>
+                </pic:pic>
+              </a:graphicData>
+            </a:graphic>
+          </wp:inline>
+        </w:drawing>
+      </w:r>
+    </w:p>
+    <w:p>
+      <w:pPr>
+        <w:pStyle w:val="Caption"/>
+        <w:spacing w:line="480" w:lineRule="auto"/>
+        <w:jc w:val="center"/>
+        <w:rPr>
+          <w:rFonts w:ascii="Times New Roman" w:hAnsi="Times New Roman" w:cs="Times New Roman"/>
+        </w:rPr>
+      </w:pPr>
+      <w:r>
+        <w:t xml:space="preserve">Gambar </w:t>
+      </w:r>
+      <w:fldSimple w:instr=" SEQ Gambar \* ARABIC ">
+        <w:r>
+          <w:rPr>
+            <w:noProof/>
+          </w:rPr>
+          <w:t>45</w:t>
+        </w:r>
+      </w:fldSimple>
+      <w:r>
+        <w:t xml:space="preserve"> permasalahan, tujuan, dan manfaat pada halaman utama</w:t>
+      </w:r>
+    </w:p>
+    <w:p>
+      <w:pPr>
+        <w:pStyle w:val="ListParagraph"/>
+        <w:numPr>
+          <w:ilvl w:val="1"/>
+          <w:numId w:val="28"/>
+        </w:numPr>
+        <w:spacing w:line="480" w:lineRule="auto"/>
+        <w:rPr>
+          <w:rFonts w:ascii="Times New Roman" w:hAnsi="Times New Roman" w:cs="Times New Roman"/>
+        </w:rPr>
+      </w:pPr>
+      <w:r>
+        <w:rPr>
+          <w:rFonts w:ascii="Times New Roman" w:hAnsi="Times New Roman" w:cs="Times New Roman"/>
+          <w:i/>
+          <w:iCs/>
+        </w:rPr>
+        <w:t>Data pipeline</w:t>
+      </w:r>
+      <w:r>
+        <w:rPr>
+          <w:rFonts w:ascii="Times New Roman" w:hAnsi="Times New Roman" w:cs="Times New Roman"/>
+        </w:rPr>
+        <w:t xml:space="preserve"> utama</w:t>
+      </w:r>
+    </w:p>
+    <w:p>
+      <w:pPr>
+        <w:pStyle w:val="ListParagraph"/>
+        <w:spacing w:line="480" w:lineRule="auto"/>
+        <w:ind w:left="2160" w:firstLine="720"/>
+        <w:jc w:val="both"/>
+        <w:rPr>
+          <w:rFonts w:ascii="Times New Roman" w:hAnsi="Times New Roman" w:cs="Times New Roman"/>
+        </w:rPr>
+      </w:pPr>
+      <w:r>
+        <w:rPr>
+          <w:rFonts w:ascii="Times New Roman" w:hAnsi="Times New Roman" w:cs="Times New Roman"/>
+        </w:rPr>
+        <w:t xml:space="preserve">Bagian ini dirancang untuk memberikan pemahaman </w:t>
+      </w:r>
+      <w:r>
+        <w:rPr>
+          <w:rFonts w:ascii="Times New Roman" w:hAnsi="Times New Roman" w:cs="Times New Roman"/>
+        </w:rPr>
+        <w:t xml:space="preserve">singkat </w:t>
+      </w:r>
+      <w:r>
+        <w:rPr>
+          <w:rFonts w:ascii="Times New Roman" w:hAnsi="Times New Roman" w:cs="Times New Roman"/>
+        </w:rPr>
+        <w:t>terkait aliran data</w:t>
+      </w:r>
+      <w:r>
+        <w:rPr>
+          <w:rFonts w:ascii="Times New Roman" w:hAnsi="Times New Roman" w:cs="Times New Roman"/>
+        </w:rPr>
+        <w:t xml:space="preserve"> pada proyek ini</w:t>
+      </w:r>
+      <w:r>
+        <w:rPr>
+          <w:rFonts w:ascii="Times New Roman" w:hAnsi="Times New Roman" w:cs="Times New Roman"/>
+        </w:rPr>
+        <w:t xml:space="preserve"> dari sumber data hingga data itu dikonsumsi.</w:t>
+      </w:r>
+    </w:p>
+    <w:p>
+      <w:pPr>
+        <w:pStyle w:val="ListParagraph"/>
+        <w:keepNext/>
+        <w:spacing w:line="480" w:lineRule="auto"/>
+        <w:ind w:left="2160"/>
+        <w:jc w:val="center"/>
+      </w:pPr>
+      <w:r>
+        <w:rPr>
+          <w:rFonts w:ascii="Times New Roman" w:hAnsi="Times New Roman" w:cs="Times New Roman"/>
+          <w:noProof/>
+        </w:rPr>
+        <w:drawing>
+          <wp:inline distT="0" distB="0" distL="0" distR="0" wp14:anchorId="77902E91" wp14:editId="03D86B52">
+            <wp:extent cx="3960000" cy="2104500"/>
+            <wp:effectExtent l="19050" t="19050" r="21590" b="10160"/>
+            <wp:docPr id="803523497" name="Picture 4"/>
+            <wp:cNvGraphicFramePr>
+              <a:graphicFrameLocks xmlns:a="http://schemas.openxmlformats.org/drawingml/2006/main" noChangeAspect="1"/>
+            </wp:cNvGraphicFramePr>
+            <a:graphic xmlns:a="http://schemas.openxmlformats.org/drawingml/2006/main">
+              <a:graphicData uri="http://schemas.openxmlformats.org/drawingml/2006/picture">
+                <pic:pic xmlns:pic="http://schemas.openxmlformats.org/drawingml/2006/picture">
+                  <pic:nvPicPr>
+                    <pic:cNvPr id="0" name="Picture 4"/>
+                    <pic:cNvPicPr>
+                      <a:picLocks noChangeAspect="1" noChangeArrowheads="1"/>
+                    </pic:cNvPicPr>
+                  </pic:nvPicPr>
+                  <pic:blipFill>
+                    <a:blip r:embed="rId53" cstate="print">
+                      <a:extLst>
+                        <a:ext uri="{28A0092B-C50C-407E-A947-70E740481C1C}">
+                          <a14:useLocalDpi xmlns:a14="http://schemas.microsoft.com/office/drawing/2010/main" val="0"/>
+                        </a:ext>
+                      </a:extLst>
+                    </a:blip>
+                    <a:srcRect/>
+                    <a:stretch>
+                      <a:fillRect/>
+                    </a:stretch>
+                  </pic:blipFill>
+                  <pic:spPr bwMode="auto">
+                    <a:xfrm>
+                      <a:off x="0" y="0"/>
+                      <a:ext cx="3960000" cy="2104500"/>
+                    </a:xfrm>
+                    <a:prstGeom prst="rect">
+                      <a:avLst/>
+                    </a:prstGeom>
+                    <a:noFill/>
+                    <a:ln w="12700">
+                      <a:solidFill>
+                        <a:schemeClr val="accent1"/>
+                      </a:solidFill>
+                    </a:ln>
+                  </pic:spPr>
+                </pic:pic>
+              </a:graphicData>
+            </a:graphic>
+          </wp:inline>
+        </w:drawing>
+      </w:r>
+    </w:p>
+    <w:p>
+      <w:pPr>
+        <w:pStyle w:val="Caption"/>
+        <w:spacing w:line="480" w:lineRule="auto"/>
+        <w:jc w:val="center"/>
+        <w:rPr>
+          <w:rFonts w:ascii="Times New Roman" w:hAnsi="Times New Roman" w:cs="Times New Roman"/>
+        </w:rPr>
+      </w:pPr>
+      <w:r>
+        <w:t xml:space="preserve">Gambar </w:t>
+      </w:r>
+      <w:fldSimple w:instr=" SEQ Gambar \* ARABIC ">
+        <w:r>
+          <w:rPr>
+            <w:noProof/>
+          </w:rPr>
+          <w:t>46</w:t>
+        </w:r>
+      </w:fldSimple>
+      <w:r>
+        <w:t xml:space="preserve"> data pipeline pada halaman utama</w:t>
+      </w:r>
+    </w:p>
+    <w:p>
+      <w:pPr>
+        <w:pStyle w:val="ListParagraph"/>
+        <w:numPr>
+          <w:ilvl w:val="1"/>
+          <w:numId w:val="28"/>
+        </w:numPr>
+        <w:spacing w:line="480" w:lineRule="auto"/>
+        <w:rPr>
+          <w:rFonts w:ascii="Times New Roman" w:hAnsi="Times New Roman" w:cs="Times New Roman"/>
+        </w:rPr>
+      </w:pPr>
+      <w:r>
+        <w:rPr>
+          <w:rFonts w:ascii="Times New Roman" w:hAnsi="Times New Roman" w:cs="Times New Roman"/>
+          <w:i/>
+          <w:iCs/>
+        </w:rPr>
+        <w:t>Funfact</w:t>
+      </w:r>
+      <w:r>
+        <w:rPr>
+          <w:rFonts w:ascii="Times New Roman" w:hAnsi="Times New Roman" w:cs="Times New Roman"/>
+        </w:rPr>
+        <w:t xml:space="preserve"> dalam </w:t>
+      </w:r>
+      <w:r>
+        <w:rPr>
+          <w:rFonts w:ascii="Times New Roman" w:hAnsi="Times New Roman" w:cs="Times New Roman"/>
+          <w:i/>
+          <w:iCs/>
+        </w:rPr>
+        <w:t>dataset</w:t>
+      </w:r>
+    </w:p>
+    <w:p>
+      <w:pPr>
+        <w:pStyle w:val="ListParagraph"/>
+        <w:spacing w:line="480" w:lineRule="auto"/>
+        <w:ind w:left="2160" w:firstLine="720"/>
+        <w:jc w:val="both"/>
+        <w:rPr>
+          <w:rFonts w:ascii="Times New Roman" w:hAnsi="Times New Roman" w:cs="Times New Roman"/>
+        </w:rPr>
+      </w:pPr>
+      <w:r>
+        <w:rPr>
+          <w:rFonts w:ascii="Times New Roman" w:hAnsi="Times New Roman" w:cs="Times New Roman"/>
+        </w:rPr>
+        <w:lastRenderedPageBreak/>
+        <w:t xml:space="preserve">Bagian ini dirancang untuk memberikan beberapa </w:t>
+      </w:r>
+      <w:r>
+        <w:rPr>
+          <w:rFonts w:ascii="Times New Roman" w:hAnsi="Times New Roman" w:cs="Times New Roman"/>
+          <w:i/>
+          <w:iCs/>
+        </w:rPr>
+        <w:t>funfact</w:t>
+      </w:r>
+      <w:r>
+        <w:rPr>
+          <w:rFonts w:ascii="Times New Roman" w:hAnsi="Times New Roman" w:cs="Times New Roman"/>
+        </w:rPr>
+        <w:t xml:space="preserve"> tentang dataset yang digunakan pada proyek ini.</w:t>
+      </w:r>
+    </w:p>
+    <w:p>
+      <w:pPr>
+        <w:pStyle w:val="ListParagraph"/>
+        <w:keepNext/>
+        <w:spacing w:line="480" w:lineRule="auto"/>
+        <w:ind w:left="2160"/>
+        <w:jc w:val="center"/>
+      </w:pPr>
+      <w:r>
+        <w:rPr>
+          <w:rFonts w:ascii="Times New Roman" w:hAnsi="Times New Roman" w:cs="Times New Roman"/>
+          <w:noProof/>
+        </w:rPr>
+        <w:drawing>
+          <wp:inline distT="0" distB="0" distL="0" distR="0" wp14:anchorId="35CB2379" wp14:editId="6AC7FC5A">
+            <wp:extent cx="3960000" cy="2104500"/>
+            <wp:effectExtent l="19050" t="19050" r="21590" b="10160"/>
+            <wp:docPr id="314713122" name="Picture 5"/>
+            <wp:cNvGraphicFramePr>
+              <a:graphicFrameLocks xmlns:a="http://schemas.openxmlformats.org/drawingml/2006/main" noChangeAspect="1"/>
+            </wp:cNvGraphicFramePr>
+            <a:graphic xmlns:a="http://schemas.openxmlformats.org/drawingml/2006/main">
+              <a:graphicData uri="http://schemas.openxmlformats.org/drawingml/2006/picture">
+                <pic:pic xmlns:pic="http://schemas.openxmlformats.org/drawingml/2006/picture">
+                  <pic:nvPicPr>
+                    <pic:cNvPr id="0" name="Picture 5"/>
+                    <pic:cNvPicPr>
+                      <a:picLocks noChangeAspect="1" noChangeArrowheads="1"/>
+                    </pic:cNvPicPr>
+                  </pic:nvPicPr>
+                  <pic:blipFill>
+                    <a:blip r:embed="rId54" cstate="print">
+                      <a:extLst>
+                        <a:ext uri="{28A0092B-C50C-407E-A947-70E740481C1C}">
+                          <a14:useLocalDpi xmlns:a14="http://schemas.microsoft.com/office/drawing/2010/main" val="0"/>
+                        </a:ext>
+                      </a:extLst>
+                    </a:blip>
+                    <a:srcRect/>
+                    <a:stretch>
+                      <a:fillRect/>
+                    </a:stretch>
+                  </pic:blipFill>
+                  <pic:spPr bwMode="auto">
+                    <a:xfrm>
+                      <a:off x="0" y="0"/>
+                      <a:ext cx="3960000" cy="2104500"/>
+                    </a:xfrm>
+                    <a:prstGeom prst="rect">
+                      <a:avLst/>
+                    </a:prstGeom>
+                    <a:noFill/>
+                    <a:ln w="12700">
+                      <a:solidFill>
+                        <a:schemeClr val="tx1"/>
+                      </a:solidFill>
+                    </a:ln>
+                  </pic:spPr>
+                </pic:pic>
+              </a:graphicData>
+            </a:graphic>
+          </wp:inline>
+        </w:drawing>
+      </w:r>
+    </w:p>
+    <w:p>
+      <w:pPr>
+        <w:pStyle w:val="Caption"/>
+        <w:spacing w:line="480" w:lineRule="auto"/>
+        <w:jc w:val="center"/>
+        <w:rPr>
+          <w:rFonts w:ascii="Times New Roman" w:hAnsi="Times New Roman" w:cs="Times New Roman"/>
+        </w:rPr>
+      </w:pPr>
+      <w:r>
+        <w:t xml:space="preserve">Gambar </w:t>
+      </w:r>
+      <w:fldSimple w:instr=" SEQ Gambar \* ARABIC ">
+        <w:r>
+          <w:rPr>
+            <w:noProof/>
+          </w:rPr>
+          <w:t>47</w:t>
+        </w:r>
+      </w:fldSimple>
+      <w:r>
+        <w:t xml:space="preserve"> funfact pada halaman utama</w:t>
+      </w:r>
+    </w:p>
+    <w:p>
+      <w:pPr>
+        <w:pStyle w:val="ListParagraph"/>
+        <w:numPr>
+          <w:ilvl w:val="1"/>
+          <w:numId w:val="28"/>
+        </w:numPr>
+        <w:spacing w:line="480" w:lineRule="auto"/>
+        <w:rPr>
+          <w:rFonts w:ascii="Times New Roman" w:hAnsi="Times New Roman" w:cs="Times New Roman"/>
+        </w:rPr>
+      </w:pPr>
+      <w:r>
+        <w:rPr>
+          <w:rFonts w:ascii="Times New Roman" w:hAnsi="Times New Roman" w:cs="Times New Roman"/>
+          <w:i/>
+          <w:iCs/>
+        </w:rPr>
+        <w:t>Brainstorming dashboard</w:t>
+      </w:r>
+      <w:r>
+        <w:rPr>
+          <w:rFonts w:ascii="Times New Roman" w:hAnsi="Times New Roman" w:cs="Times New Roman"/>
+        </w:rPr>
+        <w:t xml:space="preserve"> visualisasi</w:t>
+      </w:r>
+    </w:p>
+    <w:p>
+      <w:pPr>
+        <w:pStyle w:val="ListParagraph"/>
+        <w:spacing w:line="480" w:lineRule="auto"/>
+        <w:ind w:left="2160" w:firstLine="720"/>
+        <w:jc w:val="both"/>
+        <w:rPr>
+          <w:rFonts w:ascii="Times New Roman" w:hAnsi="Times New Roman" w:cs="Times New Roman"/>
+        </w:rPr>
+      </w:pPr>
+      <w:r>
+        <w:rPr>
+          <w:rFonts w:ascii="Times New Roman" w:hAnsi="Times New Roman" w:cs="Times New Roman"/>
+        </w:rPr>
+        <w:t xml:space="preserve">Bagian ini dirancang untuk </w:t>
+      </w:r>
+      <w:r>
+        <w:rPr>
+          <w:rFonts w:ascii="Times New Roman" w:hAnsi="Times New Roman" w:cs="Times New Roman"/>
+        </w:rPr>
+        <w:t>memberikan pemahaman tentang brainstorming yang digunakan saat tahap visualisasi pada proyek ini.</w:t>
+      </w:r>
+    </w:p>
+    <w:p>
+      <w:pPr>
+        <w:pStyle w:val="ListParagraph"/>
+        <w:keepNext/>
+        <w:spacing w:line="480" w:lineRule="auto"/>
+        <w:ind w:left="2160"/>
+        <w:jc w:val="center"/>
+      </w:pPr>
+      <w:r>
+        <w:rPr>
+          <w:rFonts w:ascii="Times New Roman" w:hAnsi="Times New Roman" w:cs="Times New Roman"/>
+          <w:noProof/>
+        </w:rPr>
+        <w:drawing>
+          <wp:inline distT="0" distB="0" distL="0" distR="0" wp14:anchorId="7AE861B7" wp14:editId="63D5DAE5">
+            <wp:extent cx="3960000" cy="2104500"/>
+            <wp:effectExtent l="19050" t="19050" r="21590" b="10160"/>
+            <wp:docPr id="674980663" name="Picture 6"/>
+            <wp:cNvGraphicFramePr>
+              <a:graphicFrameLocks xmlns:a="http://schemas.openxmlformats.org/drawingml/2006/main" noChangeAspect="1"/>
+            </wp:cNvGraphicFramePr>
+            <a:graphic xmlns:a="http://schemas.openxmlformats.org/drawingml/2006/main">
+              <a:graphicData uri="http://schemas.openxmlformats.org/drawingml/2006/picture">
+                <pic:pic xmlns:pic="http://schemas.openxmlformats.org/drawingml/2006/picture">
+                  <pic:nvPicPr>
+                    <pic:cNvPr id="0" name="Picture 6"/>
+                    <pic:cNvPicPr>
+                      <a:picLocks noChangeAspect="1" noChangeArrowheads="1"/>
+                    </pic:cNvPicPr>
+                  </pic:nvPicPr>
+                  <pic:blipFill>
+                    <a:blip r:embed="rId55" cstate="print">
+                      <a:extLst>
+                        <a:ext uri="{28A0092B-C50C-407E-A947-70E740481C1C}">
+                          <a14:useLocalDpi xmlns:a14="http://schemas.microsoft.com/office/drawing/2010/main" val="0"/>
+                        </a:ext>
+                      </a:extLst>
+                    </a:blip>
+                    <a:srcRect/>
+                    <a:stretch>
+                      <a:fillRect/>
+                    </a:stretch>
+                  </pic:blipFill>
+                  <pic:spPr bwMode="auto">
+                    <a:xfrm>
+                      <a:off x="0" y="0"/>
+                      <a:ext cx="3960000" cy="2104500"/>
+                    </a:xfrm>
+                    <a:prstGeom prst="rect">
+                      <a:avLst/>
+                    </a:prstGeom>
+                    <a:noFill/>
+                    <a:ln w="12700">
+                      <a:solidFill>
+                        <a:schemeClr val="tx1"/>
+                      </a:solidFill>
+                    </a:ln>
+                  </pic:spPr>
+                </pic:pic>
+              </a:graphicData>
+            </a:graphic>
+          </wp:inline>
+        </w:drawing>
+      </w:r>
+    </w:p>
+    <w:p>
+      <w:pPr>
+        <w:pStyle w:val="Caption"/>
+        <w:spacing w:line="480" w:lineRule="auto"/>
+        <w:jc w:val="center"/>
+        <w:rPr>
+          <w:rFonts w:ascii="Times New Roman" w:hAnsi="Times New Roman" w:cs="Times New Roman"/>
+        </w:rPr>
+      </w:pPr>
+      <w:r>
+        <w:t xml:space="preserve">Gambar </w:t>
+      </w:r>
+      <w:fldSimple w:instr=" SEQ Gambar \* ARABIC ">
+        <w:r>
+          <w:rPr>
+            <w:noProof/>
+          </w:rPr>
+          <w:t>48</w:t>
+        </w:r>
+      </w:fldSimple>
+      <w:r>
+        <w:t xml:space="preserve"> brainstorming dashboard pada halaman utama</w:t>
+      </w:r>
+    </w:p>
+    <w:p>
+      <w:pPr>
+        <w:pStyle w:val="ListParagraph"/>
+        <w:numPr>
+          <w:ilvl w:val="1"/>
+          <w:numId w:val="28"/>
+        </w:numPr>
+        <w:spacing w:line="480" w:lineRule="auto"/>
+        <w:rPr>
+          <w:rFonts w:ascii="Times New Roman" w:hAnsi="Times New Roman" w:cs="Times New Roman"/>
+        </w:rPr>
+      </w:pPr>
+      <w:r>
+        <w:rPr>
+          <w:rFonts w:ascii="Times New Roman" w:hAnsi="Times New Roman" w:cs="Times New Roman"/>
+        </w:rPr>
+        <w:t>Ucapan terimakasih</w:t>
+      </w:r>
+    </w:p>
+    <w:p>
+      <w:pPr>
+        <w:pStyle w:val="ListParagraph"/>
+        <w:spacing w:line="480" w:lineRule="auto"/>
+        <w:ind w:left="2160" w:firstLine="720"/>
+        <w:jc w:val="both"/>
+        <w:rPr>
+          <w:rFonts w:ascii="Times New Roman" w:hAnsi="Times New Roman" w:cs="Times New Roman"/>
+        </w:rPr>
+      </w:pPr>
+      <w:r>
+        <w:rPr>
+          <w:rFonts w:ascii="Times New Roman" w:hAnsi="Times New Roman" w:cs="Times New Roman"/>
+        </w:rPr>
+        <w:lastRenderedPageBreak/>
+        <w:t>Bagian ini dirancang untuk menyampaikan ucapan terimakasih penulis kepada mitra proyek.</w:t>
+      </w:r>
+    </w:p>
+    <w:p>
+      <w:pPr>
+        <w:pStyle w:val="ListParagraph"/>
+        <w:keepNext/>
+        <w:spacing w:line="480" w:lineRule="auto"/>
+        <w:ind w:left="2160"/>
+        <w:jc w:val="center"/>
+      </w:pPr>
+      <w:r>
+        <w:rPr>
+          <w:rFonts w:ascii="Times New Roman" w:hAnsi="Times New Roman" w:cs="Times New Roman"/>
+          <w:noProof/>
+        </w:rPr>
+        <w:drawing>
+          <wp:inline distT="0" distB="0" distL="0" distR="0" wp14:anchorId="1BCAA558" wp14:editId="1AD5DCA7">
+            <wp:extent cx="3960000" cy="2104500"/>
+            <wp:effectExtent l="19050" t="19050" r="21590" b="10160"/>
+            <wp:docPr id="1886904355" name="Picture 7"/>
+            <wp:cNvGraphicFramePr>
+              <a:graphicFrameLocks xmlns:a="http://schemas.openxmlformats.org/drawingml/2006/main" noChangeAspect="1"/>
+            </wp:cNvGraphicFramePr>
+            <a:graphic xmlns:a="http://schemas.openxmlformats.org/drawingml/2006/main">
+              <a:graphicData uri="http://schemas.openxmlformats.org/drawingml/2006/picture">
+                <pic:pic xmlns:pic="http://schemas.openxmlformats.org/drawingml/2006/picture">
+                  <pic:nvPicPr>
+                    <pic:cNvPr id="0" name="Picture 7"/>
+                    <pic:cNvPicPr>
+                      <a:picLocks noChangeAspect="1" noChangeArrowheads="1"/>
+                    </pic:cNvPicPr>
+                  </pic:nvPicPr>
+                  <pic:blipFill>
+                    <a:blip r:embed="rId56" cstate="print">
+                      <a:extLst>
+                        <a:ext uri="{28A0092B-C50C-407E-A947-70E740481C1C}">
+                          <a14:useLocalDpi xmlns:a14="http://schemas.microsoft.com/office/drawing/2010/main" val="0"/>
+                        </a:ext>
+                      </a:extLst>
+                    </a:blip>
+                    <a:srcRect/>
+                    <a:stretch>
+                      <a:fillRect/>
+                    </a:stretch>
+                  </pic:blipFill>
+                  <pic:spPr bwMode="auto">
+                    <a:xfrm>
+                      <a:off x="0" y="0"/>
+                      <a:ext cx="3960000" cy="2104500"/>
+                    </a:xfrm>
+                    <a:prstGeom prst="rect">
+                      <a:avLst/>
+                    </a:prstGeom>
+                    <a:noFill/>
+                    <a:ln w="12700">
+                      <a:solidFill>
+                        <a:schemeClr val="tx1"/>
+                      </a:solidFill>
+                    </a:ln>
+                  </pic:spPr>
+                </pic:pic>
+              </a:graphicData>
+            </a:graphic>
+          </wp:inline>
+        </w:drawing>
+      </w:r>
+    </w:p>
+    <w:p>
+      <w:pPr>
+        <w:pStyle w:val="Caption"/>
+        <w:spacing w:line="480" w:lineRule="auto"/>
+        <w:jc w:val="center"/>
+        <w:rPr>
+          <w:rFonts w:ascii="Times New Roman" w:hAnsi="Times New Roman" w:cs="Times New Roman"/>
+        </w:rPr>
+      </w:pPr>
+      <w:r>
+        <w:t xml:space="preserve">Gambar </w:t>
+      </w:r>
+      <w:fldSimple w:instr=" SEQ Gambar \* ARABIC ">
+        <w:r>
+          <w:rPr>
+            <w:noProof/>
+          </w:rPr>
+          <w:t>49</w:t>
+        </w:r>
+      </w:fldSimple>
+      <w:r>
+        <w:t xml:space="preserve"> ucapan terimakasih pada halaman utama</w:t>
+      </w:r>
+    </w:p>
+    <w:p>
+      <w:pPr>
+        <w:pStyle w:val="ListParagraph"/>
+        <w:numPr>
+          <w:ilvl w:val="1"/>
+          <w:numId w:val="28"/>
+        </w:numPr>
+        <w:spacing w:line="480" w:lineRule="auto"/>
+        <w:rPr>
+          <w:rFonts w:ascii="Times New Roman" w:hAnsi="Times New Roman" w:cs="Times New Roman"/>
+        </w:rPr>
+      </w:pPr>
+      <w:r>
+        <w:rPr>
+          <w:rFonts w:ascii="Times New Roman" w:hAnsi="Times New Roman" w:cs="Times New Roman"/>
+          <w:i/>
+          <w:iCs/>
+        </w:rPr>
+        <w:t>Watermark</w:t>
+      </w:r>
+      <w:r>
+        <w:rPr>
+          <w:rFonts w:ascii="Times New Roman" w:hAnsi="Times New Roman" w:cs="Times New Roman"/>
+        </w:rPr>
+        <w:t xml:space="preserve"> penulis</w:t>
+      </w:r>
+    </w:p>
+    <w:p>
+      <w:pPr>
+        <w:pStyle w:val="ListParagraph"/>
+        <w:spacing w:line="480" w:lineRule="auto"/>
+        <w:ind w:left="2160" w:firstLine="720"/>
+        <w:jc w:val="both"/>
+        <w:rPr>
+          <w:rFonts w:ascii="Times New Roman" w:hAnsi="Times New Roman" w:cs="Times New Roman"/>
+        </w:rPr>
+      </w:pPr>
+      <w:r>
+        <w:rPr>
+          <w:rFonts w:ascii="Times New Roman" w:hAnsi="Times New Roman" w:cs="Times New Roman"/>
+        </w:rPr>
+        <w:t>Bagian ini dirancang untuk memberikan label penulis</w:t>
+      </w:r>
+      <w:r>
+        <w:rPr>
+          <w:rFonts w:ascii="Times New Roman" w:hAnsi="Times New Roman" w:cs="Times New Roman"/>
+        </w:rPr>
+        <w:t xml:space="preserve"> pada proyek</w:t>
+      </w:r>
+      <w:r>
+        <w:rPr>
+          <w:rFonts w:ascii="Times New Roman" w:hAnsi="Times New Roman" w:cs="Times New Roman"/>
+        </w:rPr>
+        <w:t xml:space="preserve"> ini</w:t>
+      </w:r>
+      <w:r>
+        <w:rPr>
+          <w:rFonts w:ascii="Times New Roman" w:hAnsi="Times New Roman" w:cs="Times New Roman"/>
+        </w:rPr>
+        <w:t>.</w:t>
+      </w:r>
+    </w:p>
+    <w:p>
+      <w:pPr>
+        <w:pStyle w:val="ListParagraph"/>
+        <w:keepNext/>
+        <w:spacing w:line="480" w:lineRule="auto"/>
+        <w:ind w:left="2160"/>
+        <w:jc w:val="center"/>
+      </w:pPr>
+      <w:r>
+        <w:rPr>
+          <w:rFonts w:ascii="Times New Roman" w:hAnsi="Times New Roman" w:cs="Times New Roman"/>
+          <w:noProof/>
+        </w:rPr>
+        <w:drawing>
+          <wp:inline distT="0" distB="0" distL="0" distR="0" wp14:anchorId="72C625E9" wp14:editId="760EDE03">
+            <wp:extent cx="3960000" cy="2104500"/>
+            <wp:effectExtent l="19050" t="19050" r="21590" b="10160"/>
+            <wp:docPr id="156472786" name="Picture 8"/>
+            <wp:cNvGraphicFramePr>
+              <a:graphicFrameLocks xmlns:a="http://schemas.openxmlformats.org/drawingml/2006/main" noChangeAspect="1"/>
+            </wp:cNvGraphicFramePr>
+            <a:graphic xmlns:a="http://schemas.openxmlformats.org/drawingml/2006/main">
+              <a:graphicData uri="http://schemas.openxmlformats.org/drawingml/2006/picture">
+                <pic:pic xmlns:pic="http://schemas.openxmlformats.org/drawingml/2006/picture">
+                  <pic:nvPicPr>
+                    <pic:cNvPr id="0" name="Picture 8"/>
+                    <pic:cNvPicPr>
+                      <a:picLocks noChangeAspect="1" noChangeArrowheads="1"/>
+                    </pic:cNvPicPr>
+                  </pic:nvPicPr>
+                  <pic:blipFill>
+                    <a:blip r:embed="rId57" cstate="print">
+                      <a:extLst>
+                        <a:ext uri="{28A0092B-C50C-407E-A947-70E740481C1C}">
+                          <a14:useLocalDpi xmlns:a14="http://schemas.microsoft.com/office/drawing/2010/main" val="0"/>
+                        </a:ext>
+                      </a:extLst>
+                    </a:blip>
+                    <a:srcRect/>
+                    <a:stretch>
+                      <a:fillRect/>
+                    </a:stretch>
+                  </pic:blipFill>
+                  <pic:spPr bwMode="auto">
+                    <a:xfrm>
+                      <a:off x="0" y="0"/>
+                      <a:ext cx="3960000" cy="2104500"/>
+                    </a:xfrm>
+                    <a:prstGeom prst="rect">
+                      <a:avLst/>
+                    </a:prstGeom>
+                    <a:noFill/>
+                    <a:ln w="12700">
+                      <a:solidFill>
+                        <a:schemeClr val="tx1"/>
+                      </a:solidFill>
+                    </a:ln>
+                  </pic:spPr>
+                </pic:pic>
+              </a:graphicData>
+            </a:graphic>
+          </wp:inline>
+        </w:drawing>
+      </w:r>
+    </w:p>
+    <w:p>
+      <w:pPr>
+        <w:pStyle w:val="Caption"/>
+        <w:spacing w:line="480" w:lineRule="auto"/>
+        <w:jc w:val="center"/>
+        <w:rPr>
+          <w:rFonts w:ascii="Times New Roman" w:hAnsi="Times New Roman" w:cs="Times New Roman"/>
+        </w:rPr>
+      </w:pPr>
+      <w:r>
+        <w:t xml:space="preserve">Gambar </w:t>
+      </w:r>
+      <w:fldSimple w:instr=" SEQ Gambar \* ARABIC ">
+        <w:r>
+          <w:rPr>
+            <w:noProof/>
+          </w:rPr>
+          <w:t>50</w:t>
+        </w:r>
+      </w:fldSimple>
+      <w:r>
+        <w:t xml:space="preserve"> watermark pada halaman utama</w:t>
+      </w:r>
+    </w:p>
+    <w:p>
+      <w:pPr>
+        <w:pStyle w:val="Heading6"/>
+      </w:pPr>
+      <w:r>
+        <w:t>Halaman ‘Cara Membaca Dashboard’</w:t>
+      </w:r>
+    </w:p>
+    <w:p>
+      <w:pPr>
+        <w:pStyle w:val="ListParagraph"/>
+        <w:numPr>
+          <w:ilvl w:val="1"/>
+          <w:numId w:val="28"/>
+        </w:numPr>
+        <w:spacing w:line="480" w:lineRule="auto"/>
+        <w:rPr>
+          <w:rFonts w:ascii="Times New Roman" w:hAnsi="Times New Roman" w:cs="Times New Roman"/>
+        </w:rPr>
+      </w:pPr>
+      <w:r>
+        <w:rPr>
+          <w:rFonts w:ascii="Times New Roman" w:hAnsi="Times New Roman" w:cs="Times New Roman"/>
+        </w:rPr>
+        <w:t>Bar navigasi</w:t>
+      </w:r>
+    </w:p>
+    <w:p>
+      <w:pPr>
+        <w:pStyle w:val="ListParagraph"/>
+        <w:spacing w:line="480" w:lineRule="auto"/>
+        <w:ind w:left="2160" w:firstLine="720"/>
+        <w:jc w:val="both"/>
+        <w:rPr>
+          <w:rFonts w:ascii="Times New Roman" w:hAnsi="Times New Roman" w:cs="Times New Roman"/>
+        </w:rPr>
+      </w:pPr>
+      <w:r>
+        <w:rPr>
+          <w:rFonts w:ascii="Times New Roman" w:hAnsi="Times New Roman" w:cs="Times New Roman"/>
+        </w:rPr>
+        <w:lastRenderedPageBreak/>
+        <w:t>Bar navigasi adalah tempat dimana tombol untuk berpindah halaman berada. Bar navigasi terdiri dari 3 tombol: tombol menuju halaman utama, Cara Membaca Dashboard, dan Dashboard Visualisasi.</w:t>
+      </w:r>
+    </w:p>
+    <w:p>
+      <w:pPr>
+        <w:pStyle w:val="ListParagraph"/>
+        <w:keepNext/>
+        <w:spacing w:line="480" w:lineRule="auto"/>
+        <w:ind w:left="2160"/>
+        <w:jc w:val="center"/>
+      </w:pPr>
+      <w:r>
+        <w:rPr>
+          <w:rFonts w:ascii="Times New Roman" w:hAnsi="Times New Roman" w:cs="Times New Roman"/>
+          <w:noProof/>
+        </w:rPr>
+        <w:drawing>
+          <wp:inline distT="0" distB="0" distL="0" distR="0" wp14:anchorId="0D8026DA" wp14:editId="3E0E2AE8">
+            <wp:extent cx="3960000" cy="2106000"/>
+            <wp:effectExtent l="19050" t="19050" r="21590" b="27940"/>
+            <wp:docPr id="1106027460" name="Picture 9"/>
+            <wp:cNvGraphicFramePr>
+              <a:graphicFrameLocks xmlns:a="http://schemas.openxmlformats.org/drawingml/2006/main" noChangeAspect="1"/>
+            </wp:cNvGraphicFramePr>
+            <a:graphic xmlns:a="http://schemas.openxmlformats.org/drawingml/2006/main">
+              <a:graphicData uri="http://schemas.openxmlformats.org/drawingml/2006/picture">
+                <pic:pic xmlns:pic="http://schemas.openxmlformats.org/drawingml/2006/picture">
+                  <pic:nvPicPr>
+                    <pic:cNvPr id="0" name="Picture 9"/>
+                    <pic:cNvPicPr>
+                      <a:picLocks noChangeAspect="1" noChangeArrowheads="1"/>
+                    </pic:cNvPicPr>
+                  </pic:nvPicPr>
+                  <pic:blipFill>
+                    <a:blip r:embed="rId58" cstate="print">
+                      <a:extLst>
+                        <a:ext uri="{28A0092B-C50C-407E-A947-70E740481C1C}">
+                          <a14:useLocalDpi xmlns:a14="http://schemas.microsoft.com/office/drawing/2010/main" val="0"/>
+                        </a:ext>
+                      </a:extLst>
+                    </a:blip>
+                    <a:srcRect/>
+                    <a:stretch>
+                      <a:fillRect/>
+                    </a:stretch>
+                  </pic:blipFill>
+                  <pic:spPr bwMode="auto">
+                    <a:xfrm>
+                      <a:off x="0" y="0"/>
+                      <a:ext cx="3960000" cy="2106000"/>
+                    </a:xfrm>
+                    <a:prstGeom prst="rect">
+                      <a:avLst/>
+                    </a:prstGeom>
+                    <a:noFill/>
+                    <a:ln w="12700">
+                      <a:solidFill>
+                        <a:schemeClr val="tx1"/>
+                      </a:solidFill>
+                    </a:ln>
+                  </pic:spPr>
+                </pic:pic>
+              </a:graphicData>
+            </a:graphic>
+          </wp:inline>
+        </w:drawing>
+      </w:r>
+    </w:p>
+    <w:p>
+      <w:pPr>
+        <w:pStyle w:val="Caption"/>
+        <w:spacing w:line="480" w:lineRule="auto"/>
+        <w:jc w:val="center"/>
+        <w:rPr>
+          <w:rFonts w:ascii="Times New Roman" w:hAnsi="Times New Roman" w:cs="Times New Roman"/>
+        </w:rPr>
+      </w:pPr>
+      <w:r>
+        <w:t xml:space="preserve">Gambar </w:t>
+      </w:r>
+      <w:fldSimple w:instr=" SEQ Gambar \* ARABIC ">
+        <w:r>
+          <w:rPr>
+            <w:noProof/>
+          </w:rPr>
+          <w:t>51</w:t>
+        </w:r>
+      </w:fldSimple>
+      <w:r>
+        <w:t xml:space="preserve"> bar navigasi halaman cara membaca</w:t>
+      </w:r>
+    </w:p>
+    <w:p>
+      <w:pPr>
+        <w:pStyle w:val="ListParagraph"/>
+        <w:numPr>
+          <w:ilvl w:val="1"/>
+          <w:numId w:val="28"/>
+        </w:numPr>
+        <w:spacing w:line="480" w:lineRule="auto"/>
+        <w:rPr>
+          <w:rFonts w:ascii="Times New Roman" w:hAnsi="Times New Roman" w:cs="Times New Roman"/>
+        </w:rPr>
+      </w:pPr>
+      <w:r>
+        <w:rPr>
+          <w:rFonts w:ascii="Times New Roman" w:hAnsi="Times New Roman" w:cs="Times New Roman"/>
+        </w:rPr>
+        <w:t>Cara membaca</w:t>
+      </w:r>
+    </w:p>
+    <w:p>
+      <w:pPr>
+        <w:pStyle w:val="ListParagraph"/>
+        <w:spacing w:line="480" w:lineRule="auto"/>
+        <w:ind w:left="2160" w:firstLine="720"/>
+        <w:jc w:val="both"/>
+        <w:rPr>
+          <w:rFonts w:ascii="Times New Roman" w:hAnsi="Times New Roman" w:cs="Times New Roman"/>
+        </w:rPr>
+      </w:pPr>
+      <w:r>
+        <w:rPr>
+          <w:rFonts w:ascii="Times New Roman" w:hAnsi="Times New Roman" w:cs="Times New Roman"/>
+        </w:rPr>
+        <w:t>Bagian ini dirancang untuk menjelaskan cara membaca kedua dashboard visualisasi</w:t>
+      </w:r>
+      <w:r>
+        <w:rPr>
+          <w:rFonts w:ascii="Times New Roman" w:hAnsi="Times New Roman" w:cs="Times New Roman"/>
+        </w:rPr>
+        <w:t>.</w:t>
+      </w:r>
+    </w:p>
+    <w:p>
+      <w:pPr>
+        <w:pStyle w:val="ListParagraph"/>
+        <w:keepNext/>
+        <w:spacing w:line="480" w:lineRule="auto"/>
+        <w:ind w:left="2160"/>
+        <w:jc w:val="center"/>
+      </w:pPr>
+      <w:r>
+        <w:rPr>
+          <w:rFonts w:ascii="Times New Roman" w:hAnsi="Times New Roman" w:cs="Times New Roman"/>
+          <w:noProof/>
+        </w:rPr>
+        <w:drawing>
+          <wp:inline distT="0" distB="0" distL="0" distR="0" wp14:anchorId="43EF798C" wp14:editId="5EDC6D88">
+            <wp:extent cx="3960000" cy="2106000"/>
+            <wp:effectExtent l="19050" t="19050" r="21590" b="27940"/>
+            <wp:docPr id="1390434" name="Picture 10"/>
+            <wp:cNvGraphicFramePr>
+              <a:graphicFrameLocks xmlns:a="http://schemas.openxmlformats.org/drawingml/2006/main" noChangeAspect="1"/>
+            </wp:cNvGraphicFramePr>
+            <a:graphic xmlns:a="http://schemas.openxmlformats.org/drawingml/2006/main">
+              <a:graphicData uri="http://schemas.openxmlformats.org/drawingml/2006/picture">
+                <pic:pic xmlns:pic="http://schemas.openxmlformats.org/drawingml/2006/picture">
+                  <pic:nvPicPr>
+                    <pic:cNvPr id="0" name="Picture 10"/>
+                    <pic:cNvPicPr>
+                      <a:picLocks noChangeAspect="1" noChangeArrowheads="1"/>
+                    </pic:cNvPicPr>
+                  </pic:nvPicPr>
+                  <pic:blipFill>
+                    <a:blip r:embed="rId59" cstate="print">
+                      <a:extLst>
+                        <a:ext uri="{28A0092B-C50C-407E-A947-70E740481C1C}">
+                          <a14:useLocalDpi xmlns:a14="http://schemas.microsoft.com/office/drawing/2010/main" val="0"/>
+                        </a:ext>
+                      </a:extLst>
+                    </a:blip>
+                    <a:srcRect/>
+                    <a:stretch>
+                      <a:fillRect/>
+                    </a:stretch>
+                  </pic:blipFill>
+                  <pic:spPr bwMode="auto">
+                    <a:xfrm>
+                      <a:off x="0" y="0"/>
+                      <a:ext cx="3960000" cy="2106000"/>
+                    </a:xfrm>
+                    <a:prstGeom prst="rect">
+                      <a:avLst/>
+                    </a:prstGeom>
+                    <a:noFill/>
+                    <a:ln w="12700">
+                      <a:solidFill>
+                        <a:schemeClr val="tx1"/>
+                      </a:solidFill>
+                    </a:ln>
+                  </pic:spPr>
+                </pic:pic>
+              </a:graphicData>
+            </a:graphic>
+          </wp:inline>
+        </w:drawing>
+      </w:r>
+    </w:p>
+    <w:p>
+      <w:pPr>
+        <w:pStyle w:val="Caption"/>
+        <w:spacing w:line="480" w:lineRule="auto"/>
+        <w:jc w:val="center"/>
+        <w:rPr>
+          <w:rFonts w:ascii="Times New Roman" w:hAnsi="Times New Roman" w:cs="Times New Roman"/>
+        </w:rPr>
+      </w:pPr>
+      <w:r>
+        <w:t xml:space="preserve">Gambar </w:t>
+      </w:r>
+      <w:fldSimple w:instr=" SEQ Gambar \* ARABIC ">
+        <w:r>
+          <w:rPr>
+            <w:noProof/>
+          </w:rPr>
+          <w:t>52</w:t>
+        </w:r>
+      </w:fldSimple>
+      <w:r>
+        <w:t xml:space="preserve"> cara membaca pada halaman cara membaca</w:t>
+      </w:r>
+      <w:r>
+        <w:rPr>
+          <w:noProof/>
+        </w:rPr>
+        <w:t xml:space="preserve"> dashboard</w:t>
+      </w:r>
+    </w:p>
+    <w:p>
+      <w:pPr>
+        <w:pStyle w:val="ListParagraph"/>
+        <w:numPr>
+          <w:ilvl w:val="1"/>
+          <w:numId w:val="28"/>
+        </w:numPr>
+        <w:spacing w:line="480" w:lineRule="auto"/>
+        <w:rPr>
+          <w:rFonts w:ascii="Times New Roman" w:hAnsi="Times New Roman" w:cs="Times New Roman"/>
+        </w:rPr>
+      </w:pPr>
+      <w:r>
+        <w:rPr>
+          <w:rFonts w:ascii="Times New Roman" w:hAnsi="Times New Roman" w:cs="Times New Roman"/>
+          <w:i/>
+          <w:iCs/>
+        </w:rPr>
+        <w:lastRenderedPageBreak/>
+        <w:t>Matermark</w:t>
+      </w:r>
+      <w:r>
+        <w:rPr>
+          <w:rFonts w:ascii="Times New Roman" w:hAnsi="Times New Roman" w:cs="Times New Roman"/>
+        </w:rPr>
+        <w:t xml:space="preserve"> penulis</w:t>
+      </w:r>
+    </w:p>
+    <w:p>
+      <w:pPr>
+        <w:pStyle w:val="ListParagraph"/>
+        <w:spacing w:line="480" w:lineRule="auto"/>
+        <w:ind w:left="2160" w:firstLine="720"/>
+        <w:jc w:val="both"/>
+        <w:rPr>
+          <w:rFonts w:ascii="Times New Roman" w:hAnsi="Times New Roman" w:cs="Times New Roman"/>
+        </w:rPr>
+      </w:pPr>
+      <w:r>
+        <w:rPr>
+          <w:rFonts w:ascii="Times New Roman" w:hAnsi="Times New Roman" w:cs="Times New Roman"/>
+        </w:rPr>
+        <w:t>Bagian ini dirancang untuk memberikan label penulis pada proyek ini.</w:t>
+      </w:r>
+    </w:p>
+    <w:p>
+      <w:pPr>
+        <w:pStyle w:val="ListParagraph"/>
+        <w:keepNext/>
+        <w:spacing w:line="480" w:lineRule="auto"/>
+        <w:ind w:left="2160"/>
+        <w:jc w:val="center"/>
+      </w:pPr>
+      <w:r>
+        <w:rPr>
+          <w:rFonts w:ascii="Times New Roman" w:hAnsi="Times New Roman" w:cs="Times New Roman"/>
+          <w:noProof/>
+        </w:rPr>
+        <w:drawing>
+          <wp:inline distT="0" distB="0" distL="0" distR="0" wp14:anchorId="5C914FFA" wp14:editId="45912804">
+            <wp:extent cx="3960000" cy="2106000"/>
+            <wp:effectExtent l="19050" t="19050" r="21590" b="27940"/>
+            <wp:docPr id="1018164689" name="Picture 11"/>
+            <wp:cNvGraphicFramePr>
+              <a:graphicFrameLocks xmlns:a="http://schemas.openxmlformats.org/drawingml/2006/main" noChangeAspect="1"/>
+            </wp:cNvGraphicFramePr>
+            <a:graphic xmlns:a="http://schemas.openxmlformats.org/drawingml/2006/main">
+              <a:graphicData uri="http://schemas.openxmlformats.org/drawingml/2006/picture">
+                <pic:pic xmlns:pic="http://schemas.openxmlformats.org/drawingml/2006/picture">
+                  <pic:nvPicPr>
+                    <pic:cNvPr id="0" name="Picture 11"/>
+                    <pic:cNvPicPr>
+                      <a:picLocks noChangeAspect="1" noChangeArrowheads="1"/>
+                    </pic:cNvPicPr>
+                  </pic:nvPicPr>
+                  <pic:blipFill>
+                    <a:blip r:embed="rId60" cstate="print">
+                      <a:extLst>
+                        <a:ext uri="{28A0092B-C50C-407E-A947-70E740481C1C}">
+                          <a14:useLocalDpi xmlns:a14="http://schemas.microsoft.com/office/drawing/2010/main" val="0"/>
+                        </a:ext>
+                      </a:extLst>
+                    </a:blip>
+                    <a:srcRect/>
+                    <a:stretch>
+                      <a:fillRect/>
+                    </a:stretch>
+                  </pic:blipFill>
+                  <pic:spPr bwMode="auto">
+                    <a:xfrm>
+                      <a:off x="0" y="0"/>
+                      <a:ext cx="3960000" cy="2106000"/>
+                    </a:xfrm>
+                    <a:prstGeom prst="rect">
+                      <a:avLst/>
+                    </a:prstGeom>
+                    <a:noFill/>
+                    <a:ln w="12700">
+                      <a:solidFill>
+                        <a:schemeClr val="tx1"/>
+                      </a:solidFill>
+                    </a:ln>
+                  </pic:spPr>
+                </pic:pic>
+              </a:graphicData>
+            </a:graphic>
+          </wp:inline>
+        </w:drawing>
+      </w:r>
+    </w:p>
+    <w:p>
+      <w:pPr>
+        <w:pStyle w:val="Caption"/>
+        <w:spacing w:line="480" w:lineRule="auto"/>
+        <w:jc w:val="center"/>
+        <w:rPr>
+          <w:rFonts w:ascii="Times New Roman" w:hAnsi="Times New Roman" w:cs="Times New Roman"/>
+        </w:rPr>
+      </w:pPr>
+      <w:r>
+        <w:t xml:space="preserve">Gambar </w:t>
+      </w:r>
+      <w:fldSimple w:instr=" SEQ Gambar \* ARABIC ">
+        <w:r>
+          <w:rPr>
+            <w:noProof/>
+          </w:rPr>
+          <w:t>53</w:t>
+        </w:r>
+      </w:fldSimple>
+      <w:r>
+        <w:t xml:space="preserve"> watermark pada halaman cara membaca</w:t>
       </w:r>
     </w:p>
     <w:p>
@@ -12317,6 +13535,95 @@
     </w:lvl>
   </w:abstractNum>
   <w:abstractNum w:abstractNumId="7" w15:restartNumberingAfterBreak="0">
+    <w:nsid w:val="34170E93"/>
+    <w:multiLevelType w:val="hybridMultilevel"/>
+    <w:tmpl w:val="D708EF50"/>
+    <w:lvl w:ilvl="0" w:tplc="0409000F">
+      <w:start w:val="1"/>
+      <w:numFmt w:val="decimal"/>
+      <w:lvlText w:val="%1."/>
+      <w:lvlJc w:val="left"/>
+      <w:pPr>
+        <w:ind w:left="1440" w:hanging="360"/>
+      </w:pPr>
+    </w:lvl>
+    <w:lvl w:ilvl="1" w:tplc="04090001">
+      <w:start w:val="1"/>
+      <w:numFmt w:val="bullet"/>
+      <w:lvlText w:val=""/>
+      <w:lvlJc w:val="left"/>
+      <w:pPr>
+        <w:ind w:left="2160" w:hanging="360"/>
+      </w:pPr>
+      <w:rPr>
+        <w:rFonts w:ascii="Symbol" w:hAnsi="Symbol" w:hint="default"/>
+      </w:rPr>
+    </w:lvl>
+    <w:lvl w:ilvl="2" w:tplc="0409001B" w:tentative="1">
+      <w:start w:val="1"/>
+      <w:numFmt w:val="lowerRoman"/>
+      <w:lvlText w:val="%3."/>
+      <w:lvlJc w:val="right"/>
+      <w:pPr>
+        <w:ind w:left="2880" w:hanging="180"/>
+      </w:pPr>
+    </w:lvl>
+    <w:lvl w:ilvl="3" w:tplc="0409000F" w:tentative="1">
+      <w:start w:val="1"/>
+      <w:numFmt w:val="decimal"/>
+      <w:lvlText w:val="%4."/>
+      <w:lvlJc w:val="left"/>
+      <w:pPr>
+        <w:ind w:left="3600" w:hanging="360"/>
+      </w:pPr>
+    </w:lvl>
+    <w:lvl w:ilvl="4" w:tplc="04090019" w:tentative="1">
+      <w:start w:val="1"/>
+      <w:numFmt w:val="lowerLetter"/>
+      <w:lvlText w:val="%5."/>
+      <w:lvlJc w:val="left"/>
+      <w:pPr>
+        <w:ind w:left="4320" w:hanging="360"/>
+      </w:pPr>
+    </w:lvl>
+    <w:lvl w:ilvl="5" w:tplc="0409001B" w:tentative="1">
+      <w:start w:val="1"/>
+      <w:numFmt w:val="lowerRoman"/>
+      <w:lvlText w:val="%6."/>
+      <w:lvlJc w:val="right"/>
+      <w:pPr>
+        <w:ind w:left="5040" w:hanging="180"/>
+      </w:pPr>
+    </w:lvl>
+    <w:lvl w:ilvl="6" w:tplc="0409000F" w:tentative="1">
+      <w:start w:val="1"/>
+      <w:numFmt w:val="decimal"/>
+      <w:lvlText w:val="%7."/>
+      <w:lvlJc w:val="left"/>
+      <w:pPr>
+        <w:ind w:left="5760" w:hanging="360"/>
+      </w:pPr>
+    </w:lvl>
+    <w:lvl w:ilvl="7" w:tplc="04090019" w:tentative="1">
+      <w:start w:val="1"/>
+      <w:numFmt w:val="lowerLetter"/>
+      <w:lvlText w:val="%8."/>
+      <w:lvlJc w:val="left"/>
+      <w:pPr>
+        <w:ind w:left="6480" w:hanging="360"/>
+      </w:pPr>
+    </w:lvl>
+    <w:lvl w:ilvl="8" w:tplc="0409001B" w:tentative="1">
+      <w:start w:val="1"/>
+      <w:numFmt w:val="lowerRoman"/>
+      <w:lvlText w:val="%9."/>
+      <w:lvlJc w:val="right"/>
+      <w:pPr>
+        <w:ind w:left="7200" w:hanging="180"/>
+      </w:pPr>
+    </w:lvl>
+  </w:abstractNum>
+  <w:abstractNum w:abstractNumId="8" w15:restartNumberingAfterBreak="0">
     <w:nsid w:val="35715EFD"/>
     <w:multiLevelType w:val="hybridMultilevel"/>
     <w:tmpl w:val="DD664F90"/>
@@ -12429,7 +13736,7 @@
       </w:rPr>
     </w:lvl>
   </w:abstractNum>
-  <w:abstractNum w:abstractNumId="8" w15:restartNumberingAfterBreak="0">
+  <w:abstractNum w:abstractNumId="9" w15:restartNumberingAfterBreak="0">
     <w:nsid w:val="4167498C"/>
     <w:multiLevelType w:val="hybridMultilevel"/>
     <w:tmpl w:val="AC70AFAC"/>
@@ -12519,7 +13826,7 @@
       </w:pPr>
     </w:lvl>
   </w:abstractNum>
-  <w:abstractNum w:abstractNumId="9" w15:restartNumberingAfterBreak="0">
+  <w:abstractNum w:abstractNumId="10" w15:restartNumberingAfterBreak="0">
     <w:nsid w:val="4F7E66BA"/>
     <w:multiLevelType w:val="hybridMultilevel"/>
     <w:tmpl w:val="79F2C6B8"/>
@@ -12632,7 +13939,7 @@
       </w:rPr>
     </w:lvl>
   </w:abstractNum>
-  <w:abstractNum w:abstractNumId="10" w15:restartNumberingAfterBreak="0">
+  <w:abstractNum w:abstractNumId="11" w15:restartNumberingAfterBreak="0">
     <w:nsid w:val="51F91447"/>
     <w:multiLevelType w:val="hybridMultilevel"/>
     <w:tmpl w:val="37762FA8"/>
@@ -12745,7 +14052,7 @@
       </w:rPr>
     </w:lvl>
   </w:abstractNum>
-  <w:abstractNum w:abstractNumId="11" w15:restartNumberingAfterBreak="0">
+  <w:abstractNum w:abstractNumId="12" w15:restartNumberingAfterBreak="0">
     <w:nsid w:val="5D8A4FCC"/>
     <w:multiLevelType w:val="hybridMultilevel"/>
     <w:tmpl w:val="21287962"/>
@@ -12858,7 +14165,7 @@
       </w:rPr>
     </w:lvl>
   </w:abstractNum>
-  <w:abstractNum w:abstractNumId="12" w15:restartNumberingAfterBreak="0">
+  <w:abstractNum w:abstractNumId="13" w15:restartNumberingAfterBreak="0">
     <w:nsid w:val="5F115D9E"/>
     <w:multiLevelType w:val="hybridMultilevel"/>
     <w:tmpl w:val="AE40592A"/>
@@ -12947,7 +14254,7 @@
       </w:pPr>
     </w:lvl>
   </w:abstractNum>
-  <w:abstractNum w:abstractNumId="13" w15:restartNumberingAfterBreak="0">
+  <w:abstractNum w:abstractNumId="14" w15:restartNumberingAfterBreak="0">
     <w:nsid w:val="63917590"/>
     <w:multiLevelType w:val="hybridMultilevel"/>
     <w:tmpl w:val="D714BB68"/>
@@ -13060,7 +14367,7 @@
       </w:rPr>
     </w:lvl>
   </w:abstractNum>
-  <w:abstractNum w:abstractNumId="14" w15:restartNumberingAfterBreak="0">
+  <w:abstractNum w:abstractNumId="15" w15:restartNumberingAfterBreak="0">
     <w:nsid w:val="6E3F320D"/>
     <w:multiLevelType w:val="hybridMultilevel"/>
     <w:tmpl w:val="C68A37A4"/>
@@ -13173,7 +14480,7 @@
       </w:rPr>
     </w:lvl>
   </w:abstractNum>
-  <w:abstractNum w:abstractNumId="15" w15:restartNumberingAfterBreak="0">
+  <w:abstractNum w:abstractNumId="16" w15:restartNumberingAfterBreak="0">
     <w:nsid w:val="6F821489"/>
     <w:multiLevelType w:val="hybridMultilevel"/>
     <w:tmpl w:val="0746499E"/>
@@ -13259,7 +14566,7 @@
       </w:pPr>
     </w:lvl>
   </w:abstractNum>
-  <w:abstractNum w:abstractNumId="16" w15:restartNumberingAfterBreak="0">
+  <w:abstractNum w:abstractNumId="17" w15:restartNumberingAfterBreak="0">
     <w:nsid w:val="75AD4CC8"/>
     <w:multiLevelType w:val="hybridMultilevel"/>
     <w:tmpl w:val="CB147842"/>
@@ -13372,7 +14679,7 @@
       </w:rPr>
     </w:lvl>
   </w:abstractNum>
-  <w:abstractNum w:abstractNumId="17" w15:restartNumberingAfterBreak="0">
+  <w:abstractNum w:abstractNumId="18" w15:restartNumberingAfterBreak="0">
     <w:nsid w:val="7998064F"/>
     <w:multiLevelType w:val="hybridMultilevel"/>
     <w:tmpl w:val="6D7EEBCC"/>
@@ -13486,7 +14793,7 @@
     </w:lvl>
   </w:abstractNum>
   <w:num w:numId="1" w16cid:durableId="1173185611">
-    <w:abstractNumId w:val="13"/>
+    <w:abstractNumId w:val="14"/>
   </w:num>
   <w:num w:numId="2" w16cid:durableId="2008241989">
     <w:abstractNumId w:val="5"/>
@@ -13495,7 +14802,7 @@
     <w:abstractNumId w:val="6"/>
   </w:num>
   <w:num w:numId="4" w16cid:durableId="126434000">
-    <w:abstractNumId w:val="16"/>
+    <w:abstractNumId w:val="17"/>
   </w:num>
   <w:num w:numId="5" w16cid:durableId="88235218">
     <w:abstractNumId w:val="2"/>
@@ -13507,34 +14814,34 @@
     <w:abstractNumId w:val="3"/>
   </w:num>
   <w:num w:numId="8" w16cid:durableId="1520004101">
-    <w:abstractNumId w:val="9"/>
+    <w:abstractNumId w:val="10"/>
   </w:num>
   <w:num w:numId="9" w16cid:durableId="2040203771">
     <w:abstractNumId w:val="0"/>
   </w:num>
   <w:num w:numId="10" w16cid:durableId="315181602">
+    <w:abstractNumId w:val="9"/>
+  </w:num>
+  <w:num w:numId="11" w16cid:durableId="6830234">
     <w:abstractNumId w:val="8"/>
   </w:num>
-  <w:num w:numId="11" w16cid:durableId="6830234">
-    <w:abstractNumId w:val="7"/>
-  </w:num>
   <w:num w:numId="12" w16cid:durableId="644774398">
-    <w:abstractNumId w:val="10"/>
+    <w:abstractNumId w:val="11"/>
   </w:num>
   <w:num w:numId="13" w16cid:durableId="1220090486">
-    <w:abstractNumId w:val="8"/>
+    <w:abstractNumId w:val="9"/>
     <w:lvlOverride w:ilvl="0">
       <w:startOverride w:val="1"/>
     </w:lvlOverride>
   </w:num>
   <w:num w:numId="14" w16cid:durableId="653677883">
-    <w:abstractNumId w:val="15"/>
+    <w:abstractNumId w:val="16"/>
   </w:num>
   <w:num w:numId="15" w16cid:durableId="1593008556">
-    <w:abstractNumId w:val="11"/>
+    <w:abstractNumId w:val="12"/>
   </w:num>
   <w:num w:numId="16" w16cid:durableId="1969361129">
-    <w:abstractNumId w:val="17"/>
+    <w:abstractNumId w:val="18"/>
   </w:num>
   <w:num w:numId="17" w16cid:durableId="287854270">
     <w:abstractNumId w:val="3"/>
@@ -13555,19 +14862,19 @@
     </w:lvlOverride>
   </w:num>
   <w:num w:numId="20" w16cid:durableId="382221458">
-    <w:abstractNumId w:val="8"/>
+    <w:abstractNumId w:val="9"/>
     <w:lvlOverride w:ilvl="0">
       <w:startOverride w:val="1"/>
     </w:lvlOverride>
   </w:num>
   <w:num w:numId="21" w16cid:durableId="1655790808">
-    <w:abstractNumId w:val="8"/>
+    <w:abstractNumId w:val="9"/>
     <w:lvlOverride w:ilvl="0">
       <w:startOverride w:val="1"/>
     </w:lvlOverride>
   </w:num>
   <w:num w:numId="22" w16cid:durableId="234171700">
-    <w:abstractNumId w:val="8"/>
+    <w:abstractNumId w:val="9"/>
     <w:lvlOverride w:ilvl="0">
       <w:startOverride w:val="1"/>
     </w:lvlOverride>
@@ -13576,7 +14883,7 @@
     <w:abstractNumId w:val="1"/>
   </w:num>
   <w:num w:numId="24" w16cid:durableId="1560550362">
-    <w:abstractNumId w:val="8"/>
+    <w:abstractNumId w:val="9"/>
     <w:lvlOverride w:ilvl="0">
       <w:startOverride w:val="1"/>
     </w:lvlOverride>
@@ -13588,10 +14895,25 @@
     </w:lvlOverride>
   </w:num>
   <w:num w:numId="26" w16cid:durableId="1077551942">
-    <w:abstractNumId w:val="14"/>
+    <w:abstractNumId w:val="15"/>
   </w:num>
   <w:num w:numId="27" w16cid:durableId="840898556">
-    <w:abstractNumId w:val="12"/>
+    <w:abstractNumId w:val="13"/>
+  </w:num>
+  <w:num w:numId="28" w16cid:durableId="501895547">
+    <w:abstractNumId w:val="7"/>
+  </w:num>
+  <w:num w:numId="29" w16cid:durableId="1641417374">
+    <w:abstractNumId w:val="9"/>
+    <w:lvlOverride w:ilvl="0">
+      <w:startOverride w:val="1"/>
+    </w:lvlOverride>
+  </w:num>
+  <w:num w:numId="30" w16cid:durableId="1721786039">
+    <w:abstractNumId w:val="9"/>
+    <w:lvlOverride w:ilvl="0">
+      <w:startOverride w:val="1"/>
+    </w:lvlOverride>
   </w:num>
 </w:numbering>
 </file>
@@ -14200,6 +15522,7 @@
   <w:style w:type="character" w:default="1" w:styleId="DefaultParagraphFont">
     <w:name w:val="Default Paragraph Font"/>
     <w:uiPriority w:val="1"/>
+    <w:semiHidden/>
     <w:unhideWhenUsed/>
   </w:style>
   <w:style w:type="table" w:default="1" w:styleId="TableNormal">

</xml_diff>

<commit_message>
abis ngerjain kendala pelaksanaan, next coba liat langkah selanjutnya
</commit_message>
<xml_diff>
--- a/non-website/Laporan Akhir KP/2203040182 - Dhika Ramadhan Saputra - Laporan KP.docx
+++ b/non-website/Laporan Akhir KP/2203040182 - Dhika Ramadhan Saputra - Laporan KP.docx
@@ -1598,14 +1598,27 @@
       <w:r>
         <w:t xml:space="preserve">ambar </w:t>
       </w:r>
-      <w:fldSimple w:instr=" SEQ gambar \* ARABIC ">
-        <w:r>
-          <w:rPr>
-            <w:noProof/>
-          </w:rPr>
-          <w:t>1</w:t>
-        </w:r>
-      </w:fldSimple>
+      <w:r>
+        <w:fldChar w:fldCharType="begin"/>
+      </w:r>
+      <w:r>
+        <w:instrText xml:space="preserve"> SEQ gambar \* ARABIC </w:instrText>
+      </w:r>
+      <w:r>
+        <w:fldChar w:fldCharType="separate"/>
+      </w:r>
+      <w:r>
+        <w:rPr>
+          <w:noProof/>
+        </w:rPr>
+        <w:t>1</w:t>
+      </w:r>
+      <w:r>
+        <w:rPr>
+          <w:noProof/>
+        </w:rPr>
+        <w:fldChar w:fldCharType="end"/>
+      </w:r>
       <w:r>
         <w:t xml:space="preserve"> Tahapan Pelaksanaan</w:t>
       </w:r>
@@ -3551,14 +3564,27 @@
       <w:r>
         <w:t xml:space="preserve">Tabel </w:t>
       </w:r>
-      <w:fldSimple w:instr=" SEQ Tabel \* ARABIC ">
-        <w:r>
-          <w:rPr>
-            <w:noProof/>
-          </w:rPr>
-          <w:t>1</w:t>
-        </w:r>
-      </w:fldSimple>
+      <w:r>
+        <w:fldChar w:fldCharType="begin"/>
+      </w:r>
+      <w:r>
+        <w:instrText xml:space="preserve"> SEQ Tabel \* ARABIC </w:instrText>
+      </w:r>
+      <w:r>
+        <w:fldChar w:fldCharType="separate"/>
+      </w:r>
+      <w:r>
+        <w:rPr>
+          <w:noProof/>
+        </w:rPr>
+        <w:t>1</w:t>
+      </w:r>
+      <w:r>
+        <w:rPr>
+          <w:noProof/>
+        </w:rPr>
+        <w:fldChar w:fldCharType="end"/>
+      </w:r>
       <w:r>
         <w:t xml:space="preserve"> Jadwal pelaksanaan</w:t>
       </w:r>
@@ -3759,14 +3785,27 @@
       <w:r>
         <w:t xml:space="preserve">ambar </w:t>
       </w:r>
-      <w:fldSimple w:instr=" SEQ gambar \* ARABIC ">
-        <w:r>
-          <w:rPr>
-            <w:noProof/>
-          </w:rPr>
-          <w:t>2</w:t>
-        </w:r>
-      </w:fldSimple>
+      <w:r>
+        <w:fldChar w:fldCharType="begin"/>
+      </w:r>
+      <w:r>
+        <w:instrText xml:space="preserve"> SEQ gambar \* ARABIC </w:instrText>
+      </w:r>
+      <w:r>
+        <w:fldChar w:fldCharType="separate"/>
+      </w:r>
+      <w:r>
+        <w:rPr>
+          <w:noProof/>
+        </w:rPr>
+        <w:t>2</w:t>
+      </w:r>
+      <w:r>
+        <w:rPr>
+          <w:noProof/>
+        </w:rPr>
+        <w:fldChar w:fldCharType="end"/>
+      </w:r>
       <w:r>
         <w:t xml:space="preserve"> Struktur Umum Organisasi Mitra</w:t>
       </w:r>
@@ -4211,14 +4250,27 @@
       <w:r>
         <w:t xml:space="preserve">ambar </w:t>
       </w:r>
-      <w:fldSimple w:instr=" SEQ gambar \* ARABIC ">
-        <w:r>
-          <w:rPr>
-            <w:noProof/>
-          </w:rPr>
-          <w:t>3</w:t>
-        </w:r>
-      </w:fldSimple>
+      <w:r>
+        <w:fldChar w:fldCharType="begin"/>
+      </w:r>
+      <w:r>
+        <w:instrText xml:space="preserve"> SEQ gambar \* ARABIC </w:instrText>
+      </w:r>
+      <w:r>
+        <w:fldChar w:fldCharType="separate"/>
+      </w:r>
+      <w:r>
+        <w:rPr>
+          <w:noProof/>
+        </w:rPr>
+        <w:t>3</w:t>
+      </w:r>
+      <w:r>
+        <w:rPr>
+          <w:noProof/>
+        </w:rPr>
+        <w:fldChar w:fldCharType="end"/>
+      </w:r>
       <w:r>
         <w:t xml:space="preserve"> Dokumentasi proses penerimaan data</w:t>
       </w:r>
@@ -4237,7 +4289,7 @@
           <w:noProof/>
         </w:rPr>
         <w:drawing>
-          <wp:inline distT="0" distB="0" distL="0" distR="0" wp14:anchorId="75188C27" wp14:editId="49A75DFD">
+          <wp:inline distT="0" distB="0" distL="0" distR="0" wp14:anchorId="75188C27" wp14:editId="2B10FB4E">
             <wp:extent cx="4608000" cy="1698906"/>
             <wp:effectExtent l="19050" t="19050" r="21590" b="15875"/>
             <wp:docPr id="783286403" name="Picture 4"/>
@@ -4303,14 +4355,27 @@
       <w:r>
         <w:t xml:space="preserve">ambar </w:t>
       </w:r>
-      <w:fldSimple w:instr=" SEQ gambar \* ARABIC ">
-        <w:r>
-          <w:rPr>
-            <w:noProof/>
-          </w:rPr>
-          <w:t>4</w:t>
-        </w:r>
-      </w:fldSimple>
+      <w:r>
+        <w:fldChar w:fldCharType="begin"/>
+      </w:r>
+      <w:r>
+        <w:instrText xml:space="preserve"> SEQ gambar \* ARABIC </w:instrText>
+      </w:r>
+      <w:r>
+        <w:fldChar w:fldCharType="separate"/>
+      </w:r>
+      <w:r>
+        <w:rPr>
+          <w:noProof/>
+        </w:rPr>
+        <w:t>4</w:t>
+      </w:r>
+      <w:r>
+        <w:rPr>
+          <w:noProof/>
+        </w:rPr>
+        <w:fldChar w:fldCharType="end"/>
+      </w:r>
       <w:r>
         <w:t xml:space="preserve"> Sampel</w:t>
       </w:r>
@@ -4532,7 +4597,7 @@
           <w:noProof/>
         </w:rPr>
         <w:drawing>
-          <wp:inline distT="0" distB="0" distL="0" distR="0" wp14:anchorId="02EBA956" wp14:editId="40EC7092">
+          <wp:inline distT="0" distB="0" distL="0" distR="0" wp14:anchorId="02EBA956" wp14:editId="67DD2CEA">
             <wp:extent cx="3888000" cy="2160000"/>
             <wp:effectExtent l="19050" t="19050" r="17780" b="12065"/>
             <wp:docPr id="102117401" name="Picture 5"/>
@@ -4598,14 +4663,27 @@
       <w:r>
         <w:t xml:space="preserve">ambar </w:t>
       </w:r>
-      <w:fldSimple w:instr=" SEQ Gambar \* ARABIC ">
-        <w:r>
-          <w:rPr>
-            <w:noProof/>
-          </w:rPr>
-          <w:t>5</w:t>
-        </w:r>
-      </w:fldSimple>
+      <w:r>
+        <w:fldChar w:fldCharType="begin"/>
+      </w:r>
+      <w:r>
+        <w:instrText xml:space="preserve"> SEQ Gambar \* ARABIC </w:instrText>
+      </w:r>
+      <w:r>
+        <w:fldChar w:fldCharType="separate"/>
+      </w:r>
+      <w:r>
+        <w:rPr>
+          <w:noProof/>
+        </w:rPr>
+        <w:t>5</w:t>
+      </w:r>
+      <w:r>
+        <w:rPr>
+          <w:noProof/>
+        </w:rPr>
+        <w:fldChar w:fldCharType="end"/>
+      </w:r>
       <w:r>
         <w:t xml:space="preserve"> Cuplikan </w:t>
       </w:r>
@@ -4692,14 +4770,27 @@
       <w:r>
         <w:t xml:space="preserve">Gambar </w:t>
       </w:r>
-      <w:fldSimple w:instr=" SEQ Gambar \* ARABIC ">
-        <w:r>
-          <w:rPr>
-            <w:noProof/>
-          </w:rPr>
-          <w:t>6</w:t>
-        </w:r>
-      </w:fldSimple>
+      <w:r>
+        <w:fldChar w:fldCharType="begin"/>
+      </w:r>
+      <w:r>
+        <w:instrText xml:space="preserve"> SEQ Gambar \* ARABIC </w:instrText>
+      </w:r>
+      <w:r>
+        <w:fldChar w:fldCharType="separate"/>
+      </w:r>
+      <w:r>
+        <w:rPr>
+          <w:noProof/>
+        </w:rPr>
+        <w:t>6</w:t>
+      </w:r>
+      <w:r>
+        <w:rPr>
+          <w:noProof/>
+        </w:rPr>
+        <w:fldChar w:fldCharType="end"/>
+      </w:r>
       <w:r>
         <w:t xml:space="preserve"> Berkas sebelum &amp; sesudah penggabungan</w:t>
       </w:r>
@@ -4823,7 +4914,7 @@
           <w:noProof/>
         </w:rPr>
         <w:drawing>
-          <wp:inline distT="0" distB="0" distL="0" distR="0" wp14:anchorId="7A542151" wp14:editId="71CF8349">
+          <wp:inline distT="0" distB="0" distL="0" distR="0" wp14:anchorId="7A542151" wp14:editId="005F6CCA">
             <wp:extent cx="3418966" cy="1800000"/>
             <wp:effectExtent l="19050" t="19050" r="10160" b="10160"/>
             <wp:docPr id="1182821816" name="Picture 3"/>
@@ -4886,14 +4977,27 @@
       <w:r>
         <w:t xml:space="preserve">Gambar </w:t>
       </w:r>
-      <w:fldSimple w:instr=" SEQ Gambar \* ARABIC ">
-        <w:r>
-          <w:rPr>
-            <w:noProof/>
-          </w:rPr>
-          <w:t>7</w:t>
-        </w:r>
-      </w:fldSimple>
+      <w:r>
+        <w:fldChar w:fldCharType="begin"/>
+      </w:r>
+      <w:r>
+        <w:instrText xml:space="preserve"> SEQ Gambar \* ARABIC </w:instrText>
+      </w:r>
+      <w:r>
+        <w:fldChar w:fldCharType="separate"/>
+      </w:r>
+      <w:r>
+        <w:rPr>
+          <w:noProof/>
+        </w:rPr>
+        <w:t>7</w:t>
+      </w:r>
+      <w:r>
+        <w:rPr>
+          <w:noProof/>
+        </w:rPr>
+        <w:fldChar w:fldCharType="end"/>
+      </w:r>
       <w:r>
         <w:t xml:space="preserve"> Brainstorming pemilihan kolom menggunakan Notepad</w:t>
       </w:r>
@@ -4911,7 +5015,7 @@
           <w:noProof/>
         </w:rPr>
         <w:drawing>
-          <wp:inline distT="0" distB="0" distL="0" distR="0" wp14:anchorId="3D1861C2" wp14:editId="52E3375B">
+          <wp:inline distT="0" distB="0" distL="0" distR="0" wp14:anchorId="3D1861C2" wp14:editId="47115E67">
             <wp:extent cx="2176464" cy="2160000"/>
             <wp:effectExtent l="19050" t="19050" r="14605" b="12065"/>
             <wp:docPr id="471594841" name="Picture 1"/>
@@ -4974,14 +5078,27 @@
       <w:r>
         <w:t xml:space="preserve">Gambar </w:t>
       </w:r>
-      <w:fldSimple w:instr=" SEQ Gambar \* ARABIC ">
-        <w:r>
-          <w:rPr>
-            <w:noProof/>
-          </w:rPr>
-          <w:t>8</w:t>
-        </w:r>
-      </w:fldSimple>
+      <w:r>
+        <w:fldChar w:fldCharType="begin"/>
+      </w:r>
+      <w:r>
+        <w:instrText xml:space="preserve"> SEQ Gambar \* ARABIC </w:instrText>
+      </w:r>
+      <w:r>
+        <w:fldChar w:fldCharType="separate"/>
+      </w:r>
+      <w:r>
+        <w:rPr>
+          <w:noProof/>
+        </w:rPr>
+        <w:t>8</w:t>
+      </w:r>
+      <w:r>
+        <w:rPr>
+          <w:noProof/>
+        </w:rPr>
+        <w:fldChar w:fldCharType="end"/>
+      </w:r>
       <w:r>
         <w:t xml:space="preserve"> </w:t>
       </w:r>
@@ -5069,14 +5186,27 @@
       <w:r>
         <w:t xml:space="preserve">Gambar </w:t>
       </w:r>
-      <w:fldSimple w:instr=" SEQ Gambar \* ARABIC ">
-        <w:r>
-          <w:rPr>
-            <w:noProof/>
-          </w:rPr>
-          <w:t>9</w:t>
-        </w:r>
-      </w:fldSimple>
+      <w:r>
+        <w:fldChar w:fldCharType="begin"/>
+      </w:r>
+      <w:r>
+        <w:instrText xml:space="preserve"> SEQ Gambar \* ARABIC </w:instrText>
+      </w:r>
+      <w:r>
+        <w:fldChar w:fldCharType="separate"/>
+      </w:r>
+      <w:r>
+        <w:rPr>
+          <w:noProof/>
+        </w:rPr>
+        <w:t>9</w:t>
+      </w:r>
+      <w:r>
+        <w:rPr>
+          <w:noProof/>
+        </w:rPr>
+        <w:fldChar w:fldCharType="end"/>
+      </w:r>
       <w:r>
         <w:t xml:space="preserve"> Hasil realisasi brainstorming pemilihan kolom</w:t>
       </w:r>
@@ -5348,14 +5478,27 @@
       <w:r>
         <w:t xml:space="preserve">Gambar </w:t>
       </w:r>
-      <w:fldSimple w:instr=" SEQ Gambar \* ARABIC ">
-        <w:r>
-          <w:rPr>
-            <w:noProof/>
-          </w:rPr>
-          <w:t>10</w:t>
-        </w:r>
-      </w:fldSimple>
+      <w:r>
+        <w:fldChar w:fldCharType="begin"/>
+      </w:r>
+      <w:r>
+        <w:instrText xml:space="preserve"> SEQ Gambar \* ARABIC </w:instrText>
+      </w:r>
+      <w:r>
+        <w:fldChar w:fldCharType="separate"/>
+      </w:r>
+      <w:r>
+        <w:rPr>
+          <w:noProof/>
+        </w:rPr>
+        <w:t>10</w:t>
+      </w:r>
+      <w:r>
+        <w:rPr>
+          <w:noProof/>
+        </w:rPr>
+        <w:fldChar w:fldCharType="end"/>
+      </w:r>
       <w:r>
         <w:t xml:space="preserve"> Struktrur dataset (data mentah)</w:t>
       </w:r>
@@ -5558,14 +5701,27 @@
       <w:r>
         <w:t xml:space="preserve">Gambar </w:t>
       </w:r>
-      <w:fldSimple w:instr=" SEQ Gambar \* ARABIC ">
-        <w:r>
-          <w:rPr>
-            <w:noProof/>
-          </w:rPr>
-          <w:t>11</w:t>
-        </w:r>
-      </w:fldSimple>
+      <w:r>
+        <w:fldChar w:fldCharType="begin"/>
+      </w:r>
+      <w:r>
+        <w:instrText xml:space="preserve"> SEQ Gambar \* ARABIC </w:instrText>
+      </w:r>
+      <w:r>
+        <w:fldChar w:fldCharType="separate"/>
+      </w:r>
+      <w:r>
+        <w:rPr>
+          <w:noProof/>
+        </w:rPr>
+        <w:t>11</w:t>
+      </w:r>
+      <w:r>
+        <w:rPr>
+          <w:noProof/>
+        </w:rPr>
+        <w:fldChar w:fldCharType="end"/>
+      </w:r>
       <w:r>
         <w:t xml:space="preserve"> Menghitung jumlah data duplikat</w:t>
       </w:r>
@@ -5648,14 +5804,27 @@
       <w:r>
         <w:t xml:space="preserve">Gambar </w:t>
       </w:r>
-      <w:fldSimple w:instr=" SEQ Gambar \* ARABIC ">
-        <w:r>
-          <w:rPr>
-            <w:noProof/>
-          </w:rPr>
-          <w:t>12</w:t>
-        </w:r>
-      </w:fldSimple>
+      <w:r>
+        <w:fldChar w:fldCharType="begin"/>
+      </w:r>
+      <w:r>
+        <w:instrText xml:space="preserve"> SEQ Gambar \* ARABIC </w:instrText>
+      </w:r>
+      <w:r>
+        <w:fldChar w:fldCharType="separate"/>
+      </w:r>
+      <w:r>
+        <w:rPr>
+          <w:noProof/>
+        </w:rPr>
+        <w:t>12</w:t>
+      </w:r>
+      <w:r>
+        <w:rPr>
+          <w:noProof/>
+        </w:rPr>
+        <w:fldChar w:fldCharType="end"/>
+      </w:r>
       <w:r>
         <w:t xml:space="preserve"> Sampel data duplikat</w:t>
       </w:r>
@@ -5855,14 +6024,27 @@
       <w:r>
         <w:t xml:space="preserve">Gambar </w:t>
       </w:r>
-      <w:fldSimple w:instr=" SEQ Gambar \* ARABIC ">
-        <w:r>
-          <w:rPr>
-            <w:noProof/>
-          </w:rPr>
-          <w:t>13</w:t>
-        </w:r>
-      </w:fldSimple>
+      <w:r>
+        <w:fldChar w:fldCharType="begin"/>
+      </w:r>
+      <w:r>
+        <w:instrText xml:space="preserve"> SEQ Gambar \* ARABIC </w:instrText>
+      </w:r>
+      <w:r>
+        <w:fldChar w:fldCharType="separate"/>
+      </w:r>
+      <w:r>
+        <w:rPr>
+          <w:noProof/>
+        </w:rPr>
+        <w:t>13</w:t>
+      </w:r>
+      <w:r>
+        <w:rPr>
+          <w:noProof/>
+        </w:rPr>
+        <w:fldChar w:fldCharType="end"/>
+      </w:r>
       <w:r>
         <w:t xml:space="preserve"> </w:t>
       </w:r>
@@ -6525,14 +6707,27 @@
       <w:r>
         <w:t xml:space="preserve">Gambar </w:t>
       </w:r>
-      <w:fldSimple w:instr=" SEQ Gambar \* ARABIC ">
-        <w:r>
-          <w:rPr>
-            <w:noProof/>
-          </w:rPr>
-          <w:t>14</w:t>
-        </w:r>
-      </w:fldSimple>
+      <w:r>
+        <w:fldChar w:fldCharType="begin"/>
+      </w:r>
+      <w:r>
+        <w:instrText xml:space="preserve"> SEQ Gambar \* ARABIC </w:instrText>
+      </w:r>
+      <w:r>
+        <w:fldChar w:fldCharType="separate"/>
+      </w:r>
+      <w:r>
+        <w:rPr>
+          <w:noProof/>
+        </w:rPr>
+        <w:t>14</w:t>
+      </w:r>
+      <w:r>
+        <w:rPr>
+          <w:noProof/>
+        </w:rPr>
+        <w:fldChar w:fldCharType="end"/>
+      </w:r>
       <w:r>
         <w:t xml:space="preserve"> Distribusi jalur pendaftaran</w:t>
       </w:r>
@@ -6613,14 +6808,27 @@
       <w:r>
         <w:t xml:space="preserve">Gambar </w:t>
       </w:r>
-      <w:fldSimple w:instr=" SEQ Gambar \* ARABIC ">
-        <w:r>
-          <w:rPr>
-            <w:noProof/>
-          </w:rPr>
-          <w:t>15</w:t>
-        </w:r>
-      </w:fldSimple>
+      <w:r>
+        <w:fldChar w:fldCharType="begin"/>
+      </w:r>
+      <w:r>
+        <w:instrText xml:space="preserve"> SEQ Gambar \* ARABIC </w:instrText>
+      </w:r>
+      <w:r>
+        <w:fldChar w:fldCharType="separate"/>
+      </w:r>
+      <w:r>
+        <w:rPr>
+          <w:noProof/>
+        </w:rPr>
+        <w:t>15</w:t>
+      </w:r>
+      <w:r>
+        <w:rPr>
+          <w:noProof/>
+        </w:rPr>
+        <w:fldChar w:fldCharType="end"/>
+      </w:r>
       <w:r>
         <w:t xml:space="preserve"> </w:t>
       </w:r>
@@ -6713,14 +6921,27 @@
       <w:r>
         <w:t xml:space="preserve">Gambar </w:t>
       </w:r>
-      <w:fldSimple w:instr=" SEQ Gambar \* ARABIC ">
-        <w:r>
-          <w:rPr>
-            <w:noProof/>
-          </w:rPr>
-          <w:t>16</w:t>
-        </w:r>
-      </w:fldSimple>
+      <w:r>
+        <w:fldChar w:fldCharType="begin"/>
+      </w:r>
+      <w:r>
+        <w:instrText xml:space="preserve"> SEQ Gambar \* ARABIC </w:instrText>
+      </w:r>
+      <w:r>
+        <w:fldChar w:fldCharType="separate"/>
+      </w:r>
+      <w:r>
+        <w:rPr>
+          <w:noProof/>
+        </w:rPr>
+        <w:t>16</w:t>
+      </w:r>
+      <w:r>
+        <w:rPr>
+          <w:noProof/>
+        </w:rPr>
+        <w:fldChar w:fldCharType="end"/>
+      </w:r>
       <w:r>
         <w:t xml:space="preserve"> Distribusi </w:t>
       </w:r>
@@ -6803,14 +7024,27 @@
       <w:r>
         <w:t xml:space="preserve">Gambar </w:t>
       </w:r>
-      <w:fldSimple w:instr=" SEQ Gambar \* ARABIC ">
-        <w:r>
-          <w:rPr>
-            <w:noProof/>
-          </w:rPr>
-          <w:t>17</w:t>
-        </w:r>
-      </w:fldSimple>
+      <w:r>
+        <w:fldChar w:fldCharType="begin"/>
+      </w:r>
+      <w:r>
+        <w:instrText xml:space="preserve"> SEQ Gambar \* ARABIC </w:instrText>
+      </w:r>
+      <w:r>
+        <w:fldChar w:fldCharType="separate"/>
+      </w:r>
+      <w:r>
+        <w:rPr>
+          <w:noProof/>
+        </w:rPr>
+        <w:t>17</w:t>
+      </w:r>
+      <w:r>
+        <w:rPr>
+          <w:noProof/>
+        </w:rPr>
+        <w:fldChar w:fldCharType="end"/>
+      </w:r>
       <w:r>
         <w:t xml:space="preserve"> Distribusi </w:t>
       </w:r>
@@ -6833,7 +7067,7 @@
         </w:rPr>
         <w:lastRenderedPageBreak/>
         <w:drawing>
-          <wp:inline distT="0" distB="0" distL="0" distR="0" wp14:anchorId="5EBC01C6" wp14:editId="55A916F9">
+          <wp:inline distT="0" distB="0" distL="0" distR="0" wp14:anchorId="5EBC01C6" wp14:editId="29C6B4C3">
             <wp:extent cx="4320000" cy="4658802"/>
             <wp:effectExtent l="0" t="0" r="4445" b="8890"/>
             <wp:docPr id="1878337612" name="Picture 9"/>
@@ -6894,14 +7128,27 @@
       <w:r>
         <w:t xml:space="preserve">Gambar </w:t>
       </w:r>
-      <w:fldSimple w:instr=" SEQ Gambar \* ARABIC ">
-        <w:r>
-          <w:rPr>
-            <w:noProof/>
-          </w:rPr>
-          <w:t>18</w:t>
-        </w:r>
-      </w:fldSimple>
+      <w:r>
+        <w:fldChar w:fldCharType="begin"/>
+      </w:r>
+      <w:r>
+        <w:instrText xml:space="preserve"> SEQ Gambar \* ARABIC </w:instrText>
+      </w:r>
+      <w:r>
+        <w:fldChar w:fldCharType="separate"/>
+      </w:r>
+      <w:r>
+        <w:rPr>
+          <w:noProof/>
+        </w:rPr>
+        <w:t>18</w:t>
+      </w:r>
+      <w:r>
+        <w:rPr>
+          <w:noProof/>
+        </w:rPr>
+        <w:fldChar w:fldCharType="end"/>
+      </w:r>
       <w:r>
         <w:t xml:space="preserve"> Distribusi </w:t>
       </w:r>
@@ -6923,7 +7170,7 @@
           <w:noProof/>
         </w:rPr>
         <w:drawing>
-          <wp:inline distT="0" distB="0" distL="0" distR="0" wp14:anchorId="733B8FED" wp14:editId="4DF89CED">
+          <wp:inline distT="0" distB="0" distL="0" distR="0" wp14:anchorId="733B8FED" wp14:editId="6F0EE727">
             <wp:extent cx="4320000" cy="2058826"/>
             <wp:effectExtent l="0" t="0" r="4445" b="0"/>
             <wp:docPr id="55094509" name="Picture 10"/>
@@ -6984,14 +7231,27 @@
       <w:r>
         <w:t xml:space="preserve">Gambar </w:t>
       </w:r>
-      <w:fldSimple w:instr=" SEQ Gambar \* ARABIC ">
-        <w:r>
-          <w:rPr>
-            <w:noProof/>
-          </w:rPr>
-          <w:t>19</w:t>
-        </w:r>
-      </w:fldSimple>
+      <w:r>
+        <w:fldChar w:fldCharType="begin"/>
+      </w:r>
+      <w:r>
+        <w:instrText xml:space="preserve"> SEQ Gambar \* ARABIC </w:instrText>
+      </w:r>
+      <w:r>
+        <w:fldChar w:fldCharType="separate"/>
+      </w:r>
+      <w:r>
+        <w:rPr>
+          <w:noProof/>
+        </w:rPr>
+        <w:t>19</w:t>
+      </w:r>
+      <w:r>
+        <w:rPr>
+          <w:noProof/>
+        </w:rPr>
+        <w:fldChar w:fldCharType="end"/>
+      </w:r>
       <w:r>
         <w:t xml:space="preserve"> Distribusi </w:t>
       </w:r>
@@ -7075,14 +7335,27 @@
       <w:r>
         <w:t xml:space="preserve">Gambar </w:t>
       </w:r>
-      <w:fldSimple w:instr=" SEQ Gambar \* ARABIC ">
-        <w:r>
-          <w:rPr>
-            <w:noProof/>
-          </w:rPr>
-          <w:t>20</w:t>
-        </w:r>
-      </w:fldSimple>
+      <w:r>
+        <w:fldChar w:fldCharType="begin"/>
+      </w:r>
+      <w:r>
+        <w:instrText xml:space="preserve"> SEQ Gambar \* ARABIC </w:instrText>
+      </w:r>
+      <w:r>
+        <w:fldChar w:fldCharType="separate"/>
+      </w:r>
+      <w:r>
+        <w:rPr>
+          <w:noProof/>
+        </w:rPr>
+        <w:t>20</w:t>
+      </w:r>
+      <w:r>
+        <w:rPr>
+          <w:noProof/>
+        </w:rPr>
+        <w:fldChar w:fldCharType="end"/>
+      </w:r>
       <w:r>
         <w:t xml:space="preserve"> Distribusi </w:t>
       </w:r>
@@ -7104,7 +7377,7 @@
           <w:noProof/>
         </w:rPr>
         <w:drawing>
-          <wp:inline distT="0" distB="0" distL="0" distR="0" wp14:anchorId="314D0ACC" wp14:editId="3ABF0A3D">
+          <wp:inline distT="0" distB="0" distL="0" distR="0" wp14:anchorId="314D0ACC" wp14:editId="528FBB3D">
             <wp:extent cx="4320000" cy="2070296"/>
             <wp:effectExtent l="0" t="0" r="4445" b="6350"/>
             <wp:docPr id="1341359440" name="Picture 12"/>
@@ -7165,14 +7438,27 @@
       <w:r>
         <w:t xml:space="preserve">Gambar </w:t>
       </w:r>
-      <w:fldSimple w:instr=" SEQ Gambar \* ARABIC ">
-        <w:r>
-          <w:rPr>
-            <w:noProof/>
-          </w:rPr>
-          <w:t>21</w:t>
-        </w:r>
-      </w:fldSimple>
+      <w:r>
+        <w:fldChar w:fldCharType="begin"/>
+      </w:r>
+      <w:r>
+        <w:instrText xml:space="preserve"> SEQ Gambar \* ARABIC </w:instrText>
+      </w:r>
+      <w:r>
+        <w:fldChar w:fldCharType="separate"/>
+      </w:r>
+      <w:r>
+        <w:rPr>
+          <w:noProof/>
+        </w:rPr>
+        <w:t>21</w:t>
+      </w:r>
+      <w:r>
+        <w:rPr>
+          <w:noProof/>
+        </w:rPr>
+        <w:fldChar w:fldCharType="end"/>
+      </w:r>
       <w:r>
         <w:t xml:space="preserve"> Distribusi </w:t>
       </w:r>
@@ -7256,14 +7542,27 @@
       <w:r>
         <w:t xml:space="preserve">Gambar </w:t>
       </w:r>
-      <w:fldSimple w:instr=" SEQ Gambar \* ARABIC ">
-        <w:r>
-          <w:rPr>
-            <w:noProof/>
-          </w:rPr>
-          <w:t>22</w:t>
-        </w:r>
-      </w:fldSimple>
+      <w:r>
+        <w:fldChar w:fldCharType="begin"/>
+      </w:r>
+      <w:r>
+        <w:instrText xml:space="preserve"> SEQ Gambar \* ARABIC </w:instrText>
+      </w:r>
+      <w:r>
+        <w:fldChar w:fldCharType="separate"/>
+      </w:r>
+      <w:r>
+        <w:rPr>
+          <w:noProof/>
+        </w:rPr>
+        <w:t>22</w:t>
+      </w:r>
+      <w:r>
+        <w:rPr>
+          <w:noProof/>
+        </w:rPr>
+        <w:fldChar w:fldCharType="end"/>
+      </w:r>
       <w:r>
         <w:t xml:space="preserve"> Distribusi </w:t>
       </w:r>
@@ -7346,14 +7645,27 @@
       <w:r>
         <w:t xml:space="preserve">Gambar </w:t>
       </w:r>
-      <w:fldSimple w:instr=" SEQ Gambar \* ARABIC ">
-        <w:r>
-          <w:rPr>
-            <w:noProof/>
-          </w:rPr>
-          <w:t>23</w:t>
-        </w:r>
-      </w:fldSimple>
+      <w:r>
+        <w:fldChar w:fldCharType="begin"/>
+      </w:r>
+      <w:r>
+        <w:instrText xml:space="preserve"> SEQ Gambar \* ARABIC </w:instrText>
+      </w:r>
+      <w:r>
+        <w:fldChar w:fldCharType="separate"/>
+      </w:r>
+      <w:r>
+        <w:rPr>
+          <w:noProof/>
+        </w:rPr>
+        <w:t>23</w:t>
+      </w:r>
+      <w:r>
+        <w:rPr>
+          <w:noProof/>
+        </w:rPr>
+        <w:fldChar w:fldCharType="end"/>
+      </w:r>
       <w:r>
         <w:t xml:space="preserve"> Distribusi </w:t>
       </w:r>
@@ -7437,14 +7749,27 @@
       <w:r>
         <w:t xml:space="preserve">Gambar </w:t>
       </w:r>
-      <w:fldSimple w:instr=" SEQ Gambar \* ARABIC ">
-        <w:r>
-          <w:rPr>
-            <w:noProof/>
-          </w:rPr>
-          <w:t>24</w:t>
-        </w:r>
-      </w:fldSimple>
+      <w:r>
+        <w:fldChar w:fldCharType="begin"/>
+      </w:r>
+      <w:r>
+        <w:instrText xml:space="preserve"> SEQ Gambar \* ARABIC </w:instrText>
+      </w:r>
+      <w:r>
+        <w:fldChar w:fldCharType="separate"/>
+      </w:r>
+      <w:r>
+        <w:rPr>
+          <w:noProof/>
+        </w:rPr>
+        <w:t>24</w:t>
+      </w:r>
+      <w:r>
+        <w:rPr>
+          <w:noProof/>
+        </w:rPr>
+        <w:fldChar w:fldCharType="end"/>
+      </w:r>
       <w:r>
         <w:t xml:space="preserve"> Distribusi </w:t>
       </w:r>
@@ -7527,14 +7852,27 @@
       <w:r>
         <w:t xml:space="preserve">Gambar </w:t>
       </w:r>
-      <w:fldSimple w:instr=" SEQ Gambar \* ARABIC ">
-        <w:r>
-          <w:rPr>
-            <w:noProof/>
-          </w:rPr>
-          <w:t>25</w:t>
-        </w:r>
-      </w:fldSimple>
+      <w:r>
+        <w:fldChar w:fldCharType="begin"/>
+      </w:r>
+      <w:r>
+        <w:instrText xml:space="preserve"> SEQ Gambar \* ARABIC </w:instrText>
+      </w:r>
+      <w:r>
+        <w:fldChar w:fldCharType="separate"/>
+      </w:r>
+      <w:r>
+        <w:rPr>
+          <w:noProof/>
+        </w:rPr>
+        <w:t>25</w:t>
+      </w:r>
+      <w:r>
+        <w:rPr>
+          <w:noProof/>
+        </w:rPr>
+        <w:fldChar w:fldCharType="end"/>
+      </w:r>
       <w:r>
         <w:t xml:space="preserve"> Distribusi </w:t>
       </w:r>
@@ -7618,14 +7956,27 @@
       <w:r>
         <w:t xml:space="preserve">Gambar </w:t>
       </w:r>
-      <w:fldSimple w:instr=" SEQ Gambar \* ARABIC ">
-        <w:r>
-          <w:rPr>
-            <w:noProof/>
-          </w:rPr>
-          <w:t>26</w:t>
-        </w:r>
-      </w:fldSimple>
+      <w:r>
+        <w:fldChar w:fldCharType="begin"/>
+      </w:r>
+      <w:r>
+        <w:instrText xml:space="preserve"> SEQ Gambar \* ARABIC </w:instrText>
+      </w:r>
+      <w:r>
+        <w:fldChar w:fldCharType="separate"/>
+      </w:r>
+      <w:r>
+        <w:rPr>
+          <w:noProof/>
+        </w:rPr>
+        <w:t>26</w:t>
+      </w:r>
+      <w:r>
+        <w:rPr>
+          <w:noProof/>
+        </w:rPr>
+        <w:fldChar w:fldCharType="end"/>
+      </w:r>
       <w:r>
         <w:t xml:space="preserve"> Distribusi </w:t>
       </w:r>
@@ -8163,14 +8514,27 @@
       <w:r>
         <w:t xml:space="preserve">Gambar </w:t>
       </w:r>
-      <w:fldSimple w:instr=" SEQ Gambar \* ARABIC ">
-        <w:r>
-          <w:rPr>
-            <w:noProof/>
-          </w:rPr>
-          <w:t>27</w:t>
-        </w:r>
-      </w:fldSimple>
+      <w:r>
+        <w:fldChar w:fldCharType="begin"/>
+      </w:r>
+      <w:r>
+        <w:instrText xml:space="preserve"> SEQ Gambar \* ARABIC </w:instrText>
+      </w:r>
+      <w:r>
+        <w:fldChar w:fldCharType="separate"/>
+      </w:r>
+      <w:r>
+        <w:rPr>
+          <w:noProof/>
+        </w:rPr>
+        <w:t>27</w:t>
+      </w:r>
+      <w:r>
+        <w:rPr>
+          <w:noProof/>
+        </w:rPr>
+        <w:fldChar w:fldCharType="end"/>
+      </w:r>
       <w:r>
         <w:t xml:space="preserve"> Validasi ulang struktur data</w:t>
       </w:r>
@@ -8317,14 +8681,27 @@
       <w:r>
         <w:t xml:space="preserve">Gambar </w:t>
       </w:r>
-      <w:fldSimple w:instr=" SEQ Gambar \* ARABIC ">
-        <w:r>
-          <w:rPr>
-            <w:noProof/>
-          </w:rPr>
-          <w:t>28</w:t>
-        </w:r>
-      </w:fldSimple>
+      <w:r>
+        <w:fldChar w:fldCharType="begin"/>
+      </w:r>
+      <w:r>
+        <w:instrText xml:space="preserve"> SEQ Gambar \* ARABIC </w:instrText>
+      </w:r>
+      <w:r>
+        <w:fldChar w:fldCharType="separate"/>
+      </w:r>
+      <w:r>
+        <w:rPr>
+          <w:noProof/>
+        </w:rPr>
+        <w:t>28</w:t>
+      </w:r>
+      <w:r>
+        <w:rPr>
+          <w:noProof/>
+        </w:rPr>
+        <w:fldChar w:fldCharType="end"/>
+      </w:r>
       <w:r>
         <w:t xml:space="preserve"> Validasi ulang duplikasi data</w:t>
       </w:r>
@@ -8571,14 +8948,27 @@
       <w:r>
         <w:t xml:space="preserve">Gambar </w:t>
       </w:r>
-      <w:fldSimple w:instr=" SEQ Gambar \* ARABIC ">
-        <w:r>
-          <w:rPr>
-            <w:noProof/>
-          </w:rPr>
-          <w:t>29</w:t>
-        </w:r>
-      </w:fldSimple>
+      <w:r>
+        <w:fldChar w:fldCharType="begin"/>
+      </w:r>
+      <w:r>
+        <w:instrText xml:space="preserve"> SEQ Gambar \* ARABIC </w:instrText>
+      </w:r>
+      <w:r>
+        <w:fldChar w:fldCharType="separate"/>
+      </w:r>
+      <w:r>
+        <w:rPr>
+          <w:noProof/>
+        </w:rPr>
+        <w:t>29</w:t>
+      </w:r>
+      <w:r>
+        <w:rPr>
+          <w:noProof/>
+        </w:rPr>
+        <w:fldChar w:fldCharType="end"/>
+      </w:r>
       <w:r>
         <w:t xml:space="preserve"> </w:t>
       </w:r>
@@ -8667,14 +9057,27 @@
       <w:r>
         <w:t xml:space="preserve">Gambar </w:t>
       </w:r>
-      <w:fldSimple w:instr=" SEQ Gambar \* ARABIC ">
-        <w:r>
-          <w:rPr>
-            <w:noProof/>
-          </w:rPr>
-          <w:t>30</w:t>
-        </w:r>
-      </w:fldSimple>
+      <w:r>
+        <w:fldChar w:fldCharType="begin"/>
+      </w:r>
+      <w:r>
+        <w:instrText xml:space="preserve"> SEQ Gambar \* ARABIC </w:instrText>
+      </w:r>
+      <w:r>
+        <w:fldChar w:fldCharType="separate"/>
+      </w:r>
+      <w:r>
+        <w:rPr>
+          <w:noProof/>
+        </w:rPr>
+        <w:t>30</w:t>
+      </w:r>
+      <w:r>
+        <w:rPr>
+          <w:noProof/>
+        </w:rPr>
+        <w:fldChar w:fldCharType="end"/>
+      </w:r>
       <w:r>
         <w:t xml:space="preserve"> contoh data</w:t>
       </w:r>
@@ -8857,14 +9260,27 @@
       <w:r>
         <w:t xml:space="preserve">Gambar </w:t>
       </w:r>
-      <w:fldSimple w:instr=" SEQ Gambar \* ARABIC ">
-        <w:r>
-          <w:rPr>
-            <w:noProof/>
-          </w:rPr>
-          <w:t>31</w:t>
-        </w:r>
-      </w:fldSimple>
+      <w:r>
+        <w:fldChar w:fldCharType="begin"/>
+      </w:r>
+      <w:r>
+        <w:instrText xml:space="preserve"> SEQ Gambar \* ARABIC </w:instrText>
+      </w:r>
+      <w:r>
+        <w:fldChar w:fldCharType="separate"/>
+      </w:r>
+      <w:r>
+        <w:rPr>
+          <w:noProof/>
+        </w:rPr>
+        <w:t>31</w:t>
+      </w:r>
+      <w:r>
+        <w:rPr>
+          <w:noProof/>
+        </w:rPr>
+        <w:fldChar w:fldCharType="end"/>
+      </w:r>
       <w:r>
         <w:t xml:space="preserve"> validasi ulang distribusi usia</w:t>
       </w:r>
@@ -8941,14 +9357,27 @@
       <w:r>
         <w:t xml:space="preserve">Gambar </w:t>
       </w:r>
-      <w:fldSimple w:instr=" SEQ Gambar \* ARABIC ">
-        <w:r>
-          <w:rPr>
-            <w:noProof/>
-          </w:rPr>
-          <w:t>32</w:t>
-        </w:r>
-      </w:fldSimple>
+      <w:r>
+        <w:fldChar w:fldCharType="begin"/>
+      </w:r>
+      <w:r>
+        <w:instrText xml:space="preserve"> SEQ Gambar \* ARABIC </w:instrText>
+      </w:r>
+      <w:r>
+        <w:fldChar w:fldCharType="separate"/>
+      </w:r>
+      <w:r>
+        <w:rPr>
+          <w:noProof/>
+        </w:rPr>
+        <w:t>32</w:t>
+      </w:r>
+      <w:r>
+        <w:rPr>
+          <w:noProof/>
+        </w:rPr>
+        <w:fldChar w:fldCharType="end"/>
+      </w:r>
       <w:r>
         <w:t xml:space="preserve"> validasi ulang fakultas prodi diterima</w:t>
       </w:r>
@@ -9025,14 +9454,27 @@
       <w:r>
         <w:t xml:space="preserve">Gambar </w:t>
       </w:r>
-      <w:fldSimple w:instr=" SEQ Gambar \* ARABIC ">
-        <w:r>
-          <w:rPr>
-            <w:noProof/>
-          </w:rPr>
-          <w:t>33</w:t>
-        </w:r>
-      </w:fldSimple>
+      <w:r>
+        <w:fldChar w:fldCharType="begin"/>
+      </w:r>
+      <w:r>
+        <w:instrText xml:space="preserve"> SEQ Gambar \* ARABIC </w:instrText>
+      </w:r>
+      <w:r>
+        <w:fldChar w:fldCharType="separate"/>
+      </w:r>
+      <w:r>
+        <w:rPr>
+          <w:noProof/>
+        </w:rPr>
+        <w:t>33</w:t>
+      </w:r>
+      <w:r>
+        <w:rPr>
+          <w:noProof/>
+        </w:rPr>
+        <w:fldChar w:fldCharType="end"/>
+      </w:r>
       <w:r>
         <w:t xml:space="preserve"> validasi ulang distribusi fakultas prodi 1</w:t>
       </w:r>
@@ -9110,14 +9552,27 @@
       <w:r>
         <w:t xml:space="preserve">Gambar </w:t>
       </w:r>
-      <w:fldSimple w:instr=" SEQ Gambar \* ARABIC ">
-        <w:r>
-          <w:rPr>
-            <w:noProof/>
-          </w:rPr>
-          <w:t>34</w:t>
-        </w:r>
-      </w:fldSimple>
+      <w:r>
+        <w:fldChar w:fldCharType="begin"/>
+      </w:r>
+      <w:r>
+        <w:instrText xml:space="preserve"> SEQ Gambar \* ARABIC </w:instrText>
+      </w:r>
+      <w:r>
+        <w:fldChar w:fldCharType="separate"/>
+      </w:r>
+      <w:r>
+        <w:rPr>
+          <w:noProof/>
+        </w:rPr>
+        <w:t>34</w:t>
+      </w:r>
+      <w:r>
+        <w:rPr>
+          <w:noProof/>
+        </w:rPr>
+        <w:fldChar w:fldCharType="end"/>
+      </w:r>
       <w:r>
         <w:t xml:space="preserve"> validasi ulang distribusi fakultas prodi 2</w:t>
       </w:r>
@@ -9194,14 +9649,27 @@
       <w:r>
         <w:t xml:space="preserve">Gambar </w:t>
       </w:r>
-      <w:fldSimple w:instr=" SEQ Gambar \* ARABIC ">
-        <w:r>
-          <w:rPr>
-            <w:noProof/>
-          </w:rPr>
-          <w:t>35</w:t>
-        </w:r>
-      </w:fldSimple>
+      <w:r>
+        <w:fldChar w:fldCharType="begin"/>
+      </w:r>
+      <w:r>
+        <w:instrText xml:space="preserve"> SEQ Gambar \* ARABIC </w:instrText>
+      </w:r>
+      <w:r>
+        <w:fldChar w:fldCharType="separate"/>
+      </w:r>
+      <w:r>
+        <w:rPr>
+          <w:noProof/>
+        </w:rPr>
+        <w:t>35</w:t>
+      </w:r>
+      <w:r>
+        <w:rPr>
+          <w:noProof/>
+        </w:rPr>
+        <w:fldChar w:fldCharType="end"/>
+      </w:r>
       <w:r>
         <w:t xml:space="preserve"> validasi ulang distribusi prodi diterima</w:t>
       </w:r>
@@ -9279,14 +9747,27 @@
       <w:r>
         <w:t xml:space="preserve">Gambar </w:t>
       </w:r>
-      <w:fldSimple w:instr=" SEQ Gambar \* ARABIC ">
-        <w:r>
-          <w:rPr>
-            <w:noProof/>
-          </w:rPr>
-          <w:t>36</w:t>
-        </w:r>
-      </w:fldSimple>
+      <w:r>
+        <w:fldChar w:fldCharType="begin"/>
+      </w:r>
+      <w:r>
+        <w:instrText xml:space="preserve"> SEQ Gambar \* ARABIC </w:instrText>
+      </w:r>
+      <w:r>
+        <w:fldChar w:fldCharType="separate"/>
+      </w:r>
+      <w:r>
+        <w:rPr>
+          <w:noProof/>
+        </w:rPr>
+        <w:t>36</w:t>
+      </w:r>
+      <w:r>
+        <w:rPr>
+          <w:noProof/>
+        </w:rPr>
+        <w:fldChar w:fldCharType="end"/>
+      </w:r>
       <w:r>
         <w:t xml:space="preserve"> validasi ulang distribusi prodi pilihan 1</w:t>
       </w:r>
@@ -9367,14 +9848,27 @@
       <w:r>
         <w:t xml:space="preserve">Gambar </w:t>
       </w:r>
-      <w:fldSimple w:instr=" SEQ Gambar \* ARABIC ">
-        <w:r>
-          <w:rPr>
-            <w:noProof/>
-          </w:rPr>
-          <w:t>37</w:t>
-        </w:r>
-      </w:fldSimple>
+      <w:r>
+        <w:fldChar w:fldCharType="begin"/>
+      </w:r>
+      <w:r>
+        <w:instrText xml:space="preserve"> SEQ Gambar \* ARABIC </w:instrText>
+      </w:r>
+      <w:r>
+        <w:fldChar w:fldCharType="separate"/>
+      </w:r>
+      <w:r>
+        <w:rPr>
+          <w:noProof/>
+        </w:rPr>
+        <w:t>37</w:t>
+      </w:r>
+      <w:r>
+        <w:rPr>
+          <w:noProof/>
+        </w:rPr>
+        <w:fldChar w:fldCharType="end"/>
+      </w:r>
       <w:r>
         <w:t xml:space="preserve"> validasi ulang prodi pilihan 2</w:t>
       </w:r>
@@ -9601,14 +10095,27 @@
       <w:r>
         <w:t xml:space="preserve">Gambar </w:t>
       </w:r>
-      <w:fldSimple w:instr=" SEQ Gambar \* ARABIC ">
-        <w:r>
-          <w:rPr>
-            <w:noProof/>
-          </w:rPr>
-          <w:t>38</w:t>
-        </w:r>
-      </w:fldSimple>
+      <w:r>
+        <w:fldChar w:fldCharType="begin"/>
+      </w:r>
+      <w:r>
+        <w:instrText xml:space="preserve"> SEQ Gambar \* ARABIC </w:instrText>
+      </w:r>
+      <w:r>
+        <w:fldChar w:fldCharType="separate"/>
+      </w:r>
+      <w:r>
+        <w:rPr>
+          <w:noProof/>
+        </w:rPr>
+        <w:t>38</w:t>
+      </w:r>
+      <w:r>
+        <w:rPr>
+          <w:noProof/>
+        </w:rPr>
+        <w:fldChar w:fldCharType="end"/>
+      </w:r>
       <w:r>
         <w:t xml:space="preserve"> </w:t>
       </w:r>
@@ -9696,14 +10203,27 @@
       <w:r>
         <w:t xml:space="preserve">Gambar </w:t>
       </w:r>
-      <w:fldSimple w:instr=" SEQ Gambar \* ARABIC ">
-        <w:r>
-          <w:rPr>
-            <w:noProof/>
-          </w:rPr>
-          <w:t>39</w:t>
-        </w:r>
-      </w:fldSimple>
+      <w:r>
+        <w:fldChar w:fldCharType="begin"/>
+      </w:r>
+      <w:r>
+        <w:instrText xml:space="preserve"> SEQ Gambar \* ARABIC </w:instrText>
+      </w:r>
+      <w:r>
+        <w:fldChar w:fldCharType="separate"/>
+      </w:r>
+      <w:r>
+        <w:rPr>
+          <w:noProof/>
+        </w:rPr>
+        <w:t>39</w:t>
+      </w:r>
+      <w:r>
+        <w:rPr>
+          <w:noProof/>
+        </w:rPr>
+        <w:fldChar w:fldCharType="end"/>
+      </w:r>
       <w:r>
         <w:t xml:space="preserve"> sintaks pembuatan kolom Provinsi</w:t>
       </w:r>
@@ -9785,14 +10305,27 @@
       <w:r>
         <w:t xml:space="preserve">Gambar </w:t>
       </w:r>
-      <w:fldSimple w:instr=" SEQ Gambar \* ARABIC ">
-        <w:r>
-          <w:rPr>
-            <w:noProof/>
-          </w:rPr>
-          <w:t>40</w:t>
-        </w:r>
-      </w:fldSimple>
+      <w:r>
+        <w:fldChar w:fldCharType="begin"/>
+      </w:r>
+      <w:r>
+        <w:instrText xml:space="preserve"> SEQ Gambar \* ARABIC </w:instrText>
+      </w:r>
+      <w:r>
+        <w:fldChar w:fldCharType="separate"/>
+      </w:r>
+      <w:r>
+        <w:rPr>
+          <w:noProof/>
+        </w:rPr>
+        <w:t>40</w:t>
+      </w:r>
+      <w:r>
+        <w:rPr>
+          <w:noProof/>
+        </w:rPr>
+        <w:fldChar w:fldCharType="end"/>
+      </w:r>
       <w:r>
         <w:t xml:space="preserve"> </w:t>
       </w:r>
@@ -9934,7 +10467,21 @@
         <w:rPr>
           <w:rFonts w:ascii="Times New Roman" w:hAnsi="Times New Roman" w:cs="Times New Roman"/>
         </w:rPr>
-        <w:t xml:space="preserve"> Pada tahap ini, brainstorming sangat berguna untuk realisasi visualisasi yang lebih terstruktur</w:t>
+        <w:t xml:space="preserve"> Pada tahap ini, </w:t>
+      </w:r>
+      <w:r>
+        <w:rPr>
+          <w:rFonts w:ascii="Times New Roman" w:hAnsi="Times New Roman" w:cs="Times New Roman"/>
+          <w:i/>
+          <w:iCs/>
+        </w:rPr>
+        <w:t>brainstorming</w:t>
+      </w:r>
+      <w:r>
+        <w:rPr>
+          <w:rFonts w:ascii="Times New Roman" w:hAnsi="Times New Roman" w:cs="Times New Roman"/>
+        </w:rPr>
+        <w:t xml:space="preserve"> sangat berguna untuk realisasi visualisasi yang lebih terstruktur</w:t>
       </w:r>
       <w:r>
         <w:rPr>
@@ -9946,7 +10493,21 @@
         <w:rPr>
           <w:rFonts w:ascii="Times New Roman" w:hAnsi="Times New Roman" w:cs="Times New Roman"/>
         </w:rPr>
-        <w:t>hasil brainstorming:</w:t>
+        <w:t xml:space="preserve">hasil </w:t>
+      </w:r>
+      <w:r>
+        <w:rPr>
+          <w:rFonts w:ascii="Times New Roman" w:hAnsi="Times New Roman" w:cs="Times New Roman"/>
+          <w:i/>
+          <w:iCs/>
+        </w:rPr>
+        <w:t>brainstorming</w:t>
+      </w:r>
+      <w:r>
+        <w:rPr>
+          <w:rFonts w:ascii="Times New Roman" w:hAnsi="Times New Roman" w:cs="Times New Roman"/>
+        </w:rPr>
+        <w:t>:</w:t>
       </w:r>
     </w:p>
     <w:p>
@@ -10493,14 +11054,27 @@
       <w:r>
         <w:t xml:space="preserve">Gambar </w:t>
       </w:r>
-      <w:fldSimple w:instr=" SEQ Gambar \* ARABIC ">
-        <w:r>
-          <w:rPr>
-            <w:noProof/>
-          </w:rPr>
-          <w:t>41</w:t>
-        </w:r>
-      </w:fldSimple>
+      <w:r>
+        <w:fldChar w:fldCharType="begin"/>
+      </w:r>
+      <w:r>
+        <w:instrText xml:space="preserve"> SEQ Gambar \* ARABIC </w:instrText>
+      </w:r>
+      <w:r>
+        <w:fldChar w:fldCharType="separate"/>
+      </w:r>
+      <w:r>
+        <w:rPr>
+          <w:noProof/>
+        </w:rPr>
+        <w:t>41</w:t>
+      </w:r>
+      <w:r>
+        <w:rPr>
+          <w:noProof/>
+        </w:rPr>
+        <w:fldChar w:fldCharType="end"/>
+      </w:r>
       <w:r>
         <w:t xml:space="preserve"> dashboard overview</w:t>
       </w:r>
@@ -10597,14 +11171,27 @@
       <w:r>
         <w:t xml:space="preserve">Gambar </w:t>
       </w:r>
-      <w:fldSimple w:instr=" SEQ Gambar \* ARABIC ">
-        <w:r>
-          <w:rPr>
-            <w:noProof/>
-          </w:rPr>
-          <w:t>42</w:t>
-        </w:r>
-      </w:fldSimple>
+      <w:r>
+        <w:fldChar w:fldCharType="begin"/>
+      </w:r>
+      <w:r>
+        <w:instrText xml:space="preserve"> SEQ Gambar \* ARABIC </w:instrText>
+      </w:r>
+      <w:r>
+        <w:fldChar w:fldCharType="separate"/>
+      </w:r>
+      <w:r>
+        <w:rPr>
+          <w:noProof/>
+        </w:rPr>
+        <w:t>42</w:t>
+      </w:r>
+      <w:r>
+        <w:rPr>
+          <w:noProof/>
+        </w:rPr>
+        <w:fldChar w:fldCharType="end"/>
+      </w:r>
       <w:r>
         <w:t xml:space="preserve"> dashboard demografi</w:t>
       </w:r>
@@ -10747,6 +11334,52 @@
           <w:iCs/>
         </w:rPr>
         <w:t>dashboard</w:t>
+      </w:r>
+      <w:r>
+        <w:rPr>
+          <w:rFonts w:ascii="Times New Roman" w:hAnsi="Times New Roman" w:cs="Times New Roman"/>
+        </w:rPr>
+        <w:t>.</w:t>
+      </w:r>
+      <w:r>
+        <w:rPr>
+          <w:rFonts w:ascii="Times New Roman" w:hAnsi="Times New Roman" w:cs="Times New Roman"/>
+        </w:rPr>
+        <w:t xml:space="preserve"> </w:t>
+      </w:r>
+      <w:r>
+        <w:rPr>
+          <w:rFonts w:ascii="Times New Roman" w:hAnsi="Times New Roman" w:cs="Times New Roman"/>
+          <w:i/>
+          <w:iCs/>
+        </w:rPr>
+        <w:t>Landing page</w:t>
+      </w:r>
+      <w:r>
+        <w:rPr>
+          <w:rFonts w:ascii="Times New Roman" w:hAnsi="Times New Roman" w:cs="Times New Roman"/>
+        </w:rPr>
+        <w:t xml:space="preserve"> pada proyek ini dibuat menggunakan </w:t>
+      </w:r>
+      <w:r>
+        <w:rPr>
+          <w:rFonts w:ascii="Times New Roman" w:hAnsi="Times New Roman" w:cs="Times New Roman"/>
+        </w:rPr>
+        <w:t xml:space="preserve">template </w:t>
+      </w:r>
+      <w:r>
+        <w:rPr>
+          <w:rFonts w:ascii="Times New Roman" w:hAnsi="Times New Roman" w:cs="Times New Roman"/>
+        </w:rPr>
+        <w:t>website</w:t>
+      </w:r>
+      <w:r>
+        <w:rPr>
+          <w:rFonts w:ascii="Times New Roman" w:hAnsi="Times New Roman" w:cs="Times New Roman"/>
+          <w:i/>
+          <w:iCs/>
+        </w:rPr>
+        <w:t xml:space="preserve"> open source</w:t>
       </w:r>
       <w:r>
         <w:rPr>
@@ -11338,14 +11971,27 @@
       <w:r>
         <w:t xml:space="preserve">Gambar </w:t>
       </w:r>
-      <w:fldSimple w:instr=" SEQ Gambar \* ARABIC ">
-        <w:r>
-          <w:rPr>
-            <w:noProof/>
-          </w:rPr>
-          <w:t>43</w:t>
-        </w:r>
-      </w:fldSimple>
+      <w:r>
+        <w:fldChar w:fldCharType="begin"/>
+      </w:r>
+      <w:r>
+        <w:instrText xml:space="preserve"> SEQ Gambar \* ARABIC </w:instrText>
+      </w:r>
+      <w:r>
+        <w:fldChar w:fldCharType="separate"/>
+      </w:r>
+      <w:r>
+        <w:rPr>
+          <w:noProof/>
+        </w:rPr>
+        <w:t>43</w:t>
+      </w:r>
+      <w:r>
+        <w:rPr>
+          <w:noProof/>
+        </w:rPr>
+        <w:fldChar w:fldCharType="end"/>
+      </w:r>
       <w:r>
         <w:t xml:space="preserve"> bar navigasi halaman utama</w:t>
       </w:r>
@@ -11469,14 +12115,27 @@
       <w:r>
         <w:t xml:space="preserve">Gambar </w:t>
       </w:r>
-      <w:fldSimple w:instr=" SEQ Gambar \* ARABIC ">
-        <w:r>
-          <w:rPr>
-            <w:noProof/>
-          </w:rPr>
-          <w:t>44</w:t>
-        </w:r>
-      </w:fldSimple>
+      <w:r>
+        <w:fldChar w:fldCharType="begin"/>
+      </w:r>
+      <w:r>
+        <w:instrText xml:space="preserve"> SEQ Gambar \* ARABIC </w:instrText>
+      </w:r>
+      <w:r>
+        <w:fldChar w:fldCharType="separate"/>
+      </w:r>
+      <w:r>
+        <w:rPr>
+          <w:noProof/>
+        </w:rPr>
+        <w:t>44</w:t>
+      </w:r>
+      <w:r>
+        <w:rPr>
+          <w:noProof/>
+        </w:rPr>
+        <w:fldChar w:fldCharType="end"/>
+      </w:r>
       <w:r>
         <w:t xml:space="preserve"> judul proyek</w:t>
       </w:r>
@@ -11607,14 +12266,27 @@
       <w:r>
         <w:t xml:space="preserve">Gambar </w:t>
       </w:r>
-      <w:fldSimple w:instr=" SEQ Gambar \* ARABIC ">
-        <w:r>
-          <w:rPr>
-            <w:noProof/>
-          </w:rPr>
-          <w:t>45</w:t>
-        </w:r>
-      </w:fldSimple>
+      <w:r>
+        <w:fldChar w:fldCharType="begin"/>
+      </w:r>
+      <w:r>
+        <w:instrText xml:space="preserve"> SEQ Gambar \* ARABIC </w:instrText>
+      </w:r>
+      <w:r>
+        <w:fldChar w:fldCharType="separate"/>
+      </w:r>
+      <w:r>
+        <w:rPr>
+          <w:noProof/>
+        </w:rPr>
+        <w:t>45</w:t>
+      </w:r>
+      <w:r>
+        <w:rPr>
+          <w:noProof/>
+        </w:rPr>
+        <w:fldChar w:fldCharType="end"/>
+      </w:r>
       <w:r>
         <w:t xml:space="preserve"> permasalahan, tujuan, dan manfaat pada halaman utama</w:t>
       </w:r>
@@ -11764,14 +12436,27 @@
       <w:r>
         <w:t xml:space="preserve">Gambar </w:t>
       </w:r>
-      <w:fldSimple w:instr=" SEQ Gambar \* ARABIC ">
-        <w:r>
-          <w:rPr>
-            <w:noProof/>
-          </w:rPr>
-          <w:t>46</w:t>
-        </w:r>
-      </w:fldSimple>
+      <w:r>
+        <w:fldChar w:fldCharType="begin"/>
+      </w:r>
+      <w:r>
+        <w:instrText xml:space="preserve"> SEQ Gambar \* ARABIC </w:instrText>
+      </w:r>
+      <w:r>
+        <w:fldChar w:fldCharType="separate"/>
+      </w:r>
+      <w:r>
+        <w:rPr>
+          <w:noProof/>
+        </w:rPr>
+        <w:t>46</w:t>
+      </w:r>
+      <w:r>
+        <w:rPr>
+          <w:noProof/>
+        </w:rPr>
+        <w:fldChar w:fldCharType="end"/>
+      </w:r>
       <w:r>
         <w:t xml:space="preserve"> data pipeline pada halaman utama</w:t>
       </w:r>
@@ -11920,14 +12605,27 @@
       <w:r>
         <w:t xml:space="preserve">Gambar </w:t>
       </w:r>
-      <w:fldSimple w:instr=" SEQ Gambar \* ARABIC ">
-        <w:r>
-          <w:rPr>
-            <w:noProof/>
-          </w:rPr>
-          <w:t>47</w:t>
-        </w:r>
-      </w:fldSimple>
+      <w:r>
+        <w:fldChar w:fldCharType="begin"/>
+      </w:r>
+      <w:r>
+        <w:instrText xml:space="preserve"> SEQ Gambar \* ARABIC </w:instrText>
+      </w:r>
+      <w:r>
+        <w:fldChar w:fldCharType="separate"/>
+      </w:r>
+      <w:r>
+        <w:rPr>
+          <w:noProof/>
+        </w:rPr>
+        <w:t>47</w:t>
+      </w:r>
+      <w:r>
+        <w:rPr>
+          <w:noProof/>
+        </w:rPr>
+        <w:fldChar w:fldCharType="end"/>
+      </w:r>
       <w:r>
         <w:t xml:space="preserve"> funfact pada halaman utama</w:t>
       </w:r>
@@ -12059,14 +12757,27 @@
       <w:r>
         <w:t xml:space="preserve">Gambar </w:t>
       </w:r>
-      <w:fldSimple w:instr=" SEQ Gambar \* ARABIC ">
-        <w:r>
-          <w:rPr>
-            <w:noProof/>
-          </w:rPr>
-          <w:t>48</w:t>
-        </w:r>
-      </w:fldSimple>
+      <w:r>
+        <w:fldChar w:fldCharType="begin"/>
+      </w:r>
+      <w:r>
+        <w:instrText xml:space="preserve"> SEQ Gambar \* ARABIC </w:instrText>
+      </w:r>
+      <w:r>
+        <w:fldChar w:fldCharType="separate"/>
+      </w:r>
+      <w:r>
+        <w:rPr>
+          <w:noProof/>
+        </w:rPr>
+        <w:t>48</w:t>
+      </w:r>
+      <w:r>
+        <w:rPr>
+          <w:noProof/>
+        </w:rPr>
+        <w:fldChar w:fldCharType="end"/>
+      </w:r>
       <w:r>
         <w:t xml:space="preserve"> brainstorming dashboard pada halaman utama</w:t>
       </w:r>
@@ -12185,14 +12896,27 @@
       <w:r>
         <w:t xml:space="preserve">Gambar </w:t>
       </w:r>
-      <w:fldSimple w:instr=" SEQ Gambar \* ARABIC ">
-        <w:r>
-          <w:rPr>
-            <w:noProof/>
-          </w:rPr>
-          <w:t>49</w:t>
-        </w:r>
-      </w:fldSimple>
+      <w:r>
+        <w:fldChar w:fldCharType="begin"/>
+      </w:r>
+      <w:r>
+        <w:instrText xml:space="preserve"> SEQ Gambar \* ARABIC </w:instrText>
+      </w:r>
+      <w:r>
+        <w:fldChar w:fldCharType="separate"/>
+      </w:r>
+      <w:r>
+        <w:rPr>
+          <w:noProof/>
+        </w:rPr>
+        <w:t>49</w:t>
+      </w:r>
+      <w:r>
+        <w:rPr>
+          <w:noProof/>
+        </w:rPr>
+        <w:fldChar w:fldCharType="end"/>
+      </w:r>
       <w:r>
         <w:t xml:space="preserve"> ucapan terimakasih pada halaman utama</w:t>
       </w:r>
@@ -12336,14 +13060,27 @@
       <w:r>
         <w:t xml:space="preserve">Gambar </w:t>
       </w:r>
-      <w:fldSimple w:instr=" SEQ Gambar \* ARABIC ">
-        <w:r>
-          <w:rPr>
-            <w:noProof/>
-          </w:rPr>
-          <w:t>50</w:t>
-        </w:r>
-      </w:fldSimple>
+      <w:r>
+        <w:fldChar w:fldCharType="begin"/>
+      </w:r>
+      <w:r>
+        <w:instrText xml:space="preserve"> SEQ Gambar \* ARABIC </w:instrText>
+      </w:r>
+      <w:r>
+        <w:fldChar w:fldCharType="separate"/>
+      </w:r>
+      <w:r>
+        <w:rPr>
+          <w:noProof/>
+        </w:rPr>
+        <w:t>50</w:t>
+      </w:r>
+      <w:r>
+        <w:rPr>
+          <w:noProof/>
+        </w:rPr>
+        <w:fldChar w:fldCharType="end"/>
+      </w:r>
       <w:r>
         <w:t xml:space="preserve"> watermark pada halaman utama</w:t>
       </w:r>
@@ -12470,14 +13207,27 @@
       <w:r>
         <w:t xml:space="preserve">Gambar </w:t>
       </w:r>
-      <w:fldSimple w:instr=" SEQ Gambar \* ARABIC ">
-        <w:r>
-          <w:rPr>
-            <w:noProof/>
-          </w:rPr>
-          <w:t>51</w:t>
-        </w:r>
-      </w:fldSimple>
+      <w:r>
+        <w:fldChar w:fldCharType="begin"/>
+      </w:r>
+      <w:r>
+        <w:instrText xml:space="preserve"> SEQ Gambar \* ARABIC </w:instrText>
+      </w:r>
+      <w:r>
+        <w:fldChar w:fldCharType="separate"/>
+      </w:r>
+      <w:r>
+        <w:rPr>
+          <w:noProof/>
+        </w:rPr>
+        <w:t>51</w:t>
+      </w:r>
+      <w:r>
+        <w:rPr>
+          <w:noProof/>
+        </w:rPr>
+        <w:fldChar w:fldCharType="end"/>
+      </w:r>
       <w:r>
         <w:t xml:space="preserve"> bar navigasi halaman cara membaca</w:t>
       </w:r>
@@ -12601,14 +13351,27 @@
       <w:r>
         <w:t xml:space="preserve">Gambar </w:t>
       </w:r>
-      <w:fldSimple w:instr=" SEQ Gambar \* ARABIC ">
-        <w:r>
-          <w:rPr>
-            <w:noProof/>
-          </w:rPr>
-          <w:t>52</w:t>
-        </w:r>
-      </w:fldSimple>
+      <w:r>
+        <w:fldChar w:fldCharType="begin"/>
+      </w:r>
+      <w:r>
+        <w:instrText xml:space="preserve"> SEQ Gambar \* ARABIC </w:instrText>
+      </w:r>
+      <w:r>
+        <w:fldChar w:fldCharType="separate"/>
+      </w:r>
+      <w:r>
+        <w:rPr>
+          <w:noProof/>
+        </w:rPr>
+        <w:t>52</w:t>
+      </w:r>
+      <w:r>
+        <w:rPr>
+          <w:noProof/>
+        </w:rPr>
+        <w:fldChar w:fldCharType="end"/>
+      </w:r>
       <w:r>
         <w:t xml:space="preserve"> cara membaca pada halaman cara membaca</w:t>
       </w:r>
@@ -12741,14 +13504,27 @@
       <w:r>
         <w:t xml:space="preserve">Gambar </w:t>
       </w:r>
-      <w:fldSimple w:instr=" SEQ Gambar \* ARABIC ">
-        <w:r>
-          <w:rPr>
-            <w:noProof/>
-          </w:rPr>
-          <w:t>53</w:t>
-        </w:r>
-      </w:fldSimple>
+      <w:r>
+        <w:fldChar w:fldCharType="begin"/>
+      </w:r>
+      <w:r>
+        <w:instrText xml:space="preserve"> SEQ Gambar \* ARABIC </w:instrText>
+      </w:r>
+      <w:r>
+        <w:fldChar w:fldCharType="separate"/>
+      </w:r>
+      <w:r>
+        <w:rPr>
+          <w:noProof/>
+        </w:rPr>
+        <w:t>53</w:t>
+      </w:r>
+      <w:r>
+        <w:rPr>
+          <w:noProof/>
+        </w:rPr>
+        <w:fldChar w:fldCharType="end"/>
+      </w:r>
       <w:r>
         <w:t xml:space="preserve"> watermark pada halaman cara membaca</w:t>
       </w:r>
@@ -12767,16 +13543,430 @@
     <w:p>
       <w:pPr>
         <w:spacing w:line="480" w:lineRule="auto"/>
-        <w:rPr>
-          <w:rFonts w:ascii="Times New Roman" w:hAnsi="Times New Roman" w:cs="Times New Roman"/>
-        </w:rPr>
-      </w:pPr>
-      <w:r>
-        <w:rPr>
-          <w:rFonts w:ascii="Times New Roman" w:hAnsi="Times New Roman" w:cs="Times New Roman"/>
-        </w:rPr>
-        <w:t>sss</w:t>
-      </w:r>
+        <w:ind w:firstLine="720"/>
+        <w:jc w:val="both"/>
+        <w:rPr>
+          <w:rFonts w:ascii="Times New Roman" w:hAnsi="Times New Roman" w:cs="Times New Roman"/>
+        </w:rPr>
+      </w:pPr>
+      <w:r>
+        <w:rPr>
+          <w:rFonts w:ascii="Times New Roman" w:hAnsi="Times New Roman" w:cs="Times New Roman"/>
+        </w:rPr>
+        <w:t>Berikut ini adalah kendala tiap tahapan pelaksanaan pada saat proyek ini dikerjakan</w:t>
+      </w:r>
+      <w:r>
+        <w:rPr>
+          <w:rFonts w:ascii="Times New Roman" w:hAnsi="Times New Roman" w:cs="Times New Roman"/>
+        </w:rPr>
+        <w:t>:</w:t>
+      </w:r>
+    </w:p>
+    <w:p>
+      <w:pPr>
+        <w:pStyle w:val="Heading4"/>
+        <w:numPr>
+          <w:ilvl w:val="0"/>
+          <w:numId w:val="32"/>
+        </w:numPr>
+      </w:pPr>
+      <w:r>
+        <w:t>Pengumpulan data</w:t>
+      </w:r>
+    </w:p>
+    <w:p>
+      <w:pPr>
+        <w:pStyle w:val="ListParagraph"/>
+        <w:spacing w:line="480" w:lineRule="auto"/>
+        <w:ind w:firstLine="720"/>
+        <w:jc w:val="both"/>
+        <w:rPr>
+          <w:rFonts w:ascii="Times New Roman" w:hAnsi="Times New Roman" w:cs="Times New Roman"/>
+        </w:rPr>
+      </w:pPr>
+      <w:r>
+        <w:rPr>
+          <w:rFonts w:ascii="Times New Roman" w:hAnsi="Times New Roman" w:cs="Times New Roman"/>
+        </w:rPr>
+        <w:t>Kendala yang dialami pada tahap pengumpulan data adalah lamanya proses pada tahap ini. Tahap ini mamakan waktu kurang lebih 1 bulan</w:t>
+      </w:r>
+      <w:r>
+        <w:rPr>
+          <w:rFonts w:ascii="Times New Roman" w:hAnsi="Times New Roman" w:cs="Times New Roman"/>
+        </w:rPr>
+        <w:t>, pengumpulan data sendiri adalah tahap yang paling lama dikerjakan pada proyek ini</w:t>
+      </w:r>
+      <w:r>
+        <w:rPr>
+          <w:rFonts w:ascii="Times New Roman" w:hAnsi="Times New Roman" w:cs="Times New Roman"/>
+        </w:rPr>
+        <w:t>. Hal ini disebabkan oleh padatnya aktifitas dan keterbatasan jam kerja mitra proyek</w:t>
+      </w:r>
+      <w:r>
+        <w:rPr>
+          <w:rFonts w:ascii="Times New Roman" w:hAnsi="Times New Roman" w:cs="Times New Roman"/>
+        </w:rPr>
+        <w:t>.</w:t>
+      </w:r>
+    </w:p>
+    <w:p>
+      <w:pPr>
+        <w:pStyle w:val="Heading4"/>
+        <w:rPr>
+          <w:i/>
+          <w:iCs w:val="0"/>
+        </w:rPr>
+      </w:pPr>
+      <w:r>
+        <w:rPr>
+          <w:i/>
+          <w:iCs w:val="0"/>
+        </w:rPr>
+        <w:lastRenderedPageBreak/>
+        <w:t>Preprocessing</w:t>
+      </w:r>
+    </w:p>
+    <w:p>
+      <w:pPr>
+        <w:pStyle w:val="ListParagraph"/>
+        <w:spacing w:line="480" w:lineRule="auto"/>
+        <w:ind w:firstLine="720"/>
+        <w:jc w:val="both"/>
+        <w:rPr>
+          <w:rFonts w:ascii="Times New Roman" w:hAnsi="Times New Roman" w:cs="Times New Roman"/>
+        </w:rPr>
+      </w:pPr>
+      <w:r>
+        <w:rPr>
+          <w:rFonts w:ascii="Times New Roman" w:hAnsi="Times New Roman" w:cs="Times New Roman"/>
+        </w:rPr>
+        <w:t xml:space="preserve">Selama </w:t>
+      </w:r>
+      <w:r>
+        <w:rPr>
+          <w:rFonts w:ascii="Times New Roman" w:hAnsi="Times New Roman" w:cs="Times New Roman"/>
+        </w:rPr>
+        <w:t xml:space="preserve">serangkaian </w:t>
+      </w:r>
+      <w:r>
+        <w:rPr>
+          <w:rFonts w:ascii="Times New Roman" w:hAnsi="Times New Roman" w:cs="Times New Roman"/>
+        </w:rPr>
+        <w:t xml:space="preserve">tahap </w:t>
+      </w:r>
+      <w:r>
+        <w:rPr>
+          <w:rFonts w:ascii="Times New Roman" w:hAnsi="Times New Roman" w:cs="Times New Roman"/>
+          <w:i/>
+          <w:iCs/>
+        </w:rPr>
+        <w:t>pre-processing</w:t>
+      </w:r>
+      <w:r>
+        <w:rPr>
+          <w:rFonts w:ascii="Times New Roman" w:hAnsi="Times New Roman" w:cs="Times New Roman"/>
+        </w:rPr>
+        <w:t xml:space="preserve"> </w:t>
+      </w:r>
+      <w:r>
+        <w:rPr>
+          <w:rFonts w:ascii="Times New Roman" w:hAnsi="Times New Roman" w:cs="Times New Roman"/>
+        </w:rPr>
+        <w:t>pada proyek ini</w:t>
+      </w:r>
+      <w:r>
+        <w:rPr>
+          <w:rFonts w:ascii="Times New Roman" w:hAnsi="Times New Roman" w:cs="Times New Roman"/>
+        </w:rPr>
+        <w:t xml:space="preserve"> </w:t>
+      </w:r>
+      <w:r>
+        <w:rPr>
+          <w:rFonts w:ascii="Times New Roman" w:hAnsi="Times New Roman" w:cs="Times New Roman"/>
+        </w:rPr>
+        <w:t>dilakukan</w:t>
+      </w:r>
+      <w:r>
+        <w:rPr>
+          <w:rFonts w:ascii="Times New Roman" w:hAnsi="Times New Roman" w:cs="Times New Roman"/>
+        </w:rPr>
+        <w:t xml:space="preserve">, tidak ada </w:t>
+      </w:r>
+      <w:r>
+        <w:rPr>
+          <w:rFonts w:ascii="Times New Roman" w:hAnsi="Times New Roman" w:cs="Times New Roman"/>
+        </w:rPr>
+        <w:t xml:space="preserve">kendala yang dihadapi. Semua serangkaian proses pada tahap </w:t>
+      </w:r>
+      <w:r>
+        <w:rPr>
+          <w:rFonts w:ascii="Times New Roman" w:hAnsi="Times New Roman" w:cs="Times New Roman"/>
+          <w:i/>
+          <w:iCs/>
+        </w:rPr>
+        <w:t>pre-processing</w:t>
+      </w:r>
+      <w:r>
+        <w:rPr>
+          <w:rFonts w:ascii="Times New Roman" w:hAnsi="Times New Roman" w:cs="Times New Roman"/>
+        </w:rPr>
+        <w:t xml:space="preserve"> dilakukan secara terstruktur, mulai dari penggabungan </w:t>
+      </w:r>
+      <w:r>
+        <w:rPr>
+          <w:rFonts w:ascii="Times New Roman" w:hAnsi="Times New Roman" w:cs="Times New Roman"/>
+          <w:i/>
+          <w:iCs/>
+        </w:rPr>
+        <w:t>dataset</w:t>
+      </w:r>
+      <w:r>
+        <w:rPr>
+          <w:rFonts w:ascii="Times New Roman" w:hAnsi="Times New Roman" w:cs="Times New Roman"/>
+        </w:rPr>
+        <w:t xml:space="preserve">, pemilihan kolom, validasi data, dan </w:t>
+      </w:r>
+      <w:r>
+        <w:rPr>
+          <w:rFonts w:ascii="Times New Roman" w:hAnsi="Times New Roman" w:cs="Times New Roman"/>
+          <w:i/>
+          <w:iCs/>
+        </w:rPr>
+        <w:t>problem solving</w:t>
+      </w:r>
+      <w:r>
+        <w:rPr>
+          <w:rFonts w:ascii="Times New Roman" w:hAnsi="Times New Roman" w:cs="Times New Roman"/>
+        </w:rPr>
+        <w:t>.</w:t>
+      </w:r>
+    </w:p>
+    <w:p>
+      <w:pPr>
+        <w:pStyle w:val="Heading4"/>
+      </w:pPr>
+      <w:r>
+        <w:t>Representasi</w:t>
+      </w:r>
+    </w:p>
+    <w:p>
+      <w:pPr>
+        <w:pStyle w:val="ListParagraph"/>
+        <w:spacing w:line="480" w:lineRule="auto"/>
+        <w:ind w:firstLine="720"/>
+        <w:jc w:val="both"/>
+        <w:rPr>
+          <w:rFonts w:ascii="Times New Roman" w:hAnsi="Times New Roman" w:cs="Times New Roman"/>
+        </w:rPr>
+      </w:pPr>
+      <w:r>
+        <w:rPr>
+          <w:rFonts w:ascii="Times New Roman" w:hAnsi="Times New Roman" w:cs="Times New Roman"/>
+        </w:rPr>
+        <w:t xml:space="preserve">Tahap representasi memiliki 2 rangkaian proses, yaitu </w:t>
+      </w:r>
+      <w:r>
+        <w:rPr>
+          <w:rFonts w:ascii="Times New Roman" w:hAnsi="Times New Roman" w:cs="Times New Roman"/>
+          <w:i/>
+          <w:iCs/>
+        </w:rPr>
+        <w:t>brainstorming</w:t>
+      </w:r>
+      <w:r>
+        <w:rPr>
+          <w:rFonts w:ascii="Times New Roman" w:hAnsi="Times New Roman" w:cs="Times New Roman"/>
+        </w:rPr>
+        <w:t xml:space="preserve"> dan visualisasi. Tidak ada kendala yang dihadapi pada proses </w:t>
+      </w:r>
+      <w:r>
+        <w:rPr>
+          <w:rFonts w:ascii="Times New Roman" w:hAnsi="Times New Roman" w:cs="Times New Roman"/>
+          <w:i/>
+          <w:iCs/>
+        </w:rPr>
+        <w:t>brainstorming</w:t>
+      </w:r>
+      <w:r>
+        <w:rPr>
+          <w:rFonts w:ascii="Times New Roman" w:hAnsi="Times New Roman" w:cs="Times New Roman"/>
+        </w:rPr>
+        <w:t xml:space="preserve">. Terdapat kendala berupa sulitnya </w:t>
+      </w:r>
+      <w:r>
+        <w:rPr>
+          <w:rFonts w:ascii="Times New Roman" w:hAnsi="Times New Roman" w:cs="Times New Roman"/>
+        </w:rPr>
+        <w:t>realisasi</w:t>
+      </w:r>
+      <w:r>
+        <w:rPr>
+          <w:rFonts w:ascii="Times New Roman" w:hAnsi="Times New Roman" w:cs="Times New Roman"/>
+        </w:rPr>
+        <w:t xml:space="preserve"> </w:t>
+      </w:r>
+      <w:r>
+        <w:rPr>
+          <w:rFonts w:ascii="Times New Roman" w:hAnsi="Times New Roman" w:cs="Times New Roman"/>
+          <w:i/>
+          <w:iCs/>
+        </w:rPr>
+        <w:t>brainstorming</w:t>
+      </w:r>
+      <w:r>
+        <w:rPr>
+          <w:rFonts w:ascii="Times New Roman" w:hAnsi="Times New Roman" w:cs="Times New Roman"/>
+        </w:rPr>
+        <w:t xml:space="preserve"> dalam bentu</w:t>
+      </w:r>
+      <w:r>
+        <w:rPr>
+          <w:rFonts w:ascii="Times New Roman" w:hAnsi="Times New Roman" w:cs="Times New Roman"/>
+        </w:rPr>
+        <w:t xml:space="preserve">k </w:t>
+      </w:r>
+      <w:r>
+        <w:rPr>
+          <w:rFonts w:ascii="Times New Roman" w:hAnsi="Times New Roman" w:cs="Times New Roman"/>
+        </w:rPr>
+        <w:t>visual</w:t>
+      </w:r>
+      <w:r>
+        <w:rPr>
+          <w:rFonts w:ascii="Times New Roman" w:hAnsi="Times New Roman" w:cs="Times New Roman"/>
+        </w:rPr>
+        <w:t>.</w:t>
+      </w:r>
+      <w:r>
+        <w:rPr>
+          <w:rFonts w:ascii="Times New Roman" w:hAnsi="Times New Roman" w:cs="Times New Roman"/>
+        </w:rPr>
+        <w:t xml:space="preserve"> Hal ini </w:t>
+      </w:r>
+      <w:r>
+        <w:rPr>
+          <w:rFonts w:ascii="Times New Roman" w:hAnsi="Times New Roman" w:cs="Times New Roman"/>
+        </w:rPr>
+        <w:t xml:space="preserve">terjadi </w:t>
+      </w:r>
+      <w:r>
+        <w:rPr>
+          <w:rFonts w:ascii="Times New Roman" w:hAnsi="Times New Roman" w:cs="Times New Roman"/>
+        </w:rPr>
+        <w:t>karena keterbatasan kemampuan</w:t>
+      </w:r>
+      <w:r>
+        <w:rPr>
+          <w:rFonts w:ascii="Times New Roman" w:hAnsi="Times New Roman" w:cs="Times New Roman"/>
+        </w:rPr>
+        <w:t xml:space="preserve"> penulis dalam </w:t>
+      </w:r>
+      <w:r>
+        <w:rPr>
+          <w:rFonts w:ascii="Times New Roman" w:hAnsi="Times New Roman" w:cs="Times New Roman"/>
+        </w:rPr>
+        <w:t xml:space="preserve">menggunakan </w:t>
+      </w:r>
+      <w:r>
+        <w:rPr>
+          <w:rFonts w:ascii="Times New Roman" w:hAnsi="Times New Roman" w:cs="Times New Roman"/>
+          <w:i/>
+          <w:iCs/>
+        </w:rPr>
+        <w:t>software</w:t>
+      </w:r>
+      <w:r>
+        <w:rPr>
+          <w:rFonts w:ascii="Times New Roman" w:hAnsi="Times New Roman" w:cs="Times New Roman"/>
+        </w:rPr>
+        <w:t xml:space="preserve"> Tableau Public</w:t>
+      </w:r>
+      <w:r>
+        <w:rPr>
+          <w:rFonts w:ascii="Times New Roman" w:hAnsi="Times New Roman" w:cs="Times New Roman"/>
+        </w:rPr>
+        <w:t>.</w:t>
+      </w:r>
+    </w:p>
+    <w:p>
+      <w:pPr>
+        <w:pStyle w:val="Heading4"/>
+      </w:pPr>
+      <w:r>
+        <w:t>Pembuatan landing page</w:t>
+      </w:r>
+    </w:p>
+    <w:p>
+      <w:pPr>
+        <w:pStyle w:val="ListParagraph"/>
+        <w:spacing w:line="480" w:lineRule="auto"/>
+        <w:ind w:firstLine="720"/>
+        <w:jc w:val="both"/>
+        <w:rPr>
+          <w:rFonts w:ascii="Times New Roman" w:hAnsi="Times New Roman" w:cs="Times New Roman"/>
+        </w:rPr>
+      </w:pPr>
+      <w:r>
+        <w:rPr>
+          <w:rFonts w:ascii="Times New Roman" w:hAnsi="Times New Roman" w:cs="Times New Roman"/>
+        </w:rPr>
+        <w:t xml:space="preserve">Tidak ada ada kendala </w:t>
+      </w:r>
+      <w:r>
+        <w:rPr>
+          <w:rFonts w:ascii="Times New Roman" w:hAnsi="Times New Roman" w:cs="Times New Roman"/>
+        </w:rPr>
+        <w:t xml:space="preserve">yang dihadapi </w:t>
+      </w:r>
+      <w:r>
+        <w:rPr>
+          <w:rFonts w:ascii="Times New Roman" w:hAnsi="Times New Roman" w:cs="Times New Roman"/>
+        </w:rPr>
+        <w:t xml:space="preserve">dalam serangkaian proses pembuatan </w:t>
+      </w:r>
+      <w:r>
+        <w:rPr>
+          <w:rFonts w:ascii="Times New Roman" w:hAnsi="Times New Roman" w:cs="Times New Roman"/>
+          <w:i/>
+          <w:iCs/>
+        </w:rPr>
+        <w:t>landing page</w:t>
+      </w:r>
+      <w:r>
+        <w:rPr>
+          <w:rFonts w:ascii="Times New Roman" w:hAnsi="Times New Roman" w:cs="Times New Roman"/>
+        </w:rPr>
+        <w:t xml:space="preserve"> mulai dari </w:t>
+      </w:r>
+      <w:r>
+        <w:rPr>
+          <w:rFonts w:ascii="Times New Roman" w:hAnsi="Times New Roman" w:cs="Times New Roman"/>
+          <w:i/>
+          <w:iCs/>
+        </w:rPr>
+        <w:t>brainstorming</w:t>
+      </w:r>
+      <w:r>
+        <w:rPr>
+          <w:rFonts w:ascii="Times New Roman" w:hAnsi="Times New Roman" w:cs="Times New Roman"/>
+        </w:rPr>
+        <w:t xml:space="preserve"> hingga realisasi</w:t>
+      </w:r>
+      <w:r>
+        <w:rPr>
+          <w:rFonts w:ascii="Times New Roman" w:hAnsi="Times New Roman" w:cs="Times New Roman"/>
+        </w:rPr>
+        <w:t>.</w:t>
+      </w:r>
+    </w:p>
+    <w:p>
+      <w:pPr>
+        <w:spacing w:line="480" w:lineRule="auto"/>
+        <w:jc w:val="both"/>
+        <w:rPr>
+          <w:rFonts w:ascii="Times New Roman" w:hAnsi="Times New Roman" w:cs="Times New Roman"/>
+        </w:rPr>
+      </w:pPr>
     </w:p>
     <w:sectPr>
       <w:pgSz w:w="11909" w:h="16834" w:code="9"/>
@@ -12904,6 +14094,92 @@
     </w:lvl>
   </w:abstractNum>
   <w:abstractNum w:abstractNumId="1" w15:restartNumberingAfterBreak="0">
+    <w:nsid w:val="0D064769"/>
+    <w:multiLevelType w:val="hybridMultilevel"/>
+    <w:tmpl w:val="A1FCCCE2"/>
+    <w:lvl w:ilvl="0" w:tplc="0409000F">
+      <w:start w:val="1"/>
+      <w:numFmt w:val="decimal"/>
+      <w:lvlText w:val="%1."/>
+      <w:lvlJc w:val="left"/>
+      <w:pPr>
+        <w:ind w:left="720" w:hanging="360"/>
+      </w:pPr>
+    </w:lvl>
+    <w:lvl w:ilvl="1" w:tplc="04090019" w:tentative="1">
+      <w:start w:val="1"/>
+      <w:numFmt w:val="lowerLetter"/>
+      <w:lvlText w:val="%2."/>
+      <w:lvlJc w:val="left"/>
+      <w:pPr>
+        <w:ind w:left="1440" w:hanging="360"/>
+      </w:pPr>
+    </w:lvl>
+    <w:lvl w:ilvl="2" w:tplc="0409001B" w:tentative="1">
+      <w:start w:val="1"/>
+      <w:numFmt w:val="lowerRoman"/>
+      <w:lvlText w:val="%3."/>
+      <w:lvlJc w:val="right"/>
+      <w:pPr>
+        <w:ind w:left="2160" w:hanging="180"/>
+      </w:pPr>
+    </w:lvl>
+    <w:lvl w:ilvl="3" w:tplc="0409000F" w:tentative="1">
+      <w:start w:val="1"/>
+      <w:numFmt w:val="decimal"/>
+      <w:lvlText w:val="%4."/>
+      <w:lvlJc w:val="left"/>
+      <w:pPr>
+        <w:ind w:left="2880" w:hanging="360"/>
+      </w:pPr>
+    </w:lvl>
+    <w:lvl w:ilvl="4" w:tplc="04090019" w:tentative="1">
+      <w:start w:val="1"/>
+      <w:numFmt w:val="lowerLetter"/>
+      <w:lvlText w:val="%5."/>
+      <w:lvlJc w:val="left"/>
+      <w:pPr>
+        <w:ind w:left="3600" w:hanging="360"/>
+      </w:pPr>
+    </w:lvl>
+    <w:lvl w:ilvl="5" w:tplc="0409001B" w:tentative="1">
+      <w:start w:val="1"/>
+      <w:numFmt w:val="lowerRoman"/>
+      <w:lvlText w:val="%6."/>
+      <w:lvlJc w:val="right"/>
+      <w:pPr>
+        <w:ind w:left="4320" w:hanging="180"/>
+      </w:pPr>
+    </w:lvl>
+    <w:lvl w:ilvl="6" w:tplc="0409000F" w:tentative="1">
+      <w:start w:val="1"/>
+      <w:numFmt w:val="decimal"/>
+      <w:lvlText w:val="%7."/>
+      <w:lvlJc w:val="left"/>
+      <w:pPr>
+        <w:ind w:left="5040" w:hanging="360"/>
+      </w:pPr>
+    </w:lvl>
+    <w:lvl w:ilvl="7" w:tplc="04090019" w:tentative="1">
+      <w:start w:val="1"/>
+      <w:numFmt w:val="lowerLetter"/>
+      <w:lvlText w:val="%8."/>
+      <w:lvlJc w:val="left"/>
+      <w:pPr>
+        <w:ind w:left="5760" w:hanging="360"/>
+      </w:pPr>
+    </w:lvl>
+    <w:lvl w:ilvl="8" w:tplc="0409001B" w:tentative="1">
+      <w:start w:val="1"/>
+      <w:numFmt w:val="lowerRoman"/>
+      <w:lvlText w:val="%9."/>
+      <w:lvlJc w:val="right"/>
+      <w:pPr>
+        <w:ind w:left="6480" w:hanging="180"/>
+      </w:pPr>
+    </w:lvl>
+  </w:abstractNum>
+  <w:abstractNum w:abstractNumId="2" w15:restartNumberingAfterBreak="0">
     <w:nsid w:val="18BD3AFC"/>
     <w:multiLevelType w:val="hybridMultilevel"/>
     <w:tmpl w:val="41E44DE0"/>
@@ -13016,7 +14292,7 @@
       </w:rPr>
     </w:lvl>
   </w:abstractNum>
-  <w:abstractNum w:abstractNumId="2" w15:restartNumberingAfterBreak="0">
+  <w:abstractNum w:abstractNumId="3" w15:restartNumberingAfterBreak="0">
     <w:nsid w:val="1B792F65"/>
     <w:multiLevelType w:val="hybridMultilevel"/>
     <w:tmpl w:val="5082DAE2"/>
@@ -13129,7 +14405,7 @@
       </w:rPr>
     </w:lvl>
   </w:abstractNum>
-  <w:abstractNum w:abstractNumId="3" w15:restartNumberingAfterBreak="0">
+  <w:abstractNum w:abstractNumId="4" w15:restartNumberingAfterBreak="0">
     <w:nsid w:val="1B8B5DC0"/>
     <w:multiLevelType w:val="hybridMultilevel"/>
     <w:tmpl w:val="D7CE983E"/>
@@ -13220,7 +14496,7 @@
       </w:pPr>
     </w:lvl>
   </w:abstractNum>
-  <w:abstractNum w:abstractNumId="4" w15:restartNumberingAfterBreak="0">
+  <w:abstractNum w:abstractNumId="5" w15:restartNumberingAfterBreak="0">
     <w:nsid w:val="1FE53CE5"/>
     <w:multiLevelType w:val="hybridMultilevel"/>
     <w:tmpl w:val="D2EAEADC"/>
@@ -13307,7 +14583,7 @@
       </w:pPr>
     </w:lvl>
   </w:abstractNum>
-  <w:abstractNum w:abstractNumId="5" w15:restartNumberingAfterBreak="0">
+  <w:abstractNum w:abstractNumId="6" w15:restartNumberingAfterBreak="0">
     <w:nsid w:val="2B7B57CD"/>
     <w:multiLevelType w:val="hybridMultilevel"/>
     <w:tmpl w:val="3A02C9E4"/>
@@ -13421,7 +14697,7 @@
       </w:rPr>
     </w:lvl>
   </w:abstractNum>
-  <w:abstractNum w:abstractNumId="6" w15:restartNumberingAfterBreak="0">
+  <w:abstractNum w:abstractNumId="7" w15:restartNumberingAfterBreak="0">
     <w:nsid w:val="2EE4123E"/>
     <w:multiLevelType w:val="hybridMultilevel"/>
     <w:tmpl w:val="259C1778"/>
@@ -13534,7 +14810,7 @@
       </w:rPr>
     </w:lvl>
   </w:abstractNum>
-  <w:abstractNum w:abstractNumId="7" w15:restartNumberingAfterBreak="0">
+  <w:abstractNum w:abstractNumId="8" w15:restartNumberingAfterBreak="0">
     <w:nsid w:val="34170E93"/>
     <w:multiLevelType w:val="hybridMultilevel"/>
     <w:tmpl w:val="D708EF50"/>
@@ -13623,7 +14899,7 @@
       </w:pPr>
     </w:lvl>
   </w:abstractNum>
-  <w:abstractNum w:abstractNumId="8" w15:restartNumberingAfterBreak="0">
+  <w:abstractNum w:abstractNumId="9" w15:restartNumberingAfterBreak="0">
     <w:nsid w:val="35715EFD"/>
     <w:multiLevelType w:val="hybridMultilevel"/>
     <w:tmpl w:val="DD664F90"/>
@@ -13736,7 +15012,7 @@
       </w:rPr>
     </w:lvl>
   </w:abstractNum>
-  <w:abstractNum w:abstractNumId="9" w15:restartNumberingAfterBreak="0">
+  <w:abstractNum w:abstractNumId="10" w15:restartNumberingAfterBreak="0">
     <w:nsid w:val="4167498C"/>
     <w:multiLevelType w:val="hybridMultilevel"/>
     <w:tmpl w:val="AC70AFAC"/>
@@ -13826,7 +15102,7 @@
       </w:pPr>
     </w:lvl>
   </w:abstractNum>
-  <w:abstractNum w:abstractNumId="10" w15:restartNumberingAfterBreak="0">
+  <w:abstractNum w:abstractNumId="11" w15:restartNumberingAfterBreak="0">
     <w:nsid w:val="4F7E66BA"/>
     <w:multiLevelType w:val="hybridMultilevel"/>
     <w:tmpl w:val="79F2C6B8"/>
@@ -13939,7 +15215,7 @@
       </w:rPr>
     </w:lvl>
   </w:abstractNum>
-  <w:abstractNum w:abstractNumId="11" w15:restartNumberingAfterBreak="0">
+  <w:abstractNum w:abstractNumId="12" w15:restartNumberingAfterBreak="0">
     <w:nsid w:val="51F91447"/>
     <w:multiLevelType w:val="hybridMultilevel"/>
     <w:tmpl w:val="37762FA8"/>
@@ -14052,7 +15328,7 @@
       </w:rPr>
     </w:lvl>
   </w:abstractNum>
-  <w:abstractNum w:abstractNumId="12" w15:restartNumberingAfterBreak="0">
+  <w:abstractNum w:abstractNumId="13" w15:restartNumberingAfterBreak="0">
     <w:nsid w:val="5D8A4FCC"/>
     <w:multiLevelType w:val="hybridMultilevel"/>
     <w:tmpl w:val="21287962"/>
@@ -14165,7 +15441,7 @@
       </w:rPr>
     </w:lvl>
   </w:abstractNum>
-  <w:abstractNum w:abstractNumId="13" w15:restartNumberingAfterBreak="0">
+  <w:abstractNum w:abstractNumId="14" w15:restartNumberingAfterBreak="0">
     <w:nsid w:val="5F115D9E"/>
     <w:multiLevelType w:val="hybridMultilevel"/>
     <w:tmpl w:val="AE40592A"/>
@@ -14254,7 +15530,7 @@
       </w:pPr>
     </w:lvl>
   </w:abstractNum>
-  <w:abstractNum w:abstractNumId="14" w15:restartNumberingAfterBreak="0">
+  <w:abstractNum w:abstractNumId="15" w15:restartNumberingAfterBreak="0">
     <w:nsid w:val="63917590"/>
     <w:multiLevelType w:val="hybridMultilevel"/>
     <w:tmpl w:val="D714BB68"/>
@@ -14367,7 +15643,7 @@
       </w:rPr>
     </w:lvl>
   </w:abstractNum>
-  <w:abstractNum w:abstractNumId="15" w15:restartNumberingAfterBreak="0">
+  <w:abstractNum w:abstractNumId="16" w15:restartNumberingAfterBreak="0">
     <w:nsid w:val="6E3F320D"/>
     <w:multiLevelType w:val="hybridMultilevel"/>
     <w:tmpl w:val="C68A37A4"/>
@@ -14480,7 +15756,7 @@
       </w:rPr>
     </w:lvl>
   </w:abstractNum>
-  <w:abstractNum w:abstractNumId="16" w15:restartNumberingAfterBreak="0">
+  <w:abstractNum w:abstractNumId="17" w15:restartNumberingAfterBreak="0">
     <w:nsid w:val="6F821489"/>
     <w:multiLevelType w:val="hybridMultilevel"/>
     <w:tmpl w:val="0746499E"/>
@@ -14566,7 +15842,7 @@
       </w:pPr>
     </w:lvl>
   </w:abstractNum>
-  <w:abstractNum w:abstractNumId="17" w15:restartNumberingAfterBreak="0">
+  <w:abstractNum w:abstractNumId="18" w15:restartNumberingAfterBreak="0">
     <w:nsid w:val="75AD4CC8"/>
     <w:multiLevelType w:val="hybridMultilevel"/>
     <w:tmpl w:val="CB147842"/>
@@ -14679,7 +15955,7 @@
       </w:rPr>
     </w:lvl>
   </w:abstractNum>
-  <w:abstractNum w:abstractNumId="18" w15:restartNumberingAfterBreak="0">
+  <w:abstractNum w:abstractNumId="19" w15:restartNumberingAfterBreak="0">
     <w:nsid w:val="7998064F"/>
     <w:multiLevelType w:val="hybridMultilevel"/>
     <w:tmpl w:val="6D7EEBCC"/>
@@ -14793,124 +16069,133 @@
     </w:lvl>
   </w:abstractNum>
   <w:num w:numId="1" w16cid:durableId="1173185611">
-    <w:abstractNumId w:val="14"/>
+    <w:abstractNumId w:val="15"/>
   </w:num>
   <w:num w:numId="2" w16cid:durableId="2008241989">
+    <w:abstractNumId w:val="6"/>
+  </w:num>
+  <w:num w:numId="3" w16cid:durableId="1280189446">
+    <w:abstractNumId w:val="7"/>
+  </w:num>
+  <w:num w:numId="4" w16cid:durableId="126434000">
+    <w:abstractNumId w:val="18"/>
+  </w:num>
+  <w:num w:numId="5" w16cid:durableId="88235218">
+    <w:abstractNumId w:val="3"/>
+  </w:num>
+  <w:num w:numId="6" w16cid:durableId="2075662437">
     <w:abstractNumId w:val="5"/>
   </w:num>
-  <w:num w:numId="3" w16cid:durableId="1280189446">
-    <w:abstractNumId w:val="6"/>
-  </w:num>
-  <w:num w:numId="4" w16cid:durableId="126434000">
-    <w:abstractNumId w:val="17"/>
-  </w:num>
-  <w:num w:numId="5" w16cid:durableId="88235218">
-    <w:abstractNumId w:val="2"/>
-  </w:num>
-  <w:num w:numId="6" w16cid:durableId="2075662437">
+  <w:num w:numId="7" w16cid:durableId="100228626">
     <w:abstractNumId w:val="4"/>
   </w:num>
-  <w:num w:numId="7" w16cid:durableId="100228626">
-    <w:abstractNumId w:val="3"/>
-  </w:num>
   <w:num w:numId="8" w16cid:durableId="1520004101">
-    <w:abstractNumId w:val="10"/>
+    <w:abstractNumId w:val="11"/>
   </w:num>
   <w:num w:numId="9" w16cid:durableId="2040203771">
     <w:abstractNumId w:val="0"/>
   </w:num>
   <w:num w:numId="10" w16cid:durableId="315181602">
+    <w:abstractNumId w:val="10"/>
+  </w:num>
+  <w:num w:numId="11" w16cid:durableId="6830234">
     <w:abstractNumId w:val="9"/>
   </w:num>
-  <w:num w:numId="11" w16cid:durableId="6830234">
-    <w:abstractNumId w:val="8"/>
-  </w:num>
   <w:num w:numId="12" w16cid:durableId="644774398">
-    <w:abstractNumId w:val="11"/>
+    <w:abstractNumId w:val="12"/>
   </w:num>
   <w:num w:numId="13" w16cid:durableId="1220090486">
-    <w:abstractNumId w:val="9"/>
+    <w:abstractNumId w:val="10"/>
     <w:lvlOverride w:ilvl="0">
       <w:startOverride w:val="1"/>
     </w:lvlOverride>
   </w:num>
   <w:num w:numId="14" w16cid:durableId="653677883">
-    <w:abstractNumId w:val="16"/>
+    <w:abstractNumId w:val="17"/>
   </w:num>
   <w:num w:numId="15" w16cid:durableId="1593008556">
-    <w:abstractNumId w:val="12"/>
+    <w:abstractNumId w:val="13"/>
   </w:num>
   <w:num w:numId="16" w16cid:durableId="1969361129">
-    <w:abstractNumId w:val="18"/>
+    <w:abstractNumId w:val="19"/>
   </w:num>
   <w:num w:numId="17" w16cid:durableId="287854270">
-    <w:abstractNumId w:val="3"/>
+    <w:abstractNumId w:val="4"/>
     <w:lvlOverride w:ilvl="0">
       <w:startOverride w:val="1"/>
     </w:lvlOverride>
   </w:num>
   <w:num w:numId="18" w16cid:durableId="1455246916">
-    <w:abstractNumId w:val="3"/>
+    <w:abstractNumId w:val="4"/>
     <w:lvlOverride w:ilvl="0">
       <w:startOverride w:val="1"/>
     </w:lvlOverride>
   </w:num>
   <w:num w:numId="19" w16cid:durableId="1837114645">
-    <w:abstractNumId w:val="3"/>
+    <w:abstractNumId w:val="4"/>
     <w:lvlOverride w:ilvl="0">
       <w:startOverride w:val="1"/>
     </w:lvlOverride>
   </w:num>
   <w:num w:numId="20" w16cid:durableId="382221458">
-    <w:abstractNumId w:val="9"/>
+    <w:abstractNumId w:val="10"/>
     <w:lvlOverride w:ilvl="0">
       <w:startOverride w:val="1"/>
     </w:lvlOverride>
   </w:num>
   <w:num w:numId="21" w16cid:durableId="1655790808">
-    <w:abstractNumId w:val="9"/>
+    <w:abstractNumId w:val="10"/>
     <w:lvlOverride w:ilvl="0">
       <w:startOverride w:val="1"/>
     </w:lvlOverride>
   </w:num>
   <w:num w:numId="22" w16cid:durableId="234171700">
-    <w:abstractNumId w:val="9"/>
+    <w:abstractNumId w:val="10"/>
     <w:lvlOverride w:ilvl="0">
       <w:startOverride w:val="1"/>
     </w:lvlOverride>
   </w:num>
   <w:num w:numId="23" w16cid:durableId="1009982909">
-    <w:abstractNumId w:val="1"/>
+    <w:abstractNumId w:val="2"/>
   </w:num>
   <w:num w:numId="24" w16cid:durableId="1560550362">
-    <w:abstractNumId w:val="9"/>
+    <w:abstractNumId w:val="10"/>
     <w:lvlOverride w:ilvl="0">
       <w:startOverride w:val="1"/>
     </w:lvlOverride>
   </w:num>
   <w:num w:numId="25" w16cid:durableId="813061479">
-    <w:abstractNumId w:val="3"/>
+    <w:abstractNumId w:val="4"/>
     <w:lvlOverride w:ilvl="0">
       <w:startOverride w:val="1"/>
     </w:lvlOverride>
   </w:num>
   <w:num w:numId="26" w16cid:durableId="1077551942">
-    <w:abstractNumId w:val="15"/>
+    <w:abstractNumId w:val="16"/>
   </w:num>
   <w:num w:numId="27" w16cid:durableId="840898556">
-    <w:abstractNumId w:val="13"/>
+    <w:abstractNumId w:val="14"/>
   </w:num>
   <w:num w:numId="28" w16cid:durableId="501895547">
-    <w:abstractNumId w:val="7"/>
+    <w:abstractNumId w:val="8"/>
   </w:num>
   <w:num w:numId="29" w16cid:durableId="1641417374">
-    <w:abstractNumId w:val="9"/>
+    <w:abstractNumId w:val="10"/>
     <w:lvlOverride w:ilvl="0">
       <w:startOverride w:val="1"/>
     </w:lvlOverride>
   </w:num>
   <w:num w:numId="30" w16cid:durableId="1721786039">
-    <w:abstractNumId w:val="9"/>
+    <w:abstractNumId w:val="10"/>
+    <w:lvlOverride w:ilvl="0">
+      <w:startOverride w:val="1"/>
+    </w:lvlOverride>
+  </w:num>
+  <w:num w:numId="31" w16cid:durableId="1800874209">
+    <w:abstractNumId w:val="1"/>
+  </w:num>
+  <w:num w:numId="32" w16cid:durableId="455873032">
+    <w:abstractNumId w:val="5"/>
     <w:lvlOverride w:ilvl="0">
       <w:startOverride w:val="1"/>
     </w:lvlOverride>

</xml_diff>

<commit_message>
abis nyicil definisi, next lanjut di definisi brainstorming
</commit_message>
<xml_diff>
--- a/non-website/Laporan Akhir KP/2203040182 - Dhika Ramadhan Saputra - Laporan KP.docx
+++ b/non-website/Laporan Akhir KP/2203040182 - Dhika Ramadhan Saputra - Laporan KP.docx
@@ -742,7 +742,7 @@
           <w:i/>
           <w:iCs/>
         </w:rPr>
-        <w:t>pre-processing</w:t>
+        <w:t>Preprocessing</w:t>
       </w:r>
       <w:r>
         <w:rPr>
@@ -1204,7 +1204,7 @@
           <w:i/>
           <w:iCs/>
         </w:rPr>
-        <w:t>Pre-processing</w:t>
+        <w:t>Preprocessing</w:t>
       </w:r>
       <w:r>
         <w:rPr>
@@ -1598,27 +1598,14 @@
       <w:r>
         <w:t xml:space="preserve">ambar </w:t>
       </w:r>
-      <w:r>
-        <w:fldChar w:fldCharType="begin"/>
-      </w:r>
-      <w:r>
-        <w:instrText xml:space="preserve"> SEQ gambar \* ARABIC </w:instrText>
-      </w:r>
-      <w:r>
-        <w:fldChar w:fldCharType="separate"/>
-      </w:r>
-      <w:r>
-        <w:rPr>
-          <w:noProof/>
-        </w:rPr>
-        <w:t>1</w:t>
-      </w:r>
-      <w:r>
-        <w:rPr>
-          <w:noProof/>
-        </w:rPr>
-        <w:fldChar w:fldCharType="end"/>
-      </w:r>
+      <w:fldSimple w:instr=" SEQ gambar \* ARABIC ">
+        <w:r>
+          <w:rPr>
+            <w:noProof/>
+          </w:rPr>
+          <w:t>1</w:t>
+        </w:r>
+      </w:fldSimple>
       <w:r>
         <w:t xml:space="preserve"> Tahapan Pelaksanaan</w:t>
       </w:r>
@@ -2615,7 +2602,7 @@
                 <w:sz w:val="23"/>
                 <w:szCs w:val="23"/>
               </w:rPr>
-              <w:t>Pre-processing</w:t>
+              <w:t>Preprocessing</w:t>
             </w:r>
           </w:p>
         </w:tc>
@@ -3564,27 +3551,14 @@
       <w:r>
         <w:t xml:space="preserve">Tabel </w:t>
       </w:r>
-      <w:r>
-        <w:fldChar w:fldCharType="begin"/>
-      </w:r>
-      <w:r>
-        <w:instrText xml:space="preserve"> SEQ Tabel \* ARABIC </w:instrText>
-      </w:r>
-      <w:r>
-        <w:fldChar w:fldCharType="separate"/>
-      </w:r>
-      <w:r>
-        <w:rPr>
-          <w:noProof/>
-        </w:rPr>
-        <w:t>1</w:t>
-      </w:r>
-      <w:r>
-        <w:rPr>
-          <w:noProof/>
-        </w:rPr>
-        <w:fldChar w:fldCharType="end"/>
-      </w:r>
+      <w:fldSimple w:instr=" SEQ Tabel \* ARABIC ">
+        <w:r>
+          <w:rPr>
+            <w:noProof/>
+          </w:rPr>
+          <w:t>1</w:t>
+        </w:r>
+      </w:fldSimple>
       <w:r>
         <w:t xml:space="preserve"> Jadwal pelaksanaan</w:t>
       </w:r>
@@ -3785,27 +3759,14 @@
       <w:r>
         <w:t xml:space="preserve">ambar </w:t>
       </w:r>
-      <w:r>
-        <w:fldChar w:fldCharType="begin"/>
-      </w:r>
-      <w:r>
-        <w:instrText xml:space="preserve"> SEQ gambar \* ARABIC </w:instrText>
-      </w:r>
-      <w:r>
-        <w:fldChar w:fldCharType="separate"/>
-      </w:r>
-      <w:r>
-        <w:rPr>
-          <w:noProof/>
-        </w:rPr>
-        <w:t>2</w:t>
-      </w:r>
-      <w:r>
-        <w:rPr>
-          <w:noProof/>
-        </w:rPr>
-        <w:fldChar w:fldCharType="end"/>
-      </w:r>
+      <w:fldSimple w:instr=" SEQ gambar \* ARABIC ">
+        <w:r>
+          <w:rPr>
+            <w:noProof/>
+          </w:rPr>
+          <w:t>2</w:t>
+        </w:r>
+      </w:fldSimple>
       <w:r>
         <w:t xml:space="preserve"> Struktur Umum Organisasi Mitra</w:t>
       </w:r>
@@ -4047,18 +4008,37 @@
       <w:r>
         <w:rPr>
           <w:rFonts w:ascii="Times New Roman" w:hAnsi="Times New Roman" w:cs="Times New Roman"/>
-          <w:color w:val="FF0000"/>
-        </w:rPr>
-        <w:t xml:space="preserve">Pengumpulan data adalah </w:t>
-      </w:r>
-      <w:proofErr w:type="gramStart"/>
-      <w:r>
-        <w:rPr>
-          <w:rFonts w:ascii="Times New Roman" w:hAnsi="Times New Roman" w:cs="Times New Roman"/>
-          <w:color w:val="FF0000"/>
-        </w:rPr>
-        <w:t xml:space="preserve">… </w:t>
-      </w:r>
+        </w:rPr>
+        <w:t>Pengumpulan data merupakan tahapan awal yang sangat penting dalam proses analisis data</w:t>
+      </w:r>
+      <w:r>
+        <w:rPr>
+          <w:rFonts w:ascii="Times New Roman" w:hAnsi="Times New Roman" w:cs="Times New Roman"/>
+        </w:rPr>
+        <w:t xml:space="preserve"> </w:t>
+      </w:r>
+      <w:sdt>
+        <w:sdtPr>
+          <w:rPr>
+            <w:rFonts w:ascii="Times New Roman" w:hAnsi="Times New Roman" w:cs="Times New Roman"/>
+            <w:color w:val="000000"/>
+          </w:rPr>
+          <w:tag w:val="MENDELEY_CITATION_v3_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"/>
+          <w:id w:val="1204055513"/>
+          <w:placeholder>
+            <w:docPart w:val="DefaultPlaceholder_-1854013440"/>
+          </w:placeholder>
+        </w:sdtPr>
+        <w:sdtContent>
+          <w:r>
+            <w:rPr>
+              <w:rFonts w:ascii="Times New Roman" w:hAnsi="Times New Roman" w:cs="Times New Roman"/>
+              <w:color w:val="000000"/>
+            </w:rPr>
+            <w:t>[1]</w:t>
+          </w:r>
+        </w:sdtContent>
+      </w:sdt>
       <w:r>
         <w:rPr>
           <w:rFonts w:ascii="Times New Roman" w:hAnsi="Times New Roman" w:cs="Times New Roman"/>
@@ -4069,20 +4049,19 @@
         <w:rPr>
           <w:rFonts w:ascii="Times New Roman" w:hAnsi="Times New Roman" w:cs="Times New Roman"/>
         </w:rPr>
+        <w:t xml:space="preserve"> </w:t>
+      </w:r>
+      <w:r>
+        <w:rPr>
+          <w:rFonts w:ascii="Times New Roman" w:hAnsi="Times New Roman" w:cs="Times New Roman"/>
+        </w:rPr>
         <w:t>P</w:t>
       </w:r>
       <w:r>
         <w:rPr>
           <w:rFonts w:ascii="Times New Roman" w:hAnsi="Times New Roman" w:cs="Times New Roman"/>
         </w:rPr>
-        <w:t>ada</w:t>
-      </w:r>
-      <w:proofErr w:type="gramEnd"/>
-      <w:r>
-        <w:rPr>
-          <w:rFonts w:ascii="Times New Roman" w:hAnsi="Times New Roman" w:cs="Times New Roman"/>
-        </w:rPr>
-        <w:t xml:space="preserve"> proyek ini, p</w:t>
+        <w:t>ada proyek ini, p</w:t>
       </w:r>
       <w:r>
         <w:rPr>
@@ -4138,15 +4117,7 @@
           <w:i/>
           <w:iCs/>
         </w:rPr>
-        <w:t>p</w:t>
-      </w:r>
-      <w:r>
-        <w:rPr>
-          <w:rFonts w:ascii="Times New Roman" w:hAnsi="Times New Roman" w:cs="Times New Roman"/>
-          <w:i/>
-          <w:iCs/>
-        </w:rPr>
-        <w:t>re-processing</w:t>
+        <w:t>Preprocessing</w:t>
       </w:r>
       <w:r>
         <w:rPr>
@@ -4250,27 +4221,14 @@
       <w:r>
         <w:t xml:space="preserve">ambar </w:t>
       </w:r>
-      <w:r>
-        <w:fldChar w:fldCharType="begin"/>
-      </w:r>
-      <w:r>
-        <w:instrText xml:space="preserve"> SEQ gambar \* ARABIC </w:instrText>
-      </w:r>
-      <w:r>
-        <w:fldChar w:fldCharType="separate"/>
-      </w:r>
-      <w:r>
-        <w:rPr>
-          <w:noProof/>
-        </w:rPr>
-        <w:t>3</w:t>
-      </w:r>
-      <w:r>
-        <w:rPr>
-          <w:noProof/>
-        </w:rPr>
-        <w:fldChar w:fldCharType="end"/>
-      </w:r>
+      <w:fldSimple w:instr=" SEQ gambar \* ARABIC ">
+        <w:r>
+          <w:rPr>
+            <w:noProof/>
+          </w:rPr>
+          <w:t>3</w:t>
+        </w:r>
+      </w:fldSimple>
       <w:r>
         <w:t xml:space="preserve"> Dokumentasi proses penerimaan data</w:t>
       </w:r>
@@ -4289,7 +4247,7 @@
           <w:noProof/>
         </w:rPr>
         <w:drawing>
-          <wp:inline distT="0" distB="0" distL="0" distR="0" wp14:anchorId="75188C27" wp14:editId="2B10FB4E">
+          <wp:inline distT="0" distB="0" distL="0" distR="0" wp14:anchorId="75188C27" wp14:editId="636C375C">
             <wp:extent cx="4608000" cy="1698906"/>
             <wp:effectExtent l="19050" t="19050" r="21590" b="15875"/>
             <wp:docPr id="783286403" name="Picture 4"/>
@@ -4355,27 +4313,14 @@
       <w:r>
         <w:t xml:space="preserve">ambar </w:t>
       </w:r>
-      <w:r>
-        <w:fldChar w:fldCharType="begin"/>
-      </w:r>
-      <w:r>
-        <w:instrText xml:space="preserve"> SEQ gambar \* ARABIC </w:instrText>
-      </w:r>
-      <w:r>
-        <w:fldChar w:fldCharType="separate"/>
-      </w:r>
-      <w:r>
-        <w:rPr>
-          <w:noProof/>
-        </w:rPr>
-        <w:t>4</w:t>
-      </w:r>
-      <w:r>
-        <w:rPr>
-          <w:noProof/>
-        </w:rPr>
-        <w:fldChar w:fldCharType="end"/>
-      </w:r>
+      <w:fldSimple w:instr=" SEQ gambar \* ARABIC ">
+        <w:r>
+          <w:rPr>
+            <w:noProof/>
+          </w:rPr>
+          <w:t>4</w:t>
+        </w:r>
+      </w:fldSimple>
       <w:r>
         <w:t xml:space="preserve"> Sampel</w:t>
       </w:r>
@@ -4411,7 +4356,7 @@
           <w:i/>
           <w:iCs w:val="0"/>
         </w:rPr>
-        <w:t>Pre-processing</w:t>
+        <w:t>Preprocessing</w:t>
       </w:r>
     </w:p>
     <w:p>
@@ -4427,65 +4372,121 @@
       <w:r>
         <w:rPr>
           <w:rFonts w:ascii="Times New Roman" w:hAnsi="Times New Roman" w:cs="Times New Roman"/>
-          <w:color w:val="FF0000"/>
-        </w:rPr>
-        <w:t xml:space="preserve">Pre-processing adalah </w:t>
-      </w:r>
-      <w:proofErr w:type="gramStart"/>
-      <w:r>
-        <w:rPr>
-          <w:rFonts w:ascii="Times New Roman" w:hAnsi="Times New Roman" w:cs="Times New Roman"/>
-          <w:color w:val="FF0000"/>
-        </w:rPr>
-        <w:t xml:space="preserve">… </w:t>
-      </w:r>
-      <w:r>
-        <w:rPr>
-          <w:rFonts w:ascii="Times New Roman" w:hAnsi="Times New Roman" w:cs="Times New Roman"/>
-        </w:rPr>
-        <w:t>.</w:t>
-      </w:r>
-      <w:r>
-        <w:rPr>
-          <w:rFonts w:ascii="Times New Roman" w:hAnsi="Times New Roman" w:cs="Times New Roman"/>
-        </w:rPr>
-        <w:t>Sesuai</w:t>
-      </w:r>
-      <w:proofErr w:type="gramEnd"/>
-      <w:r>
-        <w:rPr>
-          <w:rFonts w:ascii="Times New Roman" w:hAnsi="Times New Roman" w:cs="Times New Roman"/>
-        </w:rPr>
-        <w:t xml:space="preserve"> dengan gambaran umum proyek, tahap </w:t>
-      </w:r>
-      <w:r>
-        <w:rPr>
-          <w:rFonts w:ascii="Times New Roman" w:hAnsi="Times New Roman" w:cs="Times New Roman"/>
           <w:i/>
           <w:iCs/>
         </w:rPr>
-        <w:t>Pre-processing</w:t>
-      </w:r>
-      <w:r>
-        <w:rPr>
-          <w:rFonts w:ascii="Times New Roman" w:hAnsi="Times New Roman" w:cs="Times New Roman"/>
-        </w:rPr>
-        <w:t xml:space="preserve"> memiliki 4 tahap, dengan detail dan hasil sebagai berikut: </w:t>
-      </w:r>
-    </w:p>
-    <w:p>
-      <w:pPr>
-        <w:pStyle w:val="Heading5"/>
-      </w:pPr>
-      <w:r>
+        <w:t>Preprocessing</w:t>
+      </w:r>
+      <w:r>
+        <w:rPr>
+          <w:rFonts w:ascii="Times New Roman" w:hAnsi="Times New Roman" w:cs="Times New Roman"/>
+        </w:rPr>
+        <w:t xml:space="preserve"> merupakan</w:t>
+      </w:r>
+      <w:r>
+        <w:rPr>
+          <w:rFonts w:ascii="Times New Roman" w:hAnsi="Times New Roman" w:cs="Times New Roman"/>
+        </w:rPr>
+        <w:t xml:space="preserve"> </w:t>
+      </w:r>
+      <w:r>
+        <w:rPr>
+          <w:rFonts w:ascii="Times New Roman" w:hAnsi="Times New Roman" w:cs="Times New Roman"/>
+        </w:rPr>
+        <w:t>pengolahan data yang bertujuan untuk mempersiapkan data mentah agar siap</w:t>
+      </w:r>
+      <w:r>
+        <w:rPr>
+          <w:rFonts w:ascii="Times New Roman" w:hAnsi="Times New Roman" w:cs="Times New Roman"/>
+        </w:rPr>
+        <w:t xml:space="preserve"> dikonsumsi</w:t>
+      </w:r>
+      <w:r>
+        <w:rPr>
+          <w:rFonts w:ascii="Times New Roman" w:hAnsi="Times New Roman" w:cs="Times New Roman"/>
+        </w:rPr>
+        <w:t xml:space="preserve"> </w:t>
+      </w:r>
+      <w:sdt>
+        <w:sdtPr>
+          <w:rPr>
+            <w:rFonts w:ascii="Times New Roman" w:hAnsi="Times New Roman" w:cs="Times New Roman"/>
+            <w:color w:val="000000"/>
+          </w:rPr>
+          <w:tag w:val="MENDELEY_CITATION_v3_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"/>
+          <w:id w:val="-638184159"/>
+          <w:placeholder>
+            <w:docPart w:val="DefaultPlaceholder_-1854013440"/>
+          </w:placeholder>
+        </w:sdtPr>
+        <w:sdtContent>
+          <w:r>
+            <w:rPr>
+              <w:rFonts w:ascii="Times New Roman" w:hAnsi="Times New Roman" w:cs="Times New Roman"/>
+              <w:color w:val="000000"/>
+            </w:rPr>
+            <w:t>[2]</w:t>
+          </w:r>
+        </w:sdtContent>
+      </w:sdt>
+      <w:r>
+        <w:rPr>
+          <w:rFonts w:ascii="Times New Roman" w:hAnsi="Times New Roman" w:cs="Times New Roman"/>
+        </w:rPr>
+        <w:t>.</w:t>
+      </w:r>
+      <w:r>
+        <w:rPr>
+          <w:rFonts w:ascii="Times New Roman" w:hAnsi="Times New Roman" w:cs="Times New Roman"/>
+        </w:rPr>
+        <w:t xml:space="preserve"> </w:t>
+      </w:r>
+      <w:r>
+        <w:rPr>
+          <w:rFonts w:ascii="Times New Roman" w:hAnsi="Times New Roman" w:cs="Times New Roman"/>
+        </w:rPr>
+        <w:t xml:space="preserve">Sesuai dengan </w:t>
+      </w:r>
+      <w:r>
+        <w:rPr>
+          <w:rFonts w:ascii="Times New Roman" w:hAnsi="Times New Roman" w:cs="Times New Roman"/>
+        </w:rPr>
         <w:lastRenderedPageBreak/>
-        <w:t xml:space="preserve">Penggabungan </w:t>
-      </w:r>
-      <w:r>
-        <w:rPr>
+        <w:t>gambaran umum proyek,</w:t>
+      </w:r>
+      <w:r>
+        <w:rPr>
+          <w:rFonts w:ascii="Times New Roman" w:hAnsi="Times New Roman" w:cs="Times New Roman"/>
+        </w:rPr>
+        <w:t xml:space="preserve"> </w:t>
+      </w:r>
+      <w:r>
+        <w:rPr>
+          <w:rFonts w:ascii="Times New Roman" w:hAnsi="Times New Roman" w:cs="Times New Roman"/>
           <w:i/>
           <w:iCs/>
         </w:rPr>
+        <w:t>preprocessing</w:t>
+      </w:r>
+      <w:r>
+        <w:rPr>
+          <w:rFonts w:ascii="Times New Roman" w:hAnsi="Times New Roman" w:cs="Times New Roman"/>
+        </w:rPr>
+        <w:t xml:space="preserve"> memiliki 4 tahap, dengan detail dan hasil sebagai berikut: </w:t>
+      </w:r>
+    </w:p>
+    <w:p>
+      <w:pPr>
+        <w:pStyle w:val="Heading5"/>
+      </w:pPr>
+      <w:r>
+        <w:t xml:space="preserve">Penggabungan </w:t>
+      </w:r>
+      <w:r>
+        <w:rPr>
+          <w:i/>
+          <w:iCs/>
+        </w:rPr>
         <w:t>dataset</w:t>
       </w:r>
     </w:p>
@@ -4502,31 +4503,56 @@
       <w:r>
         <w:rPr>
           <w:rFonts w:ascii="Times New Roman" w:hAnsi="Times New Roman" w:cs="Times New Roman"/>
-          <w:color w:val="FF0000"/>
-        </w:rPr>
-        <w:t xml:space="preserve">Dataset adalah </w:t>
-      </w:r>
-      <w:proofErr w:type="gramStart"/>
-      <w:r>
-        <w:rPr>
-          <w:rFonts w:ascii="Times New Roman" w:hAnsi="Times New Roman" w:cs="Times New Roman"/>
-          <w:color w:val="FF0000"/>
-        </w:rPr>
-        <w:t xml:space="preserve">… </w:t>
-      </w:r>
-      <w:r>
-        <w:rPr>
-          <w:rFonts w:ascii="Times New Roman" w:hAnsi="Times New Roman" w:cs="Times New Roman"/>
-        </w:rPr>
-        <w:t>.</w:t>
-      </w:r>
-      <w:r>
-        <w:rPr>
-          <w:rFonts w:ascii="Times New Roman" w:hAnsi="Times New Roman" w:cs="Times New Roman"/>
           <w:i/>
           <w:iCs/>
         </w:rPr>
-        <w:t>Data</w:t>
+        <w:t>Dataset</w:t>
+      </w:r>
+      <w:r>
+        <w:rPr>
+          <w:rFonts w:ascii="Times New Roman" w:hAnsi="Times New Roman" w:cs="Times New Roman"/>
+        </w:rPr>
+        <w:t xml:space="preserve"> adalah sekumpulan data, yang biasanya disajikan dalam bentuk tabel, di mana setiap kolom merepresentasikan variabel tertentu dan setiap baris mewakili anggota tertentu dari dataset yang dimaksud</w:t>
+      </w:r>
+      <w:r>
+        <w:rPr>
+          <w:rFonts w:ascii="Times New Roman" w:hAnsi="Times New Roman" w:cs="Times New Roman"/>
+        </w:rPr>
+        <w:t xml:space="preserve"> </w:t>
+      </w:r>
+      <w:sdt>
+        <w:sdtPr>
+          <w:rPr>
+            <w:rFonts w:ascii="Times New Roman" w:hAnsi="Times New Roman" w:cs="Times New Roman"/>
+            <w:color w:val="000000"/>
+          </w:rPr>
+          <w:tag w:val="MENDELEY_CITATION_v3_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"/>
+          <w:id w:val="-424886347"/>
+          <w:placeholder>
+            <w:docPart w:val="DefaultPlaceholder_-1854013440"/>
+          </w:placeholder>
+        </w:sdtPr>
+        <w:sdtContent>
+          <w:r>
+            <w:rPr>
+              <w:rFonts w:ascii="Times New Roman" w:hAnsi="Times New Roman" w:cs="Times New Roman"/>
+              <w:color w:val="000000"/>
+            </w:rPr>
+            <w:t>[3]</w:t>
+          </w:r>
+        </w:sdtContent>
+      </w:sdt>
+      <w:r>
+        <w:rPr>
+          <w:rFonts w:ascii="Times New Roman" w:hAnsi="Times New Roman" w:cs="Times New Roman"/>
+        </w:rPr>
+        <w:t>.</w:t>
+      </w:r>
+      <w:r>
+        <w:rPr>
+          <w:rFonts w:ascii="Times New Roman" w:hAnsi="Times New Roman" w:cs="Times New Roman"/>
+        </w:rPr>
+        <w:t xml:space="preserve"> </w:t>
       </w:r>
       <w:r>
         <w:rPr>
@@ -4534,32 +4560,7 @@
           <w:i/>
           <w:iCs/>
         </w:rPr>
-        <w:t>set</w:t>
-      </w:r>
-      <w:proofErr w:type="gramEnd"/>
-      <w:r>
-        <w:rPr>
-          <w:rFonts w:ascii="Times New Roman" w:hAnsi="Times New Roman" w:cs="Times New Roman"/>
-        </w:rPr>
-        <w:t xml:space="preserve"> mentah yang diterima dari mitra proyek (BPA UMP)</w:t>
-      </w:r>
-      <w:r>
-        <w:rPr>
-          <w:rFonts w:ascii="Times New Roman" w:hAnsi="Times New Roman" w:cs="Times New Roman"/>
-        </w:rPr>
-        <w:t xml:space="preserve"> merupakan </w:t>
-      </w:r>
-      <w:r>
-        <w:rPr>
-          <w:rFonts w:ascii="Times New Roman" w:hAnsi="Times New Roman" w:cs="Times New Roman"/>
-        </w:rPr>
-        <w:t>10 berkas Microsoft Excell</w:t>
-      </w:r>
-      <w:r>
-        <w:rPr>
-          <w:rFonts w:ascii="Times New Roman" w:hAnsi="Times New Roman" w:cs="Times New Roman"/>
-        </w:rPr>
-        <w:t xml:space="preserve">. Untuk alasan efisiensi pada tahap </w:t>
+        <w:t>Data</w:t>
       </w:r>
       <w:r>
         <w:rPr>
@@ -4567,7 +4568,31 @@
           <w:i/>
           <w:iCs/>
         </w:rPr>
-        <w:t>p</w:t>
+        <w:t>set</w:t>
+      </w:r>
+      <w:r>
+        <w:rPr>
+          <w:rFonts w:ascii="Times New Roman" w:hAnsi="Times New Roman" w:cs="Times New Roman"/>
+        </w:rPr>
+        <w:t xml:space="preserve"> mentah yang diterima dari mitra proyek (BPA UMP)</w:t>
+      </w:r>
+      <w:r>
+        <w:rPr>
+          <w:rFonts w:ascii="Times New Roman" w:hAnsi="Times New Roman" w:cs="Times New Roman"/>
+        </w:rPr>
+        <w:t xml:space="preserve"> merupakan </w:t>
+      </w:r>
+      <w:r>
+        <w:rPr>
+          <w:rFonts w:ascii="Times New Roman" w:hAnsi="Times New Roman" w:cs="Times New Roman"/>
+        </w:rPr>
+        <w:t>10 berkas Microsoft Excell</w:t>
+      </w:r>
+      <w:r>
+        <w:rPr>
+          <w:rFonts w:ascii="Times New Roman" w:hAnsi="Times New Roman" w:cs="Times New Roman"/>
+        </w:rPr>
+        <w:t xml:space="preserve">. Untuk alasan efisiensi pada tahap </w:t>
       </w:r>
       <w:r>
         <w:rPr>
@@ -4575,7 +4600,7 @@
           <w:i/>
           <w:iCs/>
         </w:rPr>
-        <w:t>re-processing</w:t>
+        <w:t>Preprocessing</w:t>
       </w:r>
       <w:r>
         <w:rPr>
@@ -4597,7 +4622,7 @@
           <w:noProof/>
         </w:rPr>
         <w:drawing>
-          <wp:inline distT="0" distB="0" distL="0" distR="0" wp14:anchorId="02EBA956" wp14:editId="67DD2CEA">
+          <wp:inline distT="0" distB="0" distL="0" distR="0" wp14:anchorId="02EBA956" wp14:editId="0BF57A94">
             <wp:extent cx="3888000" cy="2160000"/>
             <wp:effectExtent l="19050" t="19050" r="17780" b="12065"/>
             <wp:docPr id="102117401" name="Picture 5"/>
@@ -4663,27 +4688,14 @@
       <w:r>
         <w:t xml:space="preserve">ambar </w:t>
       </w:r>
-      <w:r>
-        <w:fldChar w:fldCharType="begin"/>
-      </w:r>
-      <w:r>
-        <w:instrText xml:space="preserve"> SEQ Gambar \* ARABIC </w:instrText>
-      </w:r>
-      <w:r>
-        <w:fldChar w:fldCharType="separate"/>
-      </w:r>
-      <w:r>
-        <w:rPr>
-          <w:noProof/>
-        </w:rPr>
-        <w:t>5</w:t>
-      </w:r>
-      <w:r>
-        <w:rPr>
-          <w:noProof/>
-        </w:rPr>
-        <w:fldChar w:fldCharType="end"/>
-      </w:r>
+      <w:fldSimple w:instr=" SEQ Gambar \* ARABIC ">
+        <w:r>
+          <w:rPr>
+            <w:noProof/>
+          </w:rPr>
+          <w:t>5</w:t>
+        </w:r>
+      </w:fldSimple>
       <w:r>
         <w:t xml:space="preserve"> Cuplikan </w:t>
       </w:r>
@@ -4706,6 +4718,7 @@
           <w:rFonts w:ascii="Times New Roman" w:hAnsi="Times New Roman" w:cs="Times New Roman"/>
           <w:noProof/>
         </w:rPr>
+        <w:lastRenderedPageBreak/>
         <w:drawing>
           <wp:inline distT="0" distB="0" distL="0" distR="0" wp14:anchorId="2A1F1CBC" wp14:editId="11C399CC">
             <wp:extent cx="2520000" cy="2411027"/>
@@ -4770,27 +4783,14 @@
       <w:r>
         <w:t xml:space="preserve">Gambar </w:t>
       </w:r>
-      <w:r>
-        <w:fldChar w:fldCharType="begin"/>
-      </w:r>
-      <w:r>
-        <w:instrText xml:space="preserve"> SEQ Gambar \* ARABIC </w:instrText>
-      </w:r>
-      <w:r>
-        <w:fldChar w:fldCharType="separate"/>
-      </w:r>
-      <w:r>
-        <w:rPr>
-          <w:noProof/>
-        </w:rPr>
-        <w:t>6</w:t>
-      </w:r>
-      <w:r>
-        <w:rPr>
-          <w:noProof/>
-        </w:rPr>
-        <w:fldChar w:fldCharType="end"/>
-      </w:r>
+      <w:fldSimple w:instr=" SEQ Gambar \* ARABIC ">
+        <w:r>
+          <w:rPr>
+            <w:noProof/>
+          </w:rPr>
+          <w:t>6</w:t>
+        </w:r>
+      </w:fldSimple>
       <w:r>
         <w:t xml:space="preserve"> Berkas sebelum &amp; sesudah penggabungan</w:t>
       </w:r>
@@ -4800,7 +4800,6 @@
         <w:pStyle w:val="Heading5"/>
       </w:pPr>
       <w:r>
-        <w:lastRenderedPageBreak/>
         <w:t>Pemilihan Kolom</w:t>
       </w:r>
     </w:p>
@@ -4914,7 +4913,7 @@
           <w:noProof/>
         </w:rPr>
         <w:drawing>
-          <wp:inline distT="0" distB="0" distL="0" distR="0" wp14:anchorId="7A542151" wp14:editId="005F6CCA">
+          <wp:inline distT="0" distB="0" distL="0" distR="0" wp14:anchorId="7A542151" wp14:editId="217E7905">
             <wp:extent cx="3418966" cy="1800000"/>
             <wp:effectExtent l="19050" t="19050" r="10160" b="10160"/>
             <wp:docPr id="1182821816" name="Picture 3"/>
@@ -4977,27 +4976,14 @@
       <w:r>
         <w:t xml:space="preserve">Gambar </w:t>
       </w:r>
-      <w:r>
-        <w:fldChar w:fldCharType="begin"/>
-      </w:r>
-      <w:r>
-        <w:instrText xml:space="preserve"> SEQ Gambar \* ARABIC </w:instrText>
-      </w:r>
-      <w:r>
-        <w:fldChar w:fldCharType="separate"/>
-      </w:r>
-      <w:r>
-        <w:rPr>
-          <w:noProof/>
-        </w:rPr>
-        <w:t>7</w:t>
-      </w:r>
-      <w:r>
-        <w:rPr>
-          <w:noProof/>
-        </w:rPr>
-        <w:fldChar w:fldCharType="end"/>
-      </w:r>
+      <w:fldSimple w:instr=" SEQ Gambar \* ARABIC ">
+        <w:r>
+          <w:rPr>
+            <w:noProof/>
+          </w:rPr>
+          <w:t>7</w:t>
+        </w:r>
+      </w:fldSimple>
       <w:r>
         <w:t xml:space="preserve"> Brainstorming pemilihan kolom menggunakan Notepad</w:t>
       </w:r>
@@ -5014,8 +5000,9 @@
           <w:rFonts w:ascii="Times New Roman" w:hAnsi="Times New Roman" w:cs="Times New Roman"/>
           <w:noProof/>
         </w:rPr>
+        <w:lastRenderedPageBreak/>
         <w:drawing>
-          <wp:inline distT="0" distB="0" distL="0" distR="0" wp14:anchorId="3D1861C2" wp14:editId="47115E67">
+          <wp:inline distT="0" distB="0" distL="0" distR="0" wp14:anchorId="3D1861C2" wp14:editId="753586BA">
             <wp:extent cx="2176464" cy="2160000"/>
             <wp:effectExtent l="19050" t="19050" r="14605" b="12065"/>
             <wp:docPr id="471594841" name="Picture 1"/>
@@ -5078,27 +5065,14 @@
       <w:r>
         <w:t xml:space="preserve">Gambar </w:t>
       </w:r>
-      <w:r>
-        <w:fldChar w:fldCharType="begin"/>
-      </w:r>
-      <w:r>
-        <w:instrText xml:space="preserve"> SEQ Gambar \* ARABIC </w:instrText>
-      </w:r>
-      <w:r>
-        <w:fldChar w:fldCharType="separate"/>
-      </w:r>
-      <w:r>
-        <w:rPr>
-          <w:noProof/>
-        </w:rPr>
-        <w:t>8</w:t>
-      </w:r>
-      <w:r>
-        <w:rPr>
-          <w:noProof/>
-        </w:rPr>
-        <w:fldChar w:fldCharType="end"/>
-      </w:r>
+      <w:fldSimple w:instr=" SEQ Gambar \* ARABIC ">
+        <w:r>
+          <w:rPr>
+            <w:noProof/>
+          </w:rPr>
+          <w:t>8</w:t>
+        </w:r>
+      </w:fldSimple>
       <w:r>
         <w:t xml:space="preserve"> </w:t>
       </w:r>
@@ -5121,7 +5095,6 @@
           <w:rFonts w:ascii="Times New Roman" w:hAnsi="Times New Roman" w:cs="Times New Roman"/>
           <w:noProof/>
         </w:rPr>
-        <w:lastRenderedPageBreak/>
         <w:drawing>
           <wp:inline distT="0" distB="0" distL="0" distR="0" wp14:anchorId="0A53EE62" wp14:editId="76666DE1">
             <wp:extent cx="2223826" cy="2160000"/>
@@ -5186,27 +5159,14 @@
       <w:r>
         <w:t xml:space="preserve">Gambar </w:t>
       </w:r>
-      <w:r>
-        <w:fldChar w:fldCharType="begin"/>
-      </w:r>
-      <w:r>
-        <w:instrText xml:space="preserve"> SEQ Gambar \* ARABIC </w:instrText>
-      </w:r>
-      <w:r>
-        <w:fldChar w:fldCharType="separate"/>
-      </w:r>
-      <w:r>
-        <w:rPr>
-          <w:noProof/>
-        </w:rPr>
-        <w:t>9</w:t>
-      </w:r>
-      <w:r>
-        <w:rPr>
-          <w:noProof/>
-        </w:rPr>
-        <w:fldChar w:fldCharType="end"/>
-      </w:r>
+      <w:fldSimple w:instr=" SEQ Gambar \* ARABIC ">
+        <w:r>
+          <w:rPr>
+            <w:noProof/>
+          </w:rPr>
+          <w:t>9</w:t>
+        </w:r>
+      </w:fldSimple>
       <w:r>
         <w:t xml:space="preserve"> Hasil realisasi brainstorming pemilihan kolom</w:t>
       </w:r>
@@ -5233,6 +5193,18 @@
         <w:rPr>
           <w:rFonts w:ascii="Times New Roman" w:hAnsi="Times New Roman" w:cs="Times New Roman"/>
         </w:rPr>
+        <w:t>Preprocessing melibatkan proses validasi. Validasi bertujuan untuk menilai tingkat kelengkapan dan akurasi data yang tersaring</w:t>
+      </w:r>
+      <w:r>
+        <w:rPr>
+          <w:rFonts w:ascii="Times New Roman" w:hAnsi="Times New Roman" w:cs="Times New Roman"/>
+        </w:rPr>
+        <w:t xml:space="preserve">. </w:t>
+      </w:r>
+      <w:r>
+        <w:rPr>
+          <w:rFonts w:ascii="Times New Roman" w:hAnsi="Times New Roman" w:cs="Times New Roman"/>
+        </w:rPr>
         <w:t xml:space="preserve">Pada tahap ini, terdapat 4 aspek utama yang akan divalidasi: Struktur data, duplikasi data, </w:t>
       </w:r>
       <w:r>
@@ -5263,57 +5235,7 @@
         <w:rPr>
           <w:rFonts w:ascii="Times New Roman" w:hAnsi="Times New Roman" w:cs="Times New Roman"/>
         </w:rPr>
-        <w:t xml:space="preserve">, dan distribusi data. </w:t>
-      </w:r>
-      <w:r>
-        <w:rPr>
-          <w:rFonts w:ascii="Times New Roman" w:hAnsi="Times New Roman" w:cs="Times New Roman"/>
-        </w:rPr>
-        <w:t xml:space="preserve">Tujuan dari tahap ini adalah untuk menemukan bagian mana dari dataset ini yang harus melalui proses </w:t>
-      </w:r>
-      <w:r>
-        <w:rPr>
-          <w:rFonts w:ascii="Times New Roman" w:hAnsi="Times New Roman" w:cs="Times New Roman"/>
-          <w:i/>
-          <w:iCs/>
-        </w:rPr>
-        <w:t>problem solving</w:t>
-      </w:r>
-      <w:r>
-        <w:rPr>
-          <w:rFonts w:ascii="Times New Roman" w:hAnsi="Times New Roman" w:cs="Times New Roman"/>
-        </w:rPr>
-        <w:t>. Validasi data s</w:t>
-      </w:r>
-      <w:r>
-        <w:rPr>
-          <w:rFonts w:ascii="Times New Roman" w:hAnsi="Times New Roman" w:cs="Times New Roman"/>
-        </w:rPr>
-        <w:t>a</w:t>
-      </w:r>
-      <w:r>
-        <w:rPr>
-          <w:rFonts w:ascii="Times New Roman" w:hAnsi="Times New Roman" w:cs="Times New Roman"/>
-        </w:rPr>
-        <w:t xml:space="preserve">ngat bermanfaat </w:t>
-      </w:r>
-      <w:r>
-        <w:rPr>
-          <w:rFonts w:ascii="Times New Roman" w:hAnsi="Times New Roman" w:cs="Times New Roman"/>
-        </w:rPr>
-        <w:t xml:space="preserve">untuk menjaga penulis tidak buta arah </w:t>
-      </w:r>
-      <w:r>
-        <w:rPr>
-          <w:rFonts w:ascii="Times New Roman" w:hAnsi="Times New Roman" w:cs="Times New Roman"/>
-        </w:rPr>
-        <w:t>pada</w:t>
-      </w:r>
-      <w:r>
-        <w:rPr>
-          <w:rFonts w:ascii="Times New Roman" w:hAnsi="Times New Roman" w:cs="Times New Roman"/>
-        </w:rPr>
-        <w:t xml:space="preserve"> proses selanjutnya</w:t>
+        <w:t>, dan distribusi data</w:t>
       </w:r>
       <w:r>
         <w:rPr>
@@ -5354,37 +5276,27 @@
       <w:r>
         <w:rPr>
           <w:rFonts w:ascii="Times New Roman" w:hAnsi="Times New Roman" w:cs="Times New Roman"/>
-          <w:color w:val="FF0000"/>
-        </w:rPr>
-        <w:t xml:space="preserve">Struktur data pada dataset adalah </w:t>
-      </w:r>
-      <w:proofErr w:type="gramStart"/>
-      <w:r>
-        <w:rPr>
-          <w:rFonts w:ascii="Times New Roman" w:hAnsi="Times New Roman" w:cs="Times New Roman"/>
-          <w:color w:val="FF0000"/>
-        </w:rPr>
-        <w:t>…..</w:t>
-      </w:r>
-      <w:proofErr w:type="gramEnd"/>
-      <w:r>
-        <w:rPr>
-          <w:rFonts w:ascii="Times New Roman" w:hAnsi="Times New Roman" w:cs="Times New Roman"/>
-          <w:color w:val="FF0000"/>
-        </w:rPr>
-        <w:t xml:space="preserve"> </w:t>
-      </w:r>
-      <w:r>
-        <w:rPr>
-          <w:rFonts w:ascii="Times New Roman" w:hAnsi="Times New Roman" w:cs="Times New Roman"/>
-        </w:rPr>
-        <w:t xml:space="preserve">. </w:t>
-      </w:r>
-      <w:r>
-        <w:rPr>
-          <w:rFonts w:ascii="Times New Roman" w:hAnsi="Times New Roman" w:cs="Times New Roman"/>
-        </w:rPr>
-        <w:t>fungsi validasi struktur data pada proyek ini adalah untuk menentukan kesesuaian tipe data tiap kolom informasi.</w:t>
+        </w:rPr>
+        <w:lastRenderedPageBreak/>
+        <w:t xml:space="preserve">Validasi struktur data </w:t>
+      </w:r>
+      <w:r>
+        <w:rPr>
+          <w:rFonts w:ascii="Times New Roman" w:hAnsi="Times New Roman" w:cs="Times New Roman"/>
+        </w:rPr>
+        <w:t xml:space="preserve">pada proyek ini </w:t>
+      </w:r>
+      <w:r>
+        <w:rPr>
+          <w:rFonts w:ascii="Times New Roman" w:hAnsi="Times New Roman" w:cs="Times New Roman"/>
+        </w:rPr>
+        <w:t xml:space="preserve">berfungsi </w:t>
+      </w:r>
+      <w:r>
+        <w:rPr>
+          <w:rFonts w:ascii="Times New Roman" w:hAnsi="Times New Roman" w:cs="Times New Roman"/>
+        </w:rPr>
+        <w:t>untuk menentukan kesesuaian tipe data tiap kolom informasi.</w:t>
       </w:r>
       <w:r>
         <w:rPr>
@@ -5412,7 +5324,6 @@
           <w:rFonts w:ascii="Times New Roman" w:hAnsi="Times New Roman" w:cs="Times New Roman"/>
           <w:noProof/>
         </w:rPr>
-        <w:lastRenderedPageBreak/>
         <w:drawing>
           <wp:inline distT="0" distB="0" distL="0" distR="0" wp14:anchorId="27B791EC" wp14:editId="2C881256">
             <wp:extent cx="2684456" cy="3240000"/>
@@ -5478,27 +5389,14 @@
       <w:r>
         <w:t xml:space="preserve">Gambar </w:t>
       </w:r>
-      <w:r>
-        <w:fldChar w:fldCharType="begin"/>
-      </w:r>
-      <w:r>
-        <w:instrText xml:space="preserve"> SEQ Gambar \* ARABIC </w:instrText>
-      </w:r>
-      <w:r>
-        <w:fldChar w:fldCharType="separate"/>
-      </w:r>
-      <w:r>
-        <w:rPr>
-          <w:noProof/>
-        </w:rPr>
-        <w:t>10</w:t>
-      </w:r>
-      <w:r>
-        <w:rPr>
-          <w:noProof/>
-        </w:rPr>
-        <w:fldChar w:fldCharType="end"/>
-      </w:r>
+      <w:fldSimple w:instr=" SEQ Gambar \* ARABIC ">
+        <w:r>
+          <w:rPr>
+            <w:noProof/>
+          </w:rPr>
+          <w:t>10</w:t>
+        </w:r>
+      </w:fldSimple>
       <w:r>
         <w:t xml:space="preserve"> Struktrur dataset (data mentah)</w:t>
       </w:r>
@@ -5580,15 +5478,40 @@
       <w:r>
         <w:rPr>
           <w:rFonts w:ascii="Times New Roman" w:hAnsi="Times New Roman" w:cs="Times New Roman"/>
-          <w:color w:val="FF0000"/>
-        </w:rPr>
-        <w:t>Duplikasi data adalah …</w:t>
-      </w:r>
-      <w:proofErr w:type="gramStart"/>
-      <w:r>
-        <w:rPr>
-          <w:rFonts w:ascii="Times New Roman" w:hAnsi="Times New Roman" w:cs="Times New Roman"/>
-          <w:color w:val="FF0000"/>
+        </w:rPr>
+        <w:t>Duplikasi data adalah kondisi di mana suatu informasi tercatat lebih dari satu kali dalam sistem atau database. Hal ini dapat terjadi secara tidak sengaja, sering kali akibat kesalahan dalam proses pengumpulan atau entri data</w:t>
+      </w:r>
+      <w:r>
+        <w:rPr>
+          <w:rFonts w:ascii="Times New Roman" w:hAnsi="Times New Roman" w:cs="Times New Roman"/>
+        </w:rPr>
+        <w:t xml:space="preserve"> </w:t>
+      </w:r>
+      <w:sdt>
+        <w:sdtPr>
+          <w:rPr>
+            <w:rFonts w:ascii="Times New Roman" w:hAnsi="Times New Roman" w:cs="Times New Roman"/>
+            <w:color w:val="000000"/>
+          </w:rPr>
+          <w:tag w:val="MENDELEY_CITATION_v3_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"/>
+          <w:id w:val="-93795661"/>
+          <w:placeholder>
+            <w:docPart w:val="DefaultPlaceholder_-1854013440"/>
+          </w:placeholder>
+        </w:sdtPr>
+        <w:sdtContent>
+          <w:r>
+            <w:rPr>
+              <w:rFonts w:ascii="Times New Roman" w:hAnsi="Times New Roman" w:cs="Times New Roman"/>
+              <w:color w:val="000000"/>
+            </w:rPr>
+            <w:t>[4]</w:t>
+          </w:r>
+        </w:sdtContent>
+      </w:sdt>
+      <w:r>
+        <w:rPr>
+          <w:rFonts w:ascii="Times New Roman" w:hAnsi="Times New Roman" w:cs="Times New Roman"/>
         </w:rPr>
         <w:t xml:space="preserve">. </w:t>
       </w:r>
@@ -5596,20 +5519,14 @@
         <w:rPr>
           <w:rFonts w:ascii="Times New Roman" w:hAnsi="Times New Roman" w:cs="Times New Roman"/>
         </w:rPr>
-        <w:t>.</w:t>
-      </w:r>
-      <w:proofErr w:type="gramEnd"/>
-      <w:r>
-        <w:rPr>
-          <w:rFonts w:ascii="Times New Roman" w:hAnsi="Times New Roman" w:cs="Times New Roman"/>
-        </w:rPr>
-        <w:t xml:space="preserve"> </w:t>
-      </w:r>
-      <w:r>
-        <w:rPr>
-          <w:rFonts w:ascii="Times New Roman" w:hAnsi="Times New Roman" w:cs="Times New Roman"/>
-        </w:rPr>
-        <w:t xml:space="preserve">Tujuan dari proses ini adalah untuk mengetahui </w:t>
+        <w:t xml:space="preserve">Tujuan dari proses ini adalah </w:t>
+      </w:r>
+      <w:r>
+        <w:rPr>
+          <w:rFonts w:ascii="Times New Roman" w:hAnsi="Times New Roman" w:cs="Times New Roman"/>
+        </w:rPr>
+        <w:lastRenderedPageBreak/>
+        <w:t xml:space="preserve">untuk mengetahui </w:t>
       </w:r>
       <w:r>
         <w:rPr>
@@ -5621,7 +5538,7 @@
         <w:rPr>
           <w:rFonts w:ascii="Times New Roman" w:hAnsi="Times New Roman" w:cs="Times New Roman"/>
         </w:rPr>
-        <w:t xml:space="preserve"> tidaknya data yang terduplikasi (100 % mirip). Berikut ini adalah dokumentasi dari proses ini:</w:t>
+        <w:t xml:space="preserve"> tidaknya data yang terduplikasi (100% mirip). Berikut ini adalah dokumentasi dari proses ini:</w:t>
       </w:r>
     </w:p>
     <w:p>
@@ -5701,27 +5618,14 @@
       <w:r>
         <w:t xml:space="preserve">Gambar </w:t>
       </w:r>
-      <w:r>
-        <w:fldChar w:fldCharType="begin"/>
-      </w:r>
-      <w:r>
-        <w:instrText xml:space="preserve"> SEQ Gambar \* ARABIC </w:instrText>
-      </w:r>
-      <w:r>
-        <w:fldChar w:fldCharType="separate"/>
-      </w:r>
-      <w:r>
-        <w:rPr>
-          <w:noProof/>
-        </w:rPr>
-        <w:t>11</w:t>
-      </w:r>
-      <w:r>
-        <w:rPr>
-          <w:noProof/>
-        </w:rPr>
-        <w:fldChar w:fldCharType="end"/>
-      </w:r>
+      <w:fldSimple w:instr=" SEQ Gambar \* ARABIC ">
+        <w:r>
+          <w:rPr>
+            <w:noProof/>
+          </w:rPr>
+          <w:t>11</w:t>
+        </w:r>
+      </w:fldSimple>
       <w:r>
         <w:t xml:space="preserve"> Menghitung jumlah data duplikat</w:t>
       </w:r>
@@ -5739,7 +5643,6 @@
           <w:rFonts w:ascii="Times New Roman" w:hAnsi="Times New Roman" w:cs="Times New Roman"/>
           <w:noProof/>
         </w:rPr>
-        <w:lastRenderedPageBreak/>
         <w:drawing>
           <wp:inline distT="0" distB="0" distL="0" distR="0" wp14:anchorId="001CEAE9" wp14:editId="3CEEB980">
             <wp:extent cx="4320000" cy="2091377"/>
@@ -5804,27 +5707,14 @@
       <w:r>
         <w:t xml:space="preserve">Gambar </w:t>
       </w:r>
-      <w:r>
-        <w:fldChar w:fldCharType="begin"/>
-      </w:r>
-      <w:r>
-        <w:instrText xml:space="preserve"> SEQ Gambar \* ARABIC </w:instrText>
-      </w:r>
-      <w:r>
-        <w:fldChar w:fldCharType="separate"/>
-      </w:r>
-      <w:r>
-        <w:rPr>
-          <w:noProof/>
-        </w:rPr>
-        <w:t>12</w:t>
-      </w:r>
-      <w:r>
-        <w:rPr>
-          <w:noProof/>
-        </w:rPr>
-        <w:fldChar w:fldCharType="end"/>
-      </w:r>
+      <w:fldSimple w:instr=" SEQ Gambar \* ARABIC ">
+        <w:r>
+          <w:rPr>
+            <w:noProof/>
+          </w:rPr>
+          <w:t>12</w:t>
+        </w:r>
+      </w:fldSimple>
       <w:r>
         <w:t xml:space="preserve"> Sampel data duplikat</w:t>
       </w:r>
@@ -5888,42 +5778,14 @@
           <w:rFonts w:ascii="Times New Roman" w:hAnsi="Times New Roman" w:cs="Times New Roman"/>
         </w:rPr>
       </w:pPr>
+      <w:proofErr w:type="gramStart"/>
       <w:r>
         <w:rPr>
           <w:rFonts w:ascii="Times New Roman" w:hAnsi="Times New Roman" w:cs="Times New Roman"/>
           <w:i/>
           <w:iCs/>
-          <w:color w:val="FF0000"/>
-        </w:rPr>
-        <w:t xml:space="preserve">Missing/null values </w:t>
-      </w:r>
-      <w:r>
-        <w:rPr>
-          <w:rFonts w:ascii="Times New Roman" w:hAnsi="Times New Roman" w:cs="Times New Roman"/>
-          <w:color w:val="FF0000"/>
-        </w:rPr>
-        <w:t>adalah …</w:t>
-      </w:r>
-      <w:proofErr w:type="gramStart"/>
-      <w:r>
-        <w:rPr>
-          <w:rFonts w:ascii="Times New Roman" w:hAnsi="Times New Roman" w:cs="Times New Roman"/>
-          <w:color w:val="FF0000"/>
-        </w:rPr>
-        <w:t xml:space="preserve">. </w:t>
-      </w:r>
-      <w:r>
-        <w:rPr>
-          <w:rFonts w:ascii="Times New Roman" w:hAnsi="Times New Roman" w:cs="Times New Roman"/>
-        </w:rPr>
-        <w:t>.</w:t>
-      </w:r>
-      <w:proofErr w:type="gramEnd"/>
-      <w:r>
-        <w:rPr>
-          <w:rFonts w:ascii="Times New Roman" w:hAnsi="Times New Roman" w:cs="Times New Roman"/>
-        </w:rPr>
-        <w:t xml:space="preserve"> Tujuan dari proses ini adalah untuk mengetahui bagian mana saja yang terdapat </w:t>
+        </w:rPr>
+        <w:t>M</w:t>
       </w:r>
       <w:r>
         <w:rPr>
@@ -5931,6 +5793,188 @@
           <w:i/>
           <w:iCs/>
         </w:rPr>
+        <w:t>issing  value</w:t>
+      </w:r>
+      <w:proofErr w:type="gramEnd"/>
+      <w:r>
+        <w:rPr>
+          <w:rFonts w:ascii="Times New Roman" w:hAnsi="Times New Roman" w:cs="Times New Roman"/>
+          <w:i/>
+          <w:iCs/>
+        </w:rPr>
+        <w:t xml:space="preserve"> </w:t>
+      </w:r>
+      <w:r>
+        <w:rPr>
+          <w:rFonts w:ascii="Times New Roman" w:hAnsi="Times New Roman" w:cs="Times New Roman"/>
+        </w:rPr>
+        <w:t xml:space="preserve"> </w:t>
+      </w:r>
+      <w:proofErr w:type="gramStart"/>
+      <w:r>
+        <w:rPr>
+          <w:rFonts w:ascii="Times New Roman" w:hAnsi="Times New Roman" w:cs="Times New Roman"/>
+        </w:rPr>
+        <w:t>adalah  satu</w:t>
+      </w:r>
+      <w:proofErr w:type="gramEnd"/>
+      <w:r>
+        <w:rPr>
+          <w:rFonts w:ascii="Times New Roman" w:hAnsi="Times New Roman" w:cs="Times New Roman"/>
+        </w:rPr>
+        <w:t xml:space="preserve">  </w:t>
+      </w:r>
+      <w:proofErr w:type="gramStart"/>
+      <w:r>
+        <w:rPr>
+          <w:rFonts w:ascii="Times New Roman" w:hAnsi="Times New Roman" w:cs="Times New Roman"/>
+        </w:rPr>
+        <w:t>kondisi  dimana</w:t>
+      </w:r>
+      <w:proofErr w:type="gramEnd"/>
+      <w:r>
+        <w:rPr>
+          <w:rFonts w:ascii="Times New Roman" w:hAnsi="Times New Roman" w:cs="Times New Roman"/>
+        </w:rPr>
+        <w:t xml:space="preserve">  </w:t>
+      </w:r>
+      <w:proofErr w:type="gramStart"/>
+      <w:r>
+        <w:rPr>
+          <w:rFonts w:ascii="Times New Roman" w:hAnsi="Times New Roman" w:cs="Times New Roman"/>
+        </w:rPr>
+        <w:t>terdapat  nilai</w:t>
+      </w:r>
+      <w:proofErr w:type="gramEnd"/>
+      <w:r>
+        <w:rPr>
+          <w:rFonts w:ascii="Times New Roman" w:hAnsi="Times New Roman" w:cs="Times New Roman"/>
+        </w:rPr>
+        <w:t xml:space="preserve">  </w:t>
+      </w:r>
+      <w:proofErr w:type="gramStart"/>
+      <w:r>
+        <w:rPr>
+          <w:rFonts w:ascii="Times New Roman" w:hAnsi="Times New Roman" w:cs="Times New Roman"/>
+        </w:rPr>
+        <w:t>yang  tidak</w:t>
+      </w:r>
+      <w:proofErr w:type="gramEnd"/>
+      <w:r>
+        <w:rPr>
+          <w:rFonts w:ascii="Times New Roman" w:hAnsi="Times New Roman" w:cs="Times New Roman"/>
+        </w:rPr>
+        <w:t xml:space="preserve"> </w:t>
+      </w:r>
+      <w:proofErr w:type="gramStart"/>
+      <w:r>
+        <w:rPr>
+          <w:rFonts w:ascii="Times New Roman" w:hAnsi="Times New Roman" w:cs="Times New Roman"/>
+        </w:rPr>
+        <w:t>lengkap  atau</w:t>
+      </w:r>
+      <w:proofErr w:type="gramEnd"/>
+      <w:r>
+        <w:rPr>
+          <w:rFonts w:ascii="Times New Roman" w:hAnsi="Times New Roman" w:cs="Times New Roman"/>
+        </w:rPr>
+        <w:t xml:space="preserve">  </w:t>
+      </w:r>
+      <w:proofErr w:type="gramStart"/>
+      <w:r>
+        <w:rPr>
+          <w:rFonts w:ascii="Times New Roman" w:hAnsi="Times New Roman" w:cs="Times New Roman"/>
+        </w:rPr>
+        <w:t>kosong  pada</w:t>
+      </w:r>
+      <w:proofErr w:type="gramEnd"/>
+      <w:r>
+        <w:rPr>
+          <w:rFonts w:ascii="Times New Roman" w:hAnsi="Times New Roman" w:cs="Times New Roman"/>
+        </w:rPr>
+        <w:t xml:space="preserve">  </w:t>
+      </w:r>
+      <w:proofErr w:type="gramStart"/>
+      <w:r>
+        <w:rPr>
+          <w:rFonts w:ascii="Times New Roman" w:hAnsi="Times New Roman" w:cs="Times New Roman"/>
+        </w:rPr>
+        <w:t>satu  atau</w:t>
+      </w:r>
+      <w:proofErr w:type="gramEnd"/>
+      <w:r>
+        <w:rPr>
+          <w:rFonts w:ascii="Times New Roman" w:hAnsi="Times New Roman" w:cs="Times New Roman"/>
+        </w:rPr>
+        <w:t xml:space="preserve">  </w:t>
+      </w:r>
+      <w:proofErr w:type="gramStart"/>
+      <w:r>
+        <w:rPr>
+          <w:rFonts w:ascii="Times New Roman" w:hAnsi="Times New Roman" w:cs="Times New Roman"/>
+        </w:rPr>
+        <w:t>beberapa  kriteria</w:t>
+      </w:r>
+      <w:proofErr w:type="gramEnd"/>
+      <w:r>
+        <w:rPr>
+          <w:rFonts w:ascii="Times New Roman" w:hAnsi="Times New Roman" w:cs="Times New Roman"/>
+        </w:rPr>
+        <w:t xml:space="preserve"> </w:t>
+      </w:r>
+      <w:sdt>
+        <w:sdtPr>
+          <w:rPr>
+            <w:rFonts w:ascii="Times New Roman" w:hAnsi="Times New Roman" w:cs="Times New Roman"/>
+            <w:color w:val="000000"/>
+          </w:rPr>
+          <w:tag w:val="MENDELEY_CITATION_v3_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"/>
+          <w:id w:val="-1331597668"/>
+          <w:placeholder>
+            <w:docPart w:val="DefaultPlaceholder_-1854013440"/>
+          </w:placeholder>
+        </w:sdtPr>
+        <w:sdtContent>
+          <w:r>
+            <w:rPr>
+              <w:rFonts w:ascii="Times New Roman" w:hAnsi="Times New Roman" w:cs="Times New Roman"/>
+              <w:color w:val="000000"/>
+            </w:rPr>
+            <w:t>[5]</w:t>
+          </w:r>
+        </w:sdtContent>
+      </w:sdt>
+      <w:r>
+        <w:rPr>
+          <w:rFonts w:ascii="Times New Roman" w:hAnsi="Times New Roman" w:cs="Times New Roman"/>
+        </w:rPr>
+        <w:t>.</w:t>
+      </w:r>
+      <w:r>
+        <w:rPr>
+          <w:rFonts w:ascii="Times New Roman" w:hAnsi="Times New Roman" w:cs="Times New Roman"/>
+        </w:rPr>
+        <w:t xml:space="preserve"> </w:t>
+      </w:r>
+      <w:r>
+        <w:rPr>
+          <w:rFonts w:ascii="Times New Roman" w:hAnsi="Times New Roman" w:cs="Times New Roman"/>
+        </w:rPr>
+        <w:t xml:space="preserve">Tujuan dari proses ini adalah untuk mengetahui bagian mana </w:t>
+      </w:r>
+      <w:r>
+        <w:rPr>
+          <w:rFonts w:ascii="Times New Roman" w:hAnsi="Times New Roman" w:cs="Times New Roman"/>
+        </w:rPr>
+        <w:lastRenderedPageBreak/>
+        <w:t xml:space="preserve">saja yang terdapat </w:t>
+      </w:r>
+      <w:r>
+        <w:rPr>
+          <w:rFonts w:ascii="Times New Roman" w:hAnsi="Times New Roman" w:cs="Times New Roman"/>
+          <w:i/>
+          <w:iCs/>
+        </w:rPr>
         <w:t>missing/null values</w:t>
       </w:r>
       <w:r>
@@ -5959,7 +6003,6 @@
           <w:rFonts w:ascii="Times New Roman" w:hAnsi="Times New Roman" w:cs="Times New Roman"/>
           <w:noProof/>
         </w:rPr>
-        <w:lastRenderedPageBreak/>
         <w:drawing>
           <wp:inline distT="0" distB="0" distL="0" distR="0" wp14:anchorId="68B1F3E2" wp14:editId="5F235B09">
             <wp:extent cx="3960000" cy="3006204"/>
@@ -6024,27 +6067,14 @@
       <w:r>
         <w:t xml:space="preserve">Gambar </w:t>
       </w:r>
-      <w:r>
-        <w:fldChar w:fldCharType="begin"/>
-      </w:r>
-      <w:r>
-        <w:instrText xml:space="preserve"> SEQ Gambar \* ARABIC </w:instrText>
-      </w:r>
-      <w:r>
-        <w:fldChar w:fldCharType="separate"/>
-      </w:r>
-      <w:r>
-        <w:rPr>
-          <w:noProof/>
-        </w:rPr>
-        <w:t>13</w:t>
-      </w:r>
-      <w:r>
-        <w:rPr>
-          <w:noProof/>
-        </w:rPr>
-        <w:fldChar w:fldCharType="end"/>
-      </w:r>
+      <w:fldSimple w:instr=" SEQ Gambar \* ARABIC ">
+        <w:r>
+          <w:rPr>
+            <w:noProof/>
+          </w:rPr>
+          <w:t>13</w:t>
+        </w:r>
+      </w:fldSimple>
       <w:r>
         <w:t xml:space="preserve"> </w:t>
       </w:r>
@@ -6430,6 +6460,7 @@
         <w:rPr>
           <w:rFonts w:ascii="Times New Roman" w:hAnsi="Times New Roman" w:cs="Times New Roman"/>
         </w:rPr>
+        <w:lastRenderedPageBreak/>
         <w:t xml:space="preserve">Kolom ‘ALAMAT DOMISILI’ = </w:t>
       </w:r>
       <w:r>
@@ -6492,7 +6523,6 @@
         <w:rPr>
           <w:rFonts w:ascii="Times New Roman" w:hAnsi="Times New Roman" w:cs="Times New Roman"/>
         </w:rPr>
-        <w:lastRenderedPageBreak/>
         <w:t xml:space="preserve">Kolom ‘PEND. IBU’ = </w:t>
       </w:r>
       <w:r>
@@ -6570,25 +6600,64 @@
       <w:pPr>
         <w:pStyle w:val="ListParagraph"/>
         <w:spacing w:line="480" w:lineRule="auto"/>
-        <w:ind w:left="1440"/>
-        <w:rPr>
-          <w:rFonts w:ascii="Times New Roman" w:hAnsi="Times New Roman" w:cs="Times New Roman"/>
-        </w:rPr>
-      </w:pPr>
-      <w:r>
-        <w:rPr>
-          <w:rFonts w:ascii="Times New Roman" w:hAnsi="Times New Roman" w:cs="Times New Roman"/>
-        </w:rPr>
-        <w:t>Distribusi data pada konteks bussines intelegence adalah …</w:t>
-      </w:r>
-      <w:proofErr w:type="gramStart"/>
-      <w:r>
-        <w:rPr>
-          <w:rFonts w:ascii="Times New Roman" w:hAnsi="Times New Roman" w:cs="Times New Roman"/>
-        </w:rPr>
-        <w:t>. .</w:t>
-      </w:r>
-      <w:proofErr w:type="gramEnd"/>
+        <w:ind w:left="1440" w:firstLine="720"/>
+        <w:jc w:val="both"/>
+        <w:rPr>
+          <w:rFonts w:ascii="Times New Roman" w:hAnsi="Times New Roman" w:cs="Times New Roman"/>
+        </w:rPr>
+      </w:pPr>
+      <w:r>
+        <w:rPr>
+          <w:rFonts w:ascii="Times New Roman" w:hAnsi="Times New Roman" w:cs="Times New Roman"/>
+        </w:rPr>
+        <w:t xml:space="preserve">Distribusi </w:t>
+      </w:r>
+      <w:r>
+        <w:rPr>
+          <w:rFonts w:ascii="Times New Roman" w:hAnsi="Times New Roman" w:cs="Times New Roman"/>
+        </w:rPr>
+        <w:t xml:space="preserve">data </w:t>
+      </w:r>
+      <w:r>
+        <w:rPr>
+          <w:rFonts w:ascii="Times New Roman" w:hAnsi="Times New Roman" w:cs="Times New Roman"/>
+        </w:rPr>
+        <w:t>adalah pola penyebaran yang merupakan gambaran kondisi sekelompok data</w:t>
+      </w:r>
+      <w:r>
+        <w:rPr>
+          <w:rFonts w:ascii="Times New Roman" w:hAnsi="Times New Roman" w:cs="Times New Roman"/>
+        </w:rPr>
+        <w:t xml:space="preserve"> </w:t>
+      </w:r>
+      <w:sdt>
+        <w:sdtPr>
+          <w:rPr>
+            <w:rFonts w:ascii="Times New Roman" w:hAnsi="Times New Roman" w:cs="Times New Roman"/>
+            <w:color w:val="000000"/>
+          </w:rPr>
+          <w:tag w:val="MENDELEY_CITATION_v3_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"/>
+          <w:id w:val="2067759511"/>
+          <w:placeholder>
+            <w:docPart w:val="DefaultPlaceholder_-1854013440"/>
+          </w:placeholder>
+        </w:sdtPr>
+        <w:sdtContent>
+          <w:r>
+            <w:rPr>
+              <w:rFonts w:ascii="Times New Roman" w:hAnsi="Times New Roman" w:cs="Times New Roman"/>
+              <w:color w:val="000000"/>
+            </w:rPr>
+            <w:t>[6]</w:t>
+          </w:r>
+        </w:sdtContent>
+      </w:sdt>
+      <w:r>
+        <w:rPr>
+          <w:rFonts w:ascii="Times New Roman" w:hAnsi="Times New Roman" w:cs="Times New Roman"/>
+        </w:rPr>
+        <w:t>.</w:t>
+      </w:r>
       <w:r>
         <w:rPr>
           <w:rFonts w:ascii="Times New Roman" w:hAnsi="Times New Roman" w:cs="Times New Roman"/>
@@ -6707,27 +6776,14 @@
       <w:r>
         <w:t xml:space="preserve">Gambar </w:t>
       </w:r>
-      <w:r>
-        <w:fldChar w:fldCharType="begin"/>
-      </w:r>
-      <w:r>
-        <w:instrText xml:space="preserve"> SEQ Gambar \* ARABIC </w:instrText>
-      </w:r>
-      <w:r>
-        <w:fldChar w:fldCharType="separate"/>
-      </w:r>
-      <w:r>
-        <w:rPr>
-          <w:noProof/>
-        </w:rPr>
-        <w:t>14</w:t>
-      </w:r>
-      <w:r>
-        <w:rPr>
-          <w:noProof/>
-        </w:rPr>
-        <w:fldChar w:fldCharType="end"/>
-      </w:r>
+      <w:fldSimple w:instr=" SEQ Gambar \* ARABIC ">
+        <w:r>
+          <w:rPr>
+            <w:noProof/>
+          </w:rPr>
+          <w:t>14</w:t>
+        </w:r>
+      </w:fldSimple>
       <w:r>
         <w:t xml:space="preserve"> Distribusi jalur pendaftaran</w:t>
       </w:r>
@@ -6808,27 +6864,14 @@
       <w:r>
         <w:t xml:space="preserve">Gambar </w:t>
       </w:r>
-      <w:r>
-        <w:fldChar w:fldCharType="begin"/>
-      </w:r>
-      <w:r>
-        <w:instrText xml:space="preserve"> SEQ Gambar \* ARABIC </w:instrText>
-      </w:r>
-      <w:r>
-        <w:fldChar w:fldCharType="separate"/>
-      </w:r>
-      <w:r>
-        <w:rPr>
-          <w:noProof/>
-        </w:rPr>
-        <w:t>15</w:t>
-      </w:r>
-      <w:r>
-        <w:rPr>
-          <w:noProof/>
-        </w:rPr>
-        <w:fldChar w:fldCharType="end"/>
-      </w:r>
+      <w:fldSimple w:instr=" SEQ Gambar \* ARABIC ">
+        <w:r>
+          <w:rPr>
+            <w:noProof/>
+          </w:rPr>
+          <w:t>15</w:t>
+        </w:r>
+      </w:fldSimple>
       <w:r>
         <w:t xml:space="preserve"> </w:t>
       </w:r>
@@ -6921,27 +6964,14 @@
       <w:r>
         <w:t xml:space="preserve">Gambar </w:t>
       </w:r>
-      <w:r>
-        <w:fldChar w:fldCharType="begin"/>
-      </w:r>
-      <w:r>
-        <w:instrText xml:space="preserve"> SEQ Gambar \* ARABIC </w:instrText>
-      </w:r>
-      <w:r>
-        <w:fldChar w:fldCharType="separate"/>
-      </w:r>
-      <w:r>
-        <w:rPr>
-          <w:noProof/>
-        </w:rPr>
-        <w:t>16</w:t>
-      </w:r>
-      <w:r>
-        <w:rPr>
-          <w:noProof/>
-        </w:rPr>
-        <w:fldChar w:fldCharType="end"/>
-      </w:r>
+      <w:fldSimple w:instr=" SEQ Gambar \* ARABIC ">
+        <w:r>
+          <w:rPr>
+            <w:noProof/>
+          </w:rPr>
+          <w:t>16</w:t>
+        </w:r>
+      </w:fldSimple>
       <w:r>
         <w:t xml:space="preserve"> Distribusi </w:t>
       </w:r>
@@ -7024,27 +7054,14 @@
       <w:r>
         <w:t xml:space="preserve">Gambar </w:t>
       </w:r>
-      <w:r>
-        <w:fldChar w:fldCharType="begin"/>
-      </w:r>
-      <w:r>
-        <w:instrText xml:space="preserve"> SEQ Gambar \* ARABIC </w:instrText>
-      </w:r>
-      <w:r>
-        <w:fldChar w:fldCharType="separate"/>
-      </w:r>
-      <w:r>
-        <w:rPr>
-          <w:noProof/>
-        </w:rPr>
-        <w:t>17</w:t>
-      </w:r>
-      <w:r>
-        <w:rPr>
-          <w:noProof/>
-        </w:rPr>
-        <w:fldChar w:fldCharType="end"/>
-      </w:r>
+      <w:fldSimple w:instr=" SEQ Gambar \* ARABIC ">
+        <w:r>
+          <w:rPr>
+            <w:noProof/>
+          </w:rPr>
+          <w:t>17</w:t>
+        </w:r>
+      </w:fldSimple>
       <w:r>
         <w:t xml:space="preserve"> Distribusi </w:t>
       </w:r>
@@ -7067,7 +7084,7 @@
         </w:rPr>
         <w:lastRenderedPageBreak/>
         <w:drawing>
-          <wp:inline distT="0" distB="0" distL="0" distR="0" wp14:anchorId="5EBC01C6" wp14:editId="29C6B4C3">
+          <wp:inline distT="0" distB="0" distL="0" distR="0" wp14:anchorId="5EBC01C6" wp14:editId="330C2D60">
             <wp:extent cx="4320000" cy="4658802"/>
             <wp:effectExtent l="0" t="0" r="4445" b="8890"/>
             <wp:docPr id="1878337612" name="Picture 9"/>
@@ -7128,27 +7145,14 @@
       <w:r>
         <w:t xml:space="preserve">Gambar </w:t>
       </w:r>
-      <w:r>
-        <w:fldChar w:fldCharType="begin"/>
-      </w:r>
-      <w:r>
-        <w:instrText xml:space="preserve"> SEQ Gambar \* ARABIC </w:instrText>
-      </w:r>
-      <w:r>
-        <w:fldChar w:fldCharType="separate"/>
-      </w:r>
-      <w:r>
-        <w:rPr>
-          <w:noProof/>
-        </w:rPr>
-        <w:t>18</w:t>
-      </w:r>
-      <w:r>
-        <w:rPr>
-          <w:noProof/>
-        </w:rPr>
-        <w:fldChar w:fldCharType="end"/>
-      </w:r>
+      <w:fldSimple w:instr=" SEQ Gambar \* ARABIC ">
+        <w:r>
+          <w:rPr>
+            <w:noProof/>
+          </w:rPr>
+          <w:t>18</w:t>
+        </w:r>
+      </w:fldSimple>
       <w:r>
         <w:t xml:space="preserve"> Distribusi </w:t>
       </w:r>
@@ -7170,7 +7174,7 @@
           <w:noProof/>
         </w:rPr>
         <w:drawing>
-          <wp:inline distT="0" distB="0" distL="0" distR="0" wp14:anchorId="733B8FED" wp14:editId="6F0EE727">
+          <wp:inline distT="0" distB="0" distL="0" distR="0" wp14:anchorId="733B8FED" wp14:editId="38F8922A">
             <wp:extent cx="4320000" cy="2058826"/>
             <wp:effectExtent l="0" t="0" r="4445" b="0"/>
             <wp:docPr id="55094509" name="Picture 10"/>
@@ -7231,27 +7235,14 @@
       <w:r>
         <w:t xml:space="preserve">Gambar </w:t>
       </w:r>
-      <w:r>
-        <w:fldChar w:fldCharType="begin"/>
-      </w:r>
-      <w:r>
-        <w:instrText xml:space="preserve"> SEQ Gambar \* ARABIC </w:instrText>
-      </w:r>
-      <w:r>
-        <w:fldChar w:fldCharType="separate"/>
-      </w:r>
-      <w:r>
-        <w:rPr>
-          <w:noProof/>
-        </w:rPr>
-        <w:t>19</w:t>
-      </w:r>
-      <w:r>
-        <w:rPr>
-          <w:noProof/>
-        </w:rPr>
-        <w:fldChar w:fldCharType="end"/>
-      </w:r>
+      <w:fldSimple w:instr=" SEQ Gambar \* ARABIC ">
+        <w:r>
+          <w:rPr>
+            <w:noProof/>
+          </w:rPr>
+          <w:t>19</w:t>
+        </w:r>
+      </w:fldSimple>
       <w:r>
         <w:t xml:space="preserve"> Distribusi </w:t>
       </w:r>
@@ -7335,27 +7326,14 @@
       <w:r>
         <w:t xml:space="preserve">Gambar </w:t>
       </w:r>
-      <w:r>
-        <w:fldChar w:fldCharType="begin"/>
-      </w:r>
-      <w:r>
-        <w:instrText xml:space="preserve"> SEQ Gambar \* ARABIC </w:instrText>
-      </w:r>
-      <w:r>
-        <w:fldChar w:fldCharType="separate"/>
-      </w:r>
-      <w:r>
-        <w:rPr>
-          <w:noProof/>
-        </w:rPr>
-        <w:t>20</w:t>
-      </w:r>
-      <w:r>
-        <w:rPr>
-          <w:noProof/>
-        </w:rPr>
-        <w:fldChar w:fldCharType="end"/>
-      </w:r>
+      <w:fldSimple w:instr=" SEQ Gambar \* ARABIC ">
+        <w:r>
+          <w:rPr>
+            <w:noProof/>
+          </w:rPr>
+          <w:t>20</w:t>
+        </w:r>
+      </w:fldSimple>
       <w:r>
         <w:t xml:space="preserve"> Distribusi </w:t>
       </w:r>
@@ -7377,7 +7355,7 @@
           <w:noProof/>
         </w:rPr>
         <w:drawing>
-          <wp:inline distT="0" distB="0" distL="0" distR="0" wp14:anchorId="314D0ACC" wp14:editId="528FBB3D">
+          <wp:inline distT="0" distB="0" distL="0" distR="0" wp14:anchorId="314D0ACC" wp14:editId="5AC0FEB7">
             <wp:extent cx="4320000" cy="2070296"/>
             <wp:effectExtent l="0" t="0" r="4445" b="6350"/>
             <wp:docPr id="1341359440" name="Picture 12"/>
@@ -7438,27 +7416,14 @@
       <w:r>
         <w:t xml:space="preserve">Gambar </w:t>
       </w:r>
-      <w:r>
-        <w:fldChar w:fldCharType="begin"/>
-      </w:r>
-      <w:r>
-        <w:instrText xml:space="preserve"> SEQ Gambar \* ARABIC </w:instrText>
-      </w:r>
-      <w:r>
-        <w:fldChar w:fldCharType="separate"/>
-      </w:r>
-      <w:r>
-        <w:rPr>
-          <w:noProof/>
-        </w:rPr>
-        <w:t>21</w:t>
-      </w:r>
-      <w:r>
-        <w:rPr>
-          <w:noProof/>
-        </w:rPr>
-        <w:fldChar w:fldCharType="end"/>
-      </w:r>
+      <w:fldSimple w:instr=" SEQ Gambar \* ARABIC ">
+        <w:r>
+          <w:rPr>
+            <w:noProof/>
+          </w:rPr>
+          <w:t>21</w:t>
+        </w:r>
+      </w:fldSimple>
       <w:r>
         <w:t xml:space="preserve"> Distribusi </w:t>
       </w:r>
@@ -7542,27 +7507,14 @@
       <w:r>
         <w:t xml:space="preserve">Gambar </w:t>
       </w:r>
-      <w:r>
-        <w:fldChar w:fldCharType="begin"/>
-      </w:r>
-      <w:r>
-        <w:instrText xml:space="preserve"> SEQ Gambar \* ARABIC </w:instrText>
-      </w:r>
-      <w:r>
-        <w:fldChar w:fldCharType="separate"/>
-      </w:r>
-      <w:r>
-        <w:rPr>
-          <w:noProof/>
-        </w:rPr>
-        <w:t>22</w:t>
-      </w:r>
-      <w:r>
-        <w:rPr>
-          <w:noProof/>
-        </w:rPr>
-        <w:fldChar w:fldCharType="end"/>
-      </w:r>
+      <w:fldSimple w:instr=" SEQ Gambar \* ARABIC ">
+        <w:r>
+          <w:rPr>
+            <w:noProof/>
+          </w:rPr>
+          <w:t>22</w:t>
+        </w:r>
+      </w:fldSimple>
       <w:r>
         <w:t xml:space="preserve"> Distribusi </w:t>
       </w:r>
@@ -7645,27 +7597,14 @@
       <w:r>
         <w:t xml:space="preserve">Gambar </w:t>
       </w:r>
-      <w:r>
-        <w:fldChar w:fldCharType="begin"/>
-      </w:r>
-      <w:r>
-        <w:instrText xml:space="preserve"> SEQ Gambar \* ARABIC </w:instrText>
-      </w:r>
-      <w:r>
-        <w:fldChar w:fldCharType="separate"/>
-      </w:r>
-      <w:r>
-        <w:rPr>
-          <w:noProof/>
-        </w:rPr>
-        <w:t>23</w:t>
-      </w:r>
-      <w:r>
-        <w:rPr>
-          <w:noProof/>
-        </w:rPr>
-        <w:fldChar w:fldCharType="end"/>
-      </w:r>
+      <w:fldSimple w:instr=" SEQ Gambar \* ARABIC ">
+        <w:r>
+          <w:rPr>
+            <w:noProof/>
+          </w:rPr>
+          <w:t>23</w:t>
+        </w:r>
+      </w:fldSimple>
       <w:r>
         <w:t xml:space="preserve"> Distribusi </w:t>
       </w:r>
@@ -7749,27 +7688,14 @@
       <w:r>
         <w:t xml:space="preserve">Gambar </w:t>
       </w:r>
-      <w:r>
-        <w:fldChar w:fldCharType="begin"/>
-      </w:r>
-      <w:r>
-        <w:instrText xml:space="preserve"> SEQ Gambar \* ARABIC </w:instrText>
-      </w:r>
-      <w:r>
-        <w:fldChar w:fldCharType="separate"/>
-      </w:r>
-      <w:r>
-        <w:rPr>
-          <w:noProof/>
-        </w:rPr>
-        <w:t>24</w:t>
-      </w:r>
-      <w:r>
-        <w:rPr>
-          <w:noProof/>
-        </w:rPr>
-        <w:fldChar w:fldCharType="end"/>
-      </w:r>
+      <w:fldSimple w:instr=" SEQ Gambar \* ARABIC ">
+        <w:r>
+          <w:rPr>
+            <w:noProof/>
+          </w:rPr>
+          <w:t>24</w:t>
+        </w:r>
+      </w:fldSimple>
       <w:r>
         <w:t xml:space="preserve"> Distribusi </w:t>
       </w:r>
@@ -7852,27 +7778,14 @@
       <w:r>
         <w:t xml:space="preserve">Gambar </w:t>
       </w:r>
-      <w:r>
-        <w:fldChar w:fldCharType="begin"/>
-      </w:r>
-      <w:r>
-        <w:instrText xml:space="preserve"> SEQ Gambar \* ARABIC </w:instrText>
-      </w:r>
-      <w:r>
-        <w:fldChar w:fldCharType="separate"/>
-      </w:r>
-      <w:r>
-        <w:rPr>
-          <w:noProof/>
-        </w:rPr>
-        <w:t>25</w:t>
-      </w:r>
-      <w:r>
-        <w:rPr>
-          <w:noProof/>
-        </w:rPr>
-        <w:fldChar w:fldCharType="end"/>
-      </w:r>
+      <w:fldSimple w:instr=" SEQ Gambar \* ARABIC ">
+        <w:r>
+          <w:rPr>
+            <w:noProof/>
+          </w:rPr>
+          <w:t>25</w:t>
+        </w:r>
+      </w:fldSimple>
       <w:r>
         <w:t xml:space="preserve"> Distribusi </w:t>
       </w:r>
@@ -7956,27 +7869,14 @@
       <w:r>
         <w:t xml:space="preserve">Gambar </w:t>
       </w:r>
-      <w:r>
-        <w:fldChar w:fldCharType="begin"/>
-      </w:r>
-      <w:r>
-        <w:instrText xml:space="preserve"> SEQ Gambar \* ARABIC </w:instrText>
-      </w:r>
-      <w:r>
-        <w:fldChar w:fldCharType="separate"/>
-      </w:r>
-      <w:r>
-        <w:rPr>
-          <w:noProof/>
-        </w:rPr>
-        <w:t>26</w:t>
-      </w:r>
-      <w:r>
-        <w:rPr>
-          <w:noProof/>
-        </w:rPr>
-        <w:fldChar w:fldCharType="end"/>
-      </w:r>
+      <w:fldSimple w:instr=" SEQ Gambar \* ARABIC ">
+        <w:r>
+          <w:rPr>
+            <w:noProof/>
+          </w:rPr>
+          <w:t>26</w:t>
+        </w:r>
+      </w:fldSimple>
       <w:r>
         <w:t xml:space="preserve"> Distribusi </w:t>
       </w:r>
@@ -8320,43 +8220,101 @@
           <w:rFonts w:ascii="Times New Roman" w:hAnsi="Times New Roman" w:cs="Times New Roman"/>
           <w:i/>
           <w:iCs/>
-          <w:color w:val="FF0000"/>
         </w:rPr>
         <w:t>Problem solving</w:t>
       </w:r>
       <w:r>
         <w:rPr>
           <w:rFonts w:ascii="Times New Roman" w:hAnsi="Times New Roman" w:cs="Times New Roman"/>
-          <w:color w:val="FF0000"/>
-        </w:rPr>
-        <w:t xml:space="preserve"> secara umum adalah </w:t>
-      </w:r>
-      <w:proofErr w:type="gramStart"/>
-      <w:r>
-        <w:rPr>
-          <w:rFonts w:ascii="Times New Roman" w:hAnsi="Times New Roman" w:cs="Times New Roman"/>
-          <w:color w:val="FF0000"/>
-        </w:rPr>
-        <w:t xml:space="preserve">… </w:t>
-      </w:r>
+        </w:rPr>
+        <w:t xml:space="preserve"> adalah salah satu bagian dari proses berpikir yang berupa kemampuan untuk memecahkan persoalan</w:t>
+      </w:r>
+      <w:r>
+        <w:rPr>
+          <w:rFonts w:ascii="Times New Roman" w:hAnsi="Times New Roman" w:cs="Times New Roman"/>
+        </w:rPr>
+        <w:t xml:space="preserve"> </w:t>
+      </w:r>
+      <w:sdt>
+        <w:sdtPr>
+          <w:rPr>
+            <w:rFonts w:ascii="Times New Roman" w:hAnsi="Times New Roman" w:cs="Times New Roman"/>
+            <w:color w:val="000000"/>
+          </w:rPr>
+          <w:tag w:val="MENDELEY_CITATION_v3_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"/>
+          <w:id w:val="98221524"/>
+          <w:placeholder>
+            <w:docPart w:val="DefaultPlaceholder_-1854013440"/>
+          </w:placeholder>
+        </w:sdtPr>
+        <w:sdtContent>
+          <w:r>
+            <w:rPr>
+              <w:rFonts w:ascii="Times New Roman" w:hAnsi="Times New Roman" w:cs="Times New Roman"/>
+              <w:color w:val="000000"/>
+            </w:rPr>
+            <w:t>[7]</w:t>
+          </w:r>
+        </w:sdtContent>
+      </w:sdt>
       <w:r>
         <w:rPr>
           <w:rFonts w:ascii="Times New Roman" w:hAnsi="Times New Roman" w:cs="Times New Roman"/>
         </w:rPr>
         <w:t>.</w:t>
       </w:r>
-      <w:proofErr w:type="gramEnd"/>
-      <w:r>
-        <w:rPr>
-          <w:rFonts w:ascii="Times New Roman" w:hAnsi="Times New Roman" w:cs="Times New Roman"/>
-        </w:rPr>
-        <w:t xml:space="preserve"> Untuk proyek ini, problem solving bertujuan untuk mengatasi daftar masalah yang ditemukan pada proses validasi data.</w:t>
-      </w:r>
-      <w:r>
-        <w:rPr>
-          <w:rFonts w:ascii="Times New Roman" w:hAnsi="Times New Roman" w:cs="Times New Roman"/>
-        </w:rPr>
-        <w:t xml:space="preserve"> Setelah dilakukan problem solving, tahap validasi dilakukan lagi untuk memastikan </w:t>
+      <w:r>
+        <w:rPr>
+          <w:rFonts w:ascii="Times New Roman" w:hAnsi="Times New Roman" w:cs="Times New Roman"/>
+        </w:rPr>
+        <w:t xml:space="preserve"> </w:t>
+      </w:r>
+      <w:r>
+        <w:rPr>
+          <w:rFonts w:ascii="Times New Roman" w:hAnsi="Times New Roman" w:cs="Times New Roman"/>
+        </w:rPr>
+        <w:t xml:space="preserve">Untuk proyek ini, </w:t>
+      </w:r>
+      <w:r>
+        <w:rPr>
+          <w:rFonts w:ascii="Times New Roman" w:hAnsi="Times New Roman" w:cs="Times New Roman"/>
+          <w:i/>
+          <w:iCs/>
+        </w:rPr>
+        <w:t>problem solving</w:t>
+      </w:r>
+      <w:r>
+        <w:rPr>
+          <w:rFonts w:ascii="Times New Roman" w:hAnsi="Times New Roman" w:cs="Times New Roman"/>
+        </w:rPr>
+        <w:t xml:space="preserve"> bertujuan untuk mengatasi daftar masalah yang ditemukan pada proses validasi data.</w:t>
+      </w:r>
+      <w:r>
+        <w:rPr>
+          <w:rFonts w:ascii="Times New Roman" w:hAnsi="Times New Roman" w:cs="Times New Roman"/>
+        </w:rPr>
+        <w:t xml:space="preserve"> Setelah dilakukan </w:t>
+      </w:r>
+      <w:r>
+        <w:rPr>
+          <w:rFonts w:ascii="Times New Roman" w:hAnsi="Times New Roman" w:cs="Times New Roman"/>
+          <w:i/>
+          <w:iCs/>
+        </w:rPr>
+        <w:t>problem solving</w:t>
+      </w:r>
+      <w:r>
+        <w:rPr>
+          <w:rFonts w:ascii="Times New Roman" w:hAnsi="Times New Roman" w:cs="Times New Roman"/>
+        </w:rPr>
+        <w:t xml:space="preserve">, tahap validasi </w:t>
+      </w:r>
+      <w:r>
+        <w:rPr>
+          <w:rFonts w:ascii="Times New Roman" w:hAnsi="Times New Roman" w:cs="Times New Roman"/>
+        </w:rPr>
+        <w:lastRenderedPageBreak/>
+        <w:t xml:space="preserve">dilakukan lagi untuk memastikan </w:t>
       </w:r>
       <w:r>
         <w:rPr>
@@ -8398,7 +8356,6 @@
         </w:numPr>
       </w:pPr>
       <w:r>
-        <w:lastRenderedPageBreak/>
         <w:t>Struktur data</w:t>
       </w:r>
     </w:p>
@@ -8514,27 +8471,14 @@
       <w:r>
         <w:t xml:space="preserve">Gambar </w:t>
       </w:r>
-      <w:r>
-        <w:fldChar w:fldCharType="begin"/>
-      </w:r>
-      <w:r>
-        <w:instrText xml:space="preserve"> SEQ Gambar \* ARABIC </w:instrText>
-      </w:r>
-      <w:r>
-        <w:fldChar w:fldCharType="separate"/>
-      </w:r>
-      <w:r>
-        <w:rPr>
-          <w:noProof/>
-        </w:rPr>
-        <w:t>27</w:t>
-      </w:r>
-      <w:r>
-        <w:rPr>
-          <w:noProof/>
-        </w:rPr>
-        <w:fldChar w:fldCharType="end"/>
-      </w:r>
+      <w:fldSimple w:instr=" SEQ Gambar \* ARABIC ">
+        <w:r>
+          <w:rPr>
+            <w:noProof/>
+          </w:rPr>
+          <w:t>27</w:t>
+        </w:r>
+      </w:fldSimple>
       <w:r>
         <w:t xml:space="preserve"> Validasi ulang struktur data</w:t>
       </w:r>
@@ -8570,7 +8514,14 @@
         <w:rPr>
           <w:rFonts w:ascii="Times New Roman" w:hAnsi="Times New Roman" w:cs="Times New Roman"/>
         </w:rPr>
-        <w:t>. Maka dari itu, 54 data duplikat dihapus pada tahap problem solving</w:t>
+        <w:t xml:space="preserve">. Maka dari itu, 54 data duplikat dihapus pada tahap </w:t>
+      </w:r>
+      <w:r>
+        <w:rPr>
+          <w:rFonts w:ascii="Times New Roman" w:hAnsi="Times New Roman" w:cs="Times New Roman"/>
+        </w:rPr>
+        <w:lastRenderedPageBreak/>
+        <w:t>problem solving</w:t>
       </w:r>
       <w:r>
         <w:rPr>
@@ -8616,7 +8567,6 @@
           <w:rFonts w:ascii="Times New Roman" w:hAnsi="Times New Roman" w:cs="Times New Roman"/>
           <w:noProof/>
         </w:rPr>
-        <w:lastRenderedPageBreak/>
         <w:drawing>
           <wp:inline distT="0" distB="0" distL="0" distR="0" wp14:anchorId="244B21FA" wp14:editId="64149F72">
             <wp:extent cx="3600000" cy="2276551"/>
@@ -8681,27 +8631,14 @@
       <w:r>
         <w:t xml:space="preserve">Gambar </w:t>
       </w:r>
-      <w:r>
-        <w:fldChar w:fldCharType="begin"/>
-      </w:r>
-      <w:r>
-        <w:instrText xml:space="preserve"> SEQ Gambar \* ARABIC </w:instrText>
-      </w:r>
-      <w:r>
-        <w:fldChar w:fldCharType="separate"/>
-      </w:r>
-      <w:r>
-        <w:rPr>
-          <w:noProof/>
-        </w:rPr>
-        <w:t>28</w:t>
-      </w:r>
-      <w:r>
-        <w:rPr>
-          <w:noProof/>
-        </w:rPr>
-        <w:fldChar w:fldCharType="end"/>
-      </w:r>
+      <w:fldSimple w:instr=" SEQ Gambar \* ARABIC ">
+        <w:r>
+          <w:rPr>
+            <w:noProof/>
+          </w:rPr>
+          <w:t>28</w:t>
+        </w:r>
+      </w:fldSimple>
       <w:r>
         <w:t xml:space="preserve"> Validasi ulang duplikasi data</w:t>
       </w:r>
@@ -8729,24 +8666,20 @@
           <w:rFonts w:ascii="Times New Roman" w:hAnsi="Times New Roman" w:cs="Times New Roman"/>
           <w:i/>
           <w:iCs/>
-          <w:color w:val="FF0000"/>
         </w:rPr>
         <w:t>Missing/null values</w:t>
       </w:r>
       <w:r>
         <w:rPr>
           <w:rFonts w:ascii="Times New Roman" w:hAnsi="Times New Roman" w:cs="Times New Roman"/>
-          <w:color w:val="FF0000"/>
-        </w:rPr>
-        <w:t xml:space="preserve"> menyebabkan …</w:t>
-      </w:r>
-      <w:proofErr w:type="gramStart"/>
-      <w:r>
-        <w:rPr>
-          <w:rFonts w:ascii="Times New Roman" w:hAnsi="Times New Roman" w:cs="Times New Roman"/>
-          <w:color w:val="FF0000"/>
-        </w:rPr>
-        <w:t xml:space="preserve">. </w:t>
+        </w:rPr>
+        <w:t xml:space="preserve"> menyebabkan</w:t>
+      </w:r>
+      <w:r>
+        <w:rPr>
+          <w:rFonts w:ascii="Times New Roman" w:hAnsi="Times New Roman" w:cs="Times New Roman"/>
+        </w:rPr>
+        <w:t xml:space="preserve"> kerancuan pada proses visualisasi</w:t>
       </w:r>
       <w:r>
         <w:rPr>
@@ -8754,7 +8687,6 @@
         </w:rPr>
         <w:t>.</w:t>
       </w:r>
-      <w:proofErr w:type="gramEnd"/>
       <w:r>
         <w:rPr>
           <w:rFonts w:ascii="Times New Roman" w:hAnsi="Times New Roman" w:cs="Times New Roman"/>
@@ -8948,27 +8880,14 @@
       <w:r>
         <w:t xml:space="preserve">Gambar </w:t>
       </w:r>
-      <w:r>
-        <w:fldChar w:fldCharType="begin"/>
-      </w:r>
-      <w:r>
-        <w:instrText xml:space="preserve"> SEQ Gambar \* ARABIC </w:instrText>
-      </w:r>
-      <w:r>
-        <w:fldChar w:fldCharType="separate"/>
-      </w:r>
-      <w:r>
-        <w:rPr>
-          <w:noProof/>
-        </w:rPr>
-        <w:t>29</w:t>
-      </w:r>
-      <w:r>
-        <w:rPr>
-          <w:noProof/>
-        </w:rPr>
-        <w:fldChar w:fldCharType="end"/>
-      </w:r>
+      <w:fldSimple w:instr=" SEQ Gambar \* ARABIC ">
+        <w:r>
+          <w:rPr>
+            <w:noProof/>
+          </w:rPr>
+          <w:t>29</w:t>
+        </w:r>
+      </w:fldSimple>
       <w:r>
         <w:t xml:space="preserve"> </w:t>
       </w:r>
@@ -9057,27 +8976,14 @@
       <w:r>
         <w:t xml:space="preserve">Gambar </w:t>
       </w:r>
-      <w:r>
-        <w:fldChar w:fldCharType="begin"/>
-      </w:r>
-      <w:r>
-        <w:instrText xml:space="preserve"> SEQ Gambar \* ARABIC </w:instrText>
-      </w:r>
-      <w:r>
-        <w:fldChar w:fldCharType="separate"/>
-      </w:r>
-      <w:r>
-        <w:rPr>
-          <w:noProof/>
-        </w:rPr>
-        <w:t>30</w:t>
-      </w:r>
-      <w:r>
-        <w:rPr>
-          <w:noProof/>
-        </w:rPr>
-        <w:fldChar w:fldCharType="end"/>
-      </w:r>
+      <w:fldSimple w:instr=" SEQ Gambar \* ARABIC ">
+        <w:r>
+          <w:rPr>
+            <w:noProof/>
+          </w:rPr>
+          <w:t>30</w:t>
+        </w:r>
+      </w:fldSimple>
       <w:r>
         <w:t xml:space="preserve"> contoh data</w:t>
       </w:r>
@@ -9260,27 +9166,14 @@
       <w:r>
         <w:t xml:space="preserve">Gambar </w:t>
       </w:r>
-      <w:r>
-        <w:fldChar w:fldCharType="begin"/>
-      </w:r>
-      <w:r>
-        <w:instrText xml:space="preserve"> SEQ Gambar \* ARABIC </w:instrText>
-      </w:r>
-      <w:r>
-        <w:fldChar w:fldCharType="separate"/>
-      </w:r>
-      <w:r>
-        <w:rPr>
-          <w:noProof/>
-        </w:rPr>
-        <w:t>31</w:t>
-      </w:r>
-      <w:r>
-        <w:rPr>
-          <w:noProof/>
-        </w:rPr>
-        <w:fldChar w:fldCharType="end"/>
-      </w:r>
+      <w:fldSimple w:instr=" SEQ Gambar \* ARABIC ">
+        <w:r>
+          <w:rPr>
+            <w:noProof/>
+          </w:rPr>
+          <w:t>31</w:t>
+        </w:r>
+      </w:fldSimple>
       <w:r>
         <w:t xml:space="preserve"> validasi ulang distribusi usia</w:t>
       </w:r>
@@ -9357,27 +9250,14 @@
       <w:r>
         <w:t xml:space="preserve">Gambar </w:t>
       </w:r>
-      <w:r>
-        <w:fldChar w:fldCharType="begin"/>
-      </w:r>
-      <w:r>
-        <w:instrText xml:space="preserve"> SEQ Gambar \* ARABIC </w:instrText>
-      </w:r>
-      <w:r>
-        <w:fldChar w:fldCharType="separate"/>
-      </w:r>
-      <w:r>
-        <w:rPr>
-          <w:noProof/>
-        </w:rPr>
-        <w:t>32</w:t>
-      </w:r>
-      <w:r>
-        <w:rPr>
-          <w:noProof/>
-        </w:rPr>
-        <w:fldChar w:fldCharType="end"/>
-      </w:r>
+      <w:fldSimple w:instr=" SEQ Gambar \* ARABIC ">
+        <w:r>
+          <w:rPr>
+            <w:noProof/>
+          </w:rPr>
+          <w:t>32</w:t>
+        </w:r>
+      </w:fldSimple>
       <w:r>
         <w:t xml:space="preserve"> validasi ulang fakultas prodi diterima</w:t>
       </w:r>
@@ -9454,27 +9334,14 @@
       <w:r>
         <w:t xml:space="preserve">Gambar </w:t>
       </w:r>
-      <w:r>
-        <w:fldChar w:fldCharType="begin"/>
-      </w:r>
-      <w:r>
-        <w:instrText xml:space="preserve"> SEQ Gambar \* ARABIC </w:instrText>
-      </w:r>
-      <w:r>
-        <w:fldChar w:fldCharType="separate"/>
-      </w:r>
-      <w:r>
-        <w:rPr>
-          <w:noProof/>
-        </w:rPr>
-        <w:t>33</w:t>
-      </w:r>
-      <w:r>
-        <w:rPr>
-          <w:noProof/>
-        </w:rPr>
-        <w:fldChar w:fldCharType="end"/>
-      </w:r>
+      <w:fldSimple w:instr=" SEQ Gambar \* ARABIC ">
+        <w:r>
+          <w:rPr>
+            <w:noProof/>
+          </w:rPr>
+          <w:t>33</w:t>
+        </w:r>
+      </w:fldSimple>
       <w:r>
         <w:t xml:space="preserve"> validasi ulang distribusi fakultas prodi 1</w:t>
       </w:r>
@@ -9552,27 +9419,14 @@
       <w:r>
         <w:t xml:space="preserve">Gambar </w:t>
       </w:r>
-      <w:r>
-        <w:fldChar w:fldCharType="begin"/>
-      </w:r>
-      <w:r>
-        <w:instrText xml:space="preserve"> SEQ Gambar \* ARABIC </w:instrText>
-      </w:r>
-      <w:r>
-        <w:fldChar w:fldCharType="separate"/>
-      </w:r>
-      <w:r>
-        <w:rPr>
-          <w:noProof/>
-        </w:rPr>
-        <w:t>34</w:t>
-      </w:r>
-      <w:r>
-        <w:rPr>
-          <w:noProof/>
-        </w:rPr>
-        <w:fldChar w:fldCharType="end"/>
-      </w:r>
+      <w:fldSimple w:instr=" SEQ Gambar \* ARABIC ">
+        <w:r>
+          <w:rPr>
+            <w:noProof/>
+          </w:rPr>
+          <w:t>34</w:t>
+        </w:r>
+      </w:fldSimple>
       <w:r>
         <w:t xml:space="preserve"> validasi ulang distribusi fakultas prodi 2</w:t>
       </w:r>
@@ -9649,27 +9503,14 @@
       <w:r>
         <w:t xml:space="preserve">Gambar </w:t>
       </w:r>
-      <w:r>
-        <w:fldChar w:fldCharType="begin"/>
-      </w:r>
-      <w:r>
-        <w:instrText xml:space="preserve"> SEQ Gambar \* ARABIC </w:instrText>
-      </w:r>
-      <w:r>
-        <w:fldChar w:fldCharType="separate"/>
-      </w:r>
-      <w:r>
-        <w:rPr>
-          <w:noProof/>
-        </w:rPr>
-        <w:t>35</w:t>
-      </w:r>
-      <w:r>
-        <w:rPr>
-          <w:noProof/>
-        </w:rPr>
-        <w:fldChar w:fldCharType="end"/>
-      </w:r>
+      <w:fldSimple w:instr=" SEQ Gambar \* ARABIC ">
+        <w:r>
+          <w:rPr>
+            <w:noProof/>
+          </w:rPr>
+          <w:t>35</w:t>
+        </w:r>
+      </w:fldSimple>
       <w:r>
         <w:t xml:space="preserve"> validasi ulang distribusi prodi diterima</w:t>
       </w:r>
@@ -9747,27 +9588,14 @@
       <w:r>
         <w:t xml:space="preserve">Gambar </w:t>
       </w:r>
-      <w:r>
-        <w:fldChar w:fldCharType="begin"/>
-      </w:r>
-      <w:r>
-        <w:instrText xml:space="preserve"> SEQ Gambar \* ARABIC </w:instrText>
-      </w:r>
-      <w:r>
-        <w:fldChar w:fldCharType="separate"/>
-      </w:r>
-      <w:r>
-        <w:rPr>
-          <w:noProof/>
-        </w:rPr>
-        <w:t>36</w:t>
-      </w:r>
-      <w:r>
-        <w:rPr>
-          <w:noProof/>
-        </w:rPr>
-        <w:fldChar w:fldCharType="end"/>
-      </w:r>
+      <w:fldSimple w:instr=" SEQ Gambar \* ARABIC ">
+        <w:r>
+          <w:rPr>
+            <w:noProof/>
+          </w:rPr>
+          <w:t>36</w:t>
+        </w:r>
+      </w:fldSimple>
       <w:r>
         <w:t xml:space="preserve"> validasi ulang distribusi prodi pilihan 1</w:t>
       </w:r>
@@ -9848,27 +9676,14 @@
       <w:r>
         <w:t xml:space="preserve">Gambar </w:t>
       </w:r>
-      <w:r>
-        <w:fldChar w:fldCharType="begin"/>
-      </w:r>
-      <w:r>
-        <w:instrText xml:space="preserve"> SEQ Gambar \* ARABIC </w:instrText>
-      </w:r>
-      <w:r>
-        <w:fldChar w:fldCharType="separate"/>
-      </w:r>
-      <w:r>
-        <w:rPr>
-          <w:noProof/>
-        </w:rPr>
-        <w:t>37</w:t>
-      </w:r>
-      <w:r>
-        <w:rPr>
-          <w:noProof/>
-        </w:rPr>
-        <w:fldChar w:fldCharType="end"/>
-      </w:r>
+      <w:fldSimple w:instr=" SEQ Gambar \* ARABIC ">
+        <w:r>
+          <w:rPr>
+            <w:noProof/>
+          </w:rPr>
+          <w:t>37</w:t>
+        </w:r>
+      </w:fldSimple>
       <w:r>
         <w:t xml:space="preserve"> validasi ulang prodi pilihan 2</w:t>
       </w:r>
@@ -10095,27 +9910,14 @@
       <w:r>
         <w:t xml:space="preserve">Gambar </w:t>
       </w:r>
-      <w:r>
-        <w:fldChar w:fldCharType="begin"/>
-      </w:r>
-      <w:r>
-        <w:instrText xml:space="preserve"> SEQ Gambar \* ARABIC </w:instrText>
-      </w:r>
-      <w:r>
-        <w:fldChar w:fldCharType="separate"/>
-      </w:r>
-      <w:r>
-        <w:rPr>
-          <w:noProof/>
-        </w:rPr>
-        <w:t>38</w:t>
-      </w:r>
-      <w:r>
-        <w:rPr>
-          <w:noProof/>
-        </w:rPr>
-        <w:fldChar w:fldCharType="end"/>
-      </w:r>
+      <w:fldSimple w:instr=" SEQ Gambar \* ARABIC ">
+        <w:r>
+          <w:rPr>
+            <w:noProof/>
+          </w:rPr>
+          <w:t>38</w:t>
+        </w:r>
+      </w:fldSimple>
       <w:r>
         <w:t xml:space="preserve"> </w:t>
       </w:r>
@@ -10203,27 +10005,14 @@
       <w:r>
         <w:t xml:space="preserve">Gambar </w:t>
       </w:r>
-      <w:r>
-        <w:fldChar w:fldCharType="begin"/>
-      </w:r>
-      <w:r>
-        <w:instrText xml:space="preserve"> SEQ Gambar \* ARABIC </w:instrText>
-      </w:r>
-      <w:r>
-        <w:fldChar w:fldCharType="separate"/>
-      </w:r>
-      <w:r>
-        <w:rPr>
-          <w:noProof/>
-        </w:rPr>
-        <w:t>39</w:t>
-      </w:r>
-      <w:r>
-        <w:rPr>
-          <w:noProof/>
-        </w:rPr>
-        <w:fldChar w:fldCharType="end"/>
-      </w:r>
+      <w:fldSimple w:instr=" SEQ Gambar \* ARABIC ">
+        <w:r>
+          <w:rPr>
+            <w:noProof/>
+          </w:rPr>
+          <w:t>39</w:t>
+        </w:r>
+      </w:fldSimple>
       <w:r>
         <w:t xml:space="preserve"> sintaks pembuatan kolom Provinsi</w:t>
       </w:r>
@@ -10305,27 +10094,14 @@
       <w:r>
         <w:t xml:space="preserve">Gambar </w:t>
       </w:r>
-      <w:r>
-        <w:fldChar w:fldCharType="begin"/>
-      </w:r>
-      <w:r>
-        <w:instrText xml:space="preserve"> SEQ Gambar \* ARABIC </w:instrText>
-      </w:r>
-      <w:r>
-        <w:fldChar w:fldCharType="separate"/>
-      </w:r>
-      <w:r>
-        <w:rPr>
-          <w:noProof/>
-        </w:rPr>
-        <w:t>40</w:t>
-      </w:r>
-      <w:r>
-        <w:rPr>
-          <w:noProof/>
-        </w:rPr>
-        <w:fldChar w:fldCharType="end"/>
-      </w:r>
+      <w:fldSimple w:instr=" SEQ Gambar \* ARABIC ">
+        <w:r>
+          <w:rPr>
+            <w:noProof/>
+          </w:rPr>
+          <w:t>40</w:t>
+        </w:r>
+      </w:fldSimple>
       <w:r>
         <w:t xml:space="preserve"> </w:t>
       </w:r>
@@ -10358,30 +10134,54 @@
       <w:r>
         <w:rPr>
           <w:rFonts w:ascii="Times New Roman" w:hAnsi="Times New Roman" w:cs="Times New Roman"/>
-          <w:color w:val="FF0000"/>
-        </w:rPr>
-        <w:t xml:space="preserve">Representasi adalah </w:t>
-      </w:r>
-      <w:proofErr w:type="gramStart"/>
-      <w:r>
-        <w:rPr>
-          <w:rFonts w:ascii="Times New Roman" w:hAnsi="Times New Roman" w:cs="Times New Roman"/>
-          <w:color w:val="FF0000"/>
-        </w:rPr>
-        <w:t xml:space="preserve">… </w:t>
-      </w:r>
+        </w:rPr>
+        <w:t>Representasi adalah suatu cara untuk menyajikan atau menggambarkan suatu objek, ide, atau konsep ke dalam bentuk lain, seperti simbol, gambar, model, atau bahasa, sehingga dapat dipahami oleh orang lain</w:t>
+      </w:r>
+      <w:r>
+        <w:rPr>
+          <w:rFonts w:ascii="Times New Roman" w:hAnsi="Times New Roman" w:cs="Times New Roman"/>
+        </w:rPr>
+        <w:t xml:space="preserve"> </w:t>
+      </w:r>
+      <w:sdt>
+        <w:sdtPr>
+          <w:rPr>
+            <w:rFonts w:ascii="Times New Roman" w:hAnsi="Times New Roman" w:cs="Times New Roman"/>
+            <w:color w:val="000000"/>
+          </w:rPr>
+          <w:tag w:val="MENDELEY_CITATION_v3_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"/>
+          <w:id w:val="124049964"/>
+          <w:placeholder>
+            <w:docPart w:val="DefaultPlaceholder_-1854013440"/>
+          </w:placeholder>
+        </w:sdtPr>
+        <w:sdtContent>
+          <w:r>
+            <w:rPr>
+              <w:rFonts w:ascii="Times New Roman" w:hAnsi="Times New Roman" w:cs="Times New Roman"/>
+              <w:color w:val="000000"/>
+            </w:rPr>
+            <w:t>[8]</w:t>
+          </w:r>
+        </w:sdtContent>
+      </w:sdt>
       <w:r>
         <w:rPr>
           <w:rFonts w:ascii="Times New Roman" w:hAnsi="Times New Roman" w:cs="Times New Roman"/>
         </w:rPr>
         <w:t>.</w:t>
       </w:r>
-      <w:proofErr w:type="gramEnd"/>
-      <w:r>
-        <w:rPr>
-          <w:rFonts w:ascii="Times New Roman" w:hAnsi="Times New Roman" w:cs="Times New Roman"/>
-        </w:rPr>
-        <w:t xml:space="preserve"> Pada proyek ini, representasi dilakukan secara visual guna memudahkan pemangku kepentingan dalam memahami tren penerimaan mahasiswa baru</w:t>
+      <w:r>
+        <w:rPr>
+          <w:rFonts w:ascii="Times New Roman" w:hAnsi="Times New Roman" w:cs="Times New Roman"/>
+        </w:rPr>
+        <w:t xml:space="preserve"> </w:t>
+      </w:r>
+      <w:r>
+        <w:rPr>
+          <w:rFonts w:ascii="Times New Roman" w:hAnsi="Times New Roman" w:cs="Times New Roman"/>
+        </w:rPr>
+        <w:t>Pada proyek ini, representasi dilakukan secara visual guna memudahkan pemangku kepentingan dalam memahami tren penerimaan mahasiswa baru</w:t>
       </w:r>
       <w:r>
         <w:rPr>
@@ -10681,6 +10481,7 @@
         <w:rPr>
           <w:rFonts w:ascii="Times New Roman" w:hAnsi="Times New Roman" w:cs="Times New Roman"/>
         </w:rPr>
+        <w:lastRenderedPageBreak/>
         <w:t>Program studi apa yang paling diminati mahasiswa baru?</w:t>
       </w:r>
     </w:p>
@@ -10715,7 +10516,6 @@
           <w:i/>
           <w:iCs/>
         </w:rPr>
-        <w:lastRenderedPageBreak/>
         <w:t>Dashboard</w:t>
       </w:r>
       <w:r>
@@ -11054,27 +10854,14 @@
       <w:r>
         <w:t xml:space="preserve">Gambar </w:t>
       </w:r>
-      <w:r>
-        <w:fldChar w:fldCharType="begin"/>
-      </w:r>
-      <w:r>
-        <w:instrText xml:space="preserve"> SEQ Gambar \* ARABIC </w:instrText>
-      </w:r>
-      <w:r>
-        <w:fldChar w:fldCharType="separate"/>
-      </w:r>
-      <w:r>
-        <w:rPr>
-          <w:noProof/>
-        </w:rPr>
-        <w:t>41</w:t>
-      </w:r>
-      <w:r>
-        <w:rPr>
-          <w:noProof/>
-        </w:rPr>
-        <w:fldChar w:fldCharType="end"/>
-      </w:r>
+      <w:fldSimple w:instr=" SEQ Gambar \* ARABIC ">
+        <w:r>
+          <w:rPr>
+            <w:noProof/>
+          </w:rPr>
+          <w:t>41</w:t>
+        </w:r>
+      </w:fldSimple>
       <w:r>
         <w:t xml:space="preserve"> dashboard overview</w:t>
       </w:r>
@@ -11171,27 +10958,14 @@
       <w:r>
         <w:t xml:space="preserve">Gambar </w:t>
       </w:r>
-      <w:r>
-        <w:fldChar w:fldCharType="begin"/>
-      </w:r>
-      <w:r>
-        <w:instrText xml:space="preserve"> SEQ Gambar \* ARABIC </w:instrText>
-      </w:r>
-      <w:r>
-        <w:fldChar w:fldCharType="separate"/>
-      </w:r>
-      <w:r>
-        <w:rPr>
-          <w:noProof/>
-        </w:rPr>
-        <w:t>42</w:t>
-      </w:r>
-      <w:r>
-        <w:rPr>
-          <w:noProof/>
-        </w:rPr>
-        <w:fldChar w:fldCharType="end"/>
-      </w:r>
+      <w:fldSimple w:instr=" SEQ Gambar \* ARABIC ">
+        <w:r>
+          <w:rPr>
+            <w:noProof/>
+          </w:rPr>
+          <w:t>42</w:t>
+        </w:r>
+      </w:fldSimple>
       <w:r>
         <w:t xml:space="preserve"> dashboard demografi</w:t>
       </w:r>
@@ -11971,27 +11745,14 @@
       <w:r>
         <w:t xml:space="preserve">Gambar </w:t>
       </w:r>
-      <w:r>
-        <w:fldChar w:fldCharType="begin"/>
-      </w:r>
-      <w:r>
-        <w:instrText xml:space="preserve"> SEQ Gambar \* ARABIC </w:instrText>
-      </w:r>
-      <w:r>
-        <w:fldChar w:fldCharType="separate"/>
-      </w:r>
-      <w:r>
-        <w:rPr>
-          <w:noProof/>
-        </w:rPr>
-        <w:t>43</w:t>
-      </w:r>
-      <w:r>
-        <w:rPr>
-          <w:noProof/>
-        </w:rPr>
-        <w:fldChar w:fldCharType="end"/>
-      </w:r>
+      <w:fldSimple w:instr=" SEQ Gambar \* ARABIC ">
+        <w:r>
+          <w:rPr>
+            <w:noProof/>
+          </w:rPr>
+          <w:t>43</w:t>
+        </w:r>
+      </w:fldSimple>
       <w:r>
         <w:t xml:space="preserve"> bar navigasi halaman utama</w:t>
       </w:r>
@@ -12115,27 +11876,14 @@
       <w:r>
         <w:t xml:space="preserve">Gambar </w:t>
       </w:r>
-      <w:r>
-        <w:fldChar w:fldCharType="begin"/>
-      </w:r>
-      <w:r>
-        <w:instrText xml:space="preserve"> SEQ Gambar \* ARABIC </w:instrText>
-      </w:r>
-      <w:r>
-        <w:fldChar w:fldCharType="separate"/>
-      </w:r>
-      <w:r>
-        <w:rPr>
-          <w:noProof/>
-        </w:rPr>
-        <w:t>44</w:t>
-      </w:r>
-      <w:r>
-        <w:rPr>
-          <w:noProof/>
-        </w:rPr>
-        <w:fldChar w:fldCharType="end"/>
-      </w:r>
+      <w:fldSimple w:instr=" SEQ Gambar \* ARABIC ">
+        <w:r>
+          <w:rPr>
+            <w:noProof/>
+          </w:rPr>
+          <w:t>44</w:t>
+        </w:r>
+      </w:fldSimple>
       <w:r>
         <w:t xml:space="preserve"> judul proyek</w:t>
       </w:r>
@@ -12266,27 +12014,14 @@
       <w:r>
         <w:t xml:space="preserve">Gambar </w:t>
       </w:r>
-      <w:r>
-        <w:fldChar w:fldCharType="begin"/>
-      </w:r>
-      <w:r>
-        <w:instrText xml:space="preserve"> SEQ Gambar \* ARABIC </w:instrText>
-      </w:r>
-      <w:r>
-        <w:fldChar w:fldCharType="separate"/>
-      </w:r>
-      <w:r>
-        <w:rPr>
-          <w:noProof/>
-        </w:rPr>
-        <w:t>45</w:t>
-      </w:r>
-      <w:r>
-        <w:rPr>
-          <w:noProof/>
-        </w:rPr>
-        <w:fldChar w:fldCharType="end"/>
-      </w:r>
+      <w:fldSimple w:instr=" SEQ Gambar \* ARABIC ">
+        <w:r>
+          <w:rPr>
+            <w:noProof/>
+          </w:rPr>
+          <w:t>45</w:t>
+        </w:r>
+      </w:fldSimple>
       <w:r>
         <w:t xml:space="preserve"> permasalahan, tujuan, dan manfaat pada halaman utama</w:t>
       </w:r>
@@ -12436,27 +12171,14 @@
       <w:r>
         <w:t xml:space="preserve">Gambar </w:t>
       </w:r>
-      <w:r>
-        <w:fldChar w:fldCharType="begin"/>
-      </w:r>
-      <w:r>
-        <w:instrText xml:space="preserve"> SEQ Gambar \* ARABIC </w:instrText>
-      </w:r>
-      <w:r>
-        <w:fldChar w:fldCharType="separate"/>
-      </w:r>
-      <w:r>
-        <w:rPr>
-          <w:noProof/>
-        </w:rPr>
-        <w:t>46</w:t>
-      </w:r>
-      <w:r>
-        <w:rPr>
-          <w:noProof/>
-        </w:rPr>
-        <w:fldChar w:fldCharType="end"/>
-      </w:r>
+      <w:fldSimple w:instr=" SEQ Gambar \* ARABIC ">
+        <w:r>
+          <w:rPr>
+            <w:noProof/>
+          </w:rPr>
+          <w:t>46</w:t>
+        </w:r>
+      </w:fldSimple>
       <w:r>
         <w:t xml:space="preserve"> data pipeline pada halaman utama</w:t>
       </w:r>
@@ -12605,27 +12327,14 @@
       <w:r>
         <w:t xml:space="preserve">Gambar </w:t>
       </w:r>
-      <w:r>
-        <w:fldChar w:fldCharType="begin"/>
-      </w:r>
-      <w:r>
-        <w:instrText xml:space="preserve"> SEQ Gambar \* ARABIC </w:instrText>
-      </w:r>
-      <w:r>
-        <w:fldChar w:fldCharType="separate"/>
-      </w:r>
-      <w:r>
-        <w:rPr>
-          <w:noProof/>
-        </w:rPr>
-        <w:t>47</w:t>
-      </w:r>
-      <w:r>
-        <w:rPr>
-          <w:noProof/>
-        </w:rPr>
-        <w:fldChar w:fldCharType="end"/>
-      </w:r>
+      <w:fldSimple w:instr=" SEQ Gambar \* ARABIC ">
+        <w:r>
+          <w:rPr>
+            <w:noProof/>
+          </w:rPr>
+          <w:t>47</w:t>
+        </w:r>
+      </w:fldSimple>
       <w:r>
         <w:t xml:space="preserve"> funfact pada halaman utama</w:t>
       </w:r>
@@ -12757,27 +12466,14 @@
       <w:r>
         <w:t xml:space="preserve">Gambar </w:t>
       </w:r>
-      <w:r>
-        <w:fldChar w:fldCharType="begin"/>
-      </w:r>
-      <w:r>
-        <w:instrText xml:space="preserve"> SEQ Gambar \* ARABIC </w:instrText>
-      </w:r>
-      <w:r>
-        <w:fldChar w:fldCharType="separate"/>
-      </w:r>
-      <w:r>
-        <w:rPr>
-          <w:noProof/>
-        </w:rPr>
-        <w:t>48</w:t>
-      </w:r>
-      <w:r>
-        <w:rPr>
-          <w:noProof/>
-        </w:rPr>
-        <w:fldChar w:fldCharType="end"/>
-      </w:r>
+      <w:fldSimple w:instr=" SEQ Gambar \* ARABIC ">
+        <w:r>
+          <w:rPr>
+            <w:noProof/>
+          </w:rPr>
+          <w:t>48</w:t>
+        </w:r>
+      </w:fldSimple>
       <w:r>
         <w:t xml:space="preserve"> brainstorming dashboard pada halaman utama</w:t>
       </w:r>
@@ -12896,27 +12592,14 @@
       <w:r>
         <w:t xml:space="preserve">Gambar </w:t>
       </w:r>
-      <w:r>
-        <w:fldChar w:fldCharType="begin"/>
-      </w:r>
-      <w:r>
-        <w:instrText xml:space="preserve"> SEQ Gambar \* ARABIC </w:instrText>
-      </w:r>
-      <w:r>
-        <w:fldChar w:fldCharType="separate"/>
-      </w:r>
-      <w:r>
-        <w:rPr>
-          <w:noProof/>
-        </w:rPr>
-        <w:t>49</w:t>
-      </w:r>
-      <w:r>
-        <w:rPr>
-          <w:noProof/>
-        </w:rPr>
-        <w:fldChar w:fldCharType="end"/>
-      </w:r>
+      <w:fldSimple w:instr=" SEQ Gambar \* ARABIC ">
+        <w:r>
+          <w:rPr>
+            <w:noProof/>
+          </w:rPr>
+          <w:t>49</w:t>
+        </w:r>
+      </w:fldSimple>
       <w:r>
         <w:t xml:space="preserve"> ucapan terimakasih pada halaman utama</w:t>
       </w:r>
@@ -13060,27 +12743,14 @@
       <w:r>
         <w:t xml:space="preserve">Gambar </w:t>
       </w:r>
-      <w:r>
-        <w:fldChar w:fldCharType="begin"/>
-      </w:r>
-      <w:r>
-        <w:instrText xml:space="preserve"> SEQ Gambar \* ARABIC </w:instrText>
-      </w:r>
-      <w:r>
-        <w:fldChar w:fldCharType="separate"/>
-      </w:r>
-      <w:r>
-        <w:rPr>
-          <w:noProof/>
-        </w:rPr>
-        <w:t>50</w:t>
-      </w:r>
-      <w:r>
-        <w:rPr>
-          <w:noProof/>
-        </w:rPr>
-        <w:fldChar w:fldCharType="end"/>
-      </w:r>
+      <w:fldSimple w:instr=" SEQ Gambar \* ARABIC ">
+        <w:r>
+          <w:rPr>
+            <w:noProof/>
+          </w:rPr>
+          <w:t>50</w:t>
+        </w:r>
+      </w:fldSimple>
       <w:r>
         <w:t xml:space="preserve"> watermark pada halaman utama</w:t>
       </w:r>
@@ -13207,27 +12877,14 @@
       <w:r>
         <w:t xml:space="preserve">Gambar </w:t>
       </w:r>
-      <w:r>
-        <w:fldChar w:fldCharType="begin"/>
-      </w:r>
-      <w:r>
-        <w:instrText xml:space="preserve"> SEQ Gambar \* ARABIC </w:instrText>
-      </w:r>
-      <w:r>
-        <w:fldChar w:fldCharType="separate"/>
-      </w:r>
-      <w:r>
-        <w:rPr>
-          <w:noProof/>
-        </w:rPr>
-        <w:t>51</w:t>
-      </w:r>
-      <w:r>
-        <w:rPr>
-          <w:noProof/>
-        </w:rPr>
-        <w:fldChar w:fldCharType="end"/>
-      </w:r>
+      <w:fldSimple w:instr=" SEQ Gambar \* ARABIC ">
+        <w:r>
+          <w:rPr>
+            <w:noProof/>
+          </w:rPr>
+          <w:t>51</w:t>
+        </w:r>
+      </w:fldSimple>
       <w:r>
         <w:t xml:space="preserve"> bar navigasi halaman cara membaca</w:t>
       </w:r>
@@ -13351,27 +13008,14 @@
       <w:r>
         <w:t xml:space="preserve">Gambar </w:t>
       </w:r>
-      <w:r>
-        <w:fldChar w:fldCharType="begin"/>
-      </w:r>
-      <w:r>
-        <w:instrText xml:space="preserve"> SEQ Gambar \* ARABIC </w:instrText>
-      </w:r>
-      <w:r>
-        <w:fldChar w:fldCharType="separate"/>
-      </w:r>
-      <w:r>
-        <w:rPr>
-          <w:noProof/>
-        </w:rPr>
-        <w:t>52</w:t>
-      </w:r>
-      <w:r>
-        <w:rPr>
-          <w:noProof/>
-        </w:rPr>
-        <w:fldChar w:fldCharType="end"/>
-      </w:r>
+      <w:fldSimple w:instr=" SEQ Gambar \* ARABIC ">
+        <w:r>
+          <w:rPr>
+            <w:noProof/>
+          </w:rPr>
+          <w:t>52</w:t>
+        </w:r>
+      </w:fldSimple>
       <w:r>
         <w:t xml:space="preserve"> cara membaca pada halaman cara membaca</w:t>
       </w:r>
@@ -13504,27 +13148,14 @@
       <w:r>
         <w:t xml:space="preserve">Gambar </w:t>
       </w:r>
-      <w:r>
-        <w:fldChar w:fldCharType="begin"/>
-      </w:r>
-      <w:r>
-        <w:instrText xml:space="preserve"> SEQ Gambar \* ARABIC </w:instrText>
-      </w:r>
-      <w:r>
-        <w:fldChar w:fldCharType="separate"/>
-      </w:r>
-      <w:r>
-        <w:rPr>
-          <w:noProof/>
-        </w:rPr>
-        <w:t>53</w:t>
-      </w:r>
-      <w:r>
-        <w:rPr>
-          <w:noProof/>
-        </w:rPr>
-        <w:fldChar w:fldCharType="end"/>
-      </w:r>
+      <w:fldSimple w:instr=" SEQ Gambar \* ARABIC ">
+        <w:r>
+          <w:rPr>
+            <w:noProof/>
+          </w:rPr>
+          <w:t>53</w:t>
+        </w:r>
+      </w:fldSimple>
       <w:r>
         <w:t xml:space="preserve"> watermark pada halaman cara membaca</w:t>
       </w:r>
@@ -13660,7 +13291,7 @@
           <w:i/>
           <w:iCs/>
         </w:rPr>
-        <w:t>pre-processing</w:t>
+        <w:t>Preprocessing</w:t>
       </w:r>
       <w:r>
         <w:rPr>
@@ -13672,13 +13303,7 @@
         <w:rPr>
           <w:rFonts w:ascii="Times New Roman" w:hAnsi="Times New Roman" w:cs="Times New Roman"/>
         </w:rPr>
-        <w:t>pada proyek ini</w:t>
-      </w:r>
-      <w:r>
-        <w:rPr>
-          <w:rFonts w:ascii="Times New Roman" w:hAnsi="Times New Roman" w:cs="Times New Roman"/>
-        </w:rPr>
-        <w:t xml:space="preserve"> </w:t>
+        <w:t xml:space="preserve">pada proyek ini </w:t>
       </w:r>
       <w:r>
         <w:rPr>
@@ -13704,7 +13329,7 @@
           <w:i/>
           <w:iCs/>
         </w:rPr>
-        <w:t>pre-processing</w:t>
+        <w:t>Preprocessing</w:t>
       </w:r>
       <w:r>
         <w:rPr>
@@ -13967,6 +13592,64 @@
           <w:rFonts w:ascii="Times New Roman" w:hAnsi="Times New Roman" w:cs="Times New Roman"/>
         </w:rPr>
       </w:pPr>
+    </w:p>
+    <w:p>
+      <w:pPr>
+        <w:rPr>
+          <w:rFonts w:ascii="Times New Roman" w:hAnsi="Times New Roman" w:cs="Times New Roman"/>
+        </w:rPr>
+      </w:pPr>
+      <w:r>
+        <w:rPr>
+          <w:rFonts w:ascii="Times New Roman" w:hAnsi="Times New Roman" w:cs="Times New Roman"/>
+        </w:rPr>
+        <w:br w:type="page"/>
+      </w:r>
+    </w:p>
+    <w:p>
+      <w:pPr>
+        <w:pStyle w:val="Heading2"/>
+      </w:pPr>
+      <w:r>
+        <w:lastRenderedPageBreak/>
+        <w:t>BAB IV.</w:t>
+      </w:r>
+      <w:r>
+        <w:br/>
+        <w:t>PENUTUP</w:t>
+      </w:r>
+    </w:p>
+    <w:p>
+      <w:pPr>
+        <w:pStyle w:val="Heading3"/>
+      </w:pPr>
+      <w:r>
+        <w:t xml:space="preserve">A. </w:t>
+      </w:r>
+      <w:r>
+        <w:t>Kesimpulan</w:t>
+      </w:r>
+    </w:p>
+    <w:p>
+      <w:r>
+        <w:t>sss</w:t>
+      </w:r>
+    </w:p>
+    <w:p>
+      <w:pPr>
+        <w:pStyle w:val="Heading3"/>
+      </w:pPr>
+      <w:r>
+        <w:t xml:space="preserve">B. </w:t>
+      </w:r>
+      <w:r>
+        <w:t>Saran</w:t>
+      </w:r>
+    </w:p>
+    <w:p>
+      <w:r>
+        <w:t>ssss</w:t>
+      </w:r>
     </w:p>
     <w:sectPr>
       <w:pgSz w:w="11909" w:h="16834" w:code="9"/>
@@ -17223,7 +16906,586 @@
       <w:spacing w:after="0"/>
     </w:pPr>
   </w:style>
+  <w:style w:type="character" w:styleId="PlaceholderText">
+    <w:name w:val="Placeholder Text"/>
+    <w:basedOn w:val="DefaultParagraphFont"/>
+    <w:uiPriority w:val="99"/>
+    <w:semiHidden/>
+    <w:rsid w:val="00C7329F"/>
+    <w:rPr>
+      <w:color w:val="666666"/>
+    </w:rPr>
+  </w:style>
 </w:styles>
+</file>
+
+<file path=word/glossary/document.xml><?xml version="1.0" encoding="utf-8"?>
+<w:glossaryDocument xmlns:wpc="http://schemas.microsoft.com/office/word/2010/wordprocessingCanvas" xmlns:cx="http://schemas.microsoft.com/office/drawing/2014/chartex" xmlns:cx1="http://schemas.microsoft.com/office/drawing/2015/9/8/chartex" xmlns:cx2="http://schemas.microsoft.com/office/drawing/2015/10/21/chartex" xmlns:cx3="http://schemas.microsoft.com/office/drawing/2016/5/9/chartex" xmlns:cx4="http://schemas.microsoft.com/office/drawing/2016/5/10/chartex" xmlns:cx5="http://schemas.microsoft.com/office/drawing/2016/5/11/chartex" xmlns:cx6="http://schemas.microsoft.com/office/drawing/2016/5/12/chartex" xmlns:cx7="http://schemas.microsoft.com/office/drawing/2016/5/13/chartex" xmlns:cx8="http://schemas.microsoft.com/office/drawing/2016/5/14/chartex" xmlns:mc="http://schemas.openxmlformats.org/markup-compatibility/2006" xmlns:aink="http://schemas.microsoft.com/office/drawing/2016/ink" xmlns:am3d="http://schemas.microsoft.com/office/drawing/2017/model3d" xmlns:o="urn:schemas-microsoft-com:office:office" xmlns:oel="http://schemas.microsoft.com/office/2019/extlst" xmlns:r="http://schemas.openxmlformats.org/officeDocument/2006/relationships" xmlns:m="http://schemas.openxmlformats.org/officeDocument/2006/math" xmlns:v="urn:schemas-microsoft-com:vml" xmlns:wp14="http://schemas.microsoft.com/office/word/2010/wordprocessingDrawing" xmlns:wp="http://schemas.openxmlformats.org/drawingml/2006/wordprocessingDrawing" xmlns:w10="urn:schemas-microsoft-com:office:word" xmlns:w="http://schemas.openxmlformats.org/wordprocessingml/2006/main" xmlns:w14="http://schemas.microsoft.com/office/word/2010/wordml" xmlns:w15="http://schemas.microsoft.com/office/word/2012/wordml" xmlns:w16cex="http://schemas.microsoft.com/office/word/2018/wordml/cex" xmlns:w16cid="http://schemas.microsoft.com/office/word/2016/wordml/cid" xmlns:w16="http://schemas.microsoft.com/office/word/2018/wordml" xmlns:w16du="http://schemas.microsoft.com/office/word/2023/wordml/word16du" xmlns:w16sdtdh="http://schemas.microsoft.com/office/word/2020/wordml/sdtdatahash" xmlns:w16sdtfl="http://schemas.microsoft.com/office/word/2024/wordml/sdtformatlock" xmlns:w16se="http://schemas.microsoft.com/office/word/2015/wordml/symex" xmlns:wpg="http://schemas.microsoft.com/office/word/2010/wordprocessingGroup" xmlns:wpi="http://schemas.microsoft.com/office/word/2010/wordprocessingInk" xmlns:wne="http://schemas.microsoft.com/office/word/2006/wordml" xmlns:wps="http://schemas.microsoft.com/office/word/2010/wordprocessingShape" mc:Ignorable="w14 w15 w16se w16cid w16 w16cex w16sdtdh w16sdtfl w16du wp14">
+  <w:docParts>
+    <w:docPart>
+      <w:docPartPr>
+        <w:name w:val="DefaultPlaceholder_-1854013440"/>
+        <w:category>
+          <w:name w:val="General"/>
+          <w:gallery w:val="placeholder"/>
+        </w:category>
+        <w:types>
+          <w:type w:val="bbPlcHdr"/>
+        </w:types>
+        <w:behaviors>
+          <w:behavior w:val="content"/>
+        </w:behaviors>
+        <w:guid w:val="{D94EDD5A-BF85-403F-AA23-A733E8F36AFF}"/>
+      </w:docPartPr>
+      <w:docPartBody>
+        <w:p>
+          <w:r>
+            <w:rPr>
+              <w:rStyle w:val="PlaceholderText"/>
+            </w:rPr>
+            <w:t>Click or tap here to enter text.</w:t>
+          </w:r>
+        </w:p>
+      </w:docPartBody>
+    </w:docPart>
+  </w:docParts>
+</w:glossaryDocument>
+</file>
+
+<file path=word/glossary/fontTable.xml><?xml version="1.0" encoding="utf-8"?>
+<w:fonts xmlns:mc="http://schemas.openxmlformats.org/markup-compatibility/2006" xmlns:r="http://schemas.openxmlformats.org/officeDocument/2006/relationships" xmlns:w="http://schemas.openxmlformats.org/wordprocessingml/2006/main" xmlns:w14="http://schemas.microsoft.com/office/word/2010/wordml" xmlns:w15="http://schemas.microsoft.com/office/word/2012/wordml" xmlns:w16cex="http://schemas.microsoft.com/office/word/2018/wordml/cex" xmlns:w16cid="http://schemas.microsoft.com/office/word/2016/wordml/cid" xmlns:w16="http://schemas.microsoft.com/office/word/2018/wordml" xmlns:w16du="http://schemas.microsoft.com/office/word/2023/wordml/word16du" xmlns:w16sdtdh="http://schemas.microsoft.com/office/word/2020/wordml/sdtdatahash" xmlns:w16sdtfl="http://schemas.microsoft.com/office/word/2024/wordml/sdtformatlock" xmlns:w16se="http://schemas.microsoft.com/office/word/2015/wordml/symex" mc:Ignorable="w14 w15 w16se w16cid w16 w16cex w16sdtdh w16sdtfl w16du">
+  <w:font w:name="Symbol">
+    <w:panose1 w:val="05050102010706020507"/>
+    <w:charset w:val="02"/>
+    <w:family w:val="roman"/>
+    <w:pitch w:val="variable"/>
+    <w:sig w:usb0="00000000" w:usb1="10000000" w:usb2="00000000" w:usb3="00000000" w:csb0="80000000" w:csb1="00000000"/>
+  </w:font>
+  <w:font w:name="Times New Roman">
+    <w:panose1 w:val="02020603050405020304"/>
+    <w:charset w:val="00"/>
+    <w:family w:val="roman"/>
+    <w:pitch w:val="variable"/>
+    <w:sig w:usb0="E0002EFF" w:usb1="C000785B" w:usb2="00000009" w:usb3="00000000" w:csb0="000001FF" w:csb1="00000000"/>
+  </w:font>
+  <w:font w:name="Courier New">
+    <w:panose1 w:val="02070309020205020404"/>
+    <w:charset w:val="00"/>
+    <w:family w:val="modern"/>
+    <w:pitch w:val="fixed"/>
+    <w:sig w:usb0="E0002EFF" w:usb1="C0007843" w:usb2="00000009" w:usb3="00000000" w:csb0="000001FF" w:csb1="00000000"/>
+  </w:font>
+  <w:font w:name="Wingdings">
+    <w:panose1 w:val="05000000000000000000"/>
+    <w:charset w:val="02"/>
+    <w:family w:val="auto"/>
+    <w:pitch w:val="variable"/>
+    <w:sig w:usb0="00000000" w:usb1="10000000" w:usb2="00000000" w:usb3="00000000" w:csb0="80000000" w:csb1="00000000"/>
+  </w:font>
+  <w:font w:name="Calibri">
+    <w:panose1 w:val="020F0502020204030204"/>
+    <w:charset w:val="00"/>
+    <w:family w:val="swiss"/>
+    <w:pitch w:val="variable"/>
+    <w:sig w:usb0="E4002EFF" w:usb1="C200247B" w:usb2="00000009" w:usb3="00000000" w:csb0="000001FF" w:csb1="00000000"/>
+  </w:font>
+  <w:font w:name="Calibri Light">
+    <w:panose1 w:val="020F0302020204030204"/>
+    <w:charset w:val="00"/>
+    <w:family w:val="swiss"/>
+    <w:pitch w:val="variable"/>
+    <w:sig w:usb0="E4002EFF" w:usb1="C200247B" w:usb2="00000009" w:usb3="00000000" w:csb0="000001FF" w:csb1="00000000"/>
+  </w:font>
+</w:fonts>
+</file>
+
+<file path=word/glossary/settings.xml><?xml version="1.0" encoding="utf-8"?>
+<w:settings xmlns:mc="http://schemas.openxmlformats.org/markup-compatibility/2006" xmlns:o="urn:schemas-microsoft-com:office:office" xmlns:r="http://schemas.openxmlformats.org/officeDocument/2006/relationships" xmlns:m="http://schemas.openxmlformats.org/officeDocument/2006/math" xmlns:v="urn:schemas-microsoft-com:vml" xmlns:w10="urn:schemas-microsoft-com:office:word" xmlns:w="http://schemas.openxmlformats.org/wordprocessingml/2006/main" xmlns:w14="http://schemas.microsoft.com/office/word/2010/wordml" xmlns:w15="http://schemas.microsoft.com/office/word/2012/wordml" xmlns:w16cex="http://schemas.microsoft.com/office/word/2018/wordml/cex" xmlns:w16cid="http://schemas.microsoft.com/office/word/2016/wordml/cid" xmlns:w16="http://schemas.microsoft.com/office/word/2018/wordml" xmlns:w16du="http://schemas.microsoft.com/office/word/2023/wordml/word16du" xmlns:w16sdtdh="http://schemas.microsoft.com/office/word/2020/wordml/sdtdatahash" xmlns:w16sdtfl="http://schemas.microsoft.com/office/word/2024/wordml/sdtformatlock" xmlns:w16se="http://schemas.microsoft.com/office/word/2015/wordml/symex" xmlns:sl="http://schemas.openxmlformats.org/schemaLibrary/2006/main" mc:Ignorable="w14 w15 w16se w16cid w16 w16cex w16sdtdh w16sdtfl w16du">
+  <w:view w:val="normal"/>
+  <w:defaultTabStop w:val="720"/>
+  <w:characterSpacingControl w:val="doNotCompress"/>
+  <w:compat>
+    <w:useFELayout/>
+    <w:compatSetting w:name="compatibilityMode" w:uri="http://schemas.microsoft.com/office/word" w:val="15"/>
+    <w:compatSetting w:name="overrideTableStyleFontSizeAndJustification" w:uri="http://schemas.microsoft.com/office/word" w:val="1"/>
+    <w:compatSetting w:name="enableOpenTypeFeatures" w:uri="http://schemas.microsoft.com/office/word" w:val="1"/>
+    <w:compatSetting w:name="doNotFlipMirrorIndents" w:uri="http://schemas.microsoft.com/office/word" w:val="1"/>
+    <w:compatSetting w:name="differentiateMultirowTableHeaders" w:uri="http://schemas.microsoft.com/office/word" w:val="1"/>
+    <w:compatSetting w:name="useWord2013TrackBottomHyphenation" w:uri="http://schemas.microsoft.com/office/word" w:val="0"/>
+  </w:compat>
+  <w:rsids>
+    <w:rsidRoot w:val="00966163"/>
+    <w:rsid w:val="005A7160"/>
+    <w:rsid w:val="00763159"/>
+    <w:rsid w:val="00966163"/>
+  </w:rsids>
+  <m:mathPr>
+    <m:mathFont m:val="Cambria Math"/>
+    <m:brkBin m:val="before"/>
+    <m:brkBinSub m:val="--"/>
+    <m:smallFrac m:val="0"/>
+    <m:dispDef/>
+    <m:lMargin m:val="0"/>
+    <m:rMargin m:val="0"/>
+    <m:defJc m:val="centerGroup"/>
+    <m:wrapIndent m:val="1440"/>
+    <m:intLim m:val="subSup"/>
+    <m:naryLim m:val="undOvr"/>
+  </m:mathPr>
+  <w:themeFontLang w:val="en-US"/>
+  <w:clrSchemeMapping w:bg1="light1" w:t1="dark1" w:bg2="light2" w:t2="dark2" w:accent1="accent1" w:accent2="accent2" w:accent3="accent3" w:accent4="accent4" w:accent5="accent5" w:accent6="accent6" w:hyperlink="hyperlink" w:followedHyperlink="followedHyperlink"/>
+  <w:decimalSymbol w:val="."/>
+  <w:listSeparator w:val=","/>
+  <w15:chartTrackingRefBased/>
+</w:settings>
+</file>
+
+<file path=word/glossary/styles.xml><?xml version="1.0" encoding="utf-8"?>
+<w:styles xmlns:mc="http://schemas.openxmlformats.org/markup-compatibility/2006" xmlns:r="http://schemas.openxmlformats.org/officeDocument/2006/relationships" xmlns:w="http://schemas.openxmlformats.org/wordprocessingml/2006/main" xmlns:w14="http://schemas.microsoft.com/office/word/2010/wordml" xmlns:w15="http://schemas.microsoft.com/office/word/2012/wordml" xmlns:w16cex="http://schemas.microsoft.com/office/word/2018/wordml/cex" xmlns:w16cid="http://schemas.microsoft.com/office/word/2016/wordml/cid" xmlns:w16="http://schemas.microsoft.com/office/word/2018/wordml" xmlns:w16du="http://schemas.microsoft.com/office/word/2023/wordml/word16du" xmlns:w16sdtdh="http://schemas.microsoft.com/office/word/2020/wordml/sdtdatahash" xmlns:w16sdtfl="http://schemas.microsoft.com/office/word/2024/wordml/sdtformatlock" xmlns:w16se="http://schemas.microsoft.com/office/word/2015/wordml/symex" mc:Ignorable="w14 w15 w16se w16cid w16 w16cex w16sdtdh w16sdtfl w16du">
+  <w:docDefaults>
+    <w:rPrDefault>
+      <w:rPr>
+        <w:rFonts w:asciiTheme="minorHAnsi" w:eastAsiaTheme="minorEastAsia" w:hAnsiTheme="minorHAnsi" w:cstheme="minorBidi"/>
+        <w:kern w:val="2"/>
+        <w:sz w:val="24"/>
+        <w:szCs w:val="24"/>
+        <w:lang w:val="en-US" w:eastAsia="en-US" w:bidi="ar-SA"/>
+        <w14:ligatures w14:val="standardContextual"/>
+      </w:rPr>
+    </w:rPrDefault>
+    <w:pPrDefault>
+      <w:pPr>
+        <w:spacing w:after="160" w:line="278" w:lineRule="auto"/>
+      </w:pPr>
+    </w:pPrDefault>
+  </w:docDefaults>
+  <w:latentStyles w:defLockedState="0" w:defUIPriority="99" w:defSemiHidden="0" w:defUnhideWhenUsed="0" w:defQFormat="0" w:count="376">
+    <w:lsdException w:name="Normal" w:uiPriority="0" w:qFormat="1"/>
+    <w:lsdException w:name="heading 1" w:uiPriority="9" w:qFormat="1"/>
+    <w:lsdException w:name="heading 2" w:semiHidden="1" w:uiPriority="9" w:unhideWhenUsed="1" w:qFormat="1"/>
+    <w:lsdException w:name="heading 3" w:semiHidden="1" w:uiPriority="9" w:unhideWhenUsed="1" w:qFormat="1"/>
+    <w:lsdException w:name="heading 4" w:semiHidden="1" w:uiPriority="9" w:unhideWhenUsed="1" w:qFormat="1"/>
+    <w:lsdException w:name="heading 5" w:semiHidden="1" w:uiPriority="9" w:unhideWhenUsed="1" w:qFormat="1"/>
+    <w:lsdException w:name="heading 6" w:semiHidden="1" w:uiPriority="9" w:unhideWhenUsed="1" w:qFormat="1"/>
+    <w:lsdException w:name="heading 7" w:semiHidden="1" w:uiPriority="9" w:unhideWhenUsed="1" w:qFormat="1"/>
+    <w:lsdException w:name="heading 8" w:semiHidden="1" w:uiPriority="9" w:unhideWhenUsed="1" w:qFormat="1"/>
+    <w:lsdException w:name="heading 9" w:semiHidden="1" w:uiPriority="9" w:unhideWhenUsed="1" w:qFormat="1"/>
+    <w:lsdException w:name="index 1" w:semiHidden="1" w:unhideWhenUsed="1"/>
+    <w:lsdException w:name="index 2" w:semiHidden="1" w:unhideWhenUsed="1"/>
+    <w:lsdException w:name="index 3" w:semiHidden="1" w:unhideWhenUsed="1"/>
+    <w:lsdException w:name="index 4" w:semiHidden="1" w:unhideWhenUsed="1"/>
+    <w:lsdException w:name="index 5" w:semiHidden="1" w:unhideWhenUsed="1"/>
+    <w:lsdException w:name="index 6" w:semiHidden="1" w:unhideWhenUsed="1"/>
+    <w:lsdException w:name="index 7" w:semiHidden="1" w:unhideWhenUsed="1"/>
+    <w:lsdException w:name="index 8" w:semiHidden="1" w:unhideWhenUsed="1"/>
+    <w:lsdException w:name="index 9" w:semiHidden="1" w:unhideWhenUsed="1"/>
+    <w:lsdException w:name="toc 1" w:semiHidden="1" w:uiPriority="39" w:unhideWhenUsed="1"/>
+    <w:lsdException w:name="toc 2" w:semiHidden="1" w:uiPriority="39" w:unhideWhenUsed="1"/>
+    <w:lsdException w:name="toc 3" w:semiHidden="1" w:uiPriority="39" w:unhideWhenUsed="1"/>
+    <w:lsdException w:name="toc 4" w:semiHidden="1" w:uiPriority="39" w:unhideWhenUsed="1"/>
+    <w:lsdException w:name="toc 5" w:semiHidden="1" w:uiPriority="39" w:unhideWhenUsed="1"/>
+    <w:lsdException w:name="toc 6" w:semiHidden="1" w:uiPriority="39" w:unhideWhenUsed="1"/>
+    <w:lsdException w:name="toc 7" w:semiHidden="1" w:uiPriority="39" w:unhideWhenUsed="1"/>
+    <w:lsdException w:name="toc 8" w:semiHidden="1" w:uiPriority="39" w:unhideWhenUsed="1"/>
+    <w:lsdException w:name="toc 9" w:semiHidden="1" w:uiPriority="39" w:unhideWhenUsed="1"/>
+    <w:lsdException w:name="Normal Indent" w:semiHidden="1" w:unhideWhenUsed="1"/>
+    <w:lsdException w:name="footnote text" w:semiHidden="1" w:unhideWhenUsed="1"/>
+    <w:lsdException w:name="annotation text" w:semiHidden="1" w:unhideWhenUsed="1"/>
+    <w:lsdException w:name="header" w:semiHidden="1" w:unhideWhenUsed="1"/>
+    <w:lsdException w:name="footer" w:semiHidden="1" w:unhideWhenUsed="1"/>
+    <w:lsdException w:name="index heading" w:semiHidden="1" w:unhideWhenUsed="1"/>
+    <w:lsdException w:name="caption" w:semiHidden="1" w:uiPriority="35" w:unhideWhenUsed="1" w:qFormat="1"/>
+    <w:lsdException w:name="table of figures" w:semiHidden="1" w:unhideWhenUsed="1"/>
+    <w:lsdException w:name="envelope address" w:semiHidden="1" w:unhideWhenUsed="1"/>
+    <w:lsdException w:name="envelope return" w:semiHidden="1" w:unhideWhenUsed="1"/>
+    <w:lsdException w:name="footnote reference" w:semiHidden="1" w:unhideWhenUsed="1"/>
+    <w:lsdException w:name="annotation reference" w:semiHidden="1" w:unhideWhenUsed="1"/>
+    <w:lsdException w:name="line number" w:semiHidden="1" w:unhideWhenUsed="1"/>
+    <w:lsdException w:name="page number" w:semiHidden="1" w:unhideWhenUsed="1"/>
+    <w:lsdException w:name="endnote reference" w:semiHidden="1" w:unhideWhenUsed="1"/>
+    <w:lsdException w:name="endnote text" w:semiHidden="1" w:unhideWhenUsed="1"/>
+    <w:lsdException w:name="table of authorities" w:semiHidden="1" w:unhideWhenUsed="1"/>
+    <w:lsdException w:name="macro" w:semiHidden="1" w:unhideWhenUsed="1"/>
+    <w:lsdException w:name="toa heading" w:semiHidden="1" w:unhideWhenUsed="1"/>
+    <w:lsdException w:name="List" w:semiHidden="1" w:unhideWhenUsed="1"/>
+    <w:lsdException w:name="List Bullet" w:semiHidden="1" w:unhideWhenUsed="1"/>
+    <w:lsdException w:name="List Number" w:semiHidden="1" w:unhideWhenUsed="1"/>
+    <w:lsdException w:name="List 2" w:semiHidden="1" w:unhideWhenUsed="1"/>
+    <w:lsdException w:name="List 3" w:semiHidden="1" w:unhideWhenUsed="1"/>
+    <w:lsdException w:name="List 4" w:semiHidden="1" w:unhideWhenUsed="1"/>
+    <w:lsdException w:name="List 5" w:semiHidden="1" w:unhideWhenUsed="1"/>
+    <w:lsdException w:name="List Bullet 2" w:semiHidden="1" w:unhideWhenUsed="1"/>
+    <w:lsdException w:name="List Bullet 3" w:semiHidden="1" w:unhideWhenUsed="1"/>
+    <w:lsdException w:name="List Bullet 4" w:semiHidden="1" w:unhideWhenUsed="1"/>
+    <w:lsdException w:name="List Bullet 5" w:semiHidden="1" w:unhideWhenUsed="1"/>
+    <w:lsdException w:name="List Number 2" w:semiHidden="1" w:unhideWhenUsed="1"/>
+    <w:lsdException w:name="List Number 3" w:semiHidden="1" w:unhideWhenUsed="1"/>
+    <w:lsdException w:name="List Number 4" w:semiHidden="1" w:unhideWhenUsed="1"/>
+    <w:lsdException w:name="List Number 5" w:semiHidden="1" w:unhideWhenUsed="1"/>
+    <w:lsdException w:name="Title" w:uiPriority="10" w:qFormat="1"/>
+    <w:lsdException w:name="Closing" w:semiHidden="1" w:unhideWhenUsed="1"/>
+    <w:lsdException w:name="Signature" w:semiHidden="1" w:unhideWhenUsed="1"/>
+    <w:lsdException w:name="Default Paragraph Font" w:semiHidden="1" w:uiPriority="1" w:unhideWhenUsed="1"/>
+    <w:lsdException w:name="Body Text" w:semiHidden="1" w:unhideWhenUsed="1"/>
+    <w:lsdException w:name="Body Text Indent" w:semiHidden="1" w:unhideWhenUsed="1"/>
+    <w:lsdException w:name="List Continue" w:semiHidden="1" w:unhideWhenUsed="1"/>
+    <w:lsdException w:name="List Continue 2" w:semiHidden="1" w:unhideWhenUsed="1"/>
+    <w:lsdException w:name="List Continue 3" w:semiHidden="1" w:unhideWhenUsed="1"/>
+    <w:lsdException w:name="List Continue 4" w:semiHidden="1" w:unhideWhenUsed="1"/>
+    <w:lsdException w:name="List Continue 5" w:semiHidden="1" w:unhideWhenUsed="1"/>
+    <w:lsdException w:name="Message Header" w:semiHidden="1" w:unhideWhenUsed="1"/>
+    <w:lsdException w:name="Subtitle" w:uiPriority="11" w:qFormat="1"/>
+    <w:lsdException w:name="Salutation" w:semiHidden="1" w:unhideWhenUsed="1"/>
+    <w:lsdException w:name="Date" w:semiHidden="1" w:unhideWhenUsed="1"/>
+    <w:lsdException w:name="Body Text First Indent" w:semiHidden="1" w:unhideWhenUsed="1"/>
+    <w:lsdException w:name="Body Text First Indent 2" w:semiHidden="1" w:unhideWhenUsed="1"/>
+    <w:lsdException w:name="Note Heading" w:semiHidden="1" w:unhideWhenUsed="1"/>
+    <w:lsdException w:name="Body Text 2" w:semiHidden="1" w:unhideWhenUsed="1"/>
+    <w:lsdException w:name="Body Text 3" w:semiHidden="1" w:unhideWhenUsed="1"/>
+    <w:lsdException w:name="Body Text Indent 2" w:semiHidden="1" w:unhideWhenUsed="1"/>
+    <w:lsdException w:name="Body Text Indent 3" w:semiHidden="1" w:unhideWhenUsed="1"/>
+    <w:lsdException w:name="Block Text" w:semiHidden="1" w:unhideWhenUsed="1"/>
+    <w:lsdException w:name="Hyperlink" w:semiHidden="1" w:unhideWhenUsed="1"/>
+    <w:lsdException w:name="FollowedHyperlink" w:semiHidden="1" w:unhideWhenUsed="1"/>
+    <w:lsdException w:name="Strong" w:uiPriority="22" w:qFormat="1"/>
+    <w:lsdException w:name="Emphasis" w:uiPriority="20" w:qFormat="1"/>
+    <w:lsdException w:name="Document Map" w:semiHidden="1" w:unhideWhenUsed="1"/>
+    <w:lsdException w:name="Plain Text" w:semiHidden="1" w:unhideWhenUsed="1"/>
+    <w:lsdException w:name="E-mail Signature" w:semiHidden="1" w:unhideWhenUsed="1"/>
+    <w:lsdException w:name="HTML Top of Form" w:semiHidden="1" w:unhideWhenUsed="1"/>
+    <w:lsdException w:name="HTML Bottom of Form" w:semiHidden="1" w:unhideWhenUsed="1"/>
+    <w:lsdException w:name="Normal (Web)" w:semiHidden="1" w:unhideWhenUsed="1"/>
+    <w:lsdException w:name="HTML Acronym" w:semiHidden="1" w:unhideWhenUsed="1"/>
+    <w:lsdException w:name="HTML Address" w:semiHidden="1" w:unhideWhenUsed="1"/>
+    <w:lsdException w:name="HTML Cite" w:semiHidden="1" w:unhideWhenUsed="1"/>
+    <w:lsdException w:name="HTML Code" w:semiHidden="1" w:unhideWhenUsed="1"/>
+    <w:lsdException w:name="HTML Definition" w:semiHidden="1" w:unhideWhenUsed="1"/>
+    <w:lsdException w:name="HTML Keyboard" w:semiHidden="1" w:unhideWhenUsed="1"/>
+    <w:lsdException w:name="HTML Preformatted" w:semiHidden="1" w:unhideWhenUsed="1"/>
+    <w:lsdException w:name="HTML Sample" w:semiHidden="1" w:unhideWhenUsed="1"/>
+    <w:lsdException w:name="HTML Typewriter" w:semiHidden="1" w:unhideWhenUsed="1"/>
+    <w:lsdException w:name="HTML Variable" w:semiHidden="1" w:unhideWhenUsed="1"/>
+    <w:lsdException w:name="Normal Table" w:semiHidden="1" w:unhideWhenUsed="1"/>
+    <w:lsdException w:name="annotation subject" w:semiHidden="1" w:unhideWhenUsed="1"/>
+    <w:lsdException w:name="No List" w:semiHidden="1" w:unhideWhenUsed="1"/>
+    <w:lsdException w:name="Outline List 1" w:semiHidden="1" w:unhideWhenUsed="1"/>
+    <w:lsdException w:name="Outline List 2" w:semiHidden="1" w:unhideWhenUsed="1"/>
+    <w:lsdException w:name="Outline List 3" w:semiHidden="1" w:unhideWhenUsed="1"/>
+    <w:lsdException w:name="Table Simple 1" w:semiHidden="1" w:unhideWhenUsed="1"/>
+    <w:lsdException w:name="Table Simple 2" w:semiHidden="1" w:unhideWhenUsed="1"/>
+    <w:lsdException w:name="Table Simple 3" w:semiHidden="1" w:unhideWhenUsed="1"/>
+    <w:lsdException w:name="Table Classic 1" w:semiHidden="1" w:unhideWhenUsed="1"/>
+    <w:lsdException w:name="Table Classic 2" w:semiHidden="1" w:unhideWhenUsed="1"/>
+    <w:lsdException w:name="Table Classic 3" w:semiHidden="1" w:unhideWhenUsed="1"/>
+    <w:lsdException w:name="Table Classic 4" w:semiHidden="1" w:unhideWhenUsed="1"/>
+    <w:lsdException w:name="Table Colorful 1" w:semiHidden="1" w:unhideWhenUsed="1"/>
+    <w:lsdException w:name="Table Colorful 2" w:semiHidden="1" w:unhideWhenUsed="1"/>
+    <w:lsdException w:name="Table Colorful 3" w:semiHidden="1" w:unhideWhenUsed="1"/>
+    <w:lsdException w:name="Table Columns 1" w:semiHidden="1" w:unhideWhenUsed="1"/>
+    <w:lsdException w:name="Table Columns 2" w:semiHidden="1" w:unhideWhenUsed="1"/>
+    <w:lsdException w:name="Table Columns 3" w:semiHidden="1" w:unhideWhenUsed="1"/>
+    <w:lsdException w:name="Table Columns 4" w:semiHidden="1" w:unhideWhenUsed="1"/>
+    <w:lsdException w:name="Table Columns 5" w:semiHidden="1" w:unhideWhenUsed="1"/>
+    <w:lsdException w:name="Table Grid 1" w:semiHidden="1" w:unhideWhenUsed="1"/>
+    <w:lsdException w:name="Table Grid 2" w:semiHidden="1" w:unhideWhenUsed="1"/>
+    <w:lsdException w:name="Table Grid 3" w:semiHidden="1" w:unhideWhenUsed="1"/>
+    <w:lsdException w:name="Table Grid 4" w:semiHidden="1" w:unhideWhenUsed="1"/>
+    <w:lsdException w:name="Table Grid 5" w:semiHidden="1" w:unhideWhenUsed="1"/>
+    <w:lsdException w:name="Table Grid 6" w:semiHidden="1" w:unhideWhenUsed="1"/>
+    <w:lsdException w:name="Table Grid 7" w:semiHidden="1" w:unhideWhenUsed="1"/>
+    <w:lsdException w:name="Table Grid 8" w:semiHidden="1" w:unhideWhenUsed="1"/>
+    <w:lsdException w:name="Table List 1" w:semiHidden="1" w:unhideWhenUsed="1"/>
+    <w:lsdException w:name="Table List 2" w:semiHidden="1" w:unhideWhenUsed="1"/>
+    <w:lsdException w:name="Table List 3" w:semiHidden="1" w:unhideWhenUsed="1"/>
+    <w:lsdException w:name="Table List 4" w:semiHidden="1" w:unhideWhenUsed="1"/>
+    <w:lsdException w:name="Table List 5" w:semiHidden="1" w:unhideWhenUsed="1"/>
+    <w:lsdException w:name="Table List 6" w:semiHidden="1" w:unhideWhenUsed="1"/>
+    <w:lsdException w:name="Table List 7" w:semiHidden="1" w:unhideWhenUsed="1"/>
+    <w:lsdException w:name="Table List 8" w:semiHidden="1" w:unhideWhenUsed="1"/>
+    <w:lsdException w:name="Table 3D effects 1" w:semiHidden="1" w:unhideWhenUsed="1"/>
+    <w:lsdException w:name="Table 3D effects 2" w:semiHidden="1" w:unhideWhenUsed="1"/>
+    <w:lsdException w:name="Table 3D effects 3" w:semiHidden="1" w:unhideWhenUsed="1"/>
+    <w:lsdException w:name="Table Contemporary" w:semiHidden="1" w:unhideWhenUsed="1"/>
+    <w:lsdException w:name="Table Elegant" w:semiHidden="1" w:unhideWhenUsed="1"/>
+    <w:lsdException w:name="Table Professional" w:semiHidden="1" w:unhideWhenUsed="1"/>
+    <w:lsdException w:name="Table Subtle 1" w:semiHidden="1" w:unhideWhenUsed="1"/>
+    <w:lsdException w:name="Table Subtle 2" w:semiHidden="1" w:unhideWhenUsed="1"/>
+    <w:lsdException w:name="Table Web 1" w:semiHidden="1" w:unhideWhenUsed="1"/>
+    <w:lsdException w:name="Table Web 2" w:semiHidden="1" w:unhideWhenUsed="1"/>
+    <w:lsdException w:name="Table Web 3" w:semiHidden="1" w:unhideWhenUsed="1"/>
+    <w:lsdException w:name="Balloon Text" w:semiHidden="1" w:unhideWhenUsed="1"/>
+    <w:lsdException w:name="Table Grid" w:uiPriority="39"/>
+    <w:lsdException w:name="Table Theme" w:semiHidden="1" w:unhideWhenUsed="1"/>
+    <w:lsdException w:name="Placeholder Text" w:semiHidden="1"/>
+    <w:lsdException w:name="No Spacing" w:uiPriority="1" w:qFormat="1"/>
+    <w:lsdException w:name="Light Shading" w:uiPriority="60"/>
+    <w:lsdException w:name="Light List" w:uiPriority="61"/>
+    <w:lsdException w:name="Light Grid" w:uiPriority="62"/>
+    <w:lsdException w:name="Medium Shading 1" w:uiPriority="63"/>
+    <w:lsdException w:name="Medium Shading 2" w:uiPriority="64"/>
+    <w:lsdException w:name="Medium List 1" w:uiPriority="65"/>
+    <w:lsdException w:name="Medium List 2" w:uiPriority="66"/>
+    <w:lsdException w:name="Medium Grid 1" w:uiPriority="67"/>
+    <w:lsdException w:name="Medium Grid 2" w:uiPriority="68"/>
+    <w:lsdException w:name="Medium Grid 3" w:uiPriority="69"/>
+    <w:lsdException w:name="Dark List" w:uiPriority="70"/>
+    <w:lsdException w:name="Colorful Shading" w:uiPriority="71"/>
+    <w:lsdException w:name="Colorful List" w:uiPriority="72"/>
+    <w:lsdException w:name="Colorful Grid" w:uiPriority="73"/>
+    <w:lsdException w:name="Light Shading Accent 1" w:uiPriority="60"/>
+    <w:lsdException w:name="Light List Accent 1" w:uiPriority="61"/>
+    <w:lsdException w:name="Light Grid Accent 1" w:uiPriority="62"/>
+    <w:lsdException w:name="Medium Shading 1 Accent 1" w:uiPriority="63"/>
+    <w:lsdException w:name="Medium Shading 2 Accent 1" w:uiPriority="64"/>
+    <w:lsdException w:name="Medium List 1 Accent 1" w:uiPriority="65"/>
+    <w:lsdException w:name="Revision" w:semiHidden="1"/>
+    <w:lsdException w:name="List Paragraph" w:uiPriority="34" w:qFormat="1"/>
+    <w:lsdException w:name="Quote" w:uiPriority="29" w:qFormat="1"/>
+    <w:lsdException w:name="Intense Quote" w:uiPriority="30" w:qFormat="1"/>
+    <w:lsdException w:name="Medium List 2 Accent 1" w:uiPriority="66"/>
+    <w:lsdException w:name="Medium Grid 1 Accent 1" w:uiPriority="67"/>
+    <w:lsdException w:name="Medium Grid 2 Accent 1" w:uiPriority="68"/>
+    <w:lsdException w:name="Medium Grid 3 Accent 1" w:uiPriority="69"/>
+    <w:lsdException w:name="Dark List Accent 1" w:uiPriority="70"/>
+    <w:lsdException w:name="Colorful Shading Accent 1" w:uiPriority="71"/>
+    <w:lsdException w:name="Colorful List Accent 1" w:uiPriority="72"/>
+    <w:lsdException w:name="Colorful Grid Accent 1" w:uiPriority="73"/>
+    <w:lsdException w:name="Light Shading Accent 2" w:uiPriority="60"/>
+    <w:lsdException w:name="Light List Accent 2" w:uiPriority="61"/>
+    <w:lsdException w:name="Light Grid Accent 2" w:uiPriority="62"/>
+    <w:lsdException w:name="Medium Shading 1 Accent 2" w:uiPriority="63"/>
+    <w:lsdException w:name="Medium Shading 2 Accent 2" w:uiPriority="64"/>
+    <w:lsdException w:name="Medium List 1 Accent 2" w:uiPriority="65"/>
+    <w:lsdException w:name="Medium List 2 Accent 2" w:uiPriority="66"/>
+    <w:lsdException w:name="Medium Grid 1 Accent 2" w:uiPriority="67"/>
+    <w:lsdException w:name="Medium Grid 2 Accent 2" w:uiPriority="68"/>
+    <w:lsdException w:name="Medium Grid 3 Accent 2" w:uiPriority="69"/>
+    <w:lsdException w:name="Dark List Accent 2" w:uiPriority="70"/>
+    <w:lsdException w:name="Colorful Shading Accent 2" w:uiPriority="71"/>
+    <w:lsdException w:name="Colorful List Accent 2" w:uiPriority="72"/>
+    <w:lsdException w:name="Colorful Grid Accent 2" w:uiPriority="73"/>
+    <w:lsdException w:name="Light Shading Accent 3" w:uiPriority="60"/>
+    <w:lsdException w:name="Light List Accent 3" w:uiPriority="61"/>
+    <w:lsdException w:name="Light Grid Accent 3" w:uiPriority="62"/>
+    <w:lsdException w:name="Medium Shading 1 Accent 3" w:uiPriority="63"/>
+    <w:lsdException w:name="Medium Shading 2 Accent 3" w:uiPriority="64"/>
+    <w:lsdException w:name="Medium List 1 Accent 3" w:uiPriority="65"/>
+    <w:lsdException w:name="Medium List 2 Accent 3" w:uiPriority="66"/>
+    <w:lsdException w:name="Medium Grid 1 Accent 3" w:uiPriority="67"/>
+    <w:lsdException w:name="Medium Grid 2 Accent 3" w:uiPriority="68"/>
+    <w:lsdException w:name="Medium Grid 3 Accent 3" w:uiPriority="69"/>
+    <w:lsdException w:name="Dark List Accent 3" w:uiPriority="70"/>
+    <w:lsdException w:name="Colorful Shading Accent 3" w:uiPriority="71"/>
+    <w:lsdException w:name="Colorful List Accent 3" w:uiPriority="72"/>
+    <w:lsdException w:name="Colorful Grid Accent 3" w:uiPriority="73"/>
+    <w:lsdException w:name="Light Shading Accent 4" w:uiPriority="60"/>
+    <w:lsdException w:name="Light List Accent 4" w:uiPriority="61"/>
+    <w:lsdException w:name="Light Grid Accent 4" w:uiPriority="62"/>
+    <w:lsdException w:name="Medium Shading 1 Accent 4" w:uiPriority="63"/>
+    <w:lsdException w:name="Medium Shading 2 Accent 4" w:uiPriority="64"/>
+    <w:lsdException w:name="Medium List 1 Accent 4" w:uiPriority="65"/>
+    <w:lsdException w:name="Medium List 2 Accent 4" w:uiPriority="66"/>
+    <w:lsdException w:name="Medium Grid 1 Accent 4" w:uiPriority="67"/>
+    <w:lsdException w:name="Medium Grid 2 Accent 4" w:uiPriority="68"/>
+    <w:lsdException w:name="Medium Grid 3 Accent 4" w:uiPriority="69"/>
+    <w:lsdException w:name="Dark List Accent 4" w:uiPriority="70"/>
+    <w:lsdException w:name="Colorful Shading Accent 4" w:uiPriority="71"/>
+    <w:lsdException w:name="Colorful List Accent 4" w:uiPriority="72"/>
+    <w:lsdException w:name="Colorful Grid Accent 4" w:uiPriority="73"/>
+    <w:lsdException w:name="Light Shading Accent 5" w:uiPriority="60"/>
+    <w:lsdException w:name="Light List Accent 5" w:uiPriority="61"/>
+    <w:lsdException w:name="Light Grid Accent 5" w:uiPriority="62"/>
+    <w:lsdException w:name="Medium Shading 1 Accent 5" w:uiPriority="63"/>
+    <w:lsdException w:name="Medium Shading 2 Accent 5" w:uiPriority="64"/>
+    <w:lsdException w:name="Medium List 1 Accent 5" w:uiPriority="65"/>
+    <w:lsdException w:name="Medium List 2 Accent 5" w:uiPriority="66"/>
+    <w:lsdException w:name="Medium Grid 1 Accent 5" w:uiPriority="67"/>
+    <w:lsdException w:name="Medium Grid 2 Accent 5" w:uiPriority="68"/>
+    <w:lsdException w:name="Medium Grid 3 Accent 5" w:uiPriority="69"/>
+    <w:lsdException w:name="Dark List Accent 5" w:uiPriority="70"/>
+    <w:lsdException w:name="Colorful Shading Accent 5" w:uiPriority="71"/>
+    <w:lsdException w:name="Colorful List Accent 5" w:uiPriority="72"/>
+    <w:lsdException w:name="Colorful Grid Accent 5" w:uiPriority="73"/>
+    <w:lsdException w:name="Light Shading Accent 6" w:uiPriority="60"/>
+    <w:lsdException w:name="Light List Accent 6" w:uiPriority="61"/>
+    <w:lsdException w:name="Light Grid Accent 6" w:uiPriority="62"/>
+    <w:lsdException w:name="Medium Shading 1 Accent 6" w:uiPriority="63"/>
+    <w:lsdException w:name="Medium Shading 2 Accent 6" w:uiPriority="64"/>
+    <w:lsdException w:name="Medium List 1 Accent 6" w:uiPriority="65"/>
+    <w:lsdException w:name="Medium List 2 Accent 6" w:uiPriority="66"/>
+    <w:lsdException w:name="Medium Grid 1 Accent 6" w:uiPriority="67"/>
+    <w:lsdException w:name="Medium Grid 2 Accent 6" w:uiPriority="68"/>
+    <w:lsdException w:name="Medium Grid 3 Accent 6" w:uiPriority="69"/>
+    <w:lsdException w:name="Dark List Accent 6" w:uiPriority="70"/>
+    <w:lsdException w:name="Colorful Shading Accent 6" w:uiPriority="71"/>
+    <w:lsdException w:name="Colorful List Accent 6" w:uiPriority="72"/>
+    <w:lsdException w:name="Colorful Grid Accent 6" w:uiPriority="73"/>
+    <w:lsdException w:name="Subtle Emphasis" w:uiPriority="19" w:qFormat="1"/>
+    <w:lsdException w:name="Intense Emphasis" w:uiPriority="21" w:qFormat="1"/>
+    <w:lsdException w:name="Subtle Reference" w:uiPriority="31" w:qFormat="1"/>
+    <w:lsdException w:name="Intense Reference" w:uiPriority="32" w:qFormat="1"/>
+    <w:lsdException w:name="Book Title" w:uiPriority="33" w:qFormat="1"/>
+    <w:lsdException w:name="Bibliography" w:semiHidden="1" w:uiPriority="37" w:unhideWhenUsed="1"/>
+    <w:lsdException w:name="TOC Heading" w:semiHidden="1" w:uiPriority="39" w:unhideWhenUsed="1" w:qFormat="1"/>
+    <w:lsdException w:name="Plain Table 1" w:uiPriority="41"/>
+    <w:lsdException w:name="Plain Table 2" w:uiPriority="42"/>
+    <w:lsdException w:name="Plain Table 3" w:uiPriority="43"/>
+    <w:lsdException w:name="Plain Table 4" w:uiPriority="44"/>
+    <w:lsdException w:name="Plain Table 5" w:uiPriority="45"/>
+    <w:lsdException w:name="Grid Table Light" w:uiPriority="40"/>
+    <w:lsdException w:name="Grid Table 1 Light" w:uiPriority="46"/>
+    <w:lsdException w:name="Grid Table 2" w:uiPriority="47"/>
+    <w:lsdException w:name="Grid Table 3" w:uiPriority="48"/>
+    <w:lsdException w:name="Grid Table 4" w:uiPriority="49"/>
+    <w:lsdException w:name="Grid Table 5 Dark" w:uiPriority="50"/>
+    <w:lsdException w:name="Grid Table 6 Colorful" w:uiPriority="51"/>
+    <w:lsdException w:name="Grid Table 7 Colorful" w:uiPriority="52"/>
+    <w:lsdException w:name="Grid Table 1 Light Accent 1" w:uiPriority="46"/>
+    <w:lsdException w:name="Grid Table 2 Accent 1" w:uiPriority="47"/>
+    <w:lsdException w:name="Grid Table 3 Accent 1" w:uiPriority="48"/>
+    <w:lsdException w:name="Grid Table 4 Accent 1" w:uiPriority="49"/>
+    <w:lsdException w:name="Grid Table 5 Dark Accent 1" w:uiPriority="50"/>
+    <w:lsdException w:name="Grid Table 6 Colorful Accent 1" w:uiPriority="51"/>
+    <w:lsdException w:name="Grid Table 7 Colorful Accent 1" w:uiPriority="52"/>
+    <w:lsdException w:name="Grid Table 1 Light Accent 2" w:uiPriority="46"/>
+    <w:lsdException w:name="Grid Table 2 Accent 2" w:uiPriority="47"/>
+    <w:lsdException w:name="Grid Table 3 Accent 2" w:uiPriority="48"/>
+    <w:lsdException w:name="Grid Table 4 Accent 2" w:uiPriority="49"/>
+    <w:lsdException w:name="Grid Table 5 Dark Accent 2" w:uiPriority="50"/>
+    <w:lsdException w:name="Grid Table 6 Colorful Accent 2" w:uiPriority="51"/>
+    <w:lsdException w:name="Grid Table 7 Colorful Accent 2" w:uiPriority="52"/>
+    <w:lsdException w:name="Grid Table 1 Light Accent 3" w:uiPriority="46"/>
+    <w:lsdException w:name="Grid Table 2 Accent 3" w:uiPriority="47"/>
+    <w:lsdException w:name="Grid Table 3 Accent 3" w:uiPriority="48"/>
+    <w:lsdException w:name="Grid Table 4 Accent 3" w:uiPriority="49"/>
+    <w:lsdException w:name="Grid Table 5 Dark Accent 3" w:uiPriority="50"/>
+    <w:lsdException w:name="Grid Table 6 Colorful Accent 3" w:uiPriority="51"/>
+    <w:lsdException w:name="Grid Table 7 Colorful Accent 3" w:uiPriority="52"/>
+    <w:lsdException w:name="Grid Table 1 Light Accent 4" w:uiPriority="46"/>
+    <w:lsdException w:name="Grid Table 2 Accent 4" w:uiPriority="47"/>
+    <w:lsdException w:name="Grid Table 3 Accent 4" w:uiPriority="48"/>
+    <w:lsdException w:name="Grid Table 4 Accent 4" w:uiPriority="49"/>
+    <w:lsdException w:name="Grid Table 5 Dark Accent 4" w:uiPriority="50"/>
+    <w:lsdException w:name="Grid Table 6 Colorful Accent 4" w:uiPriority="51"/>
+    <w:lsdException w:name="Grid Table 7 Colorful Accent 4" w:uiPriority="52"/>
+    <w:lsdException w:name="Grid Table 1 Light Accent 5" w:uiPriority="46"/>
+    <w:lsdException w:name="Grid Table 2 Accent 5" w:uiPriority="47"/>
+    <w:lsdException w:name="Grid Table 3 Accent 5" w:uiPriority="48"/>
+    <w:lsdException w:name="Grid Table 4 Accent 5" w:uiPriority="49"/>
+    <w:lsdException w:name="Grid Table 5 Dark Accent 5" w:uiPriority="50"/>
+    <w:lsdException w:name="Grid Table 6 Colorful Accent 5" w:uiPriority="51"/>
+    <w:lsdException w:name="Grid Table 7 Colorful Accent 5" w:uiPriority="52"/>
+    <w:lsdException w:name="Grid Table 1 Light Accent 6" w:uiPriority="46"/>
+    <w:lsdException w:name="Grid Table 2 Accent 6" w:uiPriority="47"/>
+    <w:lsdException w:name="Grid Table 3 Accent 6" w:uiPriority="48"/>
+    <w:lsdException w:name="Grid Table 4 Accent 6" w:uiPriority="49"/>
+    <w:lsdException w:name="Grid Table 5 Dark Accent 6" w:uiPriority="50"/>
+    <w:lsdException w:name="Grid Table 6 Colorful Accent 6" w:uiPriority="51"/>
+    <w:lsdException w:name="Grid Table 7 Colorful Accent 6" w:uiPriority="52"/>
+    <w:lsdException w:name="List Table 1 Light" w:uiPriority="46"/>
+    <w:lsdException w:name="List Table 2" w:uiPriority="47"/>
+    <w:lsdException w:name="List Table 3" w:uiPriority="48"/>
+    <w:lsdException w:name="List Table 4" w:uiPriority="49"/>
+    <w:lsdException w:name="List Table 5 Dark" w:uiPriority="50"/>
+    <w:lsdException w:name="List Table 6 Colorful" w:uiPriority="51"/>
+    <w:lsdException w:name="List Table 7 Colorful" w:uiPriority="52"/>
+    <w:lsdException w:name="List Table 1 Light Accent 1" w:uiPriority="46"/>
+    <w:lsdException w:name="List Table 2 Accent 1" w:uiPriority="47"/>
+    <w:lsdException w:name="List Table 3 Accent 1" w:uiPriority="48"/>
+    <w:lsdException w:name="List Table 4 Accent 1" w:uiPriority="49"/>
+    <w:lsdException w:name="List Table 5 Dark Accent 1" w:uiPriority="50"/>
+    <w:lsdException w:name="List Table 6 Colorful Accent 1" w:uiPriority="51"/>
+    <w:lsdException w:name="List Table 7 Colorful Accent 1" w:uiPriority="52"/>
+    <w:lsdException w:name="List Table 1 Light Accent 2" w:uiPriority="46"/>
+    <w:lsdException w:name="List Table 2 Accent 2" w:uiPriority="47"/>
+    <w:lsdException w:name="List Table 3 Accent 2" w:uiPriority="48"/>
+    <w:lsdException w:name="List Table 4 Accent 2" w:uiPriority="49"/>
+    <w:lsdException w:name="List Table 5 Dark Accent 2" w:uiPriority="50"/>
+    <w:lsdException w:name="List Table 6 Colorful Accent 2" w:uiPriority="51"/>
+    <w:lsdException w:name="List Table 7 Colorful Accent 2" w:uiPriority="52"/>
+    <w:lsdException w:name="List Table 1 Light Accent 3" w:uiPriority="46"/>
+    <w:lsdException w:name="List Table 2 Accent 3" w:uiPriority="47"/>
+    <w:lsdException w:name="List Table 3 Accent 3" w:uiPriority="48"/>
+    <w:lsdException w:name="List Table 4 Accent 3" w:uiPriority="49"/>
+    <w:lsdException w:name="List Table 5 Dark Accent 3" w:uiPriority="50"/>
+    <w:lsdException w:name="List Table 6 Colorful Accent 3" w:uiPriority="51"/>
+    <w:lsdException w:name="List Table 7 Colorful Accent 3" w:uiPriority="52"/>
+    <w:lsdException w:name="List Table 1 Light Accent 4" w:uiPriority="46"/>
+    <w:lsdException w:name="List Table 2 Accent 4" w:uiPriority="47"/>
+    <w:lsdException w:name="List Table 3 Accent 4" w:uiPriority="48"/>
+    <w:lsdException w:name="List Table 4 Accent 4" w:uiPriority="49"/>
+    <w:lsdException w:name="List Table 5 Dark Accent 4" w:uiPriority="50"/>
+    <w:lsdException w:name="List Table 6 Colorful Accent 4" w:uiPriority="51"/>
+    <w:lsdException w:name="List Table 7 Colorful Accent 4" w:uiPriority="52"/>
+    <w:lsdException w:name="List Table 1 Light Accent 5" w:uiPriority="46"/>
+    <w:lsdException w:name="List Table 2 Accent 5" w:uiPriority="47"/>
+    <w:lsdException w:name="List Table 3 Accent 5" w:uiPriority="48"/>
+    <w:lsdException w:name="List Table 4 Accent 5" w:uiPriority="49"/>
+    <w:lsdException w:name="List Table 5 Dark Accent 5" w:uiPriority="50"/>
+    <w:lsdException w:name="List Table 6 Colorful Accent 5" w:uiPriority="51"/>
+    <w:lsdException w:name="List Table 7 Colorful Accent 5" w:uiPriority="52"/>
+    <w:lsdException w:name="List Table 1 Light Accent 6" w:uiPriority="46"/>
+    <w:lsdException w:name="List Table 2 Accent 6" w:uiPriority="47"/>
+    <w:lsdException w:name="List Table 3 Accent 6" w:uiPriority="48"/>
+    <w:lsdException w:name="List Table 4 Accent 6" w:uiPriority="49"/>
+    <w:lsdException w:name="List Table 5 Dark Accent 6" w:uiPriority="50"/>
+    <w:lsdException w:name="List Table 6 Colorful Accent 6" w:uiPriority="51"/>
+    <w:lsdException w:name="List Table 7 Colorful Accent 6" w:uiPriority="52"/>
+    <w:lsdException w:name="Mention" w:semiHidden="1" w:unhideWhenUsed="1"/>
+    <w:lsdException w:name="Smart Hyperlink" w:semiHidden="1" w:unhideWhenUsed="1"/>
+    <w:lsdException w:name="Hashtag" w:semiHidden="1" w:unhideWhenUsed="1"/>
+    <w:lsdException w:name="Unresolved Mention" w:semiHidden="1" w:unhideWhenUsed="1"/>
+    <w:lsdException w:name="Smart Link" w:semiHidden="1" w:unhideWhenUsed="1"/>
+  </w:latentStyles>
+  <w:style w:type="paragraph" w:default="1" w:styleId="Normal">
+    <w:name w:val="Normal"/>
+    <w:qFormat/>
+  </w:style>
+  <w:style w:type="character" w:default="1" w:styleId="DefaultParagraphFont">
+    <w:name w:val="Default Paragraph Font"/>
+    <w:uiPriority w:val="1"/>
+    <w:semiHidden/>
+    <w:unhideWhenUsed/>
+  </w:style>
+  <w:style w:type="table" w:default="1" w:styleId="TableNormal">
+    <w:name w:val="Normal Table"/>
+    <w:uiPriority w:val="99"/>
+    <w:semiHidden/>
+    <w:unhideWhenUsed/>
+    <w:tblPr>
+      <w:tblInd w:w="0" w:type="dxa"/>
+      <w:tblCellMar>
+        <w:top w:w="0" w:type="dxa"/>
+        <w:left w:w="108" w:type="dxa"/>
+        <w:bottom w:w="0" w:type="dxa"/>
+        <w:right w:w="108" w:type="dxa"/>
+      </w:tblCellMar>
+    </w:tblPr>
+  </w:style>
+  <w:style w:type="numbering" w:default="1" w:styleId="NoList">
+    <w:name w:val="No List"/>
+    <w:uiPriority w:val="99"/>
+    <w:semiHidden/>
+    <w:unhideWhenUsed/>
+  </w:style>
+  <w:style w:type="character" w:styleId="PlaceholderText">
+    <w:name w:val="Placeholder Text"/>
+    <w:basedOn w:val="DefaultParagraphFont"/>
+    <w:uiPriority w:val="99"/>
+    <w:semiHidden/>
+    <w:rsid w:val="00966163"/>
+    <w:rPr>
+      <w:color w:val="666666"/>
+    </w:rPr>
+  </w:style>
+</w:styles>
+</file>
+
+<file path=word/glossary/webSettings.xml><?xml version="1.0" encoding="utf-8"?>
+<w:webSettings xmlns:mc="http://schemas.openxmlformats.org/markup-compatibility/2006" xmlns:r="http://schemas.openxmlformats.org/officeDocument/2006/relationships" xmlns:w="http://schemas.openxmlformats.org/wordprocessingml/2006/main" xmlns:w14="http://schemas.microsoft.com/office/word/2010/wordml" xmlns:w15="http://schemas.microsoft.com/office/word/2012/wordml" xmlns:w16cex="http://schemas.microsoft.com/office/word/2018/wordml/cex" xmlns:w16cid="http://schemas.microsoft.com/office/word/2016/wordml/cid" xmlns:w16="http://schemas.microsoft.com/office/word/2018/wordml" xmlns:w16du="http://schemas.microsoft.com/office/word/2023/wordml/word16du" xmlns:w16sdtdh="http://schemas.microsoft.com/office/word/2020/wordml/sdtdatahash" xmlns:w16sdtfl="http://schemas.microsoft.com/office/word/2024/wordml/sdtformatlock" xmlns:w16se="http://schemas.microsoft.com/office/word/2015/wordml/symex" mc:Ignorable="w14 w15 w16se w16cid w16 w16cex w16sdtdh w16sdtfl w16du">
+  <w:optimizeForBrowser/>
+  <w:allowPNG/>
+</w:webSettings>
 </file>
 
 <file path=word/theme/theme1.xml><?xml version="1.0" encoding="utf-8"?>
@@ -17521,6 +17783,29 @@
 </a:theme>
 </file>
 
+<file path=word/webextensions/taskpanes.xml><?xml version="1.0" encoding="utf-8"?>
+<wetp:taskpanes xmlns:wetp="http://schemas.microsoft.com/office/webextensions/taskpanes/2010/11">
+  <wetp:taskpane dockstate="right" visibility="0" width="438" row="0">
+    <wetp:webextensionref xmlns:r="http://schemas.openxmlformats.org/officeDocument/2006/relationships" r:id="rId1"/>
+  </wetp:taskpane>
+</wetp:taskpanes>
+</file>
+
+<file path=word/webextensions/webextension1.xml><?xml version="1.0" encoding="utf-8"?>
+<we:webextension xmlns:we="http://schemas.microsoft.com/office/webextensions/webextension/2010/11" id="{C772B10B-7618-4027-B181-D772F16F1EBA}">
+  <we:reference id="wa104382081" version="1.55.1.0" store="en-US" storeType="OMEX"/>
+  <we:alternateReferences>
+    <we:reference id="WA104382081" version="1.55.1.0" store="" storeType="OMEX"/>
+  </we:alternateReferences>
+  <we:properties>
+    <we:property name="MENDELEY_CITATIONS" value="[{&quot;citationID&quot;:&quot;MENDELEY_CITATION_3a12006e-fbea-40f6-b24c-a6b73827dc3c&quot;,&quot;properties&quot;:{&quot;noteIndex&quot;:0},&quot;isEdited&quot;:false,&quot;manualOverride&quot;:{&quot;isManuallyOverridden&quot;:false,&quot;citeprocText&quot;:&quot;[1]&quot;,&quot;manualOverrideText&quot;:&quot;&quot;},&quot;citationTag&quot;:&quot;MENDELEY_CITATION_v3_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&quot;,&quot;citationItems&quot;:[{&quot;id&quot;:&quot;74b4a176-a06b-3dcb-9904-952ea10b110c&quot;,&quot;itemData&quot;:{&quot;type&quot;:&quot;article-journal&quot;,&quot;id&quot;:&quot;74b4a176-a06b-3dcb-9904-952ea10b110c&quot;,&quot;title&quot;:&quot;PERAN DATA ANALIS DALAM MENDORONG KEPUTUSAN DAN STRATEGI BISNIS PERUSAHAAN&quot;,&quot;author&quot;:[{&quot;family&quot;:&quot;Rosita&quot;,&quot;given&quot;:&quot;Amanda Aura&quot;,&quot;parse-names&quot;:false,&quot;dropping-particle&quot;:&quot;&quot;,&quot;non-dropping-particle&quot;:&quot;&quot;},{&quot;family&quot;:&quot;Tannar&quot;,&quot;given&quot;:&quot;Oryza&quot;,&quot;parse-names&quot;:false,&quot;dropping-particle&quot;:&quot;&quot;,&quot;non-dropping-particle&quot;:&quot;&quot;}],&quot;container-title&quot;:&quot;Jurnal Ekonomi Revolusioner&quot;,&quot;issued&quot;:{&quot;date-parts&quot;:[[2024]]},&quot;issue&quot;:&quot;7&quot;,&quot;volume&quot;:&quot;7&quot;,&quot;container-title-short&quot;:&quot;&quot;},&quot;isTemporary&quot;:false}]},{&quot;citationID&quot;:&quot;MENDELEY_CITATION_7d83bb88-96d7-4f02-a289-b3d1de461bdd&quot;,&quot;properties&quot;:{&quot;noteIndex&quot;:0},&quot;isEdited&quot;:false,&quot;manualOverride&quot;:{&quot;isManuallyOverridden&quot;:false,&quot;citeprocText&quot;:&quot;[2]&quot;,&quot;manualOverrideText&quot;:&quot;&quot;},&quot;citationTag&quot;:&quot;MENDELEY_CITATION_v3_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&quot;,&quot;citationItems&quot;:[{&quot;id&quot;:&quot;624bddcc-faad-354e-a37e-9bcacc2441fb&quot;,&quot;itemData&quot;:{&quot;type&quot;:&quot;article-journal&quot;,&quot;id&quot;:&quot;624bddcc-faad-354e-a37e-9bcacc2441fb&quot;,&quot;title&quot;:&quot;Perbandingan Metode Data Mining Untuk Prediksi Nilai Dan Waktu Kelulusan Mahasiswa Prodi Teknik Informatika Dengan Algoritma C4, 5, Naïve Bayes, Knn Dan Svm&quot;,&quot;author&quot;:[{&quot;family&quot;:&quot;Widaningsih&quot;,&quot;given&quot;:&quot;Sri&quot;,&quot;parse-names&quot;:false,&quot;dropping-particle&quot;:&quot;&quot;,&quot;non-dropping-particle&quot;:&quot;&quot;}],&quot;container-title&quot;:&quot;Jurnal Tekno Insentif&quot;,&quot;ISSN&quot;:&quot;2655-089X&quot;,&quot;issued&quot;:{&quot;date-parts&quot;:[[2019]]},&quot;page&quot;:&quot;16-25&quot;,&quot;issue&quot;:&quot;1&quot;,&quot;volume&quot;:&quot;13&quot;,&quot;container-title-short&quot;:&quot;&quot;},&quot;isTemporary&quot;:false}]},{&quot;citationID&quot;:&quot;MENDELEY_CITATION_17f89917-cef1-42eb-9d1e-11357d67e251&quot;,&quot;properties&quot;:{&quot;noteIndex&quot;:0},&quot;isEdited&quot;:false,&quot;manualOverride&quot;:{&quot;isManuallyOverridden&quot;:false,&quot;citeprocText&quot;:&quot;[3]&quot;,&quot;manualOverrideText&quot;:&quot;&quot;},&quot;citationTag&quot;:&quot;MENDELEY_CITATION_v3_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&quot;,&quot;citationItems&quot;:[{&quot;id&quot;:&quot;219e0431-c196-3cad-83dd-7ead91a2a396&quot;,&quot;itemData&quot;:{&quot;type&quot;:&quot;article-journal&quot;,&quot;id&quot;:&quot;219e0431-c196-3cad-83dd-7ead91a2a396&quot;,&quot;title&quot;:&quot;Dataset on the cultural dimension of urban society food consumption in Indonesia&quot;,&quot;author&quot;:[{&quot;family&quot;:&quot;Seda&quot;,&quot;given&quot;:&quot;Francisia S S E&quot;,&quot;parse-names&quot;:false,&quot;dropping-particle&quot;:&quot;&quot;,&quot;non-dropping-particle&quot;:&quot;&quot;},{&quot;family&quot;:&quot;Setyawati&quot;,&quot;given&quot;:&quot;Lugina&quot;,&quot;parse-names&quot;:false,&quot;dropping-particle&quot;:&quot;&quot;,&quot;non-dropping-particle&quot;:&quot;&quot;},{&quot;family&quot;:&quot;Tirta&quot;,&quot;given&quot;:&quot;Timoti&quot;,&quot;parse-names&quot;:false,&quot;dropping-particle&quot;:&quot;&quot;,&quot;non-dropping-particle&quot;:&quot;&quot;},{&quot;family&quot;:&quot;Nobel&quot;,&quot;given&quot;:&quot;Kevin&quot;,&quot;parse-names&quot;:false,&quot;dropping-particle&quot;:&quot;&quot;,&quot;non-dropping-particle&quot;:&quot;&quot;}],&quot;container-title&quot;:&quot;Data in Brief&quot;,&quot;container-title-short&quot;:&quot;Data Brief&quot;,&quot;ISSN&quot;:&quot;2352-3409&quot;,&quot;issued&quot;:{&quot;date-parts&quot;:[[2020]]},&quot;page&quot;:&quot;105681&quot;,&quot;publisher&quot;:&quot;Elsevier&quot;,&quot;volume&quot;:&quot;31&quot;},&quot;isTemporary&quot;:false}]},{&quot;citationID&quot;:&quot;MENDELEY_CITATION_f89be22b-269e-4c31-831b-f953af3883fb&quot;,&quot;properties&quot;:{&quot;noteIndex&quot;:0},&quot;isEdited&quot;:false,&quot;manualOverride&quot;:{&quot;isManuallyOverridden&quot;:false,&quot;citeprocText&quot;:&quot;[4]&quot;,&quot;manualOverrideText&quot;:&quot;&quot;},&quot;citationTag&quot;:&quot;MENDELEY_CITATION_v3_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&quot;,&quot;citationItems&quot;:[{&quot;id&quot;:&quot;a93aaf8b-be5f-34bb-aae0-7da4f3b98c22&quot;,&quot;itemData&quot;:{&quot;type&quot;:&quot;article-journal&quot;,&quot;id&quot;:&quot;a93aaf8b-be5f-34bb-aae0-7da4f3b98c22&quot;,&quot;title&quot;:&quot;Manajemen Data Yang Efektif: Solusi Untuk Mencegah dan Mengatasi Duplikasi Data Dalam Perusahaan&quot;,&quot;author&quot;:[{&quot;family&quot;:&quot;Hanifah&quot;,&quot;given&quot;:&quot;Nazwa&quot;,&quot;parse-names&quot;:false,&quot;dropping-particle&quot;:&quot;&quot;,&quot;non-dropping-particle&quot;:&quot;&quot;},{&quot;family&quot;:&quot;Nasution&quot;,&quot;given&quot;:&quot;Muhammad Irwan Padli&quot;,&quot;parse-names&quot;:false,&quot;dropping-particle&quot;:&quot;&quot;,&quot;non-dropping-particle&quot;:&quot;&quot;}],&quot;container-title&quot;:&quot;Epsilon: Journal of Management (EJoM)&quot;,&quot;ISSN&quot;:&quot;3026-653X&quot;,&quot;issued&quot;:{&quot;date-parts&quot;:[[2025]]},&quot;page&quot;:&quot;27-38&quot;,&quot;issue&quot;:&quot;1&quot;,&quot;volume&quot;:&quot;3&quot;,&quot;container-title-short&quot;:&quot;&quot;},&quot;isTemporary&quot;:false}]},{&quot;citationID&quot;:&quot;MENDELEY_CITATION_41771b54-2cd1-48dc-8259-192f6ab796cb&quot;,&quot;properties&quot;:{&quot;noteIndex&quot;:0},&quot;isEdited&quot;:false,&quot;manualOverride&quot;:{&quot;isManuallyOverridden&quot;:false,&quot;citeprocText&quot;:&quot;[5]&quot;,&quot;manualOverrideText&quot;:&quot;&quot;},&quot;citationTag&quot;:&quot;MENDELEY_CITATION_v3_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&quot;,&quot;citationItems&quot;:[{&quot;id&quot;:&quot;5503319d-adb7-3949-b8f3-2192723250e6&quot;,&quot;itemData&quot;:{&quot;type&quot;:&quot;article-journal&quot;,&quot;id&quot;:&quot;5503319d-adb7-3949-b8f3-2192723250e6&quot;,&quot;title&quot;:&quot;K-Nearest Neighbor (K-Nn) Untuk Penanganan Missing Value Pada Data Umkm&quot;,&quot;author&quot;:[{&quot;family&quot;:&quot;Sudrajat&quot;,&quot;given&quot;:&quot;Wahyu&quot;,&quot;parse-names&quot;:false,&quot;dropping-particle&quot;:&quot;&quot;,&quot;non-dropping-particle&quot;:&quot;&quot;},{&quot;family&quot;:&quot;Cholid&quot;,&quot;given&quot;:&quot;Idahm&quot;,&quot;parse-names&quot;:false,&quot;dropping-particle&quot;:&quot;&quot;,&quot;non-dropping-particle&quot;:&quot;&quot;}],&quot;container-title&quot;:&quot;Jurnal Rekayasa Sistem Informasi Dan Teknologi&quot;,&quot;ISSN&quot;:&quot;3025-888X&quot;,&quot;issued&quot;:{&quot;date-parts&quot;:[[2023]]},&quot;page&quot;:&quot;54-63&quot;,&quot;issue&quot;:&quot;2&quot;,&quot;volume&quot;:&quot;1&quot;,&quot;container-title-short&quot;:&quot;&quot;},&quot;isTemporary&quot;:false}]},{&quot;citationID&quot;:&quot;MENDELEY_CITATION_a68d755a-3a98-4a4a-93be-865b7b61246c&quot;,&quot;properties&quot;:{&quot;noteIndex&quot;:0},&quot;isEdited&quot;:false,&quot;manualOverride&quot;:{&quot;isManuallyOverridden&quot;:false,&quot;citeprocText&quot;:&quot;[6]&quot;,&quot;manualOverrideText&quot;:&quot;&quot;},&quot;citationTag&quot;:&quot;MENDELEY_CITATION_v3_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&quot;,&quot;citationItems&quot;:[{&quot;id&quot;:&quot;2e56aaf9-a5a3-3f81-a5f3-734246019abf&quot;,&quot;itemData&quot;:{&quot;type&quot;:&quot;article-journal&quot;,&quot;id&quot;:&quot;2e56aaf9-a5a3-3f81-a5f3-734246019abf&quot;,&quot;title&quot;:&quot;KAJIAN SIFAT DISTRIBUSI NORMAL BIVARIAT&quot;,&quot;author&quot;:[{&quot;family&quot;:&quot;Turyadi&quot;,&quot;given&quot;:&quot;Muhlasah Novitasari Mara&quot;,&quot;parse-names&quot;:false,&quot;dropping-particle&quot;:&quot;&quot;,&quot;non-dropping-particle&quot;:&quot;&quot;},{&quot;family&quot;:&quot;Kusnandar&quot;,&quot;given&quot;:&quot;Dadan&quot;,&quot;parse-names&quot;:false,&quot;dropping-particle&quot;:&quot;&quot;,&quot;non-dropping-particle&quot;:&quot;&quot;}],&quot;container-title&quot;:&quot;Bimaster: Buletin Ilmiah Matematika, Statistika dan Terapannya&quot;,&quot;ISSN&quot;:&quot;2302-9854&quot;,&quot;issue&quot;:&quot;02&quot;,&quot;volume&quot;:&quot;2&quot;,&quot;container-title-short&quot;:&quot;&quot;},&quot;isTemporary&quot;:false}]},{&quot;citationID&quot;:&quot;MENDELEY_CITATION_dc4f565e-b259-42f3-abd0-d5e58402ca6a&quot;,&quot;properties&quot;:{&quot;noteIndex&quot;:0},&quot;isEdited&quot;:false,&quot;manualOverride&quot;:{&quot;isManuallyOverridden&quot;:false,&quot;citeprocText&quot;:&quot;[7]&quot;,&quot;manualOverrideText&quot;:&quot;&quot;},&quot;citationTag&quot;:&quot;MENDELEY_CITATION_v3_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&quot;,&quot;citationItems&quot;:[{&quot;id&quot;:&quot;8e698846-4f7b-35f4-aa77-9c90920f795f&quot;,&quot;itemData&quot;:{&quot;type&quot;:&quot;article-journal&quot;,&quot;id&quot;:&quot;8e698846-4f7b-35f4-aa77-9c90920f795f&quot;,&quot;title&quot;:&quot;Problem solving: Signifikansi, pengertian, dan ragamnya&quot;,&quot;author&quot;:[{&quot;family&quot;:&quot;Sulasmono&quot;,&quot;given&quot;:&quot;Bambang Suteng&quot;,&quot;parse-names&quot;:false,&quot;dropping-particle&quot;:&quot;&quot;,&quot;non-dropping-particle&quot;:&quot;&quot;}],&quot;container-title&quot;:&quot;Satya Widya&quot;,&quot;ISSN&quot;:&quot;2549-967X&quot;,&quot;issued&quot;:{&quot;date-parts&quot;:[[2012]]},&quot;page&quot;:&quot;155-166&quot;,&quot;issue&quot;:&quot;2&quot;,&quot;volume&quot;:&quot;28&quot;,&quot;container-title-short&quot;:&quot;&quot;},&quot;isTemporary&quot;:false}]},{&quot;citationID&quot;:&quot;MENDELEY_CITATION_0bb2aa4c-3392-4aff-8273-f70e9cc73e68&quot;,&quot;properties&quot;:{&quot;noteIndex&quot;:0},&quot;isEdited&quot;:false,&quot;manualOverride&quot;:{&quot;isManuallyOverridden&quot;:false,&quot;citeprocText&quot;:&quot;[8]&quot;,&quot;manualOverrideText&quot;:&quot;&quot;},&quot;citationTag&quot;:&quot;MENDELEY_CITATION_v3_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&quot;,&quot;citationItems&quot;:[{&quot;id&quot;:&quot;1b97f332-ea00-3a32-b851-ac744ffe09c6&quot;,&quot;itemData&quot;:{&quot;type&quot;:&quot;article-journal&quot;,&quot;id&quot;:&quot;1b97f332-ea00-3a32-b851-ac744ffe09c6&quot;,&quot;title&quot;:&quot;Analisis Kemampuan Representasi Matematis Siswa&quot;,&quot;author&quot;:[{&quot;family&quot;:&quot;Ramanisa&quot;,&quot;given&quot;:&quot;Hartiwi&quot;,&quot;parse-names&quot;:false,&quot;dropping-particle&quot;:&quot;&quot;,&quot;non-dropping-particle&quot;:&quot;&quot;},{&quot;family&quot;:&quot;Khairudin&quot;,&quot;given&quot;:&quot;Khairudin&quot;,&quot;parse-names&quot;:false,&quot;dropping-particle&quot;:&quot;&quot;,&quot;non-dropping-particle&quot;:&quot;&quot;},{&quot;family&quot;:&quot;Netti&quot;,&quot;given&quot;:&quot;Syukma&quot;,&quot;parse-names&quot;:false,&quot;dropping-particle&quot;:&quot;&quot;,&quot;non-dropping-particle&quot;:&quot;&quot;}],&quot;container-title&quot;:&quot;Jurnal Magister Pendidikan Matematika (JUMADIKA)&quot;,&quot;ISSN&quot;:&quot;2684-8848&quot;,&quot;issued&quot;:{&quot;date-parts&quot;:[[2020]]},&quot;page&quot;:&quot;34-38&quot;,&quot;issue&quot;:&quot;1&quot;,&quot;volume&quot;:&quot;2&quot;,&quot;container-title-short&quot;:&quot;&quot;},&quot;isTemporary&quot;:false}]}]"/>
+    <we:property name="MENDELEY_CITATIONS_STYLE" value="{&quot;id&quot;:&quot;https://www.zotero.org/styles/ieee&quot;,&quot;title&quot;:&quot;IEEE&quot;,&quot;format&quot;:&quot;numeric&quot;,&quot;defaultLocale&quot;:null,&quot;isLocaleCodeValid&quot;:true}"/>
+  </we:properties>
+  <we:bindings/>
+  <we:snapshot xmlns:r="http://schemas.openxmlformats.org/officeDocument/2006/relationships"/>
+</we:webextension>
+</file>
+
 <file path=customXml/item1.xml><?xml version="1.0" encoding="utf-8"?>
 <b:Sources xmlns:b="http://schemas.openxmlformats.org/officeDocument/2006/bibliography" xmlns="http://schemas.openxmlformats.org/officeDocument/2006/bibliography" SelectedStyle="\APASixthEditionOfficeOnline.xsl" StyleName="APA" Version="6"/>
 </file>

</xml_diff>

<commit_message>
laporan mau selese. tinggal liat referensi label gambar sama lampiran di perpus TI. cek juga penomoran halamannya di perpus
</commit_message>
<xml_diff>
--- a/non-website/Laporan Akhir KP/2203040182 - Dhika Ramadhan Saputra - Laporan KP.docx
+++ b/non-website/Laporan Akhir KP/2203040182 - Dhika Ramadhan Saputra - Laporan KP.docx
@@ -177,7 +177,6 @@
           <w:szCs w:val="22"/>
         </w:rPr>
       </w:pPr>
-      <w:proofErr w:type="gramStart"/>
       <w:r>
         <w:rPr>
           <w:rFonts w:ascii="Times New Roman" w:hAnsi="Times New Roman" w:cs="Times New Roman"/>
@@ -200,16 +199,15 @@
           <w:sz w:val="22"/>
           <w:szCs w:val="22"/>
         </w:rPr>
-        <w:t>:</w:t>
-      </w:r>
-      <w:proofErr w:type="gramEnd"/>
+        <w:t>: Dhika Ramadhan Saputra</w:t>
+      </w:r>
       <w:r>
         <w:rPr>
           <w:rFonts w:ascii="Times New Roman" w:hAnsi="Times New Roman" w:cs="Times New Roman"/>
           <w:sz w:val="22"/>
           <w:szCs w:val="22"/>
         </w:rPr>
-        <w:t xml:space="preserve"> Dhika Ramadhan Saputra</w:t>
+        <w:br/>
       </w:r>
       <w:r>
         <w:rPr>
@@ -217,16 +215,15 @@
           <w:sz w:val="22"/>
           <w:szCs w:val="22"/>
         </w:rPr>
-        <w:br/>
-      </w:r>
-      <w:proofErr w:type="gramStart"/>
+        <w:t>NIM.</w:t>
+      </w:r>
       <w:r>
         <w:rPr>
           <w:rFonts w:ascii="Times New Roman" w:hAnsi="Times New Roman" w:cs="Times New Roman"/>
           <w:sz w:val="22"/>
           <w:szCs w:val="22"/>
         </w:rPr>
-        <w:t>NIM.</w:t>
+        <w:t xml:space="preserve">  </w:t>
       </w:r>
       <w:r>
         <w:rPr>
@@ -234,35 +231,18 @@
           <w:sz w:val="22"/>
           <w:szCs w:val="22"/>
         </w:rPr>
-        <w:t xml:space="preserve">  </w:t>
-      </w:r>
-      <w:r>
+        <w:t>: 2203040182</w:t>
+      </w:r>
+    </w:p>
+    <w:p>
+      <w:pPr>
+        <w:spacing w:line="360" w:lineRule="auto"/>
+        <w:ind w:left="2552"/>
         <w:rPr>
           <w:rFonts w:ascii="Times New Roman" w:hAnsi="Times New Roman" w:cs="Times New Roman"/>
           <w:sz w:val="22"/>
           <w:szCs w:val="22"/>
         </w:rPr>
-        <w:t>:</w:t>
-      </w:r>
-      <w:proofErr w:type="gramEnd"/>
-      <w:r>
-        <w:rPr>
-          <w:rFonts w:ascii="Times New Roman" w:hAnsi="Times New Roman" w:cs="Times New Roman"/>
-          <w:sz w:val="22"/>
-          <w:szCs w:val="22"/>
-        </w:rPr>
-        <w:t xml:space="preserve"> 2203040182</w:t>
-      </w:r>
-    </w:p>
-    <w:p>
-      <w:pPr>
-        <w:spacing w:line="360" w:lineRule="auto"/>
-        <w:ind w:left="2552"/>
-        <w:rPr>
-          <w:rFonts w:ascii="Times New Roman" w:hAnsi="Times New Roman" w:cs="Times New Roman"/>
-          <w:sz w:val="22"/>
-          <w:szCs w:val="22"/>
-        </w:rPr>
       </w:pPr>
     </w:p>
     <w:p>
@@ -694,21 +674,7 @@
         <w:rPr>
           <w:rFonts w:ascii="Times New Roman" w:hAnsi="Times New Roman" w:cs="Times New Roman"/>
         </w:rPr>
-        <w:t xml:space="preserve">Nomor pendaftaran, jalur masuk, tahun masuk, prodi pilihan 1, prodi pilihan 2, fakultas pilihan 1, fakultas pilihan 2, prodi diterima, fakultas prodi diterima, usia, asal SLTA, jurusan SLTA, alamat asal, alamat domisili, pendidikan ayah, pendidikan ibu, pekerjaan ibu, alamat orang </w:t>
-      </w:r>
-      <w:proofErr w:type="gramStart"/>
-      <w:r>
-        <w:rPr>
-          <w:rFonts w:ascii="Times New Roman" w:hAnsi="Times New Roman" w:cs="Times New Roman"/>
-        </w:rPr>
-        <w:t>tua,  dan</w:t>
-      </w:r>
-      <w:proofErr w:type="gramEnd"/>
-      <w:r>
-        <w:rPr>
-          <w:rFonts w:ascii="Times New Roman" w:hAnsi="Times New Roman" w:cs="Times New Roman"/>
-        </w:rPr>
-        <w:t xml:space="preserve"> Provinsi asal domisili</w:t>
+        <w:t>Nomor pendaftaran, jalur masuk, tahun masuk, prodi pilihan 1, prodi pilihan 2, fakultas pilihan 1, fakultas pilihan 2, prodi diterima, fakultas prodi diterima, usia, asal SLTA, jurusan SLTA, alamat asal, alamat domisili, pendidikan ayah, pendidikan ibu, pekerjaan ibu, alamat orang tua,  dan Provinsi asal domisili</w:t>
       </w:r>
       <w:r>
         <w:rPr>
@@ -4023,7 +3989,7 @@
             <w:rFonts w:ascii="Times New Roman" w:hAnsi="Times New Roman" w:cs="Times New Roman"/>
             <w:color w:val="000000"/>
           </w:rPr>
-          <w:tag w:val="MENDELEY_CITATION_v3_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"/>
+          <w:tag w:val="MENDELEY_CITATION_v3_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"/>
           <w:id w:val="1204055513"/>
           <w:placeholder>
             <w:docPart w:val="DefaultPlaceholder_-1854013440"/>
@@ -4032,10 +3998,10 @@
         <w:sdtContent>
           <w:r>
             <w:rPr>
-              <w:rFonts w:ascii="Times New Roman" w:hAnsi="Times New Roman" w:cs="Times New Roman"/>
+              <w:rFonts w:eastAsia="Times New Roman"/>
               <w:color w:val="000000"/>
             </w:rPr>
-            <w:t>[1]</w:t>
+            <w:t>(Rosita &amp; Tannar, 2024)</w:t>
           </w:r>
         </w:sdtContent>
       </w:sdt>
@@ -4247,7 +4213,7 @@
           <w:noProof/>
         </w:rPr>
         <w:drawing>
-          <wp:inline distT="0" distB="0" distL="0" distR="0" wp14:anchorId="75188C27" wp14:editId="636C375C">
+          <wp:inline distT="0" distB="0" distL="0" distR="0" wp14:anchorId="75188C27" wp14:editId="13B82649">
             <wp:extent cx="4608000" cy="1698906"/>
             <wp:effectExtent l="19050" t="19050" r="21590" b="15875"/>
             <wp:docPr id="783286403" name="Picture 4"/>
@@ -4413,7 +4379,7 @@
             <w:rFonts w:ascii="Times New Roman" w:hAnsi="Times New Roman" w:cs="Times New Roman"/>
             <w:color w:val="000000"/>
           </w:rPr>
-          <w:tag w:val="MENDELEY_CITATION_v3_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"/>
+          <w:tag w:val="MENDELEY_CITATION_v3_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"/>
           <w:id w:val="-638184159"/>
           <w:placeholder>
             <w:docPart w:val="DefaultPlaceholder_-1854013440"/>
@@ -4425,7 +4391,7 @@
               <w:rFonts w:ascii="Times New Roman" w:hAnsi="Times New Roman" w:cs="Times New Roman"/>
               <w:color w:val="000000"/>
             </w:rPr>
-            <w:t>[2]</w:t>
+            <w:t>(Widaningsih, 2019)</w:t>
           </w:r>
         </w:sdtContent>
       </w:sdt>
@@ -4445,14 +4411,8 @@
         <w:rPr>
           <w:rFonts w:ascii="Times New Roman" w:hAnsi="Times New Roman" w:cs="Times New Roman"/>
         </w:rPr>
-        <w:t xml:space="preserve">Sesuai dengan </w:t>
-      </w:r>
-      <w:r>
-        <w:rPr>
-          <w:rFonts w:ascii="Times New Roman" w:hAnsi="Times New Roman" w:cs="Times New Roman"/>
-        </w:rPr>
         <w:lastRenderedPageBreak/>
-        <w:t>gambaran umum proyek,</w:t>
+        <w:t>Sesuai dengan gambaran umum proyek,</w:t>
       </w:r>
       <w:r>
         <w:rPr>
@@ -4526,7 +4486,7 @@
             <w:rFonts w:ascii="Times New Roman" w:hAnsi="Times New Roman" w:cs="Times New Roman"/>
             <w:color w:val="000000"/>
           </w:rPr>
-          <w:tag w:val="MENDELEY_CITATION_v3_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"/>
+          <w:tag w:val="MENDELEY_CITATION_v3_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"/>
           <w:id w:val="-424886347"/>
           <w:placeholder>
             <w:docPart w:val="DefaultPlaceholder_-1854013440"/>
@@ -4535,10 +4495,10 @@
         <w:sdtContent>
           <w:r>
             <w:rPr>
-              <w:rFonts w:ascii="Times New Roman" w:hAnsi="Times New Roman" w:cs="Times New Roman"/>
+              <w:rFonts w:eastAsia="Times New Roman"/>
               <w:color w:val="000000"/>
             </w:rPr>
-            <w:t>[3]</w:t>
+            <w:t>(Seda et al., 2020)</w:t>
           </w:r>
         </w:sdtContent>
       </w:sdt>
@@ -4622,7 +4582,7 @@
           <w:noProof/>
         </w:rPr>
         <w:drawing>
-          <wp:inline distT="0" distB="0" distL="0" distR="0" wp14:anchorId="02EBA956" wp14:editId="0BF57A94">
+          <wp:inline distT="0" distB="0" distL="0" distR="0" wp14:anchorId="02EBA956" wp14:editId="1CE4E1D3">
             <wp:extent cx="3888000" cy="2160000"/>
             <wp:effectExtent l="19050" t="19050" r="17780" b="12065"/>
             <wp:docPr id="102117401" name="Picture 5"/>
@@ -4913,7 +4873,7 @@
           <w:noProof/>
         </w:rPr>
         <w:drawing>
-          <wp:inline distT="0" distB="0" distL="0" distR="0" wp14:anchorId="7A542151" wp14:editId="217E7905">
+          <wp:inline distT="0" distB="0" distL="0" distR="0" wp14:anchorId="7A542151" wp14:editId="11B9B86D">
             <wp:extent cx="3418966" cy="1800000"/>
             <wp:effectExtent l="19050" t="19050" r="10160" b="10160"/>
             <wp:docPr id="1182821816" name="Picture 3"/>
@@ -5002,7 +4962,7 @@
         </w:rPr>
         <w:lastRenderedPageBreak/>
         <w:drawing>
-          <wp:inline distT="0" distB="0" distL="0" distR="0" wp14:anchorId="3D1861C2" wp14:editId="753586BA">
+          <wp:inline distT="0" distB="0" distL="0" distR="0" wp14:anchorId="3D1861C2" wp14:editId="180BA4B0">
             <wp:extent cx="2176464" cy="2160000"/>
             <wp:effectExtent l="19050" t="19050" r="14605" b="12065"/>
             <wp:docPr id="471594841" name="Picture 1"/>
@@ -5493,7 +5453,7 @@
             <w:rFonts w:ascii="Times New Roman" w:hAnsi="Times New Roman" w:cs="Times New Roman"/>
             <w:color w:val="000000"/>
           </w:rPr>
-          <w:tag w:val="MENDELEY_CITATION_v3_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"/>
+          <w:tag w:val="MENDELEY_CITATION_v3_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"/>
           <w:id w:val="-93795661"/>
           <w:placeholder>
             <w:docPart w:val="DefaultPlaceholder_-1854013440"/>
@@ -5502,10 +5462,10 @@
         <w:sdtContent>
           <w:r>
             <w:rPr>
-              <w:rFonts w:ascii="Times New Roman" w:hAnsi="Times New Roman" w:cs="Times New Roman"/>
+              <w:rFonts w:eastAsia="Times New Roman"/>
               <w:color w:val="000000"/>
             </w:rPr>
-            <w:t>[4]</w:t>
+            <w:t>(Hanifah &amp; Nasution, 2025)</w:t>
           </w:r>
         </w:sdtContent>
       </w:sdt>
@@ -5519,14 +5479,8 @@
         <w:rPr>
           <w:rFonts w:ascii="Times New Roman" w:hAnsi="Times New Roman" w:cs="Times New Roman"/>
         </w:rPr>
-        <w:t xml:space="preserve">Tujuan dari proses ini adalah </w:t>
-      </w:r>
-      <w:r>
-        <w:rPr>
-          <w:rFonts w:ascii="Times New Roman" w:hAnsi="Times New Roman" w:cs="Times New Roman"/>
-        </w:rPr>
         <w:lastRenderedPageBreak/>
-        <w:t xml:space="preserve">untuk mengetahui </w:t>
+        <w:t xml:space="preserve">Tujuan dari proses ini adalah untuk mengetahui </w:t>
       </w:r>
       <w:r>
         <w:rPr>
@@ -5778,7 +5732,6 @@
           <w:rFonts w:ascii="Times New Roman" w:hAnsi="Times New Roman" w:cs="Times New Roman"/>
         </w:rPr>
       </w:pPr>
-      <w:proofErr w:type="gramStart"/>
       <w:r>
         <w:rPr>
           <w:rFonts w:ascii="Times New Roman" w:hAnsi="Times New Roman" w:cs="Times New Roman"/>
@@ -5793,14 +5746,17 @@
           <w:i/>
           <w:iCs/>
         </w:rPr>
-        <w:t>issing  value</w:t>
-      </w:r>
-      <w:proofErr w:type="gramEnd"/>
-      <w:r>
-        <w:rPr>
-          <w:rFonts w:ascii="Times New Roman" w:hAnsi="Times New Roman" w:cs="Times New Roman"/>
-          <w:i/>
-          <w:iCs/>
+        <w:t xml:space="preserve">issing  value </w:t>
+      </w:r>
+      <w:r>
+        <w:rPr>
+          <w:rFonts w:ascii="Times New Roman" w:hAnsi="Times New Roman" w:cs="Times New Roman"/>
+        </w:rPr>
+        <w:t xml:space="preserve"> adalah  satu  kondisi  dimana  terdapat  nilai  yang  tidak</w:t>
+      </w:r>
+      <w:r>
+        <w:rPr>
+          <w:rFonts w:ascii="Times New Roman" w:hAnsi="Times New Roman" w:cs="Times New Roman"/>
         </w:rPr>
         <w:t xml:space="preserve"> </w:t>
       </w:r>
@@ -5808,114 +5764,8 @@
         <w:rPr>
           <w:rFonts w:ascii="Times New Roman" w:hAnsi="Times New Roman" w:cs="Times New Roman"/>
         </w:rPr>
-        <w:t xml:space="preserve"> </w:t>
-      </w:r>
-      <w:proofErr w:type="gramStart"/>
-      <w:r>
-        <w:rPr>
-          <w:rFonts w:ascii="Times New Roman" w:hAnsi="Times New Roman" w:cs="Times New Roman"/>
-        </w:rPr>
-        <w:t>adalah  satu</w:t>
-      </w:r>
-      <w:proofErr w:type="gramEnd"/>
-      <w:r>
-        <w:rPr>
-          <w:rFonts w:ascii="Times New Roman" w:hAnsi="Times New Roman" w:cs="Times New Roman"/>
-        </w:rPr>
-        <w:t xml:space="preserve">  </w:t>
-      </w:r>
-      <w:proofErr w:type="gramStart"/>
-      <w:r>
-        <w:rPr>
-          <w:rFonts w:ascii="Times New Roman" w:hAnsi="Times New Roman" w:cs="Times New Roman"/>
-        </w:rPr>
-        <w:t>kondisi  dimana</w:t>
-      </w:r>
-      <w:proofErr w:type="gramEnd"/>
-      <w:r>
-        <w:rPr>
-          <w:rFonts w:ascii="Times New Roman" w:hAnsi="Times New Roman" w:cs="Times New Roman"/>
-        </w:rPr>
-        <w:t xml:space="preserve">  </w:t>
-      </w:r>
-      <w:proofErr w:type="gramStart"/>
-      <w:r>
-        <w:rPr>
-          <w:rFonts w:ascii="Times New Roman" w:hAnsi="Times New Roman" w:cs="Times New Roman"/>
-        </w:rPr>
-        <w:t>terdapat  nilai</w:t>
-      </w:r>
-      <w:proofErr w:type="gramEnd"/>
-      <w:r>
-        <w:rPr>
-          <w:rFonts w:ascii="Times New Roman" w:hAnsi="Times New Roman" w:cs="Times New Roman"/>
-        </w:rPr>
-        <w:t xml:space="preserve">  </w:t>
-      </w:r>
-      <w:proofErr w:type="gramStart"/>
-      <w:r>
-        <w:rPr>
-          <w:rFonts w:ascii="Times New Roman" w:hAnsi="Times New Roman" w:cs="Times New Roman"/>
-        </w:rPr>
-        <w:t>yang  tidak</w:t>
-      </w:r>
-      <w:proofErr w:type="gramEnd"/>
-      <w:r>
-        <w:rPr>
-          <w:rFonts w:ascii="Times New Roman" w:hAnsi="Times New Roman" w:cs="Times New Roman"/>
-        </w:rPr>
-        <w:t xml:space="preserve"> </w:t>
-      </w:r>
-      <w:proofErr w:type="gramStart"/>
-      <w:r>
-        <w:rPr>
-          <w:rFonts w:ascii="Times New Roman" w:hAnsi="Times New Roman" w:cs="Times New Roman"/>
-        </w:rPr>
-        <w:t>lengkap  atau</w:t>
-      </w:r>
-      <w:proofErr w:type="gramEnd"/>
-      <w:r>
-        <w:rPr>
-          <w:rFonts w:ascii="Times New Roman" w:hAnsi="Times New Roman" w:cs="Times New Roman"/>
-        </w:rPr>
-        <w:t xml:space="preserve">  </w:t>
-      </w:r>
-      <w:proofErr w:type="gramStart"/>
-      <w:r>
-        <w:rPr>
-          <w:rFonts w:ascii="Times New Roman" w:hAnsi="Times New Roman" w:cs="Times New Roman"/>
-        </w:rPr>
-        <w:t>kosong  pada</w:t>
-      </w:r>
-      <w:proofErr w:type="gramEnd"/>
-      <w:r>
-        <w:rPr>
-          <w:rFonts w:ascii="Times New Roman" w:hAnsi="Times New Roman" w:cs="Times New Roman"/>
-        </w:rPr>
-        <w:t xml:space="preserve">  </w:t>
-      </w:r>
-      <w:proofErr w:type="gramStart"/>
-      <w:r>
-        <w:rPr>
-          <w:rFonts w:ascii="Times New Roman" w:hAnsi="Times New Roman" w:cs="Times New Roman"/>
-        </w:rPr>
-        <w:t>satu  atau</w:t>
-      </w:r>
-      <w:proofErr w:type="gramEnd"/>
-      <w:r>
-        <w:rPr>
-          <w:rFonts w:ascii="Times New Roman" w:hAnsi="Times New Roman" w:cs="Times New Roman"/>
-        </w:rPr>
-        <w:t xml:space="preserve">  </w:t>
-      </w:r>
-      <w:proofErr w:type="gramStart"/>
-      <w:r>
-        <w:rPr>
-          <w:rFonts w:ascii="Times New Roman" w:hAnsi="Times New Roman" w:cs="Times New Roman"/>
-        </w:rPr>
-        <w:t>beberapa  kriteria</w:t>
-      </w:r>
-      <w:proofErr w:type="gramEnd"/>
+        <w:t>lengkap  atau  kosong  pada  satu  atau  beberapa  kriteria</w:t>
+      </w:r>
       <w:r>
         <w:rPr>
           <w:rFonts w:ascii="Times New Roman" w:hAnsi="Times New Roman" w:cs="Times New Roman"/>
@@ -5928,7 +5778,7 @@
             <w:rFonts w:ascii="Times New Roman" w:hAnsi="Times New Roman" w:cs="Times New Roman"/>
             <w:color w:val="000000"/>
           </w:rPr>
-          <w:tag w:val="MENDELEY_CITATION_v3_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"/>
+          <w:tag w:val="MENDELEY_CITATION_v3_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"/>
           <w:id w:val="-1331597668"/>
           <w:placeholder>
             <w:docPart w:val="DefaultPlaceholder_-1854013440"/>
@@ -5937,10 +5787,10 @@
         <w:sdtContent>
           <w:r>
             <w:rPr>
-              <w:rFonts w:ascii="Times New Roman" w:hAnsi="Times New Roman" w:cs="Times New Roman"/>
+              <w:rFonts w:eastAsia="Times New Roman"/>
               <w:color w:val="000000"/>
             </w:rPr>
-            <w:t>[5]</w:t>
+            <w:t>(Sudrajat &amp; Cholid, 2023)</w:t>
           </w:r>
         </w:sdtContent>
       </w:sdt>
@@ -5960,14 +5810,14 @@
         <w:rPr>
           <w:rFonts w:ascii="Times New Roman" w:hAnsi="Times New Roman" w:cs="Times New Roman"/>
         </w:rPr>
-        <w:t xml:space="preserve">Tujuan dari proses ini adalah untuk mengetahui bagian mana </w:t>
+        <w:t xml:space="preserve">Tujuan dari proses ini adalah untuk </w:t>
       </w:r>
       <w:r>
         <w:rPr>
           <w:rFonts w:ascii="Times New Roman" w:hAnsi="Times New Roman" w:cs="Times New Roman"/>
         </w:rPr>
         <w:lastRenderedPageBreak/>
-        <w:t xml:space="preserve">saja yang terdapat </w:t>
+        <w:t xml:space="preserve">mengetahui bagian mana saja yang terdapat </w:t>
       </w:r>
       <w:r>
         <w:rPr>
@@ -6636,7 +6486,7 @@
             <w:rFonts w:ascii="Times New Roman" w:hAnsi="Times New Roman" w:cs="Times New Roman"/>
             <w:color w:val="000000"/>
           </w:rPr>
-          <w:tag w:val="MENDELEY_CITATION_v3_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"/>
+          <w:tag w:val="MENDELEY_CITATION_v3_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"/>
           <w:id w:val="2067759511"/>
           <w:placeholder>
             <w:docPart w:val="DefaultPlaceholder_-1854013440"/>
@@ -6645,10 +6495,10 @@
         <w:sdtContent>
           <w:r>
             <w:rPr>
-              <w:rFonts w:ascii="Times New Roman" w:hAnsi="Times New Roman" w:cs="Times New Roman"/>
+              <w:rFonts w:eastAsia="Times New Roman"/>
               <w:color w:val="000000"/>
             </w:rPr>
-            <w:t>[6]</w:t>
+            <w:t>(Turyadi &amp; Kusnandar, n.d.)</w:t>
           </w:r>
         </w:sdtContent>
       </w:sdt>
@@ -7084,7 +6934,7 @@
         </w:rPr>
         <w:lastRenderedPageBreak/>
         <w:drawing>
-          <wp:inline distT="0" distB="0" distL="0" distR="0" wp14:anchorId="5EBC01C6" wp14:editId="330C2D60">
+          <wp:inline distT="0" distB="0" distL="0" distR="0" wp14:anchorId="5EBC01C6" wp14:editId="0BD8D262">
             <wp:extent cx="4320000" cy="4658802"/>
             <wp:effectExtent l="0" t="0" r="4445" b="8890"/>
             <wp:docPr id="1878337612" name="Picture 9"/>
@@ -7174,7 +7024,7 @@
           <w:noProof/>
         </w:rPr>
         <w:drawing>
-          <wp:inline distT="0" distB="0" distL="0" distR="0" wp14:anchorId="733B8FED" wp14:editId="38F8922A">
+          <wp:inline distT="0" distB="0" distL="0" distR="0" wp14:anchorId="733B8FED" wp14:editId="4E902B45">
             <wp:extent cx="4320000" cy="2058826"/>
             <wp:effectExtent l="0" t="0" r="4445" b="0"/>
             <wp:docPr id="55094509" name="Picture 10"/>
@@ -7355,7 +7205,7 @@
           <w:noProof/>
         </w:rPr>
         <w:drawing>
-          <wp:inline distT="0" distB="0" distL="0" distR="0" wp14:anchorId="314D0ACC" wp14:editId="5AC0FEB7">
+          <wp:inline distT="0" distB="0" distL="0" distR="0" wp14:anchorId="314D0ACC" wp14:editId="66EA88D4">
             <wp:extent cx="4320000" cy="2070296"/>
             <wp:effectExtent l="0" t="0" r="4445" b="6350"/>
             <wp:docPr id="1341359440" name="Picture 12"/>
@@ -8241,7 +8091,7 @@
             <w:rFonts w:ascii="Times New Roman" w:hAnsi="Times New Roman" w:cs="Times New Roman"/>
             <w:color w:val="000000"/>
           </w:rPr>
-          <w:tag w:val="MENDELEY_CITATION_v3_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"/>
+          <w:tag w:val="MENDELEY_CITATION_v3_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"/>
           <w:id w:val="98221524"/>
           <w:placeholder>
             <w:docPart w:val="DefaultPlaceholder_-1854013440"/>
@@ -8253,7 +8103,7 @@
               <w:rFonts w:ascii="Times New Roman" w:hAnsi="Times New Roman" w:cs="Times New Roman"/>
               <w:color w:val="000000"/>
             </w:rPr>
-            <w:t>[7]</w:t>
+            <w:t>(Sulasmono, 2012)</w:t>
           </w:r>
         </w:sdtContent>
       </w:sdt>
@@ -8301,20 +8151,14 @@
           <w:i/>
           <w:iCs/>
         </w:rPr>
+        <w:lastRenderedPageBreak/>
         <w:t>problem solving</w:t>
       </w:r>
       <w:r>
         <w:rPr>
           <w:rFonts w:ascii="Times New Roman" w:hAnsi="Times New Roman" w:cs="Times New Roman"/>
         </w:rPr>
-        <w:t xml:space="preserve">, tahap validasi </w:t>
-      </w:r>
-      <w:r>
-        <w:rPr>
-          <w:rFonts w:ascii="Times New Roman" w:hAnsi="Times New Roman" w:cs="Times New Roman"/>
-        </w:rPr>
-        <w:lastRenderedPageBreak/>
-        <w:t xml:space="preserve">dilakukan lagi untuk memastikan </w:t>
+        <w:t xml:space="preserve">, tahap validasi dilakukan lagi untuk memastikan </w:t>
       </w:r>
       <w:r>
         <w:rPr>
@@ -10149,7 +9993,7 @@
             <w:rFonts w:ascii="Times New Roman" w:hAnsi="Times New Roman" w:cs="Times New Roman"/>
             <w:color w:val="000000"/>
           </w:rPr>
-          <w:tag w:val="MENDELEY_CITATION_v3_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"/>
+          <w:tag w:val="MENDELEY_CITATION_v3_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"/>
           <w:id w:val="124049964"/>
           <w:placeholder>
             <w:docPart w:val="DefaultPlaceholder_-1854013440"/>
@@ -10161,7 +10005,7 @@
               <w:rFonts w:ascii="Times New Roman" w:hAnsi="Times New Roman" w:cs="Times New Roman"/>
               <w:color w:val="000000"/>
             </w:rPr>
-            <w:t>[8]</w:t>
+            <w:t>(Ramanisa et al., 2020)</w:t>
           </w:r>
         </w:sdtContent>
       </w:sdt>
@@ -10217,8 +10061,16 @@
           <w:ilvl w:val="0"/>
           <w:numId w:val="19"/>
         </w:numPr>
-      </w:pPr>
-      <w:r>
+        <w:rPr>
+          <w:i/>
+          <w:iCs/>
+        </w:rPr>
+      </w:pPr>
+      <w:r>
+        <w:rPr>
+          <w:i/>
+          <w:iCs/>
+        </w:rPr>
         <w:t>Brainstorming</w:t>
       </w:r>
     </w:p>
@@ -10237,32 +10089,55 @@
           <w:rFonts w:ascii="Times New Roman" w:hAnsi="Times New Roman" w:cs="Times New Roman"/>
           <w:i/>
           <w:iCs/>
-          <w:color w:val="FF0000"/>
         </w:rPr>
         <w:t>Brainstorming</w:t>
       </w:r>
       <w:r>
         <w:rPr>
           <w:rFonts w:ascii="Times New Roman" w:hAnsi="Times New Roman" w:cs="Times New Roman"/>
-          <w:color w:val="FF0000"/>
-        </w:rPr>
-        <w:t xml:space="preserve"> adalah </w:t>
-      </w:r>
-      <w:proofErr w:type="gramStart"/>
-      <w:r>
-        <w:rPr>
-          <w:rFonts w:ascii="Times New Roman" w:hAnsi="Times New Roman" w:cs="Times New Roman"/>
-          <w:color w:val="FF0000"/>
-        </w:rPr>
-        <w:t xml:space="preserve">… </w:t>
-      </w:r>
+        </w:rPr>
+        <w:t xml:space="preserve"> </w:t>
+      </w:r>
+      <w:r>
+        <w:rPr>
+          <w:rFonts w:ascii="Times New Roman" w:hAnsi="Times New Roman" w:cs="Times New Roman"/>
+        </w:rPr>
+        <w:t>merupakan sebuah metode yang digunakan untuk membangkitkan sejumlah besar ide-ide</w:t>
+      </w:r>
+      <w:r>
+        <w:rPr>
+          <w:rFonts w:ascii="Times New Roman" w:hAnsi="Times New Roman" w:cs="Times New Roman"/>
+        </w:rPr>
+        <w:t xml:space="preserve"> </w:t>
+      </w:r>
+      <w:sdt>
+        <w:sdtPr>
+          <w:rPr>
+            <w:rFonts w:ascii="Times New Roman" w:hAnsi="Times New Roman" w:cs="Times New Roman"/>
+            <w:color w:val="000000"/>
+          </w:rPr>
+          <w:tag w:val="MENDELEY_CITATION_v3_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"/>
+          <w:id w:val="-1468500962"/>
+          <w:placeholder>
+            <w:docPart w:val="DefaultPlaceholder_-1854013440"/>
+          </w:placeholder>
+        </w:sdtPr>
+        <w:sdtContent>
+          <w:r>
+            <w:rPr>
+              <w:rFonts w:eastAsia="Times New Roman"/>
+              <w:color w:val="000000"/>
+            </w:rPr>
+            <w:t>(Matondang et al., 2020)</w:t>
+          </w:r>
+        </w:sdtContent>
+      </w:sdt>
       <w:r>
         <w:rPr>
           <w:rFonts w:ascii="Times New Roman" w:hAnsi="Times New Roman" w:cs="Times New Roman"/>
         </w:rPr>
         <w:t>.</w:t>
       </w:r>
-      <w:proofErr w:type="gramEnd"/>
       <w:r>
         <w:rPr>
           <w:rFonts w:ascii="Times New Roman" w:hAnsi="Times New Roman" w:cs="Times New Roman"/>
@@ -10461,6 +10336,7 @@
         <w:rPr>
           <w:rFonts w:ascii="Times New Roman" w:hAnsi="Times New Roman" w:cs="Times New Roman"/>
         </w:rPr>
+        <w:lastRenderedPageBreak/>
         <w:t>Bagaimana jumlah distribusi mahasiswa baru per-fakultas?</w:t>
       </w:r>
     </w:p>
@@ -10481,7 +10357,6 @@
         <w:rPr>
           <w:rFonts w:ascii="Times New Roman" w:hAnsi="Times New Roman" w:cs="Times New Roman"/>
         </w:rPr>
-        <w:lastRenderedPageBreak/>
         <w:t>Program studi apa yang paling diminati mahasiswa baru?</w:t>
       </w:r>
     </w:p>
@@ -10654,37 +10529,42 @@
       <w:r>
         <w:rPr>
           <w:rFonts w:ascii="Times New Roman" w:hAnsi="Times New Roman" w:cs="Times New Roman"/>
-          <w:color w:val="FF0000"/>
-        </w:rPr>
-        <w:t>Visualisasi</w:t>
-      </w:r>
-      <w:r>
-        <w:rPr>
-          <w:rFonts w:ascii="Times New Roman" w:hAnsi="Times New Roman" w:cs="Times New Roman"/>
-          <w:color w:val="FF0000"/>
-        </w:rPr>
-        <w:t xml:space="preserve"> adalah </w:t>
-      </w:r>
-      <w:proofErr w:type="gramStart"/>
-      <w:r>
-        <w:rPr>
-          <w:rFonts w:ascii="Times New Roman" w:hAnsi="Times New Roman" w:cs="Times New Roman"/>
-          <w:color w:val="FF0000"/>
-        </w:rPr>
-        <w:t xml:space="preserve">… </w:t>
-      </w:r>
-      <w:r>
-        <w:rPr>
-          <w:rFonts w:ascii="Times New Roman" w:hAnsi="Times New Roman" w:cs="Times New Roman"/>
-        </w:rPr>
-        <w:t>.</w:t>
-      </w:r>
-      <w:proofErr w:type="gramEnd"/>
-      <w:r>
-        <w:rPr>
-          <w:rFonts w:ascii="Times New Roman" w:hAnsi="Times New Roman" w:cs="Times New Roman"/>
-        </w:rPr>
-        <w:t xml:space="preserve"> Proses visualisasi pada proyek ini dilakukan dengan </w:t>
+        </w:rPr>
+        <w:t>Visualisasi data merupakan suatu teknik dasar yang digunakan untuk mengkomunikasikan informasi secara jelas dan efisien kepada pengguna lewat penyajian data dalam bentuk visual</w:t>
+      </w:r>
+      <w:r>
+        <w:rPr>
+          <w:rFonts w:ascii="Times New Roman" w:hAnsi="Times New Roman" w:cs="Times New Roman"/>
+        </w:rPr>
+        <w:t xml:space="preserve"> </w:t>
+      </w:r>
+      <w:sdt>
+        <w:sdtPr>
+          <w:rPr>
+            <w:rFonts w:ascii="Times New Roman" w:hAnsi="Times New Roman" w:cs="Times New Roman"/>
+            <w:color w:val="000000"/>
+          </w:rPr>
+          <w:tag w:val="MENDELEY_CITATION_v3_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"/>
+          <w:id w:val="2019575913"/>
+          <w:placeholder>
+            <w:docPart w:val="DefaultPlaceholder_-1854013440"/>
+          </w:placeholder>
+        </w:sdtPr>
+        <w:sdtContent>
+          <w:r>
+            <w:rPr>
+              <w:rFonts w:eastAsia="Times New Roman"/>
+              <w:color w:val="000000"/>
+            </w:rPr>
+            <w:t>(Mulyani &amp; Kartini, 2023)</w:t>
+          </w:r>
+        </w:sdtContent>
+      </w:sdt>
+      <w:r>
+        <w:rPr>
+          <w:rFonts w:ascii="Times New Roman" w:hAnsi="Times New Roman" w:cs="Times New Roman"/>
+        </w:rPr>
+        <w:t xml:space="preserve">. Proses visualisasi pada proyek ini dilakukan dengan </w:t>
       </w:r>
       <w:r>
         <w:rPr>
@@ -10989,6 +10869,8 @@
       <w:pPr>
         <w:pStyle w:val="ListParagraph"/>
         <w:spacing w:line="480" w:lineRule="auto"/>
+        <w:ind w:firstLine="720"/>
+        <w:jc w:val="both"/>
         <w:rPr>
           <w:rFonts w:ascii="Times New Roman" w:hAnsi="Times New Roman" w:cs="Times New Roman"/>
         </w:rPr>
@@ -11005,21 +10887,41 @@
         <w:rPr>
           <w:rFonts w:ascii="Times New Roman" w:hAnsi="Times New Roman" w:cs="Times New Roman"/>
         </w:rPr>
-        <w:t xml:space="preserve"> adalah …</w:t>
-      </w:r>
-      <w:proofErr w:type="gramStart"/>
-      <w:r>
-        <w:rPr>
-          <w:rFonts w:ascii="Times New Roman" w:hAnsi="Times New Roman" w:cs="Times New Roman"/>
-        </w:rPr>
-        <w:t>. .</w:t>
-      </w:r>
-      <w:proofErr w:type="gramEnd"/>
-      <w:r>
-        <w:rPr>
-          <w:rFonts w:ascii="Times New Roman" w:hAnsi="Times New Roman" w:cs="Times New Roman"/>
-        </w:rPr>
-        <w:t xml:space="preserve"> Selain untuk menampung </w:t>
+        <w:t xml:space="preserve"> merupakan bagian spesifik dari situs web yang menampilkan informasi terfokus</w:t>
+      </w:r>
+      <w:r>
+        <w:rPr>
+          <w:rFonts w:ascii="Times New Roman" w:hAnsi="Times New Roman" w:cs="Times New Roman"/>
+        </w:rPr>
+        <w:t xml:space="preserve"> </w:t>
+      </w:r>
+      <w:sdt>
+        <w:sdtPr>
+          <w:rPr>
+            <w:rFonts w:ascii="Times New Roman" w:hAnsi="Times New Roman" w:cs="Times New Roman"/>
+            <w:color w:val="000000"/>
+          </w:rPr>
+          <w:tag w:val="MENDELEY_CITATION_v3_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"/>
+          <w:id w:val="-31502255"/>
+          <w:placeholder>
+            <w:docPart w:val="DefaultPlaceholder_-1854013440"/>
+          </w:placeholder>
+        </w:sdtPr>
+        <w:sdtContent>
+          <w:r>
+            <w:rPr>
+              <w:rFonts w:eastAsia="Times New Roman"/>
+              <w:color w:val="000000"/>
+            </w:rPr>
+            <w:t>(Hismawan &amp; Izaak, 2023)</w:t>
+          </w:r>
+        </w:sdtContent>
+      </w:sdt>
+      <w:r>
+        <w:rPr>
+          <w:rFonts w:ascii="Times New Roman" w:hAnsi="Times New Roman" w:cs="Times New Roman"/>
+        </w:rPr>
+        <w:t xml:space="preserve">. Selain untuk menampung </w:t>
       </w:r>
       <w:r>
         <w:rPr>
@@ -11127,6 +11029,7 @@
           <w:i/>
           <w:iCs/>
         </w:rPr>
+        <w:lastRenderedPageBreak/>
         <w:t>Landing page</w:t>
       </w:r>
       <w:r>
@@ -11179,7 +11082,6 @@
           <w:i/>
           <w:iCs/>
         </w:rPr>
-        <w:lastRenderedPageBreak/>
         <w:t>Brainstorming</w:t>
       </w:r>
     </w:p>
@@ -11563,6 +11465,7 @@
         <w:rPr>
           <w:rFonts w:ascii="Times New Roman" w:hAnsi="Times New Roman" w:cs="Times New Roman"/>
         </w:rPr>
+        <w:lastRenderedPageBreak/>
         <w:t>Bar navigasi</w:t>
       </w:r>
     </w:p>
@@ -11586,14 +11489,7 @@
         <w:rPr>
           <w:rFonts w:ascii="Times New Roman" w:hAnsi="Times New Roman" w:cs="Times New Roman"/>
         </w:rPr>
-        <w:t xml:space="preserve">. Bar navigasi terdiri dari 3 </w:t>
-      </w:r>
-      <w:r>
-        <w:rPr>
-          <w:rFonts w:ascii="Times New Roman" w:hAnsi="Times New Roman" w:cs="Times New Roman"/>
-        </w:rPr>
-        <w:lastRenderedPageBreak/>
-        <w:t xml:space="preserve">tombol: </w:t>
+        <w:t xml:space="preserve">. Bar navigasi terdiri dari 3 tombol: </w:t>
       </w:r>
       <w:r>
         <w:rPr>
@@ -11812,6 +11708,7 @@
           <w:rFonts w:ascii="Times New Roman" w:hAnsi="Times New Roman" w:cs="Times New Roman"/>
           <w:noProof/>
         </w:rPr>
+        <w:lastRenderedPageBreak/>
         <w:drawing>
           <wp:inline distT="0" distB="0" distL="0" distR="0" wp14:anchorId="36A105A2" wp14:editId="23421EE3">
             <wp:extent cx="3960000" cy="2106500"/>
@@ -11927,7 +11824,6 @@
         <w:rPr>
           <w:rFonts w:ascii="Times New Roman" w:hAnsi="Times New Roman" w:cs="Times New Roman"/>
         </w:rPr>
-        <w:lastRenderedPageBreak/>
         <w:t>Bagian ini dirancang untuk menampung permasalahan, tujuan, dan manfaat proyek ini secara singkat</w:t>
       </w:r>
       <w:r>
@@ -12107,6 +12003,7 @@
           <w:rFonts w:ascii="Times New Roman" w:hAnsi="Times New Roman" w:cs="Times New Roman"/>
           <w:noProof/>
         </w:rPr>
+        <w:lastRenderedPageBreak/>
         <w:drawing>
           <wp:inline distT="0" distB="0" distL="0" distR="0" wp14:anchorId="77902E91" wp14:editId="03D86B52">
             <wp:extent cx="3960000" cy="2104500"/>
@@ -12232,7 +12129,6 @@
         <w:rPr>
           <w:rFonts w:ascii="Times New Roman" w:hAnsi="Times New Roman" w:cs="Times New Roman"/>
         </w:rPr>
-        <w:lastRenderedPageBreak/>
         <w:t xml:space="preserve">Bagian ini dirancang untuk memberikan beberapa </w:t>
       </w:r>
       <w:r>
@@ -12402,6 +12298,7 @@
           <w:rFonts w:ascii="Times New Roman" w:hAnsi="Times New Roman" w:cs="Times New Roman"/>
           <w:noProof/>
         </w:rPr>
+        <w:lastRenderedPageBreak/>
         <w:drawing>
           <wp:inline distT="0" distB="0" distL="0" distR="0" wp14:anchorId="7AE861B7" wp14:editId="63D5DAE5">
             <wp:extent cx="3960000" cy="2104500"/>
@@ -12511,7 +12408,6 @@
         <w:rPr>
           <w:rFonts w:ascii="Times New Roman" w:hAnsi="Times New Roman" w:cs="Times New Roman"/>
         </w:rPr>
-        <w:lastRenderedPageBreak/>
         <w:t>Bagian ini dirancang untuk menyampaikan ucapan terimakasih penulis kepada mitra proyek.</w:t>
       </w:r>
     </w:p>
@@ -12679,6 +12575,7 @@
           <w:rFonts w:ascii="Times New Roman" w:hAnsi="Times New Roman" w:cs="Times New Roman"/>
           <w:noProof/>
         </w:rPr>
+        <w:lastRenderedPageBreak/>
         <w:drawing>
           <wp:inline distT="0" distB="0" distL="0" distR="0" wp14:anchorId="72C625E9" wp14:editId="760EDE03">
             <wp:extent cx="3960000" cy="2104500"/>
@@ -12796,7 +12693,6 @@
         <w:rPr>
           <w:rFonts w:ascii="Times New Roman" w:hAnsi="Times New Roman" w:cs="Times New Roman"/>
         </w:rPr>
-        <w:lastRenderedPageBreak/>
         <w:t>Bar navigasi adalah tempat dimana tombol untuk berpindah halaman berada. Bar navigasi terdiri dari 3 tombol: tombol menuju halaman utama, Cara Membaca Dashboard, dan Dashboard Visualisasi.</w:t>
       </w:r>
     </w:p>
@@ -12922,6 +12818,7 @@
         <w:rPr>
           <w:rFonts w:ascii="Times New Roman" w:hAnsi="Times New Roman" w:cs="Times New Roman"/>
         </w:rPr>
+        <w:lastRenderedPageBreak/>
         <w:t>Bagian ini dirancang untuk menjelaskan cara membaca kedua dashboard visualisasi</w:t>
       </w:r>
       <w:r>
@@ -13044,7 +12941,6 @@
           <w:i/>
           <w:iCs/>
         </w:rPr>
-        <w:lastRenderedPageBreak/>
         <w:t>Matermark</w:t>
       </w:r>
       <w:r>
@@ -13165,6 +13061,7 @@
         <w:pStyle w:val="Heading3"/>
       </w:pPr>
       <w:r>
+        <w:lastRenderedPageBreak/>
         <w:t>B.</w:t>
       </w:r>
       <w:r>
@@ -13253,7 +13150,6 @@
           <w:i/>
           <w:iCs w:val="0"/>
         </w:rPr>
-        <w:lastRenderedPageBreak/>
         <w:t>Preprocessing</w:t>
       </w:r>
     </w:p>
@@ -13518,6 +13414,7 @@
         <w:pStyle w:val="Heading4"/>
       </w:pPr>
       <w:r>
+        <w:lastRenderedPageBreak/>
         <w:t>Pembuatan landing page</w:t>
       </w:r>
     </w:p>
@@ -13631,8 +13528,113 @@
       </w:r>
     </w:p>
     <w:p>
-      <w:r>
-        <w:t>sss</w:t>
+      <w:pPr>
+        <w:spacing w:line="480" w:lineRule="auto"/>
+        <w:ind w:firstLine="720"/>
+        <w:jc w:val="both"/>
+        <w:rPr>
+          <w:rFonts w:ascii="Times New Roman" w:hAnsi="Times New Roman" w:cs="Times New Roman"/>
+        </w:rPr>
+      </w:pPr>
+      <w:r>
+        <w:rPr>
+          <w:rFonts w:ascii="Times New Roman" w:hAnsi="Times New Roman" w:cs="Times New Roman"/>
+        </w:rPr>
+        <w:t xml:space="preserve">Berdasarkan pelaksanaan Kerja Praktik yang dilakukan di Biro Publikasi dan Admisi Universitas Muhammadiyah Purwokerto, dapat disimpulkan bahwa pembuatan </w:t>
+      </w:r>
+      <w:r>
+        <w:rPr>
+          <w:rFonts w:ascii="Times New Roman" w:hAnsi="Times New Roman" w:cs="Times New Roman"/>
+          <w:i/>
+          <w:iCs/>
+        </w:rPr>
+        <w:t>dashboard</w:t>
+      </w:r>
+      <w:r>
+        <w:rPr>
+          <w:rFonts w:ascii="Times New Roman" w:hAnsi="Times New Roman" w:cs="Times New Roman"/>
+        </w:rPr>
+        <w:t xml:space="preserve"> visualisasi data penerimaan mahasiswa baru periode 2014–2024 telah berhasil dilaksanakan sesuai dengan tujuan dan ruang lingkup yang telah ditetapkan. Proyek ini mampu menghasilkan </w:t>
+      </w:r>
+      <w:r>
+        <w:rPr>
+          <w:rFonts w:ascii="Times New Roman" w:hAnsi="Times New Roman" w:cs="Times New Roman"/>
+          <w:i/>
+          <w:iCs/>
+        </w:rPr>
+        <w:t>dashboard</w:t>
+      </w:r>
+      <w:r>
+        <w:rPr>
+          <w:rFonts w:ascii="Times New Roman" w:hAnsi="Times New Roman" w:cs="Times New Roman"/>
+        </w:rPr>
+        <w:t xml:space="preserve"> interaktif yang memudahkan pihak BPA UMP dalam menganalisis tren, distribusi, dan demografi mahasiswa baru secara informatif. Seluruh tahapan, mulai dari pengumpulan data, </w:t>
+      </w:r>
+      <w:r>
+        <w:rPr>
+          <w:rFonts w:ascii="Times New Roman" w:hAnsi="Times New Roman" w:cs="Times New Roman"/>
+          <w:i/>
+          <w:iCs/>
+        </w:rPr>
+        <w:t>pre-processing</w:t>
+      </w:r>
+      <w:r>
+        <w:rPr>
+          <w:rFonts w:ascii="Times New Roman" w:hAnsi="Times New Roman" w:cs="Times New Roman"/>
+        </w:rPr>
+        <w:t>, hingga</w:t>
+      </w:r>
+      <w:r>
+        <w:rPr>
+          <w:rFonts w:ascii="Times New Roman" w:hAnsi="Times New Roman" w:cs="Times New Roman"/>
+        </w:rPr>
+        <w:t xml:space="preserve"> </w:t>
+      </w:r>
+      <w:r>
+        <w:rPr>
+          <w:rFonts w:ascii="Times New Roman" w:hAnsi="Times New Roman" w:cs="Times New Roman"/>
+        </w:rPr>
+        <w:t>r</w:t>
+      </w:r>
+      <w:r>
+        <w:rPr>
+          <w:rFonts w:ascii="Times New Roman" w:hAnsi="Times New Roman" w:cs="Times New Roman"/>
+        </w:rPr>
+        <w:t>epresentasi</w:t>
+      </w:r>
+      <w:r>
+        <w:rPr>
+          <w:rFonts w:ascii="Times New Roman" w:hAnsi="Times New Roman" w:cs="Times New Roman"/>
+        </w:rPr>
+        <w:t xml:space="preserve">, berjalan dengan baik dan menghasilkan data yang bersih serta siap digunakan untuk pengambilan keputusan strategis. Selain itu, pembuatan </w:t>
+      </w:r>
+      <w:r>
+        <w:rPr>
+          <w:rFonts w:ascii="Times New Roman" w:hAnsi="Times New Roman" w:cs="Times New Roman"/>
+          <w:i/>
+          <w:iCs/>
+        </w:rPr>
+        <w:t>landing page</w:t>
+      </w:r>
+      <w:r>
+        <w:rPr>
+          <w:rFonts w:ascii="Times New Roman" w:hAnsi="Times New Roman" w:cs="Times New Roman"/>
+        </w:rPr>
+        <w:t xml:space="preserve"> sebagai panduan membaca </w:t>
+      </w:r>
+      <w:r>
+        <w:rPr>
+          <w:rFonts w:ascii="Times New Roman" w:hAnsi="Times New Roman" w:cs="Times New Roman"/>
+          <w:i/>
+          <w:iCs/>
+        </w:rPr>
+        <w:t>dashboard</w:t>
+      </w:r>
+      <w:r>
+        <w:rPr>
+          <w:rFonts w:ascii="Times New Roman" w:hAnsi="Times New Roman" w:cs="Times New Roman"/>
+        </w:rPr>
+        <w:t xml:space="preserve"> turut meningkatkan aksesibilitas dan pemahaman pengguna terhadap hasil visualisasi.</w:t>
       </w:r>
     </w:p>
     <w:p>
@@ -13647,10 +13649,605 @@
       </w:r>
     </w:p>
     <w:p>
-      <w:r>
-        <w:t>ssss</w:t>
-      </w:r>
-    </w:p>
+      <w:pPr>
+        <w:spacing w:line="480" w:lineRule="auto"/>
+        <w:ind w:firstLine="720"/>
+        <w:jc w:val="both"/>
+        <w:rPr>
+          <w:rFonts w:ascii="Times New Roman" w:hAnsi="Times New Roman" w:cs="Times New Roman"/>
+        </w:rPr>
+      </w:pPr>
+      <w:r>
+        <w:rPr>
+          <w:rFonts w:ascii="Times New Roman" w:hAnsi="Times New Roman" w:cs="Times New Roman"/>
+        </w:rPr>
+        <w:t xml:space="preserve">Untuk </w:t>
+      </w:r>
+      <w:r>
+        <w:rPr>
+          <w:rFonts w:ascii="Times New Roman" w:hAnsi="Times New Roman" w:cs="Times New Roman"/>
+        </w:rPr>
+        <w:t>pengembangan lebih lanjut</w:t>
+      </w:r>
+      <w:r>
+        <w:rPr>
+          <w:rFonts w:ascii="Times New Roman" w:hAnsi="Times New Roman" w:cs="Times New Roman"/>
+        </w:rPr>
+        <w:t xml:space="preserve">, disarankan untuk </w:t>
+      </w:r>
+      <w:r>
+        <w:rPr>
+          <w:rFonts w:ascii="Times New Roman" w:hAnsi="Times New Roman" w:cs="Times New Roman"/>
+        </w:rPr>
+        <w:t xml:space="preserve">dapat diarahkan pada integrasi </w:t>
+      </w:r>
+      <w:r>
+        <w:rPr>
+          <w:rFonts w:ascii="Times New Roman" w:hAnsi="Times New Roman" w:cs="Times New Roman"/>
+          <w:i/>
+          <w:iCs/>
+        </w:rPr>
+        <w:t>dashboard</w:t>
+      </w:r>
+      <w:r>
+        <w:rPr>
+          <w:rFonts w:ascii="Times New Roman" w:hAnsi="Times New Roman" w:cs="Times New Roman"/>
+        </w:rPr>
+        <w:t xml:space="preserve"> dengan sistem informasi akademik dan penambahan fitur analitik prediktif sesuai kebutuhan.</w:t>
+      </w:r>
+      <w:r>
+        <w:rPr>
+          <w:rFonts w:ascii="Times New Roman" w:hAnsi="Times New Roman" w:cs="Times New Roman"/>
+        </w:rPr>
+        <w:t xml:space="preserve"> </w:t>
+      </w:r>
+      <w:r>
+        <w:rPr>
+          <w:rFonts w:ascii="Times New Roman" w:hAnsi="Times New Roman" w:cs="Times New Roman"/>
+        </w:rPr>
+        <w:t>Bagi mahasiswa yang akan melaksanakan Kerja Praktik serupa, disarankan untuk memperdalam kemampuan teknis dalam pengolahan dan visualisasi data serta melakukan dokumentasi proses secara sistematis agar hasil yang diperoleh dapat direplikasi dan dikembangkan di masa mendatang.</w:t>
+      </w:r>
+    </w:p>
+    <w:p>
+      <w:pPr>
+        <w:pStyle w:val="Heading2"/>
+      </w:pPr>
+      <w:r>
+        <w:lastRenderedPageBreak/>
+        <w:t>DAFTAR PUSTAKA</w:t>
+      </w:r>
+    </w:p>
+    <w:sdt>
+      <w:sdtPr>
+        <w:rPr>
+          <w:color w:val="000000"/>
+        </w:rPr>
+        <w:tag w:val="MENDELEY_BIBLIOGRAPHY"/>
+        <w:id w:val="1090589119"/>
+        <w:placeholder>
+          <w:docPart w:val="DefaultPlaceholder_-1854013440"/>
+        </w:placeholder>
+      </w:sdtPr>
+      <w:sdtContent>
+        <w:p>
+          <w:pPr>
+            <w:autoSpaceDE w:val="0"/>
+            <w:autoSpaceDN w:val="0"/>
+            <w:ind w:hanging="480"/>
+            <w:jc w:val="both"/>
+            <w:divId w:val="1149446474"/>
+            <w:rPr>
+              <w:rFonts w:eastAsia="Times New Roman"/>
+              <w:kern w:val="0"/>
+              <w14:ligatures w14:val="none"/>
+            </w:rPr>
+          </w:pPr>
+          <w:r>
+            <w:rPr>
+              <w:rFonts w:eastAsia="Times New Roman"/>
+            </w:rPr>
+            <w:t xml:space="preserve">Hanifah, N., &amp; Nasution, M. I. P. (2025). Manajemen Data Yang Efektif: Solusi Untuk Mencegah dan Mengatasi Duplikasi Data Dalam Perusahaan. </w:t>
+          </w:r>
+          <w:r>
+            <w:rPr>
+              <w:rFonts w:eastAsia="Times New Roman"/>
+              <w:i/>
+              <w:iCs/>
+            </w:rPr>
+            <w:t>Epsilon: Journal of Management (EJoM)</w:t>
+          </w:r>
+          <w:r>
+            <w:rPr>
+              <w:rFonts w:eastAsia="Times New Roman"/>
+            </w:rPr>
+            <w:t xml:space="preserve">, </w:t>
+          </w:r>
+          <w:r>
+            <w:rPr>
+              <w:rFonts w:eastAsia="Times New Roman"/>
+              <w:i/>
+              <w:iCs/>
+            </w:rPr>
+            <w:t>3</w:t>
+          </w:r>
+          <w:r>
+            <w:rPr>
+              <w:rFonts w:eastAsia="Times New Roman"/>
+            </w:rPr>
+            <w:t>(1), 27–38.</w:t>
+          </w:r>
+        </w:p>
+        <w:p>
+          <w:pPr>
+            <w:autoSpaceDE w:val="0"/>
+            <w:autoSpaceDN w:val="0"/>
+            <w:ind w:hanging="480"/>
+            <w:jc w:val="both"/>
+            <w:divId w:val="1269385193"/>
+            <w:rPr>
+              <w:rFonts w:eastAsia="Times New Roman"/>
+            </w:rPr>
+          </w:pPr>
+          <w:r>
+            <w:rPr>
+              <w:rFonts w:eastAsia="Times New Roman"/>
+            </w:rPr>
+            <w:t xml:space="preserve">Hismawan, F. R., &amp; Izaak, W. C. (2023). Optimalisasi website menggunakan landing page sebagai media pemasaran produk parfum fresh fusion di era digital. </w:t>
+          </w:r>
+          <w:r>
+            <w:rPr>
+              <w:rFonts w:eastAsia="Times New Roman"/>
+              <w:i/>
+              <w:iCs/>
+            </w:rPr>
+            <w:t>KARYA: Jurnal Pengabdian Kepada Masyarakat</w:t>
+          </w:r>
+          <w:r>
+            <w:rPr>
+              <w:rFonts w:eastAsia="Times New Roman"/>
+            </w:rPr>
+            <w:t xml:space="preserve">, </w:t>
+          </w:r>
+          <w:r>
+            <w:rPr>
+              <w:rFonts w:eastAsia="Times New Roman"/>
+              <w:i/>
+              <w:iCs/>
+            </w:rPr>
+            <w:t>3</w:t>
+          </w:r>
+          <w:r>
+            <w:rPr>
+              <w:rFonts w:eastAsia="Times New Roman"/>
+            </w:rPr>
+            <w:t>(3), 364–368.</w:t>
+          </w:r>
+        </w:p>
+        <w:p>
+          <w:pPr>
+            <w:autoSpaceDE w:val="0"/>
+            <w:autoSpaceDN w:val="0"/>
+            <w:ind w:hanging="480"/>
+            <w:jc w:val="both"/>
+            <w:divId w:val="1358316123"/>
+            <w:rPr>
+              <w:rFonts w:eastAsia="Times New Roman"/>
+            </w:rPr>
+          </w:pPr>
+          <w:r>
+            <w:rPr>
+              <w:rFonts w:eastAsia="Times New Roman"/>
+            </w:rPr>
+            <w:t xml:space="preserve">Matondang, M., Sary, N., Gultom, T. B., &amp; Sebayang, Y. (2020). Penerapan Metode Brainstorming Dalam Perancangan Produk Pochade. </w:t>
+          </w:r>
+          <w:r>
+            <w:rPr>
+              <w:rFonts w:eastAsia="Times New Roman"/>
+              <w:i/>
+              <w:iCs/>
+            </w:rPr>
+            <w:t>Talenta Conference Series: Energy and Engineering (EE)</w:t>
+          </w:r>
+          <w:r>
+            <w:rPr>
+              <w:rFonts w:eastAsia="Times New Roman"/>
+            </w:rPr>
+            <w:t xml:space="preserve">, </w:t>
+          </w:r>
+          <w:r>
+            <w:rPr>
+              <w:rFonts w:eastAsia="Times New Roman"/>
+              <w:i/>
+              <w:iCs/>
+            </w:rPr>
+            <w:t>3</w:t>
+          </w:r>
+          <w:r>
+            <w:rPr>
+              <w:rFonts w:eastAsia="Times New Roman"/>
+            </w:rPr>
+            <w:t>(2).</w:t>
+          </w:r>
+        </w:p>
+        <w:p>
+          <w:pPr>
+            <w:autoSpaceDE w:val="0"/>
+            <w:autoSpaceDN w:val="0"/>
+            <w:ind w:hanging="480"/>
+            <w:jc w:val="both"/>
+            <w:divId w:val="1863399606"/>
+            <w:rPr>
+              <w:rFonts w:eastAsia="Times New Roman"/>
+            </w:rPr>
+          </w:pPr>
+          <w:r>
+            <w:rPr>
+              <w:rFonts w:eastAsia="Times New Roman"/>
+            </w:rPr>
+            <w:t xml:space="preserve">Mulyani, A., &amp; Kartini, K. (2023). Visualisasi Data Ticketing Servicedesk Dengan Dashboard Pada PT Brantas Abipraya (Persero). </w:t>
+          </w:r>
+          <w:r>
+            <w:rPr>
+              <w:rFonts w:eastAsia="Times New Roman"/>
+              <w:i/>
+              <w:iCs/>
+            </w:rPr>
+            <w:t>Journal of Information System, Applied, Management, Accounting and Research</w:t>
+          </w:r>
+          <w:r>
+            <w:rPr>
+              <w:rFonts w:eastAsia="Times New Roman"/>
+            </w:rPr>
+            <w:t xml:space="preserve">, </w:t>
+          </w:r>
+          <w:r>
+            <w:rPr>
+              <w:rFonts w:eastAsia="Times New Roman"/>
+              <w:i/>
+              <w:iCs/>
+            </w:rPr>
+            <w:t>7</w:t>
+          </w:r>
+          <w:r>
+            <w:rPr>
+              <w:rFonts w:eastAsia="Times New Roman"/>
+            </w:rPr>
+            <w:t>(2), 289–300.</w:t>
+          </w:r>
+        </w:p>
+        <w:p>
+          <w:pPr>
+            <w:autoSpaceDE w:val="0"/>
+            <w:autoSpaceDN w:val="0"/>
+            <w:ind w:hanging="480"/>
+            <w:jc w:val="both"/>
+            <w:divId w:val="706297617"/>
+            <w:rPr>
+              <w:rFonts w:eastAsia="Times New Roman"/>
+            </w:rPr>
+          </w:pPr>
+          <w:r>
+            <w:rPr>
+              <w:rFonts w:eastAsia="Times New Roman"/>
+            </w:rPr>
+            <w:t xml:space="preserve">Ramanisa, H., Khairudin, K., &amp; Netti, S. (2020). Analisis Kemampuan Representasi Matematis Siswa. </w:t>
+          </w:r>
+          <w:r>
+            <w:rPr>
+              <w:rFonts w:eastAsia="Times New Roman"/>
+              <w:i/>
+              <w:iCs/>
+            </w:rPr>
+            <w:t>Jurnal Magister Pendidikan Matematika (JUMADIKA)</w:t>
+          </w:r>
+          <w:r>
+            <w:rPr>
+              <w:rFonts w:eastAsia="Times New Roman"/>
+            </w:rPr>
+            <w:t xml:space="preserve">, </w:t>
+          </w:r>
+          <w:r>
+            <w:rPr>
+              <w:rFonts w:eastAsia="Times New Roman"/>
+              <w:i/>
+              <w:iCs/>
+            </w:rPr>
+            <w:t>2</w:t>
+          </w:r>
+          <w:r>
+            <w:rPr>
+              <w:rFonts w:eastAsia="Times New Roman"/>
+            </w:rPr>
+            <w:t>(1), 34–38.</w:t>
+          </w:r>
+        </w:p>
+        <w:p>
+          <w:pPr>
+            <w:autoSpaceDE w:val="0"/>
+            <w:autoSpaceDN w:val="0"/>
+            <w:ind w:hanging="480"/>
+            <w:jc w:val="both"/>
+            <w:divId w:val="146557034"/>
+            <w:rPr>
+              <w:rFonts w:eastAsia="Times New Roman"/>
+            </w:rPr>
+          </w:pPr>
+          <w:r>
+            <w:rPr>
+              <w:rFonts w:eastAsia="Times New Roman"/>
+            </w:rPr>
+            <w:t xml:space="preserve">Rosita, A. A., &amp; Tannar, O. (2024). PERAN DATA ANALIS DALAM MENDORONG KEPUTUSAN DAN STRATEGI BISNIS PERUSAHAAN. </w:t>
+          </w:r>
+          <w:r>
+            <w:rPr>
+              <w:rFonts w:eastAsia="Times New Roman"/>
+              <w:i/>
+              <w:iCs/>
+            </w:rPr>
+            <w:t>Jurnal Ekonomi Revolusioner</w:t>
+          </w:r>
+          <w:r>
+            <w:rPr>
+              <w:rFonts w:eastAsia="Times New Roman"/>
+            </w:rPr>
+            <w:t xml:space="preserve">, </w:t>
+          </w:r>
+          <w:r>
+            <w:rPr>
+              <w:rFonts w:eastAsia="Times New Roman"/>
+              <w:i/>
+              <w:iCs/>
+            </w:rPr>
+            <w:t>7</w:t>
+          </w:r>
+          <w:r>
+            <w:rPr>
+              <w:rFonts w:eastAsia="Times New Roman"/>
+            </w:rPr>
+            <w:t>(7).</w:t>
+          </w:r>
+        </w:p>
+        <w:p>
+          <w:pPr>
+            <w:autoSpaceDE w:val="0"/>
+            <w:autoSpaceDN w:val="0"/>
+            <w:ind w:hanging="480"/>
+            <w:jc w:val="both"/>
+            <w:divId w:val="1756784508"/>
+            <w:rPr>
+              <w:rFonts w:eastAsia="Times New Roman"/>
+            </w:rPr>
+          </w:pPr>
+          <w:r>
+            <w:rPr>
+              <w:rFonts w:eastAsia="Times New Roman"/>
+            </w:rPr>
+            <w:t xml:space="preserve">Seda, F. S. S. E., Setyawati, L., Tirta, T., &amp; Nobel, K. (2020). Dataset on the cultural dimension of urban society food consumption in Indonesia. </w:t>
+          </w:r>
+          <w:r>
+            <w:rPr>
+              <w:rFonts w:eastAsia="Times New Roman"/>
+              <w:i/>
+              <w:iCs/>
+            </w:rPr>
+            <w:t>Data in Brief</w:t>
+          </w:r>
+          <w:r>
+            <w:rPr>
+              <w:rFonts w:eastAsia="Times New Roman"/>
+            </w:rPr>
+            <w:t xml:space="preserve">, </w:t>
+          </w:r>
+          <w:r>
+            <w:rPr>
+              <w:rFonts w:eastAsia="Times New Roman"/>
+              <w:i/>
+              <w:iCs/>
+            </w:rPr>
+            <w:t>31</w:t>
+          </w:r>
+          <w:r>
+            <w:rPr>
+              <w:rFonts w:eastAsia="Times New Roman"/>
+            </w:rPr>
+            <w:t>, 105681.</w:t>
+          </w:r>
+        </w:p>
+        <w:p>
+          <w:pPr>
+            <w:autoSpaceDE w:val="0"/>
+            <w:autoSpaceDN w:val="0"/>
+            <w:ind w:hanging="480"/>
+            <w:jc w:val="both"/>
+            <w:divId w:val="1945379702"/>
+            <w:rPr>
+              <w:rFonts w:eastAsia="Times New Roman"/>
+            </w:rPr>
+          </w:pPr>
+          <w:r>
+            <w:rPr>
+              <w:rFonts w:eastAsia="Times New Roman"/>
+            </w:rPr>
+            <w:t xml:space="preserve">Sudrajat, W., &amp; Cholid, I. (2023). K-Nearest Neighbor (K-Nn) Untuk Penanganan Missing Value Pada Data Umkm. </w:t>
+          </w:r>
+          <w:r>
+            <w:rPr>
+              <w:rFonts w:eastAsia="Times New Roman"/>
+              <w:i/>
+              <w:iCs/>
+            </w:rPr>
+            <w:t>Jurnal Rekayasa Sistem Informasi Dan Teknologi</w:t>
+          </w:r>
+          <w:r>
+            <w:rPr>
+              <w:rFonts w:eastAsia="Times New Roman"/>
+            </w:rPr>
+            <w:t xml:space="preserve">, </w:t>
+          </w:r>
+          <w:r>
+            <w:rPr>
+              <w:rFonts w:eastAsia="Times New Roman"/>
+              <w:i/>
+              <w:iCs/>
+            </w:rPr>
+            <w:t>1</w:t>
+          </w:r>
+          <w:r>
+            <w:rPr>
+              <w:rFonts w:eastAsia="Times New Roman"/>
+            </w:rPr>
+            <w:t>(2), 54–63.</w:t>
+          </w:r>
+        </w:p>
+        <w:p>
+          <w:pPr>
+            <w:autoSpaceDE w:val="0"/>
+            <w:autoSpaceDN w:val="0"/>
+            <w:ind w:hanging="480"/>
+            <w:jc w:val="both"/>
+            <w:divId w:val="1308240817"/>
+            <w:rPr>
+              <w:rFonts w:eastAsia="Times New Roman"/>
+            </w:rPr>
+          </w:pPr>
+          <w:r>
+            <w:rPr>
+              <w:rFonts w:eastAsia="Times New Roman"/>
+            </w:rPr>
+            <w:t xml:space="preserve">Sulasmono, B. S. (2012). Problem solving: Signifikansi, pengertian, dan ragamnya. </w:t>
+          </w:r>
+          <w:r>
+            <w:rPr>
+              <w:rFonts w:eastAsia="Times New Roman"/>
+              <w:i/>
+              <w:iCs/>
+            </w:rPr>
+            <w:t>Satya Widya</w:t>
+          </w:r>
+          <w:r>
+            <w:rPr>
+              <w:rFonts w:eastAsia="Times New Roman"/>
+            </w:rPr>
+            <w:t xml:space="preserve">, </w:t>
+          </w:r>
+          <w:r>
+            <w:rPr>
+              <w:rFonts w:eastAsia="Times New Roman"/>
+              <w:i/>
+              <w:iCs/>
+            </w:rPr>
+            <w:t>28</w:t>
+          </w:r>
+          <w:r>
+            <w:rPr>
+              <w:rFonts w:eastAsia="Times New Roman"/>
+            </w:rPr>
+            <w:t>(2), 155–166.</w:t>
+          </w:r>
+        </w:p>
+        <w:p>
+          <w:pPr>
+            <w:autoSpaceDE w:val="0"/>
+            <w:autoSpaceDN w:val="0"/>
+            <w:ind w:hanging="480"/>
+            <w:jc w:val="both"/>
+            <w:divId w:val="1818689664"/>
+            <w:rPr>
+              <w:rFonts w:eastAsia="Times New Roman"/>
+            </w:rPr>
+          </w:pPr>
+          <w:r>
+            <w:rPr>
+              <w:rFonts w:eastAsia="Times New Roman"/>
+            </w:rPr>
+            <w:t xml:space="preserve">Turyadi, M. N. M., &amp; Kusnandar, D. (n.d.). KAJIAN SIFAT DISTRIBUSI NORMAL BIVARIAT. </w:t>
+          </w:r>
+          <w:r>
+            <w:rPr>
+              <w:rFonts w:eastAsia="Times New Roman"/>
+              <w:i/>
+              <w:iCs/>
+            </w:rPr>
+            <w:t>Bimaster: Buletin Ilmiah Matematika, Statistika Dan Terapannya</w:t>
+          </w:r>
+          <w:r>
+            <w:rPr>
+              <w:rFonts w:eastAsia="Times New Roman"/>
+            </w:rPr>
+            <w:t xml:space="preserve">, </w:t>
+          </w:r>
+          <w:r>
+            <w:rPr>
+              <w:rFonts w:eastAsia="Times New Roman"/>
+              <w:i/>
+              <w:iCs/>
+            </w:rPr>
+            <w:t>2</w:t>
+          </w:r>
+          <w:r>
+            <w:rPr>
+              <w:rFonts w:eastAsia="Times New Roman"/>
+            </w:rPr>
+            <w:t>(02).</w:t>
+          </w:r>
+        </w:p>
+        <w:p>
+          <w:pPr>
+            <w:autoSpaceDE w:val="0"/>
+            <w:autoSpaceDN w:val="0"/>
+            <w:ind w:hanging="480"/>
+            <w:jc w:val="both"/>
+            <w:divId w:val="1406756622"/>
+            <w:rPr>
+              <w:rFonts w:eastAsia="Times New Roman"/>
+            </w:rPr>
+          </w:pPr>
+          <w:r>
+            <w:rPr>
+              <w:rFonts w:eastAsia="Times New Roman"/>
+            </w:rPr>
+            <w:lastRenderedPageBreak/>
+            <w:t xml:space="preserve">Widaningsih, S. (2019). Perbandingan Metode Data Mining Untuk Prediksi Nilai Dan Waktu Kelulusan Mahasiswa Prodi Teknik Informatika Dengan Algoritma C4, 5, Naïve Bayes, Knn Dan Svm. </w:t>
+          </w:r>
+          <w:r>
+            <w:rPr>
+              <w:rFonts w:eastAsia="Times New Roman"/>
+              <w:i/>
+              <w:iCs/>
+            </w:rPr>
+            <w:t>Jurnal Tekno Insentif</w:t>
+          </w:r>
+          <w:r>
+            <w:rPr>
+              <w:rFonts w:eastAsia="Times New Roman"/>
+            </w:rPr>
+            <w:t xml:space="preserve">, </w:t>
+          </w:r>
+          <w:r>
+            <w:rPr>
+              <w:rFonts w:eastAsia="Times New Roman"/>
+              <w:i/>
+              <w:iCs/>
+            </w:rPr>
+            <w:t>13</w:t>
+          </w:r>
+          <w:r>
+            <w:rPr>
+              <w:rFonts w:eastAsia="Times New Roman"/>
+            </w:rPr>
+            <w:t>(1), 16–25.</w:t>
+          </w:r>
+        </w:p>
+        <w:p>
+          <w:r>
+            <w:rPr>
+              <w:rFonts w:eastAsia="Times New Roman"/>
+            </w:rPr>
+            <w:t> </w:t>
+          </w:r>
+        </w:p>
+      </w:sdtContent>
+    </w:sdt>
     <w:sectPr>
       <w:pgSz w:w="11909" w:h="16834" w:code="9"/>
       <w:pgMar w:top="2268" w:right="1701" w:bottom="1701" w:left="2268" w:header="720" w:footer="720" w:gutter="0"/>
@@ -17015,9 +17612,14 @@
   </w:compat>
   <w:rsids>
     <w:rsidRoot w:val="00966163"/>
+    <w:rsid w:val="001D4EF9"/>
     <w:rsid w:val="005A7160"/>
+    <w:rsid w:val="006E1BAB"/>
     <w:rsid w:val="00763159"/>
     <w:rsid w:val="00966163"/>
+    <w:rsid w:val="00AB1197"/>
+    <w:rsid w:val="00EA4982"/>
+    <w:rsid w:val="00F36618"/>
   </w:rsids>
   <m:mathPr>
     <m:mathFont m:val="Cambria Math"/>
@@ -17798,8 +18400,9 @@
     <we:reference id="WA104382081" version="1.55.1.0" store="" storeType="OMEX"/>
   </we:alternateReferences>
   <we:properties>
-    <we:property name="MENDELEY_CITATIONS" value="[{&quot;citationID&quot;:&quot;MENDELEY_CITATION_3a12006e-fbea-40f6-b24c-a6b73827dc3c&quot;,&quot;properties&quot;:{&quot;noteIndex&quot;:0},&quot;isEdited&quot;:false,&quot;manualOverride&quot;:{&quot;isManuallyOverridden&quot;:false,&quot;citeprocText&quot;:&quot;[1]&quot;,&quot;manualOverrideText&quot;:&quot;&quot;},&quot;citationTag&quot;:&quot;MENDELEY_CITATION_v3_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&quot;,&quot;citationItems&quot;:[{&quot;id&quot;:&quot;74b4a176-a06b-3dcb-9904-952ea10b110c&quot;,&quot;itemData&quot;:{&quot;type&quot;:&quot;article-journal&quot;,&quot;id&quot;:&quot;74b4a176-a06b-3dcb-9904-952ea10b110c&quot;,&quot;title&quot;:&quot;PERAN DATA ANALIS DALAM MENDORONG KEPUTUSAN DAN STRATEGI BISNIS PERUSAHAAN&quot;,&quot;author&quot;:[{&quot;family&quot;:&quot;Rosita&quot;,&quot;given&quot;:&quot;Amanda Aura&quot;,&quot;parse-names&quot;:false,&quot;dropping-particle&quot;:&quot;&quot;,&quot;non-dropping-particle&quot;:&quot;&quot;},{&quot;family&quot;:&quot;Tannar&quot;,&quot;given&quot;:&quot;Oryza&quot;,&quot;parse-names&quot;:false,&quot;dropping-particle&quot;:&quot;&quot;,&quot;non-dropping-particle&quot;:&quot;&quot;}],&quot;container-title&quot;:&quot;Jurnal Ekonomi Revolusioner&quot;,&quot;issued&quot;:{&quot;date-parts&quot;:[[2024]]},&quot;issue&quot;:&quot;7&quot;,&quot;volume&quot;:&quot;7&quot;,&quot;container-title-short&quot;:&quot;&quot;},&quot;isTemporary&quot;:false}]},{&quot;citationID&quot;:&quot;MENDELEY_CITATION_7d83bb88-96d7-4f02-a289-b3d1de461bdd&quot;,&quot;properties&quot;:{&quot;noteIndex&quot;:0},&quot;isEdited&quot;:false,&quot;manualOverride&quot;:{&quot;isManuallyOverridden&quot;:false,&quot;citeprocText&quot;:&quot;[2]&quot;,&quot;manualOverrideText&quot;:&quot;&quot;},&quot;citationTag&quot;:&quot;MENDELEY_CITATION_v3_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&quot;,&quot;citationItems&quot;:[{&quot;id&quot;:&quot;624bddcc-faad-354e-a37e-9bcacc2441fb&quot;,&quot;itemData&quot;:{&quot;type&quot;:&quot;article-journal&quot;,&quot;id&quot;:&quot;624bddcc-faad-354e-a37e-9bcacc2441fb&quot;,&quot;title&quot;:&quot;Perbandingan Metode Data Mining Untuk Prediksi Nilai Dan Waktu Kelulusan Mahasiswa Prodi Teknik Informatika Dengan Algoritma C4, 5, Naïve Bayes, Knn Dan Svm&quot;,&quot;author&quot;:[{&quot;family&quot;:&quot;Widaningsih&quot;,&quot;given&quot;:&quot;Sri&quot;,&quot;parse-names&quot;:false,&quot;dropping-particle&quot;:&quot;&quot;,&quot;non-dropping-particle&quot;:&quot;&quot;}],&quot;container-title&quot;:&quot;Jurnal Tekno Insentif&quot;,&quot;ISSN&quot;:&quot;2655-089X&quot;,&quot;issued&quot;:{&quot;date-parts&quot;:[[2019]]},&quot;page&quot;:&quot;16-25&quot;,&quot;issue&quot;:&quot;1&quot;,&quot;volume&quot;:&quot;13&quot;,&quot;container-title-short&quot;:&quot;&quot;},&quot;isTemporary&quot;:false}]},{&quot;citationID&quot;:&quot;MENDELEY_CITATION_17f89917-cef1-42eb-9d1e-11357d67e251&quot;,&quot;properties&quot;:{&quot;noteIndex&quot;:0},&quot;isEdited&quot;:false,&quot;manualOverride&quot;:{&quot;isManuallyOverridden&quot;:false,&quot;citeprocText&quot;:&quot;[3]&quot;,&quot;manualOverrideText&quot;:&quot;&quot;},&quot;citationTag&quot;:&quot;MENDELEY_CITATION_v3_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&quot;,&quot;citationItems&quot;:[{&quot;id&quot;:&quot;219e0431-c196-3cad-83dd-7ead91a2a396&quot;,&quot;itemData&quot;:{&quot;type&quot;:&quot;article-journal&quot;,&quot;id&quot;:&quot;219e0431-c196-3cad-83dd-7ead91a2a396&quot;,&quot;title&quot;:&quot;Dataset on the cultural dimension of urban society food consumption in Indonesia&quot;,&quot;author&quot;:[{&quot;family&quot;:&quot;Seda&quot;,&quot;given&quot;:&quot;Francisia S S E&quot;,&quot;parse-names&quot;:false,&quot;dropping-particle&quot;:&quot;&quot;,&quot;non-dropping-particle&quot;:&quot;&quot;},{&quot;family&quot;:&quot;Setyawati&quot;,&quot;given&quot;:&quot;Lugina&quot;,&quot;parse-names&quot;:false,&quot;dropping-particle&quot;:&quot;&quot;,&quot;non-dropping-particle&quot;:&quot;&quot;},{&quot;family&quot;:&quot;Tirta&quot;,&quot;given&quot;:&quot;Timoti&quot;,&quot;parse-names&quot;:false,&quot;dropping-particle&quot;:&quot;&quot;,&quot;non-dropping-particle&quot;:&quot;&quot;},{&quot;family&quot;:&quot;Nobel&quot;,&quot;given&quot;:&quot;Kevin&quot;,&quot;parse-names&quot;:false,&quot;dropping-particle&quot;:&quot;&quot;,&quot;non-dropping-particle&quot;:&quot;&quot;}],&quot;container-title&quot;:&quot;Data in Brief&quot;,&quot;container-title-short&quot;:&quot;Data Brief&quot;,&quot;ISSN&quot;:&quot;2352-3409&quot;,&quot;issued&quot;:{&quot;date-parts&quot;:[[2020]]},&quot;page&quot;:&quot;105681&quot;,&quot;publisher&quot;:&quot;Elsevier&quot;,&quot;volume&quot;:&quot;31&quot;},&quot;isTemporary&quot;:false}]},{&quot;citationID&quot;:&quot;MENDELEY_CITATION_f89be22b-269e-4c31-831b-f953af3883fb&quot;,&quot;properties&quot;:{&quot;noteIndex&quot;:0},&quot;isEdited&quot;:false,&quot;manualOverride&quot;:{&quot;isManuallyOverridden&quot;:false,&quot;citeprocText&quot;:&quot;[4]&quot;,&quot;manualOverrideText&quot;:&quot;&quot;},&quot;citationTag&quot;:&quot;MENDELEY_CITATION_v3_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&quot;,&quot;citationItems&quot;:[{&quot;id&quot;:&quot;a93aaf8b-be5f-34bb-aae0-7da4f3b98c22&quot;,&quot;itemData&quot;:{&quot;type&quot;:&quot;article-journal&quot;,&quot;id&quot;:&quot;a93aaf8b-be5f-34bb-aae0-7da4f3b98c22&quot;,&quot;title&quot;:&quot;Manajemen Data Yang Efektif: Solusi Untuk Mencegah dan Mengatasi Duplikasi Data Dalam Perusahaan&quot;,&quot;author&quot;:[{&quot;family&quot;:&quot;Hanifah&quot;,&quot;given&quot;:&quot;Nazwa&quot;,&quot;parse-names&quot;:false,&quot;dropping-particle&quot;:&quot;&quot;,&quot;non-dropping-particle&quot;:&quot;&quot;},{&quot;family&quot;:&quot;Nasution&quot;,&quot;given&quot;:&quot;Muhammad Irwan Padli&quot;,&quot;parse-names&quot;:false,&quot;dropping-particle&quot;:&quot;&quot;,&quot;non-dropping-particle&quot;:&quot;&quot;}],&quot;container-title&quot;:&quot;Epsilon: Journal of Management (EJoM)&quot;,&quot;ISSN&quot;:&quot;3026-653X&quot;,&quot;issued&quot;:{&quot;date-parts&quot;:[[2025]]},&quot;page&quot;:&quot;27-38&quot;,&quot;issue&quot;:&quot;1&quot;,&quot;volume&quot;:&quot;3&quot;,&quot;container-title-short&quot;:&quot;&quot;},&quot;isTemporary&quot;:false}]},{&quot;citationID&quot;:&quot;MENDELEY_CITATION_41771b54-2cd1-48dc-8259-192f6ab796cb&quot;,&quot;properties&quot;:{&quot;noteIndex&quot;:0},&quot;isEdited&quot;:false,&quot;manualOverride&quot;:{&quot;isManuallyOverridden&quot;:false,&quot;citeprocText&quot;:&quot;[5]&quot;,&quot;manualOverrideText&quot;:&quot;&quot;},&quot;citationTag&quot;:&quot;MENDELEY_CITATION_v3_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&quot;,&quot;citationItems&quot;:[{&quot;id&quot;:&quot;5503319d-adb7-3949-b8f3-2192723250e6&quot;,&quot;itemData&quot;:{&quot;type&quot;:&quot;article-journal&quot;,&quot;id&quot;:&quot;5503319d-adb7-3949-b8f3-2192723250e6&quot;,&quot;title&quot;:&quot;K-Nearest Neighbor (K-Nn) Untuk Penanganan Missing Value Pada Data Umkm&quot;,&quot;author&quot;:[{&quot;family&quot;:&quot;Sudrajat&quot;,&quot;given&quot;:&quot;Wahyu&quot;,&quot;parse-names&quot;:false,&quot;dropping-particle&quot;:&quot;&quot;,&quot;non-dropping-particle&quot;:&quot;&quot;},{&quot;family&quot;:&quot;Cholid&quot;,&quot;given&quot;:&quot;Idahm&quot;,&quot;parse-names&quot;:false,&quot;dropping-particle&quot;:&quot;&quot;,&quot;non-dropping-particle&quot;:&quot;&quot;}],&quot;container-title&quot;:&quot;Jurnal Rekayasa Sistem Informasi Dan Teknologi&quot;,&quot;ISSN&quot;:&quot;3025-888X&quot;,&quot;issued&quot;:{&quot;date-parts&quot;:[[2023]]},&quot;page&quot;:&quot;54-63&quot;,&quot;issue&quot;:&quot;2&quot;,&quot;volume&quot;:&quot;1&quot;,&quot;container-title-short&quot;:&quot;&quot;},&quot;isTemporary&quot;:false}]},{&quot;citationID&quot;:&quot;MENDELEY_CITATION_a68d755a-3a98-4a4a-93be-865b7b61246c&quot;,&quot;properties&quot;:{&quot;noteIndex&quot;:0},&quot;isEdited&quot;:false,&quot;manualOverride&quot;:{&quot;isManuallyOverridden&quot;:false,&quot;citeprocText&quot;:&quot;[6]&quot;,&quot;manualOverrideText&quot;:&quot;&quot;},&quot;citationTag&quot;:&quot;MENDELEY_CITATION_v3_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&quot;,&quot;citationItems&quot;:[{&quot;id&quot;:&quot;2e56aaf9-a5a3-3f81-a5f3-734246019abf&quot;,&quot;itemData&quot;:{&quot;type&quot;:&quot;article-journal&quot;,&quot;id&quot;:&quot;2e56aaf9-a5a3-3f81-a5f3-734246019abf&quot;,&quot;title&quot;:&quot;KAJIAN SIFAT DISTRIBUSI NORMAL BIVARIAT&quot;,&quot;author&quot;:[{&quot;family&quot;:&quot;Turyadi&quot;,&quot;given&quot;:&quot;Muhlasah Novitasari Mara&quot;,&quot;parse-names&quot;:false,&quot;dropping-particle&quot;:&quot;&quot;,&quot;non-dropping-particle&quot;:&quot;&quot;},{&quot;family&quot;:&quot;Kusnandar&quot;,&quot;given&quot;:&quot;Dadan&quot;,&quot;parse-names&quot;:false,&quot;dropping-particle&quot;:&quot;&quot;,&quot;non-dropping-particle&quot;:&quot;&quot;}],&quot;container-title&quot;:&quot;Bimaster: Buletin Ilmiah Matematika, Statistika dan Terapannya&quot;,&quot;ISSN&quot;:&quot;2302-9854&quot;,&quot;issue&quot;:&quot;02&quot;,&quot;volume&quot;:&quot;2&quot;,&quot;container-title-short&quot;:&quot;&quot;},&quot;isTemporary&quot;:false}]},{&quot;citationID&quot;:&quot;MENDELEY_CITATION_dc4f565e-b259-42f3-abd0-d5e58402ca6a&quot;,&quot;properties&quot;:{&quot;noteIndex&quot;:0},&quot;isEdited&quot;:false,&quot;manualOverride&quot;:{&quot;isManuallyOverridden&quot;:false,&quot;citeprocText&quot;:&quot;[7]&quot;,&quot;manualOverrideText&quot;:&quot;&quot;},&quot;citationTag&quot;:&quot;MENDELEY_CITATION_v3_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&quot;,&quot;citationItems&quot;:[{&quot;id&quot;:&quot;8e698846-4f7b-35f4-aa77-9c90920f795f&quot;,&quot;itemData&quot;:{&quot;type&quot;:&quot;article-journal&quot;,&quot;id&quot;:&quot;8e698846-4f7b-35f4-aa77-9c90920f795f&quot;,&quot;title&quot;:&quot;Problem solving: Signifikansi, pengertian, dan ragamnya&quot;,&quot;author&quot;:[{&quot;family&quot;:&quot;Sulasmono&quot;,&quot;given&quot;:&quot;Bambang Suteng&quot;,&quot;parse-names&quot;:false,&quot;dropping-particle&quot;:&quot;&quot;,&quot;non-dropping-particle&quot;:&quot;&quot;}],&quot;container-title&quot;:&quot;Satya Widya&quot;,&quot;ISSN&quot;:&quot;2549-967X&quot;,&quot;issued&quot;:{&quot;date-parts&quot;:[[2012]]},&quot;page&quot;:&quot;155-166&quot;,&quot;issue&quot;:&quot;2&quot;,&quot;volume&quot;:&quot;28&quot;,&quot;container-title-short&quot;:&quot;&quot;},&quot;isTemporary&quot;:false}]},{&quot;citationID&quot;:&quot;MENDELEY_CITATION_0bb2aa4c-3392-4aff-8273-f70e9cc73e68&quot;,&quot;properties&quot;:{&quot;noteIndex&quot;:0},&quot;isEdited&quot;:false,&quot;manualOverride&quot;:{&quot;isManuallyOverridden&quot;:false,&quot;citeprocText&quot;:&quot;[8]&quot;,&quot;manualOverrideText&quot;:&quot;&quot;},&quot;citationTag&quot;:&quot;MENDELEY_CITATION_v3_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&quot;,&quot;citationItems&quot;:[{&quot;id&quot;:&quot;1b97f332-ea00-3a32-b851-ac744ffe09c6&quot;,&quot;itemData&quot;:{&quot;type&quot;:&quot;article-journal&quot;,&quot;id&quot;:&quot;1b97f332-ea00-3a32-b851-ac744ffe09c6&quot;,&quot;title&quot;:&quot;Analisis Kemampuan Representasi Matematis Siswa&quot;,&quot;author&quot;:[{&quot;family&quot;:&quot;Ramanisa&quot;,&quot;given&quot;:&quot;Hartiwi&quot;,&quot;parse-names&quot;:false,&quot;dropping-particle&quot;:&quot;&quot;,&quot;non-dropping-particle&quot;:&quot;&quot;},{&quot;family&quot;:&quot;Khairudin&quot;,&quot;given&quot;:&quot;Khairudin&quot;,&quot;parse-names&quot;:false,&quot;dropping-particle&quot;:&quot;&quot;,&quot;non-dropping-particle&quot;:&quot;&quot;},{&quot;family&quot;:&quot;Netti&quot;,&quot;given&quot;:&quot;Syukma&quot;,&quot;parse-names&quot;:false,&quot;dropping-particle&quot;:&quot;&quot;,&quot;non-dropping-particle&quot;:&quot;&quot;}],&quot;container-title&quot;:&quot;Jurnal Magister Pendidikan Matematika (JUMADIKA)&quot;,&quot;ISSN&quot;:&quot;2684-8848&quot;,&quot;issued&quot;:{&quot;date-parts&quot;:[[2020]]},&quot;page&quot;:&quot;34-38&quot;,&quot;issue&quot;:&quot;1&quot;,&quot;volume&quot;:&quot;2&quot;,&quot;container-title-short&quot;:&quot;&quot;},&quot;isTemporary&quot;:false}]}]"/>
-    <we:property name="MENDELEY_CITATIONS_STYLE" value="{&quot;id&quot;:&quot;https://www.zotero.org/styles/ieee&quot;,&quot;title&quot;:&quot;IEEE&quot;,&quot;format&quot;:&quot;numeric&quot;,&quot;defaultLocale&quot;:null,&quot;isLocaleCodeValid&quot;:true}"/>
+    <we:property name="MENDELEY_CITATIONS" value="[{&quot;citationID&quot;:&quot;MENDELEY_CITATION_3a12006e-fbea-40f6-b24c-a6b73827dc3c&quot;,&quot;properties&quot;:{&quot;noteIndex&quot;:0},&quot;isEdited&quot;:false,&quot;manualOverride&quot;:{&quot;isManuallyOverridden&quot;:false,&quot;citeprocText&quot;:&quot;(Rosita &amp;#38; Tannar, 2024)&quot;,&quot;manualOverrideText&quot;:&quot;&quot;},&quot;citationItems&quot;:[{&quot;id&quot;:&quot;74b4a176-a06b-3dcb-9904-952ea10b110c&quot;,&quot;itemData&quot;:{&quot;type&quot;:&quot;article-journal&quot;,&quot;id&quot;:&quot;74b4a176-a06b-3dcb-9904-952ea10b110c&quot;,&quot;title&quot;:&quot;PERAN DATA ANALIS DALAM MENDORONG KEPUTUSAN DAN STRATEGI BISNIS PERUSAHAAN&quot;,&quot;author&quot;:[{&quot;family&quot;:&quot;Rosita&quot;,&quot;given&quot;:&quot;Amanda Aura&quot;,&quot;parse-names&quot;:false,&quot;dropping-particle&quot;:&quot;&quot;,&quot;non-dropping-particle&quot;:&quot;&quot;},{&quot;family&quot;:&quot;Tannar&quot;,&quot;given&quot;:&quot;Oryza&quot;,&quot;parse-names&quot;:false,&quot;dropping-particle&quot;:&quot;&quot;,&quot;non-dropping-particle&quot;:&quot;&quot;}],&quot;container-title&quot;:&quot;Jurnal Ekonomi Revolusioner&quot;,&quot;issued&quot;:{&quot;date-parts&quot;:[[2024]]},&quot;issue&quot;:&quot;7&quot;,&quot;volume&quot;:&quot;7&quot;,&quot;container-title-short&quot;:&quot;&quot;},&quot;isTemporary&quot;:false}],&quot;citationTag&quot;:&quot;MENDELEY_CITATION_v3_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&quot;},{&quot;citationID&quot;:&quot;MENDELEY_CITATION_7d83bb88-96d7-4f02-a289-b3d1de461bdd&quot;,&quot;properties&quot;:{&quot;noteIndex&quot;:0},&quot;isEdited&quot;:false,&quot;manualOverride&quot;:{&quot;isManuallyOverridden&quot;:false,&quot;citeprocText&quot;:&quot;(Widaningsih, 2019)&quot;,&quot;manualOverrideText&quot;:&quot;&quot;},&quot;citationItems&quot;:[{&quot;id&quot;:&quot;624bddcc-faad-354e-a37e-9bcacc2441fb&quot;,&quot;itemData&quot;:{&quot;type&quot;:&quot;article-journal&quot;,&quot;id&quot;:&quot;624bddcc-faad-354e-a37e-9bcacc2441fb&quot;,&quot;title&quot;:&quot;Perbandingan Metode Data Mining Untuk Prediksi Nilai Dan Waktu Kelulusan Mahasiswa Prodi Teknik Informatika Dengan Algoritma C4, 5, Naïve Bayes, Knn Dan Svm&quot;,&quot;author&quot;:[{&quot;family&quot;:&quot;Widaningsih&quot;,&quot;given&quot;:&quot;Sri&quot;,&quot;parse-names&quot;:false,&quot;dropping-particle&quot;:&quot;&quot;,&quot;non-dropping-particle&quot;:&quot;&quot;}],&quot;container-title&quot;:&quot;Jurnal Tekno Insentif&quot;,&quot;ISSN&quot;:&quot;2655-089X&quot;,&quot;issued&quot;:{&quot;date-parts&quot;:[[2019]]},&quot;page&quot;:&quot;16-25&quot;,&quot;issue&quot;:&quot;1&quot;,&quot;volume&quot;:&quot;13&quot;,&quot;container-title-short&quot;:&quot;&quot;},&quot;isTemporary&quot;:false}],&quot;citationTag&quot;:&quot;MENDELEY_CITATION_v3_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&quot;},{&quot;citationID&quot;:&quot;MENDELEY_CITATION_17f89917-cef1-42eb-9d1e-11357d67e251&quot;,&quot;properties&quot;:{&quot;noteIndex&quot;:0},&quot;isEdited&quot;:false,&quot;manualOverride&quot;:{&quot;isManuallyOverridden&quot;:false,&quot;citeprocText&quot;:&quot;(Seda et al., 2020)&quot;,&quot;manualOverrideText&quot;:&quot;&quot;},&quot;citationItems&quot;:[{&quot;id&quot;:&quot;219e0431-c196-3cad-83dd-7ead91a2a396&quot;,&quot;itemData&quot;:{&quot;type&quot;:&quot;article-journal&quot;,&quot;id&quot;:&quot;219e0431-c196-3cad-83dd-7ead91a2a396&quot;,&quot;title&quot;:&quot;Dataset on the cultural dimension of urban society food consumption in Indonesia&quot;,&quot;author&quot;:[{&quot;family&quot;:&quot;Seda&quot;,&quot;given&quot;:&quot;Francisia S S E&quot;,&quot;parse-names&quot;:false,&quot;dropping-particle&quot;:&quot;&quot;,&quot;non-dropping-particle&quot;:&quot;&quot;},{&quot;family&quot;:&quot;Setyawati&quot;,&quot;given&quot;:&quot;Lugina&quot;,&quot;parse-names&quot;:false,&quot;dropping-particle&quot;:&quot;&quot;,&quot;non-dropping-particle&quot;:&quot;&quot;},{&quot;family&quot;:&quot;Tirta&quot;,&quot;given&quot;:&quot;Timoti&quot;,&quot;parse-names&quot;:false,&quot;dropping-particle&quot;:&quot;&quot;,&quot;non-dropping-particle&quot;:&quot;&quot;},{&quot;family&quot;:&quot;Nobel&quot;,&quot;given&quot;:&quot;Kevin&quot;,&quot;parse-names&quot;:false,&quot;dropping-particle&quot;:&quot;&quot;,&quot;non-dropping-particle&quot;:&quot;&quot;}],&quot;container-title&quot;:&quot;Data in Brief&quot;,&quot;container-title-short&quot;:&quot;Data Brief&quot;,&quot;ISSN&quot;:&quot;2352-3409&quot;,&quot;issued&quot;:{&quot;date-parts&quot;:[[2020]]},&quot;page&quot;:&quot;105681&quot;,&quot;publisher&quot;:&quot;Elsevier&quot;,&quot;volume&quot;:&quot;31&quot;},&quot;isTemporary&quot;:false}],&quot;citationTag&quot;:&quot;MENDELEY_CITATION_v3_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&quot;},{&quot;citationID&quot;:&quot;MENDELEY_CITATION_f89be22b-269e-4c31-831b-f953af3883fb&quot;,&quot;properties&quot;:{&quot;noteIndex&quot;:0},&quot;isEdited&quot;:false,&quot;manualOverride&quot;:{&quot;isManuallyOverridden&quot;:false,&quot;citeprocText&quot;:&quot;(Hanifah &amp;#38; Nasution, 2025)&quot;,&quot;manualOverrideText&quot;:&quot;&quot;},&quot;citationItems&quot;:[{&quot;id&quot;:&quot;a93aaf8b-be5f-34bb-aae0-7da4f3b98c22&quot;,&quot;itemData&quot;:{&quot;type&quot;:&quot;article-journal&quot;,&quot;id&quot;:&quot;a93aaf8b-be5f-34bb-aae0-7da4f3b98c22&quot;,&quot;title&quot;:&quot;Manajemen Data Yang Efektif: Solusi Untuk Mencegah dan Mengatasi Duplikasi Data Dalam Perusahaan&quot;,&quot;author&quot;:[{&quot;family&quot;:&quot;Hanifah&quot;,&quot;given&quot;:&quot;Nazwa&quot;,&quot;parse-names&quot;:false,&quot;dropping-particle&quot;:&quot;&quot;,&quot;non-dropping-particle&quot;:&quot;&quot;},{&quot;family&quot;:&quot;Nasution&quot;,&quot;given&quot;:&quot;Muhammad Irwan Padli&quot;,&quot;parse-names&quot;:false,&quot;dropping-particle&quot;:&quot;&quot;,&quot;non-dropping-particle&quot;:&quot;&quot;}],&quot;container-title&quot;:&quot;Epsilon: Journal of Management (EJoM)&quot;,&quot;ISSN&quot;:&quot;3026-653X&quot;,&quot;issued&quot;:{&quot;date-parts&quot;:[[2025]]},&quot;page&quot;:&quot;27-38&quot;,&quot;issue&quot;:&quot;1&quot;,&quot;volume&quot;:&quot;3&quot;,&quot;container-title-short&quot;:&quot;&quot;},&quot;isTemporary&quot;:false}],&quot;citationTag&quot;:&quot;MENDELEY_CITATION_v3_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&quot;},{&quot;citationID&quot;:&quot;MENDELEY_CITATION_41771b54-2cd1-48dc-8259-192f6ab796cb&quot;,&quot;properties&quot;:{&quot;noteIndex&quot;:0},&quot;isEdited&quot;:false,&quot;manualOverride&quot;:{&quot;isManuallyOverridden&quot;:false,&quot;citeprocText&quot;:&quot;(Sudrajat &amp;#38; Cholid, 2023)&quot;,&quot;manualOverrideText&quot;:&quot;&quot;},&quot;citationItems&quot;:[{&quot;id&quot;:&quot;5503319d-adb7-3949-b8f3-2192723250e6&quot;,&quot;itemData&quot;:{&quot;type&quot;:&quot;article-journal&quot;,&quot;id&quot;:&quot;5503319d-adb7-3949-b8f3-2192723250e6&quot;,&quot;title&quot;:&quot;K-Nearest Neighbor (K-Nn) Untuk Penanganan Missing Value Pada Data Umkm&quot;,&quot;author&quot;:[{&quot;family&quot;:&quot;Sudrajat&quot;,&quot;given&quot;:&quot;Wahyu&quot;,&quot;parse-names&quot;:false,&quot;dropping-particle&quot;:&quot;&quot;,&quot;non-dropping-particle&quot;:&quot;&quot;},{&quot;family&quot;:&quot;Cholid&quot;,&quot;given&quot;:&quot;Idahm&quot;,&quot;parse-names&quot;:false,&quot;dropping-particle&quot;:&quot;&quot;,&quot;non-dropping-particle&quot;:&quot;&quot;}],&quot;container-title&quot;:&quot;Jurnal Rekayasa Sistem Informasi Dan Teknologi&quot;,&quot;ISSN&quot;:&quot;3025-888X&quot;,&quot;issued&quot;:{&quot;date-parts&quot;:[[2023]]},&quot;page&quot;:&quot;54-63&quot;,&quot;issue&quot;:&quot;2&quot;,&quot;volume&quot;:&quot;1&quot;,&quot;container-title-short&quot;:&quot;&quot;},&quot;isTemporary&quot;:false}],&quot;citationTag&quot;:&quot;MENDELEY_CITATION_v3_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&quot;},{&quot;citationID&quot;:&quot;MENDELEY_CITATION_a68d755a-3a98-4a4a-93be-865b7b61246c&quot;,&quot;properties&quot;:{&quot;noteIndex&quot;:0},&quot;isEdited&quot;:false,&quot;manualOverride&quot;:{&quot;isManuallyOverridden&quot;:false,&quot;citeprocText&quot;:&quot;(Turyadi &amp;#38; Kusnandar, n.d.)&quot;,&quot;manualOverrideText&quot;:&quot;&quot;},&quot;citationItems&quot;:[{&quot;id&quot;:&quot;2e56aaf9-a5a3-3f81-a5f3-734246019abf&quot;,&quot;itemData&quot;:{&quot;type&quot;:&quot;article-journal&quot;,&quot;id&quot;:&quot;2e56aaf9-a5a3-3f81-a5f3-734246019abf&quot;,&quot;title&quot;:&quot;KAJIAN SIFAT DISTRIBUSI NORMAL BIVARIAT&quot;,&quot;author&quot;:[{&quot;family&quot;:&quot;Turyadi&quot;,&quot;given&quot;:&quot;Muhlasah Novitasari Mara&quot;,&quot;parse-names&quot;:false,&quot;dropping-particle&quot;:&quot;&quot;,&quot;non-dropping-particle&quot;:&quot;&quot;},{&quot;family&quot;:&quot;Kusnandar&quot;,&quot;given&quot;:&quot;Dadan&quot;,&quot;parse-names&quot;:false,&quot;dropping-particle&quot;:&quot;&quot;,&quot;non-dropping-particle&quot;:&quot;&quot;}],&quot;container-title&quot;:&quot;Bimaster: Buletin Ilmiah Matematika, Statistika dan Terapannya&quot;,&quot;ISSN&quot;:&quot;2302-9854&quot;,&quot;issue&quot;:&quot;02&quot;,&quot;volume&quot;:&quot;2&quot;,&quot;container-title-short&quot;:&quot;&quot;},&quot;isTemporary&quot;:false}],&quot;citationTag&quot;:&quot;MENDELEY_CITATION_v3_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&quot;},{&quot;citationID&quot;:&quot;MENDELEY_CITATION_dc4f565e-b259-42f3-abd0-d5e58402ca6a&quot;,&quot;properties&quot;:{&quot;noteIndex&quot;:0},&quot;isEdited&quot;:false,&quot;manualOverride&quot;:{&quot;isManuallyOverridden&quot;:false,&quot;citeprocText&quot;:&quot;(Sulasmono, 2012)&quot;,&quot;manualOverrideText&quot;:&quot;&quot;},&quot;citationItems&quot;:[{&quot;id&quot;:&quot;8e698846-4f7b-35f4-aa77-9c90920f795f&quot;,&quot;itemData&quot;:{&quot;type&quot;:&quot;article-journal&quot;,&quot;id&quot;:&quot;8e698846-4f7b-35f4-aa77-9c90920f795f&quot;,&quot;title&quot;:&quot;Problem solving: Signifikansi, pengertian, dan ragamnya&quot;,&quot;author&quot;:[{&quot;family&quot;:&quot;Sulasmono&quot;,&quot;given&quot;:&quot;Bambang Suteng&quot;,&quot;parse-names&quot;:false,&quot;dropping-particle&quot;:&quot;&quot;,&quot;non-dropping-particle&quot;:&quot;&quot;}],&quot;container-title&quot;:&quot;Satya Widya&quot;,&quot;ISSN&quot;:&quot;2549-967X&quot;,&quot;issued&quot;:{&quot;date-parts&quot;:[[2012]]},&quot;page&quot;:&quot;155-166&quot;,&quot;issue&quot;:&quot;2&quot;,&quot;volume&quot;:&quot;28&quot;,&quot;container-title-short&quot;:&quot;&quot;},&quot;isTemporary&quot;:false}],&quot;citationTag&quot;:&quot;MENDELEY_CITATION_v3_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&quot;},{&quot;citationID&quot;:&quot;MENDELEY_CITATION_0bb2aa4c-3392-4aff-8273-f70e9cc73e68&quot;,&quot;properties&quot;:{&quot;noteIndex&quot;:0},&quot;isEdited&quot;:false,&quot;manualOverride&quot;:{&quot;isManuallyOverridden&quot;:false,&quot;citeprocText&quot;:&quot;(Ramanisa et al., 2020)&quot;,&quot;manualOverrideText&quot;:&quot;&quot;},&quot;citationItems&quot;:[{&quot;id&quot;:&quot;1b97f332-ea00-3a32-b851-ac744ffe09c6&quot;,&quot;itemData&quot;:{&quot;type&quot;:&quot;article-journal&quot;,&quot;id&quot;:&quot;1b97f332-ea00-3a32-b851-ac744ffe09c6&quot;,&quot;title&quot;:&quot;Analisis Kemampuan Representasi Matematis Siswa&quot;,&quot;author&quot;:[{&quot;family&quot;:&quot;Ramanisa&quot;,&quot;given&quot;:&quot;Hartiwi&quot;,&quot;parse-names&quot;:false,&quot;dropping-particle&quot;:&quot;&quot;,&quot;non-dropping-particle&quot;:&quot;&quot;},{&quot;family&quot;:&quot;Khairudin&quot;,&quot;given&quot;:&quot;Khairudin&quot;,&quot;parse-names&quot;:false,&quot;dropping-particle&quot;:&quot;&quot;,&quot;non-dropping-particle&quot;:&quot;&quot;},{&quot;family&quot;:&quot;Netti&quot;,&quot;given&quot;:&quot;Syukma&quot;,&quot;parse-names&quot;:false,&quot;dropping-particle&quot;:&quot;&quot;,&quot;non-dropping-particle&quot;:&quot;&quot;}],&quot;container-title&quot;:&quot;Jurnal Magister Pendidikan Matematika (JUMADIKA)&quot;,&quot;ISSN&quot;:&quot;2684-8848&quot;,&quot;issued&quot;:{&quot;date-parts&quot;:[[2020]]},&quot;page&quot;:&quot;34-38&quot;,&quot;issue&quot;:&quot;1&quot;,&quot;volume&quot;:&quot;2&quot;,&quot;container-title-short&quot;:&quot;&quot;},&quot;isTemporary&quot;:false}],&quot;citationTag&quot;:&quot;MENDELEY_CITATION_v3_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&quot;},{&quot;citationID&quot;:&quot;MENDELEY_CITATION_b766a1da-7ff7-4b3b-9de1-5325f90eb8b2&quot;,&quot;properties&quot;:{&quot;noteIndex&quot;:0},&quot;isEdited&quot;:false,&quot;manualOverride&quot;:{&quot;isManuallyOverridden&quot;:false,&quot;citeprocText&quot;:&quot;(Matondang et al., 2020)&quot;,&quot;manualOverrideText&quot;:&quot;&quot;},&quot;citationTag&quot;:&quot;MENDELEY_CITATION_v3_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&quot;,&quot;citationItems&quot;:[{&quot;id&quot;:&quot;abac9297-d8b0-3b76-a078-f6adb92f755b&quot;,&quot;itemData&quot;:{&quot;type&quot;:&quot;paper-conference&quot;,&quot;id&quot;:&quot;abac9297-d8b0-3b76-a078-f6adb92f755b&quot;,&quot;title&quot;:&quot;Penerapan Metode Brainstorming Dalam Perancangan Produk Pochade&quot;,&quot;author&quot;:[{&quot;family&quot;:&quot;Matondang&quot;,&quot;given&quot;:&quot;Muharram&quot;,&quot;parse-names&quot;:false,&quot;dropping-particle&quot;:&quot;&quot;,&quot;non-dropping-particle&quot;:&quot;&quot;},{&quot;family&quot;:&quot;Sary&quot;,&quot;given&quot;:&quot;Nadilah&quot;,&quot;parse-names&quot;:false,&quot;dropping-particle&quot;:&quot;&quot;,&quot;non-dropping-particle&quot;:&quot;&quot;},{&quot;family&quot;:&quot;Gultom&quot;,&quot;given&quot;:&quot;Theo Benneditson&quot;,&quot;parse-names&quot;:false,&quot;dropping-particle&quot;:&quot;&quot;,&quot;non-dropping-particle&quot;:&quot;&quot;},{&quot;family&quot;:&quot;Sebayang&quot;,&quot;given&quot;:&quot;Yesticka&quot;,&quot;parse-names&quot;:false,&quot;dropping-particle&quot;:&quot;&quot;,&quot;non-dropping-particle&quot;:&quot;&quot;}],&quot;container-title&quot;:&quot;Talenta Conference Series: Energy and Engineering (EE)&quot;,&quot;ISBN&quot;:&quot;2654-704X&quot;,&quot;issued&quot;:{&quot;date-parts&quot;:[[2020]]},&quot;issue&quot;:&quot;2&quot;,&quot;volume&quot;:&quot;3&quot;,&quot;container-title-short&quot;:&quot;&quot;},&quot;isTemporary&quot;:false}]},{&quot;citationID&quot;:&quot;MENDELEY_CITATION_517e0629-801d-4b12-a8f8-ee2fe9f46ac4&quot;,&quot;properties&quot;:{&quot;noteIndex&quot;:0},&quot;isEdited&quot;:false,&quot;manualOverride&quot;:{&quot;isManuallyOverridden&quot;:false,&quot;citeprocText&quot;:&quot;(Mulyani &amp;#38; Kartini, 2023)&quot;,&quot;manualOverrideText&quot;:&quot;&quot;},&quot;citationTag&quot;:&quot;MENDELEY_CITATION_v3_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&quot;,&quot;citationItems&quot;:[{&quot;id&quot;:&quot;0cb1f664-1d35-3d25-a481-d642dbf50f2d&quot;,&quot;itemData&quot;:{&quot;type&quot;:&quot;article-journal&quot;,&quot;id&quot;:&quot;0cb1f664-1d35-3d25-a481-d642dbf50f2d&quot;,&quot;title&quot;:&quot;Visualisasi Data Ticketing Servicedesk Dengan Dashboard Pada PT Brantas Abipraya (Persero)&quot;,&quot;author&quot;:[{&quot;family&quot;:&quot;Mulyani&quot;,&quot;given&quot;:&quot;Astriana&quot;,&quot;parse-names&quot;:false,&quot;dropping-particle&quot;:&quot;&quot;,&quot;non-dropping-particle&quot;:&quot;&quot;},{&quot;family&quot;:&quot;Kartini&quot;,&quot;given&quot;:&quot;Kartini&quot;,&quot;parse-names&quot;:false,&quot;dropping-particle&quot;:&quot;&quot;,&quot;non-dropping-particle&quot;:&quot;&quot;}],&quot;container-title&quot;:&quot;Journal of Information System, Applied, Management, Accounting and Research&quot;,&quot;ISSN&quot;:&quot;2598-8719&quot;,&quot;issued&quot;:{&quot;date-parts&quot;:[[2023]]},&quot;page&quot;:&quot;289-300&quot;,&quot;issue&quot;:&quot;2&quot;,&quot;volume&quot;:&quot;7&quot;,&quot;container-title-short&quot;:&quot;&quot;},&quot;isTemporary&quot;:false}]},{&quot;citationID&quot;:&quot;MENDELEY_CITATION_b7c5119d-813d-44e2-977d-b57712b9b0e2&quot;,&quot;properties&quot;:{&quot;noteIndex&quot;:0},&quot;isEdited&quot;:false,&quot;manualOverride&quot;:{&quot;isManuallyOverridden&quot;:false,&quot;citeprocText&quot;:&quot;(Hismawan &amp;#38; Izaak, 2023)&quot;,&quot;manualOverrideText&quot;:&quot;&quot;},&quot;citationTag&quot;:&quot;MENDELEY_CITATION_v3_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&quot;,&quot;citationItems&quot;:[{&quot;id&quot;:&quot;11846df6-0008-38cd-b3d5-57f64a205852&quot;,&quot;itemData&quot;:{&quot;type&quot;:&quot;article-journal&quot;,&quot;id&quot;:&quot;11846df6-0008-38cd-b3d5-57f64a205852&quot;,&quot;title&quot;:&quot;Optimalisasi website menggunakan landing page sebagai media pemasaran produk parfum fresh fusion di era digital&quot;,&quot;author&quot;:[{&quot;family&quot;:&quot;Hismawan&quot;,&quot;given&quot;:&quot;Fiska Rahma&quot;,&quot;parse-names&quot;:false,&quot;dropping-particle&quot;:&quot;&quot;,&quot;non-dropping-particle&quot;:&quot;&quot;},{&quot;family&quot;:&quot;Izaak&quot;,&quot;given&quot;:&quot;Wilma Cordelia&quot;,&quot;parse-names&quot;:false,&quot;dropping-particle&quot;:&quot;&quot;,&quot;non-dropping-particle&quot;:&quot;&quot;}],&quot;container-title&quot;:&quot;KARYA: Jurnal Pengabdian Kepada Masyarakat&quot;,&quot;ISSN&quot;:&quot;2798-1827&quot;,&quot;issued&quot;:{&quot;date-parts&quot;:[[2023]]},&quot;page&quot;:&quot;364-368&quot;,&quot;issue&quot;:&quot;3&quot;,&quot;volume&quot;:&quot;3&quot;,&quot;container-title-short&quot;:&quot;&quot;},&quot;isTemporary&quot;:false}]}]"/>
+    <we:property name="MENDELEY_CITATIONS_LOCALE_CODE" value="&quot;en-GB&quot;"/>
+    <we:property name="MENDELEY_CITATIONS_STYLE" value="{&quot;id&quot;:&quot;https://www.zotero.org/styles/apa&quot;,&quot;title&quot;:&quot;American Psychological Association 7th edition&quot;,&quot;format&quot;:&quot;author-date&quot;,&quot;defaultLocale&quot;:null,&quot;isLocaleCodeValid&quot;:true}"/>
   </we:properties>
   <we:bindings/>
   <we:snapshot xmlns:r="http://schemas.openxmlformats.org/officeDocument/2006/relationships"/>

</xml_diff>

<commit_message>
abis benerin semua label + bikin nomor halaman. next selesaikan halaman persembahan + masukin lembar pengesahan dll (ternyata jadi 1 sama laporan)
</commit_message>
<xml_diff>
--- a/non-website/Laporan Akhir KP/2203040182 - Dhika Ramadhan Saputra - Laporan KP.docx
+++ b/non-website/Laporan Akhir KP/2203040182 - Dhika Ramadhan Saputra - Laporan KP.docx
@@ -61,7 +61,7 @@
                     <pic:cNvPicPr/>
                   </pic:nvPicPr>
                   <pic:blipFill>
-                    <a:blip r:embed="rId6" cstate="print">
+                    <a:blip r:embed="rId8" cstate="print">
                       <a:extLst>
                         <a:ext uri="{28A0092B-C50C-407E-A947-70E740481C1C}">
                           <a14:useLocalDpi xmlns:a14="http://schemas.microsoft.com/office/drawing/2010/main" val="0"/>
@@ -177,6 +177,7 @@
           <w:szCs w:val="22"/>
         </w:rPr>
       </w:pPr>
+      <w:proofErr w:type="gramStart"/>
       <w:r>
         <w:rPr>
           <w:rFonts w:ascii="Times New Roman" w:hAnsi="Times New Roman" w:cs="Times New Roman"/>
@@ -199,15 +200,16 @@
           <w:sz w:val="22"/>
           <w:szCs w:val="22"/>
         </w:rPr>
-        <w:t>: Dhika Ramadhan Saputra</w:t>
-      </w:r>
+        <w:t>:</w:t>
+      </w:r>
+      <w:proofErr w:type="gramEnd"/>
       <w:r>
         <w:rPr>
           <w:rFonts w:ascii="Times New Roman" w:hAnsi="Times New Roman" w:cs="Times New Roman"/>
           <w:sz w:val="22"/>
           <w:szCs w:val="22"/>
         </w:rPr>
-        <w:br/>
+        <w:t xml:space="preserve"> Dhika Ramadhan Saputra</w:t>
       </w:r>
       <w:r>
         <w:rPr>
@@ -215,15 +217,16 @@
           <w:sz w:val="22"/>
           <w:szCs w:val="22"/>
         </w:rPr>
-        <w:t>NIM.</w:t>
-      </w:r>
+        <w:br/>
+      </w:r>
+      <w:proofErr w:type="gramStart"/>
       <w:r>
         <w:rPr>
           <w:rFonts w:ascii="Times New Roman" w:hAnsi="Times New Roman" w:cs="Times New Roman"/>
           <w:sz w:val="22"/>
           <w:szCs w:val="22"/>
         </w:rPr>
-        <w:t xml:space="preserve">  </w:t>
+        <w:t>NIM.</w:t>
       </w:r>
       <w:r>
         <w:rPr>
@@ -231,7 +234,24 @@
           <w:sz w:val="22"/>
           <w:szCs w:val="22"/>
         </w:rPr>
-        <w:t>: 2203040182</w:t>
+        <w:t xml:space="preserve">  </w:t>
+      </w:r>
+      <w:r>
+        <w:rPr>
+          <w:rFonts w:ascii="Times New Roman" w:hAnsi="Times New Roman" w:cs="Times New Roman"/>
+          <w:sz w:val="22"/>
+          <w:szCs w:val="22"/>
+        </w:rPr>
+        <w:t>:</w:t>
+      </w:r>
+      <w:proofErr w:type="gramEnd"/>
+      <w:r>
+        <w:rPr>
+          <w:rFonts w:ascii="Times New Roman" w:hAnsi="Times New Roman" w:cs="Times New Roman"/>
+          <w:sz w:val="22"/>
+          <w:szCs w:val="22"/>
+        </w:rPr>
+        <w:t xml:space="preserve"> 2203040182</w:t>
       </w:r>
     </w:p>
     <w:p>
@@ -252,6 +272,15 @@
         <w:rPr>
           <w:rFonts w:ascii="Times New Roman" w:hAnsi="Times New Roman" w:cs="Times New Roman"/>
         </w:rPr>
+        <w:sectPr>
+          <w:footerReference w:type="default" r:id="rId9"/>
+          <w:footerReference w:type="first" r:id="rId10"/>
+          <w:pgSz w:w="11909" w:h="16834" w:code="9"/>
+          <w:pgMar w:top="2268" w:right="1701" w:bottom="1701" w:left="2268" w:header="720" w:footer="720" w:gutter="0"/>
+          <w:pgNumType w:fmt="lowerRoman" w:start="1"/>
+          <w:cols w:space="720"/>
+          <w:docGrid w:linePitch="360"/>
+        </w:sectPr>
       </w:pPr>
       <w:r>
         <w:rPr>
@@ -312,9 +341,6 @@
       <w:pPr>
         <w:pStyle w:val="Heading2"/>
       </w:pPr>
-      <w:r>
-        <w:br w:type="page"/>
-      </w:r>
       <w:r>
         <w:lastRenderedPageBreak/>
         <w:t>HALAMAN PERSEMBAHAN</w:t>
@@ -457,6 +483,15 @@
           <w:rFonts w:ascii="Times New Roman" w:hAnsi="Times New Roman" w:cs="Times New Roman"/>
         </w:rPr>
       </w:pPr>
+    </w:p>
+    <w:p>
+      <w:pPr>
+        <w:spacing w:line="480" w:lineRule="auto"/>
+        <w:ind w:left="5245"/>
+        <w:rPr>
+          <w:rFonts w:ascii="Times New Roman" w:hAnsi="Times New Roman" w:cs="Times New Roman"/>
+        </w:rPr>
+      </w:pPr>
       <w:r>
         <w:rPr>
           <w:rFonts w:ascii="Times New Roman" w:hAnsi="Times New Roman" w:cs="Times New Roman"/>
@@ -497,7 +532,7 @@
         <w:rPr>
           <w:rFonts w:ascii="Times New Roman" w:hAnsi="Times New Roman" w:cs="Times New Roman"/>
         </w:rPr>
-        <w:t>ssssss</w:t>
+        <w:t>sss</w:t>
       </w:r>
       <w:r>
         <w:rPr>
@@ -525,13 +560,7 @@
         <w:rPr>
           <w:rFonts w:ascii="Times New Roman" w:hAnsi="Times New Roman" w:cs="Times New Roman"/>
         </w:rPr>
-        <w:t>S</w:t>
-      </w:r>
-      <w:r>
-        <w:rPr>
-          <w:rFonts w:ascii="Times New Roman" w:hAnsi="Times New Roman" w:cs="Times New Roman"/>
-        </w:rPr>
-        <w:t>sss</w:t>
+        <w:t>ssss</w:t>
       </w:r>
       <w:r>
         <w:rPr>
@@ -674,7 +703,21 @@
         <w:rPr>
           <w:rFonts w:ascii="Times New Roman" w:hAnsi="Times New Roman" w:cs="Times New Roman"/>
         </w:rPr>
-        <w:t>Nomor pendaftaran, jalur masuk, tahun masuk, prodi pilihan 1, prodi pilihan 2, fakultas pilihan 1, fakultas pilihan 2, prodi diterima, fakultas prodi diterima, usia, asal SLTA, jurusan SLTA, alamat asal, alamat domisili, pendidikan ayah, pendidikan ibu, pekerjaan ibu, alamat orang tua,  dan Provinsi asal domisili</w:t>
+        <w:t xml:space="preserve">Nomor pendaftaran, jalur masuk, tahun masuk, prodi pilihan 1, prodi pilihan 2, fakultas pilihan 1, fakultas pilihan 2, prodi diterima, fakultas prodi diterima, usia, asal SLTA, jurusan SLTA, alamat asal, alamat domisili, pendidikan ayah, pendidikan ibu, pekerjaan ibu, alamat orang </w:t>
+      </w:r>
+      <w:proofErr w:type="gramStart"/>
+      <w:r>
+        <w:rPr>
+          <w:rFonts w:ascii="Times New Roman" w:hAnsi="Times New Roman" w:cs="Times New Roman"/>
+        </w:rPr>
+        <w:t>tua,  dan</w:t>
+      </w:r>
+      <w:proofErr w:type="gramEnd"/>
+      <w:r>
+        <w:rPr>
+          <w:rFonts w:ascii="Times New Roman" w:hAnsi="Times New Roman" w:cs="Times New Roman"/>
+        </w:rPr>
+        <w:t xml:space="preserve"> Provinsi asal domisili</w:t>
       </w:r>
       <w:r>
         <w:rPr>
@@ -804,19 +847,30 @@
         <w:rPr>
           <w:rFonts w:ascii="Times New Roman" w:hAnsi="Times New Roman" w:cs="Times New Roman"/>
         </w:rPr>
-      </w:pPr>
-      <w:r>
-        <w:rPr>
-          <w:rFonts w:ascii="Times New Roman" w:hAnsi="Times New Roman" w:cs="Times New Roman"/>
-        </w:rPr>
-        <w:t>Kata kunci</w:t>
-      </w:r>
+        <w:sectPr>
+          <w:footerReference w:type="default" r:id="rId11"/>
+          <w:footerReference w:type="first" r:id="rId12"/>
+          <w:pgSz w:w="11909" w:h="16834" w:code="9"/>
+          <w:pgMar w:top="2268" w:right="1701" w:bottom="1701" w:left="2268" w:header="720" w:footer="720" w:gutter="0"/>
+          <w:pgNumType w:fmt="lowerRoman" w:start="1"/>
+          <w:cols w:space="720"/>
+          <w:docGrid w:linePitch="360"/>
+        </w:sectPr>
+      </w:pPr>
       <w:r>
         <w:rPr>
           <w:rFonts w:ascii="Times New Roman" w:hAnsi="Times New Roman" w:cs="Times New Roman"/>
           <w:b/>
           <w:bCs/>
         </w:rPr>
+        <w:t>Kata kunci</w:t>
+      </w:r>
+      <w:r>
+        <w:rPr>
+          <w:rFonts w:ascii="Times New Roman" w:hAnsi="Times New Roman" w:cs="Times New Roman"/>
+          <w:b/>
+          <w:bCs/>
+        </w:rPr>
         <w:t xml:space="preserve">: </w:t>
       </w:r>
       <w:r>
@@ -850,12 +904,6 @@
           <w:rFonts w:ascii="Times New Roman" w:hAnsi="Times New Roman" w:cs="Times New Roman"/>
         </w:rPr>
         <w:t>.</w:t>
-      </w:r>
-      <w:r>
-        <w:rPr>
-          <w:rFonts w:ascii="Times New Roman" w:hAnsi="Times New Roman" w:cs="Times New Roman"/>
-        </w:rPr>
-        <w:t xml:space="preserve"> </w:t>
       </w:r>
     </w:p>
     <w:p>
@@ -1522,7 +1570,7 @@
                     <pic:cNvPicPr/>
                   </pic:nvPicPr>
                   <pic:blipFill>
-                    <a:blip r:embed="rId7">
+                    <a:blip r:embed="rId13">
                       <a:extLst>
                         <a:ext uri="{28A0092B-C50C-407E-A947-70E740481C1C}">
                           <a14:useLocalDpi xmlns:a14="http://schemas.microsoft.com/office/drawing/2010/main" val="0"/>
@@ -1558,23 +1606,32 @@
           <w:rFonts w:ascii="Times New Roman" w:hAnsi="Times New Roman" w:cs="Times New Roman"/>
         </w:rPr>
       </w:pPr>
-      <w:r>
-        <w:t>G</w:t>
-      </w:r>
-      <w:r>
-        <w:t xml:space="preserve">ambar </w:t>
-      </w:r>
-      <w:fldSimple w:instr=" SEQ gambar \* ARABIC ">
-        <w:r>
-          <w:rPr>
-            <w:noProof/>
-          </w:rPr>
-          <w:t>1</w:t>
-        </w:r>
-      </w:fldSimple>
-      <w:r>
-        <w:t xml:space="preserve"> Tahapan Pelaksanaan</w:t>
-      </w:r>
+      <w:bookmarkStart w:id="0" w:name="_Toc200446284"/>
+      <w:r>
+        <w:t xml:space="preserve">Gambar 1. </w:t>
+      </w:r>
+      <w:r>
+        <w:fldChar w:fldCharType="begin"/>
+      </w:r>
+      <w:r>
+        <w:instrText xml:space="preserve"> SEQ Gambar_1. \* ARABIC </w:instrText>
+      </w:r>
+      <w:r>
+        <w:fldChar w:fldCharType="separate"/>
+      </w:r>
+      <w:r>
+        <w:rPr>
+          <w:noProof/>
+        </w:rPr>
+        <w:t>1</w:t>
+      </w:r>
+      <w:r>
+        <w:fldChar w:fldCharType="end"/>
+      </w:r>
+      <w:r>
+        <w:t xml:space="preserve"> tahapan pelaksanaan</w:t>
+      </w:r>
+      <w:bookmarkEnd w:id="0"/>
     </w:p>
     <w:p>
       <w:pPr>
@@ -1601,6 +1658,37 @@
           <w:rFonts w:ascii="Times New Roman" w:hAnsi="Times New Roman" w:cs="Times New Roman"/>
         </w:rPr>
         <w:t>Berikut ini adalah jadwal pelaksanaan proyek ini:</w:t>
+      </w:r>
+    </w:p>
+    <w:p>
+      <w:pPr>
+        <w:pStyle w:val="Caption"/>
+        <w:keepNext/>
+        <w:jc w:val="center"/>
+      </w:pPr>
+      <w:r>
+        <w:t xml:space="preserve">Tabel 1. </w:t>
+      </w:r>
+      <w:r>
+        <w:fldChar w:fldCharType="begin"/>
+      </w:r>
+      <w:r>
+        <w:instrText xml:space="preserve"> SEQ Tabel_1. \* ARABIC </w:instrText>
+      </w:r>
+      <w:r>
+        <w:fldChar w:fldCharType="separate"/>
+      </w:r>
+      <w:r>
+        <w:rPr>
+          <w:noProof/>
+        </w:rPr>
+        <w:t>1</w:t>
+      </w:r>
+      <w:r>
+        <w:fldChar w:fldCharType="end"/>
+      </w:r>
+      <w:r>
+        <w:t xml:space="preserve"> jadwal pelaksanaan</w:t>
       </w:r>
     </w:p>
     <w:tbl>
@@ -3502,32 +3590,11 @@
     <w:p>
       <w:pPr>
         <w:pStyle w:val="Caption"/>
-        <w:jc w:val="center"/>
-      </w:pPr>
-    </w:p>
-    <w:p>
-      <w:pPr>
-        <w:pStyle w:val="Caption"/>
-        <w:spacing w:line="480" w:lineRule="auto"/>
-        <w:jc w:val="center"/>
-        <w:rPr>
-          <w:rFonts w:ascii="Times New Roman" w:hAnsi="Times New Roman" w:cs="Times New Roman"/>
-        </w:rPr>
-      </w:pPr>
-      <w:r>
-        <w:t xml:space="preserve">Tabel </w:t>
-      </w:r>
-      <w:fldSimple w:instr=" SEQ Tabel \* ARABIC ">
-        <w:r>
-          <w:rPr>
-            <w:noProof/>
-          </w:rPr>
-          <w:t>1</w:t>
-        </w:r>
-      </w:fldSimple>
-      <w:r>
-        <w:t xml:space="preserve"> Jadwal pelaksanaan</w:t>
-      </w:r>
+        <w:spacing w:line="480" w:lineRule="auto"/>
+        <w:rPr>
+          <w:rFonts w:ascii="Times New Roman" w:hAnsi="Times New Roman" w:cs="Times New Roman"/>
+        </w:rPr>
+      </w:pPr>
     </w:p>
     <w:p>
       <w:pPr>
@@ -3683,7 +3750,7 @@
                     <pic:cNvPicPr/>
                   </pic:nvPicPr>
                   <pic:blipFill>
-                    <a:blip r:embed="rId8">
+                    <a:blip r:embed="rId14">
                       <a:extLst>
                         <a:ext uri="{28A0092B-C50C-407E-A947-70E740481C1C}">
                           <a14:useLocalDpi xmlns:a14="http://schemas.microsoft.com/office/drawing/2010/main" val="0"/>
@@ -3719,23 +3786,32 @@
           <w:rFonts w:ascii="Times New Roman" w:hAnsi="Times New Roman" w:cs="Times New Roman"/>
         </w:rPr>
       </w:pPr>
-      <w:r>
-        <w:t>G</w:t>
-      </w:r>
-      <w:r>
-        <w:t xml:space="preserve">ambar </w:t>
-      </w:r>
-      <w:fldSimple w:instr=" SEQ gambar \* ARABIC ">
-        <w:r>
-          <w:rPr>
-            <w:noProof/>
-          </w:rPr>
-          <w:t>2</w:t>
-        </w:r>
-      </w:fldSimple>
-      <w:r>
-        <w:t xml:space="preserve"> Struktur Umum Organisasi Mitra</w:t>
-      </w:r>
+      <w:bookmarkStart w:id="1" w:name="_Toc200446290"/>
+      <w:r>
+        <w:t xml:space="preserve">Gambar 2. </w:t>
+      </w:r>
+      <w:r>
+        <w:fldChar w:fldCharType="begin"/>
+      </w:r>
+      <w:r>
+        <w:instrText xml:space="preserve"> SEQ Gambar_2. \* ARABIC </w:instrText>
+      </w:r>
+      <w:r>
+        <w:fldChar w:fldCharType="separate"/>
+      </w:r>
+      <w:r>
+        <w:rPr>
+          <w:noProof/>
+        </w:rPr>
+        <w:t>1</w:t>
+      </w:r>
+      <w:r>
+        <w:fldChar w:fldCharType="end"/>
+      </w:r>
+      <w:r>
+        <w:t xml:space="preserve"> struktur umum organisasi mitra</w:t>
+      </w:r>
+      <w:bookmarkEnd w:id="1"/>
     </w:p>
     <w:p>
       <w:pPr>
@@ -3900,7 +3976,7 @@
         </w:rPr>
         <w:t xml:space="preserve">Website: </w:t>
       </w:r>
-      <w:hyperlink r:id="rId9" w:history="1">
+      <w:hyperlink r:id="rId15" w:history="1">
         <w:r>
           <w:rPr>
             <w:rStyle w:val="Hyperlink"/>
@@ -4141,7 +4217,7 @@
                     </pic:cNvPicPr>
                   </pic:nvPicPr>
                   <pic:blipFill>
-                    <a:blip r:embed="rId10" cstate="print">
+                    <a:blip r:embed="rId16" cstate="print">
                       <a:extLst>
                         <a:ext uri="{28A0092B-C50C-407E-A947-70E740481C1C}">
                           <a14:useLocalDpi xmlns:a14="http://schemas.microsoft.com/office/drawing/2010/main" val="0"/>
@@ -4181,25 +4257,33 @@
         <w:spacing w:line="480" w:lineRule="auto"/>
         <w:jc w:val="center"/>
       </w:pPr>
-      <w:r>
-        <w:t>G</w:t>
-      </w:r>
-      <w:r>
-        <w:t xml:space="preserve">ambar </w:t>
-      </w:r>
-      <w:fldSimple w:instr=" SEQ gambar \* ARABIC ">
-        <w:r>
-          <w:rPr>
-            <w:noProof/>
-          </w:rPr>
-          <w:t>3</w:t>
-        </w:r>
-      </w:fldSimple>
-      <w:r>
-        <w:t xml:space="preserve"> Dokumentasi proses penerimaan data</w:t>
-      </w:r>
-    </w:p>
-    <w:p/>
+      <w:bookmarkStart w:id="2" w:name="_Toc200446296"/>
+      <w:r>
+        <w:t xml:space="preserve">Gambar 3. </w:t>
+      </w:r>
+      <w:r>
+        <w:fldChar w:fldCharType="begin"/>
+      </w:r>
+      <w:r>
+        <w:instrText xml:space="preserve"> SEQ Gambar_3. \* ARABIC </w:instrText>
+      </w:r>
+      <w:r>
+        <w:fldChar w:fldCharType="separate"/>
+      </w:r>
+      <w:r>
+        <w:rPr>
+          <w:noProof/>
+        </w:rPr>
+        <w:t>1</w:t>
+      </w:r>
+      <w:r>
+        <w:fldChar w:fldCharType="end"/>
+      </w:r>
+      <w:r>
+        <w:t xml:space="preserve"> dokumentasi penerimaan data via Whatsapp</w:t>
+      </w:r>
+      <w:bookmarkEnd w:id="2"/>
+    </w:p>
     <w:p>
       <w:pPr>
         <w:pStyle w:val="ListParagraph"/>
@@ -4213,7 +4297,7 @@
           <w:noProof/>
         </w:rPr>
         <w:drawing>
-          <wp:inline distT="0" distB="0" distL="0" distR="0" wp14:anchorId="75188C27" wp14:editId="13B82649">
+          <wp:inline distT="0" distB="0" distL="0" distR="0" wp14:anchorId="75188C27" wp14:editId="71B9F8FE">
             <wp:extent cx="4608000" cy="1698906"/>
             <wp:effectExtent l="19050" t="19050" r="21590" b="15875"/>
             <wp:docPr id="783286403" name="Picture 4"/>
@@ -4230,7 +4314,7 @@
                     </pic:cNvPicPr>
                   </pic:nvPicPr>
                   <pic:blipFill>
-                    <a:blip r:embed="rId11" cstate="print">
+                    <a:blip r:embed="rId17" cstate="print">
                       <a:extLst>
                         <a:ext uri="{28A0092B-C50C-407E-A947-70E740481C1C}">
                           <a14:useLocalDpi xmlns:a14="http://schemas.microsoft.com/office/drawing/2010/main" val="0"/>
@@ -4273,41 +4357,35 @@
           <w:rFonts w:ascii="Times New Roman" w:hAnsi="Times New Roman" w:cs="Times New Roman"/>
         </w:rPr>
       </w:pPr>
-      <w:r>
-        <w:t>G</w:t>
-      </w:r>
-      <w:r>
-        <w:t xml:space="preserve">ambar </w:t>
-      </w:r>
-      <w:fldSimple w:instr=" SEQ gambar \* ARABIC ">
-        <w:r>
-          <w:rPr>
-            <w:noProof/>
-          </w:rPr>
-          <w:t>4</w:t>
-        </w:r>
-      </w:fldSimple>
-      <w:r>
-        <w:t xml:space="preserve"> Sampel</w:t>
-      </w:r>
-      <w:r>
-        <w:t xml:space="preserve"> kolom dan data </w:t>
-      </w:r>
-      <w:r>
-        <w:t>mentah</w:t>
-      </w:r>
-      <w:r>
-        <w:t xml:space="preserve"> </w:t>
-      </w:r>
-      <w:r>
-        <w:t xml:space="preserve">tahun </w:t>
-      </w:r>
-      <w:r>
-        <w:t>2024</w:t>
-      </w:r>
-      <w:r>
-        <w:t xml:space="preserve"> (dengan sensor)</w:t>
-      </w:r>
+      <w:bookmarkStart w:id="3" w:name="_Toc200446297"/>
+      <w:r>
+        <w:t xml:space="preserve">Gambar 3. </w:t>
+      </w:r>
+      <w:r>
+        <w:fldChar w:fldCharType="begin"/>
+      </w:r>
+      <w:r>
+        <w:instrText xml:space="preserve"> SEQ Gambar_3. \* ARABIC </w:instrText>
+      </w:r>
+      <w:r>
+        <w:fldChar w:fldCharType="separate"/>
+      </w:r>
+      <w:r>
+        <w:rPr>
+          <w:noProof/>
+        </w:rPr>
+        <w:t>2</w:t>
+      </w:r>
+      <w:r>
+        <w:fldChar w:fldCharType="end"/>
+      </w:r>
+      <w:r>
+        <w:t xml:space="preserve"> s</w:t>
+      </w:r>
+      <w:r>
+        <w:t>ampel kolom dan data mentah tahun 2024 (dengan sensor)</w:t>
+      </w:r>
+      <w:bookmarkEnd w:id="3"/>
     </w:p>
     <w:p>
       <w:pPr>
@@ -4411,7 +4489,6 @@
         <w:rPr>
           <w:rFonts w:ascii="Times New Roman" w:hAnsi="Times New Roman" w:cs="Times New Roman"/>
         </w:rPr>
-        <w:lastRenderedPageBreak/>
         <w:t>Sesuai dengan gambaran umum proyek,</w:t>
       </w:r>
       <w:r>
@@ -4440,6 +4517,7 @@
         <w:pStyle w:val="Heading5"/>
       </w:pPr>
       <w:r>
+        <w:lastRenderedPageBreak/>
         <w:t xml:space="preserve">Penggabungan </w:t>
       </w:r>
       <w:r>
@@ -4582,7 +4660,7 @@
           <w:noProof/>
         </w:rPr>
         <w:drawing>
-          <wp:inline distT="0" distB="0" distL="0" distR="0" wp14:anchorId="02EBA956" wp14:editId="1CE4E1D3">
+          <wp:inline distT="0" distB="0" distL="0" distR="0" wp14:anchorId="02EBA956" wp14:editId="0D9394A3">
             <wp:extent cx="3888000" cy="2160000"/>
             <wp:effectExtent l="19050" t="19050" r="17780" b="12065"/>
             <wp:docPr id="102117401" name="Picture 5"/>
@@ -4599,7 +4677,7 @@
                     </pic:cNvPicPr>
                   </pic:nvPicPr>
                   <pic:blipFill>
-                    <a:blip r:embed="rId12" cstate="print">
+                    <a:blip r:embed="rId18" cstate="print">
                       <a:extLst>
                         <a:ext uri="{28A0092B-C50C-407E-A947-70E740481C1C}">
                           <a14:useLocalDpi xmlns:a14="http://schemas.microsoft.com/office/drawing/2010/main" val="0"/>
@@ -4636,35 +4714,40 @@
     <w:p>
       <w:pPr>
         <w:pStyle w:val="Caption"/>
-        <w:spacing w:line="480" w:lineRule="auto"/>
         <w:jc w:val="center"/>
         <w:rPr>
           <w:rFonts w:ascii="Times New Roman" w:hAnsi="Times New Roman" w:cs="Times New Roman"/>
         </w:rPr>
       </w:pPr>
-      <w:r>
-        <w:t>G</w:t>
-      </w:r>
-      <w:r>
-        <w:t xml:space="preserve">ambar </w:t>
-      </w:r>
-      <w:fldSimple w:instr=" SEQ Gambar \* ARABIC ">
-        <w:r>
-          <w:rPr>
-            <w:noProof/>
-          </w:rPr>
-          <w:t>5</w:t>
-        </w:r>
-      </w:fldSimple>
-      <w:r>
-        <w:t xml:space="preserve"> Cuplikan </w:t>
-      </w:r>
-      <w:r>
-        <w:t>sintaks</w:t>
-      </w:r>
-      <w:r>
-        <w:t xml:space="preserve"> penggabungan dataset</w:t>
-      </w:r>
+      <w:bookmarkStart w:id="4" w:name="_Toc200446298"/>
+      <w:r>
+        <w:t xml:space="preserve">Gambar 3. </w:t>
+      </w:r>
+      <w:r>
+        <w:fldChar w:fldCharType="begin"/>
+      </w:r>
+      <w:r>
+        <w:instrText xml:space="preserve"> SEQ Gambar_3. \* ARABIC </w:instrText>
+      </w:r>
+      <w:r>
+        <w:fldChar w:fldCharType="separate"/>
+      </w:r>
+      <w:r>
+        <w:rPr>
+          <w:noProof/>
+        </w:rPr>
+        <w:t>3</w:t>
+      </w:r>
+      <w:r>
+        <w:fldChar w:fldCharType="end"/>
+      </w:r>
+      <w:r>
+        <w:t xml:space="preserve"> c</w:t>
+      </w:r>
+      <w:r>
+        <w:t>uplikan sintaks penggabungan dataset</w:t>
+      </w:r>
+      <w:bookmarkEnd w:id="4"/>
     </w:p>
     <w:p>
       <w:pPr>
@@ -4697,7 +4780,7 @@
                     </pic:cNvPicPr>
                   </pic:nvPicPr>
                   <pic:blipFill>
-                    <a:blip r:embed="rId13">
+                    <a:blip r:embed="rId19">
                       <a:extLst>
                         <a:ext uri="{28A0092B-C50C-407E-A947-70E740481C1C}">
                           <a14:useLocalDpi xmlns:a14="http://schemas.microsoft.com/office/drawing/2010/main" val="0"/>
@@ -4740,20 +4823,35 @@
           <w:rFonts w:ascii="Times New Roman" w:hAnsi="Times New Roman" w:cs="Times New Roman"/>
         </w:rPr>
       </w:pPr>
-      <w:r>
-        <w:t xml:space="preserve">Gambar </w:t>
-      </w:r>
-      <w:fldSimple w:instr=" SEQ Gambar \* ARABIC ">
-        <w:r>
-          <w:rPr>
-            <w:noProof/>
-          </w:rPr>
-          <w:t>6</w:t>
-        </w:r>
-      </w:fldSimple>
-      <w:r>
-        <w:t xml:space="preserve"> Berkas sebelum &amp; sesudah penggabungan</w:t>
-      </w:r>
+      <w:bookmarkStart w:id="5" w:name="_Toc200446299"/>
+      <w:r>
+        <w:t xml:space="preserve">Gambar 3. </w:t>
+      </w:r>
+      <w:r>
+        <w:fldChar w:fldCharType="begin"/>
+      </w:r>
+      <w:r>
+        <w:instrText xml:space="preserve"> SEQ Gambar_3. \* ARABIC </w:instrText>
+      </w:r>
+      <w:r>
+        <w:fldChar w:fldCharType="separate"/>
+      </w:r>
+      <w:r>
+        <w:rPr>
+          <w:noProof/>
+        </w:rPr>
+        <w:t>4</w:t>
+      </w:r>
+      <w:r>
+        <w:fldChar w:fldCharType="end"/>
+      </w:r>
+      <w:r>
+        <w:t xml:space="preserve"> b</w:t>
+      </w:r>
+      <w:r>
+        <w:t>erkas sebelum &amp; sesudah penggabungan</w:t>
+      </w:r>
+      <w:bookmarkEnd w:id="5"/>
     </w:p>
     <w:p>
       <w:pPr>
@@ -4873,7 +4971,7 @@
           <w:noProof/>
         </w:rPr>
         <w:drawing>
-          <wp:inline distT="0" distB="0" distL="0" distR="0" wp14:anchorId="7A542151" wp14:editId="11B9B86D">
+          <wp:inline distT="0" distB="0" distL="0" distR="0" wp14:anchorId="7A542151" wp14:editId="19DEA604">
             <wp:extent cx="3418966" cy="1800000"/>
             <wp:effectExtent l="19050" t="19050" r="10160" b="10160"/>
             <wp:docPr id="1182821816" name="Picture 3"/>
@@ -4890,7 +4988,7 @@
                     </pic:cNvPicPr>
                   </pic:nvPicPr>
                   <pic:blipFill>
-                    <a:blip r:embed="rId14" cstate="print">
+                    <a:blip r:embed="rId20" cstate="print">
                       <a:extLst>
                         <a:ext uri="{28A0092B-C50C-407E-A947-70E740481C1C}">
                           <a14:useLocalDpi xmlns:a14="http://schemas.microsoft.com/office/drawing/2010/main" val="0"/>
@@ -4933,20 +5031,35 @@
           <w:rFonts w:ascii="Times New Roman" w:hAnsi="Times New Roman" w:cs="Times New Roman"/>
         </w:rPr>
       </w:pPr>
-      <w:r>
-        <w:t xml:space="preserve">Gambar </w:t>
-      </w:r>
-      <w:fldSimple w:instr=" SEQ Gambar \* ARABIC ">
-        <w:r>
-          <w:rPr>
-            <w:noProof/>
-          </w:rPr>
-          <w:t>7</w:t>
-        </w:r>
-      </w:fldSimple>
-      <w:r>
-        <w:t xml:space="preserve"> Brainstorming pemilihan kolom menggunakan Notepad</w:t>
-      </w:r>
+      <w:bookmarkStart w:id="6" w:name="_Toc200446300"/>
+      <w:r>
+        <w:t xml:space="preserve">Gambar 3. </w:t>
+      </w:r>
+      <w:r>
+        <w:fldChar w:fldCharType="begin"/>
+      </w:r>
+      <w:r>
+        <w:instrText xml:space="preserve"> SEQ Gambar_3. \* ARABIC </w:instrText>
+      </w:r>
+      <w:r>
+        <w:fldChar w:fldCharType="separate"/>
+      </w:r>
+      <w:r>
+        <w:rPr>
+          <w:noProof/>
+        </w:rPr>
+        <w:t>5</w:t>
+      </w:r>
+      <w:r>
+        <w:fldChar w:fldCharType="end"/>
+      </w:r>
+      <w:r>
+        <w:t xml:space="preserve"> b</w:t>
+      </w:r>
+      <w:r>
+        <w:t>rainstorming pemilihan kolom menggunakan Notepad</w:t>
+      </w:r>
+      <w:bookmarkEnd w:id="6"/>
     </w:p>
     <w:p>
       <w:pPr>
@@ -4962,7 +5075,7 @@
         </w:rPr>
         <w:lastRenderedPageBreak/>
         <w:drawing>
-          <wp:inline distT="0" distB="0" distL="0" distR="0" wp14:anchorId="3D1861C2" wp14:editId="180BA4B0">
+          <wp:inline distT="0" distB="0" distL="0" distR="0" wp14:anchorId="3D1861C2" wp14:editId="7EA4F883">
             <wp:extent cx="2176464" cy="2160000"/>
             <wp:effectExtent l="19050" t="19050" r="14605" b="12065"/>
             <wp:docPr id="471594841" name="Picture 1"/>
@@ -4979,7 +5092,7 @@
                     </pic:cNvPicPr>
                   </pic:nvPicPr>
                   <pic:blipFill>
-                    <a:blip r:embed="rId15" cstate="print">
+                    <a:blip r:embed="rId21" cstate="print">
                       <a:extLst>
                         <a:ext uri="{28A0092B-C50C-407E-A947-70E740481C1C}">
                           <a14:useLocalDpi xmlns:a14="http://schemas.microsoft.com/office/drawing/2010/main" val="0"/>
@@ -5022,26 +5135,35 @@
           <w:rFonts w:ascii="Times New Roman" w:hAnsi="Times New Roman" w:cs="Times New Roman"/>
         </w:rPr>
       </w:pPr>
-      <w:r>
-        <w:t xml:space="preserve">Gambar </w:t>
-      </w:r>
-      <w:fldSimple w:instr=" SEQ Gambar \* ARABIC ">
-        <w:r>
-          <w:rPr>
-            <w:noProof/>
-          </w:rPr>
-          <w:t>8</w:t>
-        </w:r>
-      </w:fldSimple>
-      <w:r>
-        <w:t xml:space="preserve"> </w:t>
-      </w:r>
-      <w:r>
-        <w:t>Sintaks</w:t>
-      </w:r>
-      <w:r>
-        <w:t xml:space="preserve"> realisasi brainstorming</w:t>
-      </w:r>
+      <w:bookmarkStart w:id="7" w:name="_Toc200446301"/>
+      <w:r>
+        <w:t xml:space="preserve">Gambar 3. </w:t>
+      </w:r>
+      <w:r>
+        <w:fldChar w:fldCharType="begin"/>
+      </w:r>
+      <w:r>
+        <w:instrText xml:space="preserve"> SEQ Gambar_3. \* ARABIC </w:instrText>
+      </w:r>
+      <w:r>
+        <w:fldChar w:fldCharType="separate"/>
+      </w:r>
+      <w:r>
+        <w:rPr>
+          <w:noProof/>
+        </w:rPr>
+        <w:t>6</w:t>
+      </w:r>
+      <w:r>
+        <w:fldChar w:fldCharType="end"/>
+      </w:r>
+      <w:r>
+        <w:t xml:space="preserve"> s</w:t>
+      </w:r>
+      <w:r>
+        <w:t>intaks realisasi brainstorming</w:t>
+      </w:r>
+      <w:bookmarkEnd w:id="7"/>
     </w:p>
     <w:p>
       <w:pPr>
@@ -5073,7 +5195,7 @@
                     </pic:cNvPicPr>
                   </pic:nvPicPr>
                   <pic:blipFill>
-                    <a:blip r:embed="rId16" cstate="print">
+                    <a:blip r:embed="rId22" cstate="print">
                       <a:extLst>
                         <a:ext uri="{28A0092B-C50C-407E-A947-70E740481C1C}">
                           <a14:useLocalDpi xmlns:a14="http://schemas.microsoft.com/office/drawing/2010/main" val="0"/>
@@ -5116,20 +5238,35 @@
           <w:rFonts w:ascii="Times New Roman" w:hAnsi="Times New Roman" w:cs="Times New Roman"/>
         </w:rPr>
       </w:pPr>
-      <w:r>
-        <w:t xml:space="preserve">Gambar </w:t>
-      </w:r>
-      <w:fldSimple w:instr=" SEQ Gambar \* ARABIC ">
-        <w:r>
-          <w:rPr>
-            <w:noProof/>
-          </w:rPr>
-          <w:t>9</w:t>
-        </w:r>
-      </w:fldSimple>
-      <w:r>
-        <w:t xml:space="preserve"> Hasil realisasi brainstorming pemilihan kolom</w:t>
-      </w:r>
+      <w:bookmarkStart w:id="8" w:name="_Toc200446302"/>
+      <w:r>
+        <w:t xml:space="preserve">Gambar 3. </w:t>
+      </w:r>
+      <w:r>
+        <w:fldChar w:fldCharType="begin"/>
+      </w:r>
+      <w:r>
+        <w:instrText xml:space="preserve"> SEQ Gambar_3. \* ARABIC </w:instrText>
+      </w:r>
+      <w:r>
+        <w:fldChar w:fldCharType="separate"/>
+      </w:r>
+      <w:r>
+        <w:rPr>
+          <w:noProof/>
+        </w:rPr>
+        <w:t>7</w:t>
+      </w:r>
+      <w:r>
+        <w:fldChar w:fldCharType="end"/>
+      </w:r>
+      <w:r>
+        <w:t xml:space="preserve"> h</w:t>
+      </w:r>
+      <w:r>
+        <w:t>asil realisasi brainstorming pemilihan kolom</w:t>
+      </w:r>
+      <w:bookmarkEnd w:id="8"/>
     </w:p>
     <w:p>
       <w:pPr>
@@ -5302,7 +5439,7 @@
                     </pic:cNvPicPr>
                   </pic:nvPicPr>
                   <pic:blipFill>
-                    <a:blip r:embed="rId17" cstate="print">
+                    <a:blip r:embed="rId23" cstate="print">
                       <a:extLst>
                         <a:ext uri="{28A0092B-C50C-407E-A947-70E740481C1C}">
                           <a14:useLocalDpi xmlns:a14="http://schemas.microsoft.com/office/drawing/2010/main" val="0"/>
@@ -5346,20 +5483,35 @@
           <w:color w:val="auto"/>
         </w:rPr>
       </w:pPr>
-      <w:r>
-        <w:t xml:space="preserve">Gambar </w:t>
-      </w:r>
-      <w:fldSimple w:instr=" SEQ Gambar \* ARABIC ">
-        <w:r>
-          <w:rPr>
-            <w:noProof/>
-          </w:rPr>
-          <w:t>10</w:t>
-        </w:r>
-      </w:fldSimple>
-      <w:r>
-        <w:t xml:space="preserve"> Struktrur dataset (data mentah)</w:t>
-      </w:r>
+      <w:bookmarkStart w:id="9" w:name="_Toc200446303"/>
+      <w:r>
+        <w:t xml:space="preserve">Gambar 3. </w:t>
+      </w:r>
+      <w:r>
+        <w:fldChar w:fldCharType="begin"/>
+      </w:r>
+      <w:r>
+        <w:instrText xml:space="preserve"> SEQ Gambar_3. \* ARABIC </w:instrText>
+      </w:r>
+      <w:r>
+        <w:fldChar w:fldCharType="separate"/>
+      </w:r>
+      <w:r>
+        <w:rPr>
+          <w:noProof/>
+        </w:rPr>
+        <w:t>8</w:t>
+      </w:r>
+      <w:r>
+        <w:fldChar w:fldCharType="end"/>
+      </w:r>
+      <w:r>
+        <w:t xml:space="preserve"> </w:t>
+      </w:r>
+      <w:r>
+        <w:t>Struktrur dataset (data mentah)</w:t>
+      </w:r>
+      <w:bookmarkEnd w:id="9"/>
     </w:p>
     <w:p>
       <w:pPr>
@@ -5526,7 +5678,7 @@
                     </pic:cNvPicPr>
                   </pic:nvPicPr>
                   <pic:blipFill>
-                    <a:blip r:embed="rId18">
+                    <a:blip r:embed="rId24">
                       <a:extLst>
                         <a:ext uri="{28A0092B-C50C-407E-A947-70E740481C1C}">
                           <a14:useLocalDpi xmlns:a14="http://schemas.microsoft.com/office/drawing/2010/main" val="0"/>
@@ -5569,20 +5721,35 @@
           <w:rFonts w:ascii="Times New Roman" w:hAnsi="Times New Roman" w:cs="Times New Roman"/>
         </w:rPr>
       </w:pPr>
-      <w:r>
-        <w:t xml:space="preserve">Gambar </w:t>
-      </w:r>
-      <w:fldSimple w:instr=" SEQ Gambar \* ARABIC ">
-        <w:r>
-          <w:rPr>
-            <w:noProof/>
-          </w:rPr>
-          <w:t>11</w:t>
-        </w:r>
-      </w:fldSimple>
-      <w:r>
-        <w:t xml:space="preserve"> Menghitung jumlah data duplikat</w:t>
-      </w:r>
+      <w:bookmarkStart w:id="10" w:name="_Toc200446304"/>
+      <w:r>
+        <w:t xml:space="preserve">Gambar 3. </w:t>
+      </w:r>
+      <w:r>
+        <w:fldChar w:fldCharType="begin"/>
+      </w:r>
+      <w:r>
+        <w:instrText xml:space="preserve"> SEQ Gambar_3. \* ARABIC </w:instrText>
+      </w:r>
+      <w:r>
+        <w:fldChar w:fldCharType="separate"/>
+      </w:r>
+      <w:r>
+        <w:rPr>
+          <w:noProof/>
+        </w:rPr>
+        <w:t>9</w:t>
+      </w:r>
+      <w:r>
+        <w:fldChar w:fldCharType="end"/>
+      </w:r>
+      <w:r>
+        <w:t xml:space="preserve"> m</w:t>
+      </w:r>
+      <w:r>
+        <w:t>enghitung jumlah data duplikat</w:t>
+      </w:r>
+      <w:bookmarkEnd w:id="10"/>
     </w:p>
     <w:p>
       <w:pPr>
@@ -5615,7 +5782,7 @@
                     </pic:cNvPicPr>
                   </pic:nvPicPr>
                   <pic:blipFill>
-                    <a:blip r:embed="rId19" cstate="print">
+                    <a:blip r:embed="rId25" cstate="print">
                       <a:extLst>
                         <a:ext uri="{28A0092B-C50C-407E-A947-70E740481C1C}">
                           <a14:useLocalDpi xmlns:a14="http://schemas.microsoft.com/office/drawing/2010/main" val="0"/>
@@ -5658,20 +5825,35 @@
           <w:rFonts w:ascii="Times New Roman" w:hAnsi="Times New Roman" w:cs="Times New Roman"/>
         </w:rPr>
       </w:pPr>
-      <w:r>
-        <w:t xml:space="preserve">Gambar </w:t>
-      </w:r>
-      <w:fldSimple w:instr=" SEQ Gambar \* ARABIC ">
-        <w:r>
-          <w:rPr>
-            <w:noProof/>
-          </w:rPr>
-          <w:t>12</w:t>
-        </w:r>
-      </w:fldSimple>
-      <w:r>
-        <w:t xml:space="preserve"> Sampel data duplikat</w:t>
-      </w:r>
+      <w:bookmarkStart w:id="11" w:name="_Toc200446305"/>
+      <w:r>
+        <w:t xml:space="preserve">Gambar 3. </w:t>
+      </w:r>
+      <w:r>
+        <w:fldChar w:fldCharType="begin"/>
+      </w:r>
+      <w:r>
+        <w:instrText xml:space="preserve"> SEQ Gambar_3. \* ARABIC </w:instrText>
+      </w:r>
+      <w:r>
+        <w:fldChar w:fldCharType="separate"/>
+      </w:r>
+      <w:r>
+        <w:rPr>
+          <w:noProof/>
+        </w:rPr>
+        <w:t>10</w:t>
+      </w:r>
+      <w:r>
+        <w:fldChar w:fldCharType="end"/>
+      </w:r>
+      <w:r>
+        <w:t xml:space="preserve"> s</w:t>
+      </w:r>
+      <w:r>
+        <w:t>ampel data duplikat</w:t>
+      </w:r>
+      <w:bookmarkEnd w:id="11"/>
     </w:p>
     <w:p>
       <w:pPr>
@@ -5732,6 +5914,7 @@
           <w:rFonts w:ascii="Times New Roman" w:hAnsi="Times New Roman" w:cs="Times New Roman"/>
         </w:rPr>
       </w:pPr>
+      <w:proofErr w:type="gramStart"/>
       <w:r>
         <w:rPr>
           <w:rFonts w:ascii="Times New Roman" w:hAnsi="Times New Roman" w:cs="Times New Roman"/>
@@ -5746,17 +5929,14 @@
           <w:i/>
           <w:iCs/>
         </w:rPr>
-        <w:t xml:space="preserve">issing  value </w:t>
-      </w:r>
-      <w:r>
-        <w:rPr>
-          <w:rFonts w:ascii="Times New Roman" w:hAnsi="Times New Roman" w:cs="Times New Roman"/>
-        </w:rPr>
-        <w:t xml:space="preserve"> adalah  satu  kondisi  dimana  terdapat  nilai  yang  tidak</w:t>
-      </w:r>
-      <w:r>
-        <w:rPr>
-          <w:rFonts w:ascii="Times New Roman" w:hAnsi="Times New Roman" w:cs="Times New Roman"/>
+        <w:t>issing  value</w:t>
+      </w:r>
+      <w:proofErr w:type="gramEnd"/>
+      <w:r>
+        <w:rPr>
+          <w:rFonts w:ascii="Times New Roman" w:hAnsi="Times New Roman" w:cs="Times New Roman"/>
+          <w:i/>
+          <w:iCs/>
         </w:rPr>
         <w:t xml:space="preserve"> </w:t>
       </w:r>
@@ -5764,8 +5944,114 @@
         <w:rPr>
           <w:rFonts w:ascii="Times New Roman" w:hAnsi="Times New Roman" w:cs="Times New Roman"/>
         </w:rPr>
-        <w:t>lengkap  atau  kosong  pada  satu  atau  beberapa  kriteria</w:t>
-      </w:r>
+        <w:t xml:space="preserve"> </w:t>
+      </w:r>
+      <w:proofErr w:type="gramStart"/>
+      <w:r>
+        <w:rPr>
+          <w:rFonts w:ascii="Times New Roman" w:hAnsi="Times New Roman" w:cs="Times New Roman"/>
+        </w:rPr>
+        <w:t>adalah  satu</w:t>
+      </w:r>
+      <w:proofErr w:type="gramEnd"/>
+      <w:r>
+        <w:rPr>
+          <w:rFonts w:ascii="Times New Roman" w:hAnsi="Times New Roman" w:cs="Times New Roman"/>
+        </w:rPr>
+        <w:t xml:space="preserve">  </w:t>
+      </w:r>
+      <w:proofErr w:type="gramStart"/>
+      <w:r>
+        <w:rPr>
+          <w:rFonts w:ascii="Times New Roman" w:hAnsi="Times New Roman" w:cs="Times New Roman"/>
+        </w:rPr>
+        <w:t>kondisi  dimana</w:t>
+      </w:r>
+      <w:proofErr w:type="gramEnd"/>
+      <w:r>
+        <w:rPr>
+          <w:rFonts w:ascii="Times New Roman" w:hAnsi="Times New Roman" w:cs="Times New Roman"/>
+        </w:rPr>
+        <w:t xml:space="preserve">  </w:t>
+      </w:r>
+      <w:proofErr w:type="gramStart"/>
+      <w:r>
+        <w:rPr>
+          <w:rFonts w:ascii="Times New Roman" w:hAnsi="Times New Roman" w:cs="Times New Roman"/>
+        </w:rPr>
+        <w:t>terdapat  nilai</w:t>
+      </w:r>
+      <w:proofErr w:type="gramEnd"/>
+      <w:r>
+        <w:rPr>
+          <w:rFonts w:ascii="Times New Roman" w:hAnsi="Times New Roman" w:cs="Times New Roman"/>
+        </w:rPr>
+        <w:t xml:space="preserve">  </w:t>
+      </w:r>
+      <w:proofErr w:type="gramStart"/>
+      <w:r>
+        <w:rPr>
+          <w:rFonts w:ascii="Times New Roman" w:hAnsi="Times New Roman" w:cs="Times New Roman"/>
+        </w:rPr>
+        <w:t>yang  tidak</w:t>
+      </w:r>
+      <w:proofErr w:type="gramEnd"/>
+      <w:r>
+        <w:rPr>
+          <w:rFonts w:ascii="Times New Roman" w:hAnsi="Times New Roman" w:cs="Times New Roman"/>
+        </w:rPr>
+        <w:t xml:space="preserve"> </w:t>
+      </w:r>
+      <w:proofErr w:type="gramStart"/>
+      <w:r>
+        <w:rPr>
+          <w:rFonts w:ascii="Times New Roman" w:hAnsi="Times New Roman" w:cs="Times New Roman"/>
+        </w:rPr>
+        <w:t>lengkap  atau</w:t>
+      </w:r>
+      <w:proofErr w:type="gramEnd"/>
+      <w:r>
+        <w:rPr>
+          <w:rFonts w:ascii="Times New Roman" w:hAnsi="Times New Roman" w:cs="Times New Roman"/>
+        </w:rPr>
+        <w:t xml:space="preserve">  </w:t>
+      </w:r>
+      <w:proofErr w:type="gramStart"/>
+      <w:r>
+        <w:rPr>
+          <w:rFonts w:ascii="Times New Roman" w:hAnsi="Times New Roman" w:cs="Times New Roman"/>
+        </w:rPr>
+        <w:t>kosong  pada</w:t>
+      </w:r>
+      <w:proofErr w:type="gramEnd"/>
+      <w:r>
+        <w:rPr>
+          <w:rFonts w:ascii="Times New Roman" w:hAnsi="Times New Roman" w:cs="Times New Roman"/>
+        </w:rPr>
+        <w:t xml:space="preserve">  </w:t>
+      </w:r>
+      <w:proofErr w:type="gramStart"/>
+      <w:r>
+        <w:rPr>
+          <w:rFonts w:ascii="Times New Roman" w:hAnsi="Times New Roman" w:cs="Times New Roman"/>
+        </w:rPr>
+        <w:t>satu  atau</w:t>
+      </w:r>
+      <w:proofErr w:type="gramEnd"/>
+      <w:r>
+        <w:rPr>
+          <w:rFonts w:ascii="Times New Roman" w:hAnsi="Times New Roman" w:cs="Times New Roman"/>
+        </w:rPr>
+        <w:t xml:space="preserve">  </w:t>
+      </w:r>
+      <w:proofErr w:type="gramStart"/>
+      <w:r>
+        <w:rPr>
+          <w:rFonts w:ascii="Times New Roman" w:hAnsi="Times New Roman" w:cs="Times New Roman"/>
+        </w:rPr>
+        <w:t>beberapa  kriteria</w:t>
+      </w:r>
+      <w:proofErr w:type="gramEnd"/>
       <w:r>
         <w:rPr>
           <w:rFonts w:ascii="Times New Roman" w:hAnsi="Times New Roman" w:cs="Times New Roman"/>
@@ -5871,7 +6157,7 @@
                     </pic:cNvPicPr>
                   </pic:nvPicPr>
                   <pic:blipFill>
-                    <a:blip r:embed="rId20">
+                    <a:blip r:embed="rId26">
                       <a:extLst>
                         <a:ext uri="{28A0092B-C50C-407E-A947-70E740481C1C}">
                           <a14:useLocalDpi xmlns:a14="http://schemas.microsoft.com/office/drawing/2010/main" val="0"/>
@@ -5914,26 +6200,35 @@
           <w:rFonts w:ascii="Times New Roman" w:hAnsi="Times New Roman" w:cs="Times New Roman"/>
         </w:rPr>
       </w:pPr>
-      <w:r>
-        <w:t xml:space="preserve">Gambar </w:t>
-      </w:r>
-      <w:fldSimple w:instr=" SEQ Gambar \* ARABIC ">
-        <w:r>
-          <w:rPr>
-            <w:noProof/>
-          </w:rPr>
-          <w:t>13</w:t>
-        </w:r>
-      </w:fldSimple>
-      <w:r>
-        <w:t xml:space="preserve"> </w:t>
-      </w:r>
-      <w:r>
-        <w:t>Sintaks</w:t>
-      </w:r>
-      <w:r>
-        <w:t xml:space="preserve"> dan hasil pengecekan missing/null values</w:t>
-      </w:r>
+      <w:bookmarkStart w:id="12" w:name="_Toc200446306"/>
+      <w:r>
+        <w:t xml:space="preserve">Gambar 3. </w:t>
+      </w:r>
+      <w:r>
+        <w:fldChar w:fldCharType="begin"/>
+      </w:r>
+      <w:r>
+        <w:instrText xml:space="preserve"> SEQ Gambar_3. \* ARABIC </w:instrText>
+      </w:r>
+      <w:r>
+        <w:fldChar w:fldCharType="separate"/>
+      </w:r>
+      <w:r>
+        <w:rPr>
+          <w:noProof/>
+        </w:rPr>
+        <w:t>11</w:t>
+      </w:r>
+      <w:r>
+        <w:fldChar w:fldCharType="end"/>
+      </w:r>
+      <w:r>
+        <w:t xml:space="preserve"> s</w:t>
+      </w:r>
+      <w:r>
+        <w:t>intaks dan hasil pengecekan missing/null values</w:t>
+      </w:r>
+      <w:bookmarkEnd w:id="12"/>
     </w:p>
     <w:p>
       <w:pPr>
@@ -6582,7 +6877,7 @@
                     </pic:cNvPicPr>
                   </pic:nvPicPr>
                   <pic:blipFill>
-                    <a:blip r:embed="rId21" cstate="print">
+                    <a:blip r:embed="rId27" cstate="print">
                       <a:extLst>
                         <a:ext uri="{28A0092B-C50C-407E-A947-70E740481C1C}">
                           <a14:useLocalDpi xmlns:a14="http://schemas.microsoft.com/office/drawing/2010/main" val="0"/>
@@ -6623,20 +6918,35 @@
           <w:rFonts w:ascii="Times New Roman" w:hAnsi="Times New Roman" w:cs="Times New Roman"/>
         </w:rPr>
       </w:pPr>
-      <w:r>
-        <w:t xml:space="preserve">Gambar </w:t>
-      </w:r>
-      <w:fldSimple w:instr=" SEQ Gambar \* ARABIC ">
-        <w:r>
-          <w:rPr>
-            <w:noProof/>
-          </w:rPr>
-          <w:t>14</w:t>
-        </w:r>
-      </w:fldSimple>
-      <w:r>
-        <w:t xml:space="preserve"> Distribusi jalur pendaftaran</w:t>
-      </w:r>
+      <w:bookmarkStart w:id="13" w:name="_Toc200446307"/>
+      <w:r>
+        <w:t xml:space="preserve">Gambar 3. </w:t>
+      </w:r>
+      <w:r>
+        <w:fldChar w:fldCharType="begin"/>
+      </w:r>
+      <w:r>
+        <w:instrText xml:space="preserve"> SEQ Gambar_3. \* ARABIC </w:instrText>
+      </w:r>
+      <w:r>
+        <w:fldChar w:fldCharType="separate"/>
+      </w:r>
+      <w:r>
+        <w:rPr>
+          <w:noProof/>
+        </w:rPr>
+        <w:t>12</w:t>
+      </w:r>
+      <w:r>
+        <w:fldChar w:fldCharType="end"/>
+      </w:r>
+      <w:r>
+        <w:t xml:space="preserve"> d</w:t>
+      </w:r>
+      <w:r>
+        <w:t>istribusi jalur pendaftaran</w:t>
+      </w:r>
+      <w:bookmarkEnd w:id="13"/>
     </w:p>
     <w:p>
       <w:pPr>
@@ -6670,7 +6980,7 @@
                     </pic:cNvPicPr>
                   </pic:nvPicPr>
                   <pic:blipFill>
-                    <a:blip r:embed="rId22">
+                    <a:blip r:embed="rId28">
                       <a:extLst>
                         <a:ext uri="{28A0092B-C50C-407E-A947-70E740481C1C}">
                           <a14:useLocalDpi xmlns:a14="http://schemas.microsoft.com/office/drawing/2010/main" val="0"/>
@@ -6711,32 +7021,35 @@
           <w:rFonts w:ascii="Times New Roman" w:hAnsi="Times New Roman" w:cs="Times New Roman"/>
         </w:rPr>
       </w:pPr>
-      <w:r>
-        <w:t xml:space="preserve">Gambar </w:t>
-      </w:r>
-      <w:fldSimple w:instr=" SEQ Gambar \* ARABIC ">
-        <w:r>
-          <w:rPr>
-            <w:noProof/>
-          </w:rPr>
-          <w:t>15</w:t>
-        </w:r>
-      </w:fldSimple>
-      <w:r>
-        <w:t xml:space="preserve"> </w:t>
-      </w:r>
-      <w:r>
-        <w:t>Distribusi</w:t>
-      </w:r>
-      <w:r>
-        <w:t xml:space="preserve"> </w:t>
+      <w:bookmarkStart w:id="14" w:name="_Toc200446308"/>
+      <w:r>
+        <w:t xml:space="preserve">Gambar 3. </w:t>
+      </w:r>
+      <w:r>
+        <w:fldChar w:fldCharType="begin"/>
+      </w:r>
+      <w:r>
+        <w:instrText xml:space="preserve"> SEQ Gambar_3. \* ARABIC </w:instrText>
+      </w:r>
+      <w:r>
+        <w:fldChar w:fldCharType="separate"/>
       </w:r>
       <w:r>
         <w:rPr>
           <w:noProof/>
         </w:rPr>
-        <w:t>tahun</w:t>
-      </w:r>
+        <w:t>13</w:t>
+      </w:r>
+      <w:r>
+        <w:fldChar w:fldCharType="end"/>
+      </w:r>
+      <w:r>
+        <w:t xml:space="preserve"> d</w:t>
+      </w:r>
+      <w:r>
+        <w:t>istribusi tahun</w:t>
+      </w:r>
+      <w:bookmarkEnd w:id="14"/>
     </w:p>
     <w:p>
       <w:pPr>
@@ -6770,7 +7083,7 @@
                     </pic:cNvPicPr>
                   </pic:nvPicPr>
                   <pic:blipFill>
-                    <a:blip r:embed="rId23" cstate="print">
+                    <a:blip r:embed="rId29" cstate="print">
                       <a:extLst>
                         <a:ext uri="{28A0092B-C50C-407E-A947-70E740481C1C}">
                           <a14:useLocalDpi xmlns:a14="http://schemas.microsoft.com/office/drawing/2010/main" val="0"/>
@@ -6811,23 +7124,35 @@
           <w:rFonts w:ascii="Times New Roman" w:hAnsi="Times New Roman" w:cs="Times New Roman"/>
         </w:rPr>
       </w:pPr>
-      <w:r>
-        <w:t xml:space="preserve">Gambar </w:t>
-      </w:r>
-      <w:fldSimple w:instr=" SEQ Gambar \* ARABIC ">
-        <w:r>
-          <w:rPr>
-            <w:noProof/>
-          </w:rPr>
-          <w:t>16</w:t>
-        </w:r>
-      </w:fldSimple>
-      <w:r>
-        <w:t xml:space="preserve"> Distribusi </w:t>
-      </w:r>
-      <w:r>
-        <w:t>prodi pilihan 1</w:t>
-      </w:r>
+      <w:bookmarkStart w:id="15" w:name="_Toc200446309"/>
+      <w:r>
+        <w:t xml:space="preserve">Gambar 3. </w:t>
+      </w:r>
+      <w:r>
+        <w:fldChar w:fldCharType="begin"/>
+      </w:r>
+      <w:r>
+        <w:instrText xml:space="preserve"> SEQ Gambar_3. \* ARABIC </w:instrText>
+      </w:r>
+      <w:r>
+        <w:fldChar w:fldCharType="separate"/>
+      </w:r>
+      <w:r>
+        <w:rPr>
+          <w:noProof/>
+        </w:rPr>
+        <w:t>14</w:t>
+      </w:r>
+      <w:r>
+        <w:fldChar w:fldCharType="end"/>
+      </w:r>
+      <w:r>
+        <w:t xml:space="preserve"> d</w:t>
+      </w:r>
+      <w:r>
+        <w:t>istribusi prodi pilihan 1</w:t>
+      </w:r>
+      <w:bookmarkEnd w:id="15"/>
     </w:p>
     <w:p>
       <w:pPr>
@@ -6860,7 +7185,7 @@
                     </pic:cNvPicPr>
                   </pic:nvPicPr>
                   <pic:blipFill>
-                    <a:blip r:embed="rId24" cstate="print">
+                    <a:blip r:embed="rId30" cstate="print">
                       <a:extLst>
                         <a:ext uri="{28A0092B-C50C-407E-A947-70E740481C1C}">
                           <a14:useLocalDpi xmlns:a14="http://schemas.microsoft.com/office/drawing/2010/main" val="0"/>
@@ -6895,29 +7220,40 @@
     <w:p>
       <w:pPr>
         <w:pStyle w:val="Caption"/>
-        <w:spacing w:line="480" w:lineRule="auto"/>
         <w:jc w:val="center"/>
         <w:rPr>
           <w:rFonts w:ascii="Times New Roman" w:hAnsi="Times New Roman" w:cs="Times New Roman"/>
         </w:rPr>
       </w:pPr>
-      <w:r>
-        <w:t xml:space="preserve">Gambar </w:t>
-      </w:r>
-      <w:fldSimple w:instr=" SEQ Gambar \* ARABIC ">
-        <w:r>
-          <w:rPr>
-            <w:noProof/>
-          </w:rPr>
-          <w:t>17</w:t>
-        </w:r>
-      </w:fldSimple>
-      <w:r>
-        <w:t xml:space="preserve"> Distribusi </w:t>
-      </w:r>
-      <w:r>
-        <w:t>fakultas prodi pilihan 1</w:t>
-      </w:r>
+      <w:bookmarkStart w:id="16" w:name="_Toc200446310"/>
+      <w:r>
+        <w:t xml:space="preserve">Gambar 3. </w:t>
+      </w:r>
+      <w:r>
+        <w:fldChar w:fldCharType="begin"/>
+      </w:r>
+      <w:r>
+        <w:instrText xml:space="preserve"> SEQ Gambar_3. \* ARABIC </w:instrText>
+      </w:r>
+      <w:r>
+        <w:fldChar w:fldCharType="separate"/>
+      </w:r>
+      <w:r>
+        <w:rPr>
+          <w:noProof/>
+        </w:rPr>
+        <w:t>15</w:t>
+      </w:r>
+      <w:r>
+        <w:fldChar w:fldCharType="end"/>
+      </w:r>
+      <w:r>
+        <w:t xml:space="preserve"> d</w:t>
+      </w:r>
+      <w:r>
+        <w:t>istribusi fakultas prodi pilihan 1</w:t>
+      </w:r>
+      <w:bookmarkEnd w:id="16"/>
     </w:p>
     <w:p>
       <w:pPr>
@@ -6934,7 +7270,7 @@
         </w:rPr>
         <w:lastRenderedPageBreak/>
         <w:drawing>
-          <wp:inline distT="0" distB="0" distL="0" distR="0" wp14:anchorId="5EBC01C6" wp14:editId="0BD8D262">
+          <wp:inline distT="0" distB="0" distL="0" distR="0" wp14:anchorId="5EBC01C6" wp14:editId="65B8D3DF">
             <wp:extent cx="4320000" cy="4658802"/>
             <wp:effectExtent l="0" t="0" r="4445" b="8890"/>
             <wp:docPr id="1878337612" name="Picture 9"/>
@@ -6951,7 +7287,7 @@
                     </pic:cNvPicPr>
                   </pic:nvPicPr>
                   <pic:blipFill>
-                    <a:blip r:embed="rId25" cstate="print">
+                    <a:blip r:embed="rId31" cstate="print">
                       <a:extLst>
                         <a:ext uri="{28A0092B-C50C-407E-A947-70E740481C1C}">
                           <a14:useLocalDpi xmlns:a14="http://schemas.microsoft.com/office/drawing/2010/main" val="0"/>
@@ -6992,23 +7328,35 @@
           <w:rFonts w:ascii="Times New Roman" w:hAnsi="Times New Roman" w:cs="Times New Roman"/>
         </w:rPr>
       </w:pPr>
-      <w:r>
-        <w:t xml:space="preserve">Gambar </w:t>
-      </w:r>
-      <w:fldSimple w:instr=" SEQ Gambar \* ARABIC ">
-        <w:r>
-          <w:rPr>
-            <w:noProof/>
-          </w:rPr>
-          <w:t>18</w:t>
-        </w:r>
-      </w:fldSimple>
-      <w:r>
-        <w:t xml:space="preserve"> Distribusi </w:t>
-      </w:r>
-      <w:r>
-        <w:t>prodi pilihan 2</w:t>
-      </w:r>
+      <w:bookmarkStart w:id="17" w:name="_Toc200446311"/>
+      <w:r>
+        <w:t xml:space="preserve">Gambar 3. </w:t>
+      </w:r>
+      <w:r>
+        <w:fldChar w:fldCharType="begin"/>
+      </w:r>
+      <w:r>
+        <w:instrText xml:space="preserve"> SEQ Gambar_3. \* ARABIC </w:instrText>
+      </w:r>
+      <w:r>
+        <w:fldChar w:fldCharType="separate"/>
+      </w:r>
+      <w:r>
+        <w:rPr>
+          <w:noProof/>
+        </w:rPr>
+        <w:t>16</w:t>
+      </w:r>
+      <w:r>
+        <w:fldChar w:fldCharType="end"/>
+      </w:r>
+      <w:r>
+        <w:t xml:space="preserve"> d</w:t>
+      </w:r>
+      <w:r>
+        <w:t>istribusi prodi pilihan 2</w:t>
+      </w:r>
+      <w:bookmarkEnd w:id="17"/>
     </w:p>
     <w:p>
       <w:pPr>
@@ -7024,7 +7372,7 @@
           <w:noProof/>
         </w:rPr>
         <w:drawing>
-          <wp:inline distT="0" distB="0" distL="0" distR="0" wp14:anchorId="733B8FED" wp14:editId="4E902B45">
+          <wp:inline distT="0" distB="0" distL="0" distR="0" wp14:anchorId="733B8FED" wp14:editId="4AB6E696">
             <wp:extent cx="4320000" cy="2058826"/>
             <wp:effectExtent l="0" t="0" r="4445" b="0"/>
             <wp:docPr id="55094509" name="Picture 10"/>
@@ -7041,7 +7389,7 @@
                     </pic:cNvPicPr>
                   </pic:nvPicPr>
                   <pic:blipFill>
-                    <a:blip r:embed="rId26" cstate="print">
+                    <a:blip r:embed="rId32" cstate="print">
                       <a:extLst>
                         <a:ext uri="{28A0092B-C50C-407E-A947-70E740481C1C}">
                           <a14:useLocalDpi xmlns:a14="http://schemas.microsoft.com/office/drawing/2010/main" val="0"/>
@@ -7076,29 +7424,40 @@
     <w:p>
       <w:pPr>
         <w:pStyle w:val="Caption"/>
-        <w:spacing w:line="480" w:lineRule="auto"/>
         <w:jc w:val="center"/>
         <w:rPr>
           <w:rFonts w:ascii="Times New Roman" w:hAnsi="Times New Roman" w:cs="Times New Roman"/>
         </w:rPr>
       </w:pPr>
-      <w:r>
-        <w:t xml:space="preserve">Gambar </w:t>
-      </w:r>
-      <w:fldSimple w:instr=" SEQ Gambar \* ARABIC ">
-        <w:r>
-          <w:rPr>
-            <w:noProof/>
-          </w:rPr>
-          <w:t>19</w:t>
-        </w:r>
-      </w:fldSimple>
-      <w:r>
-        <w:t xml:space="preserve"> Distribusi </w:t>
-      </w:r>
-      <w:r>
-        <w:t>fakultas prodi pilihan 2</w:t>
-      </w:r>
+      <w:bookmarkStart w:id="18" w:name="_Toc200446312"/>
+      <w:r>
+        <w:t xml:space="preserve">Gambar 3. </w:t>
+      </w:r>
+      <w:r>
+        <w:fldChar w:fldCharType="begin"/>
+      </w:r>
+      <w:r>
+        <w:instrText xml:space="preserve"> SEQ Gambar_3. \* ARABIC </w:instrText>
+      </w:r>
+      <w:r>
+        <w:fldChar w:fldCharType="separate"/>
+      </w:r>
+      <w:r>
+        <w:rPr>
+          <w:noProof/>
+        </w:rPr>
+        <w:t>17</w:t>
+      </w:r>
+      <w:r>
+        <w:fldChar w:fldCharType="end"/>
+      </w:r>
+      <w:r>
+        <w:t xml:space="preserve"> d</w:t>
+      </w:r>
+      <w:r>
+        <w:t>istribusi fakultas prodi pilihan 2</w:t>
+      </w:r>
+      <w:bookmarkEnd w:id="18"/>
     </w:p>
     <w:p>
       <w:pPr>
@@ -7132,7 +7491,7 @@
                     </pic:cNvPicPr>
                   </pic:nvPicPr>
                   <pic:blipFill>
-                    <a:blip r:embed="rId27" cstate="print">
+                    <a:blip r:embed="rId33" cstate="print">
                       <a:extLst>
                         <a:ext uri="{28A0092B-C50C-407E-A947-70E740481C1C}">
                           <a14:useLocalDpi xmlns:a14="http://schemas.microsoft.com/office/drawing/2010/main" val="0"/>
@@ -7173,23 +7532,35 @@
           <w:rFonts w:ascii="Times New Roman" w:hAnsi="Times New Roman" w:cs="Times New Roman"/>
         </w:rPr>
       </w:pPr>
-      <w:r>
-        <w:t xml:space="preserve">Gambar </w:t>
-      </w:r>
-      <w:fldSimple w:instr=" SEQ Gambar \* ARABIC ">
-        <w:r>
-          <w:rPr>
-            <w:noProof/>
-          </w:rPr>
-          <w:t>20</w:t>
-        </w:r>
-      </w:fldSimple>
-      <w:r>
-        <w:t xml:space="preserve"> Distribusi </w:t>
-      </w:r>
-      <w:r>
-        <w:t>prodi diterima</w:t>
-      </w:r>
+      <w:bookmarkStart w:id="19" w:name="_Toc200446313"/>
+      <w:r>
+        <w:t xml:space="preserve">Gambar 3. </w:t>
+      </w:r>
+      <w:r>
+        <w:fldChar w:fldCharType="begin"/>
+      </w:r>
+      <w:r>
+        <w:instrText xml:space="preserve"> SEQ Gambar_3. \* ARABIC </w:instrText>
+      </w:r>
+      <w:r>
+        <w:fldChar w:fldCharType="separate"/>
+      </w:r>
+      <w:r>
+        <w:rPr>
+          <w:noProof/>
+        </w:rPr>
+        <w:t>18</w:t>
+      </w:r>
+      <w:r>
+        <w:fldChar w:fldCharType="end"/>
+      </w:r>
+      <w:r>
+        <w:t xml:space="preserve"> d</w:t>
+      </w:r>
+      <w:r>
+        <w:t>istribusi prodi diterima</w:t>
+      </w:r>
+      <w:bookmarkEnd w:id="19"/>
     </w:p>
     <w:p>
       <w:pPr>
@@ -7205,7 +7576,7 @@
           <w:noProof/>
         </w:rPr>
         <w:drawing>
-          <wp:inline distT="0" distB="0" distL="0" distR="0" wp14:anchorId="314D0ACC" wp14:editId="66EA88D4">
+          <wp:inline distT="0" distB="0" distL="0" distR="0" wp14:anchorId="314D0ACC" wp14:editId="01DB0762">
             <wp:extent cx="4320000" cy="2070296"/>
             <wp:effectExtent l="0" t="0" r="4445" b="6350"/>
             <wp:docPr id="1341359440" name="Picture 12"/>
@@ -7222,7 +7593,7 @@
                     </pic:cNvPicPr>
                   </pic:nvPicPr>
                   <pic:blipFill>
-                    <a:blip r:embed="rId28" cstate="print">
+                    <a:blip r:embed="rId34" cstate="print">
                       <a:extLst>
                         <a:ext uri="{28A0092B-C50C-407E-A947-70E740481C1C}">
                           <a14:useLocalDpi xmlns:a14="http://schemas.microsoft.com/office/drawing/2010/main" val="0"/>
@@ -7263,23 +7634,35 @@
           <w:rFonts w:ascii="Times New Roman" w:hAnsi="Times New Roman" w:cs="Times New Roman"/>
         </w:rPr>
       </w:pPr>
-      <w:r>
-        <w:t xml:space="preserve">Gambar </w:t>
-      </w:r>
-      <w:fldSimple w:instr=" SEQ Gambar \* ARABIC ">
-        <w:r>
-          <w:rPr>
-            <w:noProof/>
-          </w:rPr>
-          <w:t>21</w:t>
-        </w:r>
-      </w:fldSimple>
-      <w:r>
-        <w:t xml:space="preserve"> Distribusi </w:t>
-      </w:r>
-      <w:r>
-        <w:t>fakultas prodi diterima</w:t>
-      </w:r>
+      <w:bookmarkStart w:id="20" w:name="_Toc200446314"/>
+      <w:r>
+        <w:t xml:space="preserve">Gambar 3. </w:t>
+      </w:r>
+      <w:r>
+        <w:fldChar w:fldCharType="begin"/>
+      </w:r>
+      <w:r>
+        <w:instrText xml:space="preserve"> SEQ Gambar_3. \* ARABIC </w:instrText>
+      </w:r>
+      <w:r>
+        <w:fldChar w:fldCharType="separate"/>
+      </w:r>
+      <w:r>
+        <w:rPr>
+          <w:noProof/>
+        </w:rPr>
+        <w:t>19</w:t>
+      </w:r>
+      <w:r>
+        <w:fldChar w:fldCharType="end"/>
+      </w:r>
+      <w:r>
+        <w:t xml:space="preserve"> d</w:t>
+      </w:r>
+      <w:r>
+        <w:t>istribusi fakultas prodi diterima</w:t>
+      </w:r>
+      <w:bookmarkEnd w:id="20"/>
     </w:p>
     <w:p>
       <w:pPr>
@@ -7313,7 +7696,7 @@
                     </pic:cNvPicPr>
                   </pic:nvPicPr>
                   <pic:blipFill>
-                    <a:blip r:embed="rId29">
+                    <a:blip r:embed="rId35">
                       <a:extLst>
                         <a:ext uri="{28A0092B-C50C-407E-A947-70E740481C1C}">
                           <a14:useLocalDpi xmlns:a14="http://schemas.microsoft.com/office/drawing/2010/main" val="0"/>
@@ -7354,23 +7737,35 @@
           <w:rFonts w:ascii="Times New Roman" w:hAnsi="Times New Roman" w:cs="Times New Roman"/>
         </w:rPr>
       </w:pPr>
-      <w:r>
-        <w:t xml:space="preserve">Gambar </w:t>
-      </w:r>
-      <w:fldSimple w:instr=" SEQ Gambar \* ARABIC ">
-        <w:r>
-          <w:rPr>
-            <w:noProof/>
-          </w:rPr>
-          <w:t>22</w:t>
-        </w:r>
-      </w:fldSimple>
-      <w:r>
-        <w:t xml:space="preserve"> Distribusi </w:t>
-      </w:r>
-      <w:r>
-        <w:t>usia mahasiswa baru</w:t>
-      </w:r>
+      <w:bookmarkStart w:id="21" w:name="_Toc200446315"/>
+      <w:r>
+        <w:t xml:space="preserve">Gambar 3. </w:t>
+      </w:r>
+      <w:r>
+        <w:fldChar w:fldCharType="begin"/>
+      </w:r>
+      <w:r>
+        <w:instrText xml:space="preserve"> SEQ Gambar_3. \* ARABIC </w:instrText>
+      </w:r>
+      <w:r>
+        <w:fldChar w:fldCharType="separate"/>
+      </w:r>
+      <w:r>
+        <w:rPr>
+          <w:noProof/>
+        </w:rPr>
+        <w:t>20</w:t>
+      </w:r>
+      <w:r>
+        <w:fldChar w:fldCharType="end"/>
+      </w:r>
+      <w:r>
+        <w:t xml:space="preserve"> d</w:t>
+      </w:r>
+      <w:r>
+        <w:t>istribusi usia mahasiswa baru</w:t>
+      </w:r>
+      <w:bookmarkEnd w:id="21"/>
     </w:p>
     <w:p>
       <w:pPr>
@@ -7403,7 +7798,7 @@
                     </pic:cNvPicPr>
                   </pic:nvPicPr>
                   <pic:blipFill>
-                    <a:blip r:embed="rId30" cstate="print">
+                    <a:blip r:embed="rId36" cstate="print">
                       <a:extLst>
                         <a:ext uri="{28A0092B-C50C-407E-A947-70E740481C1C}">
                           <a14:useLocalDpi xmlns:a14="http://schemas.microsoft.com/office/drawing/2010/main" val="0"/>
@@ -7444,23 +7839,35 @@
           <w:rFonts w:ascii="Times New Roman" w:hAnsi="Times New Roman" w:cs="Times New Roman"/>
         </w:rPr>
       </w:pPr>
-      <w:r>
-        <w:t xml:space="preserve">Gambar </w:t>
-      </w:r>
-      <w:fldSimple w:instr=" SEQ Gambar \* ARABIC ">
-        <w:r>
-          <w:rPr>
-            <w:noProof/>
-          </w:rPr>
-          <w:t>23</w:t>
-        </w:r>
-      </w:fldSimple>
-      <w:r>
-        <w:t xml:space="preserve"> Distribusi </w:t>
-      </w:r>
-      <w:r>
-        <w:t>jurusan SLTA</w:t>
-      </w:r>
+      <w:bookmarkStart w:id="22" w:name="_Toc200446316"/>
+      <w:r>
+        <w:t xml:space="preserve">Gambar 3. </w:t>
+      </w:r>
+      <w:r>
+        <w:fldChar w:fldCharType="begin"/>
+      </w:r>
+      <w:r>
+        <w:instrText xml:space="preserve"> SEQ Gambar_3. \* ARABIC </w:instrText>
+      </w:r>
+      <w:r>
+        <w:fldChar w:fldCharType="separate"/>
+      </w:r>
+      <w:r>
+        <w:rPr>
+          <w:noProof/>
+        </w:rPr>
+        <w:t>21</w:t>
+      </w:r>
+      <w:r>
+        <w:fldChar w:fldCharType="end"/>
+      </w:r>
+      <w:r>
+        <w:t xml:space="preserve"> d</w:t>
+      </w:r>
+      <w:r>
+        <w:t>istribusi jurusan SLTA</w:t>
+      </w:r>
+      <w:bookmarkEnd w:id="22"/>
     </w:p>
     <w:p>
       <w:pPr>
@@ -7494,7 +7901,7 @@
                     </pic:cNvPicPr>
                   </pic:nvPicPr>
                   <pic:blipFill>
-                    <a:blip r:embed="rId31">
+                    <a:blip r:embed="rId37">
                       <a:extLst>
                         <a:ext uri="{28A0092B-C50C-407E-A947-70E740481C1C}">
                           <a14:useLocalDpi xmlns:a14="http://schemas.microsoft.com/office/drawing/2010/main" val="0"/>
@@ -7535,23 +7942,35 @@
           <w:rFonts w:ascii="Times New Roman" w:hAnsi="Times New Roman" w:cs="Times New Roman"/>
         </w:rPr>
       </w:pPr>
-      <w:r>
-        <w:t xml:space="preserve">Gambar </w:t>
-      </w:r>
-      <w:fldSimple w:instr=" SEQ Gambar \* ARABIC ">
-        <w:r>
-          <w:rPr>
-            <w:noProof/>
-          </w:rPr>
-          <w:t>24</w:t>
-        </w:r>
-      </w:fldSimple>
-      <w:r>
-        <w:t xml:space="preserve"> Distribusi </w:t>
-      </w:r>
-      <w:r>
-        <w:t>pendidikan ayah</w:t>
-      </w:r>
+      <w:bookmarkStart w:id="23" w:name="_Toc200446317"/>
+      <w:r>
+        <w:t xml:space="preserve">Gambar 3. </w:t>
+      </w:r>
+      <w:r>
+        <w:fldChar w:fldCharType="begin"/>
+      </w:r>
+      <w:r>
+        <w:instrText xml:space="preserve"> SEQ Gambar_3. \* ARABIC </w:instrText>
+      </w:r>
+      <w:r>
+        <w:fldChar w:fldCharType="separate"/>
+      </w:r>
+      <w:r>
+        <w:rPr>
+          <w:noProof/>
+        </w:rPr>
+        <w:t>22</w:t>
+      </w:r>
+      <w:r>
+        <w:fldChar w:fldCharType="end"/>
+      </w:r>
+      <w:r>
+        <w:t xml:space="preserve"> d</w:t>
+      </w:r>
+      <w:r>
+        <w:t>istribusi pendidikan ayah</w:t>
+      </w:r>
+      <w:bookmarkEnd w:id="23"/>
     </w:p>
     <w:p>
       <w:pPr>
@@ -7584,7 +8003,7 @@
                     </pic:cNvPicPr>
                   </pic:nvPicPr>
                   <pic:blipFill>
-                    <a:blip r:embed="rId32">
+                    <a:blip r:embed="rId38">
                       <a:extLst>
                         <a:ext uri="{28A0092B-C50C-407E-A947-70E740481C1C}">
                           <a14:useLocalDpi xmlns:a14="http://schemas.microsoft.com/office/drawing/2010/main" val="0"/>
@@ -7625,23 +8044,35 @@
           <w:rFonts w:ascii="Times New Roman" w:hAnsi="Times New Roman" w:cs="Times New Roman"/>
         </w:rPr>
       </w:pPr>
-      <w:r>
-        <w:t xml:space="preserve">Gambar </w:t>
-      </w:r>
-      <w:fldSimple w:instr=" SEQ Gambar \* ARABIC ">
-        <w:r>
-          <w:rPr>
-            <w:noProof/>
-          </w:rPr>
-          <w:t>25</w:t>
-        </w:r>
-      </w:fldSimple>
-      <w:r>
-        <w:t xml:space="preserve"> Distribusi </w:t>
-      </w:r>
-      <w:r>
-        <w:t>pendidikan ibu</w:t>
-      </w:r>
+      <w:bookmarkStart w:id="24" w:name="_Toc200446318"/>
+      <w:r>
+        <w:t xml:space="preserve">Gambar 3. </w:t>
+      </w:r>
+      <w:r>
+        <w:fldChar w:fldCharType="begin"/>
+      </w:r>
+      <w:r>
+        <w:instrText xml:space="preserve"> SEQ Gambar_3. \* ARABIC </w:instrText>
+      </w:r>
+      <w:r>
+        <w:fldChar w:fldCharType="separate"/>
+      </w:r>
+      <w:r>
+        <w:rPr>
+          <w:noProof/>
+        </w:rPr>
+        <w:t>23</w:t>
+      </w:r>
+      <w:r>
+        <w:fldChar w:fldCharType="end"/>
+      </w:r>
+      <w:r>
+        <w:t xml:space="preserve"> d</w:t>
+      </w:r>
+      <w:r>
+        <w:t>istribusi pendidikan ibu</w:t>
+      </w:r>
+      <w:bookmarkEnd w:id="24"/>
     </w:p>
     <w:p>
       <w:pPr>
@@ -7675,7 +8106,7 @@
                     </pic:cNvPicPr>
                   </pic:nvPicPr>
                   <pic:blipFill>
-                    <a:blip r:embed="rId33">
+                    <a:blip r:embed="rId39">
                       <a:extLst>
                         <a:ext uri="{28A0092B-C50C-407E-A947-70E740481C1C}">
                           <a14:useLocalDpi xmlns:a14="http://schemas.microsoft.com/office/drawing/2010/main" val="0"/>
@@ -7716,23 +8147,35 @@
           <w:rFonts w:ascii="Times New Roman" w:hAnsi="Times New Roman" w:cs="Times New Roman"/>
         </w:rPr>
       </w:pPr>
-      <w:r>
-        <w:t xml:space="preserve">Gambar </w:t>
-      </w:r>
-      <w:fldSimple w:instr=" SEQ Gambar \* ARABIC ">
-        <w:r>
-          <w:rPr>
-            <w:noProof/>
-          </w:rPr>
-          <w:t>26</w:t>
-        </w:r>
-      </w:fldSimple>
-      <w:r>
-        <w:t xml:space="preserve"> Distribusi </w:t>
-      </w:r>
-      <w:r>
-        <w:t>pekerjaan orang tua (ibu)</w:t>
-      </w:r>
+      <w:bookmarkStart w:id="25" w:name="_Toc200446319"/>
+      <w:r>
+        <w:t xml:space="preserve">Gambar 3. </w:t>
+      </w:r>
+      <w:r>
+        <w:fldChar w:fldCharType="begin"/>
+      </w:r>
+      <w:r>
+        <w:instrText xml:space="preserve"> SEQ Gambar_3. \* ARABIC </w:instrText>
+      </w:r>
+      <w:r>
+        <w:fldChar w:fldCharType="separate"/>
+      </w:r>
+      <w:r>
+        <w:rPr>
+          <w:noProof/>
+        </w:rPr>
+        <w:t>24</w:t>
+      </w:r>
+      <w:r>
+        <w:fldChar w:fldCharType="end"/>
+      </w:r>
+      <w:r>
+        <w:t xml:space="preserve"> d</w:t>
+      </w:r>
+      <w:r>
+        <w:t>istribusi pekerjaan orang tua (ibu)</w:t>
+      </w:r>
+      <w:bookmarkEnd w:id="25"/>
     </w:p>
     <w:p>
       <w:pPr>
@@ -8269,7 +8712,7 @@
                     </pic:cNvPicPr>
                   </pic:nvPicPr>
                   <pic:blipFill>
-                    <a:blip r:embed="rId34">
+                    <a:blip r:embed="rId40">
                       <a:extLst>
                         <a:ext uri="{28A0092B-C50C-407E-A947-70E740481C1C}">
                           <a14:useLocalDpi xmlns:a14="http://schemas.microsoft.com/office/drawing/2010/main" val="0"/>
@@ -8312,23 +8755,35 @@
           <w:rFonts w:ascii="Times New Roman" w:hAnsi="Times New Roman" w:cs="Times New Roman"/>
         </w:rPr>
       </w:pPr>
-      <w:r>
-        <w:t xml:space="preserve">Gambar </w:t>
-      </w:r>
-      <w:fldSimple w:instr=" SEQ Gambar \* ARABIC ">
-        <w:r>
-          <w:rPr>
-            <w:noProof/>
-          </w:rPr>
-          <w:t>27</w:t>
-        </w:r>
-      </w:fldSimple>
-      <w:r>
-        <w:t xml:space="preserve"> Validasi ulang struktur data</w:t>
-      </w:r>
-      <w:r>
-        <w:t xml:space="preserve"> </w:t>
-      </w:r>
+      <w:bookmarkStart w:id="26" w:name="_Toc200446320"/>
+      <w:r>
+        <w:t xml:space="preserve">Gambar 3. </w:t>
+      </w:r>
+      <w:r>
+        <w:fldChar w:fldCharType="begin"/>
+      </w:r>
+      <w:r>
+        <w:instrText xml:space="preserve"> SEQ Gambar_3. \* ARABIC </w:instrText>
+      </w:r>
+      <w:r>
+        <w:fldChar w:fldCharType="separate"/>
+      </w:r>
+      <w:r>
+        <w:rPr>
+          <w:noProof/>
+        </w:rPr>
+        <w:t>25</w:t>
+      </w:r>
+      <w:r>
+        <w:fldChar w:fldCharType="end"/>
+      </w:r>
+      <w:r>
+        <w:t xml:space="preserve"> v</w:t>
+      </w:r>
+      <w:r>
+        <w:t>alidasi ulang struktur data</w:t>
+      </w:r>
+      <w:bookmarkEnd w:id="26"/>
     </w:p>
     <w:p>
       <w:pPr>
@@ -8429,7 +8884,7 @@
                     </pic:cNvPicPr>
                   </pic:nvPicPr>
                   <pic:blipFill>
-                    <a:blip r:embed="rId35">
+                    <a:blip r:embed="rId41">
                       <a:extLst>
                         <a:ext uri="{28A0092B-C50C-407E-A947-70E740481C1C}">
                           <a14:useLocalDpi xmlns:a14="http://schemas.microsoft.com/office/drawing/2010/main" val="0"/>
@@ -8472,20 +8927,35 @@
           <w:rFonts w:ascii="Times New Roman" w:hAnsi="Times New Roman" w:cs="Times New Roman"/>
         </w:rPr>
       </w:pPr>
-      <w:r>
-        <w:t xml:space="preserve">Gambar </w:t>
-      </w:r>
-      <w:fldSimple w:instr=" SEQ Gambar \* ARABIC ">
-        <w:r>
-          <w:rPr>
-            <w:noProof/>
-          </w:rPr>
-          <w:t>28</w:t>
-        </w:r>
-      </w:fldSimple>
-      <w:r>
-        <w:t xml:space="preserve"> Validasi ulang duplikasi data</w:t>
-      </w:r>
+      <w:bookmarkStart w:id="27" w:name="_Toc200446321"/>
+      <w:r>
+        <w:t xml:space="preserve">Gambar 3. </w:t>
+      </w:r>
+      <w:r>
+        <w:fldChar w:fldCharType="begin"/>
+      </w:r>
+      <w:r>
+        <w:instrText xml:space="preserve"> SEQ Gambar_3. \* ARABIC </w:instrText>
+      </w:r>
+      <w:r>
+        <w:fldChar w:fldCharType="separate"/>
+      </w:r>
+      <w:r>
+        <w:rPr>
+          <w:noProof/>
+        </w:rPr>
+        <w:t>26</w:t>
+      </w:r>
+      <w:r>
+        <w:fldChar w:fldCharType="end"/>
+      </w:r>
+      <w:r>
+        <w:t xml:space="preserve"> v</w:t>
+      </w:r>
+      <w:r>
+        <w:t>alidasi ulang duplikasi data</w:t>
+      </w:r>
+      <w:bookmarkEnd w:id="27"/>
     </w:p>
     <w:p>
       <w:pPr>
@@ -8678,7 +9148,7 @@
                     </pic:cNvPicPr>
                   </pic:nvPicPr>
                   <pic:blipFill>
-                    <a:blip r:embed="rId36">
+                    <a:blip r:embed="rId42">
                       <a:extLst>
                         <a:ext uri="{28A0092B-C50C-407E-A947-70E740481C1C}">
                           <a14:useLocalDpi xmlns:a14="http://schemas.microsoft.com/office/drawing/2010/main" val="0"/>
@@ -8721,26 +9191,35 @@
           <w:rFonts w:ascii="Times New Roman" w:hAnsi="Times New Roman" w:cs="Times New Roman"/>
         </w:rPr>
       </w:pPr>
-      <w:r>
-        <w:t xml:space="preserve">Gambar </w:t>
-      </w:r>
-      <w:fldSimple w:instr=" SEQ Gambar \* ARABIC ">
-        <w:r>
-          <w:rPr>
-            <w:noProof/>
-          </w:rPr>
-          <w:t>29</w:t>
-        </w:r>
-      </w:fldSimple>
+      <w:bookmarkStart w:id="28" w:name="_Toc200446322"/>
+      <w:r>
+        <w:t xml:space="preserve">Gambar 3. </w:t>
+      </w:r>
+      <w:r>
+        <w:fldChar w:fldCharType="begin"/>
+      </w:r>
+      <w:r>
+        <w:instrText xml:space="preserve"> SEQ Gambar_3. \* ARABIC </w:instrText>
+      </w:r>
+      <w:r>
+        <w:fldChar w:fldCharType="separate"/>
+      </w:r>
+      <w:r>
+        <w:rPr>
+          <w:noProof/>
+        </w:rPr>
+        <w:t>27</w:t>
+      </w:r>
+      <w:r>
+        <w:fldChar w:fldCharType="end"/>
+      </w:r>
       <w:r>
         <w:t xml:space="preserve"> </w:t>
       </w:r>
       <w:r>
-        <w:t>v</w:t>
-      </w:r>
-      <w:r>
-        <w:t>alidasi ulang missing/null values</w:t>
-      </w:r>
+        <w:t>validasi ulang missing/null values</w:t>
+      </w:r>
+      <w:bookmarkEnd w:id="28"/>
     </w:p>
     <w:p>
       <w:pPr>
@@ -8773,7 +9252,7 @@
                     </pic:cNvPicPr>
                   </pic:nvPicPr>
                   <pic:blipFill>
-                    <a:blip r:embed="rId37" cstate="print">
+                    <a:blip r:embed="rId43" cstate="print">
                       <a:extLst>
                         <a:ext uri="{28A0092B-C50C-407E-A947-70E740481C1C}">
                           <a14:useLocalDpi xmlns:a14="http://schemas.microsoft.com/office/drawing/2010/main" val="0"/>
@@ -8817,26 +9296,35 @@
           <w:color w:val="auto"/>
         </w:rPr>
       </w:pPr>
-      <w:r>
-        <w:t xml:space="preserve">Gambar </w:t>
-      </w:r>
-      <w:fldSimple w:instr=" SEQ Gambar \* ARABIC ">
-        <w:r>
-          <w:rPr>
-            <w:noProof/>
-          </w:rPr>
-          <w:t>30</w:t>
-        </w:r>
-      </w:fldSimple>
-      <w:r>
-        <w:t xml:space="preserve"> contoh data</w:t>
-      </w:r>
-      <w:r>
-        <w:t xml:space="preserve"> missing yang di isi</w:t>
-      </w:r>
-      <w:r>
-        <w:t xml:space="preserve"> dengan teknik imputation</w:t>
-      </w:r>
+      <w:bookmarkStart w:id="29" w:name="_Toc200446323"/>
+      <w:r>
+        <w:t xml:space="preserve">Gambar 3. </w:t>
+      </w:r>
+      <w:r>
+        <w:fldChar w:fldCharType="begin"/>
+      </w:r>
+      <w:r>
+        <w:instrText xml:space="preserve"> SEQ Gambar_3. \* ARABIC </w:instrText>
+      </w:r>
+      <w:r>
+        <w:fldChar w:fldCharType="separate"/>
+      </w:r>
+      <w:r>
+        <w:rPr>
+          <w:noProof/>
+        </w:rPr>
+        <w:t>28</w:t>
+      </w:r>
+      <w:r>
+        <w:fldChar w:fldCharType="end"/>
+      </w:r>
+      <w:r>
+        <w:t xml:space="preserve"> </w:t>
+      </w:r>
+      <w:r>
+        <w:t>contoh data missing yang di isi dengan teknik imputation</w:t>
+      </w:r>
+      <w:bookmarkEnd w:id="29"/>
     </w:p>
     <w:p>
       <w:pPr>
@@ -8969,7 +9457,7 @@
                     </pic:cNvPicPr>
                   </pic:nvPicPr>
                   <pic:blipFill>
-                    <a:blip r:embed="rId38">
+                    <a:blip r:embed="rId44">
                       <a:extLst>
                         <a:ext uri="{28A0092B-C50C-407E-A947-70E740481C1C}">
                           <a14:useLocalDpi xmlns:a14="http://schemas.microsoft.com/office/drawing/2010/main" val="0"/>
@@ -9007,20 +9495,35 @@
         <w:spacing w:line="480" w:lineRule="auto"/>
         <w:jc w:val="center"/>
       </w:pPr>
-      <w:r>
-        <w:t xml:space="preserve">Gambar </w:t>
-      </w:r>
-      <w:fldSimple w:instr=" SEQ Gambar \* ARABIC ">
-        <w:r>
-          <w:rPr>
-            <w:noProof/>
-          </w:rPr>
-          <w:t>31</w:t>
-        </w:r>
-      </w:fldSimple>
-      <w:r>
-        <w:t xml:space="preserve"> validasi ulang distribusi usia</w:t>
-      </w:r>
+      <w:bookmarkStart w:id="30" w:name="_Toc200446324"/>
+      <w:r>
+        <w:t xml:space="preserve">Gambar 3. </w:t>
+      </w:r>
+      <w:r>
+        <w:fldChar w:fldCharType="begin"/>
+      </w:r>
+      <w:r>
+        <w:instrText xml:space="preserve"> SEQ Gambar_3. \* ARABIC </w:instrText>
+      </w:r>
+      <w:r>
+        <w:fldChar w:fldCharType="separate"/>
+      </w:r>
+      <w:r>
+        <w:rPr>
+          <w:noProof/>
+        </w:rPr>
+        <w:t>29</w:t>
+      </w:r>
+      <w:r>
+        <w:fldChar w:fldCharType="end"/>
+      </w:r>
+      <w:r>
+        <w:t xml:space="preserve"> </w:t>
+      </w:r>
+      <w:r>
+        <w:t>validasi ulang distribusi usia</w:t>
+      </w:r>
+      <w:bookmarkEnd w:id="30"/>
     </w:p>
     <w:p>
       <w:pPr>
@@ -9053,7 +9556,7 @@
                     </pic:cNvPicPr>
                   </pic:nvPicPr>
                   <pic:blipFill>
-                    <a:blip r:embed="rId39" cstate="print">
+                    <a:blip r:embed="rId45" cstate="print">
                       <a:extLst>
                         <a:ext uri="{28A0092B-C50C-407E-A947-70E740481C1C}">
                           <a14:useLocalDpi xmlns:a14="http://schemas.microsoft.com/office/drawing/2010/main" val="0"/>
@@ -9091,20 +9594,35 @@
         <w:spacing w:line="480" w:lineRule="auto"/>
         <w:jc w:val="center"/>
       </w:pPr>
-      <w:r>
-        <w:t xml:space="preserve">Gambar </w:t>
-      </w:r>
-      <w:fldSimple w:instr=" SEQ Gambar \* ARABIC ">
-        <w:r>
-          <w:rPr>
-            <w:noProof/>
-          </w:rPr>
-          <w:t>32</w:t>
-        </w:r>
-      </w:fldSimple>
-      <w:r>
-        <w:t xml:space="preserve"> validasi ulang fakultas prodi diterima</w:t>
-      </w:r>
+      <w:bookmarkStart w:id="31" w:name="_Toc200446325"/>
+      <w:r>
+        <w:t xml:space="preserve">Gambar 3. </w:t>
+      </w:r>
+      <w:r>
+        <w:fldChar w:fldCharType="begin"/>
+      </w:r>
+      <w:r>
+        <w:instrText xml:space="preserve"> SEQ Gambar_3. \* ARABIC </w:instrText>
+      </w:r>
+      <w:r>
+        <w:fldChar w:fldCharType="separate"/>
+      </w:r>
+      <w:r>
+        <w:rPr>
+          <w:noProof/>
+        </w:rPr>
+        <w:t>30</w:t>
+      </w:r>
+      <w:r>
+        <w:fldChar w:fldCharType="end"/>
+      </w:r>
+      <w:r>
+        <w:t xml:space="preserve"> </w:t>
+      </w:r>
+      <w:r>
+        <w:t>validasi ulang fakultas prodi diterima</w:t>
+      </w:r>
+      <w:bookmarkEnd w:id="31"/>
     </w:p>
     <w:p>
       <w:pPr>
@@ -9137,7 +9655,7 @@
                     </pic:cNvPicPr>
                   </pic:nvPicPr>
                   <pic:blipFill>
-                    <a:blip r:embed="rId40" cstate="print">
+                    <a:blip r:embed="rId46" cstate="print">
                       <a:extLst>
                         <a:ext uri="{28A0092B-C50C-407E-A947-70E740481C1C}">
                           <a14:useLocalDpi xmlns:a14="http://schemas.microsoft.com/office/drawing/2010/main" val="0"/>
@@ -9172,23 +9690,37 @@
     <w:p>
       <w:pPr>
         <w:pStyle w:val="Caption"/>
-        <w:spacing w:line="480" w:lineRule="auto"/>
         <w:jc w:val="center"/>
       </w:pPr>
-      <w:r>
-        <w:t xml:space="preserve">Gambar </w:t>
-      </w:r>
-      <w:fldSimple w:instr=" SEQ Gambar \* ARABIC ">
-        <w:r>
-          <w:rPr>
-            <w:noProof/>
-          </w:rPr>
-          <w:t>33</w:t>
-        </w:r>
-      </w:fldSimple>
-      <w:r>
-        <w:t xml:space="preserve"> validasi ulang distribusi fakultas prodi 1</w:t>
-      </w:r>
+      <w:bookmarkStart w:id="32" w:name="_Toc200446326"/>
+      <w:r>
+        <w:t xml:space="preserve">Gambar 3. </w:t>
+      </w:r>
+      <w:r>
+        <w:fldChar w:fldCharType="begin"/>
+      </w:r>
+      <w:r>
+        <w:instrText xml:space="preserve"> SEQ Gambar_3. \* ARABIC </w:instrText>
+      </w:r>
+      <w:r>
+        <w:fldChar w:fldCharType="separate"/>
+      </w:r>
+      <w:r>
+        <w:rPr>
+          <w:noProof/>
+        </w:rPr>
+        <w:t>31</w:t>
+      </w:r>
+      <w:r>
+        <w:fldChar w:fldCharType="end"/>
+      </w:r>
+      <w:r>
+        <w:t xml:space="preserve"> </w:t>
+      </w:r>
+      <w:r>
+        <w:t>validasi ulang distribusi fakultas prodi 1</w:t>
+      </w:r>
+      <w:bookmarkEnd w:id="32"/>
     </w:p>
     <w:p>
       <w:pPr>
@@ -9222,7 +9754,7 @@
                     </pic:cNvPicPr>
                   </pic:nvPicPr>
                   <pic:blipFill>
-                    <a:blip r:embed="rId41" cstate="print">
+                    <a:blip r:embed="rId47" cstate="print">
                       <a:extLst>
                         <a:ext uri="{28A0092B-C50C-407E-A947-70E740481C1C}">
                           <a14:useLocalDpi xmlns:a14="http://schemas.microsoft.com/office/drawing/2010/main" val="0"/>
@@ -9263,14 +9795,24 @@
       <w:r>
         <w:t xml:space="preserve">Gambar </w:t>
       </w:r>
-      <w:fldSimple w:instr=" SEQ Gambar \* ARABIC ">
-        <w:r>
-          <w:rPr>
-            <w:noProof/>
-          </w:rPr>
-          <w:t>34</w:t>
-        </w:r>
-      </w:fldSimple>
+      <w:r>
+        <w:fldChar w:fldCharType="begin"/>
+      </w:r>
+      <w:r>
+        <w:instrText xml:space="preserve"> SEQ Gambar \* ARABIC </w:instrText>
+      </w:r>
+      <w:r>
+        <w:fldChar w:fldCharType="separate"/>
+      </w:r>
+      <w:r>
+        <w:rPr>
+          <w:noProof/>
+        </w:rPr>
+        <w:t>33</w:t>
+      </w:r>
+      <w:r>
+        <w:fldChar w:fldCharType="end"/>
+      </w:r>
       <w:r>
         <w:t xml:space="preserve"> validasi ulang distribusi fakultas prodi 2</w:t>
       </w:r>
@@ -9306,7 +9848,7 @@
                     </pic:cNvPicPr>
                   </pic:nvPicPr>
                   <pic:blipFill>
-                    <a:blip r:embed="rId42" cstate="print">
+                    <a:blip r:embed="rId48" cstate="print">
                       <a:extLst>
                         <a:ext uri="{28A0092B-C50C-407E-A947-70E740481C1C}">
                           <a14:useLocalDpi xmlns:a14="http://schemas.microsoft.com/office/drawing/2010/main" val="0"/>
@@ -9344,20 +9886,35 @@
         <w:spacing w:line="480" w:lineRule="auto"/>
         <w:jc w:val="center"/>
       </w:pPr>
-      <w:r>
-        <w:t xml:space="preserve">Gambar </w:t>
-      </w:r>
-      <w:fldSimple w:instr=" SEQ Gambar \* ARABIC ">
-        <w:r>
-          <w:rPr>
-            <w:noProof/>
-          </w:rPr>
-          <w:t>35</w:t>
-        </w:r>
-      </w:fldSimple>
-      <w:r>
-        <w:t xml:space="preserve"> validasi ulang distribusi prodi diterima</w:t>
-      </w:r>
+      <w:bookmarkStart w:id="33" w:name="_Toc200446327"/>
+      <w:r>
+        <w:t xml:space="preserve">Gambar 3. </w:t>
+      </w:r>
+      <w:r>
+        <w:fldChar w:fldCharType="begin"/>
+      </w:r>
+      <w:r>
+        <w:instrText xml:space="preserve"> SEQ Gambar_3. \* ARABIC </w:instrText>
+      </w:r>
+      <w:r>
+        <w:fldChar w:fldCharType="separate"/>
+      </w:r>
+      <w:r>
+        <w:rPr>
+          <w:noProof/>
+        </w:rPr>
+        <w:t>32</w:t>
+      </w:r>
+      <w:r>
+        <w:fldChar w:fldCharType="end"/>
+      </w:r>
+      <w:r>
+        <w:t xml:space="preserve"> </w:t>
+      </w:r>
+      <w:r>
+        <w:t>validasi ulang distribusi prodi diterima</w:t>
+      </w:r>
+      <w:bookmarkEnd w:id="33"/>
     </w:p>
     <w:p>
       <w:pPr>
@@ -9391,7 +9948,7 @@
                     </pic:cNvPicPr>
                   </pic:nvPicPr>
                   <pic:blipFill>
-                    <a:blip r:embed="rId43" cstate="print">
+                    <a:blip r:embed="rId49" cstate="print">
                       <a:extLst>
                         <a:ext uri="{28A0092B-C50C-407E-A947-70E740481C1C}">
                           <a14:useLocalDpi xmlns:a14="http://schemas.microsoft.com/office/drawing/2010/main" val="0"/>
@@ -9429,20 +9986,35 @@
         <w:spacing w:line="480" w:lineRule="auto"/>
         <w:jc w:val="center"/>
       </w:pPr>
-      <w:r>
-        <w:t xml:space="preserve">Gambar </w:t>
-      </w:r>
-      <w:fldSimple w:instr=" SEQ Gambar \* ARABIC ">
-        <w:r>
-          <w:rPr>
-            <w:noProof/>
-          </w:rPr>
-          <w:t>36</w:t>
-        </w:r>
-      </w:fldSimple>
-      <w:r>
-        <w:t xml:space="preserve"> validasi ulang distribusi prodi pilihan 1</w:t>
-      </w:r>
+      <w:bookmarkStart w:id="34" w:name="_Toc200446328"/>
+      <w:r>
+        <w:t xml:space="preserve">Gambar 3. </w:t>
+      </w:r>
+      <w:r>
+        <w:fldChar w:fldCharType="begin"/>
+      </w:r>
+      <w:r>
+        <w:instrText xml:space="preserve"> SEQ Gambar_3. \* ARABIC </w:instrText>
+      </w:r>
+      <w:r>
+        <w:fldChar w:fldCharType="separate"/>
+      </w:r>
+      <w:r>
+        <w:rPr>
+          <w:noProof/>
+        </w:rPr>
+        <w:t>33</w:t>
+      </w:r>
+      <w:r>
+        <w:fldChar w:fldCharType="end"/>
+      </w:r>
+      <w:r>
+        <w:t xml:space="preserve"> </w:t>
+      </w:r>
+      <w:r>
+        <w:t>validasi ulang distribusi prodi pilihan 1</w:t>
+      </w:r>
+      <w:bookmarkEnd w:id="34"/>
     </w:p>
     <w:p>
       <w:pPr>
@@ -9476,7 +10048,7 @@
                     </pic:cNvPicPr>
                   </pic:nvPicPr>
                   <pic:blipFill>
-                    <a:blip r:embed="rId44" cstate="print">
+                    <a:blip r:embed="rId50" cstate="print">
                       <a:extLst>
                         <a:ext uri="{28A0092B-C50C-407E-A947-70E740481C1C}">
                           <a14:useLocalDpi xmlns:a14="http://schemas.microsoft.com/office/drawing/2010/main" val="0"/>
@@ -9517,20 +10089,35 @@
           <w:rFonts w:ascii="Times New Roman" w:hAnsi="Times New Roman" w:cs="Times New Roman"/>
         </w:rPr>
       </w:pPr>
-      <w:r>
-        <w:t xml:space="preserve">Gambar </w:t>
-      </w:r>
-      <w:fldSimple w:instr=" SEQ Gambar \* ARABIC ">
-        <w:r>
-          <w:rPr>
-            <w:noProof/>
-          </w:rPr>
-          <w:t>37</w:t>
-        </w:r>
-      </w:fldSimple>
-      <w:r>
-        <w:t xml:space="preserve"> validasi ulang prodi pilihan 2</w:t>
-      </w:r>
+      <w:bookmarkStart w:id="35" w:name="_Toc200446329"/>
+      <w:r>
+        <w:t xml:space="preserve">Gambar 3. </w:t>
+      </w:r>
+      <w:r>
+        <w:fldChar w:fldCharType="begin"/>
+      </w:r>
+      <w:r>
+        <w:instrText xml:space="preserve"> SEQ Gambar_3. \* ARABIC </w:instrText>
+      </w:r>
+      <w:r>
+        <w:fldChar w:fldCharType="separate"/>
+      </w:r>
+      <w:r>
+        <w:rPr>
+          <w:noProof/>
+        </w:rPr>
+        <w:t>34</w:t>
+      </w:r>
+      <w:r>
+        <w:fldChar w:fldCharType="end"/>
+      </w:r>
+      <w:r>
+        <w:t xml:space="preserve"> </w:t>
+      </w:r>
+      <w:r>
+        <w:t>validasi ulang prodi pilihan 2</w:t>
+      </w:r>
+      <w:bookmarkEnd w:id="35"/>
     </w:p>
     <w:p>
       <w:pPr>
@@ -9708,7 +10295,7 @@
                     </pic:cNvPicPr>
                   </pic:nvPicPr>
                   <pic:blipFill>
-                    <a:blip r:embed="rId45">
+                    <a:blip r:embed="rId51">
                       <a:extLst>
                         <a:ext uri="{28A0092B-C50C-407E-A947-70E740481C1C}">
                           <a14:useLocalDpi xmlns:a14="http://schemas.microsoft.com/office/drawing/2010/main" val="0"/>
@@ -9751,26 +10338,35 @@
           <w:rFonts w:ascii="Times New Roman" w:hAnsi="Times New Roman" w:cs="Times New Roman"/>
         </w:rPr>
       </w:pPr>
-      <w:r>
-        <w:t xml:space="preserve">Gambar </w:t>
-      </w:r>
-      <w:fldSimple w:instr=" SEQ Gambar \* ARABIC ">
-        <w:r>
-          <w:rPr>
-            <w:noProof/>
-          </w:rPr>
-          <w:t>38</w:t>
-        </w:r>
-      </w:fldSimple>
+      <w:bookmarkStart w:id="36" w:name="_Toc200446330"/>
+      <w:r>
+        <w:t xml:space="preserve">Gambar 3. </w:t>
+      </w:r>
+      <w:r>
+        <w:fldChar w:fldCharType="begin"/>
+      </w:r>
+      <w:r>
+        <w:instrText xml:space="preserve"> SEQ Gambar_3. \* ARABIC </w:instrText>
+      </w:r>
+      <w:r>
+        <w:fldChar w:fldCharType="separate"/>
+      </w:r>
+      <w:r>
+        <w:rPr>
+          <w:noProof/>
+        </w:rPr>
+        <w:t>35</w:t>
+      </w:r>
+      <w:r>
+        <w:fldChar w:fldCharType="end"/>
+      </w:r>
       <w:r>
         <w:t xml:space="preserve"> </w:t>
       </w:r>
       <w:r>
-        <w:t>sintaks</w:t>
-      </w:r>
-      <w:r>
-        <w:t xml:space="preserve"> pembuatan kolom Kabupaten/Kota</w:t>
-      </w:r>
+        <w:t>sintaks pembuatan kolom Kabupaten/Kota</w:t>
+      </w:r>
+      <w:bookmarkEnd w:id="36"/>
     </w:p>
     <w:p>
       <w:pPr>
@@ -9803,7 +10399,7 @@
                     </pic:cNvPicPr>
                   </pic:nvPicPr>
                   <pic:blipFill>
-                    <a:blip r:embed="rId46">
+                    <a:blip r:embed="rId52">
                       <a:extLst>
                         <a:ext uri="{28A0092B-C50C-407E-A947-70E740481C1C}">
                           <a14:useLocalDpi xmlns:a14="http://schemas.microsoft.com/office/drawing/2010/main" val="0"/>
@@ -9846,20 +10442,35 @@
           <w:rFonts w:ascii="Times New Roman" w:hAnsi="Times New Roman" w:cs="Times New Roman"/>
         </w:rPr>
       </w:pPr>
-      <w:r>
-        <w:t xml:space="preserve">Gambar </w:t>
-      </w:r>
-      <w:fldSimple w:instr=" SEQ Gambar \* ARABIC ">
-        <w:r>
-          <w:rPr>
-            <w:noProof/>
-          </w:rPr>
-          <w:t>39</w:t>
-        </w:r>
-      </w:fldSimple>
-      <w:r>
-        <w:t xml:space="preserve"> sintaks pembuatan kolom Provinsi</w:t>
-      </w:r>
+      <w:bookmarkStart w:id="37" w:name="_Toc200446331"/>
+      <w:r>
+        <w:t xml:space="preserve">Gambar 3. </w:t>
+      </w:r>
+      <w:r>
+        <w:fldChar w:fldCharType="begin"/>
+      </w:r>
+      <w:r>
+        <w:instrText xml:space="preserve"> SEQ Gambar_3. \* ARABIC </w:instrText>
+      </w:r>
+      <w:r>
+        <w:fldChar w:fldCharType="separate"/>
+      </w:r>
+      <w:r>
+        <w:rPr>
+          <w:noProof/>
+        </w:rPr>
+        <w:t>36</w:t>
+      </w:r>
+      <w:r>
+        <w:fldChar w:fldCharType="end"/>
+      </w:r>
+      <w:r>
+        <w:t xml:space="preserve"> </w:t>
+      </w:r>
+      <w:r>
+        <w:t>sintaks pembuatan kolom Provinsi</w:t>
+      </w:r>
+      <w:bookmarkEnd w:id="37"/>
     </w:p>
     <w:p>
       <w:pPr>
@@ -9892,7 +10503,7 @@
                     </pic:cNvPicPr>
                   </pic:nvPicPr>
                   <pic:blipFill>
-                    <a:blip r:embed="rId47" cstate="print">
+                    <a:blip r:embed="rId53" cstate="print">
                       <a:extLst>
                         <a:ext uri="{28A0092B-C50C-407E-A947-70E740481C1C}">
                           <a14:useLocalDpi xmlns:a14="http://schemas.microsoft.com/office/drawing/2010/main" val="0"/>
@@ -9928,33 +10539,41 @@
     <w:p>
       <w:pPr>
         <w:pStyle w:val="Caption"/>
-        <w:spacing w:line="480" w:lineRule="auto"/>
         <w:jc w:val="center"/>
         <w:rPr>
           <w:rFonts w:ascii="Times New Roman" w:hAnsi="Times New Roman" w:cs="Times New Roman"/>
           <w:color w:val="auto"/>
         </w:rPr>
       </w:pPr>
-      <w:r>
-        <w:t xml:space="preserve">Gambar </w:t>
-      </w:r>
-      <w:fldSimple w:instr=" SEQ Gambar \* ARABIC ">
-        <w:r>
-          <w:rPr>
-            <w:noProof/>
-          </w:rPr>
-          <w:t>40</w:t>
-        </w:r>
-      </w:fldSimple>
+      <w:bookmarkStart w:id="38" w:name="_Toc200446332"/>
+      <w:r>
+        <w:t xml:space="preserve">Gambar 3. </w:t>
+      </w:r>
+      <w:r>
+        <w:fldChar w:fldCharType="begin"/>
+      </w:r>
+      <w:r>
+        <w:instrText xml:space="preserve"> SEQ Gambar_3. \* ARABIC </w:instrText>
+      </w:r>
+      <w:r>
+        <w:fldChar w:fldCharType="separate"/>
+      </w:r>
+      <w:r>
+        <w:rPr>
+          <w:noProof/>
+        </w:rPr>
+        <w:t>37</w:t>
+      </w:r>
+      <w:r>
+        <w:fldChar w:fldCharType="end"/>
+      </w:r>
       <w:r>
         <w:t xml:space="preserve"> </w:t>
       </w:r>
       <w:r>
-        <w:t xml:space="preserve">contoh </w:t>
-      </w:r>
-      <w:r>
-        <w:t>hasil pembuatan kolom baru</w:t>
-      </w:r>
+        <w:t>contoh hasil pembuatan kolom baru</w:t>
+      </w:r>
+      <w:bookmarkEnd w:id="38"/>
     </w:p>
     <w:p>
       <w:pPr>
@@ -10688,7 +11307,7 @@
                     </pic:cNvPicPr>
                   </pic:nvPicPr>
                   <pic:blipFill>
-                    <a:blip r:embed="rId48" cstate="print">
+                    <a:blip r:embed="rId54" cstate="print">
                       <a:extLst>
                         <a:ext uri="{28A0092B-C50C-407E-A947-70E740481C1C}">
                           <a14:useLocalDpi xmlns:a14="http://schemas.microsoft.com/office/drawing/2010/main" val="0"/>
@@ -10731,20 +11350,35 @@
           <w:rFonts w:ascii="Times New Roman" w:hAnsi="Times New Roman" w:cs="Times New Roman"/>
         </w:rPr>
       </w:pPr>
-      <w:r>
-        <w:t xml:space="preserve">Gambar </w:t>
-      </w:r>
-      <w:fldSimple w:instr=" SEQ Gambar \* ARABIC ">
-        <w:r>
-          <w:rPr>
-            <w:noProof/>
-          </w:rPr>
-          <w:t>41</w:t>
-        </w:r>
-      </w:fldSimple>
-      <w:r>
-        <w:t xml:space="preserve"> dashboard overview</w:t>
-      </w:r>
+      <w:bookmarkStart w:id="39" w:name="_Toc200446333"/>
+      <w:r>
+        <w:t xml:space="preserve">Gambar 3. </w:t>
+      </w:r>
+      <w:r>
+        <w:fldChar w:fldCharType="begin"/>
+      </w:r>
+      <w:r>
+        <w:instrText xml:space="preserve"> SEQ Gambar_3. \* ARABIC </w:instrText>
+      </w:r>
+      <w:r>
+        <w:fldChar w:fldCharType="separate"/>
+      </w:r>
+      <w:r>
+        <w:rPr>
+          <w:noProof/>
+        </w:rPr>
+        <w:t>38</w:t>
+      </w:r>
+      <w:r>
+        <w:fldChar w:fldCharType="end"/>
+      </w:r>
+      <w:r>
+        <w:t xml:space="preserve"> </w:t>
+      </w:r>
+      <w:r>
+        <w:t>dashboard overview</w:t>
+      </w:r>
+      <w:bookmarkEnd w:id="39"/>
     </w:p>
     <w:p>
       <w:pPr>
@@ -10792,7 +11426,7 @@
                     </pic:cNvPicPr>
                   </pic:nvPicPr>
                   <pic:blipFill>
-                    <a:blip r:embed="rId49" cstate="print">
+                    <a:blip r:embed="rId55" cstate="print">
                       <a:extLst>
                         <a:ext uri="{28A0092B-C50C-407E-A947-70E740481C1C}">
                           <a14:useLocalDpi xmlns:a14="http://schemas.microsoft.com/office/drawing/2010/main" val="0"/>
@@ -10835,20 +11469,35 @@
           <w:rFonts w:ascii="Times New Roman" w:hAnsi="Times New Roman" w:cs="Times New Roman"/>
         </w:rPr>
       </w:pPr>
-      <w:r>
-        <w:t xml:space="preserve">Gambar </w:t>
-      </w:r>
-      <w:fldSimple w:instr=" SEQ Gambar \* ARABIC ">
-        <w:r>
-          <w:rPr>
-            <w:noProof/>
-          </w:rPr>
-          <w:t>42</w:t>
-        </w:r>
-      </w:fldSimple>
-      <w:r>
-        <w:t xml:space="preserve"> dashboard demografi</w:t>
-      </w:r>
+      <w:bookmarkStart w:id="40" w:name="_Toc200446334"/>
+      <w:r>
+        <w:t xml:space="preserve">Gambar 3. </w:t>
+      </w:r>
+      <w:r>
+        <w:fldChar w:fldCharType="begin"/>
+      </w:r>
+      <w:r>
+        <w:instrText xml:space="preserve"> SEQ Gambar_3. \* ARABIC </w:instrText>
+      </w:r>
+      <w:r>
+        <w:fldChar w:fldCharType="separate"/>
+      </w:r>
+      <w:r>
+        <w:rPr>
+          <w:noProof/>
+        </w:rPr>
+        <w:t>39</w:t>
+      </w:r>
+      <w:r>
+        <w:fldChar w:fldCharType="end"/>
+      </w:r>
+      <w:r>
+        <w:t xml:space="preserve"> </w:t>
+      </w:r>
+      <w:r>
+        <w:t>dashboard demografi</w:t>
+      </w:r>
+      <w:bookmarkEnd w:id="40"/>
     </w:p>
     <w:p>
       <w:pPr>
@@ -11595,7 +12244,7 @@
                     </pic:cNvPicPr>
                   </pic:nvPicPr>
                   <pic:blipFill>
-                    <a:blip r:embed="rId50" cstate="print">
+                    <a:blip r:embed="rId56" cstate="print">
                       <a:extLst>
                         <a:ext uri="{28A0092B-C50C-407E-A947-70E740481C1C}">
                           <a14:useLocalDpi xmlns:a14="http://schemas.microsoft.com/office/drawing/2010/main" val="0"/>
@@ -11638,20 +12287,35 @@
           <w:rFonts w:ascii="Times New Roman" w:hAnsi="Times New Roman" w:cs="Times New Roman"/>
         </w:rPr>
       </w:pPr>
-      <w:r>
-        <w:t xml:space="preserve">Gambar </w:t>
-      </w:r>
-      <w:fldSimple w:instr=" SEQ Gambar \* ARABIC ">
-        <w:r>
-          <w:rPr>
-            <w:noProof/>
-          </w:rPr>
-          <w:t>43</w:t>
-        </w:r>
-      </w:fldSimple>
-      <w:r>
-        <w:t xml:space="preserve"> bar navigasi halaman utama</w:t>
-      </w:r>
+      <w:bookmarkStart w:id="41" w:name="_Toc200446335"/>
+      <w:r>
+        <w:t xml:space="preserve">Gambar 3. </w:t>
+      </w:r>
+      <w:r>
+        <w:fldChar w:fldCharType="begin"/>
+      </w:r>
+      <w:r>
+        <w:instrText xml:space="preserve"> SEQ Gambar_3. \* ARABIC </w:instrText>
+      </w:r>
+      <w:r>
+        <w:fldChar w:fldCharType="separate"/>
+      </w:r>
+      <w:r>
+        <w:rPr>
+          <w:noProof/>
+        </w:rPr>
+        <w:t>40</w:t>
+      </w:r>
+      <w:r>
+        <w:fldChar w:fldCharType="end"/>
+      </w:r>
+      <w:r>
+        <w:t xml:space="preserve"> </w:t>
+      </w:r>
+      <w:r>
+        <w:t>bar navigasi halaman utama</w:t>
+      </w:r>
+      <w:bookmarkEnd w:id="41"/>
     </w:p>
     <w:p>
       <w:pPr>
@@ -11727,7 +12391,7 @@
                     </pic:cNvPicPr>
                   </pic:nvPicPr>
                   <pic:blipFill>
-                    <a:blip r:embed="rId51" cstate="print">
+                    <a:blip r:embed="rId57" cstate="print">
                       <a:extLst>
                         <a:ext uri="{28A0092B-C50C-407E-A947-70E740481C1C}">
                           <a14:useLocalDpi xmlns:a14="http://schemas.microsoft.com/office/drawing/2010/main" val="0"/>
@@ -11770,26 +12434,35 @@
           <w:rFonts w:ascii="Times New Roman" w:hAnsi="Times New Roman" w:cs="Times New Roman"/>
         </w:rPr>
       </w:pPr>
-      <w:r>
-        <w:t xml:space="preserve">Gambar </w:t>
-      </w:r>
-      <w:fldSimple w:instr=" SEQ Gambar \* ARABIC ">
-        <w:r>
-          <w:rPr>
-            <w:noProof/>
-          </w:rPr>
-          <w:t>44</w:t>
-        </w:r>
-      </w:fldSimple>
-      <w:r>
-        <w:t xml:space="preserve"> judul proyek</w:t>
+      <w:bookmarkStart w:id="42" w:name="_Toc200446336"/>
+      <w:r>
+        <w:t xml:space="preserve">Gambar 3. </w:t>
+      </w:r>
+      <w:r>
+        <w:fldChar w:fldCharType="begin"/>
+      </w:r>
+      <w:r>
+        <w:instrText xml:space="preserve"> SEQ Gambar_3. \* ARABIC </w:instrText>
+      </w:r>
+      <w:r>
+        <w:fldChar w:fldCharType="separate"/>
       </w:r>
       <w:r>
         <w:rPr>
           <w:noProof/>
         </w:rPr>
-        <w:t xml:space="preserve"> pada halaman utama</w:t>
-      </w:r>
+        <w:t>41</w:t>
+      </w:r>
+      <w:r>
+        <w:fldChar w:fldCharType="end"/>
+      </w:r>
+      <w:r>
+        <w:t xml:space="preserve"> </w:t>
+      </w:r>
+      <w:r>
+        <w:t>judul proyek pada halaman utama</w:t>
+      </w:r>
+      <w:bookmarkEnd w:id="42"/>
     </w:p>
     <w:p>
       <w:pPr>
@@ -11864,7 +12537,7 @@
                     </pic:cNvPicPr>
                   </pic:nvPicPr>
                   <pic:blipFill>
-                    <a:blip r:embed="rId52" cstate="print">
+                    <a:blip r:embed="rId58" cstate="print">
                       <a:extLst>
                         <a:ext uri="{28A0092B-C50C-407E-A947-70E740481C1C}">
                           <a14:useLocalDpi xmlns:a14="http://schemas.microsoft.com/office/drawing/2010/main" val="0"/>
@@ -11907,20 +12580,35 @@
           <w:rFonts w:ascii="Times New Roman" w:hAnsi="Times New Roman" w:cs="Times New Roman"/>
         </w:rPr>
       </w:pPr>
-      <w:r>
-        <w:t xml:space="preserve">Gambar </w:t>
-      </w:r>
-      <w:fldSimple w:instr=" SEQ Gambar \* ARABIC ">
-        <w:r>
-          <w:rPr>
-            <w:noProof/>
-          </w:rPr>
-          <w:t>45</w:t>
-        </w:r>
-      </w:fldSimple>
-      <w:r>
-        <w:t xml:space="preserve"> permasalahan, tujuan, dan manfaat pada halaman utama</w:t>
-      </w:r>
+      <w:bookmarkStart w:id="43" w:name="_Toc200446337"/>
+      <w:r>
+        <w:t xml:space="preserve">Gambar 3. </w:t>
+      </w:r>
+      <w:r>
+        <w:fldChar w:fldCharType="begin"/>
+      </w:r>
+      <w:r>
+        <w:instrText xml:space="preserve"> SEQ Gambar_3. \* ARABIC </w:instrText>
+      </w:r>
+      <w:r>
+        <w:fldChar w:fldCharType="separate"/>
+      </w:r>
+      <w:r>
+        <w:rPr>
+          <w:noProof/>
+        </w:rPr>
+        <w:t>42</w:t>
+      </w:r>
+      <w:r>
+        <w:fldChar w:fldCharType="end"/>
+      </w:r>
+      <w:r>
+        <w:t xml:space="preserve"> </w:t>
+      </w:r>
+      <w:r>
+        <w:t>permasalahan, tujuan, dan manfaat pada halaman utama</w:t>
+      </w:r>
+      <w:bookmarkEnd w:id="43"/>
     </w:p>
     <w:p>
       <w:pPr>
@@ -12022,7 +12710,7 @@
                     </pic:cNvPicPr>
                   </pic:nvPicPr>
                   <pic:blipFill>
-                    <a:blip r:embed="rId53" cstate="print">
+                    <a:blip r:embed="rId59" cstate="print">
                       <a:extLst>
                         <a:ext uri="{28A0092B-C50C-407E-A947-70E740481C1C}">
                           <a14:useLocalDpi xmlns:a14="http://schemas.microsoft.com/office/drawing/2010/main" val="0"/>
@@ -12065,20 +12753,35 @@
           <w:rFonts w:ascii="Times New Roman" w:hAnsi="Times New Roman" w:cs="Times New Roman"/>
         </w:rPr>
       </w:pPr>
-      <w:r>
-        <w:t xml:space="preserve">Gambar </w:t>
-      </w:r>
-      <w:fldSimple w:instr=" SEQ Gambar \* ARABIC ">
-        <w:r>
-          <w:rPr>
-            <w:noProof/>
-          </w:rPr>
-          <w:t>46</w:t>
-        </w:r>
-      </w:fldSimple>
-      <w:r>
-        <w:t xml:space="preserve"> data pipeline pada halaman utama</w:t>
-      </w:r>
+      <w:bookmarkStart w:id="44" w:name="_Toc200446338"/>
+      <w:r>
+        <w:t xml:space="preserve">Gambar 3. </w:t>
+      </w:r>
+      <w:r>
+        <w:fldChar w:fldCharType="begin"/>
+      </w:r>
+      <w:r>
+        <w:instrText xml:space="preserve"> SEQ Gambar_3. \* ARABIC </w:instrText>
+      </w:r>
+      <w:r>
+        <w:fldChar w:fldCharType="separate"/>
+      </w:r>
+      <w:r>
+        <w:rPr>
+          <w:noProof/>
+        </w:rPr>
+        <w:t>43</w:t>
+      </w:r>
+      <w:r>
+        <w:fldChar w:fldCharType="end"/>
+      </w:r>
+      <w:r>
+        <w:t xml:space="preserve"> </w:t>
+      </w:r>
+      <w:r>
+        <w:t>data pipeline pada halaman utama</w:t>
+      </w:r>
+      <w:bookmarkEnd w:id="44"/>
     </w:p>
     <w:p>
       <w:pPr>
@@ -12177,7 +12880,7 @@
                     </pic:cNvPicPr>
                   </pic:nvPicPr>
                   <pic:blipFill>
-                    <a:blip r:embed="rId54" cstate="print">
+                    <a:blip r:embed="rId60" cstate="print">
                       <a:extLst>
                         <a:ext uri="{28A0092B-C50C-407E-A947-70E740481C1C}">
                           <a14:useLocalDpi xmlns:a14="http://schemas.microsoft.com/office/drawing/2010/main" val="0"/>
@@ -12220,20 +12923,35 @@
           <w:rFonts w:ascii="Times New Roman" w:hAnsi="Times New Roman" w:cs="Times New Roman"/>
         </w:rPr>
       </w:pPr>
-      <w:r>
-        <w:t xml:space="preserve">Gambar </w:t>
-      </w:r>
-      <w:fldSimple w:instr=" SEQ Gambar \* ARABIC ">
-        <w:r>
-          <w:rPr>
-            <w:noProof/>
-          </w:rPr>
-          <w:t>47</w:t>
-        </w:r>
-      </w:fldSimple>
-      <w:r>
-        <w:t xml:space="preserve"> funfact pada halaman utama</w:t>
-      </w:r>
+      <w:bookmarkStart w:id="45" w:name="_Toc200446339"/>
+      <w:r>
+        <w:t xml:space="preserve">Gambar 3. </w:t>
+      </w:r>
+      <w:r>
+        <w:fldChar w:fldCharType="begin"/>
+      </w:r>
+      <w:r>
+        <w:instrText xml:space="preserve"> SEQ Gambar_3. \* ARABIC </w:instrText>
+      </w:r>
+      <w:r>
+        <w:fldChar w:fldCharType="separate"/>
+      </w:r>
+      <w:r>
+        <w:rPr>
+          <w:noProof/>
+        </w:rPr>
+        <w:t>44</w:t>
+      </w:r>
+      <w:r>
+        <w:fldChar w:fldCharType="end"/>
+      </w:r>
+      <w:r>
+        <w:t xml:space="preserve"> </w:t>
+      </w:r>
+      <w:r>
+        <w:t>funfact pada halaman utama</w:t>
+      </w:r>
+      <w:bookmarkEnd w:id="45"/>
     </w:p>
     <w:p>
       <w:pPr>
@@ -12317,7 +13035,7 @@
                     </pic:cNvPicPr>
                   </pic:nvPicPr>
                   <pic:blipFill>
-                    <a:blip r:embed="rId55" cstate="print">
+                    <a:blip r:embed="rId61" cstate="print">
                       <a:extLst>
                         <a:ext uri="{28A0092B-C50C-407E-A947-70E740481C1C}">
                           <a14:useLocalDpi xmlns:a14="http://schemas.microsoft.com/office/drawing/2010/main" val="0"/>
@@ -12360,20 +13078,35 @@
           <w:rFonts w:ascii="Times New Roman" w:hAnsi="Times New Roman" w:cs="Times New Roman"/>
         </w:rPr>
       </w:pPr>
-      <w:r>
-        <w:t xml:space="preserve">Gambar </w:t>
-      </w:r>
-      <w:fldSimple w:instr=" SEQ Gambar \* ARABIC ">
-        <w:r>
-          <w:rPr>
-            <w:noProof/>
-          </w:rPr>
-          <w:t>48</w:t>
-        </w:r>
-      </w:fldSimple>
-      <w:r>
-        <w:t xml:space="preserve"> brainstorming dashboard pada halaman utama</w:t>
-      </w:r>
+      <w:bookmarkStart w:id="46" w:name="_Toc200446340"/>
+      <w:r>
+        <w:t xml:space="preserve">Gambar 3. </w:t>
+      </w:r>
+      <w:r>
+        <w:fldChar w:fldCharType="begin"/>
+      </w:r>
+      <w:r>
+        <w:instrText xml:space="preserve"> SEQ Gambar_3. \* ARABIC </w:instrText>
+      </w:r>
+      <w:r>
+        <w:fldChar w:fldCharType="separate"/>
+      </w:r>
+      <w:r>
+        <w:rPr>
+          <w:noProof/>
+        </w:rPr>
+        <w:t>45</w:t>
+      </w:r>
+      <w:r>
+        <w:fldChar w:fldCharType="end"/>
+      </w:r>
+      <w:r>
+        <w:t xml:space="preserve"> </w:t>
+      </w:r>
+      <w:r>
+        <w:t>brainstorming dashboard pada halaman utama</w:t>
+      </w:r>
+      <w:bookmarkEnd w:id="46"/>
     </w:p>
     <w:p>
       <w:pPr>
@@ -12442,7 +13175,7 @@
                     </pic:cNvPicPr>
                   </pic:nvPicPr>
                   <pic:blipFill>
-                    <a:blip r:embed="rId56" cstate="print">
+                    <a:blip r:embed="rId62" cstate="print">
                       <a:extLst>
                         <a:ext uri="{28A0092B-C50C-407E-A947-70E740481C1C}">
                           <a14:useLocalDpi xmlns:a14="http://schemas.microsoft.com/office/drawing/2010/main" val="0"/>
@@ -12485,20 +13218,35 @@
           <w:rFonts w:ascii="Times New Roman" w:hAnsi="Times New Roman" w:cs="Times New Roman"/>
         </w:rPr>
       </w:pPr>
-      <w:r>
-        <w:t xml:space="preserve">Gambar </w:t>
-      </w:r>
-      <w:fldSimple w:instr=" SEQ Gambar \* ARABIC ">
-        <w:r>
-          <w:rPr>
-            <w:noProof/>
-          </w:rPr>
-          <w:t>49</w:t>
-        </w:r>
-      </w:fldSimple>
-      <w:r>
-        <w:t xml:space="preserve"> ucapan terimakasih pada halaman utama</w:t>
-      </w:r>
+      <w:bookmarkStart w:id="47" w:name="_Toc200446341"/>
+      <w:r>
+        <w:t xml:space="preserve">Gambar 3. </w:t>
+      </w:r>
+      <w:r>
+        <w:fldChar w:fldCharType="begin"/>
+      </w:r>
+      <w:r>
+        <w:instrText xml:space="preserve"> SEQ Gambar_3. \* ARABIC </w:instrText>
+      </w:r>
+      <w:r>
+        <w:fldChar w:fldCharType="separate"/>
+      </w:r>
+      <w:r>
+        <w:rPr>
+          <w:noProof/>
+        </w:rPr>
+        <w:t>46</w:t>
+      </w:r>
+      <w:r>
+        <w:fldChar w:fldCharType="end"/>
+      </w:r>
+      <w:r>
+        <w:t xml:space="preserve"> </w:t>
+      </w:r>
+      <w:r>
+        <w:t>ucapan terimakasih pada halaman utama</w:t>
+      </w:r>
+      <w:bookmarkEnd w:id="47"/>
     </w:p>
     <w:p>
       <w:pPr>
@@ -12594,7 +13342,7 @@
                     </pic:cNvPicPr>
                   </pic:nvPicPr>
                   <pic:blipFill>
-                    <a:blip r:embed="rId57" cstate="print">
+                    <a:blip r:embed="rId63" cstate="print">
                       <a:extLst>
                         <a:ext uri="{28A0092B-C50C-407E-A947-70E740481C1C}">
                           <a14:useLocalDpi xmlns:a14="http://schemas.microsoft.com/office/drawing/2010/main" val="0"/>
@@ -12637,20 +13385,35 @@
           <w:rFonts w:ascii="Times New Roman" w:hAnsi="Times New Roman" w:cs="Times New Roman"/>
         </w:rPr>
       </w:pPr>
-      <w:r>
-        <w:t xml:space="preserve">Gambar </w:t>
-      </w:r>
-      <w:fldSimple w:instr=" SEQ Gambar \* ARABIC ">
-        <w:r>
-          <w:rPr>
-            <w:noProof/>
-          </w:rPr>
-          <w:t>50</w:t>
-        </w:r>
-      </w:fldSimple>
-      <w:r>
-        <w:t xml:space="preserve"> watermark pada halaman utama</w:t>
-      </w:r>
+      <w:bookmarkStart w:id="48" w:name="_Toc200446342"/>
+      <w:r>
+        <w:t xml:space="preserve">Gambar 3. </w:t>
+      </w:r>
+      <w:r>
+        <w:fldChar w:fldCharType="begin"/>
+      </w:r>
+      <w:r>
+        <w:instrText xml:space="preserve"> SEQ Gambar_3. \* ARABIC </w:instrText>
+      </w:r>
+      <w:r>
+        <w:fldChar w:fldCharType="separate"/>
+      </w:r>
+      <w:r>
+        <w:rPr>
+          <w:noProof/>
+        </w:rPr>
+        <w:t>47</w:t>
+      </w:r>
+      <w:r>
+        <w:fldChar w:fldCharType="end"/>
+      </w:r>
+      <w:r>
+        <w:t xml:space="preserve"> </w:t>
+      </w:r>
+      <w:r>
+        <w:t>watermark pada halaman utama</w:t>
+      </w:r>
+      <w:bookmarkEnd w:id="48"/>
     </w:p>
     <w:p>
       <w:pPr>
@@ -12727,7 +13490,7 @@
                     </pic:cNvPicPr>
                   </pic:nvPicPr>
                   <pic:blipFill>
-                    <a:blip r:embed="rId58" cstate="print">
+                    <a:blip r:embed="rId64" cstate="print">
                       <a:extLst>
                         <a:ext uri="{28A0092B-C50C-407E-A947-70E740481C1C}">
                           <a14:useLocalDpi xmlns:a14="http://schemas.microsoft.com/office/drawing/2010/main" val="0"/>
@@ -12770,20 +13533,35 @@
           <w:rFonts w:ascii="Times New Roman" w:hAnsi="Times New Roman" w:cs="Times New Roman"/>
         </w:rPr>
       </w:pPr>
-      <w:r>
-        <w:t xml:space="preserve">Gambar </w:t>
-      </w:r>
-      <w:fldSimple w:instr=" SEQ Gambar \* ARABIC ">
-        <w:r>
-          <w:rPr>
-            <w:noProof/>
-          </w:rPr>
-          <w:t>51</w:t>
-        </w:r>
-      </w:fldSimple>
-      <w:r>
-        <w:t xml:space="preserve"> bar navigasi halaman cara membaca</w:t>
-      </w:r>
+      <w:bookmarkStart w:id="49" w:name="_Toc200446343"/>
+      <w:r>
+        <w:t xml:space="preserve">Gambar 3. </w:t>
+      </w:r>
+      <w:r>
+        <w:fldChar w:fldCharType="begin"/>
+      </w:r>
+      <w:r>
+        <w:instrText xml:space="preserve"> SEQ Gambar_3. \* ARABIC </w:instrText>
+      </w:r>
+      <w:r>
+        <w:fldChar w:fldCharType="separate"/>
+      </w:r>
+      <w:r>
+        <w:rPr>
+          <w:noProof/>
+        </w:rPr>
+        <w:t>48</w:t>
+      </w:r>
+      <w:r>
+        <w:fldChar w:fldCharType="end"/>
+      </w:r>
+      <w:r>
+        <w:t xml:space="preserve"> </w:t>
+      </w:r>
+      <w:r>
+        <w:t>bar navigasi halaman cara membaca</w:t>
+      </w:r>
+      <w:bookmarkEnd w:id="49"/>
     </w:p>
     <w:p>
       <w:pPr>
@@ -12859,7 +13637,7 @@
                     </pic:cNvPicPr>
                   </pic:nvPicPr>
                   <pic:blipFill>
-                    <a:blip r:embed="rId59" cstate="print">
+                    <a:blip r:embed="rId65" cstate="print">
                       <a:extLst>
                         <a:ext uri="{28A0092B-C50C-407E-A947-70E740481C1C}">
                           <a14:useLocalDpi xmlns:a14="http://schemas.microsoft.com/office/drawing/2010/main" val="0"/>
@@ -12902,26 +13680,35 @@
           <w:rFonts w:ascii="Times New Roman" w:hAnsi="Times New Roman" w:cs="Times New Roman"/>
         </w:rPr>
       </w:pPr>
-      <w:r>
-        <w:t xml:space="preserve">Gambar </w:t>
-      </w:r>
-      <w:fldSimple w:instr=" SEQ Gambar \* ARABIC ">
-        <w:r>
-          <w:rPr>
-            <w:noProof/>
-          </w:rPr>
-          <w:t>52</w:t>
-        </w:r>
-      </w:fldSimple>
-      <w:r>
-        <w:t xml:space="preserve"> cara membaca pada halaman cara membaca</w:t>
+      <w:bookmarkStart w:id="50" w:name="_Toc200446344"/>
+      <w:r>
+        <w:t xml:space="preserve">Gambar 3. </w:t>
+      </w:r>
+      <w:r>
+        <w:fldChar w:fldCharType="begin"/>
+      </w:r>
+      <w:r>
+        <w:instrText xml:space="preserve"> SEQ Gambar_3. \* ARABIC </w:instrText>
+      </w:r>
+      <w:r>
+        <w:fldChar w:fldCharType="separate"/>
       </w:r>
       <w:r>
         <w:rPr>
           <w:noProof/>
         </w:rPr>
-        <w:t xml:space="preserve"> dashboard</w:t>
-      </w:r>
+        <w:t>49</w:t>
+      </w:r>
+      <w:r>
+        <w:fldChar w:fldCharType="end"/>
+      </w:r>
+      <w:r>
+        <w:t xml:space="preserve"> </w:t>
+      </w:r>
+      <w:r>
+        <w:t>cara membaca pada halaman cara membaca dashboard</w:t>
+      </w:r>
+      <w:bookmarkEnd w:id="50"/>
     </w:p>
     <w:p>
       <w:pPr>
@@ -12998,7 +13785,7 @@
                     </pic:cNvPicPr>
                   </pic:nvPicPr>
                   <pic:blipFill>
-                    <a:blip r:embed="rId60" cstate="print">
+                    <a:blip r:embed="rId66" cstate="print">
                       <a:extLst>
                         <a:ext uri="{28A0092B-C50C-407E-A947-70E740481C1C}">
                           <a14:useLocalDpi xmlns:a14="http://schemas.microsoft.com/office/drawing/2010/main" val="0"/>
@@ -13041,20 +13828,35 @@
           <w:rFonts w:ascii="Times New Roman" w:hAnsi="Times New Roman" w:cs="Times New Roman"/>
         </w:rPr>
       </w:pPr>
-      <w:r>
-        <w:t xml:space="preserve">Gambar </w:t>
-      </w:r>
-      <w:fldSimple w:instr=" SEQ Gambar \* ARABIC ">
-        <w:r>
-          <w:rPr>
-            <w:noProof/>
-          </w:rPr>
-          <w:t>53</w:t>
-        </w:r>
-      </w:fldSimple>
-      <w:r>
-        <w:t xml:space="preserve"> watermark pada halaman cara membaca</w:t>
-      </w:r>
+      <w:bookmarkStart w:id="51" w:name="_Toc200446345"/>
+      <w:r>
+        <w:t xml:space="preserve">Gambar 3. </w:t>
+      </w:r>
+      <w:r>
+        <w:fldChar w:fldCharType="begin"/>
+      </w:r>
+      <w:r>
+        <w:instrText xml:space="preserve"> SEQ Gambar_3. \* ARABIC </w:instrText>
+      </w:r>
+      <w:r>
+        <w:fldChar w:fldCharType="separate"/>
+      </w:r>
+      <w:r>
+        <w:rPr>
+          <w:noProof/>
+        </w:rPr>
+        <w:t>50</w:t>
+      </w:r>
+      <w:r>
+        <w:fldChar w:fldCharType="end"/>
+      </w:r>
+      <w:r>
+        <w:t xml:space="preserve"> </w:t>
+      </w:r>
+      <w:r>
+        <w:t>watermark pada halaman cara membaca</w:t>
+      </w:r>
+      <w:bookmarkEnd w:id="51"/>
     </w:p>
     <w:p>
       <w:pPr>
@@ -14239,6 +15041,11 @@
           </w:r>
         </w:p>
         <w:p>
+          <w:pPr>
+            <w:rPr>
+              <w:color w:val="000000"/>
+            </w:rPr>
+          </w:pPr>
           <w:r>
             <w:rPr>
               <w:rFonts w:eastAsia="Times New Roman"/>
@@ -14248,14 +15055,330 @@
         </w:p>
       </w:sdtContent>
     </w:sdt>
+    <w:p>
+      <w:pPr>
+        <w:spacing w:line="480" w:lineRule="auto"/>
+        <w:rPr>
+          <w:rFonts w:ascii="Times New Roman" w:hAnsi="Times New Roman" w:cs="Times New Roman"/>
+        </w:rPr>
+      </w:pPr>
+      <w:r>
+        <w:rPr>
+          <w:rFonts w:ascii="Times New Roman" w:hAnsi="Times New Roman" w:cs="Times New Roman"/>
+        </w:rPr>
+        <w:br w:type="page"/>
+      </w:r>
+    </w:p>
+    <w:p>
+      <w:pPr>
+        <w:pStyle w:val="Heading2"/>
+      </w:pPr>
+      <w:r>
+        <w:lastRenderedPageBreak/>
+        <w:t>LAMPIRAN</w:t>
+      </w:r>
+    </w:p>
+    <w:p>
+      <w:pPr>
+        <w:spacing w:line="480" w:lineRule="auto"/>
+        <w:rPr>
+          <w:rFonts w:ascii="Times New Roman" w:hAnsi="Times New Roman" w:cs="Times New Roman"/>
+        </w:rPr>
+      </w:pPr>
+      <w:r>
+        <w:rPr>
+          <w:rFonts w:ascii="Times New Roman" w:hAnsi="Times New Roman" w:cs="Times New Roman"/>
+        </w:rPr>
+        <w:t>sssss</w:t>
+      </w:r>
+    </w:p>
     <w:sectPr>
+      <w:footerReference w:type="default" r:id="rId67"/>
       <w:pgSz w:w="11909" w:h="16834" w:code="9"/>
       <w:pgMar w:top="2268" w:right="1701" w:bottom="1701" w:left="2268" w:header="720" w:footer="720" w:gutter="0"/>
+      <w:pgNumType w:start="1"/>
       <w:cols w:space="720"/>
       <w:docGrid w:linePitch="360"/>
     </w:sectPr>
   </w:body>
 </w:document>
+</file>
+
+<file path=word/endnotes.xml><?xml version="1.0" encoding="utf-8"?>
+<w:endnotes xmlns:wpc="http://schemas.microsoft.com/office/word/2010/wordprocessingCanvas" xmlns:cx="http://schemas.microsoft.com/office/drawing/2014/chartex" xmlns:cx1="http://schemas.microsoft.com/office/drawing/2015/9/8/chartex" xmlns:cx2="http://schemas.microsoft.com/office/drawing/2015/10/21/chartex" xmlns:cx3="http://schemas.microsoft.com/office/drawing/2016/5/9/chartex" xmlns:cx4="http://schemas.microsoft.com/office/drawing/2016/5/10/chartex" xmlns:cx5="http://schemas.microsoft.com/office/drawing/2016/5/11/chartex" xmlns:cx6="http://schemas.microsoft.com/office/drawing/2016/5/12/chartex" xmlns:cx7="http://schemas.microsoft.com/office/drawing/2016/5/13/chartex" xmlns:cx8="http://schemas.microsoft.com/office/drawing/2016/5/14/chartex" xmlns:mc="http://schemas.openxmlformats.org/markup-compatibility/2006" xmlns:aink="http://schemas.microsoft.com/office/drawing/2016/ink" xmlns:am3d="http://schemas.microsoft.com/office/drawing/2017/model3d" xmlns:o="urn:schemas-microsoft-com:office:office" xmlns:oel="http://schemas.microsoft.com/office/2019/extlst" xmlns:r="http://schemas.openxmlformats.org/officeDocument/2006/relationships" xmlns:m="http://schemas.openxmlformats.org/officeDocument/2006/math" xmlns:v="urn:schemas-microsoft-com:vml" xmlns:wp14="http://schemas.microsoft.com/office/word/2010/wordprocessingDrawing" xmlns:wp="http://schemas.openxmlformats.org/drawingml/2006/wordprocessingDrawing" xmlns:w10="urn:schemas-microsoft-com:office:word" xmlns:w="http://schemas.openxmlformats.org/wordprocessingml/2006/main" xmlns:w14="http://schemas.microsoft.com/office/word/2010/wordml" xmlns:w15="http://schemas.microsoft.com/office/word/2012/wordml" xmlns:w16cex="http://schemas.microsoft.com/office/word/2018/wordml/cex" xmlns:w16cid="http://schemas.microsoft.com/office/word/2016/wordml/cid" xmlns:w16="http://schemas.microsoft.com/office/word/2018/wordml" xmlns:w16du="http://schemas.microsoft.com/office/word/2023/wordml/word16du" xmlns:w16sdtdh="http://schemas.microsoft.com/office/word/2020/wordml/sdtdatahash" xmlns:w16sdtfl="http://schemas.microsoft.com/office/word/2024/wordml/sdtformatlock" xmlns:w16se="http://schemas.microsoft.com/office/word/2015/wordml/symex" xmlns:wpg="http://schemas.microsoft.com/office/word/2010/wordprocessingGroup" xmlns:wpi="http://schemas.microsoft.com/office/word/2010/wordprocessingInk" xmlns:wne="http://schemas.microsoft.com/office/word/2006/wordml" xmlns:wps="http://schemas.microsoft.com/office/word/2010/wordprocessingShape" mc:Ignorable="w14 w15 w16se w16cid w16 w16cex w16sdtdh w16sdtfl w16du wp14">
+  <w:endnote w:type="separator" w:id="-1">
+    <w:p>
+      <w:pPr>
+        <w:spacing w:after="0" w:line="240" w:lineRule="auto"/>
+      </w:pPr>
+      <w:r>
+        <w:separator/>
+      </w:r>
+    </w:p>
+  </w:endnote>
+  <w:endnote w:type="continuationSeparator" w:id="0">
+    <w:p>
+      <w:pPr>
+        <w:spacing w:after="0" w:line="240" w:lineRule="auto"/>
+      </w:pPr>
+      <w:r>
+        <w:continuationSeparator/>
+      </w:r>
+    </w:p>
+  </w:endnote>
+</w:endnotes>
+</file>
+
+<file path=word/footer1.xml><?xml version="1.0" encoding="utf-8"?>
+<w:ftr xmlns:wpc="http://schemas.microsoft.com/office/word/2010/wordprocessingCanvas" xmlns:cx="http://schemas.microsoft.com/office/drawing/2014/chartex" xmlns:cx1="http://schemas.microsoft.com/office/drawing/2015/9/8/chartex" xmlns:cx2="http://schemas.microsoft.com/office/drawing/2015/10/21/chartex" xmlns:cx3="http://schemas.microsoft.com/office/drawing/2016/5/9/chartex" xmlns:cx4="http://schemas.microsoft.com/office/drawing/2016/5/10/chartex" xmlns:cx5="http://schemas.microsoft.com/office/drawing/2016/5/11/chartex" xmlns:cx6="http://schemas.microsoft.com/office/drawing/2016/5/12/chartex" xmlns:cx7="http://schemas.microsoft.com/office/drawing/2016/5/13/chartex" xmlns:cx8="http://schemas.microsoft.com/office/drawing/2016/5/14/chartex" xmlns:mc="http://schemas.openxmlformats.org/markup-compatibility/2006" xmlns:aink="http://schemas.microsoft.com/office/drawing/2016/ink" xmlns:am3d="http://schemas.microsoft.com/office/drawing/2017/model3d" xmlns:o="urn:schemas-microsoft-com:office:office" xmlns:oel="http://schemas.microsoft.com/office/2019/extlst" xmlns:r="http://schemas.openxmlformats.org/officeDocument/2006/relationships" xmlns:m="http://schemas.openxmlformats.org/officeDocument/2006/math" xmlns:v="urn:schemas-microsoft-com:vml" xmlns:wp14="http://schemas.microsoft.com/office/word/2010/wordprocessingDrawing" xmlns:wp="http://schemas.openxmlformats.org/drawingml/2006/wordprocessingDrawing" xmlns:w10="urn:schemas-microsoft-com:office:word" xmlns:w="http://schemas.openxmlformats.org/wordprocessingml/2006/main" xmlns:w14="http://schemas.microsoft.com/office/word/2010/wordml" xmlns:w15="http://schemas.microsoft.com/office/word/2012/wordml" xmlns:w16cex="http://schemas.microsoft.com/office/word/2018/wordml/cex" xmlns:w16cid="http://schemas.microsoft.com/office/word/2016/wordml/cid" xmlns:w16="http://schemas.microsoft.com/office/word/2018/wordml" xmlns:w16du="http://schemas.microsoft.com/office/word/2023/wordml/word16du" xmlns:w16sdtdh="http://schemas.microsoft.com/office/word/2020/wordml/sdtdatahash" xmlns:w16sdtfl="http://schemas.microsoft.com/office/word/2024/wordml/sdtformatlock" xmlns:w16se="http://schemas.microsoft.com/office/word/2015/wordml/symex" xmlns:wpg="http://schemas.microsoft.com/office/word/2010/wordprocessingGroup" xmlns:wpi="http://schemas.microsoft.com/office/word/2010/wordprocessingInk" xmlns:wne="http://schemas.microsoft.com/office/word/2006/wordml" xmlns:wps="http://schemas.microsoft.com/office/word/2010/wordprocessingShape" mc:Ignorable="w14 w15 w16se w16cid w16 w16cex w16sdtdh w16sdtfl w16du wp14">
+  <w:p>
+    <w:pPr>
+      <w:pStyle w:val="Footer"/>
+    </w:pPr>
+  </w:p>
+  <w:p>
+    <w:pPr>
+      <w:pStyle w:val="Footer"/>
+    </w:pPr>
+  </w:p>
+</w:ftr>
+</file>
+
+<file path=word/footer2.xml><?xml version="1.0" encoding="utf-8"?>
+<w:ftr xmlns:wpc="http://schemas.microsoft.com/office/word/2010/wordprocessingCanvas" xmlns:cx="http://schemas.microsoft.com/office/drawing/2014/chartex" xmlns:cx1="http://schemas.microsoft.com/office/drawing/2015/9/8/chartex" xmlns:cx2="http://schemas.microsoft.com/office/drawing/2015/10/21/chartex" xmlns:cx3="http://schemas.microsoft.com/office/drawing/2016/5/9/chartex" xmlns:cx4="http://schemas.microsoft.com/office/drawing/2016/5/10/chartex" xmlns:cx5="http://schemas.microsoft.com/office/drawing/2016/5/11/chartex" xmlns:cx6="http://schemas.microsoft.com/office/drawing/2016/5/12/chartex" xmlns:cx7="http://schemas.microsoft.com/office/drawing/2016/5/13/chartex" xmlns:cx8="http://schemas.microsoft.com/office/drawing/2016/5/14/chartex" xmlns:mc="http://schemas.openxmlformats.org/markup-compatibility/2006" xmlns:aink="http://schemas.microsoft.com/office/drawing/2016/ink" xmlns:am3d="http://schemas.microsoft.com/office/drawing/2017/model3d" xmlns:o="urn:schemas-microsoft-com:office:office" xmlns:oel="http://schemas.microsoft.com/office/2019/extlst" xmlns:r="http://schemas.openxmlformats.org/officeDocument/2006/relationships" xmlns:m="http://schemas.openxmlformats.org/officeDocument/2006/math" xmlns:v="urn:schemas-microsoft-com:vml" xmlns:wp14="http://schemas.microsoft.com/office/word/2010/wordprocessingDrawing" xmlns:wp="http://schemas.openxmlformats.org/drawingml/2006/wordprocessingDrawing" xmlns:w10="urn:schemas-microsoft-com:office:word" xmlns:w="http://schemas.openxmlformats.org/wordprocessingml/2006/main" xmlns:w14="http://schemas.microsoft.com/office/word/2010/wordml" xmlns:w15="http://schemas.microsoft.com/office/word/2012/wordml" xmlns:w16cex="http://schemas.microsoft.com/office/word/2018/wordml/cex" xmlns:w16cid="http://schemas.microsoft.com/office/word/2016/wordml/cid" xmlns:w16="http://schemas.microsoft.com/office/word/2018/wordml" xmlns:w16du="http://schemas.microsoft.com/office/word/2023/wordml/word16du" xmlns:w16sdtdh="http://schemas.microsoft.com/office/word/2020/wordml/sdtdatahash" xmlns:w16sdtfl="http://schemas.microsoft.com/office/word/2024/wordml/sdtformatlock" xmlns:w16se="http://schemas.microsoft.com/office/word/2015/wordml/symex" xmlns:wpg="http://schemas.microsoft.com/office/word/2010/wordprocessingGroup" xmlns:wpi="http://schemas.microsoft.com/office/word/2010/wordprocessingInk" xmlns:wne="http://schemas.microsoft.com/office/word/2006/wordml" xmlns:wps="http://schemas.microsoft.com/office/word/2010/wordprocessingShape" mc:Ignorable="w14 w15 w16se w16cid w16 w16cex w16sdtdh w16sdtfl w16du wp14">
+  <w:sdt>
+    <w:sdtPr>
+      <w:id w:val="219796081"/>
+      <w:docPartObj>
+        <w:docPartGallery w:val="Page Numbers (Bottom of Page)"/>
+        <w:docPartUnique/>
+      </w:docPartObj>
+    </w:sdtPr>
+    <w:sdtEndPr>
+      <w:rPr>
+        <w:noProof/>
+      </w:rPr>
+    </w:sdtEndPr>
+    <w:sdtContent>
+      <w:p>
+        <w:pPr>
+          <w:pStyle w:val="Footer"/>
+          <w:jc w:val="center"/>
+        </w:pPr>
+        <w:r>
+          <w:fldChar w:fldCharType="begin"/>
+        </w:r>
+        <w:r>
+          <w:instrText xml:space="preserve"> PAGE   \* MERGEFORMAT </w:instrText>
+        </w:r>
+        <w:r>
+          <w:fldChar w:fldCharType="separate"/>
+        </w:r>
+        <w:r>
+          <w:rPr>
+            <w:noProof/>
+          </w:rPr>
+          <w:t>2</w:t>
+        </w:r>
+        <w:r>
+          <w:rPr>
+            <w:noProof/>
+          </w:rPr>
+          <w:fldChar w:fldCharType="end"/>
+        </w:r>
+      </w:p>
+    </w:sdtContent>
+  </w:sdt>
+  <w:p>
+    <w:pPr>
+      <w:pStyle w:val="Footer"/>
+    </w:pPr>
+  </w:p>
+</w:ftr>
+</file>
+
+<file path=word/footer3.xml><?xml version="1.0" encoding="utf-8"?>
+<w:ftr xmlns:wpc="http://schemas.microsoft.com/office/word/2010/wordprocessingCanvas" xmlns:cx="http://schemas.microsoft.com/office/drawing/2014/chartex" xmlns:cx1="http://schemas.microsoft.com/office/drawing/2015/9/8/chartex" xmlns:cx2="http://schemas.microsoft.com/office/drawing/2015/10/21/chartex" xmlns:cx3="http://schemas.microsoft.com/office/drawing/2016/5/9/chartex" xmlns:cx4="http://schemas.microsoft.com/office/drawing/2016/5/10/chartex" xmlns:cx5="http://schemas.microsoft.com/office/drawing/2016/5/11/chartex" xmlns:cx6="http://schemas.microsoft.com/office/drawing/2016/5/12/chartex" xmlns:cx7="http://schemas.microsoft.com/office/drawing/2016/5/13/chartex" xmlns:cx8="http://schemas.microsoft.com/office/drawing/2016/5/14/chartex" xmlns:mc="http://schemas.openxmlformats.org/markup-compatibility/2006" xmlns:aink="http://schemas.microsoft.com/office/drawing/2016/ink" xmlns:am3d="http://schemas.microsoft.com/office/drawing/2017/model3d" xmlns:o="urn:schemas-microsoft-com:office:office" xmlns:oel="http://schemas.microsoft.com/office/2019/extlst" xmlns:r="http://schemas.openxmlformats.org/officeDocument/2006/relationships" xmlns:m="http://schemas.openxmlformats.org/officeDocument/2006/math" xmlns:v="urn:schemas-microsoft-com:vml" xmlns:wp14="http://schemas.microsoft.com/office/word/2010/wordprocessingDrawing" xmlns:wp="http://schemas.openxmlformats.org/drawingml/2006/wordprocessingDrawing" xmlns:w10="urn:schemas-microsoft-com:office:word" xmlns:w="http://schemas.openxmlformats.org/wordprocessingml/2006/main" xmlns:w14="http://schemas.microsoft.com/office/word/2010/wordml" xmlns:w15="http://schemas.microsoft.com/office/word/2012/wordml" xmlns:w16cex="http://schemas.microsoft.com/office/word/2018/wordml/cex" xmlns:w16cid="http://schemas.microsoft.com/office/word/2016/wordml/cid" xmlns:w16="http://schemas.microsoft.com/office/word/2018/wordml" xmlns:w16du="http://schemas.microsoft.com/office/word/2023/wordml/word16du" xmlns:w16sdtdh="http://schemas.microsoft.com/office/word/2020/wordml/sdtdatahash" xmlns:w16sdtfl="http://schemas.microsoft.com/office/word/2024/wordml/sdtformatlock" xmlns:w16se="http://schemas.microsoft.com/office/word/2015/wordml/symex" xmlns:wpg="http://schemas.microsoft.com/office/word/2010/wordprocessingGroup" xmlns:wpi="http://schemas.microsoft.com/office/word/2010/wordprocessingInk" xmlns:wne="http://schemas.microsoft.com/office/word/2006/wordml" xmlns:wps="http://schemas.microsoft.com/office/word/2010/wordprocessingShape" mc:Ignorable="w14 w15 w16se w16cid w16 w16cex w16sdtdh w16sdtfl w16du wp14">
+  <w:sdt>
+    <w:sdtPr>
+      <w:id w:val="1585340561"/>
+      <w:docPartObj>
+        <w:docPartGallery w:val="Page Numbers (Bottom of Page)"/>
+        <w:docPartUnique/>
+      </w:docPartObj>
+    </w:sdtPr>
+    <w:sdtEndPr>
+      <w:rPr>
+        <w:noProof/>
+      </w:rPr>
+    </w:sdtEndPr>
+    <w:sdtContent>
+      <w:p>
+        <w:pPr>
+          <w:pStyle w:val="Footer"/>
+          <w:jc w:val="center"/>
+        </w:pPr>
+        <w:r>
+          <w:fldChar w:fldCharType="begin"/>
+        </w:r>
+        <w:r>
+          <w:instrText xml:space="preserve"> PAGE   \* MERGEFORMAT </w:instrText>
+        </w:r>
+        <w:r>
+          <w:fldChar w:fldCharType="separate"/>
+        </w:r>
+        <w:r>
+          <w:rPr>
+            <w:noProof/>
+          </w:rPr>
+          <w:t>2</w:t>
+        </w:r>
+        <w:r>
+          <w:rPr>
+            <w:noProof/>
+          </w:rPr>
+          <w:fldChar w:fldCharType="end"/>
+        </w:r>
+      </w:p>
+    </w:sdtContent>
+  </w:sdt>
+  <w:p>
+    <w:pPr>
+      <w:pStyle w:val="Footer"/>
+    </w:pPr>
+  </w:p>
+</w:ftr>
+</file>
+
+<file path=word/footer4.xml><?xml version="1.0" encoding="utf-8"?>
+<w:ftr xmlns:wpc="http://schemas.microsoft.com/office/word/2010/wordprocessingCanvas" xmlns:cx="http://schemas.microsoft.com/office/drawing/2014/chartex" xmlns:cx1="http://schemas.microsoft.com/office/drawing/2015/9/8/chartex" xmlns:cx2="http://schemas.microsoft.com/office/drawing/2015/10/21/chartex" xmlns:cx3="http://schemas.microsoft.com/office/drawing/2016/5/9/chartex" xmlns:cx4="http://schemas.microsoft.com/office/drawing/2016/5/10/chartex" xmlns:cx5="http://schemas.microsoft.com/office/drawing/2016/5/11/chartex" xmlns:cx6="http://schemas.microsoft.com/office/drawing/2016/5/12/chartex" xmlns:cx7="http://schemas.microsoft.com/office/drawing/2016/5/13/chartex" xmlns:cx8="http://schemas.microsoft.com/office/drawing/2016/5/14/chartex" xmlns:mc="http://schemas.openxmlformats.org/markup-compatibility/2006" xmlns:aink="http://schemas.microsoft.com/office/drawing/2016/ink" xmlns:am3d="http://schemas.microsoft.com/office/drawing/2017/model3d" xmlns:o="urn:schemas-microsoft-com:office:office" xmlns:oel="http://schemas.microsoft.com/office/2019/extlst" xmlns:r="http://schemas.openxmlformats.org/officeDocument/2006/relationships" xmlns:m="http://schemas.openxmlformats.org/officeDocument/2006/math" xmlns:v="urn:schemas-microsoft-com:vml" xmlns:wp14="http://schemas.microsoft.com/office/word/2010/wordprocessingDrawing" xmlns:wp="http://schemas.openxmlformats.org/drawingml/2006/wordprocessingDrawing" xmlns:w10="urn:schemas-microsoft-com:office:word" xmlns:w="http://schemas.openxmlformats.org/wordprocessingml/2006/main" xmlns:w14="http://schemas.microsoft.com/office/word/2010/wordml" xmlns:w15="http://schemas.microsoft.com/office/word/2012/wordml" xmlns:w16cex="http://schemas.microsoft.com/office/word/2018/wordml/cex" xmlns:w16cid="http://schemas.microsoft.com/office/word/2016/wordml/cid" xmlns:w16="http://schemas.microsoft.com/office/word/2018/wordml" xmlns:w16du="http://schemas.microsoft.com/office/word/2023/wordml/word16du" xmlns:w16sdtdh="http://schemas.microsoft.com/office/word/2020/wordml/sdtdatahash" xmlns:w16sdtfl="http://schemas.microsoft.com/office/word/2024/wordml/sdtformatlock" xmlns:w16se="http://schemas.microsoft.com/office/word/2015/wordml/symex" xmlns:wpg="http://schemas.microsoft.com/office/word/2010/wordprocessingGroup" xmlns:wpi="http://schemas.microsoft.com/office/word/2010/wordprocessingInk" xmlns:wne="http://schemas.microsoft.com/office/word/2006/wordml" xmlns:wps="http://schemas.microsoft.com/office/word/2010/wordprocessingShape" mc:Ignorable="w14 w15 w16se w16cid w16 w16cex w16sdtdh w16sdtfl w16du wp14">
+  <w:sdt>
+    <w:sdtPr>
+      <w:id w:val="-748342297"/>
+      <w:docPartObj>
+        <w:docPartGallery w:val="Page Numbers (Bottom of Page)"/>
+        <w:docPartUnique/>
+      </w:docPartObj>
+    </w:sdtPr>
+    <w:sdtEndPr>
+      <w:rPr>
+        <w:noProof/>
+      </w:rPr>
+    </w:sdtEndPr>
+    <w:sdtContent>
+      <w:p>
+        <w:pPr>
+          <w:pStyle w:val="Footer"/>
+          <w:jc w:val="center"/>
+        </w:pPr>
+        <w:r>
+          <w:fldChar w:fldCharType="begin"/>
+        </w:r>
+        <w:r>
+          <w:instrText xml:space="preserve"> PAGE   \* MERGEFORMAT </w:instrText>
+        </w:r>
+        <w:r>
+          <w:fldChar w:fldCharType="separate"/>
+        </w:r>
+        <w:r>
+          <w:rPr>
+            <w:noProof/>
+          </w:rPr>
+          <w:t>2</w:t>
+        </w:r>
+        <w:r>
+          <w:rPr>
+            <w:noProof/>
+          </w:rPr>
+          <w:fldChar w:fldCharType="end"/>
+        </w:r>
+      </w:p>
+    </w:sdtContent>
+  </w:sdt>
+  <w:p>
+    <w:pPr>
+      <w:pStyle w:val="Footer"/>
+    </w:pPr>
+  </w:p>
+</w:ftr>
+</file>
+
+<file path=word/footer5.xml><?xml version="1.0" encoding="utf-8"?>
+<w:ftr xmlns:wpc="http://schemas.microsoft.com/office/word/2010/wordprocessingCanvas" xmlns:cx="http://schemas.microsoft.com/office/drawing/2014/chartex" xmlns:cx1="http://schemas.microsoft.com/office/drawing/2015/9/8/chartex" xmlns:cx2="http://schemas.microsoft.com/office/drawing/2015/10/21/chartex" xmlns:cx3="http://schemas.microsoft.com/office/drawing/2016/5/9/chartex" xmlns:cx4="http://schemas.microsoft.com/office/drawing/2016/5/10/chartex" xmlns:cx5="http://schemas.microsoft.com/office/drawing/2016/5/11/chartex" xmlns:cx6="http://schemas.microsoft.com/office/drawing/2016/5/12/chartex" xmlns:cx7="http://schemas.microsoft.com/office/drawing/2016/5/13/chartex" xmlns:cx8="http://schemas.microsoft.com/office/drawing/2016/5/14/chartex" xmlns:mc="http://schemas.openxmlformats.org/markup-compatibility/2006" xmlns:aink="http://schemas.microsoft.com/office/drawing/2016/ink" xmlns:am3d="http://schemas.microsoft.com/office/drawing/2017/model3d" xmlns:o="urn:schemas-microsoft-com:office:office" xmlns:oel="http://schemas.microsoft.com/office/2019/extlst" xmlns:r="http://schemas.openxmlformats.org/officeDocument/2006/relationships" xmlns:m="http://schemas.openxmlformats.org/officeDocument/2006/math" xmlns:v="urn:schemas-microsoft-com:vml" xmlns:wp14="http://schemas.microsoft.com/office/word/2010/wordprocessingDrawing" xmlns:wp="http://schemas.openxmlformats.org/drawingml/2006/wordprocessingDrawing" xmlns:w10="urn:schemas-microsoft-com:office:word" xmlns:w="http://schemas.openxmlformats.org/wordprocessingml/2006/main" xmlns:w14="http://schemas.microsoft.com/office/word/2010/wordml" xmlns:w15="http://schemas.microsoft.com/office/word/2012/wordml" xmlns:w16cex="http://schemas.microsoft.com/office/word/2018/wordml/cex" xmlns:w16cid="http://schemas.microsoft.com/office/word/2016/wordml/cid" xmlns:w16="http://schemas.microsoft.com/office/word/2018/wordml" xmlns:w16du="http://schemas.microsoft.com/office/word/2023/wordml/word16du" xmlns:w16sdtdh="http://schemas.microsoft.com/office/word/2020/wordml/sdtdatahash" xmlns:w16sdtfl="http://schemas.microsoft.com/office/word/2024/wordml/sdtformatlock" xmlns:w16se="http://schemas.microsoft.com/office/word/2015/wordml/symex" xmlns:wpg="http://schemas.microsoft.com/office/word/2010/wordprocessingGroup" xmlns:wpi="http://schemas.microsoft.com/office/word/2010/wordprocessingInk" xmlns:wne="http://schemas.microsoft.com/office/word/2006/wordml" xmlns:wps="http://schemas.microsoft.com/office/word/2010/wordprocessingShape" mc:Ignorable="w14 w15 w16se w16cid w16 w16cex w16sdtdh w16sdtfl w16du wp14">
+  <w:sdt>
+    <w:sdtPr>
+      <w:id w:val="774451785"/>
+      <w:docPartObj>
+        <w:docPartGallery w:val="Page Numbers (Bottom of Page)"/>
+        <w:docPartUnique/>
+      </w:docPartObj>
+    </w:sdtPr>
+    <w:sdtEndPr>
+      <w:rPr>
+        <w:noProof/>
+      </w:rPr>
+    </w:sdtEndPr>
+    <w:sdtContent>
+      <w:p>
+        <w:pPr>
+          <w:pStyle w:val="Footer"/>
+          <w:jc w:val="center"/>
+        </w:pPr>
+        <w:r>
+          <w:fldChar w:fldCharType="begin"/>
+        </w:r>
+        <w:r>
+          <w:instrText xml:space="preserve"> PAGE   \* MERGEFORMAT </w:instrText>
+        </w:r>
+        <w:r>
+          <w:fldChar w:fldCharType="separate"/>
+        </w:r>
+        <w:r>
+          <w:rPr>
+            <w:noProof/>
+          </w:rPr>
+          <w:t>2</w:t>
+        </w:r>
+        <w:r>
+          <w:rPr>
+            <w:noProof/>
+          </w:rPr>
+          <w:fldChar w:fldCharType="end"/>
+        </w:r>
+      </w:p>
+    </w:sdtContent>
+  </w:sdt>
+  <w:p>
+    <w:pPr>
+      <w:pStyle w:val="Footer"/>
+    </w:pPr>
+  </w:p>
+</w:ftr>
+</file>
+
+<file path=word/footnotes.xml><?xml version="1.0" encoding="utf-8"?>
+<w:footnotes xmlns:wpc="http://schemas.microsoft.com/office/word/2010/wordprocessingCanvas" xmlns:cx="http://schemas.microsoft.com/office/drawing/2014/chartex" xmlns:cx1="http://schemas.microsoft.com/office/drawing/2015/9/8/chartex" xmlns:cx2="http://schemas.microsoft.com/office/drawing/2015/10/21/chartex" xmlns:cx3="http://schemas.microsoft.com/office/drawing/2016/5/9/chartex" xmlns:cx4="http://schemas.microsoft.com/office/drawing/2016/5/10/chartex" xmlns:cx5="http://schemas.microsoft.com/office/drawing/2016/5/11/chartex" xmlns:cx6="http://schemas.microsoft.com/office/drawing/2016/5/12/chartex" xmlns:cx7="http://schemas.microsoft.com/office/drawing/2016/5/13/chartex" xmlns:cx8="http://schemas.microsoft.com/office/drawing/2016/5/14/chartex" xmlns:mc="http://schemas.openxmlformats.org/markup-compatibility/2006" xmlns:aink="http://schemas.microsoft.com/office/drawing/2016/ink" xmlns:am3d="http://schemas.microsoft.com/office/drawing/2017/model3d" xmlns:o="urn:schemas-microsoft-com:office:office" xmlns:oel="http://schemas.microsoft.com/office/2019/extlst" xmlns:r="http://schemas.openxmlformats.org/officeDocument/2006/relationships" xmlns:m="http://schemas.openxmlformats.org/officeDocument/2006/math" xmlns:v="urn:schemas-microsoft-com:vml" xmlns:wp14="http://schemas.microsoft.com/office/word/2010/wordprocessingDrawing" xmlns:wp="http://schemas.openxmlformats.org/drawingml/2006/wordprocessingDrawing" xmlns:w10="urn:schemas-microsoft-com:office:word" xmlns:w="http://schemas.openxmlformats.org/wordprocessingml/2006/main" xmlns:w14="http://schemas.microsoft.com/office/word/2010/wordml" xmlns:w15="http://schemas.microsoft.com/office/word/2012/wordml" xmlns:w16cex="http://schemas.microsoft.com/office/word/2018/wordml/cex" xmlns:w16cid="http://schemas.microsoft.com/office/word/2016/wordml/cid" xmlns:w16="http://schemas.microsoft.com/office/word/2018/wordml" xmlns:w16du="http://schemas.microsoft.com/office/word/2023/wordml/word16du" xmlns:w16sdtdh="http://schemas.microsoft.com/office/word/2020/wordml/sdtdatahash" xmlns:w16sdtfl="http://schemas.microsoft.com/office/word/2024/wordml/sdtformatlock" xmlns:w16se="http://schemas.microsoft.com/office/word/2015/wordml/symex" xmlns:wpg="http://schemas.microsoft.com/office/word/2010/wordprocessingGroup" xmlns:wpi="http://schemas.microsoft.com/office/word/2010/wordprocessingInk" xmlns:wne="http://schemas.microsoft.com/office/word/2006/wordml" xmlns:wps="http://schemas.microsoft.com/office/word/2010/wordprocessingShape" mc:Ignorable="w14 w15 w16se w16cid w16 w16cex w16sdtdh w16sdtfl w16du wp14">
+  <w:footnote w:type="separator" w:id="-1">
+    <w:p>
+      <w:pPr>
+        <w:spacing w:after="0" w:line="240" w:lineRule="auto"/>
+      </w:pPr>
+      <w:r>
+        <w:separator/>
+      </w:r>
+    </w:p>
+  </w:footnote>
+  <w:footnote w:type="continuationSeparator" w:id="0">
+    <w:p>
+      <w:pPr>
+        <w:spacing w:after="0" w:line="240" w:lineRule="auto"/>
+      </w:pPr>
+      <w:r>
+        <w:continuationSeparator/>
+      </w:r>
+    </w:p>
+  </w:footnote>
+</w:footnotes>
 </file>
 
 <file path=word/numbering.xml><?xml version="1.0" encoding="utf-8"?>
@@ -17513,6 +18636,89 @@
       <w:color w:val="666666"/>
     </w:rPr>
   </w:style>
+  <w:style w:type="paragraph" w:styleId="Header">
+    <w:name w:val="header"/>
+    <w:basedOn w:val="Normal"/>
+    <w:link w:val="HeaderChar"/>
+    <w:uiPriority w:val="99"/>
+    <w:unhideWhenUsed/>
+    <w:rsid w:val="00462AD4"/>
+    <w:pPr>
+      <w:tabs>
+        <w:tab w:val="center" w:pos="4680"/>
+        <w:tab w:val="right" w:pos="9360"/>
+      </w:tabs>
+      <w:spacing w:after="0" w:line="240" w:lineRule="auto"/>
+    </w:pPr>
+  </w:style>
+  <w:style w:type="character" w:customStyle="1" w:styleId="HeaderChar">
+    <w:name w:val="Header Char"/>
+    <w:basedOn w:val="DefaultParagraphFont"/>
+    <w:link w:val="Header"/>
+    <w:uiPriority w:val="99"/>
+    <w:rsid w:val="00462AD4"/>
+  </w:style>
+  <w:style w:type="paragraph" w:styleId="Footer">
+    <w:name w:val="footer"/>
+    <w:basedOn w:val="Normal"/>
+    <w:link w:val="FooterChar"/>
+    <w:uiPriority w:val="99"/>
+    <w:unhideWhenUsed/>
+    <w:rsid w:val="00462AD4"/>
+    <w:pPr>
+      <w:tabs>
+        <w:tab w:val="center" w:pos="4680"/>
+        <w:tab w:val="right" w:pos="9360"/>
+      </w:tabs>
+      <w:spacing w:after="0" w:line="240" w:lineRule="auto"/>
+    </w:pPr>
+  </w:style>
+  <w:style w:type="character" w:customStyle="1" w:styleId="FooterChar">
+    <w:name w:val="Footer Char"/>
+    <w:basedOn w:val="DefaultParagraphFont"/>
+    <w:link w:val="Footer"/>
+    <w:uiPriority w:val="99"/>
+    <w:rsid w:val="00462AD4"/>
+  </w:style>
+  <w:style w:type="paragraph" w:styleId="EndnoteText">
+    <w:name w:val="endnote text"/>
+    <w:basedOn w:val="Normal"/>
+    <w:link w:val="EndnoteTextChar"/>
+    <w:uiPriority w:val="99"/>
+    <w:semiHidden/>
+    <w:unhideWhenUsed/>
+    <w:rsid w:val="00220A9D"/>
+    <w:pPr>
+      <w:spacing w:after="0" w:line="240" w:lineRule="auto"/>
+    </w:pPr>
+    <w:rPr>
+      <w:sz w:val="20"/>
+      <w:szCs w:val="20"/>
+    </w:rPr>
+  </w:style>
+  <w:style w:type="character" w:customStyle="1" w:styleId="EndnoteTextChar">
+    <w:name w:val="Endnote Text Char"/>
+    <w:basedOn w:val="DefaultParagraphFont"/>
+    <w:link w:val="EndnoteText"/>
+    <w:uiPriority w:val="99"/>
+    <w:semiHidden/>
+    <w:rsid w:val="00220A9D"/>
+    <w:rPr>
+      <w:sz w:val="20"/>
+      <w:szCs w:val="20"/>
+    </w:rPr>
+  </w:style>
+  <w:style w:type="character" w:styleId="EndnoteReference">
+    <w:name w:val="endnote reference"/>
+    <w:basedOn w:val="DefaultParagraphFont"/>
+    <w:uiPriority w:val="99"/>
+    <w:semiHidden/>
+    <w:unhideWhenUsed/>
+    <w:rsid w:val="00220A9D"/>
+    <w:rPr>
+      <w:vertAlign w:val="superscript"/>
+    </w:rPr>
+  </w:style>
 </w:styles>
 </file>
 
@@ -17613,12 +18819,14 @@
   <w:rsids>
     <w:rsidRoot w:val="00966163"/>
     <w:rsid w:val="001D4EF9"/>
+    <w:rsid w:val="002A4EB4"/>
     <w:rsid w:val="005A7160"/>
     <w:rsid w:val="006E1BAB"/>
     <w:rsid w:val="00763159"/>
     <w:rsid w:val="00966163"/>
     <w:rsid w:val="00AB1197"/>
     <w:rsid w:val="00EA4982"/>
+    <w:rsid w:val="00F274DE"/>
     <w:rsid w:val="00F36618"/>
   </w:rsids>
   <m:mathPr>

</xml_diff>